<commit_message>
Pulir terminologia y arquitectura futura
</commit_message>
<xml_diff>
--- a/docs/memoria/TFM_definitivo_2026-10-25.docx
+++ b/docs/memoria/TFM_definitivo_2026-10-25.docx
@@ -374,7 +374,7 @@
       <w:r>
         <w:fldChar w:fldCharType="separate"/>
       </w:r>
-      <w:hyperlink w:anchor="_Toc243834571" w:history="1">
+      <w:hyperlink w:anchor="_Toc243835764" w:history="1">
         <w:r>
           <w:rPr>
             <w:rStyle w:val="Hipervnculo"/>
@@ -401,7 +401,7 @@
             <w:noProof/>
             <w:webHidden/>
           </w:rPr>
-          <w:instrText xml:space="preserve"> PAGEREF _Toc243834571 \h </w:instrText>
+          <w:instrText xml:space="preserve"> PAGEREF _Toc243835764 \h </w:instrText>
         </w:r>
         <w:r>
           <w:rPr>
@@ -448,7 +448,7 @@
           <w14:ligatures w14:val="standardContextual"/>
         </w:rPr>
       </w:pPr>
-      <w:hyperlink w:anchor="_Toc243834572" w:history="1">
+      <w:hyperlink w:anchor="_Toc243835765" w:history="1">
         <w:r>
           <w:rPr>
             <w:rStyle w:val="Hipervnculo"/>
@@ -475,7 +475,7 @@
             <w:noProof/>
             <w:webHidden/>
           </w:rPr>
-          <w:instrText xml:space="preserve"> PAGEREF _Toc243834572 \h </w:instrText>
+          <w:instrText xml:space="preserve"> PAGEREF _Toc243835765 \h </w:instrText>
         </w:r>
         <w:r>
           <w:rPr>
@@ -522,7 +522,7 @@
           <w14:ligatures w14:val="standardContextual"/>
         </w:rPr>
       </w:pPr>
-      <w:hyperlink w:anchor="_Toc243834573" w:history="1">
+      <w:hyperlink w:anchor="_Toc243835766" w:history="1">
         <w:r>
           <w:rPr>
             <w:rStyle w:val="Hipervnculo"/>
@@ -549,7 +549,7 @@
             <w:noProof/>
             <w:webHidden/>
           </w:rPr>
-          <w:instrText xml:space="preserve"> PAGEREF _Toc243834573 \h </w:instrText>
+          <w:instrText xml:space="preserve"> PAGEREF _Toc243835766 \h </w:instrText>
         </w:r>
         <w:r>
           <w:rPr>
@@ -596,7 +596,7 @@
           <w14:ligatures w14:val="standardContextual"/>
         </w:rPr>
       </w:pPr>
-      <w:hyperlink w:anchor="_Toc243834574" w:history="1">
+      <w:hyperlink w:anchor="_Toc243835767" w:history="1">
         <w:r>
           <w:rPr>
             <w:rStyle w:val="Hipervnculo"/>
@@ -623,7 +623,7 @@
             <w:noProof/>
             <w:webHidden/>
           </w:rPr>
-          <w:instrText xml:space="preserve"> PAGEREF _Toc243834574 \h </w:instrText>
+          <w:instrText xml:space="preserve"> PAGEREF _Toc243835767 \h </w:instrText>
         </w:r>
         <w:r>
           <w:rPr>
@@ -670,7 +670,7 @@
           <w14:ligatures w14:val="standardContextual"/>
         </w:rPr>
       </w:pPr>
-      <w:hyperlink w:anchor="_Toc243834575" w:history="1">
+      <w:hyperlink w:anchor="_Toc243835768" w:history="1">
         <w:r>
           <w:rPr>
             <w:rStyle w:val="Hipervnculo"/>
@@ -697,7 +697,7 @@
             <w:noProof/>
             <w:webHidden/>
           </w:rPr>
-          <w:instrText xml:space="preserve"> PAGEREF _Toc243834575 \h </w:instrText>
+          <w:instrText xml:space="preserve"> PAGEREF _Toc243835768 \h </w:instrText>
         </w:r>
         <w:r>
           <w:rPr>
@@ -744,7 +744,7 @@
           <w14:ligatures w14:val="standardContextual"/>
         </w:rPr>
       </w:pPr>
-      <w:hyperlink w:anchor="_Toc243834576" w:history="1">
+      <w:hyperlink w:anchor="_Toc243835769" w:history="1">
         <w:r>
           <w:rPr>
             <w:rStyle w:val="Hipervnculo"/>
@@ -771,7 +771,7 @@
             <w:noProof/>
             <w:webHidden/>
           </w:rPr>
-          <w:instrText xml:space="preserve"> PAGEREF _Toc243834576 \h </w:instrText>
+          <w:instrText xml:space="preserve"> PAGEREF _Toc243835769 \h </w:instrText>
         </w:r>
         <w:r>
           <w:rPr>
@@ -818,13 +818,13 @@
           <w14:ligatures w14:val="standardContextual"/>
         </w:rPr>
       </w:pPr>
-      <w:hyperlink w:anchor="_Toc243834577" w:history="1">
+      <w:hyperlink w:anchor="_Toc243835770" w:history="1">
         <w:r>
           <w:rPr>
             <w:rStyle w:val="Hipervnculo"/>
             <w:noProof/>
           </w:rPr>
-          <w:t>2.2. Agricultura de precisión y Machine Learning</w:t>
+          <w:t>2.2. Agricultura de precisión y aprendizaje automático</w:t>
         </w:r>
         <w:r>
           <w:rPr>
@@ -845,7 +845,7 @@
             <w:noProof/>
             <w:webHidden/>
           </w:rPr>
-          <w:instrText xml:space="preserve"> PAGEREF _Toc243834577 \h </w:instrText>
+          <w:instrText xml:space="preserve"> PAGEREF _Toc243835770 \h </w:instrText>
         </w:r>
         <w:r>
           <w:rPr>
@@ -892,7 +892,7 @@
           <w14:ligatures w14:val="standardContextual"/>
         </w:rPr>
       </w:pPr>
-      <w:hyperlink w:anchor="_Toc243834578" w:history="1">
+      <w:hyperlink w:anchor="_Toc243835771" w:history="1">
         <w:r>
           <w:rPr>
             <w:rStyle w:val="Hipervnculo"/>
@@ -919,7 +919,7 @@
             <w:noProof/>
             <w:webHidden/>
           </w:rPr>
-          <w:instrText xml:space="preserve"> PAGEREF _Toc243834578 \h </w:instrText>
+          <w:instrText xml:space="preserve"> PAGEREF _Toc243835771 \h </w:instrText>
         </w:r>
         <w:r>
           <w:rPr>
@@ -966,7 +966,7 @@
           <w14:ligatures w14:val="standardContextual"/>
         </w:rPr>
       </w:pPr>
-      <w:hyperlink w:anchor="_Toc243834579" w:history="1">
+      <w:hyperlink w:anchor="_Toc243835772" w:history="1">
         <w:r>
           <w:rPr>
             <w:rStyle w:val="Hipervnculo"/>
@@ -993,7 +993,7 @@
             <w:noProof/>
             <w:webHidden/>
           </w:rPr>
-          <w:instrText xml:space="preserve"> PAGEREF _Toc243834579 \h </w:instrText>
+          <w:instrText xml:space="preserve"> PAGEREF _Toc243835772 \h </w:instrText>
         </w:r>
         <w:r>
           <w:rPr>
@@ -1040,7 +1040,7 @@
           <w14:ligatures w14:val="standardContextual"/>
         </w:rPr>
       </w:pPr>
-      <w:hyperlink w:anchor="_Toc243834580" w:history="1">
+      <w:hyperlink w:anchor="_Toc243835773" w:history="1">
         <w:r>
           <w:rPr>
             <w:rStyle w:val="Hipervnculo"/>
@@ -1067,7 +1067,7 @@
             <w:noProof/>
             <w:webHidden/>
           </w:rPr>
-          <w:instrText xml:space="preserve"> PAGEREF _Toc243834580 \h </w:instrText>
+          <w:instrText xml:space="preserve"> PAGEREF _Toc243835773 \h </w:instrText>
         </w:r>
         <w:r>
           <w:rPr>
@@ -1114,7 +1114,7 @@
           <w14:ligatures w14:val="standardContextual"/>
         </w:rPr>
       </w:pPr>
-      <w:hyperlink w:anchor="_Toc243834581" w:history="1">
+      <w:hyperlink w:anchor="_Toc243835774" w:history="1">
         <w:r>
           <w:rPr>
             <w:rStyle w:val="Hipervnculo"/>
@@ -1141,7 +1141,7 @@
             <w:noProof/>
             <w:webHidden/>
           </w:rPr>
-          <w:instrText xml:space="preserve"> PAGEREF _Toc243834581 \h </w:instrText>
+          <w:instrText xml:space="preserve"> PAGEREF _Toc243835774 \h </w:instrText>
         </w:r>
         <w:r>
           <w:rPr>
@@ -1188,7 +1188,7 @@
           <w14:ligatures w14:val="standardContextual"/>
         </w:rPr>
       </w:pPr>
-      <w:hyperlink w:anchor="_Toc243834582" w:history="1">
+      <w:hyperlink w:anchor="_Toc243835775" w:history="1">
         <w:r>
           <w:rPr>
             <w:rStyle w:val="Hipervnculo"/>
@@ -1215,7 +1215,7 @@
             <w:noProof/>
             <w:webHidden/>
           </w:rPr>
-          <w:instrText xml:space="preserve"> PAGEREF _Toc243834582 \h </w:instrText>
+          <w:instrText xml:space="preserve"> PAGEREF _Toc243835775 \h </w:instrText>
         </w:r>
         <w:r>
           <w:rPr>
@@ -1262,7 +1262,7 @@
           <w14:ligatures w14:val="standardContextual"/>
         </w:rPr>
       </w:pPr>
-      <w:hyperlink w:anchor="_Toc243834583" w:history="1">
+      <w:hyperlink w:anchor="_Toc243835776" w:history="1">
         <w:r>
           <w:rPr>
             <w:rStyle w:val="Hipervnculo"/>
@@ -1289,7 +1289,7 @@
             <w:noProof/>
             <w:webHidden/>
           </w:rPr>
-          <w:instrText xml:space="preserve"> PAGEREF _Toc243834583 \h </w:instrText>
+          <w:instrText xml:space="preserve"> PAGEREF _Toc243835776 \h </w:instrText>
         </w:r>
         <w:r>
           <w:rPr>
@@ -1336,7 +1336,7 @@
           <w14:ligatures w14:val="standardContextual"/>
         </w:rPr>
       </w:pPr>
-      <w:hyperlink w:anchor="_Toc243834584" w:history="1">
+      <w:hyperlink w:anchor="_Toc243835777" w:history="1">
         <w:r>
           <w:rPr>
             <w:rStyle w:val="Hipervnculo"/>
@@ -1363,7 +1363,7 @@
             <w:noProof/>
             <w:webHidden/>
           </w:rPr>
-          <w:instrText xml:space="preserve"> PAGEREF _Toc243834584 \h </w:instrText>
+          <w:instrText xml:space="preserve"> PAGEREF _Toc243835777 \h </w:instrText>
         </w:r>
         <w:r>
           <w:rPr>
@@ -1410,7 +1410,7 @@
           <w14:ligatures w14:val="standardContextual"/>
         </w:rPr>
       </w:pPr>
-      <w:hyperlink w:anchor="_Toc243834585" w:history="1">
+      <w:hyperlink w:anchor="_Toc243835778" w:history="1">
         <w:r>
           <w:rPr>
             <w:rStyle w:val="Hipervnculo"/>
@@ -1437,7 +1437,7 @@
             <w:noProof/>
             <w:webHidden/>
           </w:rPr>
-          <w:instrText xml:space="preserve"> PAGEREF _Toc243834585 \h </w:instrText>
+          <w:instrText xml:space="preserve"> PAGEREF _Toc243835778 \h </w:instrText>
         </w:r>
         <w:r>
           <w:rPr>
@@ -1484,7 +1484,7 @@
           <w14:ligatures w14:val="standardContextual"/>
         </w:rPr>
       </w:pPr>
-      <w:hyperlink w:anchor="_Toc243834586" w:history="1">
+      <w:hyperlink w:anchor="_Toc243835779" w:history="1">
         <w:r>
           <w:rPr>
             <w:rStyle w:val="Hipervnculo"/>
@@ -1511,7 +1511,7 @@
             <w:noProof/>
             <w:webHidden/>
           </w:rPr>
-          <w:instrText xml:space="preserve"> PAGEREF _Toc243834586 \h </w:instrText>
+          <w:instrText xml:space="preserve"> PAGEREF _Toc243835779 \h </w:instrText>
         </w:r>
         <w:r>
           <w:rPr>
@@ -1558,7 +1558,7 @@
           <w14:ligatures w14:val="standardContextual"/>
         </w:rPr>
       </w:pPr>
-      <w:hyperlink w:anchor="_Toc243834587" w:history="1">
+      <w:hyperlink w:anchor="_Toc243835780" w:history="1">
         <w:r>
           <w:rPr>
             <w:rStyle w:val="Hipervnculo"/>
@@ -1585,7 +1585,7 @@
             <w:noProof/>
             <w:webHidden/>
           </w:rPr>
-          <w:instrText xml:space="preserve"> PAGEREF _Toc243834587 \h </w:instrText>
+          <w:instrText xml:space="preserve"> PAGEREF _Toc243835780 \h </w:instrText>
         </w:r>
         <w:r>
           <w:rPr>
@@ -1632,7 +1632,7 @@
           <w14:ligatures w14:val="standardContextual"/>
         </w:rPr>
       </w:pPr>
-      <w:hyperlink w:anchor="_Toc243834588" w:history="1">
+      <w:hyperlink w:anchor="_Toc243835781" w:history="1">
         <w:r>
           <w:rPr>
             <w:rStyle w:val="Hipervnculo"/>
@@ -1659,7 +1659,7 @@
             <w:noProof/>
             <w:webHidden/>
           </w:rPr>
-          <w:instrText xml:space="preserve"> PAGEREF _Toc243834588 \h </w:instrText>
+          <w:instrText xml:space="preserve"> PAGEREF _Toc243835781 \h </w:instrText>
         </w:r>
         <w:r>
           <w:rPr>
@@ -1706,7 +1706,7 @@
           <w14:ligatures w14:val="standardContextual"/>
         </w:rPr>
       </w:pPr>
-      <w:hyperlink w:anchor="_Toc243834589" w:history="1">
+      <w:hyperlink w:anchor="_Toc243835782" w:history="1">
         <w:r>
           <w:rPr>
             <w:rStyle w:val="Hipervnculo"/>
@@ -1733,7 +1733,7 @@
             <w:noProof/>
             <w:webHidden/>
           </w:rPr>
-          <w:instrText xml:space="preserve"> PAGEREF _Toc243834589 \h </w:instrText>
+          <w:instrText xml:space="preserve"> PAGEREF _Toc243835782 \h </w:instrText>
         </w:r>
         <w:r>
           <w:rPr>
@@ -1780,7 +1780,7 @@
           <w14:ligatures w14:val="standardContextual"/>
         </w:rPr>
       </w:pPr>
-      <w:hyperlink w:anchor="_Toc243834590" w:history="1">
+      <w:hyperlink w:anchor="_Toc243835783" w:history="1">
         <w:r>
           <w:rPr>
             <w:rStyle w:val="Hipervnculo"/>
@@ -1807,7 +1807,7 @@
             <w:noProof/>
             <w:webHidden/>
           </w:rPr>
-          <w:instrText xml:space="preserve"> PAGEREF _Toc243834590 \h </w:instrText>
+          <w:instrText xml:space="preserve"> PAGEREF _Toc243835783 \h </w:instrText>
         </w:r>
         <w:r>
           <w:rPr>
@@ -1854,13 +1854,13 @@
           <w14:ligatures w14:val="standardContextual"/>
         </w:rPr>
       </w:pPr>
-      <w:hyperlink w:anchor="_Toc243834591" w:history="1">
+      <w:hyperlink w:anchor="_Toc243835784" w:history="1">
         <w:r>
           <w:rPr>
             <w:rStyle w:val="Hipervnculo"/>
             <w:noProof/>
           </w:rPr>
-          <w:t>4. Procesamiento de datos y Machine Learning</w:t>
+          <w:t>4. Procesamiento de datos y aprendizaje automático</w:t>
         </w:r>
         <w:r>
           <w:rPr>
@@ -1881,7 +1881,7 @@
             <w:noProof/>
             <w:webHidden/>
           </w:rPr>
-          <w:instrText xml:space="preserve"> PAGEREF _Toc243834591 \h </w:instrText>
+          <w:instrText xml:space="preserve"> PAGEREF _Toc243835784 \h </w:instrText>
         </w:r>
         <w:r>
           <w:rPr>
@@ -1928,7 +1928,7 @@
           <w14:ligatures w14:val="standardContextual"/>
         </w:rPr>
       </w:pPr>
-      <w:hyperlink w:anchor="_Toc243834592" w:history="1">
+      <w:hyperlink w:anchor="_Toc243835785" w:history="1">
         <w:r>
           <w:rPr>
             <w:rStyle w:val="Hipervnculo"/>
@@ -1955,7 +1955,7 @@
             <w:noProof/>
             <w:webHidden/>
           </w:rPr>
-          <w:instrText xml:space="preserve"> PAGEREF _Toc243834592 \h </w:instrText>
+          <w:instrText xml:space="preserve"> PAGEREF _Toc243835785 \h </w:instrText>
         </w:r>
         <w:r>
           <w:rPr>
@@ -2002,7 +2002,7 @@
           <w14:ligatures w14:val="standardContextual"/>
         </w:rPr>
       </w:pPr>
-      <w:hyperlink w:anchor="_Toc243834593" w:history="1">
+      <w:hyperlink w:anchor="_Toc243835786" w:history="1">
         <w:r>
           <w:rPr>
             <w:rStyle w:val="Hipervnculo"/>
@@ -2029,7 +2029,7 @@
             <w:noProof/>
             <w:webHidden/>
           </w:rPr>
-          <w:instrText xml:space="preserve"> PAGEREF _Toc243834593 \h </w:instrText>
+          <w:instrText xml:space="preserve"> PAGEREF _Toc243835786 \h </w:instrText>
         </w:r>
         <w:r>
           <w:rPr>
@@ -2076,7 +2076,7 @@
           <w14:ligatures w14:val="standardContextual"/>
         </w:rPr>
       </w:pPr>
-      <w:hyperlink w:anchor="_Toc243834594" w:history="1">
+      <w:hyperlink w:anchor="_Toc243835787" w:history="1">
         <w:r>
           <w:rPr>
             <w:rStyle w:val="Hipervnculo"/>
@@ -2103,7 +2103,7 @@
             <w:noProof/>
             <w:webHidden/>
           </w:rPr>
-          <w:instrText xml:space="preserve"> PAGEREF _Toc243834594 \h </w:instrText>
+          <w:instrText xml:space="preserve"> PAGEREF _Toc243835787 \h </w:instrText>
         </w:r>
         <w:r>
           <w:rPr>
@@ -2150,7 +2150,7 @@
           <w14:ligatures w14:val="standardContextual"/>
         </w:rPr>
       </w:pPr>
-      <w:hyperlink w:anchor="_Toc243834595" w:history="1">
+      <w:hyperlink w:anchor="_Toc243835788" w:history="1">
         <w:r>
           <w:rPr>
             <w:rStyle w:val="Hipervnculo"/>
@@ -2177,7 +2177,7 @@
             <w:noProof/>
             <w:webHidden/>
           </w:rPr>
-          <w:instrText xml:space="preserve"> PAGEREF _Toc243834595 \h </w:instrText>
+          <w:instrText xml:space="preserve"> PAGEREF _Toc243835788 \h </w:instrText>
         </w:r>
         <w:r>
           <w:rPr>
@@ -2224,7 +2224,7 @@
           <w14:ligatures w14:val="standardContextual"/>
         </w:rPr>
       </w:pPr>
-      <w:hyperlink w:anchor="_Toc243834596" w:history="1">
+      <w:hyperlink w:anchor="_Toc243835789" w:history="1">
         <w:r>
           <w:rPr>
             <w:rStyle w:val="Hipervnculo"/>
@@ -2251,7 +2251,7 @@
             <w:noProof/>
             <w:webHidden/>
           </w:rPr>
-          <w:instrText xml:space="preserve"> PAGEREF _Toc243834596 \h </w:instrText>
+          <w:instrText xml:space="preserve"> PAGEREF _Toc243835789 \h </w:instrText>
         </w:r>
         <w:r>
           <w:rPr>
@@ -2298,7 +2298,7 @@
           <w14:ligatures w14:val="standardContextual"/>
         </w:rPr>
       </w:pPr>
-      <w:hyperlink w:anchor="_Toc243834597" w:history="1">
+      <w:hyperlink w:anchor="_Toc243835790" w:history="1">
         <w:r>
           <w:rPr>
             <w:rStyle w:val="Hipervnculo"/>
@@ -2325,7 +2325,7 @@
             <w:noProof/>
             <w:webHidden/>
           </w:rPr>
-          <w:instrText xml:space="preserve"> PAGEREF _Toc243834597 \h </w:instrText>
+          <w:instrText xml:space="preserve"> PAGEREF _Toc243835790 \h </w:instrText>
         </w:r>
         <w:r>
           <w:rPr>
@@ -2372,7 +2372,7 @@
           <w14:ligatures w14:val="standardContextual"/>
         </w:rPr>
       </w:pPr>
-      <w:hyperlink w:anchor="_Toc243834598" w:history="1">
+      <w:hyperlink w:anchor="_Toc243835791" w:history="1">
         <w:r>
           <w:rPr>
             <w:rStyle w:val="Hipervnculo"/>
@@ -2399,7 +2399,7 @@
             <w:noProof/>
             <w:webHidden/>
           </w:rPr>
-          <w:instrText xml:space="preserve"> PAGEREF _Toc243834598 \h </w:instrText>
+          <w:instrText xml:space="preserve"> PAGEREF _Toc243835791 \h </w:instrText>
         </w:r>
         <w:r>
           <w:rPr>
@@ -2446,7 +2446,7 @@
           <w14:ligatures w14:val="standardContextual"/>
         </w:rPr>
       </w:pPr>
-      <w:hyperlink w:anchor="_Toc243834599" w:history="1">
+      <w:hyperlink w:anchor="_Toc243835792" w:history="1">
         <w:r>
           <w:rPr>
             <w:rStyle w:val="Hipervnculo"/>
@@ -2473,7 +2473,7 @@
             <w:noProof/>
             <w:webHidden/>
           </w:rPr>
-          <w:instrText xml:space="preserve"> PAGEREF _Toc243834599 \h </w:instrText>
+          <w:instrText xml:space="preserve"> PAGEREF _Toc243835792 \h </w:instrText>
         </w:r>
         <w:r>
           <w:rPr>
@@ -2520,7 +2520,7 @@
           <w14:ligatures w14:val="standardContextual"/>
         </w:rPr>
       </w:pPr>
-      <w:hyperlink w:anchor="_Toc243834600" w:history="1">
+      <w:hyperlink w:anchor="_Toc243835793" w:history="1">
         <w:r>
           <w:rPr>
             <w:rStyle w:val="Hipervnculo"/>
@@ -2547,7 +2547,7 @@
             <w:noProof/>
             <w:webHidden/>
           </w:rPr>
-          <w:instrText xml:space="preserve"> PAGEREF _Toc243834600 \h </w:instrText>
+          <w:instrText xml:space="preserve"> PAGEREF _Toc243835793 \h </w:instrText>
         </w:r>
         <w:r>
           <w:rPr>
@@ -2594,7 +2594,7 @@
           <w14:ligatures w14:val="standardContextual"/>
         </w:rPr>
       </w:pPr>
-      <w:hyperlink w:anchor="_Toc243834601" w:history="1">
+      <w:hyperlink w:anchor="_Toc243835794" w:history="1">
         <w:r>
           <w:rPr>
             <w:rStyle w:val="Hipervnculo"/>
@@ -2621,7 +2621,7 @@
             <w:noProof/>
             <w:webHidden/>
           </w:rPr>
-          <w:instrText xml:space="preserve"> PAGEREF _Toc243834601 \h </w:instrText>
+          <w:instrText xml:space="preserve"> PAGEREF _Toc243835794 \h </w:instrText>
         </w:r>
         <w:r>
           <w:rPr>
@@ -2668,7 +2668,7 @@
           <w14:ligatures w14:val="standardContextual"/>
         </w:rPr>
       </w:pPr>
-      <w:hyperlink w:anchor="_Toc243834602" w:history="1">
+      <w:hyperlink w:anchor="_Toc243835795" w:history="1">
         <w:r>
           <w:rPr>
             <w:rStyle w:val="Hipervnculo"/>
@@ -2695,7 +2695,7 @@
             <w:noProof/>
             <w:webHidden/>
           </w:rPr>
-          <w:instrText xml:space="preserve"> PAGEREF _Toc243834602 \h </w:instrText>
+          <w:instrText xml:space="preserve"> PAGEREF _Toc243835795 \h </w:instrText>
         </w:r>
         <w:r>
           <w:rPr>
@@ -2742,7 +2742,7 @@
           <w14:ligatures w14:val="standardContextual"/>
         </w:rPr>
       </w:pPr>
-      <w:hyperlink w:anchor="_Toc243834603" w:history="1">
+      <w:hyperlink w:anchor="_Toc243835796" w:history="1">
         <w:r>
           <w:rPr>
             <w:rStyle w:val="Hipervnculo"/>
@@ -2769,7 +2769,7 @@
             <w:noProof/>
             <w:webHidden/>
           </w:rPr>
-          <w:instrText xml:space="preserve"> PAGEREF _Toc243834603 \h </w:instrText>
+          <w:instrText xml:space="preserve"> PAGEREF _Toc243835796 \h </w:instrText>
         </w:r>
         <w:r>
           <w:rPr>
@@ -2816,7 +2816,7 @@
           <w14:ligatures w14:val="standardContextual"/>
         </w:rPr>
       </w:pPr>
-      <w:hyperlink w:anchor="_Toc243834604" w:history="1">
+      <w:hyperlink w:anchor="_Toc243835797" w:history="1">
         <w:r>
           <w:rPr>
             <w:rStyle w:val="Hipervnculo"/>
@@ -2843,7 +2843,7 @@
             <w:noProof/>
             <w:webHidden/>
           </w:rPr>
-          <w:instrText xml:space="preserve"> PAGEREF _Toc243834604 \h </w:instrText>
+          <w:instrText xml:space="preserve"> PAGEREF _Toc243835797 \h </w:instrText>
         </w:r>
         <w:r>
           <w:rPr>
@@ -2890,7 +2890,7 @@
           <w14:ligatures w14:val="standardContextual"/>
         </w:rPr>
       </w:pPr>
-      <w:hyperlink w:anchor="_Toc243834605" w:history="1">
+      <w:hyperlink w:anchor="_Toc243835798" w:history="1">
         <w:r>
           <w:rPr>
             <w:rStyle w:val="Hipervnculo"/>
@@ -2917,7 +2917,7 @@
             <w:noProof/>
             <w:webHidden/>
           </w:rPr>
-          <w:instrText xml:space="preserve"> PAGEREF _Toc243834605 \h </w:instrText>
+          <w:instrText xml:space="preserve"> PAGEREF _Toc243835798 \h </w:instrText>
         </w:r>
         <w:r>
           <w:rPr>
@@ -2964,7 +2964,7 @@
           <w14:ligatures w14:val="standardContextual"/>
         </w:rPr>
       </w:pPr>
-      <w:hyperlink w:anchor="_Toc243834606" w:history="1">
+      <w:hyperlink w:anchor="_Toc243835799" w:history="1">
         <w:r>
           <w:rPr>
             <w:rStyle w:val="Hipervnculo"/>
@@ -2991,7 +2991,7 @@
             <w:noProof/>
             <w:webHidden/>
           </w:rPr>
-          <w:instrText xml:space="preserve"> PAGEREF _Toc243834606 \h </w:instrText>
+          <w:instrText xml:space="preserve"> PAGEREF _Toc243835799 \h </w:instrText>
         </w:r>
         <w:r>
           <w:rPr>
@@ -3038,7 +3038,7 @@
           <w14:ligatures w14:val="standardContextual"/>
         </w:rPr>
       </w:pPr>
-      <w:hyperlink w:anchor="_Toc243834607" w:history="1">
+      <w:hyperlink w:anchor="_Toc243835800" w:history="1">
         <w:r>
           <w:rPr>
             <w:rStyle w:val="Hipervnculo"/>
@@ -3065,7 +3065,7 @@
             <w:noProof/>
             <w:webHidden/>
           </w:rPr>
-          <w:instrText xml:space="preserve"> PAGEREF _Toc243834607 \h </w:instrText>
+          <w:instrText xml:space="preserve"> PAGEREF _Toc243835800 \h </w:instrText>
         </w:r>
         <w:r>
           <w:rPr>
@@ -3112,7 +3112,7 @@
           <w14:ligatures w14:val="standardContextual"/>
         </w:rPr>
       </w:pPr>
-      <w:hyperlink w:anchor="_Toc243834608" w:history="1">
+      <w:hyperlink w:anchor="_Toc243835801" w:history="1">
         <w:r>
           <w:rPr>
             <w:rStyle w:val="Hipervnculo"/>
@@ -3139,7 +3139,7 @@
             <w:noProof/>
             <w:webHidden/>
           </w:rPr>
-          <w:instrText xml:space="preserve"> PAGEREF _Toc243834608 \h </w:instrText>
+          <w:instrText xml:space="preserve"> PAGEREF _Toc243835801 \h </w:instrText>
         </w:r>
         <w:r>
           <w:rPr>
@@ -3186,7 +3186,7 @@
           <w14:ligatures w14:val="standardContextual"/>
         </w:rPr>
       </w:pPr>
-      <w:hyperlink w:anchor="_Toc243834609" w:history="1">
+      <w:hyperlink w:anchor="_Toc243835802" w:history="1">
         <w:r>
           <w:rPr>
             <w:rStyle w:val="Hipervnculo"/>
@@ -3213,7 +3213,7 @@
             <w:noProof/>
             <w:webHidden/>
           </w:rPr>
-          <w:instrText xml:space="preserve"> PAGEREF _Toc243834609 \h </w:instrText>
+          <w:instrText xml:space="preserve"> PAGEREF _Toc243835802 \h </w:instrText>
         </w:r>
         <w:r>
           <w:rPr>
@@ -3260,7 +3260,7 @@
           <w14:ligatures w14:val="standardContextual"/>
         </w:rPr>
       </w:pPr>
-      <w:hyperlink w:anchor="_Toc243834610" w:history="1">
+      <w:hyperlink w:anchor="_Toc243835803" w:history="1">
         <w:r>
           <w:rPr>
             <w:rStyle w:val="Hipervnculo"/>
@@ -3287,7 +3287,7 @@
             <w:noProof/>
             <w:webHidden/>
           </w:rPr>
-          <w:instrText xml:space="preserve"> PAGEREF _Toc243834610 \h </w:instrText>
+          <w:instrText xml:space="preserve"> PAGEREF _Toc243835803 \h </w:instrText>
         </w:r>
         <w:r>
           <w:rPr>
@@ -3334,7 +3334,7 @@
           <w14:ligatures w14:val="standardContextual"/>
         </w:rPr>
       </w:pPr>
-      <w:hyperlink w:anchor="_Toc243834611" w:history="1">
+      <w:hyperlink w:anchor="_Toc243835804" w:history="1">
         <w:r>
           <w:rPr>
             <w:rStyle w:val="Hipervnculo"/>
@@ -3361,7 +3361,7 @@
             <w:noProof/>
             <w:webHidden/>
           </w:rPr>
-          <w:instrText xml:space="preserve"> PAGEREF _Toc243834611 \h </w:instrText>
+          <w:instrText xml:space="preserve"> PAGEREF _Toc243835804 \h </w:instrText>
         </w:r>
         <w:r>
           <w:rPr>
@@ -3408,7 +3408,7 @@
           <w14:ligatures w14:val="standardContextual"/>
         </w:rPr>
       </w:pPr>
-      <w:hyperlink w:anchor="_Toc243834612" w:history="1">
+      <w:hyperlink w:anchor="_Toc243835805" w:history="1">
         <w:r>
           <w:rPr>
             <w:rStyle w:val="Hipervnculo"/>
@@ -3435,7 +3435,7 @@
             <w:noProof/>
             <w:webHidden/>
           </w:rPr>
-          <w:instrText xml:space="preserve"> PAGEREF _Toc243834612 \h </w:instrText>
+          <w:instrText xml:space="preserve"> PAGEREF _Toc243835805 \h </w:instrText>
         </w:r>
         <w:r>
           <w:rPr>
@@ -3482,7 +3482,7 @@
           <w14:ligatures w14:val="standardContextual"/>
         </w:rPr>
       </w:pPr>
-      <w:hyperlink w:anchor="_Toc243834613" w:history="1">
+      <w:hyperlink w:anchor="_Toc243835806" w:history="1">
         <w:r>
           <w:rPr>
             <w:rStyle w:val="Hipervnculo"/>
@@ -3509,7 +3509,7 @@
             <w:noProof/>
             <w:webHidden/>
           </w:rPr>
-          <w:instrText xml:space="preserve"> PAGEREF _Toc243834613 \h </w:instrText>
+          <w:instrText xml:space="preserve"> PAGEREF _Toc243835806 \h </w:instrText>
         </w:r>
         <w:r>
           <w:rPr>
@@ -3556,7 +3556,7 @@
           <w14:ligatures w14:val="standardContextual"/>
         </w:rPr>
       </w:pPr>
-      <w:hyperlink w:anchor="_Toc243834614" w:history="1">
+      <w:hyperlink w:anchor="_Toc243835807" w:history="1">
         <w:r>
           <w:rPr>
             <w:rStyle w:val="Hipervnculo"/>
@@ -3583,7 +3583,7 @@
             <w:noProof/>
             <w:webHidden/>
           </w:rPr>
-          <w:instrText xml:space="preserve"> PAGEREF _Toc243834614 \h </w:instrText>
+          <w:instrText xml:space="preserve"> PAGEREF _Toc243835807 \h </w:instrText>
         </w:r>
         <w:r>
           <w:rPr>
@@ -3630,7 +3630,7 @@
           <w14:ligatures w14:val="standardContextual"/>
         </w:rPr>
       </w:pPr>
-      <w:hyperlink w:anchor="_Toc243834615" w:history="1">
+      <w:hyperlink w:anchor="_Toc243835808" w:history="1">
         <w:r>
           <w:rPr>
             <w:rStyle w:val="Hipervnculo"/>
@@ -3657,7 +3657,7 @@
             <w:noProof/>
             <w:webHidden/>
           </w:rPr>
-          <w:instrText xml:space="preserve"> PAGEREF _Toc243834615 \h </w:instrText>
+          <w:instrText xml:space="preserve"> PAGEREF _Toc243835808 \h </w:instrText>
         </w:r>
         <w:r>
           <w:rPr>
@@ -3704,7 +3704,7 @@
           <w14:ligatures w14:val="standardContextual"/>
         </w:rPr>
       </w:pPr>
-      <w:hyperlink w:anchor="_Toc243834616" w:history="1">
+      <w:hyperlink w:anchor="_Toc243835809" w:history="1">
         <w:r>
           <w:rPr>
             <w:rStyle w:val="Hipervnculo"/>
@@ -3731,7 +3731,7 @@
             <w:noProof/>
             <w:webHidden/>
           </w:rPr>
-          <w:instrText xml:space="preserve"> PAGEREF _Toc243834616 \h </w:instrText>
+          <w:instrText xml:space="preserve"> PAGEREF _Toc243835809 \h </w:instrText>
         </w:r>
         <w:r>
           <w:rPr>
@@ -3778,7 +3778,7 @@
           <w14:ligatures w14:val="standardContextual"/>
         </w:rPr>
       </w:pPr>
-      <w:hyperlink w:anchor="_Toc243834617" w:history="1">
+      <w:hyperlink w:anchor="_Toc243835810" w:history="1">
         <w:r>
           <w:rPr>
             <w:rStyle w:val="Hipervnculo"/>
@@ -3805,7 +3805,7 @@
             <w:noProof/>
             <w:webHidden/>
           </w:rPr>
-          <w:instrText xml:space="preserve"> PAGEREF _Toc243834617 \h </w:instrText>
+          <w:instrText xml:space="preserve"> PAGEREF _Toc243835810 \h </w:instrText>
         </w:r>
         <w:r>
           <w:rPr>
@@ -3852,7 +3852,7 @@
           <w14:ligatures w14:val="standardContextual"/>
         </w:rPr>
       </w:pPr>
-      <w:hyperlink w:anchor="_Toc243834618" w:history="1">
+      <w:hyperlink w:anchor="_Toc243835811" w:history="1">
         <w:r>
           <w:rPr>
             <w:rStyle w:val="Hipervnculo"/>
@@ -3879,7 +3879,7 @@
             <w:noProof/>
             <w:webHidden/>
           </w:rPr>
-          <w:instrText xml:space="preserve"> PAGEREF _Toc243834618 \h </w:instrText>
+          <w:instrText xml:space="preserve"> PAGEREF _Toc243835811 \h </w:instrText>
         </w:r>
         <w:r>
           <w:rPr>
@@ -3926,7 +3926,7 @@
           <w14:ligatures w14:val="standardContextual"/>
         </w:rPr>
       </w:pPr>
-      <w:hyperlink w:anchor="_Toc243834619" w:history="1">
+      <w:hyperlink w:anchor="_Toc243835812" w:history="1">
         <w:r>
           <w:rPr>
             <w:rStyle w:val="Hipervnculo"/>
@@ -3953,7 +3953,7 @@
             <w:noProof/>
             <w:webHidden/>
           </w:rPr>
-          <w:instrText xml:space="preserve"> PAGEREF _Toc243834619 \h </w:instrText>
+          <w:instrText xml:space="preserve"> PAGEREF _Toc243835812 \h </w:instrText>
         </w:r>
         <w:r>
           <w:rPr>
@@ -4000,7 +4000,7 @@
           <w14:ligatures w14:val="standardContextual"/>
         </w:rPr>
       </w:pPr>
-      <w:hyperlink w:anchor="_Toc243834620" w:history="1">
+      <w:hyperlink w:anchor="_Toc243835813" w:history="1">
         <w:r>
           <w:rPr>
             <w:rStyle w:val="Hipervnculo"/>
@@ -4027,7 +4027,7 @@
             <w:noProof/>
             <w:webHidden/>
           </w:rPr>
-          <w:instrText xml:space="preserve"> PAGEREF _Toc243834620 \h </w:instrText>
+          <w:instrText xml:space="preserve"> PAGEREF _Toc243835813 \h </w:instrText>
         </w:r>
         <w:r>
           <w:rPr>
@@ -4074,7 +4074,7 @@
           <w14:ligatures w14:val="standardContextual"/>
         </w:rPr>
       </w:pPr>
-      <w:hyperlink w:anchor="_Toc243834621" w:history="1">
+      <w:hyperlink w:anchor="_Toc243835814" w:history="1">
         <w:r>
           <w:rPr>
             <w:rStyle w:val="Hipervnculo"/>
@@ -4101,7 +4101,7 @@
             <w:noProof/>
             <w:webHidden/>
           </w:rPr>
-          <w:instrText xml:space="preserve"> PAGEREF _Toc243834621 \h </w:instrText>
+          <w:instrText xml:space="preserve"> PAGEREF _Toc243835814 \h </w:instrText>
         </w:r>
         <w:r>
           <w:rPr>
@@ -4148,7 +4148,7 @@
           <w14:ligatures w14:val="standardContextual"/>
         </w:rPr>
       </w:pPr>
-      <w:hyperlink w:anchor="_Toc243834622" w:history="1">
+      <w:hyperlink w:anchor="_Toc243835815" w:history="1">
         <w:r>
           <w:rPr>
             <w:rStyle w:val="Hipervnculo"/>
@@ -4175,7 +4175,7 @@
             <w:noProof/>
             <w:webHidden/>
           </w:rPr>
-          <w:instrText xml:space="preserve"> PAGEREF _Toc243834622 \h </w:instrText>
+          <w:instrText xml:space="preserve"> PAGEREF _Toc243835815 \h </w:instrText>
         </w:r>
         <w:r>
           <w:rPr>
@@ -4222,7 +4222,7 @@
           <w14:ligatures w14:val="standardContextual"/>
         </w:rPr>
       </w:pPr>
-      <w:hyperlink w:anchor="_Toc243834623" w:history="1">
+      <w:hyperlink w:anchor="_Toc243835816" w:history="1">
         <w:r>
           <w:rPr>
             <w:rStyle w:val="Hipervnculo"/>
@@ -4249,7 +4249,7 @@
             <w:noProof/>
             <w:webHidden/>
           </w:rPr>
-          <w:instrText xml:space="preserve"> PAGEREF _Toc243834623 \h </w:instrText>
+          <w:instrText xml:space="preserve"> PAGEREF _Toc243835816 \h </w:instrText>
         </w:r>
         <w:r>
           <w:rPr>
@@ -4296,7 +4296,7 @@
           <w14:ligatures w14:val="standardContextual"/>
         </w:rPr>
       </w:pPr>
-      <w:hyperlink w:anchor="_Toc243834624" w:history="1">
+      <w:hyperlink w:anchor="_Toc243835817" w:history="1">
         <w:r>
           <w:rPr>
             <w:rStyle w:val="Hipervnculo"/>
@@ -4323,7 +4323,7 @@
             <w:noProof/>
             <w:webHidden/>
           </w:rPr>
-          <w:instrText xml:space="preserve"> PAGEREF _Toc243834624 \h </w:instrText>
+          <w:instrText xml:space="preserve"> PAGEREF _Toc243835817 \h </w:instrText>
         </w:r>
         <w:r>
           <w:rPr>
@@ -4370,7 +4370,7 @@
           <w14:ligatures w14:val="standardContextual"/>
         </w:rPr>
       </w:pPr>
-      <w:hyperlink w:anchor="_Toc243834625" w:history="1">
+      <w:hyperlink w:anchor="_Toc243835818" w:history="1">
         <w:r>
           <w:rPr>
             <w:rStyle w:val="Hipervnculo"/>
@@ -4397,7 +4397,7 @@
             <w:noProof/>
             <w:webHidden/>
           </w:rPr>
-          <w:instrText xml:space="preserve"> PAGEREF _Toc243834625 \h </w:instrText>
+          <w:instrText xml:space="preserve"> PAGEREF _Toc243835818 \h </w:instrText>
         </w:r>
         <w:r>
           <w:rPr>
@@ -4444,7 +4444,7 @@
           <w14:ligatures w14:val="standardContextual"/>
         </w:rPr>
       </w:pPr>
-      <w:hyperlink w:anchor="_Toc243834626" w:history="1">
+      <w:hyperlink w:anchor="_Toc243835819" w:history="1">
         <w:r>
           <w:rPr>
             <w:rStyle w:val="Hipervnculo"/>
@@ -4471,7 +4471,7 @@
             <w:noProof/>
             <w:webHidden/>
           </w:rPr>
-          <w:instrText xml:space="preserve"> PAGEREF _Toc243834626 \h </w:instrText>
+          <w:instrText xml:space="preserve"> PAGEREF _Toc243835819 \h </w:instrText>
         </w:r>
         <w:r>
           <w:rPr>
@@ -4518,7 +4518,7 @@
           <w14:ligatures w14:val="standardContextual"/>
         </w:rPr>
       </w:pPr>
-      <w:hyperlink w:anchor="_Toc243834627" w:history="1">
+      <w:hyperlink w:anchor="_Toc243835820" w:history="1">
         <w:r>
           <w:rPr>
             <w:rStyle w:val="Hipervnculo"/>
@@ -4545,7 +4545,7 @@
             <w:noProof/>
             <w:webHidden/>
           </w:rPr>
-          <w:instrText xml:space="preserve"> PAGEREF _Toc243834627 \h </w:instrText>
+          <w:instrText xml:space="preserve"> PAGEREF _Toc243835820 \h </w:instrText>
         </w:r>
         <w:r>
           <w:rPr>
@@ -4592,7 +4592,7 @@
           <w14:ligatures w14:val="standardContextual"/>
         </w:rPr>
       </w:pPr>
-      <w:hyperlink w:anchor="_Toc243834628" w:history="1">
+      <w:hyperlink w:anchor="_Toc243835821" w:history="1">
         <w:r>
           <w:rPr>
             <w:rStyle w:val="Hipervnculo"/>
@@ -4619,7 +4619,7 @@
             <w:noProof/>
             <w:webHidden/>
           </w:rPr>
-          <w:instrText xml:space="preserve"> PAGEREF _Toc243834628 \h </w:instrText>
+          <w:instrText xml:space="preserve"> PAGEREF _Toc243835821 \h </w:instrText>
         </w:r>
         <w:r>
           <w:rPr>
@@ -4666,7 +4666,7 @@
           <w14:ligatures w14:val="standardContextual"/>
         </w:rPr>
       </w:pPr>
-      <w:hyperlink w:anchor="_Toc243834629" w:history="1">
+      <w:hyperlink w:anchor="_Toc243835822" w:history="1">
         <w:r>
           <w:rPr>
             <w:rStyle w:val="Hipervnculo"/>
@@ -4693,7 +4693,7 @@
             <w:noProof/>
             <w:webHidden/>
           </w:rPr>
-          <w:instrText xml:space="preserve"> PAGEREF _Toc243834629 \h </w:instrText>
+          <w:instrText xml:space="preserve"> PAGEREF _Toc243835822 \h </w:instrText>
         </w:r>
         <w:r>
           <w:rPr>
@@ -4740,7 +4740,7 @@
           <w14:ligatures w14:val="standardContextual"/>
         </w:rPr>
       </w:pPr>
-      <w:hyperlink w:anchor="_Toc243834630" w:history="1">
+      <w:hyperlink w:anchor="_Toc243835823" w:history="1">
         <w:r>
           <w:rPr>
             <w:rStyle w:val="Hipervnculo"/>
@@ -4767,7 +4767,7 @@
             <w:noProof/>
             <w:webHidden/>
           </w:rPr>
-          <w:instrText xml:space="preserve"> PAGEREF _Toc243834630 \h </w:instrText>
+          <w:instrText xml:space="preserve"> PAGEREF _Toc243835823 \h </w:instrText>
         </w:r>
         <w:r>
           <w:rPr>
@@ -4814,7 +4814,7 @@
           <w14:ligatures w14:val="standardContextual"/>
         </w:rPr>
       </w:pPr>
-      <w:hyperlink w:anchor="_Toc243834631" w:history="1">
+      <w:hyperlink w:anchor="_Toc243835824" w:history="1">
         <w:r>
           <w:rPr>
             <w:rStyle w:val="Hipervnculo"/>
@@ -4841,7 +4841,7 @@
             <w:noProof/>
             <w:webHidden/>
           </w:rPr>
-          <w:instrText xml:space="preserve"> PAGEREF _Toc243834631 \h </w:instrText>
+          <w:instrText xml:space="preserve"> PAGEREF _Toc243835824 \h </w:instrText>
         </w:r>
         <w:r>
           <w:rPr>
@@ -4888,7 +4888,7 @@
           <w14:ligatures w14:val="standardContextual"/>
         </w:rPr>
       </w:pPr>
-      <w:hyperlink w:anchor="_Toc243834632" w:history="1">
+      <w:hyperlink w:anchor="_Toc243835825" w:history="1">
         <w:r>
           <w:rPr>
             <w:rStyle w:val="Hipervnculo"/>
@@ -4915,7 +4915,7 @@
             <w:noProof/>
             <w:webHidden/>
           </w:rPr>
-          <w:instrText xml:space="preserve"> PAGEREF _Toc243834632 \h </w:instrText>
+          <w:instrText xml:space="preserve"> PAGEREF _Toc243835825 \h </w:instrText>
         </w:r>
         <w:r>
           <w:rPr>
@@ -4962,7 +4962,7 @@
           <w14:ligatures w14:val="standardContextual"/>
         </w:rPr>
       </w:pPr>
-      <w:hyperlink w:anchor="_Toc243834633" w:history="1">
+      <w:hyperlink w:anchor="_Toc243835826" w:history="1">
         <w:r>
           <w:rPr>
             <w:rStyle w:val="Hipervnculo"/>
@@ -4989,7 +4989,7 @@
             <w:noProof/>
             <w:webHidden/>
           </w:rPr>
-          <w:instrText xml:space="preserve"> PAGEREF _Toc243834633 \h </w:instrText>
+          <w:instrText xml:space="preserve"> PAGEREF _Toc243835826 \h </w:instrText>
         </w:r>
         <w:r>
           <w:rPr>
@@ -5036,7 +5036,7 @@
           <w14:ligatures w14:val="standardContextual"/>
         </w:rPr>
       </w:pPr>
-      <w:hyperlink w:anchor="_Toc243834634" w:history="1">
+      <w:hyperlink w:anchor="_Toc243835827" w:history="1">
         <w:r>
           <w:rPr>
             <w:rStyle w:val="Hipervnculo"/>
@@ -5063,7 +5063,7 @@
             <w:noProof/>
             <w:webHidden/>
           </w:rPr>
-          <w:instrText xml:space="preserve"> PAGEREF _Toc243834634 \h </w:instrText>
+          <w:instrText xml:space="preserve"> PAGEREF _Toc243835827 \h </w:instrText>
         </w:r>
         <w:r>
           <w:rPr>
@@ -5110,7 +5110,7 @@
           <w14:ligatures w14:val="standardContextual"/>
         </w:rPr>
       </w:pPr>
-      <w:hyperlink w:anchor="_Toc243834635" w:history="1">
+      <w:hyperlink w:anchor="_Toc243835828" w:history="1">
         <w:r>
           <w:rPr>
             <w:rStyle w:val="Hipervnculo"/>
@@ -5137,7 +5137,7 @@
             <w:noProof/>
             <w:webHidden/>
           </w:rPr>
-          <w:instrText xml:space="preserve"> PAGEREF _Toc243834635 \h </w:instrText>
+          <w:instrText xml:space="preserve"> PAGEREF _Toc243835828 \h </w:instrText>
         </w:r>
         <w:r>
           <w:rPr>
@@ -5184,7 +5184,7 @@
           <w14:ligatures w14:val="standardContextual"/>
         </w:rPr>
       </w:pPr>
-      <w:hyperlink w:anchor="_Toc243834636" w:history="1">
+      <w:hyperlink w:anchor="_Toc243835829" w:history="1">
         <w:r>
           <w:rPr>
             <w:rStyle w:val="Hipervnculo"/>
@@ -5211,7 +5211,7 @@
             <w:noProof/>
             <w:webHidden/>
           </w:rPr>
-          <w:instrText xml:space="preserve"> PAGEREF _Toc243834636 \h </w:instrText>
+          <w:instrText xml:space="preserve"> PAGEREF _Toc243835829 \h </w:instrText>
         </w:r>
         <w:r>
           <w:rPr>
@@ -5258,7 +5258,7 @@
           <w14:ligatures w14:val="standardContextual"/>
         </w:rPr>
       </w:pPr>
-      <w:hyperlink w:anchor="_Toc243834637" w:history="1">
+      <w:hyperlink w:anchor="_Toc243835830" w:history="1">
         <w:r>
           <w:rPr>
             <w:rStyle w:val="Hipervnculo"/>
@@ -5285,7 +5285,7 @@
             <w:noProof/>
             <w:webHidden/>
           </w:rPr>
-          <w:instrText xml:space="preserve"> PAGEREF _Toc243834637 \h </w:instrText>
+          <w:instrText xml:space="preserve"> PAGEREF _Toc243835830 \h </w:instrText>
         </w:r>
         <w:r>
           <w:rPr>
@@ -5332,7 +5332,7 @@
           <w14:ligatures w14:val="standardContextual"/>
         </w:rPr>
       </w:pPr>
-      <w:hyperlink w:anchor="_Toc243834638" w:history="1">
+      <w:hyperlink w:anchor="_Toc243835831" w:history="1">
         <w:r>
           <w:rPr>
             <w:rStyle w:val="Hipervnculo"/>
@@ -5359,7 +5359,7 @@
             <w:noProof/>
             <w:webHidden/>
           </w:rPr>
-          <w:instrText xml:space="preserve"> PAGEREF _Toc243834638 \h </w:instrText>
+          <w:instrText xml:space="preserve"> PAGEREF _Toc243835831 \h </w:instrText>
         </w:r>
         <w:r>
           <w:rPr>
@@ -5406,7 +5406,7 @@
           <w14:ligatures w14:val="standardContextual"/>
         </w:rPr>
       </w:pPr>
-      <w:hyperlink w:anchor="_Toc243834639" w:history="1">
+      <w:hyperlink w:anchor="_Toc243835832" w:history="1">
         <w:r>
           <w:rPr>
             <w:rStyle w:val="Hipervnculo"/>
@@ -5433,7 +5433,7 @@
             <w:noProof/>
             <w:webHidden/>
           </w:rPr>
-          <w:instrText xml:space="preserve"> PAGEREF _Toc243834639 \h </w:instrText>
+          <w:instrText xml:space="preserve"> PAGEREF _Toc243835832 \h </w:instrText>
         </w:r>
         <w:r>
           <w:rPr>
@@ -5480,7 +5480,7 @@
           <w14:ligatures w14:val="standardContextual"/>
         </w:rPr>
       </w:pPr>
-      <w:hyperlink w:anchor="_Toc243834640" w:history="1">
+      <w:hyperlink w:anchor="_Toc243835833" w:history="1">
         <w:r>
           <w:rPr>
             <w:rStyle w:val="Hipervnculo"/>
@@ -5507,7 +5507,7 @@
             <w:noProof/>
             <w:webHidden/>
           </w:rPr>
-          <w:instrText xml:space="preserve"> PAGEREF _Toc243834640 \h </w:instrText>
+          <w:instrText xml:space="preserve"> PAGEREF _Toc243835833 \h </w:instrText>
         </w:r>
         <w:r>
           <w:rPr>
@@ -5554,7 +5554,7 @@
           <w14:ligatures w14:val="standardContextual"/>
         </w:rPr>
       </w:pPr>
-      <w:hyperlink w:anchor="_Toc243834641" w:history="1">
+      <w:hyperlink w:anchor="_Toc243835834" w:history="1">
         <w:r>
           <w:rPr>
             <w:rStyle w:val="Hipervnculo"/>
@@ -5581,7 +5581,7 @@
             <w:noProof/>
             <w:webHidden/>
           </w:rPr>
-          <w:instrText xml:space="preserve"> PAGEREF _Toc243834641 \h </w:instrText>
+          <w:instrText xml:space="preserve"> PAGEREF _Toc243835834 \h </w:instrText>
         </w:r>
         <w:r>
           <w:rPr>
@@ -5628,7 +5628,7 @@
           <w14:ligatures w14:val="standardContextual"/>
         </w:rPr>
       </w:pPr>
-      <w:hyperlink w:anchor="_Toc243834642" w:history="1">
+      <w:hyperlink w:anchor="_Toc243835835" w:history="1">
         <w:r>
           <w:rPr>
             <w:rStyle w:val="Hipervnculo"/>
@@ -5655,7 +5655,7 @@
             <w:noProof/>
             <w:webHidden/>
           </w:rPr>
-          <w:instrText xml:space="preserve"> PAGEREF _Toc243834642 \h </w:instrText>
+          <w:instrText xml:space="preserve"> PAGEREF _Toc243835835 \h </w:instrText>
         </w:r>
         <w:r>
           <w:rPr>
@@ -5702,7 +5702,7 @@
           <w14:ligatures w14:val="standardContextual"/>
         </w:rPr>
       </w:pPr>
-      <w:hyperlink w:anchor="_Toc243834643" w:history="1">
+      <w:hyperlink w:anchor="_Toc243835836" w:history="1">
         <w:r>
           <w:rPr>
             <w:rStyle w:val="Hipervnculo"/>
@@ -5729,7 +5729,7 @@
             <w:noProof/>
             <w:webHidden/>
           </w:rPr>
-          <w:instrText xml:space="preserve"> PAGEREF _Toc243834643 \h </w:instrText>
+          <w:instrText xml:space="preserve"> PAGEREF _Toc243835836 \h </w:instrText>
         </w:r>
         <w:r>
           <w:rPr>
@@ -5776,7 +5776,7 @@
           <w14:ligatures w14:val="standardContextual"/>
         </w:rPr>
       </w:pPr>
-      <w:hyperlink w:anchor="_Toc243834644" w:history="1">
+      <w:hyperlink w:anchor="_Toc243835837" w:history="1">
         <w:r>
           <w:rPr>
             <w:rStyle w:val="Hipervnculo"/>
@@ -5803,7 +5803,7 @@
             <w:noProof/>
             <w:webHidden/>
           </w:rPr>
-          <w:instrText xml:space="preserve"> PAGEREF _Toc243834644 \h </w:instrText>
+          <w:instrText xml:space="preserve"> PAGEREF _Toc243835837 \h </w:instrText>
         </w:r>
         <w:r>
           <w:rPr>
@@ -5850,7 +5850,7 @@
           <w14:ligatures w14:val="standardContextual"/>
         </w:rPr>
       </w:pPr>
-      <w:hyperlink w:anchor="_Toc243834645" w:history="1">
+      <w:hyperlink w:anchor="_Toc243835838" w:history="1">
         <w:r>
           <w:rPr>
             <w:rStyle w:val="Hipervnculo"/>
@@ -5877,7 +5877,7 @@
             <w:noProof/>
             <w:webHidden/>
           </w:rPr>
-          <w:instrText xml:space="preserve"> PAGEREF _Toc243834645 \h </w:instrText>
+          <w:instrText xml:space="preserve"> PAGEREF _Toc243835838 \h </w:instrText>
         </w:r>
         <w:r>
           <w:rPr>
@@ -5924,7 +5924,7 @@
           <w14:ligatures w14:val="standardContextual"/>
         </w:rPr>
       </w:pPr>
-      <w:hyperlink w:anchor="_Toc243834646" w:history="1">
+      <w:hyperlink w:anchor="_Toc243835839" w:history="1">
         <w:r>
           <w:rPr>
             <w:rStyle w:val="Hipervnculo"/>
@@ -5951,7 +5951,7 @@
             <w:noProof/>
             <w:webHidden/>
           </w:rPr>
-          <w:instrText xml:space="preserve"> PAGEREF _Toc243834646 \h </w:instrText>
+          <w:instrText xml:space="preserve"> PAGEREF _Toc243835839 \h </w:instrText>
         </w:r>
         <w:r>
           <w:rPr>
@@ -5998,7 +5998,7 @@
           <w14:ligatures w14:val="standardContextual"/>
         </w:rPr>
       </w:pPr>
-      <w:hyperlink w:anchor="_Toc243834647" w:history="1">
+      <w:hyperlink w:anchor="_Toc243835840" w:history="1">
         <w:r>
           <w:rPr>
             <w:rStyle w:val="Hipervnculo"/>
@@ -6025,7 +6025,7 @@
             <w:noProof/>
             <w:webHidden/>
           </w:rPr>
-          <w:instrText xml:space="preserve"> PAGEREF _Toc243834647 \h </w:instrText>
+          <w:instrText xml:space="preserve"> PAGEREF _Toc243835840 \h </w:instrText>
         </w:r>
         <w:r>
           <w:rPr>
@@ -6072,7 +6072,7 @@
           <w14:ligatures w14:val="standardContextual"/>
         </w:rPr>
       </w:pPr>
-      <w:hyperlink w:anchor="_Toc243834648" w:history="1">
+      <w:hyperlink w:anchor="_Toc243835841" w:history="1">
         <w:r>
           <w:rPr>
             <w:rStyle w:val="Hipervnculo"/>
@@ -6099,7 +6099,7 @@
             <w:noProof/>
             <w:webHidden/>
           </w:rPr>
-          <w:instrText xml:space="preserve"> PAGEREF _Toc243834648 \h </w:instrText>
+          <w:instrText xml:space="preserve"> PAGEREF _Toc243835841 \h </w:instrText>
         </w:r>
         <w:r>
           <w:rPr>
@@ -6146,7 +6146,7 @@
           <w14:ligatures w14:val="standardContextual"/>
         </w:rPr>
       </w:pPr>
-      <w:hyperlink w:anchor="_Toc243834649" w:history="1">
+      <w:hyperlink w:anchor="_Toc243835842" w:history="1">
         <w:r>
           <w:rPr>
             <w:rStyle w:val="Hipervnculo"/>
@@ -6173,7 +6173,7 @@
             <w:noProof/>
             <w:webHidden/>
           </w:rPr>
-          <w:instrText xml:space="preserve"> PAGEREF _Toc243834649 \h </w:instrText>
+          <w:instrText xml:space="preserve"> PAGEREF _Toc243835842 \h </w:instrText>
         </w:r>
         <w:r>
           <w:rPr>
@@ -6220,7 +6220,7 @@
           <w14:ligatures w14:val="standardContextual"/>
         </w:rPr>
       </w:pPr>
-      <w:hyperlink w:anchor="_Toc243834650" w:history="1">
+      <w:hyperlink w:anchor="_Toc243835843" w:history="1">
         <w:r>
           <w:rPr>
             <w:rStyle w:val="Hipervnculo"/>
@@ -6247,7 +6247,7 @@
             <w:noProof/>
             <w:webHidden/>
           </w:rPr>
-          <w:instrText xml:space="preserve"> PAGEREF _Toc243834650 \h </w:instrText>
+          <w:instrText xml:space="preserve"> PAGEREF _Toc243835843 \h </w:instrText>
         </w:r>
         <w:r>
           <w:rPr>
@@ -6294,7 +6294,7 @@
           <w14:ligatures w14:val="standardContextual"/>
         </w:rPr>
       </w:pPr>
-      <w:hyperlink w:anchor="_Toc243834651" w:history="1">
+      <w:hyperlink w:anchor="_Toc243835844" w:history="1">
         <w:r>
           <w:rPr>
             <w:rStyle w:val="Hipervnculo"/>
@@ -6321,7 +6321,7 @@
             <w:noProof/>
             <w:webHidden/>
           </w:rPr>
-          <w:instrText xml:space="preserve"> PAGEREF _Toc243834651 \h </w:instrText>
+          <w:instrText xml:space="preserve"> PAGEREF _Toc243835844 \h </w:instrText>
         </w:r>
         <w:r>
           <w:rPr>
@@ -6368,7 +6368,7 @@
           <w14:ligatures w14:val="standardContextual"/>
         </w:rPr>
       </w:pPr>
-      <w:hyperlink w:anchor="_Toc243834652" w:history="1">
+      <w:hyperlink w:anchor="_Toc243835845" w:history="1">
         <w:r>
           <w:rPr>
             <w:rStyle w:val="Hipervnculo"/>
@@ -6395,7 +6395,7 @@
             <w:noProof/>
             <w:webHidden/>
           </w:rPr>
-          <w:instrText xml:space="preserve"> PAGEREF _Toc243834652 \h </w:instrText>
+          <w:instrText xml:space="preserve"> PAGEREF _Toc243835845 \h </w:instrText>
         </w:r>
         <w:r>
           <w:rPr>
@@ -6442,7 +6442,7 @@
           <w14:ligatures w14:val="standardContextual"/>
         </w:rPr>
       </w:pPr>
-      <w:hyperlink w:anchor="_Toc243834653" w:history="1">
+      <w:hyperlink w:anchor="_Toc243835846" w:history="1">
         <w:r>
           <w:rPr>
             <w:rStyle w:val="Hipervnculo"/>
@@ -6469,7 +6469,7 @@
             <w:noProof/>
             <w:webHidden/>
           </w:rPr>
-          <w:instrText xml:space="preserve"> PAGEREF _Toc243834653 \h </w:instrText>
+          <w:instrText xml:space="preserve"> PAGEREF _Toc243835846 \h </w:instrText>
         </w:r>
         <w:r>
           <w:rPr>
@@ -6516,7 +6516,7 @@
           <w14:ligatures w14:val="standardContextual"/>
         </w:rPr>
       </w:pPr>
-      <w:hyperlink w:anchor="_Toc243834654" w:history="1">
+      <w:hyperlink w:anchor="_Toc243835847" w:history="1">
         <w:r>
           <w:rPr>
             <w:rStyle w:val="Hipervnculo"/>
@@ -6543,7 +6543,7 @@
             <w:noProof/>
             <w:webHidden/>
           </w:rPr>
-          <w:instrText xml:space="preserve"> PAGEREF _Toc243834654 \h </w:instrText>
+          <w:instrText xml:space="preserve"> PAGEREF _Toc243835847 \h </w:instrText>
         </w:r>
         <w:r>
           <w:rPr>
@@ -6590,7 +6590,7 @@
           <w14:ligatures w14:val="standardContextual"/>
         </w:rPr>
       </w:pPr>
-      <w:hyperlink w:anchor="_Toc243834655" w:history="1">
+      <w:hyperlink w:anchor="_Toc243835848" w:history="1">
         <w:r>
           <w:rPr>
             <w:rStyle w:val="Hipervnculo"/>
@@ -6617,7 +6617,7 @@
             <w:noProof/>
             <w:webHidden/>
           </w:rPr>
-          <w:instrText xml:space="preserve"> PAGEREF _Toc243834655 \h </w:instrText>
+          <w:instrText xml:space="preserve"> PAGEREF _Toc243835848 \h </w:instrText>
         </w:r>
         <w:r>
           <w:rPr>
@@ -6664,7 +6664,7 @@
           <w14:ligatures w14:val="standardContextual"/>
         </w:rPr>
       </w:pPr>
-      <w:hyperlink w:anchor="_Toc243834656" w:history="1">
+      <w:hyperlink w:anchor="_Toc243835849" w:history="1">
         <w:r>
           <w:rPr>
             <w:rStyle w:val="Hipervnculo"/>
@@ -6691,7 +6691,7 @@
             <w:noProof/>
             <w:webHidden/>
           </w:rPr>
-          <w:instrText xml:space="preserve"> PAGEREF _Toc243834656 \h </w:instrText>
+          <w:instrText xml:space="preserve"> PAGEREF _Toc243835849 \h </w:instrText>
         </w:r>
         <w:r>
           <w:rPr>
@@ -6738,7 +6738,7 @@
           <w14:ligatures w14:val="standardContextual"/>
         </w:rPr>
       </w:pPr>
-      <w:hyperlink w:anchor="_Toc243834657" w:history="1">
+      <w:hyperlink w:anchor="_Toc243835850" w:history="1">
         <w:r>
           <w:rPr>
             <w:rStyle w:val="Hipervnculo"/>
@@ -6765,7 +6765,7 @@
             <w:noProof/>
             <w:webHidden/>
           </w:rPr>
-          <w:instrText xml:space="preserve"> PAGEREF _Toc243834657 \h </w:instrText>
+          <w:instrText xml:space="preserve"> PAGEREF _Toc243835850 \h </w:instrText>
         </w:r>
         <w:r>
           <w:rPr>
@@ -6812,7 +6812,7 @@
           <w14:ligatures w14:val="standardContextual"/>
         </w:rPr>
       </w:pPr>
-      <w:hyperlink w:anchor="_Toc243834658" w:history="1">
+      <w:hyperlink w:anchor="_Toc243835851" w:history="1">
         <w:r>
           <w:rPr>
             <w:rStyle w:val="Hipervnculo"/>
@@ -6839,7 +6839,7 @@
             <w:noProof/>
             <w:webHidden/>
           </w:rPr>
-          <w:instrText xml:space="preserve"> PAGEREF _Toc243834658 \h </w:instrText>
+          <w:instrText xml:space="preserve"> PAGEREF _Toc243835851 \h </w:instrText>
         </w:r>
         <w:r>
           <w:rPr>
@@ -6886,7 +6886,7 @@
           <w14:ligatures w14:val="standardContextual"/>
         </w:rPr>
       </w:pPr>
-      <w:hyperlink w:anchor="_Toc243834659" w:history="1">
+      <w:hyperlink w:anchor="_Toc243835852" w:history="1">
         <w:r>
           <w:rPr>
             <w:rStyle w:val="Hipervnculo"/>
@@ -6913,7 +6913,7 @@
             <w:noProof/>
             <w:webHidden/>
           </w:rPr>
-          <w:instrText xml:space="preserve"> PAGEREF _Toc243834659 \h </w:instrText>
+          <w:instrText xml:space="preserve"> PAGEREF _Toc243835852 \h </w:instrText>
         </w:r>
         <w:r>
           <w:rPr>
@@ -6960,7 +6960,7 @@
           <w14:ligatures w14:val="standardContextual"/>
         </w:rPr>
       </w:pPr>
-      <w:hyperlink w:anchor="_Toc243834660" w:history="1">
+      <w:hyperlink w:anchor="_Toc243835853" w:history="1">
         <w:r>
           <w:rPr>
             <w:rStyle w:val="Hipervnculo"/>
@@ -6987,7 +6987,7 @@
             <w:noProof/>
             <w:webHidden/>
           </w:rPr>
-          <w:instrText xml:space="preserve"> PAGEREF _Toc243834660 \h </w:instrText>
+          <w:instrText xml:space="preserve"> PAGEREF _Toc243835853 \h </w:instrText>
         </w:r>
         <w:r>
           <w:rPr>
@@ -7034,7 +7034,7 @@
           <w14:ligatures w14:val="standardContextual"/>
         </w:rPr>
       </w:pPr>
-      <w:hyperlink w:anchor="_Toc243834661" w:history="1">
+      <w:hyperlink w:anchor="_Toc243835854" w:history="1">
         <w:r>
           <w:rPr>
             <w:rStyle w:val="Hipervnculo"/>
@@ -7061,7 +7061,7 @@
             <w:noProof/>
             <w:webHidden/>
           </w:rPr>
-          <w:instrText xml:space="preserve"> PAGEREF _Toc243834661 \h </w:instrText>
+          <w:instrText xml:space="preserve"> PAGEREF _Toc243835854 \h </w:instrText>
         </w:r>
         <w:r>
           <w:rPr>
@@ -7081,7 +7081,7 @@
             <w:noProof/>
             <w:webHidden/>
           </w:rPr>
-          <w:t>80</w:t>
+          <w:t>81</w:t>
         </w:r>
         <w:r>
           <w:rPr>
@@ -7108,7 +7108,7 @@
           <w14:ligatures w14:val="standardContextual"/>
         </w:rPr>
       </w:pPr>
-      <w:hyperlink w:anchor="_Toc243834662" w:history="1">
+      <w:hyperlink w:anchor="_Toc243835855" w:history="1">
         <w:r>
           <w:rPr>
             <w:rStyle w:val="Hipervnculo"/>
@@ -7135,7 +7135,7 @@
             <w:noProof/>
             <w:webHidden/>
           </w:rPr>
-          <w:instrText xml:space="preserve"> PAGEREF _Toc243834662 \h </w:instrText>
+          <w:instrText xml:space="preserve"> PAGEREF _Toc243835855 \h </w:instrText>
         </w:r>
         <w:r>
           <w:rPr>
@@ -7182,7 +7182,7 @@
           <w14:ligatures w14:val="standardContextual"/>
         </w:rPr>
       </w:pPr>
-      <w:hyperlink w:anchor="_Toc243834663" w:history="1">
+      <w:hyperlink w:anchor="_Toc243835856" w:history="1">
         <w:r>
           <w:rPr>
             <w:rStyle w:val="Hipervnculo"/>
@@ -7209,7 +7209,7 @@
             <w:noProof/>
             <w:webHidden/>
           </w:rPr>
-          <w:instrText xml:space="preserve"> PAGEREF _Toc243834663 \h </w:instrText>
+          <w:instrText xml:space="preserve"> PAGEREF _Toc243835856 \h </w:instrText>
         </w:r>
         <w:r>
           <w:rPr>
@@ -7256,7 +7256,7 @@
           <w14:ligatures w14:val="standardContextual"/>
         </w:rPr>
       </w:pPr>
-      <w:hyperlink w:anchor="_Toc243834664" w:history="1">
+      <w:hyperlink w:anchor="_Toc243835857" w:history="1">
         <w:r>
           <w:rPr>
             <w:rStyle w:val="Hipervnculo"/>
@@ -7283,7 +7283,7 @@
             <w:noProof/>
             <w:webHidden/>
           </w:rPr>
-          <w:instrText xml:space="preserve"> PAGEREF _Toc243834664 \h </w:instrText>
+          <w:instrText xml:space="preserve"> PAGEREF _Toc243835857 \h </w:instrText>
         </w:r>
         <w:r>
           <w:rPr>
@@ -7330,7 +7330,7 @@
           <w14:ligatures w14:val="standardContextual"/>
         </w:rPr>
       </w:pPr>
-      <w:hyperlink w:anchor="_Toc243834665" w:history="1">
+      <w:hyperlink w:anchor="_Toc243835858" w:history="1">
         <w:r>
           <w:rPr>
             <w:rStyle w:val="Hipervnculo"/>
@@ -7357,7 +7357,7 @@
             <w:noProof/>
             <w:webHidden/>
           </w:rPr>
-          <w:instrText xml:space="preserve"> PAGEREF _Toc243834665 \h </w:instrText>
+          <w:instrText xml:space="preserve"> PAGEREF _Toc243835858 \h </w:instrText>
         </w:r>
         <w:r>
           <w:rPr>
@@ -7404,7 +7404,7 @@
           <w14:ligatures w14:val="standardContextual"/>
         </w:rPr>
       </w:pPr>
-      <w:hyperlink w:anchor="_Toc243834666" w:history="1">
+      <w:hyperlink w:anchor="_Toc243835859" w:history="1">
         <w:r>
           <w:rPr>
             <w:rStyle w:val="Hipervnculo"/>
@@ -7431,7 +7431,7 @@
             <w:noProof/>
             <w:webHidden/>
           </w:rPr>
-          <w:instrText xml:space="preserve"> PAGEREF _Toc243834666 \h </w:instrText>
+          <w:instrText xml:space="preserve"> PAGEREF _Toc243835859 \h </w:instrText>
         </w:r>
         <w:r>
           <w:rPr>
@@ -7478,7 +7478,7 @@
           <w14:ligatures w14:val="standardContextual"/>
         </w:rPr>
       </w:pPr>
-      <w:hyperlink w:anchor="_Toc243834667" w:history="1">
+      <w:hyperlink w:anchor="_Toc243835860" w:history="1">
         <w:r>
           <w:rPr>
             <w:rStyle w:val="Hipervnculo"/>
@@ -7505,7 +7505,7 @@
             <w:noProof/>
             <w:webHidden/>
           </w:rPr>
-          <w:instrText xml:space="preserve"> PAGEREF _Toc243834667 \h </w:instrText>
+          <w:instrText xml:space="preserve"> PAGEREF _Toc243835860 \h </w:instrText>
         </w:r>
         <w:r>
           <w:rPr>
@@ -8104,7 +8104,7 @@
       <w:r>
         <w:br w:type="page"/>
       </w:r>
-      <w:bookmarkStart w:id="1" w:name="_Toc243834571"/>
+      <w:bookmarkStart w:id="1" w:name="_Toc243835764"/>
       <w:r>
         <w:lastRenderedPageBreak/>
         <w:t>1. Introducción y objetivos</w:t>
@@ -8115,7 +8115,7 @@
       <w:pPr>
         <w:pStyle w:val="Ttulo2"/>
       </w:pPr>
-      <w:bookmarkStart w:id="2" w:name="_Toc243834572"/>
+      <w:bookmarkStart w:id="2" w:name="_Toc243835765"/>
       <w:r>
         <w:t>1.1. Contexto, motivación y justificación</w:t>
       </w:r>
@@ -8178,7 +8178,7 @@
       <w:pPr>
         <w:pStyle w:val="Ttulo2"/>
       </w:pPr>
-      <w:bookmarkStart w:id="3" w:name="_Toc243834573"/>
+      <w:bookmarkStart w:id="3" w:name="_Toc243835766"/>
       <w:r>
         <w:t>1.2. Objetivos generales y específicos</w:t>
       </w:r>
@@ -8240,7 +8240,7 @@
       <w:pPr>
         <w:pStyle w:val="Ttulo2"/>
       </w:pPr>
-      <w:bookmarkStart w:id="4" w:name="_Toc243834574"/>
+      <w:bookmarkStart w:id="4" w:name="_Toc243835767"/>
       <w:r>
         <w:t>1.3. Alcance, usuarios y limitaciones</w:t>
       </w:r>
@@ -8295,7 +8295,7 @@
         <w:pStyle w:val="Ttulo1"/>
         <w:pageBreakBefore/>
       </w:pPr>
-      <w:bookmarkStart w:id="5" w:name="_Toc243834575"/>
+      <w:bookmarkStart w:id="5" w:name="_Toc243835768"/>
       <w:r>
         <w:lastRenderedPageBreak/>
         <w:t>2. Marco teórico y estado del arte</w:t>
@@ -8306,7 +8306,7 @@
       <w:pPr>
         <w:pStyle w:val="Ttulo2"/>
       </w:pPr>
-      <w:bookmarkStart w:id="6" w:name="_Toc243834576"/>
+      <w:bookmarkStart w:id="6" w:name="_Toc243835769"/>
       <w:r>
         <w:t>2.1. Necesidades hídricas y gestión eficiente del riego</w:t>
       </w:r>
@@ -8374,9 +8374,9 @@
       <w:pPr>
         <w:pStyle w:val="Ttulo2"/>
       </w:pPr>
-      <w:bookmarkStart w:id="7" w:name="_Toc243834577"/>
-      <w:r>
-        <w:t>2.2. Agricultura de precisión y Machine Learning</w:t>
+      <w:bookmarkStart w:id="7" w:name="_Toc243835770"/>
+      <w:r>
+        <w:t>2.2. Agricultura de precisión y aprendizaje automático</w:t>
       </w:r>
       <w:bookmarkEnd w:id="7"/>
     </w:p>
@@ -8439,7 +8439,7 @@
       <w:pPr>
         <w:pStyle w:val="Ttulo2"/>
       </w:pPr>
-      <w:bookmarkStart w:id="8" w:name="_Toc243834578"/>
+      <w:bookmarkStart w:id="8" w:name="_Toc243835771"/>
       <w:r>
         <w:t>2.3. Sistemas inteligentes de apoyo a la decisión</w:t>
       </w:r>
@@ -8503,7 +8503,7 @@
         <w:pStyle w:val="Ttulo1"/>
         <w:pageBreakBefore/>
       </w:pPr>
-      <w:bookmarkStart w:id="9" w:name="_Toc243834579"/>
+      <w:bookmarkStart w:id="9" w:name="_Toc243835772"/>
       <w:r>
         <w:lastRenderedPageBreak/>
         <w:t>3. Metodología y arquitectura del sistema</w:t>
@@ -8514,7 +8514,7 @@
       <w:pPr>
         <w:pStyle w:val="Ttulo2"/>
       </w:pPr>
-      <w:bookmarkStart w:id="10" w:name="_Toc243834580"/>
+      <w:bookmarkStart w:id="10" w:name="_Toc243835773"/>
       <w:r>
         <w:t>3.1. Fuentes, variables y calidad de los datos</w:t>
       </w:r>
@@ -8527,14 +8527,14 @@
     </w:p>
     <w:p>
       <w:r>
-        <w:t>La visión del producto contempla que el usuario seleccione libremente ubicación, cultivo y periodo para determinar las fuentes necesarias. La demo implementa una selección limitada a las combinaciones SiAR ya descargadas, no una extracción nacional arbitraria. El caso original de evaluación del motor sigue siendo pimiento en AL01 La Mojonera durante 2025. El CSV lo denomina «Pimiento» sin especificar el sistema productivo. Para este piloto se asume cultivo al aire libre; el CSV no confirma ese sistema.</w:t>
+        <w:t>La visión del producto contempla que el usuario seleccione libremente ubicación, cultivo y periodo para determinar las fuentes necesarias. El prototipo implementa una selección limitada a las combinaciones SiAR ya descargadas, no una extracción nacional arbitraria. El caso original de evaluación del motor sigue siendo pimiento en AL01 La Mojonera durante 2025. El CSV lo denomina «Pimiento» sin especificar el sistema productivo. Para este piloto se asume cultivo al aire libre; el CSV no confirma ese sistema.</w:t>
       </w:r>
     </w:p>
     <w:p>
       <w:pPr>
         <w:pStyle w:val="Ttulo3"/>
       </w:pPr>
-      <w:bookmarkStart w:id="11" w:name="_Toc243834581"/>
+      <w:bookmarkStart w:id="11" w:name="_Toc243835774"/>
       <w:r>
         <w:rPr>
           <w:sz w:val="24"/>
@@ -9204,7 +9204,7 @@
       <w:pPr>
         <w:pStyle w:val="Ttulo3"/>
       </w:pPr>
-      <w:bookmarkStart w:id="12" w:name="_Toc243834582"/>
+      <w:bookmarkStart w:id="12" w:name="_Toc243835775"/>
       <w:r>
         <w:rPr>
           <w:sz w:val="24"/>
@@ -9945,7 +9945,7 @@
       <w:pPr>
         <w:pStyle w:val="Ttulo3"/>
       </w:pPr>
-      <w:bookmarkStart w:id="13" w:name="_Toc243834583"/>
+      <w:bookmarkStart w:id="13" w:name="_Toc243835776"/>
       <w:r>
         <w:rPr>
           <w:sz w:val="24"/>
@@ -10054,7 +10054,7 @@
       <w:pPr>
         <w:pStyle w:val="Ttulo3"/>
       </w:pPr>
-      <w:bookmarkStart w:id="14" w:name="_Toc243834584"/>
+      <w:bookmarkStart w:id="14" w:name="_Toc243835777"/>
       <w:r>
         <w:rPr>
           <w:sz w:val="24"/>
@@ -10078,7 +10078,7 @@
       <w:pPr>
         <w:pStyle w:val="Ttulo2"/>
       </w:pPr>
-      <w:bookmarkStart w:id="15" w:name="_Toc243834585"/>
+      <w:bookmarkStart w:id="15" w:name="_Toc243835778"/>
       <w:r>
         <w:t>3.2. Arquitectura, tecnologías y flujo de información</w:t>
       </w:r>
@@ -10151,7 +10151,7 @@
       <w:pPr>
         <w:pStyle w:val="Ttulo3"/>
       </w:pPr>
-      <w:bookmarkStart w:id="16" w:name="_Toc243834586"/>
+      <w:bookmarkStart w:id="16" w:name="_Toc243835779"/>
       <w:r>
         <w:rPr>
           <w:sz w:val="24"/>
@@ -10288,7 +10288,7 @@
       <w:pPr>
         <w:pStyle w:val="Ttulo3"/>
       </w:pPr>
-      <w:bookmarkStart w:id="17" w:name="_Toc243834587"/>
+      <w:bookmarkStart w:id="17" w:name="_Toc243835780"/>
       <w:r>
         <w:rPr>
           <w:sz w:val="24"/>
@@ -11289,14 +11289,14 @@
     </w:p>
     <w:p>
       <w:r>
-        <w:t>Esta clasificación actualiza el planteamiento del anteproyecto. MySQL, Apache Hop, Docker, PySpark y un cuadro de mando en Power BI o Tableau forman parte de la arquitectura objetivo, pero no se consideran evidencias terminadas. En el estado actual, el prototipo reproducible se apoya en módulos Python, almacenamiento local por capas y una aplicación en Streamlit para consultar el sistema de recomendación.</w:t>
+        <w:t>Esta clasificación actualiza el planteamiento del anteproyecto. MySQL, Apache Hop, Docker, PySpark y un cuadro de mando en Power BI o Tableau se evaluaron como opciones, pero no constituyen evidencias terminadas ni una arquitectura obligatoria. En el estado actual, el prototipo reproducible se apoya en módulos Python, almacenamiento local por capas y una aplicación Streamlit. La evolución propuesta en 6.3.4 prioriza una ingesta ligera y programada, almacenamiento de objetos y formatos analíticos antes de introducir procesamiento distribuido.</w:t>
       </w:r>
     </w:p>
     <w:p>
       <w:pPr>
         <w:pStyle w:val="Ttulo3"/>
       </w:pPr>
-      <w:bookmarkStart w:id="18" w:name="_Toc243834588"/>
+      <w:bookmarkStart w:id="18" w:name="_Toc243835781"/>
       <w:r>
         <w:rPr>
           <w:sz w:val="24"/>
@@ -11319,7 +11319,7 @@
       <w:pPr>
         <w:pStyle w:val="Ttulo3"/>
       </w:pPr>
-      <w:bookmarkStart w:id="19" w:name="_Toc243834589"/>
+      <w:bookmarkStart w:id="19" w:name="_Toc243835782"/>
       <w:r>
         <w:rPr>
           <w:sz w:val="24"/>
@@ -11343,7 +11343,7 @@
       <w:pPr>
         <w:pStyle w:val="Ttulo2"/>
       </w:pPr>
-      <w:bookmarkStart w:id="20" w:name="_Toc243834590"/>
+      <w:bookmarkStart w:id="20" w:name="_Toc243835783"/>
       <w:r>
         <w:t>3.3. Planificación y organización del proyecto</w:t>
       </w:r>
@@ -11914,7 +11914,7 @@
       </w:r>
       <w:r>
         <w:lastRenderedPageBreak/>
-        <w:t>conclusiones entre el 15 y el 17/10; revisión de coherencia y reproducción independiente el 22/10. Son fechas de integración comprobables, no una asignación individual de tareas. La publicación de una demo por enlace y una validación agronómica externa siguen pendientes.</w:t>
+        <w:t>conclusiones entre el 15 y el 17/10; revisión de coherencia y reproducción independiente el 22/10. Son fechas de integración comprobables, no una asignación individual de tareas. La publicación del prototipo mediante un enlace y una validación agronómica externa siguen pendientes.</w:t>
       </w:r>
     </w:p>
     <w:p>
@@ -11986,10 +11986,10 @@
         <w:pStyle w:val="Ttulo1"/>
         <w:pageBreakBefore/>
       </w:pPr>
-      <w:bookmarkStart w:id="21" w:name="_Toc243834591"/>
+      <w:bookmarkStart w:id="21" w:name="_Toc243835784"/>
       <w:r>
         <w:lastRenderedPageBreak/>
-        <w:t>4. Procesamiento de datos y Machine Learning</w:t>
+        <w:t>4. Procesamiento de datos y aprendizaje automático</w:t>
       </w:r>
       <w:bookmarkEnd w:id="21"/>
     </w:p>
@@ -11997,7 +11997,7 @@
       <w:pPr>
         <w:pStyle w:val="Ttulo2"/>
       </w:pPr>
-      <w:bookmarkStart w:id="22" w:name="_Toc243834592"/>
+      <w:bookmarkStart w:id="22" w:name="_Toc243835785"/>
       <w:r>
         <w:t>4.1. Extracción, transformación y almacenamiento de datos</w:t>
       </w:r>
@@ -12078,7 +12078,7 @@
       <w:pPr>
         <w:pStyle w:val="Ttulo3"/>
       </w:pPr>
-      <w:bookmarkStart w:id="23" w:name="_Toc243834593"/>
+      <w:bookmarkStart w:id="23" w:name="_Toc243835786"/>
       <w:r>
         <w:rPr>
           <w:sz w:val="24"/>
@@ -12665,7 +12665,7 @@
       <w:pPr>
         <w:pStyle w:val="Ttulo3"/>
       </w:pPr>
-      <w:bookmarkStart w:id="24" w:name="_Toc243834594"/>
+      <w:bookmarkStart w:id="24" w:name="_Toc243835787"/>
       <w:r>
         <w:rPr>
           <w:sz w:val="24"/>
@@ -13133,7 +13133,7 @@
       <w:pPr>
         <w:pStyle w:val="Ttulo3"/>
       </w:pPr>
-      <w:bookmarkStart w:id="25" w:name="_Toc243834595"/>
+      <w:bookmarkStart w:id="25" w:name="_Toc243835788"/>
       <w:r>
         <w:rPr>
           <w:sz w:val="24"/>
@@ -13917,7 +13917,7 @@
       <w:pPr>
         <w:pStyle w:val="Ttulo3"/>
       </w:pPr>
-      <w:bookmarkStart w:id="26" w:name="_Toc243834596"/>
+      <w:bookmarkStart w:id="26" w:name="_Toc243835789"/>
       <w:r>
         <w:rPr>
           <w:sz w:val="24"/>
@@ -13993,7 +13993,7 @@
       <w:pPr>
         <w:pStyle w:val="Ttulo3"/>
       </w:pPr>
-      <w:bookmarkStart w:id="27" w:name="_Toc243834597"/>
+      <w:bookmarkStart w:id="27" w:name="_Toc243835790"/>
       <w:r>
         <w:rPr>
           <w:sz w:val="24"/>
@@ -14142,7 +14142,7 @@
       <w:pPr>
         <w:pStyle w:val="Ttulo3"/>
       </w:pPr>
-      <w:bookmarkStart w:id="28" w:name="_Toc243834598"/>
+      <w:bookmarkStart w:id="28" w:name="_Toc243835791"/>
       <w:r>
         <w:rPr>
           <w:sz w:val="24"/>
@@ -16753,7 +16753,7 @@
       <w:pPr>
         <w:pStyle w:val="Ttulo3"/>
       </w:pPr>
-      <w:bookmarkStart w:id="29" w:name="_Toc243834599"/>
+      <w:bookmarkStart w:id="29" w:name="_Toc243835792"/>
       <w:r>
         <w:rPr>
           <w:sz w:val="24"/>
@@ -18742,7 +18742,7 @@
       <w:pPr>
         <w:pStyle w:val="Ttulo3"/>
       </w:pPr>
-      <w:bookmarkStart w:id="30" w:name="_Toc243834600"/>
+      <w:bookmarkStart w:id="30" w:name="_Toc243835793"/>
       <w:r>
         <w:rPr>
           <w:sz w:val="24"/>
@@ -19494,7 +19494,7 @@
       <w:pPr>
         <w:pStyle w:val="Ttulo3"/>
       </w:pPr>
-      <w:bookmarkStart w:id="31" w:name="_Toc243834601"/>
+      <w:bookmarkStart w:id="31" w:name="_Toc243835794"/>
       <w:r>
         <w:rPr>
           <w:sz w:val="24"/>
@@ -19510,18 +19510,18 @@
     </w:p>
     <w:p>
       <w:r>
-        <w:t xml:space="preserve">La futura base MySQL almacenará catálogos, recomendaciones y metadatos que deban consultarse transaccionalmente. Los históricos voluminosos y artefactos de modelo podrán </w:t>
+        <w:t xml:space="preserve">Una futura base relacional, como PostgreSQL o MySQL, almacenará usuarios, parcelas, recomendaciones y metadatos que deban consultarse transaccionalmente. Los históricos </w:t>
       </w:r>
       <w:r>
         <w:lastRenderedPageBreak/>
-        <w:t>permanecer en almacenamiento de objetos. Esta separación evita utilizar la base transaccional como repositorio de archivos y mantiene una arquitectura compatible con ejecución local y despliegue cloud.</w:t>
+        <w:t>agroclimáticos y los artefactos voluminosos podrán conservarse en almacenamiento de objetos, con una capa curada en Parquet. Esta separación evita utilizar la base transaccional como repositorio de archivos y mantiene una arquitectura compatible con ejecución local y despliegue en la nube.</w:t>
       </w:r>
     </w:p>
     <w:p>
       <w:pPr>
         <w:pStyle w:val="Ttulo3"/>
       </w:pPr>
-      <w:bookmarkStart w:id="32" w:name="_Toc243834602"/>
+      <w:bookmarkStart w:id="32" w:name="_Toc243835795"/>
       <w:r>
         <w:rPr>
           <w:sz w:val="24"/>
@@ -19575,7 +19575,7 @@
       <w:pPr>
         <w:pStyle w:val="Ttulo3"/>
       </w:pPr>
-      <w:bookmarkStart w:id="33" w:name="_Toc243834603"/>
+      <w:bookmarkStart w:id="33" w:name="_Toc243835796"/>
       <w:r>
         <w:rPr>
           <w:sz w:val="24"/>
@@ -19593,7 +19593,7 @@
       <w:pPr>
         <w:pStyle w:val="Ttulo2"/>
       </w:pPr>
-      <w:bookmarkStart w:id="34" w:name="_Toc243834604"/>
+      <w:bookmarkStart w:id="34" w:name="_Toc243835797"/>
       <w:r>
         <w:t>4.2. Análisis exploratorio y preparación de variables</w:t>
       </w:r>
@@ -19608,7 +19608,7 @@
       <w:pPr>
         <w:pStyle w:val="Ttulo3"/>
       </w:pPr>
-      <w:bookmarkStart w:id="35" w:name="_Toc243834605"/>
+      <w:bookmarkStart w:id="35" w:name="_Toc243835798"/>
       <w:r>
         <w:rPr>
           <w:sz w:val="24"/>
@@ -19619,11 +19619,11 @@
     </w:p>
     <w:p>
       <w:r>
-        <w:t xml:space="preserve">El piloto utiliza el cultivo de pimiento y la estación SiAR AL01 La Mojonera, en Almería, entre el 1 de mayo y el 30 de septiembre de 2025. La unidad de análisis es una combinación de fecha, estación y cultivo. Las tablas meteorológica y agronómica se unen por station_code y </w:t>
+        <w:t xml:space="preserve">El piloto utiliza el cultivo de pimiento y la estación SiAR AL01 La Mojonera, en Almería, entre el 1 de mayo y el 30 de septiembre de 2025. La unidad de análisis es una combinación de fecha, </w:t>
       </w:r>
       <w:r>
         <w:lastRenderedPageBreak/>
-        <w:t>observed_date; el cultivo se conserva como parte de la clave analítica. El resultado contiene 150 registros y 88 columnas entre variables de origen, controles de calidad, atributos derivados, retardos y ventanas temporales.</w:t>
+        <w:t>estación y cultivo. Las tablas meteorológica y agronómica se unen por station_code y observed_date; el cultivo se conserva como parte de la clave analítica. El resultado contiene 150 registros y 88 columnas entre variables de origen, controles de calidad, atributos derivados, retardos y ventanas temporales.</w:t>
       </w:r>
     </w:p>
     <w:p>
@@ -20141,7 +20141,7 @@
       <w:pPr>
         <w:pStyle w:val="Ttulo3"/>
       </w:pPr>
-      <w:bookmarkStart w:id="36" w:name="_Toc243834606"/>
+      <w:bookmarkStart w:id="36" w:name="_Toc243835799"/>
       <w:r>
         <w:rPr>
           <w:sz w:val="24"/>
@@ -21207,7 +21207,7 @@
       <w:pPr>
         <w:pStyle w:val="Ttulo3"/>
       </w:pPr>
-      <w:bookmarkStart w:id="37" w:name="_Toc243834607"/>
+      <w:bookmarkStart w:id="37" w:name="_Toc243835800"/>
       <w:r>
         <w:rPr>
           <w:sz w:val="24"/>
@@ -21294,7 +21294,7 @@
       <w:pPr>
         <w:pStyle w:val="Ttulo3"/>
       </w:pPr>
-      <w:bookmarkStart w:id="38" w:name="_Toc243834608"/>
+      <w:bookmarkStart w:id="38" w:name="_Toc243835801"/>
       <w:r>
         <w:rPr>
           <w:sz w:val="24"/>
@@ -21377,7 +21377,7 @@
       <w:pPr>
         <w:pStyle w:val="Ttulo3"/>
       </w:pPr>
-      <w:bookmarkStart w:id="39" w:name="_Toc243834609"/>
+      <w:bookmarkStart w:id="39" w:name="_Toc243835802"/>
       <w:r>
         <w:rPr>
           <w:sz w:val="24"/>
@@ -21915,7 +21915,7 @@
       <w:pPr>
         <w:pStyle w:val="Ttulo3"/>
       </w:pPr>
-      <w:bookmarkStart w:id="40" w:name="_Toc243834610"/>
+      <w:bookmarkStart w:id="40" w:name="_Toc243835803"/>
       <w:r>
         <w:rPr>
           <w:sz w:val="24"/>
@@ -21943,7 +21943,7 @@
       <w:pPr>
         <w:pStyle w:val="Ttulo3"/>
       </w:pPr>
-      <w:bookmarkStart w:id="41" w:name="_Toc243834611"/>
+      <w:bookmarkStart w:id="41" w:name="_Toc243835804"/>
       <w:r>
         <w:rPr>
           <w:sz w:val="24"/>
@@ -22059,7 +22059,7 @@
       <w:pPr>
         <w:pStyle w:val="Ttulo2"/>
       </w:pPr>
-      <w:bookmarkStart w:id="42" w:name="_Toc243834612"/>
+      <w:bookmarkStart w:id="42" w:name="_Toc243835805"/>
       <w:r>
         <w:lastRenderedPageBreak/>
         <w:t>4.3. Desarrollo y evaluación del modelo predictivo</w:t>
@@ -22075,7 +22075,7 @@
       <w:pPr>
         <w:pStyle w:val="Ttulo3"/>
       </w:pPr>
-      <w:bookmarkStart w:id="43" w:name="_Toc243834613"/>
+      <w:bookmarkStart w:id="43" w:name="_Toc243835806"/>
       <w:r>
         <w:rPr>
           <w:sz w:val="24"/>
@@ -22103,7 +22103,7 @@
       <w:pPr>
         <w:pStyle w:val="Ttulo3"/>
       </w:pPr>
-      <w:bookmarkStart w:id="44" w:name="_Toc243834614"/>
+      <w:bookmarkStart w:id="44" w:name="_Toc243835807"/>
       <w:r>
         <w:rPr>
           <w:sz w:val="24"/>
@@ -22129,7 +22129,7 @@
       <w:pPr>
         <w:pStyle w:val="Ttulo3"/>
       </w:pPr>
-      <w:bookmarkStart w:id="45" w:name="_Toc243834615"/>
+      <w:bookmarkStart w:id="45" w:name="_Toc243835808"/>
       <w:r>
         <w:rPr>
           <w:sz w:val="24"/>
@@ -22270,7 +22270,7 @@
       <w:pPr>
         <w:pStyle w:val="Ttulo3"/>
       </w:pPr>
-      <w:bookmarkStart w:id="46" w:name="_Toc243834616"/>
+      <w:bookmarkStart w:id="46" w:name="_Toc243835809"/>
       <w:r>
         <w:rPr>
           <w:sz w:val="24"/>
@@ -22288,7 +22288,7 @@
       <w:pPr>
         <w:pStyle w:val="Ttulo3"/>
       </w:pPr>
-      <w:bookmarkStart w:id="47" w:name="_Toc243834617"/>
+      <w:bookmarkStart w:id="47" w:name="_Toc243835810"/>
       <w:r>
         <w:rPr>
           <w:sz w:val="24"/>
@@ -23262,7 +23262,7 @@
       <w:pPr>
         <w:pStyle w:val="Ttulo3"/>
       </w:pPr>
-      <w:bookmarkStart w:id="48" w:name="_Toc243834618"/>
+      <w:bookmarkStart w:id="48" w:name="_Toc243835811"/>
       <w:r>
         <w:rPr>
           <w:sz w:val="24"/>
@@ -24396,7 +24396,7 @@
       <w:pPr>
         <w:pStyle w:val="Ttulo3"/>
       </w:pPr>
-      <w:bookmarkStart w:id="49" w:name="_Toc243834619"/>
+      <w:bookmarkStart w:id="49" w:name="_Toc243835812"/>
       <w:r>
         <w:rPr>
           <w:sz w:val="24"/>
@@ -24424,7 +24424,7 @@
       <w:pPr>
         <w:pStyle w:val="Ttulo3"/>
       </w:pPr>
-      <w:bookmarkStart w:id="50" w:name="_Toc243834620"/>
+      <w:bookmarkStart w:id="50" w:name="_Toc243835813"/>
       <w:r>
         <w:rPr>
           <w:sz w:val="24"/>
@@ -24448,7 +24448,7 @@
       <w:pPr>
         <w:pStyle w:val="Ttulo3"/>
       </w:pPr>
-      <w:bookmarkStart w:id="51" w:name="_Toc243834621"/>
+      <w:bookmarkStart w:id="51" w:name="_Toc243835814"/>
       <w:r>
         <w:rPr>
           <w:sz w:val="24"/>
@@ -24481,7 +24481,7 @@
       <w:pPr>
         <w:pStyle w:val="Ttulo3"/>
       </w:pPr>
-      <w:bookmarkStart w:id="52" w:name="_Toc243834622"/>
+      <w:bookmarkStart w:id="52" w:name="_Toc243835815"/>
       <w:r>
         <w:t>4.3.10. Reentrenamiento con datos de 2026</w:t>
       </w:r>
@@ -25397,7 +25397,7 @@
       <w:pPr>
         <w:pStyle w:val="Ttulo3"/>
       </w:pPr>
-      <w:bookmarkStart w:id="53" w:name="_Toc243834623"/>
+      <w:bookmarkStart w:id="53" w:name="_Toc243835816"/>
       <w:r>
         <w:lastRenderedPageBreak/>
         <w:t>4.3.11. Modelo de ETc para la aplicación</w:t>
@@ -26007,7 +26007,7 @@
         <w:pageBreakBefore/>
       </w:pPr>
       <w:bookmarkStart w:id="54" w:name="_Toc243495226"/>
-      <w:bookmarkStart w:id="55" w:name="_Toc243834624"/>
+      <w:bookmarkStart w:id="55" w:name="_Toc243835817"/>
       <w:r>
         <w:lastRenderedPageBreak/>
         <w:t>5. Sistema de recomendación y resultados</w:t>
@@ -26017,17 +26017,14 @@
     </w:p>
     <w:p>
       <w:r>
-        <w:t>Este capítulo separa dos entornos que aportan evidencias diferentes. El entorno de evaluación estricta utiliza el histórico SiAR de 2025, particiones temporales y métricas reproducibles; no incorpora previsiones AEMET archivadas. El entorno de demostración operativa corresponde a la aplicación Streamlit actual, que consulta datos recientes de SiAR y previsión AEMET para generar una recomendación. Por tanto, la demo acredita integración y funcionamiento, mientras que su efecto sobre el error, el ahorro de ag</w:t>
-      </w:r>
-      <w:r>
-        <w:t>ua o la adecuación a una parcela todavía no dispone de una evaluación retrospectiva equivalente.</w:t>
+        <w:t>Este capítulo separa dos entornos que aportan evidencias diferentes. El entorno de evaluación estricta utiliza el histórico SiAR de 2025, particiones temporales y métricas reproducibles; no incorpora previsiones AEMET archivadas. El entorno de demostración operativa corresponde a la aplicación Streamlit actual, que consulta datos recientes de SiAR y previsión AEMET para generar una recomendación. Por tanto, el demostrador acredita integración y funcionamiento, mientras que su efecto sobre el error, el ahorro de agua o la adecuación a una parcela todavía no dispone de una evaluación retrospectiva equivalente.</w:t>
       </w:r>
     </w:p>
     <w:p>
       <w:pPr>
         <w:pStyle w:val="Ttulo2"/>
       </w:pPr>
-      <w:bookmarkStart w:id="56" w:name="_Toc243834625"/>
+      <w:bookmarkStart w:id="56" w:name="_Toc243835818"/>
       <w:r>
         <w:t>5.1. Diseño del sistema de recomendación de riego</w:t>
       </w:r>
@@ -26047,7 +26044,7 @@
       <w:pPr>
         <w:pStyle w:val="Ttulo3"/>
       </w:pPr>
-      <w:bookmarkStart w:id="57" w:name="_Toc243834626"/>
+      <w:bookmarkStart w:id="57" w:name="_Toc243835819"/>
       <w:r>
         <w:rPr>
           <w:sz w:val="24"/>
@@ -26074,7 +26071,7 @@
       <w:pPr>
         <w:pStyle w:val="Ttulo3"/>
       </w:pPr>
-      <w:bookmarkStart w:id="58" w:name="_Toc243834627"/>
+      <w:bookmarkStart w:id="58" w:name="_Toc243835820"/>
       <w:r>
         <w:rPr>
           <w:sz w:val="24"/>
@@ -26157,7 +26154,7 @@
       <w:pPr>
         <w:pStyle w:val="Ttulo3"/>
       </w:pPr>
-      <w:bookmarkStart w:id="59" w:name="_Toc243834628"/>
+      <w:bookmarkStart w:id="59" w:name="_Toc243835821"/>
       <w:r>
         <w:rPr>
           <w:sz w:val="24"/>
@@ -26206,7 +26203,7 @@
       <w:pPr>
         <w:pStyle w:val="Ttulo3"/>
       </w:pPr>
-      <w:bookmarkStart w:id="60" w:name="_Toc243834629"/>
+      <w:bookmarkStart w:id="60" w:name="_Toc243835822"/>
       <w:r>
         <w:rPr>
           <w:sz w:val="24"/>
@@ -27088,7 +27085,7 @@
       <w:pPr>
         <w:pStyle w:val="Ttulo3"/>
       </w:pPr>
-      <w:bookmarkStart w:id="61" w:name="_Toc243834630"/>
+      <w:bookmarkStart w:id="61" w:name="_Toc243835823"/>
       <w:r>
         <w:rPr>
           <w:sz w:val="24"/>
@@ -27111,7 +27108,7 @@
       <w:pPr>
         <w:pStyle w:val="Ttulo3"/>
       </w:pPr>
-      <w:bookmarkStart w:id="62" w:name="_Toc243834631"/>
+      <w:bookmarkStart w:id="62" w:name="_Toc243835824"/>
       <w:r>
         <w:rPr>
           <w:sz w:val="24"/>
@@ -27130,7 +27127,7 @@
       <w:pPr>
         <w:pStyle w:val="Ttulo3"/>
       </w:pPr>
-      <w:bookmarkStart w:id="63" w:name="_Toc243834632"/>
+      <w:bookmarkStart w:id="63" w:name="_Toc243835825"/>
       <w:r>
         <w:t>5.1.7. Integración operativa de ETc y AEMET</w:t>
       </w:r>
@@ -27150,7 +27147,7 @@
       <w:pPr>
         <w:pStyle w:val="Ttulo2"/>
       </w:pPr>
-      <w:bookmarkStart w:id="64" w:name="_Toc243834633"/>
+      <w:bookmarkStart w:id="64" w:name="_Toc243835826"/>
       <w:r>
         <w:t>5.2. Aplicación y visualización de resultados</w:t>
       </w:r>
@@ -27165,7 +27162,7 @@
       <w:pPr>
         <w:pStyle w:val="Ttulo3"/>
       </w:pPr>
-      <w:bookmarkStart w:id="65" w:name="_Toc243834634"/>
+      <w:bookmarkStart w:id="65" w:name="_Toc243835827"/>
       <w:r>
         <w:rPr>
           <w:sz w:val="24"/>
@@ -27192,7 +27189,7 @@
       <w:pPr>
         <w:pStyle w:val="Ttulo3"/>
       </w:pPr>
-      <w:bookmarkStart w:id="66" w:name="_Toc243834635"/>
+      <w:bookmarkStart w:id="66" w:name="_Toc243835828"/>
       <w:r>
         <w:rPr>
           <w:sz w:val="24"/>
@@ -27220,7 +27217,7 @@
       <w:pPr>
         <w:pStyle w:val="Ttulo3"/>
       </w:pPr>
-      <w:bookmarkStart w:id="67" w:name="_Toc243834636"/>
+      <w:bookmarkStart w:id="67" w:name="_Toc243835829"/>
       <w:r>
         <w:rPr>
           <w:sz w:val="24"/>
@@ -29163,7 +29160,7 @@
       <w:pPr>
         <w:pStyle w:val="Ttulo3"/>
       </w:pPr>
-      <w:bookmarkStart w:id="68" w:name="_Toc243834637"/>
+      <w:bookmarkStart w:id="68" w:name="_Toc243835830"/>
       <w:r>
         <w:rPr>
           <w:sz w:val="24"/>
@@ -29197,7 +29194,7 @@
       <w:pPr>
         <w:pStyle w:val="Ttulo3"/>
       </w:pPr>
-      <w:bookmarkStart w:id="69" w:name="_Toc243834638"/>
+      <w:bookmarkStart w:id="69" w:name="_Toc243835831"/>
       <w:r>
         <w:rPr>
           <w:sz w:val="24"/>
@@ -29215,7 +29212,7 @@
       <w:pPr>
         <w:pStyle w:val="Ttulo3"/>
       </w:pPr>
-      <w:bookmarkStart w:id="70" w:name="_Toc243834639"/>
+      <w:bookmarkStart w:id="70" w:name="_Toc243835832"/>
       <w:r>
         <w:rPr>
           <w:sz w:val="24"/>
@@ -29226,14 +29223,14 @@
     </w:p>
     <w:p>
       <w:r>
-        <w:t>La aplicación es una demostración pública sin cuentas de usuario ni histórico de riego por parcela. Lee CSV verificados y puede actualizar en memoria el caso vigente desde SiAR. Para hoy suma solo las horas futuras de lluvia AEMET que tienen cantidad numérica utilizable; para mañana exige cobertura horaria completa. Una emisión antigua o sin milímetros útiles deja la dosis base sin descuento. La dosis de hoy representa el día completo: la app desconoce el riego y la lluvia ya ocurridos, por lo que el usuario debe ajustarla antes de aplicarla. No calcula ET0 futura a partir de la temperatura ni dispone de emisiones pasadas para evaluar AEMET. Los días posteriores al primero son orientativos y deben recalcularse. Tampoco se ha probado la interfaz con agricultores o técnicos (Rose et al., 2016).</w:t>
+        <w:t>La aplicación es una demostración pública sin cuentas de usuario ni histórico de riego por parcela. Lee CSV verificados y puede actualizar en memoria el caso vigente desde SiAR. Para hoy suma solo las horas futuras de lluvia AEMET que tienen cantidad numérica utilizable; para mañana exige cobertura horaria completa. Una emisión antigua o sin milímetros útiles deja la dosis base sin descuento. La dosis de hoy representa el día completo: la aplicación desconoce el riego y la lluvia ya ocurridos, por lo que el usuario debe ajustarla antes de aplicarla. No calcula ET0 futura a partir de la temperatura ni dispone de emisiones pasadas para evaluar AEMET. Los días posteriores al primero son orientativos y deben recalcularse. Tampoco se ha probado la interfaz con agricultores o técnicos (Rose et al., 2016).</w:t>
       </w:r>
     </w:p>
     <w:p>
       <w:pPr>
         <w:pStyle w:val="Ttulo2"/>
       </w:pPr>
-      <w:bookmarkStart w:id="71" w:name="_Toc243834640"/>
+      <w:bookmarkStart w:id="71" w:name="_Toc243835833"/>
       <w:r>
         <w:t>5.3. Validación, resultados y análisis crítico</w:t>
       </w:r>
@@ -29257,7 +29254,7 @@
       <w:pPr>
         <w:pStyle w:val="Ttulo3"/>
       </w:pPr>
-      <w:bookmarkStart w:id="72" w:name="_Toc243834641"/>
+      <w:bookmarkStart w:id="72" w:name="_Toc243835834"/>
       <w:r>
         <w:rPr>
           <w:sz w:val="24"/>
@@ -29280,7 +29277,7 @@
       <w:pPr>
         <w:pStyle w:val="Ttulo3"/>
       </w:pPr>
-      <w:bookmarkStart w:id="73" w:name="_Toc243834642"/>
+      <w:bookmarkStart w:id="73" w:name="_Toc243835835"/>
       <w:r>
         <w:rPr>
           <w:sz w:val="24"/>
@@ -29786,7 +29783,7 @@
       <w:pPr>
         <w:pStyle w:val="Ttulo3"/>
       </w:pPr>
-      <w:bookmarkStart w:id="74" w:name="_Toc243834643"/>
+      <w:bookmarkStart w:id="74" w:name="_Toc243835836"/>
       <w:r>
         <w:rPr>
           <w:sz w:val="24"/>
@@ -30659,7 +30656,7 @@
       <w:pPr>
         <w:pStyle w:val="Ttulo3"/>
       </w:pPr>
-      <w:bookmarkStart w:id="75" w:name="_Toc243834644"/>
+      <w:bookmarkStart w:id="75" w:name="_Toc243835837"/>
       <w:r>
         <w:rPr>
           <w:sz w:val="24"/>
@@ -31759,7 +31756,7 @@
       <w:pPr>
         <w:pStyle w:val="Ttulo3"/>
       </w:pPr>
-      <w:bookmarkStart w:id="76" w:name="_Toc243834645"/>
+      <w:bookmarkStart w:id="76" w:name="_Toc243835838"/>
       <w:r>
         <w:rPr>
           <w:sz w:val="24"/>
@@ -31851,7 +31848,7 @@
       <w:pPr>
         <w:pStyle w:val="Ttulo3"/>
       </w:pPr>
-      <w:bookmarkStart w:id="77" w:name="_Toc243834646"/>
+      <w:bookmarkStart w:id="77" w:name="_Toc243835839"/>
       <w:r>
         <w:rPr>
           <w:sz w:val="24"/>
@@ -32306,7 +32303,7 @@
       <w:pPr>
         <w:pStyle w:val="Ttulo3"/>
       </w:pPr>
-      <w:bookmarkStart w:id="78" w:name="_Toc243834647"/>
+      <w:bookmarkStart w:id="78" w:name="_Toc243835840"/>
       <w:r>
         <w:rPr>
           <w:sz w:val="24"/>
@@ -33396,7 +33393,7 @@
       <w:pPr>
         <w:pStyle w:val="Ttulo3"/>
       </w:pPr>
-      <w:bookmarkStart w:id="79" w:name="_Toc243834648"/>
+      <w:bookmarkStart w:id="79" w:name="_Toc243835841"/>
       <w:r>
         <w:rPr>
           <w:sz w:val="24"/>
@@ -33414,7 +33411,7 @@
       <w:pPr>
         <w:pStyle w:val="Ttulo3"/>
       </w:pPr>
-      <w:bookmarkStart w:id="80" w:name="_Toc243834649"/>
+      <w:bookmarkStart w:id="80" w:name="_Toc243835842"/>
       <w:r>
         <w:rPr>
           <w:sz w:val="24"/>
@@ -33451,7 +33448,7 @@
       <w:pPr>
         <w:pStyle w:val="Ttulo3"/>
       </w:pPr>
-      <w:bookmarkStart w:id="81" w:name="_Toc243834650"/>
+      <w:bookmarkStart w:id="81" w:name="_Toc243835843"/>
       <w:r>
         <w:rPr>
           <w:sz w:val="24"/>
@@ -33505,7 +33502,7 @@
         <w:pStyle w:val="Ttulo1"/>
         <w:pageBreakBefore/>
       </w:pPr>
-      <w:bookmarkStart w:id="82" w:name="_Toc243834651"/>
+      <w:bookmarkStart w:id="82" w:name="_Toc243835844"/>
       <w:r>
         <w:lastRenderedPageBreak/>
         <w:t>6. Conclusiones</w:t>
@@ -33516,7 +33513,7 @@
       <w:pPr>
         <w:pStyle w:val="Ttulo2"/>
       </w:pPr>
-      <w:bookmarkStart w:id="83" w:name="_Toc243834652"/>
+      <w:bookmarkStart w:id="83" w:name="_Toc243835845"/>
       <w:r>
         <w:t>6.1. Cumplimiento de objetivos y aportaciones</w:t>
       </w:r>
@@ -33526,7 +33523,7 @@
       <w:pPr>
         <w:pStyle w:val="Ttulo3"/>
       </w:pPr>
-      <w:bookmarkStart w:id="84" w:name="_Toc243834653"/>
+      <w:bookmarkStart w:id="84" w:name="_Toc243835846"/>
       <w:r>
         <w:rPr>
           <w:sz w:val="24"/>
@@ -34306,7 +34303,7 @@
       <w:pPr>
         <w:pStyle w:val="Ttulo3"/>
       </w:pPr>
-      <w:bookmarkStart w:id="85" w:name="_Toc243834654"/>
+      <w:bookmarkStart w:id="85" w:name="_Toc243835847"/>
       <w:r>
         <w:rPr>
           <w:sz w:val="24"/>
@@ -34336,14 +34333,14 @@
     </w:p>
     <w:p>
       <w:r>
-        <w:t>La cuarta aportación es la reproducibilidad. El repositorio conserva los CSV SiAR acotados, los protocolos de modelado y las métricas por caso, el motor y la demo pública. Los modelos de necesidad neta del experimento quedan como artefactos locales reproducibles; los seis artefactos pequeños de ETc sí se versionan para su uso en Streamlit. Los módulos de entrenamiento y la suite de pruebas verifican calidad, orden temporal y ausencia de variables del día objetivo.</w:t>
+        <w:t>La cuarta aportación es la reproducibilidad. El repositorio conserva los CSV SiAR acotados, los protocolos de modelado y las métricas por caso, el motor y la aplicación pública. Los modelos de necesidad neta del experimento quedan como artefactos locales reproducibles; los seis artefactos pequeños de ETc sí se versionan para su uso en Streamlit. Los módulos de entrenamiento y la suite de pruebas verifican calidad, orden temporal y ausencia de variables del día objetivo.</w:t>
       </w:r>
     </w:p>
     <w:p>
       <w:pPr>
         <w:pStyle w:val="Ttulo2"/>
       </w:pPr>
-      <w:bookmarkStart w:id="86" w:name="_Toc243834655"/>
+      <w:bookmarkStart w:id="86" w:name="_Toc243835848"/>
       <w:r>
         <w:t>6.2. Limitaciones e impacto del proyecto</w:t>
       </w:r>
@@ -34353,7 +34350,7 @@
       <w:pPr>
         <w:pStyle w:val="Ttulo3"/>
       </w:pPr>
-      <w:bookmarkStart w:id="87" w:name="_Toc243834656"/>
+      <w:bookmarkStart w:id="87" w:name="_Toc243835849"/>
       <w:r>
         <w:rPr>
           <w:sz w:val="24"/>
@@ -34964,7 +34961,7 @@
       <w:pPr>
         <w:pStyle w:val="Ttulo3"/>
       </w:pPr>
-      <w:bookmarkStart w:id="88" w:name="_Toc243834657"/>
+      <w:bookmarkStart w:id="88" w:name="_Toc243835850"/>
       <w:r>
         <w:rPr>
           <w:sz w:val="24"/>
@@ -35003,7 +35000,7 @@
       <w:pPr>
         <w:pStyle w:val="Ttulo2"/>
       </w:pPr>
-      <w:bookmarkStart w:id="89" w:name="_Toc243834658"/>
+      <w:bookmarkStart w:id="89" w:name="_Toc243835851"/>
       <w:r>
         <w:t>6.3. Mejoras y líneas futuras</w:t>
       </w:r>
@@ -35018,7 +35015,7 @@
       <w:pPr>
         <w:pStyle w:val="Ttulo3"/>
       </w:pPr>
-      <w:bookmarkStart w:id="90" w:name="_Toc243834659"/>
+      <w:bookmarkStart w:id="90" w:name="_Toc243835852"/>
       <w:r>
         <w:rPr>
           <w:sz w:val="24"/>
@@ -35036,7 +35033,7 @@
       <w:pPr>
         <w:pStyle w:val="Ttulo3"/>
       </w:pPr>
-      <w:bookmarkStart w:id="91" w:name="_Toc243834660"/>
+      <w:bookmarkStart w:id="91" w:name="_Toc243835853"/>
       <w:r>
         <w:rPr>
           <w:sz w:val="24"/>
@@ -35048,12 +35045,12 @@
     </w:p>
     <w:p>
       <w:r>
-        <w:t>La prioridad principal para la siguiente iteración es incorporar un balance hídrico real de la parcela. Requiere combinar sensores de humedad del suelo, capacidad de retención, profundidad radicular, precipitación efectiva y registro del riego realmente aplicado. Con estas entradas el sistema podría estimar el agotamiento admisible propuesto en FAO-56, decidir no solo cuánto sino cuándo regar y aprovechar la lluvia realmente almacenada en el suelo (Allen et al., 1998). Los sensores IoT facilitarían una telemetría continua, pero no sustituyen la caracterización agronómica ni el registro de las actuaciones: recomendar una dosis no prueba que se haya ejecutado. Cualquier mejora de precisión deberá comprobarse mediante observaciones y ensayos de campo. Con esa información, la reducción proporcional por dotación podría sustituirse por una estrategia de riego deficitario que concentre el déficit en las fases menos sensibles del cultivo (Fereres &amp; Soriano, 2007).</w:t>
-      </w:r>
-    </w:p>
-    <w:p>
-      <w:r>
-        <w:t>La segunda prioridad es anticipar los cambios meteorológicos mediante una ET0 futura validada, especialmente para los días 4 a 7. El motor admite esa entrada, pero la aplicación usa de momento ET0 observada reciente. AEMET aporta lluvia prevista al cálculo actual; no hay emisiones históricas archivadas que permitan evaluar su aportación frente a la lluvia finalmente efectiva. Ese archivo deberá registrar emisión, periodo de validez y observación posterior. Con él se podría evaluar una ET0 derivada de variables pronosticadas o el producto de necesidades previstas de SiAR (Sistema de Información Agroclimática para el Regadío, s. f.), sin confundir productos relacionados con una validación independiente. La sustitución de la vía actual exigiría mejorar el error por horizonte en bloques temporales nuevos.</w:t>
+        <w:t>La prioridad principal para la siguiente iteración es incorporar un balance hídrico real de la parcela. La instrumentación podría combinar sondas capacitivas FDR o TDR para contenido volumétrico y tensiómetros para potencial matricial, instalados a varias profundidades representativas de la zona radicular. Como configuración inicial se propone un registro frecuente y una agregación horaria; Sui (2017) documenta un caso con lectura cada minuto, promedio horario y sensores a tres profundidades. La frecuencia definitiva deberá ajustarse al suelo, cultivo y sistema de riego. La tubería de datos controlaría rango físico, valores ausentes, deriva, conectividad y calibración específica del suelo antes de alimentar el DSS. Junto con capacidad de retención, profundidad radicular, precipitación efectiva y riego realmente aplicado, estas entradas permitirían estimar el agotamiento admisible de FAO-56, decidir no solo cuánto sino cuándo regar y aprovechar la lluvia almacenada (Allen et al., 1998). La telemetría no sustituye la caracterización agronómica ni prueba que una dosis recomendada se haya ejecutado. Cualquier mejora deberá validarse en campo; después podría estudiarse un riego deficitario que concentre el déficit en fases menos sensibles (Fereres &amp; Soriano, 2007).</w:t>
+      </w:r>
+    </w:p>
+    <w:p>
+      <w:r>
+        <w:t>La segunda prioridad es anticipar los cambios meteorológicos mediante una ET0 futura validada, especialmente para los días 4 a 7. El motor admite esa entrada, pero la aplicación usa de momento ET0 observada reciente. AEMET aporta lluvia prevista al cálculo actual; no hay emisiones históricas archivadas que permitan evaluar su aportación frente a la lluvia finalmente efectiva. Ese archivo deberá registrar emisión, periodo de validez y observación posterior. Con él se podría evaluar una ET0 derivada de variables pronosticadas o el producto de necesidades previstas de SiAR (Sistema de Información Agroclimática para el Regadío, s. f.), sin confundir productos relacionados con una validación independiente. La sustitución de la vía actual exigiría mejorar el error por horizonte en bloques temporales nuevos. El mismo archivo permitiría modelizar el error local de AEMET mediante dos tareas separadas: clasificación de la ocurrencia de lluvia y regresión de la cantidad observada frente a la prevista. Este posprocesado corregiría sesgos locales y cuantificaría la incertidumbre; no sustituiría la predicción oficial. El entrenamiento respetaría la hora de emisión y reservaría bloques temporales posteriores para prueba.</w:t>
       </w:r>
     </w:p>
     <w:p>
@@ -35065,34 +35062,31 @@
       <w:pPr>
         <w:pStyle w:val="Ttulo3"/>
       </w:pPr>
-      <w:bookmarkStart w:id="92" w:name="_Toc243834661"/>
+      <w:bookmarkStart w:id="92" w:name="_Toc243835854"/>
       <w:r>
         <w:rPr>
           <w:sz w:val="24"/>
         </w:rPr>
+        <w:lastRenderedPageBreak/>
         <w:t>6.3.3. Validación en condiciones de uso</w:t>
       </w:r>
       <w:bookmarkEnd w:id="92"/>
     </w:p>
     <w:p>
       <w:r>
-        <w:t>Antes de un uso agronómico continuado se debe evaluar la aplicación con técnicos y agricultores mediante tareas de interpretación y decisión, midiendo comprensión, utilidad percibida y confianza (Rose et al., 2016). La demo pública permite hacer esa evaluación, pero la publicación del enlace no constituye validación con usuarios.</w:t>
-      </w:r>
-    </w:p>
-    <w:p>
-      <w:r>
-        <w:t xml:space="preserve">La única forma de cuantificar el ahorro de agua o el efecto sobre la producción es un ensayo en campo que registre el riego aplicado, la humedad del suelo y el rendimiento en parcelas que sigan </w:t>
-      </w:r>
-      <w:r>
-        <w:lastRenderedPageBreak/>
-        <w:t>la recomendación y en parcelas de control. El sistema ya exporta cada recomendación con sus parámetros y su origen, de manera que el archivo de recomendaciones emitidas puede compararse directamente con el riego real. Solo entonces podrá sustituirse la referencia calculada por una referencia medida y evaluarse el sistema frente al problema que motivó el trabajo.</w:t>
+        <w:t>Antes de un uso agronómico continuado se debe evaluar la aplicación con técnicos y agricultores mediante tareas de interpretación y decisión, midiendo comprensión, utilidad percibida y confianza (Rose et al., 2016). La aplicación pública permite hacer esa evaluación, pero la publicación del enlace no constituye validación con usuarios.</w:t>
+      </w:r>
+    </w:p>
+    <w:p>
+      <w:r>
+        <w:t>La única forma de cuantificar el ahorro de agua o el efecto sobre la producción es un ensayo en campo que registre el riego aplicado, la humedad del suelo y el rendimiento en parcelas que sigan la recomendación y en parcelas de control. El sistema ya exporta cada recomendación con sus parámetros y su origen, de manera que el archivo de recomendaciones emitidas puede compararse directamente con el riego real. Solo entonces podrá sustituirse la referencia calculada por una referencia medida y evaluarse el sistema frente al problema que motivó el trabajo.</w:t>
       </w:r>
     </w:p>
     <w:p>
       <w:pPr>
         <w:pStyle w:val="Ttulo3"/>
       </w:pPr>
-      <w:bookmarkStart w:id="93" w:name="_Toc243834662"/>
+      <w:bookmarkStart w:id="93" w:name="_Toc243835855"/>
       <w:r>
         <w:rPr>
           <w:sz w:val="24"/>
@@ -35103,14 +35097,14 @@
     </w:p>
     <w:p>
       <w:r>
-        <w:t>La industrialización exigiría persistir catálogos, recomendaciones y metadatos en una base de datos, programar la ingesta y gestionar acceso y operación. Apache Hop y Docker son opciones previstas, todavía no implementadas. La aplicación ya deja elegir entre los casos SiAR declarados; una expansión nacional requeriría un catálogo dinámico, controles agronómicos por cultivo y cobertura de estaciones. Los indicadores del MITECO podrían aportar contexto de cuenca, sin deducir de ellos la dotación de una parcela. PySpark solo estaría justificado con un volumen muy superior al del piloto, como se indicó en 3.2.4.</w:t>
+        <w:t>La industrialización debería ser gradual y proporcional al volumen real. Una primera etapa programaría procesos ligeros en Python o funciones gestionadas que conservaran cada respuesta JSON, su hora de emisión y su procedencia en una capa raw inmutable de almacenamiento de objetos. Una segunda capa normalizaría y particionaría los datos en Parquet por fuente, estación y fecha, con catálogo, controles de calidad y trazabilidad. Una base relacional quedaría reservada para usuarios, parcelas y recomendaciones; el histórico analítico se consultaría con DuckDB o Polars mientras el volumen sea moderado. Si una ampliación nacional y multianual exigiera consultas concurrentes, podría incorporarse un motor SQL distribuido como Trino, capaz de consultar formatos de tabla y archivos Parquet sobre almacenamiento de objetos (Trino, s. f.). Esta evolución sigue los principios de un lakehouse sin presentar Apache Hop, Impala, Hue o PySpark como requisitos. El procesamiento distribuido solo se justificaría mediante mediciones de volumen, latencia y coste que demostrasen una limitación del enfoque ligero. La aplicación seguiría necesitando un catálogo agronómico dinámico, operación, control de acceso y persistencia de consultas.</w:t>
       </w:r>
     </w:p>
     <w:p>
       <w:pPr>
         <w:pStyle w:val="Ttulo3"/>
       </w:pPr>
-      <w:bookmarkStart w:id="94" w:name="_Toc243834663"/>
+      <w:bookmarkStart w:id="94" w:name="_Toc243835856"/>
       <w:r>
         <w:rPr>
           <w:sz w:val="24"/>
@@ -35129,7 +35123,7 @@
         <w:pStyle w:val="Ttulo1"/>
         <w:pageBreakBefore/>
       </w:pPr>
-      <w:bookmarkStart w:id="95" w:name="_Toc243834664"/>
+      <w:bookmarkStart w:id="95" w:name="_Toc243835857"/>
       <w:r>
         <w:lastRenderedPageBreak/>
         <w:t>Referencias bibliográficas</w:t>
@@ -35845,6 +35839,58 @@
         <w:pStyle w:val="BibliografaAPA"/>
       </w:pPr>
       <w:r>
+        <w:t xml:space="preserve">Sui, R. (2017). Soil moisture sensing. </w:t>
+      </w:r>
+      <w:r>
+        <w:rPr>
+          <w:i/>
+        </w:rPr>
+        <w:t>Irrigation Today, 1</w:t>
+      </w:r>
+      <w:r>
+        <w:t xml:space="preserve">(3), 16–17. </w:t>
+      </w:r>
+      <w:hyperlink r:id="rId52">
+        <w:r>
+          <w:rPr>
+            <w:color w:val="0563C1"/>
+            <w:u w:val="single"/>
+          </w:rPr>
+          <w:t>https://www.ars.usda.gov/research/publications/publication/?seqNo115=336401</w:t>
+        </w:r>
+      </w:hyperlink>
+    </w:p>
+    <w:p>
+      <w:pPr>
+        <w:pStyle w:val="BibliografaAPA"/>
+      </w:pPr>
+      <w:r>
+        <w:t xml:space="preserve">Trino. (s. f.). </w:t>
+      </w:r>
+      <w:r>
+        <w:rPr>
+          <w:i/>
+        </w:rPr>
+        <w:t>Object storage</w:t>
+      </w:r>
+      <w:r>
+        <w:t xml:space="preserve">. Recuperado el 25 de octubre de 2026, de </w:t>
+      </w:r>
+      <w:hyperlink r:id="rId53">
+        <w:r>
+          <w:rPr>
+            <w:color w:val="0563C1"/>
+            <w:u w:val="single"/>
+          </w:rPr>
+          <w:t>https://trino.io/docs/current/object-storage.html</w:t>
+        </w:r>
+      </w:hyperlink>
+    </w:p>
+    <w:p>
+      <w:pPr>
+        <w:pStyle w:val="BibliografaAPA"/>
+      </w:pPr>
+      <w:r>
         <w:t xml:space="preserve">Willmott, C. J., &amp; Matsuura, K. (2005). Advantages of the mean absolute error (MAE) over the root mean square error (RMSE) in assessing average model performance. </w:t>
       </w:r>
       <w:r>
@@ -35856,7 +35902,7 @@
       <w:r>
         <w:t xml:space="preserve">(1), 79–82. </w:t>
       </w:r>
-      <w:hyperlink r:id="rId52">
+      <w:hyperlink r:id="rId54">
         <w:r>
           <w:rPr>
             <w:color w:val="0563C1"/>
@@ -35882,7 +35928,7 @@
       <w:r>
         <w:t xml:space="preserve">, 69–80. </w:t>
       </w:r>
-      <w:hyperlink r:id="rId53">
+      <w:hyperlink r:id="rId55">
         <w:r>
           <w:rPr>
             <w:color w:val="0563C1"/>
@@ -35908,7 +35954,7 @@
       <w:r>
         <w:t xml:space="preserve">, 105256. </w:t>
       </w:r>
-      <w:hyperlink r:id="rId54">
+      <w:hyperlink r:id="rId56">
         <w:r>
           <w:rPr>
             <w:color w:val="0563C1"/>
@@ -35934,7 +35980,7 @@
       <w:r>
         <w:t xml:space="preserve">(2–3), 113–132. </w:t>
       </w:r>
-      <w:hyperlink r:id="rId55">
+      <w:hyperlink r:id="rId57">
         <w:r>
           <w:rPr>
             <w:color w:val="0563C1"/>
@@ -35953,7 +35999,7 @@
       <w:pPr>
         <w:pStyle w:val="Ttulo1"/>
       </w:pPr>
-      <w:bookmarkStart w:id="96" w:name="_Toc243834665"/>
+      <w:bookmarkStart w:id="96" w:name="_Toc243835858"/>
       <w:r>
         <w:lastRenderedPageBreak/>
         <w:t>Anexo A. Reproducción y localización de las evidencias</w:t>
@@ -35964,7 +36010,7 @@
       <w:r>
         <w:t xml:space="preserve">El repositorio de entrega, con código, CSV de muestra y resultados, es </w:t>
       </w:r>
-      <w:hyperlink r:id="rId56">
+      <w:hyperlink r:id="rId58">
         <w:r>
           <w:rPr>
             <w:color w:val="0563C1"/>
@@ -35976,7 +36022,7 @@
       <w:r>
         <w:t xml:space="preserve"> Procede del trabajo del equipo en </w:t>
       </w:r>
-      <w:hyperlink r:id="rId57">
+      <w:hyperlink r:id="rId59">
         <w:r>
           <w:rPr>
             <w:color w:val="0563C1"/>
@@ -35986,9 +36032,9 @@
         </w:r>
       </w:hyperlink>
       <w:r>
-        <w:t xml:space="preserve"> las rutas siguientes corresponden al repositorio de entrega en su rama main. Los ensayos con CSV versionados y las pruebas no requieren credenciales. La demo pública está en </w:t>
-      </w:r>
-      <w:hyperlink r:id="rId58">
+        <w:t xml:space="preserve"> las rutas siguientes corresponden al repositorio de entrega en su rama main. Los ensayos con CSV versionados y las pruebas no requieren credenciales. La aplicación pública está en </w:t>
+      </w:r>
+      <w:hyperlink r:id="rId60">
         <w:r>
           <w:rPr>
             <w:color w:val="0563C1"/>
@@ -36005,7 +36051,7 @@
       <w:pPr>
         <w:pStyle w:val="Ttulo2"/>
       </w:pPr>
-      <w:bookmarkStart w:id="97" w:name="_Toc243834666"/>
+      <w:bookmarkStart w:id="97" w:name="_Toc243835859"/>
       <w:r>
         <w:t>A.1. Archivos principales</w:t>
       </w:r>
@@ -36333,7 +36379,7 @@
       <w:pPr>
         <w:pStyle w:val="Ttulo2"/>
       </w:pPr>
-      <w:bookmarkStart w:id="98" w:name="_Toc243834667"/>
+      <w:bookmarkStart w:id="98" w:name="_Toc243835860"/>
       <w:r>
         <w:t>A.2. Secuencia mínima de reproducción</w:t>
       </w:r>
@@ -36415,8 +36461,8 @@
       </w:r>
     </w:p>
     <w:sectPr>
-      <w:headerReference w:type="default" r:id="rId59"/>
-      <w:footerReference w:type="default" r:id="rId60"/>
+      <w:headerReference w:type="default" r:id="rId61"/>
+      <w:footerReference w:type="default" r:id="rId62"/>
       <w:pgSz w:w="11906" w:h="16838" w:code="9"/>
       <w:pgMar w:top="1134" w:right="1134" w:bottom="1134" w:left="1134" w:header="567" w:footer="567" w:gutter="0"/>
       <w:cols w:space="708"/>
@@ -39477,21 +39523,6 @@
 </file>
 
 <file path=customXml/item1.xml><?xml version="1.0" encoding="utf-8"?>
-<?mso-contentType ?>
-<FormTemplates xmlns="http://schemas.microsoft.com/sharepoint/v3/contenttype/forms">
-  <Display>DocumentLibraryForm</Display>
-  <Edit>DocumentLibraryForm</Edit>
-  <New>DocumentLibraryForm</New>
-</FormTemplates>
-</file>
-
-<file path=customXml/item2.xml><?xml version="1.0" encoding="utf-8"?>
-<p:properties xmlns:p="http://schemas.microsoft.com/office/2006/metadata/properties" xmlns:xsi="http://www.w3.org/2001/XMLSchema-instance" xmlns:pc="http://schemas.microsoft.com/office/infopath/2007/PartnerControls">
-  <documentManagement/>
-</p:properties>
-</file>
-
-<file path=customXml/item3.xml><?xml version="1.0" encoding="utf-8"?>
 <ct:contentTypeSchema xmlns:ct="http://schemas.microsoft.com/office/2006/metadata/contentType" xmlns:ma="http://schemas.microsoft.com/office/2006/metadata/properties/metaAttributes" ct:_="" ma:_="" ma:contentTypeName="Documento" ma:contentTypeID="0x01010019FAAD7208B57F46B26AFFED99BCE0D3" ma:contentTypeVersion="12" ma:contentTypeDescription="Crear nuevo documento." ma:contentTypeScope="" ma:versionID="1ef574cbf204855aeab3c40b347ffcdd">
   <xsd:schema xmlns:xsd="http://www.w3.org/2001/XMLSchema" xmlns:xs="http://www.w3.org/2001/XMLSchema" xmlns:p="http://schemas.microsoft.com/office/2006/metadata/properties" xmlns:ns2="9d7b9a5c-6b4f-4ca1-bb03-c38cacb734bc" xmlns:ns3="7d80c08f-e909-465c-8aa4-0e649fbe85d0" targetNamespace="http://schemas.microsoft.com/office/2006/metadata/properties" ma:root="true" ma:fieldsID="d90f8574e5bf50e8ad773515e43a9e2d" ns2:_="" ns3:_="">
     <xsd:import namespace="9d7b9a5c-6b4f-4ca1-bb03-c38cacb734bc"/>
@@ -39708,24 +39739,22 @@
 </ct:contentTypeSchema>
 </file>
 
-<file path=customXml/itemProps1.xml><?xml version="1.0" encoding="utf-8"?>
-<ds:datastoreItem xmlns:ds="http://schemas.openxmlformats.org/officeDocument/2006/customXml" ds:itemID="{E5FD6A2B-9479-4129-9D84-6C858DBE1A90}">
-  <ds:schemaRefs>
-    <ds:schemaRef ds:uri="http://schemas.microsoft.com/sharepoint/v3/contenttype/forms"/>
-  </ds:schemaRefs>
-</ds:datastoreItem>
+<file path=customXml/item2.xml><?xml version="1.0" encoding="utf-8"?>
+<?mso-contentType ?>
+<FormTemplates xmlns="http://schemas.microsoft.com/sharepoint/v3/contenttype/forms">
+  <Display>DocumentLibraryForm</Display>
+  <Edit>DocumentLibraryForm</Edit>
+  <New>DocumentLibraryForm</New>
+</FormTemplates>
 </file>
 
-<file path=customXml/itemProps2.xml><?xml version="1.0" encoding="utf-8"?>
-<ds:datastoreItem xmlns:ds="http://schemas.openxmlformats.org/officeDocument/2006/customXml" ds:itemID="{261B0A37-6C6C-45CF-A5C4-83D994BC3980}">
-  <ds:schemaRefs>
-    <ds:schemaRef ds:uri="http://schemas.microsoft.com/office/2006/metadata/properties"/>
-    <ds:schemaRef ds:uri="http://schemas.microsoft.com/office/infopath/2007/PartnerControls"/>
-  </ds:schemaRefs>
-</ds:datastoreItem>
+<file path=customXml/item3.xml><?xml version="1.0" encoding="utf-8"?>
+<p:properties xmlns:p="http://schemas.microsoft.com/office/2006/metadata/properties" xmlns:xsi="http://www.w3.org/2001/XMLSchema-instance" xmlns:pc="http://schemas.microsoft.com/office/infopath/2007/PartnerControls">
+  <documentManagement/>
+</p:properties>
 </file>
 
-<file path=customXml/itemProps3.xml><?xml version="1.0" encoding="utf-8"?>
+<file path=customXml/itemProps1.xml><?xml version="1.0" encoding="utf-8"?>
 <ds:datastoreItem xmlns:ds="http://schemas.openxmlformats.org/officeDocument/2006/customXml" ds:itemID="{01B4916B-2905-40FE-B973-786E02856A77}">
   <ds:schemaRefs>
     <ds:schemaRef ds:uri="http://schemas.microsoft.com/office/2006/metadata/contentType"/>
@@ -39742,4 +39771,21 @@
     <ds:schemaRef ds:uri="http://schemas.microsoft.com/internal/obd"/>
   </ds:schemaRefs>
 </ds:datastoreItem>
+</file>
+
+<file path=customXml/itemProps2.xml><?xml version="1.0" encoding="utf-8"?>
+<ds:datastoreItem xmlns:ds="http://schemas.openxmlformats.org/officeDocument/2006/customXml" ds:itemID="{E5FD6A2B-9479-4129-9D84-6C858DBE1A90}">
+  <ds:schemaRefs>
+    <ds:schemaRef ds:uri="http://schemas.microsoft.com/sharepoint/v3/contenttype/forms"/>
+  </ds:schemaRefs>
+</ds:datastoreItem>
+</file>
+
+<file path=customXml/itemProps3.xml><?xml version="1.0" encoding="utf-8"?>
+<ds:datastoreItem xmlns:ds="http://schemas.openxmlformats.org/officeDocument/2006/customXml" ds:itemID="{261B0A37-6C6C-45CF-A5C4-83D994BC3980}">
+  <ds:schemaRefs>
+    <ds:schemaRef ds:uri="http://schemas.microsoft.com/office/2006/metadata/properties"/>
+    <ds:schemaRef ds:uri="http://schemas.microsoft.com/office/infopath/2007/PartnerControls"/>
+  </ds:schemaRefs>
+</ds:datastoreItem>
 </file>
</xml_diff>

<commit_message>
Pulir terminología y arquitectura futura
Unifica la terminología académica, concreta la sensorización y plantea una arquitectura analítica gradual y proporcionada. Memoria verificada en 85 páginas y suite de 103 pruebas superada.
</commit_message>
<xml_diff>
--- a/docs/memoria/TFM_definitivo_2026-10-25.docx
+++ b/docs/memoria/TFM_definitivo_2026-10-25.docx
@@ -374,7 +374,7 @@
       <w:r>
         <w:fldChar w:fldCharType="separate"/>
       </w:r>
-      <w:hyperlink w:anchor="_Toc243834571" w:history="1">
+      <w:hyperlink w:anchor="_Toc243835764" w:history="1">
         <w:r>
           <w:rPr>
             <w:rStyle w:val="Hipervnculo"/>
@@ -401,7 +401,7 @@
             <w:noProof/>
             <w:webHidden/>
           </w:rPr>
-          <w:instrText xml:space="preserve"> PAGEREF _Toc243834571 \h </w:instrText>
+          <w:instrText xml:space="preserve"> PAGEREF _Toc243835764 \h </w:instrText>
         </w:r>
         <w:r>
           <w:rPr>
@@ -448,7 +448,7 @@
           <w14:ligatures w14:val="standardContextual"/>
         </w:rPr>
       </w:pPr>
-      <w:hyperlink w:anchor="_Toc243834572" w:history="1">
+      <w:hyperlink w:anchor="_Toc243835765" w:history="1">
         <w:r>
           <w:rPr>
             <w:rStyle w:val="Hipervnculo"/>
@@ -475,7 +475,7 @@
             <w:noProof/>
             <w:webHidden/>
           </w:rPr>
-          <w:instrText xml:space="preserve"> PAGEREF _Toc243834572 \h </w:instrText>
+          <w:instrText xml:space="preserve"> PAGEREF _Toc243835765 \h </w:instrText>
         </w:r>
         <w:r>
           <w:rPr>
@@ -522,7 +522,7 @@
           <w14:ligatures w14:val="standardContextual"/>
         </w:rPr>
       </w:pPr>
-      <w:hyperlink w:anchor="_Toc243834573" w:history="1">
+      <w:hyperlink w:anchor="_Toc243835766" w:history="1">
         <w:r>
           <w:rPr>
             <w:rStyle w:val="Hipervnculo"/>
@@ -549,7 +549,7 @@
             <w:noProof/>
             <w:webHidden/>
           </w:rPr>
-          <w:instrText xml:space="preserve"> PAGEREF _Toc243834573 \h </w:instrText>
+          <w:instrText xml:space="preserve"> PAGEREF _Toc243835766 \h </w:instrText>
         </w:r>
         <w:r>
           <w:rPr>
@@ -596,7 +596,7 @@
           <w14:ligatures w14:val="standardContextual"/>
         </w:rPr>
       </w:pPr>
-      <w:hyperlink w:anchor="_Toc243834574" w:history="1">
+      <w:hyperlink w:anchor="_Toc243835767" w:history="1">
         <w:r>
           <w:rPr>
             <w:rStyle w:val="Hipervnculo"/>
@@ -623,7 +623,7 @@
             <w:noProof/>
             <w:webHidden/>
           </w:rPr>
-          <w:instrText xml:space="preserve"> PAGEREF _Toc243834574 \h </w:instrText>
+          <w:instrText xml:space="preserve"> PAGEREF _Toc243835767 \h </w:instrText>
         </w:r>
         <w:r>
           <w:rPr>
@@ -670,7 +670,7 @@
           <w14:ligatures w14:val="standardContextual"/>
         </w:rPr>
       </w:pPr>
-      <w:hyperlink w:anchor="_Toc243834575" w:history="1">
+      <w:hyperlink w:anchor="_Toc243835768" w:history="1">
         <w:r>
           <w:rPr>
             <w:rStyle w:val="Hipervnculo"/>
@@ -697,7 +697,7 @@
             <w:noProof/>
             <w:webHidden/>
           </w:rPr>
-          <w:instrText xml:space="preserve"> PAGEREF _Toc243834575 \h </w:instrText>
+          <w:instrText xml:space="preserve"> PAGEREF _Toc243835768 \h </w:instrText>
         </w:r>
         <w:r>
           <w:rPr>
@@ -744,7 +744,7 @@
           <w14:ligatures w14:val="standardContextual"/>
         </w:rPr>
       </w:pPr>
-      <w:hyperlink w:anchor="_Toc243834576" w:history="1">
+      <w:hyperlink w:anchor="_Toc243835769" w:history="1">
         <w:r>
           <w:rPr>
             <w:rStyle w:val="Hipervnculo"/>
@@ -771,7 +771,7 @@
             <w:noProof/>
             <w:webHidden/>
           </w:rPr>
-          <w:instrText xml:space="preserve"> PAGEREF _Toc243834576 \h </w:instrText>
+          <w:instrText xml:space="preserve"> PAGEREF _Toc243835769 \h </w:instrText>
         </w:r>
         <w:r>
           <w:rPr>
@@ -818,13 +818,13 @@
           <w14:ligatures w14:val="standardContextual"/>
         </w:rPr>
       </w:pPr>
-      <w:hyperlink w:anchor="_Toc243834577" w:history="1">
+      <w:hyperlink w:anchor="_Toc243835770" w:history="1">
         <w:r>
           <w:rPr>
             <w:rStyle w:val="Hipervnculo"/>
             <w:noProof/>
           </w:rPr>
-          <w:t>2.2. Agricultura de precisión y Machine Learning</w:t>
+          <w:t>2.2. Agricultura de precisión y aprendizaje automático</w:t>
         </w:r>
         <w:r>
           <w:rPr>
@@ -845,7 +845,7 @@
             <w:noProof/>
             <w:webHidden/>
           </w:rPr>
-          <w:instrText xml:space="preserve"> PAGEREF _Toc243834577 \h </w:instrText>
+          <w:instrText xml:space="preserve"> PAGEREF _Toc243835770 \h </w:instrText>
         </w:r>
         <w:r>
           <w:rPr>
@@ -892,7 +892,7 @@
           <w14:ligatures w14:val="standardContextual"/>
         </w:rPr>
       </w:pPr>
-      <w:hyperlink w:anchor="_Toc243834578" w:history="1">
+      <w:hyperlink w:anchor="_Toc243835771" w:history="1">
         <w:r>
           <w:rPr>
             <w:rStyle w:val="Hipervnculo"/>
@@ -919,7 +919,7 @@
             <w:noProof/>
             <w:webHidden/>
           </w:rPr>
-          <w:instrText xml:space="preserve"> PAGEREF _Toc243834578 \h </w:instrText>
+          <w:instrText xml:space="preserve"> PAGEREF _Toc243835771 \h </w:instrText>
         </w:r>
         <w:r>
           <w:rPr>
@@ -966,7 +966,7 @@
           <w14:ligatures w14:val="standardContextual"/>
         </w:rPr>
       </w:pPr>
-      <w:hyperlink w:anchor="_Toc243834579" w:history="1">
+      <w:hyperlink w:anchor="_Toc243835772" w:history="1">
         <w:r>
           <w:rPr>
             <w:rStyle w:val="Hipervnculo"/>
@@ -993,7 +993,7 @@
             <w:noProof/>
             <w:webHidden/>
           </w:rPr>
-          <w:instrText xml:space="preserve"> PAGEREF _Toc243834579 \h </w:instrText>
+          <w:instrText xml:space="preserve"> PAGEREF _Toc243835772 \h </w:instrText>
         </w:r>
         <w:r>
           <w:rPr>
@@ -1040,7 +1040,7 @@
           <w14:ligatures w14:val="standardContextual"/>
         </w:rPr>
       </w:pPr>
-      <w:hyperlink w:anchor="_Toc243834580" w:history="1">
+      <w:hyperlink w:anchor="_Toc243835773" w:history="1">
         <w:r>
           <w:rPr>
             <w:rStyle w:val="Hipervnculo"/>
@@ -1067,7 +1067,7 @@
             <w:noProof/>
             <w:webHidden/>
           </w:rPr>
-          <w:instrText xml:space="preserve"> PAGEREF _Toc243834580 \h </w:instrText>
+          <w:instrText xml:space="preserve"> PAGEREF _Toc243835773 \h </w:instrText>
         </w:r>
         <w:r>
           <w:rPr>
@@ -1114,7 +1114,7 @@
           <w14:ligatures w14:val="standardContextual"/>
         </w:rPr>
       </w:pPr>
-      <w:hyperlink w:anchor="_Toc243834581" w:history="1">
+      <w:hyperlink w:anchor="_Toc243835774" w:history="1">
         <w:r>
           <w:rPr>
             <w:rStyle w:val="Hipervnculo"/>
@@ -1141,7 +1141,7 @@
             <w:noProof/>
             <w:webHidden/>
           </w:rPr>
-          <w:instrText xml:space="preserve"> PAGEREF _Toc243834581 \h </w:instrText>
+          <w:instrText xml:space="preserve"> PAGEREF _Toc243835774 \h </w:instrText>
         </w:r>
         <w:r>
           <w:rPr>
@@ -1188,7 +1188,7 @@
           <w14:ligatures w14:val="standardContextual"/>
         </w:rPr>
       </w:pPr>
-      <w:hyperlink w:anchor="_Toc243834582" w:history="1">
+      <w:hyperlink w:anchor="_Toc243835775" w:history="1">
         <w:r>
           <w:rPr>
             <w:rStyle w:val="Hipervnculo"/>
@@ -1215,7 +1215,7 @@
             <w:noProof/>
             <w:webHidden/>
           </w:rPr>
-          <w:instrText xml:space="preserve"> PAGEREF _Toc243834582 \h </w:instrText>
+          <w:instrText xml:space="preserve"> PAGEREF _Toc243835775 \h </w:instrText>
         </w:r>
         <w:r>
           <w:rPr>
@@ -1262,7 +1262,7 @@
           <w14:ligatures w14:val="standardContextual"/>
         </w:rPr>
       </w:pPr>
-      <w:hyperlink w:anchor="_Toc243834583" w:history="1">
+      <w:hyperlink w:anchor="_Toc243835776" w:history="1">
         <w:r>
           <w:rPr>
             <w:rStyle w:val="Hipervnculo"/>
@@ -1289,7 +1289,7 @@
             <w:noProof/>
             <w:webHidden/>
           </w:rPr>
-          <w:instrText xml:space="preserve"> PAGEREF _Toc243834583 \h </w:instrText>
+          <w:instrText xml:space="preserve"> PAGEREF _Toc243835776 \h </w:instrText>
         </w:r>
         <w:r>
           <w:rPr>
@@ -1336,7 +1336,7 @@
           <w14:ligatures w14:val="standardContextual"/>
         </w:rPr>
       </w:pPr>
-      <w:hyperlink w:anchor="_Toc243834584" w:history="1">
+      <w:hyperlink w:anchor="_Toc243835777" w:history="1">
         <w:r>
           <w:rPr>
             <w:rStyle w:val="Hipervnculo"/>
@@ -1363,7 +1363,7 @@
             <w:noProof/>
             <w:webHidden/>
           </w:rPr>
-          <w:instrText xml:space="preserve"> PAGEREF _Toc243834584 \h </w:instrText>
+          <w:instrText xml:space="preserve"> PAGEREF _Toc243835777 \h </w:instrText>
         </w:r>
         <w:r>
           <w:rPr>
@@ -1410,7 +1410,7 @@
           <w14:ligatures w14:val="standardContextual"/>
         </w:rPr>
       </w:pPr>
-      <w:hyperlink w:anchor="_Toc243834585" w:history="1">
+      <w:hyperlink w:anchor="_Toc243835778" w:history="1">
         <w:r>
           <w:rPr>
             <w:rStyle w:val="Hipervnculo"/>
@@ -1437,7 +1437,7 @@
             <w:noProof/>
             <w:webHidden/>
           </w:rPr>
-          <w:instrText xml:space="preserve"> PAGEREF _Toc243834585 \h </w:instrText>
+          <w:instrText xml:space="preserve"> PAGEREF _Toc243835778 \h </w:instrText>
         </w:r>
         <w:r>
           <w:rPr>
@@ -1484,7 +1484,7 @@
           <w14:ligatures w14:val="standardContextual"/>
         </w:rPr>
       </w:pPr>
-      <w:hyperlink w:anchor="_Toc243834586" w:history="1">
+      <w:hyperlink w:anchor="_Toc243835779" w:history="1">
         <w:r>
           <w:rPr>
             <w:rStyle w:val="Hipervnculo"/>
@@ -1511,7 +1511,7 @@
             <w:noProof/>
             <w:webHidden/>
           </w:rPr>
-          <w:instrText xml:space="preserve"> PAGEREF _Toc243834586 \h </w:instrText>
+          <w:instrText xml:space="preserve"> PAGEREF _Toc243835779 \h </w:instrText>
         </w:r>
         <w:r>
           <w:rPr>
@@ -1558,7 +1558,7 @@
           <w14:ligatures w14:val="standardContextual"/>
         </w:rPr>
       </w:pPr>
-      <w:hyperlink w:anchor="_Toc243834587" w:history="1">
+      <w:hyperlink w:anchor="_Toc243835780" w:history="1">
         <w:r>
           <w:rPr>
             <w:rStyle w:val="Hipervnculo"/>
@@ -1585,7 +1585,7 @@
             <w:noProof/>
             <w:webHidden/>
           </w:rPr>
-          <w:instrText xml:space="preserve"> PAGEREF _Toc243834587 \h </w:instrText>
+          <w:instrText xml:space="preserve"> PAGEREF _Toc243835780 \h </w:instrText>
         </w:r>
         <w:r>
           <w:rPr>
@@ -1632,7 +1632,7 @@
           <w14:ligatures w14:val="standardContextual"/>
         </w:rPr>
       </w:pPr>
-      <w:hyperlink w:anchor="_Toc243834588" w:history="1">
+      <w:hyperlink w:anchor="_Toc243835781" w:history="1">
         <w:r>
           <w:rPr>
             <w:rStyle w:val="Hipervnculo"/>
@@ -1659,7 +1659,7 @@
             <w:noProof/>
             <w:webHidden/>
           </w:rPr>
-          <w:instrText xml:space="preserve"> PAGEREF _Toc243834588 \h </w:instrText>
+          <w:instrText xml:space="preserve"> PAGEREF _Toc243835781 \h </w:instrText>
         </w:r>
         <w:r>
           <w:rPr>
@@ -1706,7 +1706,7 @@
           <w14:ligatures w14:val="standardContextual"/>
         </w:rPr>
       </w:pPr>
-      <w:hyperlink w:anchor="_Toc243834589" w:history="1">
+      <w:hyperlink w:anchor="_Toc243835782" w:history="1">
         <w:r>
           <w:rPr>
             <w:rStyle w:val="Hipervnculo"/>
@@ -1733,7 +1733,7 @@
             <w:noProof/>
             <w:webHidden/>
           </w:rPr>
-          <w:instrText xml:space="preserve"> PAGEREF _Toc243834589 \h </w:instrText>
+          <w:instrText xml:space="preserve"> PAGEREF _Toc243835782 \h </w:instrText>
         </w:r>
         <w:r>
           <w:rPr>
@@ -1780,7 +1780,7 @@
           <w14:ligatures w14:val="standardContextual"/>
         </w:rPr>
       </w:pPr>
-      <w:hyperlink w:anchor="_Toc243834590" w:history="1">
+      <w:hyperlink w:anchor="_Toc243835783" w:history="1">
         <w:r>
           <w:rPr>
             <w:rStyle w:val="Hipervnculo"/>
@@ -1807,7 +1807,7 @@
             <w:noProof/>
             <w:webHidden/>
           </w:rPr>
-          <w:instrText xml:space="preserve"> PAGEREF _Toc243834590 \h </w:instrText>
+          <w:instrText xml:space="preserve"> PAGEREF _Toc243835783 \h </w:instrText>
         </w:r>
         <w:r>
           <w:rPr>
@@ -1854,13 +1854,13 @@
           <w14:ligatures w14:val="standardContextual"/>
         </w:rPr>
       </w:pPr>
-      <w:hyperlink w:anchor="_Toc243834591" w:history="1">
+      <w:hyperlink w:anchor="_Toc243835784" w:history="1">
         <w:r>
           <w:rPr>
             <w:rStyle w:val="Hipervnculo"/>
             <w:noProof/>
           </w:rPr>
-          <w:t>4. Procesamiento de datos y Machine Learning</w:t>
+          <w:t>4. Procesamiento de datos y aprendizaje automático</w:t>
         </w:r>
         <w:r>
           <w:rPr>
@@ -1881,7 +1881,7 @@
             <w:noProof/>
             <w:webHidden/>
           </w:rPr>
-          <w:instrText xml:space="preserve"> PAGEREF _Toc243834591 \h </w:instrText>
+          <w:instrText xml:space="preserve"> PAGEREF _Toc243835784 \h </w:instrText>
         </w:r>
         <w:r>
           <w:rPr>
@@ -1928,7 +1928,7 @@
           <w14:ligatures w14:val="standardContextual"/>
         </w:rPr>
       </w:pPr>
-      <w:hyperlink w:anchor="_Toc243834592" w:history="1">
+      <w:hyperlink w:anchor="_Toc243835785" w:history="1">
         <w:r>
           <w:rPr>
             <w:rStyle w:val="Hipervnculo"/>
@@ -1955,7 +1955,7 @@
             <w:noProof/>
             <w:webHidden/>
           </w:rPr>
-          <w:instrText xml:space="preserve"> PAGEREF _Toc243834592 \h </w:instrText>
+          <w:instrText xml:space="preserve"> PAGEREF _Toc243835785 \h </w:instrText>
         </w:r>
         <w:r>
           <w:rPr>
@@ -2002,7 +2002,7 @@
           <w14:ligatures w14:val="standardContextual"/>
         </w:rPr>
       </w:pPr>
-      <w:hyperlink w:anchor="_Toc243834593" w:history="1">
+      <w:hyperlink w:anchor="_Toc243835786" w:history="1">
         <w:r>
           <w:rPr>
             <w:rStyle w:val="Hipervnculo"/>
@@ -2029,7 +2029,7 @@
             <w:noProof/>
             <w:webHidden/>
           </w:rPr>
-          <w:instrText xml:space="preserve"> PAGEREF _Toc243834593 \h </w:instrText>
+          <w:instrText xml:space="preserve"> PAGEREF _Toc243835786 \h </w:instrText>
         </w:r>
         <w:r>
           <w:rPr>
@@ -2076,7 +2076,7 @@
           <w14:ligatures w14:val="standardContextual"/>
         </w:rPr>
       </w:pPr>
-      <w:hyperlink w:anchor="_Toc243834594" w:history="1">
+      <w:hyperlink w:anchor="_Toc243835787" w:history="1">
         <w:r>
           <w:rPr>
             <w:rStyle w:val="Hipervnculo"/>
@@ -2103,7 +2103,7 @@
             <w:noProof/>
             <w:webHidden/>
           </w:rPr>
-          <w:instrText xml:space="preserve"> PAGEREF _Toc243834594 \h </w:instrText>
+          <w:instrText xml:space="preserve"> PAGEREF _Toc243835787 \h </w:instrText>
         </w:r>
         <w:r>
           <w:rPr>
@@ -2150,7 +2150,7 @@
           <w14:ligatures w14:val="standardContextual"/>
         </w:rPr>
       </w:pPr>
-      <w:hyperlink w:anchor="_Toc243834595" w:history="1">
+      <w:hyperlink w:anchor="_Toc243835788" w:history="1">
         <w:r>
           <w:rPr>
             <w:rStyle w:val="Hipervnculo"/>
@@ -2177,7 +2177,7 @@
             <w:noProof/>
             <w:webHidden/>
           </w:rPr>
-          <w:instrText xml:space="preserve"> PAGEREF _Toc243834595 \h </w:instrText>
+          <w:instrText xml:space="preserve"> PAGEREF _Toc243835788 \h </w:instrText>
         </w:r>
         <w:r>
           <w:rPr>
@@ -2224,7 +2224,7 @@
           <w14:ligatures w14:val="standardContextual"/>
         </w:rPr>
       </w:pPr>
-      <w:hyperlink w:anchor="_Toc243834596" w:history="1">
+      <w:hyperlink w:anchor="_Toc243835789" w:history="1">
         <w:r>
           <w:rPr>
             <w:rStyle w:val="Hipervnculo"/>
@@ -2251,7 +2251,7 @@
             <w:noProof/>
             <w:webHidden/>
           </w:rPr>
-          <w:instrText xml:space="preserve"> PAGEREF _Toc243834596 \h </w:instrText>
+          <w:instrText xml:space="preserve"> PAGEREF _Toc243835789 \h </w:instrText>
         </w:r>
         <w:r>
           <w:rPr>
@@ -2298,7 +2298,7 @@
           <w14:ligatures w14:val="standardContextual"/>
         </w:rPr>
       </w:pPr>
-      <w:hyperlink w:anchor="_Toc243834597" w:history="1">
+      <w:hyperlink w:anchor="_Toc243835790" w:history="1">
         <w:r>
           <w:rPr>
             <w:rStyle w:val="Hipervnculo"/>
@@ -2325,7 +2325,7 @@
             <w:noProof/>
             <w:webHidden/>
           </w:rPr>
-          <w:instrText xml:space="preserve"> PAGEREF _Toc243834597 \h </w:instrText>
+          <w:instrText xml:space="preserve"> PAGEREF _Toc243835790 \h </w:instrText>
         </w:r>
         <w:r>
           <w:rPr>
@@ -2372,7 +2372,7 @@
           <w14:ligatures w14:val="standardContextual"/>
         </w:rPr>
       </w:pPr>
-      <w:hyperlink w:anchor="_Toc243834598" w:history="1">
+      <w:hyperlink w:anchor="_Toc243835791" w:history="1">
         <w:r>
           <w:rPr>
             <w:rStyle w:val="Hipervnculo"/>
@@ -2399,7 +2399,7 @@
             <w:noProof/>
             <w:webHidden/>
           </w:rPr>
-          <w:instrText xml:space="preserve"> PAGEREF _Toc243834598 \h </w:instrText>
+          <w:instrText xml:space="preserve"> PAGEREF _Toc243835791 \h </w:instrText>
         </w:r>
         <w:r>
           <w:rPr>
@@ -2446,7 +2446,7 @@
           <w14:ligatures w14:val="standardContextual"/>
         </w:rPr>
       </w:pPr>
-      <w:hyperlink w:anchor="_Toc243834599" w:history="1">
+      <w:hyperlink w:anchor="_Toc243835792" w:history="1">
         <w:r>
           <w:rPr>
             <w:rStyle w:val="Hipervnculo"/>
@@ -2473,7 +2473,7 @@
             <w:noProof/>
             <w:webHidden/>
           </w:rPr>
-          <w:instrText xml:space="preserve"> PAGEREF _Toc243834599 \h </w:instrText>
+          <w:instrText xml:space="preserve"> PAGEREF _Toc243835792 \h </w:instrText>
         </w:r>
         <w:r>
           <w:rPr>
@@ -2520,7 +2520,7 @@
           <w14:ligatures w14:val="standardContextual"/>
         </w:rPr>
       </w:pPr>
-      <w:hyperlink w:anchor="_Toc243834600" w:history="1">
+      <w:hyperlink w:anchor="_Toc243835793" w:history="1">
         <w:r>
           <w:rPr>
             <w:rStyle w:val="Hipervnculo"/>
@@ -2547,7 +2547,7 @@
             <w:noProof/>
             <w:webHidden/>
           </w:rPr>
-          <w:instrText xml:space="preserve"> PAGEREF _Toc243834600 \h </w:instrText>
+          <w:instrText xml:space="preserve"> PAGEREF _Toc243835793 \h </w:instrText>
         </w:r>
         <w:r>
           <w:rPr>
@@ -2594,7 +2594,7 @@
           <w14:ligatures w14:val="standardContextual"/>
         </w:rPr>
       </w:pPr>
-      <w:hyperlink w:anchor="_Toc243834601" w:history="1">
+      <w:hyperlink w:anchor="_Toc243835794" w:history="1">
         <w:r>
           <w:rPr>
             <w:rStyle w:val="Hipervnculo"/>
@@ -2621,7 +2621,7 @@
             <w:noProof/>
             <w:webHidden/>
           </w:rPr>
-          <w:instrText xml:space="preserve"> PAGEREF _Toc243834601 \h </w:instrText>
+          <w:instrText xml:space="preserve"> PAGEREF _Toc243835794 \h </w:instrText>
         </w:r>
         <w:r>
           <w:rPr>
@@ -2668,7 +2668,7 @@
           <w14:ligatures w14:val="standardContextual"/>
         </w:rPr>
       </w:pPr>
-      <w:hyperlink w:anchor="_Toc243834602" w:history="1">
+      <w:hyperlink w:anchor="_Toc243835795" w:history="1">
         <w:r>
           <w:rPr>
             <w:rStyle w:val="Hipervnculo"/>
@@ -2695,7 +2695,7 @@
             <w:noProof/>
             <w:webHidden/>
           </w:rPr>
-          <w:instrText xml:space="preserve"> PAGEREF _Toc243834602 \h </w:instrText>
+          <w:instrText xml:space="preserve"> PAGEREF _Toc243835795 \h </w:instrText>
         </w:r>
         <w:r>
           <w:rPr>
@@ -2742,7 +2742,7 @@
           <w14:ligatures w14:val="standardContextual"/>
         </w:rPr>
       </w:pPr>
-      <w:hyperlink w:anchor="_Toc243834603" w:history="1">
+      <w:hyperlink w:anchor="_Toc243835796" w:history="1">
         <w:r>
           <w:rPr>
             <w:rStyle w:val="Hipervnculo"/>
@@ -2769,7 +2769,7 @@
             <w:noProof/>
             <w:webHidden/>
           </w:rPr>
-          <w:instrText xml:space="preserve"> PAGEREF _Toc243834603 \h </w:instrText>
+          <w:instrText xml:space="preserve"> PAGEREF _Toc243835796 \h </w:instrText>
         </w:r>
         <w:r>
           <w:rPr>
@@ -2816,7 +2816,7 @@
           <w14:ligatures w14:val="standardContextual"/>
         </w:rPr>
       </w:pPr>
-      <w:hyperlink w:anchor="_Toc243834604" w:history="1">
+      <w:hyperlink w:anchor="_Toc243835797" w:history="1">
         <w:r>
           <w:rPr>
             <w:rStyle w:val="Hipervnculo"/>
@@ -2843,7 +2843,7 @@
             <w:noProof/>
             <w:webHidden/>
           </w:rPr>
-          <w:instrText xml:space="preserve"> PAGEREF _Toc243834604 \h </w:instrText>
+          <w:instrText xml:space="preserve"> PAGEREF _Toc243835797 \h </w:instrText>
         </w:r>
         <w:r>
           <w:rPr>
@@ -2890,7 +2890,7 @@
           <w14:ligatures w14:val="standardContextual"/>
         </w:rPr>
       </w:pPr>
-      <w:hyperlink w:anchor="_Toc243834605" w:history="1">
+      <w:hyperlink w:anchor="_Toc243835798" w:history="1">
         <w:r>
           <w:rPr>
             <w:rStyle w:val="Hipervnculo"/>
@@ -2917,7 +2917,7 @@
             <w:noProof/>
             <w:webHidden/>
           </w:rPr>
-          <w:instrText xml:space="preserve"> PAGEREF _Toc243834605 \h </w:instrText>
+          <w:instrText xml:space="preserve"> PAGEREF _Toc243835798 \h </w:instrText>
         </w:r>
         <w:r>
           <w:rPr>
@@ -2964,7 +2964,7 @@
           <w14:ligatures w14:val="standardContextual"/>
         </w:rPr>
       </w:pPr>
-      <w:hyperlink w:anchor="_Toc243834606" w:history="1">
+      <w:hyperlink w:anchor="_Toc243835799" w:history="1">
         <w:r>
           <w:rPr>
             <w:rStyle w:val="Hipervnculo"/>
@@ -2991,7 +2991,7 @@
             <w:noProof/>
             <w:webHidden/>
           </w:rPr>
-          <w:instrText xml:space="preserve"> PAGEREF _Toc243834606 \h </w:instrText>
+          <w:instrText xml:space="preserve"> PAGEREF _Toc243835799 \h </w:instrText>
         </w:r>
         <w:r>
           <w:rPr>
@@ -3038,7 +3038,7 @@
           <w14:ligatures w14:val="standardContextual"/>
         </w:rPr>
       </w:pPr>
-      <w:hyperlink w:anchor="_Toc243834607" w:history="1">
+      <w:hyperlink w:anchor="_Toc243835800" w:history="1">
         <w:r>
           <w:rPr>
             <w:rStyle w:val="Hipervnculo"/>
@@ -3065,7 +3065,7 @@
             <w:noProof/>
             <w:webHidden/>
           </w:rPr>
-          <w:instrText xml:space="preserve"> PAGEREF _Toc243834607 \h </w:instrText>
+          <w:instrText xml:space="preserve"> PAGEREF _Toc243835800 \h </w:instrText>
         </w:r>
         <w:r>
           <w:rPr>
@@ -3112,7 +3112,7 @@
           <w14:ligatures w14:val="standardContextual"/>
         </w:rPr>
       </w:pPr>
-      <w:hyperlink w:anchor="_Toc243834608" w:history="1">
+      <w:hyperlink w:anchor="_Toc243835801" w:history="1">
         <w:r>
           <w:rPr>
             <w:rStyle w:val="Hipervnculo"/>
@@ -3139,7 +3139,7 @@
             <w:noProof/>
             <w:webHidden/>
           </w:rPr>
-          <w:instrText xml:space="preserve"> PAGEREF _Toc243834608 \h </w:instrText>
+          <w:instrText xml:space="preserve"> PAGEREF _Toc243835801 \h </w:instrText>
         </w:r>
         <w:r>
           <w:rPr>
@@ -3186,7 +3186,7 @@
           <w14:ligatures w14:val="standardContextual"/>
         </w:rPr>
       </w:pPr>
-      <w:hyperlink w:anchor="_Toc243834609" w:history="1">
+      <w:hyperlink w:anchor="_Toc243835802" w:history="1">
         <w:r>
           <w:rPr>
             <w:rStyle w:val="Hipervnculo"/>
@@ -3213,7 +3213,7 @@
             <w:noProof/>
             <w:webHidden/>
           </w:rPr>
-          <w:instrText xml:space="preserve"> PAGEREF _Toc243834609 \h </w:instrText>
+          <w:instrText xml:space="preserve"> PAGEREF _Toc243835802 \h </w:instrText>
         </w:r>
         <w:r>
           <w:rPr>
@@ -3260,7 +3260,7 @@
           <w14:ligatures w14:val="standardContextual"/>
         </w:rPr>
       </w:pPr>
-      <w:hyperlink w:anchor="_Toc243834610" w:history="1">
+      <w:hyperlink w:anchor="_Toc243835803" w:history="1">
         <w:r>
           <w:rPr>
             <w:rStyle w:val="Hipervnculo"/>
@@ -3287,7 +3287,7 @@
             <w:noProof/>
             <w:webHidden/>
           </w:rPr>
-          <w:instrText xml:space="preserve"> PAGEREF _Toc243834610 \h </w:instrText>
+          <w:instrText xml:space="preserve"> PAGEREF _Toc243835803 \h </w:instrText>
         </w:r>
         <w:r>
           <w:rPr>
@@ -3334,7 +3334,7 @@
           <w14:ligatures w14:val="standardContextual"/>
         </w:rPr>
       </w:pPr>
-      <w:hyperlink w:anchor="_Toc243834611" w:history="1">
+      <w:hyperlink w:anchor="_Toc243835804" w:history="1">
         <w:r>
           <w:rPr>
             <w:rStyle w:val="Hipervnculo"/>
@@ -3361,7 +3361,7 @@
             <w:noProof/>
             <w:webHidden/>
           </w:rPr>
-          <w:instrText xml:space="preserve"> PAGEREF _Toc243834611 \h </w:instrText>
+          <w:instrText xml:space="preserve"> PAGEREF _Toc243835804 \h </w:instrText>
         </w:r>
         <w:r>
           <w:rPr>
@@ -3408,7 +3408,7 @@
           <w14:ligatures w14:val="standardContextual"/>
         </w:rPr>
       </w:pPr>
-      <w:hyperlink w:anchor="_Toc243834612" w:history="1">
+      <w:hyperlink w:anchor="_Toc243835805" w:history="1">
         <w:r>
           <w:rPr>
             <w:rStyle w:val="Hipervnculo"/>
@@ -3435,7 +3435,7 @@
             <w:noProof/>
             <w:webHidden/>
           </w:rPr>
-          <w:instrText xml:space="preserve"> PAGEREF _Toc243834612 \h </w:instrText>
+          <w:instrText xml:space="preserve"> PAGEREF _Toc243835805 \h </w:instrText>
         </w:r>
         <w:r>
           <w:rPr>
@@ -3482,7 +3482,7 @@
           <w14:ligatures w14:val="standardContextual"/>
         </w:rPr>
       </w:pPr>
-      <w:hyperlink w:anchor="_Toc243834613" w:history="1">
+      <w:hyperlink w:anchor="_Toc243835806" w:history="1">
         <w:r>
           <w:rPr>
             <w:rStyle w:val="Hipervnculo"/>
@@ -3509,7 +3509,7 @@
             <w:noProof/>
             <w:webHidden/>
           </w:rPr>
-          <w:instrText xml:space="preserve"> PAGEREF _Toc243834613 \h </w:instrText>
+          <w:instrText xml:space="preserve"> PAGEREF _Toc243835806 \h </w:instrText>
         </w:r>
         <w:r>
           <w:rPr>
@@ -3556,7 +3556,7 @@
           <w14:ligatures w14:val="standardContextual"/>
         </w:rPr>
       </w:pPr>
-      <w:hyperlink w:anchor="_Toc243834614" w:history="1">
+      <w:hyperlink w:anchor="_Toc243835807" w:history="1">
         <w:r>
           <w:rPr>
             <w:rStyle w:val="Hipervnculo"/>
@@ -3583,7 +3583,7 @@
             <w:noProof/>
             <w:webHidden/>
           </w:rPr>
-          <w:instrText xml:space="preserve"> PAGEREF _Toc243834614 \h </w:instrText>
+          <w:instrText xml:space="preserve"> PAGEREF _Toc243835807 \h </w:instrText>
         </w:r>
         <w:r>
           <w:rPr>
@@ -3630,7 +3630,7 @@
           <w14:ligatures w14:val="standardContextual"/>
         </w:rPr>
       </w:pPr>
-      <w:hyperlink w:anchor="_Toc243834615" w:history="1">
+      <w:hyperlink w:anchor="_Toc243835808" w:history="1">
         <w:r>
           <w:rPr>
             <w:rStyle w:val="Hipervnculo"/>
@@ -3657,7 +3657,7 @@
             <w:noProof/>
             <w:webHidden/>
           </w:rPr>
-          <w:instrText xml:space="preserve"> PAGEREF _Toc243834615 \h </w:instrText>
+          <w:instrText xml:space="preserve"> PAGEREF _Toc243835808 \h </w:instrText>
         </w:r>
         <w:r>
           <w:rPr>
@@ -3704,7 +3704,7 @@
           <w14:ligatures w14:val="standardContextual"/>
         </w:rPr>
       </w:pPr>
-      <w:hyperlink w:anchor="_Toc243834616" w:history="1">
+      <w:hyperlink w:anchor="_Toc243835809" w:history="1">
         <w:r>
           <w:rPr>
             <w:rStyle w:val="Hipervnculo"/>
@@ -3731,7 +3731,7 @@
             <w:noProof/>
             <w:webHidden/>
           </w:rPr>
-          <w:instrText xml:space="preserve"> PAGEREF _Toc243834616 \h </w:instrText>
+          <w:instrText xml:space="preserve"> PAGEREF _Toc243835809 \h </w:instrText>
         </w:r>
         <w:r>
           <w:rPr>
@@ -3778,7 +3778,7 @@
           <w14:ligatures w14:val="standardContextual"/>
         </w:rPr>
       </w:pPr>
-      <w:hyperlink w:anchor="_Toc243834617" w:history="1">
+      <w:hyperlink w:anchor="_Toc243835810" w:history="1">
         <w:r>
           <w:rPr>
             <w:rStyle w:val="Hipervnculo"/>
@@ -3805,7 +3805,7 @@
             <w:noProof/>
             <w:webHidden/>
           </w:rPr>
-          <w:instrText xml:space="preserve"> PAGEREF _Toc243834617 \h </w:instrText>
+          <w:instrText xml:space="preserve"> PAGEREF _Toc243835810 \h </w:instrText>
         </w:r>
         <w:r>
           <w:rPr>
@@ -3852,7 +3852,7 @@
           <w14:ligatures w14:val="standardContextual"/>
         </w:rPr>
       </w:pPr>
-      <w:hyperlink w:anchor="_Toc243834618" w:history="1">
+      <w:hyperlink w:anchor="_Toc243835811" w:history="1">
         <w:r>
           <w:rPr>
             <w:rStyle w:val="Hipervnculo"/>
@@ -3879,7 +3879,7 @@
             <w:noProof/>
             <w:webHidden/>
           </w:rPr>
-          <w:instrText xml:space="preserve"> PAGEREF _Toc243834618 \h </w:instrText>
+          <w:instrText xml:space="preserve"> PAGEREF _Toc243835811 \h </w:instrText>
         </w:r>
         <w:r>
           <w:rPr>
@@ -3926,7 +3926,7 @@
           <w14:ligatures w14:val="standardContextual"/>
         </w:rPr>
       </w:pPr>
-      <w:hyperlink w:anchor="_Toc243834619" w:history="1">
+      <w:hyperlink w:anchor="_Toc243835812" w:history="1">
         <w:r>
           <w:rPr>
             <w:rStyle w:val="Hipervnculo"/>
@@ -3953,7 +3953,7 @@
             <w:noProof/>
             <w:webHidden/>
           </w:rPr>
-          <w:instrText xml:space="preserve"> PAGEREF _Toc243834619 \h </w:instrText>
+          <w:instrText xml:space="preserve"> PAGEREF _Toc243835812 \h </w:instrText>
         </w:r>
         <w:r>
           <w:rPr>
@@ -4000,7 +4000,7 @@
           <w14:ligatures w14:val="standardContextual"/>
         </w:rPr>
       </w:pPr>
-      <w:hyperlink w:anchor="_Toc243834620" w:history="1">
+      <w:hyperlink w:anchor="_Toc243835813" w:history="1">
         <w:r>
           <w:rPr>
             <w:rStyle w:val="Hipervnculo"/>
@@ -4027,7 +4027,7 @@
             <w:noProof/>
             <w:webHidden/>
           </w:rPr>
-          <w:instrText xml:space="preserve"> PAGEREF _Toc243834620 \h </w:instrText>
+          <w:instrText xml:space="preserve"> PAGEREF _Toc243835813 \h </w:instrText>
         </w:r>
         <w:r>
           <w:rPr>
@@ -4074,7 +4074,7 @@
           <w14:ligatures w14:val="standardContextual"/>
         </w:rPr>
       </w:pPr>
-      <w:hyperlink w:anchor="_Toc243834621" w:history="1">
+      <w:hyperlink w:anchor="_Toc243835814" w:history="1">
         <w:r>
           <w:rPr>
             <w:rStyle w:val="Hipervnculo"/>
@@ -4101,7 +4101,7 @@
             <w:noProof/>
             <w:webHidden/>
           </w:rPr>
-          <w:instrText xml:space="preserve"> PAGEREF _Toc243834621 \h </w:instrText>
+          <w:instrText xml:space="preserve"> PAGEREF _Toc243835814 \h </w:instrText>
         </w:r>
         <w:r>
           <w:rPr>
@@ -4148,7 +4148,7 @@
           <w14:ligatures w14:val="standardContextual"/>
         </w:rPr>
       </w:pPr>
-      <w:hyperlink w:anchor="_Toc243834622" w:history="1">
+      <w:hyperlink w:anchor="_Toc243835815" w:history="1">
         <w:r>
           <w:rPr>
             <w:rStyle w:val="Hipervnculo"/>
@@ -4175,7 +4175,7 @@
             <w:noProof/>
             <w:webHidden/>
           </w:rPr>
-          <w:instrText xml:space="preserve"> PAGEREF _Toc243834622 \h </w:instrText>
+          <w:instrText xml:space="preserve"> PAGEREF _Toc243835815 \h </w:instrText>
         </w:r>
         <w:r>
           <w:rPr>
@@ -4222,7 +4222,7 @@
           <w14:ligatures w14:val="standardContextual"/>
         </w:rPr>
       </w:pPr>
-      <w:hyperlink w:anchor="_Toc243834623" w:history="1">
+      <w:hyperlink w:anchor="_Toc243835816" w:history="1">
         <w:r>
           <w:rPr>
             <w:rStyle w:val="Hipervnculo"/>
@@ -4249,7 +4249,7 @@
             <w:noProof/>
             <w:webHidden/>
           </w:rPr>
-          <w:instrText xml:space="preserve"> PAGEREF _Toc243834623 \h </w:instrText>
+          <w:instrText xml:space="preserve"> PAGEREF _Toc243835816 \h </w:instrText>
         </w:r>
         <w:r>
           <w:rPr>
@@ -4296,7 +4296,7 @@
           <w14:ligatures w14:val="standardContextual"/>
         </w:rPr>
       </w:pPr>
-      <w:hyperlink w:anchor="_Toc243834624" w:history="1">
+      <w:hyperlink w:anchor="_Toc243835817" w:history="1">
         <w:r>
           <w:rPr>
             <w:rStyle w:val="Hipervnculo"/>
@@ -4323,7 +4323,7 @@
             <w:noProof/>
             <w:webHidden/>
           </w:rPr>
-          <w:instrText xml:space="preserve"> PAGEREF _Toc243834624 \h </w:instrText>
+          <w:instrText xml:space="preserve"> PAGEREF _Toc243835817 \h </w:instrText>
         </w:r>
         <w:r>
           <w:rPr>
@@ -4370,7 +4370,7 @@
           <w14:ligatures w14:val="standardContextual"/>
         </w:rPr>
       </w:pPr>
-      <w:hyperlink w:anchor="_Toc243834625" w:history="1">
+      <w:hyperlink w:anchor="_Toc243835818" w:history="1">
         <w:r>
           <w:rPr>
             <w:rStyle w:val="Hipervnculo"/>
@@ -4397,7 +4397,7 @@
             <w:noProof/>
             <w:webHidden/>
           </w:rPr>
-          <w:instrText xml:space="preserve"> PAGEREF _Toc243834625 \h </w:instrText>
+          <w:instrText xml:space="preserve"> PAGEREF _Toc243835818 \h </w:instrText>
         </w:r>
         <w:r>
           <w:rPr>
@@ -4444,7 +4444,7 @@
           <w14:ligatures w14:val="standardContextual"/>
         </w:rPr>
       </w:pPr>
-      <w:hyperlink w:anchor="_Toc243834626" w:history="1">
+      <w:hyperlink w:anchor="_Toc243835819" w:history="1">
         <w:r>
           <w:rPr>
             <w:rStyle w:val="Hipervnculo"/>
@@ -4471,7 +4471,7 @@
             <w:noProof/>
             <w:webHidden/>
           </w:rPr>
-          <w:instrText xml:space="preserve"> PAGEREF _Toc243834626 \h </w:instrText>
+          <w:instrText xml:space="preserve"> PAGEREF _Toc243835819 \h </w:instrText>
         </w:r>
         <w:r>
           <w:rPr>
@@ -4518,7 +4518,7 @@
           <w14:ligatures w14:val="standardContextual"/>
         </w:rPr>
       </w:pPr>
-      <w:hyperlink w:anchor="_Toc243834627" w:history="1">
+      <w:hyperlink w:anchor="_Toc243835820" w:history="1">
         <w:r>
           <w:rPr>
             <w:rStyle w:val="Hipervnculo"/>
@@ -4545,7 +4545,7 @@
             <w:noProof/>
             <w:webHidden/>
           </w:rPr>
-          <w:instrText xml:space="preserve"> PAGEREF _Toc243834627 \h </w:instrText>
+          <w:instrText xml:space="preserve"> PAGEREF _Toc243835820 \h </w:instrText>
         </w:r>
         <w:r>
           <w:rPr>
@@ -4592,7 +4592,7 @@
           <w14:ligatures w14:val="standardContextual"/>
         </w:rPr>
       </w:pPr>
-      <w:hyperlink w:anchor="_Toc243834628" w:history="1">
+      <w:hyperlink w:anchor="_Toc243835821" w:history="1">
         <w:r>
           <w:rPr>
             <w:rStyle w:val="Hipervnculo"/>
@@ -4619,7 +4619,7 @@
             <w:noProof/>
             <w:webHidden/>
           </w:rPr>
-          <w:instrText xml:space="preserve"> PAGEREF _Toc243834628 \h </w:instrText>
+          <w:instrText xml:space="preserve"> PAGEREF _Toc243835821 \h </w:instrText>
         </w:r>
         <w:r>
           <w:rPr>
@@ -4666,7 +4666,7 @@
           <w14:ligatures w14:val="standardContextual"/>
         </w:rPr>
       </w:pPr>
-      <w:hyperlink w:anchor="_Toc243834629" w:history="1">
+      <w:hyperlink w:anchor="_Toc243835822" w:history="1">
         <w:r>
           <w:rPr>
             <w:rStyle w:val="Hipervnculo"/>
@@ -4693,7 +4693,7 @@
             <w:noProof/>
             <w:webHidden/>
           </w:rPr>
-          <w:instrText xml:space="preserve"> PAGEREF _Toc243834629 \h </w:instrText>
+          <w:instrText xml:space="preserve"> PAGEREF _Toc243835822 \h </w:instrText>
         </w:r>
         <w:r>
           <w:rPr>
@@ -4740,7 +4740,7 @@
           <w14:ligatures w14:val="standardContextual"/>
         </w:rPr>
       </w:pPr>
-      <w:hyperlink w:anchor="_Toc243834630" w:history="1">
+      <w:hyperlink w:anchor="_Toc243835823" w:history="1">
         <w:r>
           <w:rPr>
             <w:rStyle w:val="Hipervnculo"/>
@@ -4767,7 +4767,7 @@
             <w:noProof/>
             <w:webHidden/>
           </w:rPr>
-          <w:instrText xml:space="preserve"> PAGEREF _Toc243834630 \h </w:instrText>
+          <w:instrText xml:space="preserve"> PAGEREF _Toc243835823 \h </w:instrText>
         </w:r>
         <w:r>
           <w:rPr>
@@ -4814,7 +4814,7 @@
           <w14:ligatures w14:val="standardContextual"/>
         </w:rPr>
       </w:pPr>
-      <w:hyperlink w:anchor="_Toc243834631" w:history="1">
+      <w:hyperlink w:anchor="_Toc243835824" w:history="1">
         <w:r>
           <w:rPr>
             <w:rStyle w:val="Hipervnculo"/>
@@ -4841,7 +4841,7 @@
             <w:noProof/>
             <w:webHidden/>
           </w:rPr>
-          <w:instrText xml:space="preserve"> PAGEREF _Toc243834631 \h </w:instrText>
+          <w:instrText xml:space="preserve"> PAGEREF _Toc243835824 \h </w:instrText>
         </w:r>
         <w:r>
           <w:rPr>
@@ -4888,7 +4888,7 @@
           <w14:ligatures w14:val="standardContextual"/>
         </w:rPr>
       </w:pPr>
-      <w:hyperlink w:anchor="_Toc243834632" w:history="1">
+      <w:hyperlink w:anchor="_Toc243835825" w:history="1">
         <w:r>
           <w:rPr>
             <w:rStyle w:val="Hipervnculo"/>
@@ -4915,7 +4915,7 @@
             <w:noProof/>
             <w:webHidden/>
           </w:rPr>
-          <w:instrText xml:space="preserve"> PAGEREF _Toc243834632 \h </w:instrText>
+          <w:instrText xml:space="preserve"> PAGEREF _Toc243835825 \h </w:instrText>
         </w:r>
         <w:r>
           <w:rPr>
@@ -4962,7 +4962,7 @@
           <w14:ligatures w14:val="standardContextual"/>
         </w:rPr>
       </w:pPr>
-      <w:hyperlink w:anchor="_Toc243834633" w:history="1">
+      <w:hyperlink w:anchor="_Toc243835826" w:history="1">
         <w:r>
           <w:rPr>
             <w:rStyle w:val="Hipervnculo"/>
@@ -4989,7 +4989,7 @@
             <w:noProof/>
             <w:webHidden/>
           </w:rPr>
-          <w:instrText xml:space="preserve"> PAGEREF _Toc243834633 \h </w:instrText>
+          <w:instrText xml:space="preserve"> PAGEREF _Toc243835826 \h </w:instrText>
         </w:r>
         <w:r>
           <w:rPr>
@@ -5036,7 +5036,7 @@
           <w14:ligatures w14:val="standardContextual"/>
         </w:rPr>
       </w:pPr>
-      <w:hyperlink w:anchor="_Toc243834634" w:history="1">
+      <w:hyperlink w:anchor="_Toc243835827" w:history="1">
         <w:r>
           <w:rPr>
             <w:rStyle w:val="Hipervnculo"/>
@@ -5063,7 +5063,7 @@
             <w:noProof/>
             <w:webHidden/>
           </w:rPr>
-          <w:instrText xml:space="preserve"> PAGEREF _Toc243834634 \h </w:instrText>
+          <w:instrText xml:space="preserve"> PAGEREF _Toc243835827 \h </w:instrText>
         </w:r>
         <w:r>
           <w:rPr>
@@ -5110,7 +5110,7 @@
           <w14:ligatures w14:val="standardContextual"/>
         </w:rPr>
       </w:pPr>
-      <w:hyperlink w:anchor="_Toc243834635" w:history="1">
+      <w:hyperlink w:anchor="_Toc243835828" w:history="1">
         <w:r>
           <w:rPr>
             <w:rStyle w:val="Hipervnculo"/>
@@ -5137,7 +5137,7 @@
             <w:noProof/>
             <w:webHidden/>
           </w:rPr>
-          <w:instrText xml:space="preserve"> PAGEREF _Toc243834635 \h </w:instrText>
+          <w:instrText xml:space="preserve"> PAGEREF _Toc243835828 \h </w:instrText>
         </w:r>
         <w:r>
           <w:rPr>
@@ -5184,7 +5184,7 @@
           <w14:ligatures w14:val="standardContextual"/>
         </w:rPr>
       </w:pPr>
-      <w:hyperlink w:anchor="_Toc243834636" w:history="1">
+      <w:hyperlink w:anchor="_Toc243835829" w:history="1">
         <w:r>
           <w:rPr>
             <w:rStyle w:val="Hipervnculo"/>
@@ -5211,7 +5211,7 @@
             <w:noProof/>
             <w:webHidden/>
           </w:rPr>
-          <w:instrText xml:space="preserve"> PAGEREF _Toc243834636 \h </w:instrText>
+          <w:instrText xml:space="preserve"> PAGEREF _Toc243835829 \h </w:instrText>
         </w:r>
         <w:r>
           <w:rPr>
@@ -5258,7 +5258,7 @@
           <w14:ligatures w14:val="standardContextual"/>
         </w:rPr>
       </w:pPr>
-      <w:hyperlink w:anchor="_Toc243834637" w:history="1">
+      <w:hyperlink w:anchor="_Toc243835830" w:history="1">
         <w:r>
           <w:rPr>
             <w:rStyle w:val="Hipervnculo"/>
@@ -5285,7 +5285,7 @@
             <w:noProof/>
             <w:webHidden/>
           </w:rPr>
-          <w:instrText xml:space="preserve"> PAGEREF _Toc243834637 \h </w:instrText>
+          <w:instrText xml:space="preserve"> PAGEREF _Toc243835830 \h </w:instrText>
         </w:r>
         <w:r>
           <w:rPr>
@@ -5332,7 +5332,7 @@
           <w14:ligatures w14:val="standardContextual"/>
         </w:rPr>
       </w:pPr>
-      <w:hyperlink w:anchor="_Toc243834638" w:history="1">
+      <w:hyperlink w:anchor="_Toc243835831" w:history="1">
         <w:r>
           <w:rPr>
             <w:rStyle w:val="Hipervnculo"/>
@@ -5359,7 +5359,7 @@
             <w:noProof/>
             <w:webHidden/>
           </w:rPr>
-          <w:instrText xml:space="preserve"> PAGEREF _Toc243834638 \h </w:instrText>
+          <w:instrText xml:space="preserve"> PAGEREF _Toc243835831 \h </w:instrText>
         </w:r>
         <w:r>
           <w:rPr>
@@ -5406,7 +5406,7 @@
           <w14:ligatures w14:val="standardContextual"/>
         </w:rPr>
       </w:pPr>
-      <w:hyperlink w:anchor="_Toc243834639" w:history="1">
+      <w:hyperlink w:anchor="_Toc243835832" w:history="1">
         <w:r>
           <w:rPr>
             <w:rStyle w:val="Hipervnculo"/>
@@ -5433,7 +5433,7 @@
             <w:noProof/>
             <w:webHidden/>
           </w:rPr>
-          <w:instrText xml:space="preserve"> PAGEREF _Toc243834639 \h </w:instrText>
+          <w:instrText xml:space="preserve"> PAGEREF _Toc243835832 \h </w:instrText>
         </w:r>
         <w:r>
           <w:rPr>
@@ -5480,7 +5480,7 @@
           <w14:ligatures w14:val="standardContextual"/>
         </w:rPr>
       </w:pPr>
-      <w:hyperlink w:anchor="_Toc243834640" w:history="1">
+      <w:hyperlink w:anchor="_Toc243835833" w:history="1">
         <w:r>
           <w:rPr>
             <w:rStyle w:val="Hipervnculo"/>
@@ -5507,7 +5507,7 @@
             <w:noProof/>
             <w:webHidden/>
           </w:rPr>
-          <w:instrText xml:space="preserve"> PAGEREF _Toc243834640 \h </w:instrText>
+          <w:instrText xml:space="preserve"> PAGEREF _Toc243835833 \h </w:instrText>
         </w:r>
         <w:r>
           <w:rPr>
@@ -5554,7 +5554,7 @@
           <w14:ligatures w14:val="standardContextual"/>
         </w:rPr>
       </w:pPr>
-      <w:hyperlink w:anchor="_Toc243834641" w:history="1">
+      <w:hyperlink w:anchor="_Toc243835834" w:history="1">
         <w:r>
           <w:rPr>
             <w:rStyle w:val="Hipervnculo"/>
@@ -5581,7 +5581,7 @@
             <w:noProof/>
             <w:webHidden/>
           </w:rPr>
-          <w:instrText xml:space="preserve"> PAGEREF _Toc243834641 \h </w:instrText>
+          <w:instrText xml:space="preserve"> PAGEREF _Toc243835834 \h </w:instrText>
         </w:r>
         <w:r>
           <w:rPr>
@@ -5628,7 +5628,7 @@
           <w14:ligatures w14:val="standardContextual"/>
         </w:rPr>
       </w:pPr>
-      <w:hyperlink w:anchor="_Toc243834642" w:history="1">
+      <w:hyperlink w:anchor="_Toc243835835" w:history="1">
         <w:r>
           <w:rPr>
             <w:rStyle w:val="Hipervnculo"/>
@@ -5655,7 +5655,7 @@
             <w:noProof/>
             <w:webHidden/>
           </w:rPr>
-          <w:instrText xml:space="preserve"> PAGEREF _Toc243834642 \h </w:instrText>
+          <w:instrText xml:space="preserve"> PAGEREF _Toc243835835 \h </w:instrText>
         </w:r>
         <w:r>
           <w:rPr>
@@ -5702,7 +5702,7 @@
           <w14:ligatures w14:val="standardContextual"/>
         </w:rPr>
       </w:pPr>
-      <w:hyperlink w:anchor="_Toc243834643" w:history="1">
+      <w:hyperlink w:anchor="_Toc243835836" w:history="1">
         <w:r>
           <w:rPr>
             <w:rStyle w:val="Hipervnculo"/>
@@ -5729,7 +5729,7 @@
             <w:noProof/>
             <w:webHidden/>
           </w:rPr>
-          <w:instrText xml:space="preserve"> PAGEREF _Toc243834643 \h </w:instrText>
+          <w:instrText xml:space="preserve"> PAGEREF _Toc243835836 \h </w:instrText>
         </w:r>
         <w:r>
           <w:rPr>
@@ -5776,7 +5776,7 @@
           <w14:ligatures w14:val="standardContextual"/>
         </w:rPr>
       </w:pPr>
-      <w:hyperlink w:anchor="_Toc243834644" w:history="1">
+      <w:hyperlink w:anchor="_Toc243835837" w:history="1">
         <w:r>
           <w:rPr>
             <w:rStyle w:val="Hipervnculo"/>
@@ -5803,7 +5803,7 @@
             <w:noProof/>
             <w:webHidden/>
           </w:rPr>
-          <w:instrText xml:space="preserve"> PAGEREF _Toc243834644 \h </w:instrText>
+          <w:instrText xml:space="preserve"> PAGEREF _Toc243835837 \h </w:instrText>
         </w:r>
         <w:r>
           <w:rPr>
@@ -5850,7 +5850,7 @@
           <w14:ligatures w14:val="standardContextual"/>
         </w:rPr>
       </w:pPr>
-      <w:hyperlink w:anchor="_Toc243834645" w:history="1">
+      <w:hyperlink w:anchor="_Toc243835838" w:history="1">
         <w:r>
           <w:rPr>
             <w:rStyle w:val="Hipervnculo"/>
@@ -5877,7 +5877,7 @@
             <w:noProof/>
             <w:webHidden/>
           </w:rPr>
-          <w:instrText xml:space="preserve"> PAGEREF _Toc243834645 \h </w:instrText>
+          <w:instrText xml:space="preserve"> PAGEREF _Toc243835838 \h </w:instrText>
         </w:r>
         <w:r>
           <w:rPr>
@@ -5924,7 +5924,7 @@
           <w14:ligatures w14:val="standardContextual"/>
         </w:rPr>
       </w:pPr>
-      <w:hyperlink w:anchor="_Toc243834646" w:history="1">
+      <w:hyperlink w:anchor="_Toc243835839" w:history="1">
         <w:r>
           <w:rPr>
             <w:rStyle w:val="Hipervnculo"/>
@@ -5951,7 +5951,7 @@
             <w:noProof/>
             <w:webHidden/>
           </w:rPr>
-          <w:instrText xml:space="preserve"> PAGEREF _Toc243834646 \h </w:instrText>
+          <w:instrText xml:space="preserve"> PAGEREF _Toc243835839 \h </w:instrText>
         </w:r>
         <w:r>
           <w:rPr>
@@ -5998,7 +5998,7 @@
           <w14:ligatures w14:val="standardContextual"/>
         </w:rPr>
       </w:pPr>
-      <w:hyperlink w:anchor="_Toc243834647" w:history="1">
+      <w:hyperlink w:anchor="_Toc243835840" w:history="1">
         <w:r>
           <w:rPr>
             <w:rStyle w:val="Hipervnculo"/>
@@ -6025,7 +6025,7 @@
             <w:noProof/>
             <w:webHidden/>
           </w:rPr>
-          <w:instrText xml:space="preserve"> PAGEREF _Toc243834647 \h </w:instrText>
+          <w:instrText xml:space="preserve"> PAGEREF _Toc243835840 \h </w:instrText>
         </w:r>
         <w:r>
           <w:rPr>
@@ -6072,7 +6072,7 @@
           <w14:ligatures w14:val="standardContextual"/>
         </w:rPr>
       </w:pPr>
-      <w:hyperlink w:anchor="_Toc243834648" w:history="1">
+      <w:hyperlink w:anchor="_Toc243835841" w:history="1">
         <w:r>
           <w:rPr>
             <w:rStyle w:val="Hipervnculo"/>
@@ -6099,7 +6099,7 @@
             <w:noProof/>
             <w:webHidden/>
           </w:rPr>
-          <w:instrText xml:space="preserve"> PAGEREF _Toc243834648 \h </w:instrText>
+          <w:instrText xml:space="preserve"> PAGEREF _Toc243835841 \h </w:instrText>
         </w:r>
         <w:r>
           <w:rPr>
@@ -6146,7 +6146,7 @@
           <w14:ligatures w14:val="standardContextual"/>
         </w:rPr>
       </w:pPr>
-      <w:hyperlink w:anchor="_Toc243834649" w:history="1">
+      <w:hyperlink w:anchor="_Toc243835842" w:history="1">
         <w:r>
           <w:rPr>
             <w:rStyle w:val="Hipervnculo"/>
@@ -6173,7 +6173,7 @@
             <w:noProof/>
             <w:webHidden/>
           </w:rPr>
-          <w:instrText xml:space="preserve"> PAGEREF _Toc243834649 \h </w:instrText>
+          <w:instrText xml:space="preserve"> PAGEREF _Toc243835842 \h </w:instrText>
         </w:r>
         <w:r>
           <w:rPr>
@@ -6220,7 +6220,7 @@
           <w14:ligatures w14:val="standardContextual"/>
         </w:rPr>
       </w:pPr>
-      <w:hyperlink w:anchor="_Toc243834650" w:history="1">
+      <w:hyperlink w:anchor="_Toc243835843" w:history="1">
         <w:r>
           <w:rPr>
             <w:rStyle w:val="Hipervnculo"/>
@@ -6247,7 +6247,7 @@
             <w:noProof/>
             <w:webHidden/>
           </w:rPr>
-          <w:instrText xml:space="preserve"> PAGEREF _Toc243834650 \h </w:instrText>
+          <w:instrText xml:space="preserve"> PAGEREF _Toc243835843 \h </w:instrText>
         </w:r>
         <w:r>
           <w:rPr>
@@ -6294,7 +6294,7 @@
           <w14:ligatures w14:val="standardContextual"/>
         </w:rPr>
       </w:pPr>
-      <w:hyperlink w:anchor="_Toc243834651" w:history="1">
+      <w:hyperlink w:anchor="_Toc243835844" w:history="1">
         <w:r>
           <w:rPr>
             <w:rStyle w:val="Hipervnculo"/>
@@ -6321,7 +6321,7 @@
             <w:noProof/>
             <w:webHidden/>
           </w:rPr>
-          <w:instrText xml:space="preserve"> PAGEREF _Toc243834651 \h </w:instrText>
+          <w:instrText xml:space="preserve"> PAGEREF _Toc243835844 \h </w:instrText>
         </w:r>
         <w:r>
           <w:rPr>
@@ -6368,7 +6368,7 @@
           <w14:ligatures w14:val="standardContextual"/>
         </w:rPr>
       </w:pPr>
-      <w:hyperlink w:anchor="_Toc243834652" w:history="1">
+      <w:hyperlink w:anchor="_Toc243835845" w:history="1">
         <w:r>
           <w:rPr>
             <w:rStyle w:val="Hipervnculo"/>
@@ -6395,7 +6395,7 @@
             <w:noProof/>
             <w:webHidden/>
           </w:rPr>
-          <w:instrText xml:space="preserve"> PAGEREF _Toc243834652 \h </w:instrText>
+          <w:instrText xml:space="preserve"> PAGEREF _Toc243835845 \h </w:instrText>
         </w:r>
         <w:r>
           <w:rPr>
@@ -6442,7 +6442,7 @@
           <w14:ligatures w14:val="standardContextual"/>
         </w:rPr>
       </w:pPr>
-      <w:hyperlink w:anchor="_Toc243834653" w:history="1">
+      <w:hyperlink w:anchor="_Toc243835846" w:history="1">
         <w:r>
           <w:rPr>
             <w:rStyle w:val="Hipervnculo"/>
@@ -6469,7 +6469,7 @@
             <w:noProof/>
             <w:webHidden/>
           </w:rPr>
-          <w:instrText xml:space="preserve"> PAGEREF _Toc243834653 \h </w:instrText>
+          <w:instrText xml:space="preserve"> PAGEREF _Toc243835846 \h </w:instrText>
         </w:r>
         <w:r>
           <w:rPr>
@@ -6516,7 +6516,7 @@
           <w14:ligatures w14:val="standardContextual"/>
         </w:rPr>
       </w:pPr>
-      <w:hyperlink w:anchor="_Toc243834654" w:history="1">
+      <w:hyperlink w:anchor="_Toc243835847" w:history="1">
         <w:r>
           <w:rPr>
             <w:rStyle w:val="Hipervnculo"/>
@@ -6543,7 +6543,7 @@
             <w:noProof/>
             <w:webHidden/>
           </w:rPr>
-          <w:instrText xml:space="preserve"> PAGEREF _Toc243834654 \h </w:instrText>
+          <w:instrText xml:space="preserve"> PAGEREF _Toc243835847 \h </w:instrText>
         </w:r>
         <w:r>
           <w:rPr>
@@ -6590,7 +6590,7 @@
           <w14:ligatures w14:val="standardContextual"/>
         </w:rPr>
       </w:pPr>
-      <w:hyperlink w:anchor="_Toc243834655" w:history="1">
+      <w:hyperlink w:anchor="_Toc243835848" w:history="1">
         <w:r>
           <w:rPr>
             <w:rStyle w:val="Hipervnculo"/>
@@ -6617,7 +6617,7 @@
             <w:noProof/>
             <w:webHidden/>
           </w:rPr>
-          <w:instrText xml:space="preserve"> PAGEREF _Toc243834655 \h </w:instrText>
+          <w:instrText xml:space="preserve"> PAGEREF _Toc243835848 \h </w:instrText>
         </w:r>
         <w:r>
           <w:rPr>
@@ -6664,7 +6664,7 @@
           <w14:ligatures w14:val="standardContextual"/>
         </w:rPr>
       </w:pPr>
-      <w:hyperlink w:anchor="_Toc243834656" w:history="1">
+      <w:hyperlink w:anchor="_Toc243835849" w:history="1">
         <w:r>
           <w:rPr>
             <w:rStyle w:val="Hipervnculo"/>
@@ -6691,7 +6691,7 @@
             <w:noProof/>
             <w:webHidden/>
           </w:rPr>
-          <w:instrText xml:space="preserve"> PAGEREF _Toc243834656 \h </w:instrText>
+          <w:instrText xml:space="preserve"> PAGEREF _Toc243835849 \h </w:instrText>
         </w:r>
         <w:r>
           <w:rPr>
@@ -6738,7 +6738,7 @@
           <w14:ligatures w14:val="standardContextual"/>
         </w:rPr>
       </w:pPr>
-      <w:hyperlink w:anchor="_Toc243834657" w:history="1">
+      <w:hyperlink w:anchor="_Toc243835850" w:history="1">
         <w:r>
           <w:rPr>
             <w:rStyle w:val="Hipervnculo"/>
@@ -6765,7 +6765,7 @@
             <w:noProof/>
             <w:webHidden/>
           </w:rPr>
-          <w:instrText xml:space="preserve"> PAGEREF _Toc243834657 \h </w:instrText>
+          <w:instrText xml:space="preserve"> PAGEREF _Toc243835850 \h </w:instrText>
         </w:r>
         <w:r>
           <w:rPr>
@@ -6812,7 +6812,7 @@
           <w14:ligatures w14:val="standardContextual"/>
         </w:rPr>
       </w:pPr>
-      <w:hyperlink w:anchor="_Toc243834658" w:history="1">
+      <w:hyperlink w:anchor="_Toc243835851" w:history="1">
         <w:r>
           <w:rPr>
             <w:rStyle w:val="Hipervnculo"/>
@@ -6839,7 +6839,7 @@
             <w:noProof/>
             <w:webHidden/>
           </w:rPr>
-          <w:instrText xml:space="preserve"> PAGEREF _Toc243834658 \h </w:instrText>
+          <w:instrText xml:space="preserve"> PAGEREF _Toc243835851 \h </w:instrText>
         </w:r>
         <w:r>
           <w:rPr>
@@ -6886,7 +6886,7 @@
           <w14:ligatures w14:val="standardContextual"/>
         </w:rPr>
       </w:pPr>
-      <w:hyperlink w:anchor="_Toc243834659" w:history="1">
+      <w:hyperlink w:anchor="_Toc243835852" w:history="1">
         <w:r>
           <w:rPr>
             <w:rStyle w:val="Hipervnculo"/>
@@ -6913,7 +6913,7 @@
             <w:noProof/>
             <w:webHidden/>
           </w:rPr>
-          <w:instrText xml:space="preserve"> PAGEREF _Toc243834659 \h </w:instrText>
+          <w:instrText xml:space="preserve"> PAGEREF _Toc243835852 \h </w:instrText>
         </w:r>
         <w:r>
           <w:rPr>
@@ -6960,7 +6960,7 @@
           <w14:ligatures w14:val="standardContextual"/>
         </w:rPr>
       </w:pPr>
-      <w:hyperlink w:anchor="_Toc243834660" w:history="1">
+      <w:hyperlink w:anchor="_Toc243835853" w:history="1">
         <w:r>
           <w:rPr>
             <w:rStyle w:val="Hipervnculo"/>
@@ -6987,7 +6987,7 @@
             <w:noProof/>
             <w:webHidden/>
           </w:rPr>
-          <w:instrText xml:space="preserve"> PAGEREF _Toc243834660 \h </w:instrText>
+          <w:instrText xml:space="preserve"> PAGEREF _Toc243835853 \h </w:instrText>
         </w:r>
         <w:r>
           <w:rPr>
@@ -7034,7 +7034,7 @@
           <w14:ligatures w14:val="standardContextual"/>
         </w:rPr>
       </w:pPr>
-      <w:hyperlink w:anchor="_Toc243834661" w:history="1">
+      <w:hyperlink w:anchor="_Toc243835854" w:history="1">
         <w:r>
           <w:rPr>
             <w:rStyle w:val="Hipervnculo"/>
@@ -7061,7 +7061,7 @@
             <w:noProof/>
             <w:webHidden/>
           </w:rPr>
-          <w:instrText xml:space="preserve"> PAGEREF _Toc243834661 \h </w:instrText>
+          <w:instrText xml:space="preserve"> PAGEREF _Toc243835854 \h </w:instrText>
         </w:r>
         <w:r>
           <w:rPr>
@@ -7081,7 +7081,7 @@
             <w:noProof/>
             <w:webHidden/>
           </w:rPr>
-          <w:t>80</w:t>
+          <w:t>81</w:t>
         </w:r>
         <w:r>
           <w:rPr>
@@ -7108,7 +7108,7 @@
           <w14:ligatures w14:val="standardContextual"/>
         </w:rPr>
       </w:pPr>
-      <w:hyperlink w:anchor="_Toc243834662" w:history="1">
+      <w:hyperlink w:anchor="_Toc243835855" w:history="1">
         <w:r>
           <w:rPr>
             <w:rStyle w:val="Hipervnculo"/>
@@ -7135,7 +7135,7 @@
             <w:noProof/>
             <w:webHidden/>
           </w:rPr>
-          <w:instrText xml:space="preserve"> PAGEREF _Toc243834662 \h </w:instrText>
+          <w:instrText xml:space="preserve"> PAGEREF _Toc243835855 \h </w:instrText>
         </w:r>
         <w:r>
           <w:rPr>
@@ -7182,7 +7182,7 @@
           <w14:ligatures w14:val="standardContextual"/>
         </w:rPr>
       </w:pPr>
-      <w:hyperlink w:anchor="_Toc243834663" w:history="1">
+      <w:hyperlink w:anchor="_Toc243835856" w:history="1">
         <w:r>
           <w:rPr>
             <w:rStyle w:val="Hipervnculo"/>
@@ -7209,7 +7209,7 @@
             <w:noProof/>
             <w:webHidden/>
           </w:rPr>
-          <w:instrText xml:space="preserve"> PAGEREF _Toc243834663 \h </w:instrText>
+          <w:instrText xml:space="preserve"> PAGEREF _Toc243835856 \h </w:instrText>
         </w:r>
         <w:r>
           <w:rPr>
@@ -7256,7 +7256,7 @@
           <w14:ligatures w14:val="standardContextual"/>
         </w:rPr>
       </w:pPr>
-      <w:hyperlink w:anchor="_Toc243834664" w:history="1">
+      <w:hyperlink w:anchor="_Toc243835857" w:history="1">
         <w:r>
           <w:rPr>
             <w:rStyle w:val="Hipervnculo"/>
@@ -7283,7 +7283,7 @@
             <w:noProof/>
             <w:webHidden/>
           </w:rPr>
-          <w:instrText xml:space="preserve"> PAGEREF _Toc243834664 \h </w:instrText>
+          <w:instrText xml:space="preserve"> PAGEREF _Toc243835857 \h </w:instrText>
         </w:r>
         <w:r>
           <w:rPr>
@@ -7330,7 +7330,7 @@
           <w14:ligatures w14:val="standardContextual"/>
         </w:rPr>
       </w:pPr>
-      <w:hyperlink w:anchor="_Toc243834665" w:history="1">
+      <w:hyperlink w:anchor="_Toc243835858" w:history="1">
         <w:r>
           <w:rPr>
             <w:rStyle w:val="Hipervnculo"/>
@@ -7357,7 +7357,7 @@
             <w:noProof/>
             <w:webHidden/>
           </w:rPr>
-          <w:instrText xml:space="preserve"> PAGEREF _Toc243834665 \h </w:instrText>
+          <w:instrText xml:space="preserve"> PAGEREF _Toc243835858 \h </w:instrText>
         </w:r>
         <w:r>
           <w:rPr>
@@ -7404,7 +7404,7 @@
           <w14:ligatures w14:val="standardContextual"/>
         </w:rPr>
       </w:pPr>
-      <w:hyperlink w:anchor="_Toc243834666" w:history="1">
+      <w:hyperlink w:anchor="_Toc243835859" w:history="1">
         <w:r>
           <w:rPr>
             <w:rStyle w:val="Hipervnculo"/>
@@ -7431,7 +7431,7 @@
             <w:noProof/>
             <w:webHidden/>
           </w:rPr>
-          <w:instrText xml:space="preserve"> PAGEREF _Toc243834666 \h </w:instrText>
+          <w:instrText xml:space="preserve"> PAGEREF _Toc243835859 \h </w:instrText>
         </w:r>
         <w:r>
           <w:rPr>
@@ -7478,7 +7478,7 @@
           <w14:ligatures w14:val="standardContextual"/>
         </w:rPr>
       </w:pPr>
-      <w:hyperlink w:anchor="_Toc243834667" w:history="1">
+      <w:hyperlink w:anchor="_Toc243835860" w:history="1">
         <w:r>
           <w:rPr>
             <w:rStyle w:val="Hipervnculo"/>
@@ -7505,7 +7505,7 @@
             <w:noProof/>
             <w:webHidden/>
           </w:rPr>
-          <w:instrText xml:space="preserve"> PAGEREF _Toc243834667 \h </w:instrText>
+          <w:instrText xml:space="preserve"> PAGEREF _Toc243835860 \h </w:instrText>
         </w:r>
         <w:r>
           <w:rPr>
@@ -8104,7 +8104,7 @@
       <w:r>
         <w:br w:type="page"/>
       </w:r>
-      <w:bookmarkStart w:id="1" w:name="_Toc243834571"/>
+      <w:bookmarkStart w:id="1" w:name="_Toc243835764"/>
       <w:r>
         <w:lastRenderedPageBreak/>
         <w:t>1. Introducción y objetivos</w:t>
@@ -8115,7 +8115,7 @@
       <w:pPr>
         <w:pStyle w:val="Ttulo2"/>
       </w:pPr>
-      <w:bookmarkStart w:id="2" w:name="_Toc243834572"/>
+      <w:bookmarkStart w:id="2" w:name="_Toc243835765"/>
       <w:r>
         <w:t>1.1. Contexto, motivación y justificación</w:t>
       </w:r>
@@ -8178,7 +8178,7 @@
       <w:pPr>
         <w:pStyle w:val="Ttulo2"/>
       </w:pPr>
-      <w:bookmarkStart w:id="3" w:name="_Toc243834573"/>
+      <w:bookmarkStart w:id="3" w:name="_Toc243835766"/>
       <w:r>
         <w:t>1.2. Objetivos generales y específicos</w:t>
       </w:r>
@@ -8240,7 +8240,7 @@
       <w:pPr>
         <w:pStyle w:val="Ttulo2"/>
       </w:pPr>
-      <w:bookmarkStart w:id="4" w:name="_Toc243834574"/>
+      <w:bookmarkStart w:id="4" w:name="_Toc243835767"/>
       <w:r>
         <w:t>1.3. Alcance, usuarios y limitaciones</w:t>
       </w:r>
@@ -8295,7 +8295,7 @@
         <w:pStyle w:val="Ttulo1"/>
         <w:pageBreakBefore/>
       </w:pPr>
-      <w:bookmarkStart w:id="5" w:name="_Toc243834575"/>
+      <w:bookmarkStart w:id="5" w:name="_Toc243835768"/>
       <w:r>
         <w:lastRenderedPageBreak/>
         <w:t>2. Marco teórico y estado del arte</w:t>
@@ -8306,7 +8306,7 @@
       <w:pPr>
         <w:pStyle w:val="Ttulo2"/>
       </w:pPr>
-      <w:bookmarkStart w:id="6" w:name="_Toc243834576"/>
+      <w:bookmarkStart w:id="6" w:name="_Toc243835769"/>
       <w:r>
         <w:t>2.1. Necesidades hídricas y gestión eficiente del riego</w:t>
       </w:r>
@@ -8374,9 +8374,9 @@
       <w:pPr>
         <w:pStyle w:val="Ttulo2"/>
       </w:pPr>
-      <w:bookmarkStart w:id="7" w:name="_Toc243834577"/>
-      <w:r>
-        <w:t>2.2. Agricultura de precisión y Machine Learning</w:t>
+      <w:bookmarkStart w:id="7" w:name="_Toc243835770"/>
+      <w:r>
+        <w:t>2.2. Agricultura de precisión y aprendizaje automático</w:t>
       </w:r>
       <w:bookmarkEnd w:id="7"/>
     </w:p>
@@ -8439,7 +8439,7 @@
       <w:pPr>
         <w:pStyle w:val="Ttulo2"/>
       </w:pPr>
-      <w:bookmarkStart w:id="8" w:name="_Toc243834578"/>
+      <w:bookmarkStart w:id="8" w:name="_Toc243835771"/>
       <w:r>
         <w:t>2.3. Sistemas inteligentes de apoyo a la decisión</w:t>
       </w:r>
@@ -8503,7 +8503,7 @@
         <w:pStyle w:val="Ttulo1"/>
         <w:pageBreakBefore/>
       </w:pPr>
-      <w:bookmarkStart w:id="9" w:name="_Toc243834579"/>
+      <w:bookmarkStart w:id="9" w:name="_Toc243835772"/>
       <w:r>
         <w:lastRenderedPageBreak/>
         <w:t>3. Metodología y arquitectura del sistema</w:t>
@@ -8514,7 +8514,7 @@
       <w:pPr>
         <w:pStyle w:val="Ttulo2"/>
       </w:pPr>
-      <w:bookmarkStart w:id="10" w:name="_Toc243834580"/>
+      <w:bookmarkStart w:id="10" w:name="_Toc243835773"/>
       <w:r>
         <w:t>3.1. Fuentes, variables y calidad de los datos</w:t>
       </w:r>
@@ -8527,14 +8527,14 @@
     </w:p>
     <w:p>
       <w:r>
-        <w:t>La visión del producto contempla que el usuario seleccione libremente ubicación, cultivo y periodo para determinar las fuentes necesarias. La demo implementa una selección limitada a las combinaciones SiAR ya descargadas, no una extracción nacional arbitraria. El caso original de evaluación del motor sigue siendo pimiento en AL01 La Mojonera durante 2025. El CSV lo denomina «Pimiento» sin especificar el sistema productivo. Para este piloto se asume cultivo al aire libre; el CSV no confirma ese sistema.</w:t>
+        <w:t>La visión del producto contempla que el usuario seleccione libremente ubicación, cultivo y periodo para determinar las fuentes necesarias. El prototipo implementa una selección limitada a las combinaciones SiAR ya descargadas, no una extracción nacional arbitraria. El caso original de evaluación del motor sigue siendo pimiento en AL01 La Mojonera durante 2025. El CSV lo denomina «Pimiento» sin especificar el sistema productivo. Para este piloto se asume cultivo al aire libre; el CSV no confirma ese sistema.</w:t>
       </w:r>
     </w:p>
     <w:p>
       <w:pPr>
         <w:pStyle w:val="Ttulo3"/>
       </w:pPr>
-      <w:bookmarkStart w:id="11" w:name="_Toc243834581"/>
+      <w:bookmarkStart w:id="11" w:name="_Toc243835774"/>
       <w:r>
         <w:rPr>
           <w:sz w:val="24"/>
@@ -9204,7 +9204,7 @@
       <w:pPr>
         <w:pStyle w:val="Ttulo3"/>
       </w:pPr>
-      <w:bookmarkStart w:id="12" w:name="_Toc243834582"/>
+      <w:bookmarkStart w:id="12" w:name="_Toc243835775"/>
       <w:r>
         <w:rPr>
           <w:sz w:val="24"/>
@@ -9945,7 +9945,7 @@
       <w:pPr>
         <w:pStyle w:val="Ttulo3"/>
       </w:pPr>
-      <w:bookmarkStart w:id="13" w:name="_Toc243834583"/>
+      <w:bookmarkStart w:id="13" w:name="_Toc243835776"/>
       <w:r>
         <w:rPr>
           <w:sz w:val="24"/>
@@ -10054,7 +10054,7 @@
       <w:pPr>
         <w:pStyle w:val="Ttulo3"/>
       </w:pPr>
-      <w:bookmarkStart w:id="14" w:name="_Toc243834584"/>
+      <w:bookmarkStart w:id="14" w:name="_Toc243835777"/>
       <w:r>
         <w:rPr>
           <w:sz w:val="24"/>
@@ -10078,7 +10078,7 @@
       <w:pPr>
         <w:pStyle w:val="Ttulo2"/>
       </w:pPr>
-      <w:bookmarkStart w:id="15" w:name="_Toc243834585"/>
+      <w:bookmarkStart w:id="15" w:name="_Toc243835778"/>
       <w:r>
         <w:t>3.2. Arquitectura, tecnologías y flujo de información</w:t>
       </w:r>
@@ -10151,7 +10151,7 @@
       <w:pPr>
         <w:pStyle w:val="Ttulo3"/>
       </w:pPr>
-      <w:bookmarkStart w:id="16" w:name="_Toc243834586"/>
+      <w:bookmarkStart w:id="16" w:name="_Toc243835779"/>
       <w:r>
         <w:rPr>
           <w:sz w:val="24"/>
@@ -10288,7 +10288,7 @@
       <w:pPr>
         <w:pStyle w:val="Ttulo3"/>
       </w:pPr>
-      <w:bookmarkStart w:id="17" w:name="_Toc243834587"/>
+      <w:bookmarkStart w:id="17" w:name="_Toc243835780"/>
       <w:r>
         <w:rPr>
           <w:sz w:val="24"/>
@@ -11289,14 +11289,14 @@
     </w:p>
     <w:p>
       <w:r>
-        <w:t>Esta clasificación actualiza el planteamiento del anteproyecto. MySQL, Apache Hop, Docker, PySpark y un cuadro de mando en Power BI o Tableau forman parte de la arquitectura objetivo, pero no se consideran evidencias terminadas. En el estado actual, el prototipo reproducible se apoya en módulos Python, almacenamiento local por capas y una aplicación en Streamlit para consultar el sistema de recomendación.</w:t>
+        <w:t>Esta clasificación actualiza el planteamiento del anteproyecto. MySQL, Apache Hop, Docker, PySpark y un cuadro de mando en Power BI o Tableau se evaluaron como opciones, pero no constituyen evidencias terminadas ni una arquitectura obligatoria. En el estado actual, el prototipo reproducible se apoya en módulos Python, almacenamiento local por capas y una aplicación Streamlit. La evolución propuesta en 6.3.4 prioriza una ingesta ligera y programada, almacenamiento de objetos y formatos analíticos antes de introducir procesamiento distribuido.</w:t>
       </w:r>
     </w:p>
     <w:p>
       <w:pPr>
         <w:pStyle w:val="Ttulo3"/>
       </w:pPr>
-      <w:bookmarkStart w:id="18" w:name="_Toc243834588"/>
+      <w:bookmarkStart w:id="18" w:name="_Toc243835781"/>
       <w:r>
         <w:rPr>
           <w:sz w:val="24"/>
@@ -11319,7 +11319,7 @@
       <w:pPr>
         <w:pStyle w:val="Ttulo3"/>
       </w:pPr>
-      <w:bookmarkStart w:id="19" w:name="_Toc243834589"/>
+      <w:bookmarkStart w:id="19" w:name="_Toc243835782"/>
       <w:r>
         <w:rPr>
           <w:sz w:val="24"/>
@@ -11343,7 +11343,7 @@
       <w:pPr>
         <w:pStyle w:val="Ttulo2"/>
       </w:pPr>
-      <w:bookmarkStart w:id="20" w:name="_Toc243834590"/>
+      <w:bookmarkStart w:id="20" w:name="_Toc243835783"/>
       <w:r>
         <w:t>3.3. Planificación y organización del proyecto</w:t>
       </w:r>
@@ -11914,7 +11914,7 @@
       </w:r>
       <w:r>
         <w:lastRenderedPageBreak/>
-        <w:t>conclusiones entre el 15 y el 17/10; revisión de coherencia y reproducción independiente el 22/10. Son fechas de integración comprobables, no una asignación individual de tareas. La publicación de una demo por enlace y una validación agronómica externa siguen pendientes.</w:t>
+        <w:t>conclusiones entre el 15 y el 17/10; revisión de coherencia y reproducción independiente el 22/10. Son fechas de integración comprobables, no una asignación individual de tareas. La publicación del prototipo mediante un enlace y una validación agronómica externa siguen pendientes.</w:t>
       </w:r>
     </w:p>
     <w:p>
@@ -11986,10 +11986,10 @@
         <w:pStyle w:val="Ttulo1"/>
         <w:pageBreakBefore/>
       </w:pPr>
-      <w:bookmarkStart w:id="21" w:name="_Toc243834591"/>
+      <w:bookmarkStart w:id="21" w:name="_Toc243835784"/>
       <w:r>
         <w:lastRenderedPageBreak/>
-        <w:t>4. Procesamiento de datos y Machine Learning</w:t>
+        <w:t>4. Procesamiento de datos y aprendizaje automático</w:t>
       </w:r>
       <w:bookmarkEnd w:id="21"/>
     </w:p>
@@ -11997,7 +11997,7 @@
       <w:pPr>
         <w:pStyle w:val="Ttulo2"/>
       </w:pPr>
-      <w:bookmarkStart w:id="22" w:name="_Toc243834592"/>
+      <w:bookmarkStart w:id="22" w:name="_Toc243835785"/>
       <w:r>
         <w:t>4.1. Extracción, transformación y almacenamiento de datos</w:t>
       </w:r>
@@ -12078,7 +12078,7 @@
       <w:pPr>
         <w:pStyle w:val="Ttulo3"/>
       </w:pPr>
-      <w:bookmarkStart w:id="23" w:name="_Toc243834593"/>
+      <w:bookmarkStart w:id="23" w:name="_Toc243835786"/>
       <w:r>
         <w:rPr>
           <w:sz w:val="24"/>
@@ -12665,7 +12665,7 @@
       <w:pPr>
         <w:pStyle w:val="Ttulo3"/>
       </w:pPr>
-      <w:bookmarkStart w:id="24" w:name="_Toc243834594"/>
+      <w:bookmarkStart w:id="24" w:name="_Toc243835787"/>
       <w:r>
         <w:rPr>
           <w:sz w:val="24"/>
@@ -13133,7 +13133,7 @@
       <w:pPr>
         <w:pStyle w:val="Ttulo3"/>
       </w:pPr>
-      <w:bookmarkStart w:id="25" w:name="_Toc243834595"/>
+      <w:bookmarkStart w:id="25" w:name="_Toc243835788"/>
       <w:r>
         <w:rPr>
           <w:sz w:val="24"/>
@@ -13917,7 +13917,7 @@
       <w:pPr>
         <w:pStyle w:val="Ttulo3"/>
       </w:pPr>
-      <w:bookmarkStart w:id="26" w:name="_Toc243834596"/>
+      <w:bookmarkStart w:id="26" w:name="_Toc243835789"/>
       <w:r>
         <w:rPr>
           <w:sz w:val="24"/>
@@ -13993,7 +13993,7 @@
       <w:pPr>
         <w:pStyle w:val="Ttulo3"/>
       </w:pPr>
-      <w:bookmarkStart w:id="27" w:name="_Toc243834597"/>
+      <w:bookmarkStart w:id="27" w:name="_Toc243835790"/>
       <w:r>
         <w:rPr>
           <w:sz w:val="24"/>
@@ -14142,7 +14142,7 @@
       <w:pPr>
         <w:pStyle w:val="Ttulo3"/>
       </w:pPr>
-      <w:bookmarkStart w:id="28" w:name="_Toc243834598"/>
+      <w:bookmarkStart w:id="28" w:name="_Toc243835791"/>
       <w:r>
         <w:rPr>
           <w:sz w:val="24"/>
@@ -16753,7 +16753,7 @@
       <w:pPr>
         <w:pStyle w:val="Ttulo3"/>
       </w:pPr>
-      <w:bookmarkStart w:id="29" w:name="_Toc243834599"/>
+      <w:bookmarkStart w:id="29" w:name="_Toc243835792"/>
       <w:r>
         <w:rPr>
           <w:sz w:val="24"/>
@@ -18742,7 +18742,7 @@
       <w:pPr>
         <w:pStyle w:val="Ttulo3"/>
       </w:pPr>
-      <w:bookmarkStart w:id="30" w:name="_Toc243834600"/>
+      <w:bookmarkStart w:id="30" w:name="_Toc243835793"/>
       <w:r>
         <w:rPr>
           <w:sz w:val="24"/>
@@ -19494,7 +19494,7 @@
       <w:pPr>
         <w:pStyle w:val="Ttulo3"/>
       </w:pPr>
-      <w:bookmarkStart w:id="31" w:name="_Toc243834601"/>
+      <w:bookmarkStart w:id="31" w:name="_Toc243835794"/>
       <w:r>
         <w:rPr>
           <w:sz w:val="24"/>
@@ -19510,18 +19510,18 @@
     </w:p>
     <w:p>
       <w:r>
-        <w:t xml:space="preserve">La futura base MySQL almacenará catálogos, recomendaciones y metadatos que deban consultarse transaccionalmente. Los históricos voluminosos y artefactos de modelo podrán </w:t>
+        <w:t xml:space="preserve">Una futura base relacional, como PostgreSQL o MySQL, almacenará usuarios, parcelas, recomendaciones y metadatos que deban consultarse transaccionalmente. Los históricos </w:t>
       </w:r>
       <w:r>
         <w:lastRenderedPageBreak/>
-        <w:t>permanecer en almacenamiento de objetos. Esta separación evita utilizar la base transaccional como repositorio de archivos y mantiene una arquitectura compatible con ejecución local y despliegue cloud.</w:t>
+        <w:t>agroclimáticos y los artefactos voluminosos podrán conservarse en almacenamiento de objetos, con una capa curada en Parquet. Esta separación evita utilizar la base transaccional como repositorio de archivos y mantiene una arquitectura compatible con ejecución local y despliegue en la nube.</w:t>
       </w:r>
     </w:p>
     <w:p>
       <w:pPr>
         <w:pStyle w:val="Ttulo3"/>
       </w:pPr>
-      <w:bookmarkStart w:id="32" w:name="_Toc243834602"/>
+      <w:bookmarkStart w:id="32" w:name="_Toc243835795"/>
       <w:r>
         <w:rPr>
           <w:sz w:val="24"/>
@@ -19575,7 +19575,7 @@
       <w:pPr>
         <w:pStyle w:val="Ttulo3"/>
       </w:pPr>
-      <w:bookmarkStart w:id="33" w:name="_Toc243834603"/>
+      <w:bookmarkStart w:id="33" w:name="_Toc243835796"/>
       <w:r>
         <w:rPr>
           <w:sz w:val="24"/>
@@ -19593,7 +19593,7 @@
       <w:pPr>
         <w:pStyle w:val="Ttulo2"/>
       </w:pPr>
-      <w:bookmarkStart w:id="34" w:name="_Toc243834604"/>
+      <w:bookmarkStart w:id="34" w:name="_Toc243835797"/>
       <w:r>
         <w:t>4.2. Análisis exploratorio y preparación de variables</w:t>
       </w:r>
@@ -19608,7 +19608,7 @@
       <w:pPr>
         <w:pStyle w:val="Ttulo3"/>
       </w:pPr>
-      <w:bookmarkStart w:id="35" w:name="_Toc243834605"/>
+      <w:bookmarkStart w:id="35" w:name="_Toc243835798"/>
       <w:r>
         <w:rPr>
           <w:sz w:val="24"/>
@@ -19619,11 +19619,11 @@
     </w:p>
     <w:p>
       <w:r>
-        <w:t xml:space="preserve">El piloto utiliza el cultivo de pimiento y la estación SiAR AL01 La Mojonera, en Almería, entre el 1 de mayo y el 30 de septiembre de 2025. La unidad de análisis es una combinación de fecha, estación y cultivo. Las tablas meteorológica y agronómica se unen por station_code y </w:t>
+        <w:t xml:space="preserve">El piloto utiliza el cultivo de pimiento y la estación SiAR AL01 La Mojonera, en Almería, entre el 1 de mayo y el 30 de septiembre de 2025. La unidad de análisis es una combinación de fecha, </w:t>
       </w:r>
       <w:r>
         <w:lastRenderedPageBreak/>
-        <w:t>observed_date; el cultivo se conserva como parte de la clave analítica. El resultado contiene 150 registros y 88 columnas entre variables de origen, controles de calidad, atributos derivados, retardos y ventanas temporales.</w:t>
+        <w:t>estación y cultivo. Las tablas meteorológica y agronómica se unen por station_code y observed_date; el cultivo se conserva como parte de la clave analítica. El resultado contiene 150 registros y 88 columnas entre variables de origen, controles de calidad, atributos derivados, retardos y ventanas temporales.</w:t>
       </w:r>
     </w:p>
     <w:p>
@@ -20141,7 +20141,7 @@
       <w:pPr>
         <w:pStyle w:val="Ttulo3"/>
       </w:pPr>
-      <w:bookmarkStart w:id="36" w:name="_Toc243834606"/>
+      <w:bookmarkStart w:id="36" w:name="_Toc243835799"/>
       <w:r>
         <w:rPr>
           <w:sz w:val="24"/>
@@ -21207,7 +21207,7 @@
       <w:pPr>
         <w:pStyle w:val="Ttulo3"/>
       </w:pPr>
-      <w:bookmarkStart w:id="37" w:name="_Toc243834607"/>
+      <w:bookmarkStart w:id="37" w:name="_Toc243835800"/>
       <w:r>
         <w:rPr>
           <w:sz w:val="24"/>
@@ -21294,7 +21294,7 @@
       <w:pPr>
         <w:pStyle w:val="Ttulo3"/>
       </w:pPr>
-      <w:bookmarkStart w:id="38" w:name="_Toc243834608"/>
+      <w:bookmarkStart w:id="38" w:name="_Toc243835801"/>
       <w:r>
         <w:rPr>
           <w:sz w:val="24"/>
@@ -21377,7 +21377,7 @@
       <w:pPr>
         <w:pStyle w:val="Ttulo3"/>
       </w:pPr>
-      <w:bookmarkStart w:id="39" w:name="_Toc243834609"/>
+      <w:bookmarkStart w:id="39" w:name="_Toc243835802"/>
       <w:r>
         <w:rPr>
           <w:sz w:val="24"/>
@@ -21915,7 +21915,7 @@
       <w:pPr>
         <w:pStyle w:val="Ttulo3"/>
       </w:pPr>
-      <w:bookmarkStart w:id="40" w:name="_Toc243834610"/>
+      <w:bookmarkStart w:id="40" w:name="_Toc243835803"/>
       <w:r>
         <w:rPr>
           <w:sz w:val="24"/>
@@ -21943,7 +21943,7 @@
       <w:pPr>
         <w:pStyle w:val="Ttulo3"/>
       </w:pPr>
-      <w:bookmarkStart w:id="41" w:name="_Toc243834611"/>
+      <w:bookmarkStart w:id="41" w:name="_Toc243835804"/>
       <w:r>
         <w:rPr>
           <w:sz w:val="24"/>
@@ -22059,7 +22059,7 @@
       <w:pPr>
         <w:pStyle w:val="Ttulo2"/>
       </w:pPr>
-      <w:bookmarkStart w:id="42" w:name="_Toc243834612"/>
+      <w:bookmarkStart w:id="42" w:name="_Toc243835805"/>
       <w:r>
         <w:lastRenderedPageBreak/>
         <w:t>4.3. Desarrollo y evaluación del modelo predictivo</w:t>
@@ -22075,7 +22075,7 @@
       <w:pPr>
         <w:pStyle w:val="Ttulo3"/>
       </w:pPr>
-      <w:bookmarkStart w:id="43" w:name="_Toc243834613"/>
+      <w:bookmarkStart w:id="43" w:name="_Toc243835806"/>
       <w:r>
         <w:rPr>
           <w:sz w:val="24"/>
@@ -22103,7 +22103,7 @@
       <w:pPr>
         <w:pStyle w:val="Ttulo3"/>
       </w:pPr>
-      <w:bookmarkStart w:id="44" w:name="_Toc243834614"/>
+      <w:bookmarkStart w:id="44" w:name="_Toc243835807"/>
       <w:r>
         <w:rPr>
           <w:sz w:val="24"/>
@@ -22129,7 +22129,7 @@
       <w:pPr>
         <w:pStyle w:val="Ttulo3"/>
       </w:pPr>
-      <w:bookmarkStart w:id="45" w:name="_Toc243834615"/>
+      <w:bookmarkStart w:id="45" w:name="_Toc243835808"/>
       <w:r>
         <w:rPr>
           <w:sz w:val="24"/>
@@ -22270,7 +22270,7 @@
       <w:pPr>
         <w:pStyle w:val="Ttulo3"/>
       </w:pPr>
-      <w:bookmarkStart w:id="46" w:name="_Toc243834616"/>
+      <w:bookmarkStart w:id="46" w:name="_Toc243835809"/>
       <w:r>
         <w:rPr>
           <w:sz w:val="24"/>
@@ -22288,7 +22288,7 @@
       <w:pPr>
         <w:pStyle w:val="Ttulo3"/>
       </w:pPr>
-      <w:bookmarkStart w:id="47" w:name="_Toc243834617"/>
+      <w:bookmarkStart w:id="47" w:name="_Toc243835810"/>
       <w:r>
         <w:rPr>
           <w:sz w:val="24"/>
@@ -23262,7 +23262,7 @@
       <w:pPr>
         <w:pStyle w:val="Ttulo3"/>
       </w:pPr>
-      <w:bookmarkStart w:id="48" w:name="_Toc243834618"/>
+      <w:bookmarkStart w:id="48" w:name="_Toc243835811"/>
       <w:r>
         <w:rPr>
           <w:sz w:val="24"/>
@@ -24396,7 +24396,7 @@
       <w:pPr>
         <w:pStyle w:val="Ttulo3"/>
       </w:pPr>
-      <w:bookmarkStart w:id="49" w:name="_Toc243834619"/>
+      <w:bookmarkStart w:id="49" w:name="_Toc243835812"/>
       <w:r>
         <w:rPr>
           <w:sz w:val="24"/>
@@ -24424,7 +24424,7 @@
       <w:pPr>
         <w:pStyle w:val="Ttulo3"/>
       </w:pPr>
-      <w:bookmarkStart w:id="50" w:name="_Toc243834620"/>
+      <w:bookmarkStart w:id="50" w:name="_Toc243835813"/>
       <w:r>
         <w:rPr>
           <w:sz w:val="24"/>
@@ -24448,7 +24448,7 @@
       <w:pPr>
         <w:pStyle w:val="Ttulo3"/>
       </w:pPr>
-      <w:bookmarkStart w:id="51" w:name="_Toc243834621"/>
+      <w:bookmarkStart w:id="51" w:name="_Toc243835814"/>
       <w:r>
         <w:rPr>
           <w:sz w:val="24"/>
@@ -24481,7 +24481,7 @@
       <w:pPr>
         <w:pStyle w:val="Ttulo3"/>
       </w:pPr>
-      <w:bookmarkStart w:id="52" w:name="_Toc243834622"/>
+      <w:bookmarkStart w:id="52" w:name="_Toc243835815"/>
       <w:r>
         <w:t>4.3.10. Reentrenamiento con datos de 2026</w:t>
       </w:r>
@@ -25397,7 +25397,7 @@
       <w:pPr>
         <w:pStyle w:val="Ttulo3"/>
       </w:pPr>
-      <w:bookmarkStart w:id="53" w:name="_Toc243834623"/>
+      <w:bookmarkStart w:id="53" w:name="_Toc243835816"/>
       <w:r>
         <w:lastRenderedPageBreak/>
         <w:t>4.3.11. Modelo de ETc para la aplicación</w:t>
@@ -26007,7 +26007,7 @@
         <w:pageBreakBefore/>
       </w:pPr>
       <w:bookmarkStart w:id="54" w:name="_Toc243495226"/>
-      <w:bookmarkStart w:id="55" w:name="_Toc243834624"/>
+      <w:bookmarkStart w:id="55" w:name="_Toc243835817"/>
       <w:r>
         <w:lastRenderedPageBreak/>
         <w:t>5. Sistema de recomendación y resultados</w:t>
@@ -26017,17 +26017,14 @@
     </w:p>
     <w:p>
       <w:r>
-        <w:t>Este capítulo separa dos entornos que aportan evidencias diferentes. El entorno de evaluación estricta utiliza el histórico SiAR de 2025, particiones temporales y métricas reproducibles; no incorpora previsiones AEMET archivadas. El entorno de demostración operativa corresponde a la aplicación Streamlit actual, que consulta datos recientes de SiAR y previsión AEMET para generar una recomendación. Por tanto, la demo acredita integración y funcionamiento, mientras que su efecto sobre el error, el ahorro de ag</w:t>
-      </w:r>
-      <w:r>
-        <w:t>ua o la adecuación a una parcela todavía no dispone de una evaluación retrospectiva equivalente.</w:t>
+        <w:t>Este capítulo separa dos entornos que aportan evidencias diferentes. El entorno de evaluación estricta utiliza el histórico SiAR de 2025, particiones temporales y métricas reproducibles; no incorpora previsiones AEMET archivadas. El entorno de demostración operativa corresponde a la aplicación Streamlit actual, que consulta datos recientes de SiAR y previsión AEMET para generar una recomendación. Por tanto, el demostrador acredita integración y funcionamiento, mientras que su efecto sobre el error, el ahorro de agua o la adecuación a una parcela todavía no dispone de una evaluación retrospectiva equivalente.</w:t>
       </w:r>
     </w:p>
     <w:p>
       <w:pPr>
         <w:pStyle w:val="Ttulo2"/>
       </w:pPr>
-      <w:bookmarkStart w:id="56" w:name="_Toc243834625"/>
+      <w:bookmarkStart w:id="56" w:name="_Toc243835818"/>
       <w:r>
         <w:t>5.1. Diseño del sistema de recomendación de riego</w:t>
       </w:r>
@@ -26047,7 +26044,7 @@
       <w:pPr>
         <w:pStyle w:val="Ttulo3"/>
       </w:pPr>
-      <w:bookmarkStart w:id="57" w:name="_Toc243834626"/>
+      <w:bookmarkStart w:id="57" w:name="_Toc243835819"/>
       <w:r>
         <w:rPr>
           <w:sz w:val="24"/>
@@ -26074,7 +26071,7 @@
       <w:pPr>
         <w:pStyle w:val="Ttulo3"/>
       </w:pPr>
-      <w:bookmarkStart w:id="58" w:name="_Toc243834627"/>
+      <w:bookmarkStart w:id="58" w:name="_Toc243835820"/>
       <w:r>
         <w:rPr>
           <w:sz w:val="24"/>
@@ -26157,7 +26154,7 @@
       <w:pPr>
         <w:pStyle w:val="Ttulo3"/>
       </w:pPr>
-      <w:bookmarkStart w:id="59" w:name="_Toc243834628"/>
+      <w:bookmarkStart w:id="59" w:name="_Toc243835821"/>
       <w:r>
         <w:rPr>
           <w:sz w:val="24"/>
@@ -26206,7 +26203,7 @@
       <w:pPr>
         <w:pStyle w:val="Ttulo3"/>
       </w:pPr>
-      <w:bookmarkStart w:id="60" w:name="_Toc243834629"/>
+      <w:bookmarkStart w:id="60" w:name="_Toc243835822"/>
       <w:r>
         <w:rPr>
           <w:sz w:val="24"/>
@@ -27088,7 +27085,7 @@
       <w:pPr>
         <w:pStyle w:val="Ttulo3"/>
       </w:pPr>
-      <w:bookmarkStart w:id="61" w:name="_Toc243834630"/>
+      <w:bookmarkStart w:id="61" w:name="_Toc243835823"/>
       <w:r>
         <w:rPr>
           <w:sz w:val="24"/>
@@ -27111,7 +27108,7 @@
       <w:pPr>
         <w:pStyle w:val="Ttulo3"/>
       </w:pPr>
-      <w:bookmarkStart w:id="62" w:name="_Toc243834631"/>
+      <w:bookmarkStart w:id="62" w:name="_Toc243835824"/>
       <w:r>
         <w:rPr>
           <w:sz w:val="24"/>
@@ -27130,7 +27127,7 @@
       <w:pPr>
         <w:pStyle w:val="Ttulo3"/>
       </w:pPr>
-      <w:bookmarkStart w:id="63" w:name="_Toc243834632"/>
+      <w:bookmarkStart w:id="63" w:name="_Toc243835825"/>
       <w:r>
         <w:t>5.1.7. Integración operativa de ETc y AEMET</w:t>
       </w:r>
@@ -27150,7 +27147,7 @@
       <w:pPr>
         <w:pStyle w:val="Ttulo2"/>
       </w:pPr>
-      <w:bookmarkStart w:id="64" w:name="_Toc243834633"/>
+      <w:bookmarkStart w:id="64" w:name="_Toc243835826"/>
       <w:r>
         <w:t>5.2. Aplicación y visualización de resultados</w:t>
       </w:r>
@@ -27165,7 +27162,7 @@
       <w:pPr>
         <w:pStyle w:val="Ttulo3"/>
       </w:pPr>
-      <w:bookmarkStart w:id="65" w:name="_Toc243834634"/>
+      <w:bookmarkStart w:id="65" w:name="_Toc243835827"/>
       <w:r>
         <w:rPr>
           <w:sz w:val="24"/>
@@ -27192,7 +27189,7 @@
       <w:pPr>
         <w:pStyle w:val="Ttulo3"/>
       </w:pPr>
-      <w:bookmarkStart w:id="66" w:name="_Toc243834635"/>
+      <w:bookmarkStart w:id="66" w:name="_Toc243835828"/>
       <w:r>
         <w:rPr>
           <w:sz w:val="24"/>
@@ -27220,7 +27217,7 @@
       <w:pPr>
         <w:pStyle w:val="Ttulo3"/>
       </w:pPr>
-      <w:bookmarkStart w:id="67" w:name="_Toc243834636"/>
+      <w:bookmarkStart w:id="67" w:name="_Toc243835829"/>
       <w:r>
         <w:rPr>
           <w:sz w:val="24"/>
@@ -29163,7 +29160,7 @@
       <w:pPr>
         <w:pStyle w:val="Ttulo3"/>
       </w:pPr>
-      <w:bookmarkStart w:id="68" w:name="_Toc243834637"/>
+      <w:bookmarkStart w:id="68" w:name="_Toc243835830"/>
       <w:r>
         <w:rPr>
           <w:sz w:val="24"/>
@@ -29197,7 +29194,7 @@
       <w:pPr>
         <w:pStyle w:val="Ttulo3"/>
       </w:pPr>
-      <w:bookmarkStart w:id="69" w:name="_Toc243834638"/>
+      <w:bookmarkStart w:id="69" w:name="_Toc243835831"/>
       <w:r>
         <w:rPr>
           <w:sz w:val="24"/>
@@ -29215,7 +29212,7 @@
       <w:pPr>
         <w:pStyle w:val="Ttulo3"/>
       </w:pPr>
-      <w:bookmarkStart w:id="70" w:name="_Toc243834639"/>
+      <w:bookmarkStart w:id="70" w:name="_Toc243835832"/>
       <w:r>
         <w:rPr>
           <w:sz w:val="24"/>
@@ -29226,14 +29223,14 @@
     </w:p>
     <w:p>
       <w:r>
-        <w:t>La aplicación es una demostración pública sin cuentas de usuario ni histórico de riego por parcela. Lee CSV verificados y puede actualizar en memoria el caso vigente desde SiAR. Para hoy suma solo las horas futuras de lluvia AEMET que tienen cantidad numérica utilizable; para mañana exige cobertura horaria completa. Una emisión antigua o sin milímetros útiles deja la dosis base sin descuento. La dosis de hoy representa el día completo: la app desconoce el riego y la lluvia ya ocurridos, por lo que el usuario debe ajustarla antes de aplicarla. No calcula ET0 futura a partir de la temperatura ni dispone de emisiones pasadas para evaluar AEMET. Los días posteriores al primero son orientativos y deben recalcularse. Tampoco se ha probado la interfaz con agricultores o técnicos (Rose et al., 2016).</w:t>
+        <w:t>La aplicación es una demostración pública sin cuentas de usuario ni histórico de riego por parcela. Lee CSV verificados y puede actualizar en memoria el caso vigente desde SiAR. Para hoy suma solo las horas futuras de lluvia AEMET que tienen cantidad numérica utilizable; para mañana exige cobertura horaria completa. Una emisión antigua o sin milímetros útiles deja la dosis base sin descuento. La dosis de hoy representa el día completo: la aplicación desconoce el riego y la lluvia ya ocurridos, por lo que el usuario debe ajustarla antes de aplicarla. No calcula ET0 futura a partir de la temperatura ni dispone de emisiones pasadas para evaluar AEMET. Los días posteriores al primero son orientativos y deben recalcularse. Tampoco se ha probado la interfaz con agricultores o técnicos (Rose et al., 2016).</w:t>
       </w:r>
     </w:p>
     <w:p>
       <w:pPr>
         <w:pStyle w:val="Ttulo2"/>
       </w:pPr>
-      <w:bookmarkStart w:id="71" w:name="_Toc243834640"/>
+      <w:bookmarkStart w:id="71" w:name="_Toc243835833"/>
       <w:r>
         <w:t>5.3. Validación, resultados y análisis crítico</w:t>
       </w:r>
@@ -29257,7 +29254,7 @@
       <w:pPr>
         <w:pStyle w:val="Ttulo3"/>
       </w:pPr>
-      <w:bookmarkStart w:id="72" w:name="_Toc243834641"/>
+      <w:bookmarkStart w:id="72" w:name="_Toc243835834"/>
       <w:r>
         <w:rPr>
           <w:sz w:val="24"/>
@@ -29280,7 +29277,7 @@
       <w:pPr>
         <w:pStyle w:val="Ttulo3"/>
       </w:pPr>
-      <w:bookmarkStart w:id="73" w:name="_Toc243834642"/>
+      <w:bookmarkStart w:id="73" w:name="_Toc243835835"/>
       <w:r>
         <w:rPr>
           <w:sz w:val="24"/>
@@ -29786,7 +29783,7 @@
       <w:pPr>
         <w:pStyle w:val="Ttulo3"/>
       </w:pPr>
-      <w:bookmarkStart w:id="74" w:name="_Toc243834643"/>
+      <w:bookmarkStart w:id="74" w:name="_Toc243835836"/>
       <w:r>
         <w:rPr>
           <w:sz w:val="24"/>
@@ -30659,7 +30656,7 @@
       <w:pPr>
         <w:pStyle w:val="Ttulo3"/>
       </w:pPr>
-      <w:bookmarkStart w:id="75" w:name="_Toc243834644"/>
+      <w:bookmarkStart w:id="75" w:name="_Toc243835837"/>
       <w:r>
         <w:rPr>
           <w:sz w:val="24"/>
@@ -31759,7 +31756,7 @@
       <w:pPr>
         <w:pStyle w:val="Ttulo3"/>
       </w:pPr>
-      <w:bookmarkStart w:id="76" w:name="_Toc243834645"/>
+      <w:bookmarkStart w:id="76" w:name="_Toc243835838"/>
       <w:r>
         <w:rPr>
           <w:sz w:val="24"/>
@@ -31851,7 +31848,7 @@
       <w:pPr>
         <w:pStyle w:val="Ttulo3"/>
       </w:pPr>
-      <w:bookmarkStart w:id="77" w:name="_Toc243834646"/>
+      <w:bookmarkStart w:id="77" w:name="_Toc243835839"/>
       <w:r>
         <w:rPr>
           <w:sz w:val="24"/>
@@ -32306,7 +32303,7 @@
       <w:pPr>
         <w:pStyle w:val="Ttulo3"/>
       </w:pPr>
-      <w:bookmarkStart w:id="78" w:name="_Toc243834647"/>
+      <w:bookmarkStart w:id="78" w:name="_Toc243835840"/>
       <w:r>
         <w:rPr>
           <w:sz w:val="24"/>
@@ -33396,7 +33393,7 @@
       <w:pPr>
         <w:pStyle w:val="Ttulo3"/>
       </w:pPr>
-      <w:bookmarkStart w:id="79" w:name="_Toc243834648"/>
+      <w:bookmarkStart w:id="79" w:name="_Toc243835841"/>
       <w:r>
         <w:rPr>
           <w:sz w:val="24"/>
@@ -33414,7 +33411,7 @@
       <w:pPr>
         <w:pStyle w:val="Ttulo3"/>
       </w:pPr>
-      <w:bookmarkStart w:id="80" w:name="_Toc243834649"/>
+      <w:bookmarkStart w:id="80" w:name="_Toc243835842"/>
       <w:r>
         <w:rPr>
           <w:sz w:val="24"/>
@@ -33451,7 +33448,7 @@
       <w:pPr>
         <w:pStyle w:val="Ttulo3"/>
       </w:pPr>
-      <w:bookmarkStart w:id="81" w:name="_Toc243834650"/>
+      <w:bookmarkStart w:id="81" w:name="_Toc243835843"/>
       <w:r>
         <w:rPr>
           <w:sz w:val="24"/>
@@ -33505,7 +33502,7 @@
         <w:pStyle w:val="Ttulo1"/>
         <w:pageBreakBefore/>
       </w:pPr>
-      <w:bookmarkStart w:id="82" w:name="_Toc243834651"/>
+      <w:bookmarkStart w:id="82" w:name="_Toc243835844"/>
       <w:r>
         <w:lastRenderedPageBreak/>
         <w:t>6. Conclusiones</w:t>
@@ -33516,7 +33513,7 @@
       <w:pPr>
         <w:pStyle w:val="Ttulo2"/>
       </w:pPr>
-      <w:bookmarkStart w:id="83" w:name="_Toc243834652"/>
+      <w:bookmarkStart w:id="83" w:name="_Toc243835845"/>
       <w:r>
         <w:t>6.1. Cumplimiento de objetivos y aportaciones</w:t>
       </w:r>
@@ -33526,7 +33523,7 @@
       <w:pPr>
         <w:pStyle w:val="Ttulo3"/>
       </w:pPr>
-      <w:bookmarkStart w:id="84" w:name="_Toc243834653"/>
+      <w:bookmarkStart w:id="84" w:name="_Toc243835846"/>
       <w:r>
         <w:rPr>
           <w:sz w:val="24"/>
@@ -34306,7 +34303,7 @@
       <w:pPr>
         <w:pStyle w:val="Ttulo3"/>
       </w:pPr>
-      <w:bookmarkStart w:id="85" w:name="_Toc243834654"/>
+      <w:bookmarkStart w:id="85" w:name="_Toc243835847"/>
       <w:r>
         <w:rPr>
           <w:sz w:val="24"/>
@@ -34336,14 +34333,14 @@
     </w:p>
     <w:p>
       <w:r>
-        <w:t>La cuarta aportación es la reproducibilidad. El repositorio conserva los CSV SiAR acotados, los protocolos de modelado y las métricas por caso, el motor y la demo pública. Los modelos de necesidad neta del experimento quedan como artefactos locales reproducibles; los seis artefactos pequeños de ETc sí se versionan para su uso en Streamlit. Los módulos de entrenamiento y la suite de pruebas verifican calidad, orden temporal y ausencia de variables del día objetivo.</w:t>
+        <w:t>La cuarta aportación es la reproducibilidad. El repositorio conserva los CSV SiAR acotados, los protocolos de modelado y las métricas por caso, el motor y la aplicación pública. Los modelos de necesidad neta del experimento quedan como artefactos locales reproducibles; los seis artefactos pequeños de ETc sí se versionan para su uso en Streamlit. Los módulos de entrenamiento y la suite de pruebas verifican calidad, orden temporal y ausencia de variables del día objetivo.</w:t>
       </w:r>
     </w:p>
     <w:p>
       <w:pPr>
         <w:pStyle w:val="Ttulo2"/>
       </w:pPr>
-      <w:bookmarkStart w:id="86" w:name="_Toc243834655"/>
+      <w:bookmarkStart w:id="86" w:name="_Toc243835848"/>
       <w:r>
         <w:t>6.2. Limitaciones e impacto del proyecto</w:t>
       </w:r>
@@ -34353,7 +34350,7 @@
       <w:pPr>
         <w:pStyle w:val="Ttulo3"/>
       </w:pPr>
-      <w:bookmarkStart w:id="87" w:name="_Toc243834656"/>
+      <w:bookmarkStart w:id="87" w:name="_Toc243835849"/>
       <w:r>
         <w:rPr>
           <w:sz w:val="24"/>
@@ -34964,7 +34961,7 @@
       <w:pPr>
         <w:pStyle w:val="Ttulo3"/>
       </w:pPr>
-      <w:bookmarkStart w:id="88" w:name="_Toc243834657"/>
+      <w:bookmarkStart w:id="88" w:name="_Toc243835850"/>
       <w:r>
         <w:rPr>
           <w:sz w:val="24"/>
@@ -35003,7 +35000,7 @@
       <w:pPr>
         <w:pStyle w:val="Ttulo2"/>
       </w:pPr>
-      <w:bookmarkStart w:id="89" w:name="_Toc243834658"/>
+      <w:bookmarkStart w:id="89" w:name="_Toc243835851"/>
       <w:r>
         <w:t>6.3. Mejoras y líneas futuras</w:t>
       </w:r>
@@ -35018,7 +35015,7 @@
       <w:pPr>
         <w:pStyle w:val="Ttulo3"/>
       </w:pPr>
-      <w:bookmarkStart w:id="90" w:name="_Toc243834659"/>
+      <w:bookmarkStart w:id="90" w:name="_Toc243835852"/>
       <w:r>
         <w:rPr>
           <w:sz w:val="24"/>
@@ -35036,7 +35033,7 @@
       <w:pPr>
         <w:pStyle w:val="Ttulo3"/>
       </w:pPr>
-      <w:bookmarkStart w:id="91" w:name="_Toc243834660"/>
+      <w:bookmarkStart w:id="91" w:name="_Toc243835853"/>
       <w:r>
         <w:rPr>
           <w:sz w:val="24"/>
@@ -35048,12 +35045,12 @@
     </w:p>
     <w:p>
       <w:r>
-        <w:t>La prioridad principal para la siguiente iteración es incorporar un balance hídrico real de la parcela. Requiere combinar sensores de humedad del suelo, capacidad de retención, profundidad radicular, precipitación efectiva y registro del riego realmente aplicado. Con estas entradas el sistema podría estimar el agotamiento admisible propuesto en FAO-56, decidir no solo cuánto sino cuándo regar y aprovechar la lluvia realmente almacenada en el suelo (Allen et al., 1998). Los sensores IoT facilitarían una telemetría continua, pero no sustituyen la caracterización agronómica ni el registro de las actuaciones: recomendar una dosis no prueba que se haya ejecutado. Cualquier mejora de precisión deberá comprobarse mediante observaciones y ensayos de campo. Con esa información, la reducción proporcional por dotación podría sustituirse por una estrategia de riego deficitario que concentre el déficit en las fases menos sensibles del cultivo (Fereres &amp; Soriano, 2007).</w:t>
-      </w:r>
-    </w:p>
-    <w:p>
-      <w:r>
-        <w:t>La segunda prioridad es anticipar los cambios meteorológicos mediante una ET0 futura validada, especialmente para los días 4 a 7. El motor admite esa entrada, pero la aplicación usa de momento ET0 observada reciente. AEMET aporta lluvia prevista al cálculo actual; no hay emisiones históricas archivadas que permitan evaluar su aportación frente a la lluvia finalmente efectiva. Ese archivo deberá registrar emisión, periodo de validez y observación posterior. Con él se podría evaluar una ET0 derivada de variables pronosticadas o el producto de necesidades previstas de SiAR (Sistema de Información Agroclimática para el Regadío, s. f.), sin confundir productos relacionados con una validación independiente. La sustitución de la vía actual exigiría mejorar el error por horizonte en bloques temporales nuevos.</w:t>
+        <w:t>La prioridad principal para la siguiente iteración es incorporar un balance hídrico real de la parcela. La instrumentación podría combinar sondas capacitivas FDR o TDR para contenido volumétrico y tensiómetros para potencial matricial, instalados a varias profundidades representativas de la zona radicular. Como configuración inicial se propone un registro frecuente y una agregación horaria; Sui (2017) documenta un caso con lectura cada minuto, promedio horario y sensores a tres profundidades. La frecuencia definitiva deberá ajustarse al suelo, cultivo y sistema de riego. La tubería de datos controlaría rango físico, valores ausentes, deriva, conectividad y calibración específica del suelo antes de alimentar el DSS. Junto con capacidad de retención, profundidad radicular, precipitación efectiva y riego realmente aplicado, estas entradas permitirían estimar el agotamiento admisible de FAO-56, decidir no solo cuánto sino cuándo regar y aprovechar la lluvia almacenada (Allen et al., 1998). La telemetría no sustituye la caracterización agronómica ni prueba que una dosis recomendada se haya ejecutado. Cualquier mejora deberá validarse en campo; después podría estudiarse un riego deficitario que concentre el déficit en fases menos sensibles (Fereres &amp; Soriano, 2007).</w:t>
+      </w:r>
+    </w:p>
+    <w:p>
+      <w:r>
+        <w:t>La segunda prioridad es anticipar los cambios meteorológicos mediante una ET0 futura validada, especialmente para los días 4 a 7. El motor admite esa entrada, pero la aplicación usa de momento ET0 observada reciente. AEMET aporta lluvia prevista al cálculo actual; no hay emisiones históricas archivadas que permitan evaluar su aportación frente a la lluvia finalmente efectiva. Ese archivo deberá registrar emisión, periodo de validez y observación posterior. Con él se podría evaluar una ET0 derivada de variables pronosticadas o el producto de necesidades previstas de SiAR (Sistema de Información Agroclimática para el Regadío, s. f.), sin confundir productos relacionados con una validación independiente. La sustitución de la vía actual exigiría mejorar el error por horizonte en bloques temporales nuevos. El mismo archivo permitiría modelizar el error local de AEMET mediante dos tareas separadas: clasificación de la ocurrencia de lluvia y regresión de la cantidad observada frente a la prevista. Este posprocesado corregiría sesgos locales y cuantificaría la incertidumbre; no sustituiría la predicción oficial. El entrenamiento respetaría la hora de emisión y reservaría bloques temporales posteriores para prueba.</w:t>
       </w:r>
     </w:p>
     <w:p>
@@ -35065,34 +35062,31 @@
       <w:pPr>
         <w:pStyle w:val="Ttulo3"/>
       </w:pPr>
-      <w:bookmarkStart w:id="92" w:name="_Toc243834661"/>
+      <w:bookmarkStart w:id="92" w:name="_Toc243835854"/>
       <w:r>
         <w:rPr>
           <w:sz w:val="24"/>
         </w:rPr>
+        <w:lastRenderedPageBreak/>
         <w:t>6.3.3. Validación en condiciones de uso</w:t>
       </w:r>
       <w:bookmarkEnd w:id="92"/>
     </w:p>
     <w:p>
       <w:r>
-        <w:t>Antes de un uso agronómico continuado se debe evaluar la aplicación con técnicos y agricultores mediante tareas de interpretación y decisión, midiendo comprensión, utilidad percibida y confianza (Rose et al., 2016). La demo pública permite hacer esa evaluación, pero la publicación del enlace no constituye validación con usuarios.</w:t>
-      </w:r>
-    </w:p>
-    <w:p>
-      <w:r>
-        <w:t xml:space="preserve">La única forma de cuantificar el ahorro de agua o el efecto sobre la producción es un ensayo en campo que registre el riego aplicado, la humedad del suelo y el rendimiento en parcelas que sigan </w:t>
-      </w:r>
-      <w:r>
-        <w:lastRenderedPageBreak/>
-        <w:t>la recomendación y en parcelas de control. El sistema ya exporta cada recomendación con sus parámetros y su origen, de manera que el archivo de recomendaciones emitidas puede compararse directamente con el riego real. Solo entonces podrá sustituirse la referencia calculada por una referencia medida y evaluarse el sistema frente al problema que motivó el trabajo.</w:t>
+        <w:t>Antes de un uso agronómico continuado se debe evaluar la aplicación con técnicos y agricultores mediante tareas de interpretación y decisión, midiendo comprensión, utilidad percibida y confianza (Rose et al., 2016). La aplicación pública permite hacer esa evaluación, pero la publicación del enlace no constituye validación con usuarios.</w:t>
+      </w:r>
+    </w:p>
+    <w:p>
+      <w:r>
+        <w:t>La única forma de cuantificar el ahorro de agua o el efecto sobre la producción es un ensayo en campo que registre el riego aplicado, la humedad del suelo y el rendimiento en parcelas que sigan la recomendación y en parcelas de control. El sistema ya exporta cada recomendación con sus parámetros y su origen, de manera que el archivo de recomendaciones emitidas puede compararse directamente con el riego real. Solo entonces podrá sustituirse la referencia calculada por una referencia medida y evaluarse el sistema frente al problema que motivó el trabajo.</w:t>
       </w:r>
     </w:p>
     <w:p>
       <w:pPr>
         <w:pStyle w:val="Ttulo3"/>
       </w:pPr>
-      <w:bookmarkStart w:id="93" w:name="_Toc243834662"/>
+      <w:bookmarkStart w:id="93" w:name="_Toc243835855"/>
       <w:r>
         <w:rPr>
           <w:sz w:val="24"/>
@@ -35103,14 +35097,14 @@
     </w:p>
     <w:p>
       <w:r>
-        <w:t>La industrialización exigiría persistir catálogos, recomendaciones y metadatos en una base de datos, programar la ingesta y gestionar acceso y operación. Apache Hop y Docker son opciones previstas, todavía no implementadas. La aplicación ya deja elegir entre los casos SiAR declarados; una expansión nacional requeriría un catálogo dinámico, controles agronómicos por cultivo y cobertura de estaciones. Los indicadores del MITECO podrían aportar contexto de cuenca, sin deducir de ellos la dotación de una parcela. PySpark solo estaría justificado con un volumen muy superior al del piloto, como se indicó en 3.2.4.</w:t>
+        <w:t>La industrialización debería ser gradual y proporcional al volumen real. Una primera etapa programaría procesos ligeros en Python o funciones gestionadas que conservaran cada respuesta JSON, su hora de emisión y su procedencia en una capa raw inmutable de almacenamiento de objetos. Una segunda capa normalizaría y particionaría los datos en Parquet por fuente, estación y fecha, con catálogo, controles de calidad y trazabilidad. Una base relacional quedaría reservada para usuarios, parcelas y recomendaciones; el histórico analítico se consultaría con DuckDB o Polars mientras el volumen sea moderado. Si una ampliación nacional y multianual exigiera consultas concurrentes, podría incorporarse un motor SQL distribuido como Trino, capaz de consultar formatos de tabla y archivos Parquet sobre almacenamiento de objetos (Trino, s. f.). Esta evolución sigue los principios de un lakehouse sin presentar Apache Hop, Impala, Hue o PySpark como requisitos. El procesamiento distribuido solo se justificaría mediante mediciones de volumen, latencia y coste que demostrasen una limitación del enfoque ligero. La aplicación seguiría necesitando un catálogo agronómico dinámico, operación, control de acceso y persistencia de consultas.</w:t>
       </w:r>
     </w:p>
     <w:p>
       <w:pPr>
         <w:pStyle w:val="Ttulo3"/>
       </w:pPr>
-      <w:bookmarkStart w:id="94" w:name="_Toc243834663"/>
+      <w:bookmarkStart w:id="94" w:name="_Toc243835856"/>
       <w:r>
         <w:rPr>
           <w:sz w:val="24"/>
@@ -35129,7 +35123,7 @@
         <w:pStyle w:val="Ttulo1"/>
         <w:pageBreakBefore/>
       </w:pPr>
-      <w:bookmarkStart w:id="95" w:name="_Toc243834664"/>
+      <w:bookmarkStart w:id="95" w:name="_Toc243835857"/>
       <w:r>
         <w:lastRenderedPageBreak/>
         <w:t>Referencias bibliográficas</w:t>
@@ -35845,6 +35839,58 @@
         <w:pStyle w:val="BibliografaAPA"/>
       </w:pPr>
       <w:r>
+        <w:t xml:space="preserve">Sui, R. (2017). Soil moisture sensing. </w:t>
+      </w:r>
+      <w:r>
+        <w:rPr>
+          <w:i/>
+        </w:rPr>
+        <w:t>Irrigation Today, 1</w:t>
+      </w:r>
+      <w:r>
+        <w:t xml:space="preserve">(3), 16–17. </w:t>
+      </w:r>
+      <w:hyperlink r:id="rId52">
+        <w:r>
+          <w:rPr>
+            <w:color w:val="0563C1"/>
+            <w:u w:val="single"/>
+          </w:rPr>
+          <w:t>https://www.ars.usda.gov/research/publications/publication/?seqNo115=336401</w:t>
+        </w:r>
+      </w:hyperlink>
+    </w:p>
+    <w:p>
+      <w:pPr>
+        <w:pStyle w:val="BibliografaAPA"/>
+      </w:pPr>
+      <w:r>
+        <w:t xml:space="preserve">Trino. (s. f.). </w:t>
+      </w:r>
+      <w:r>
+        <w:rPr>
+          <w:i/>
+        </w:rPr>
+        <w:t>Object storage</w:t>
+      </w:r>
+      <w:r>
+        <w:t xml:space="preserve">. Recuperado el 25 de octubre de 2026, de </w:t>
+      </w:r>
+      <w:hyperlink r:id="rId53">
+        <w:r>
+          <w:rPr>
+            <w:color w:val="0563C1"/>
+            <w:u w:val="single"/>
+          </w:rPr>
+          <w:t>https://trino.io/docs/current/object-storage.html</w:t>
+        </w:r>
+      </w:hyperlink>
+    </w:p>
+    <w:p>
+      <w:pPr>
+        <w:pStyle w:val="BibliografaAPA"/>
+      </w:pPr>
+      <w:r>
         <w:t xml:space="preserve">Willmott, C. J., &amp; Matsuura, K. (2005). Advantages of the mean absolute error (MAE) over the root mean square error (RMSE) in assessing average model performance. </w:t>
       </w:r>
       <w:r>
@@ -35856,7 +35902,7 @@
       <w:r>
         <w:t xml:space="preserve">(1), 79–82. </w:t>
       </w:r>
-      <w:hyperlink r:id="rId52">
+      <w:hyperlink r:id="rId54">
         <w:r>
           <w:rPr>
             <w:color w:val="0563C1"/>
@@ -35882,7 +35928,7 @@
       <w:r>
         <w:t xml:space="preserve">, 69–80. </w:t>
       </w:r>
-      <w:hyperlink r:id="rId53">
+      <w:hyperlink r:id="rId55">
         <w:r>
           <w:rPr>
             <w:color w:val="0563C1"/>
@@ -35908,7 +35954,7 @@
       <w:r>
         <w:t xml:space="preserve">, 105256. </w:t>
       </w:r>
-      <w:hyperlink r:id="rId54">
+      <w:hyperlink r:id="rId56">
         <w:r>
           <w:rPr>
             <w:color w:val="0563C1"/>
@@ -35934,7 +35980,7 @@
       <w:r>
         <w:t xml:space="preserve">(2–3), 113–132. </w:t>
       </w:r>
-      <w:hyperlink r:id="rId55">
+      <w:hyperlink r:id="rId57">
         <w:r>
           <w:rPr>
             <w:color w:val="0563C1"/>
@@ -35953,7 +35999,7 @@
       <w:pPr>
         <w:pStyle w:val="Ttulo1"/>
       </w:pPr>
-      <w:bookmarkStart w:id="96" w:name="_Toc243834665"/>
+      <w:bookmarkStart w:id="96" w:name="_Toc243835858"/>
       <w:r>
         <w:lastRenderedPageBreak/>
         <w:t>Anexo A. Reproducción y localización de las evidencias</w:t>
@@ -35964,7 +36010,7 @@
       <w:r>
         <w:t xml:space="preserve">El repositorio de entrega, con código, CSV de muestra y resultados, es </w:t>
       </w:r>
-      <w:hyperlink r:id="rId56">
+      <w:hyperlink r:id="rId58">
         <w:r>
           <w:rPr>
             <w:color w:val="0563C1"/>
@@ -35976,7 +36022,7 @@
       <w:r>
         <w:t xml:space="preserve"> Procede del trabajo del equipo en </w:t>
       </w:r>
-      <w:hyperlink r:id="rId57">
+      <w:hyperlink r:id="rId59">
         <w:r>
           <w:rPr>
             <w:color w:val="0563C1"/>
@@ -35986,9 +36032,9 @@
         </w:r>
       </w:hyperlink>
       <w:r>
-        <w:t xml:space="preserve"> las rutas siguientes corresponden al repositorio de entrega en su rama main. Los ensayos con CSV versionados y las pruebas no requieren credenciales. La demo pública está en </w:t>
-      </w:r>
-      <w:hyperlink r:id="rId58">
+        <w:t xml:space="preserve"> las rutas siguientes corresponden al repositorio de entrega en su rama main. Los ensayos con CSV versionados y las pruebas no requieren credenciales. La aplicación pública está en </w:t>
+      </w:r>
+      <w:hyperlink r:id="rId60">
         <w:r>
           <w:rPr>
             <w:color w:val="0563C1"/>
@@ -36005,7 +36051,7 @@
       <w:pPr>
         <w:pStyle w:val="Ttulo2"/>
       </w:pPr>
-      <w:bookmarkStart w:id="97" w:name="_Toc243834666"/>
+      <w:bookmarkStart w:id="97" w:name="_Toc243835859"/>
       <w:r>
         <w:t>A.1. Archivos principales</w:t>
       </w:r>
@@ -36333,7 +36379,7 @@
       <w:pPr>
         <w:pStyle w:val="Ttulo2"/>
       </w:pPr>
-      <w:bookmarkStart w:id="98" w:name="_Toc243834667"/>
+      <w:bookmarkStart w:id="98" w:name="_Toc243835860"/>
       <w:r>
         <w:t>A.2. Secuencia mínima de reproducción</w:t>
       </w:r>
@@ -36415,8 +36461,8 @@
       </w:r>
     </w:p>
     <w:sectPr>
-      <w:headerReference w:type="default" r:id="rId59"/>
-      <w:footerReference w:type="default" r:id="rId60"/>
+      <w:headerReference w:type="default" r:id="rId61"/>
+      <w:footerReference w:type="default" r:id="rId62"/>
       <w:pgSz w:w="11906" w:h="16838" w:code="9"/>
       <w:pgMar w:top="1134" w:right="1134" w:bottom="1134" w:left="1134" w:header="567" w:footer="567" w:gutter="0"/>
       <w:cols w:space="708"/>
@@ -39477,21 +39523,6 @@
 </file>
 
 <file path=customXml/item1.xml><?xml version="1.0" encoding="utf-8"?>
-<?mso-contentType ?>
-<FormTemplates xmlns="http://schemas.microsoft.com/sharepoint/v3/contenttype/forms">
-  <Display>DocumentLibraryForm</Display>
-  <Edit>DocumentLibraryForm</Edit>
-  <New>DocumentLibraryForm</New>
-</FormTemplates>
-</file>
-
-<file path=customXml/item2.xml><?xml version="1.0" encoding="utf-8"?>
-<p:properties xmlns:p="http://schemas.microsoft.com/office/2006/metadata/properties" xmlns:xsi="http://www.w3.org/2001/XMLSchema-instance" xmlns:pc="http://schemas.microsoft.com/office/infopath/2007/PartnerControls">
-  <documentManagement/>
-</p:properties>
-</file>
-
-<file path=customXml/item3.xml><?xml version="1.0" encoding="utf-8"?>
 <ct:contentTypeSchema xmlns:ct="http://schemas.microsoft.com/office/2006/metadata/contentType" xmlns:ma="http://schemas.microsoft.com/office/2006/metadata/properties/metaAttributes" ct:_="" ma:_="" ma:contentTypeName="Documento" ma:contentTypeID="0x01010019FAAD7208B57F46B26AFFED99BCE0D3" ma:contentTypeVersion="12" ma:contentTypeDescription="Crear nuevo documento." ma:contentTypeScope="" ma:versionID="1ef574cbf204855aeab3c40b347ffcdd">
   <xsd:schema xmlns:xsd="http://www.w3.org/2001/XMLSchema" xmlns:xs="http://www.w3.org/2001/XMLSchema" xmlns:p="http://schemas.microsoft.com/office/2006/metadata/properties" xmlns:ns2="9d7b9a5c-6b4f-4ca1-bb03-c38cacb734bc" xmlns:ns3="7d80c08f-e909-465c-8aa4-0e649fbe85d0" targetNamespace="http://schemas.microsoft.com/office/2006/metadata/properties" ma:root="true" ma:fieldsID="d90f8574e5bf50e8ad773515e43a9e2d" ns2:_="" ns3:_="">
     <xsd:import namespace="9d7b9a5c-6b4f-4ca1-bb03-c38cacb734bc"/>
@@ -39708,24 +39739,22 @@
 </ct:contentTypeSchema>
 </file>
 
-<file path=customXml/itemProps1.xml><?xml version="1.0" encoding="utf-8"?>
-<ds:datastoreItem xmlns:ds="http://schemas.openxmlformats.org/officeDocument/2006/customXml" ds:itemID="{E5FD6A2B-9479-4129-9D84-6C858DBE1A90}">
-  <ds:schemaRefs>
-    <ds:schemaRef ds:uri="http://schemas.microsoft.com/sharepoint/v3/contenttype/forms"/>
-  </ds:schemaRefs>
-</ds:datastoreItem>
+<file path=customXml/item2.xml><?xml version="1.0" encoding="utf-8"?>
+<?mso-contentType ?>
+<FormTemplates xmlns="http://schemas.microsoft.com/sharepoint/v3/contenttype/forms">
+  <Display>DocumentLibraryForm</Display>
+  <Edit>DocumentLibraryForm</Edit>
+  <New>DocumentLibraryForm</New>
+</FormTemplates>
 </file>
 
-<file path=customXml/itemProps2.xml><?xml version="1.0" encoding="utf-8"?>
-<ds:datastoreItem xmlns:ds="http://schemas.openxmlformats.org/officeDocument/2006/customXml" ds:itemID="{261B0A37-6C6C-45CF-A5C4-83D994BC3980}">
-  <ds:schemaRefs>
-    <ds:schemaRef ds:uri="http://schemas.microsoft.com/office/2006/metadata/properties"/>
-    <ds:schemaRef ds:uri="http://schemas.microsoft.com/office/infopath/2007/PartnerControls"/>
-  </ds:schemaRefs>
-</ds:datastoreItem>
+<file path=customXml/item3.xml><?xml version="1.0" encoding="utf-8"?>
+<p:properties xmlns:p="http://schemas.microsoft.com/office/2006/metadata/properties" xmlns:xsi="http://www.w3.org/2001/XMLSchema-instance" xmlns:pc="http://schemas.microsoft.com/office/infopath/2007/PartnerControls">
+  <documentManagement/>
+</p:properties>
 </file>
 
-<file path=customXml/itemProps3.xml><?xml version="1.0" encoding="utf-8"?>
+<file path=customXml/itemProps1.xml><?xml version="1.0" encoding="utf-8"?>
 <ds:datastoreItem xmlns:ds="http://schemas.openxmlformats.org/officeDocument/2006/customXml" ds:itemID="{01B4916B-2905-40FE-B973-786E02856A77}">
   <ds:schemaRefs>
     <ds:schemaRef ds:uri="http://schemas.microsoft.com/office/2006/metadata/contentType"/>
@@ -39742,4 +39771,21 @@
     <ds:schemaRef ds:uri="http://schemas.microsoft.com/internal/obd"/>
   </ds:schemaRefs>
 </ds:datastoreItem>
+</file>
+
+<file path=customXml/itemProps2.xml><?xml version="1.0" encoding="utf-8"?>
+<ds:datastoreItem xmlns:ds="http://schemas.openxmlformats.org/officeDocument/2006/customXml" ds:itemID="{E5FD6A2B-9479-4129-9D84-6C858DBE1A90}">
+  <ds:schemaRefs>
+    <ds:schemaRef ds:uri="http://schemas.microsoft.com/sharepoint/v3/contenttype/forms"/>
+  </ds:schemaRefs>
+</ds:datastoreItem>
+</file>
+
+<file path=customXml/itemProps3.xml><?xml version="1.0" encoding="utf-8"?>
+<ds:datastoreItem xmlns:ds="http://schemas.openxmlformats.org/officeDocument/2006/customXml" ds:itemID="{261B0A37-6C6C-45CF-A5C4-83D994BC3980}">
+  <ds:schemaRefs>
+    <ds:schemaRef ds:uri="http://schemas.microsoft.com/office/2006/metadata/properties"/>
+    <ds:schemaRef ds:uri="http://schemas.microsoft.com/office/infopath/2007/PartnerControls"/>
+  </ds:schemaRefs>
+</ds:datastoreItem>
 </file>
</xml_diff>

<commit_message>
Añadir explicabilidad XAI y estrategia FAIR MLOps
</commit_message>
<xml_diff>
--- a/docs/memoria/TFM_definitivo_2026-10-25.docx
+++ b/docs/memoria/TFM_definitivo_2026-10-25.docx
@@ -374,7 +374,7 @@
       <w:r>
         <w:fldChar w:fldCharType="separate"/>
       </w:r>
-      <w:hyperlink w:anchor="_Toc243835764" w:history="1">
+      <w:hyperlink w:anchor="_Toc243837938" w:history="1">
         <w:r>
           <w:rPr>
             <w:rStyle w:val="Hipervnculo"/>
@@ -401,7 +401,7 @@
             <w:noProof/>
             <w:webHidden/>
           </w:rPr>
-          <w:instrText xml:space="preserve"> PAGEREF _Toc243835764 \h </w:instrText>
+          <w:instrText xml:space="preserve"> PAGEREF _Toc243837938 \h </w:instrText>
         </w:r>
         <w:r>
           <w:rPr>
@@ -448,7 +448,7 @@
           <w14:ligatures w14:val="standardContextual"/>
         </w:rPr>
       </w:pPr>
-      <w:hyperlink w:anchor="_Toc243835765" w:history="1">
+      <w:hyperlink w:anchor="_Toc243837939" w:history="1">
         <w:r>
           <w:rPr>
             <w:rStyle w:val="Hipervnculo"/>
@@ -475,7 +475,7 @@
             <w:noProof/>
             <w:webHidden/>
           </w:rPr>
-          <w:instrText xml:space="preserve"> PAGEREF _Toc243835765 \h </w:instrText>
+          <w:instrText xml:space="preserve"> PAGEREF _Toc243837939 \h </w:instrText>
         </w:r>
         <w:r>
           <w:rPr>
@@ -522,7 +522,7 @@
           <w14:ligatures w14:val="standardContextual"/>
         </w:rPr>
       </w:pPr>
-      <w:hyperlink w:anchor="_Toc243835766" w:history="1">
+      <w:hyperlink w:anchor="_Toc243837940" w:history="1">
         <w:r>
           <w:rPr>
             <w:rStyle w:val="Hipervnculo"/>
@@ -549,7 +549,7 @@
             <w:noProof/>
             <w:webHidden/>
           </w:rPr>
-          <w:instrText xml:space="preserve"> PAGEREF _Toc243835766 \h </w:instrText>
+          <w:instrText xml:space="preserve"> PAGEREF _Toc243837940 \h </w:instrText>
         </w:r>
         <w:r>
           <w:rPr>
@@ -596,7 +596,7 @@
           <w14:ligatures w14:val="standardContextual"/>
         </w:rPr>
       </w:pPr>
-      <w:hyperlink w:anchor="_Toc243835767" w:history="1">
+      <w:hyperlink w:anchor="_Toc243837941" w:history="1">
         <w:r>
           <w:rPr>
             <w:rStyle w:val="Hipervnculo"/>
@@ -623,7 +623,7 @@
             <w:noProof/>
             <w:webHidden/>
           </w:rPr>
-          <w:instrText xml:space="preserve"> PAGEREF _Toc243835767 \h </w:instrText>
+          <w:instrText xml:space="preserve"> PAGEREF _Toc243837941 \h </w:instrText>
         </w:r>
         <w:r>
           <w:rPr>
@@ -670,7 +670,7 @@
           <w14:ligatures w14:val="standardContextual"/>
         </w:rPr>
       </w:pPr>
-      <w:hyperlink w:anchor="_Toc243835768" w:history="1">
+      <w:hyperlink w:anchor="_Toc243837942" w:history="1">
         <w:r>
           <w:rPr>
             <w:rStyle w:val="Hipervnculo"/>
@@ -697,7 +697,7 @@
             <w:noProof/>
             <w:webHidden/>
           </w:rPr>
-          <w:instrText xml:space="preserve"> PAGEREF _Toc243835768 \h </w:instrText>
+          <w:instrText xml:space="preserve"> PAGEREF _Toc243837942 \h </w:instrText>
         </w:r>
         <w:r>
           <w:rPr>
@@ -744,7 +744,7 @@
           <w14:ligatures w14:val="standardContextual"/>
         </w:rPr>
       </w:pPr>
-      <w:hyperlink w:anchor="_Toc243835769" w:history="1">
+      <w:hyperlink w:anchor="_Toc243837943" w:history="1">
         <w:r>
           <w:rPr>
             <w:rStyle w:val="Hipervnculo"/>
@@ -771,7 +771,7 @@
             <w:noProof/>
             <w:webHidden/>
           </w:rPr>
-          <w:instrText xml:space="preserve"> PAGEREF _Toc243835769 \h </w:instrText>
+          <w:instrText xml:space="preserve"> PAGEREF _Toc243837943 \h </w:instrText>
         </w:r>
         <w:r>
           <w:rPr>
@@ -818,7 +818,7 @@
           <w14:ligatures w14:val="standardContextual"/>
         </w:rPr>
       </w:pPr>
-      <w:hyperlink w:anchor="_Toc243835770" w:history="1">
+      <w:hyperlink w:anchor="_Toc243837944" w:history="1">
         <w:r>
           <w:rPr>
             <w:rStyle w:val="Hipervnculo"/>
@@ -845,7 +845,7 @@
             <w:noProof/>
             <w:webHidden/>
           </w:rPr>
-          <w:instrText xml:space="preserve"> PAGEREF _Toc243835770 \h </w:instrText>
+          <w:instrText xml:space="preserve"> PAGEREF _Toc243837944 \h </w:instrText>
         </w:r>
         <w:r>
           <w:rPr>
@@ -892,7 +892,7 @@
           <w14:ligatures w14:val="standardContextual"/>
         </w:rPr>
       </w:pPr>
-      <w:hyperlink w:anchor="_Toc243835771" w:history="1">
+      <w:hyperlink w:anchor="_Toc243837945" w:history="1">
         <w:r>
           <w:rPr>
             <w:rStyle w:val="Hipervnculo"/>
@@ -919,7 +919,7 @@
             <w:noProof/>
             <w:webHidden/>
           </w:rPr>
-          <w:instrText xml:space="preserve"> PAGEREF _Toc243835771 \h </w:instrText>
+          <w:instrText xml:space="preserve"> PAGEREF _Toc243837945 \h </w:instrText>
         </w:r>
         <w:r>
           <w:rPr>
@@ -966,7 +966,7 @@
           <w14:ligatures w14:val="standardContextual"/>
         </w:rPr>
       </w:pPr>
-      <w:hyperlink w:anchor="_Toc243835772" w:history="1">
+      <w:hyperlink w:anchor="_Toc243837946" w:history="1">
         <w:r>
           <w:rPr>
             <w:rStyle w:val="Hipervnculo"/>
@@ -993,7 +993,7 @@
             <w:noProof/>
             <w:webHidden/>
           </w:rPr>
-          <w:instrText xml:space="preserve"> PAGEREF _Toc243835772 \h </w:instrText>
+          <w:instrText xml:space="preserve"> PAGEREF _Toc243837946 \h </w:instrText>
         </w:r>
         <w:r>
           <w:rPr>
@@ -1040,7 +1040,7 @@
           <w14:ligatures w14:val="standardContextual"/>
         </w:rPr>
       </w:pPr>
-      <w:hyperlink w:anchor="_Toc243835773" w:history="1">
+      <w:hyperlink w:anchor="_Toc243837947" w:history="1">
         <w:r>
           <w:rPr>
             <w:rStyle w:val="Hipervnculo"/>
@@ -1067,7 +1067,7 @@
             <w:noProof/>
             <w:webHidden/>
           </w:rPr>
-          <w:instrText xml:space="preserve"> PAGEREF _Toc243835773 \h </w:instrText>
+          <w:instrText xml:space="preserve"> PAGEREF _Toc243837947 \h </w:instrText>
         </w:r>
         <w:r>
           <w:rPr>
@@ -1114,7 +1114,7 @@
           <w14:ligatures w14:val="standardContextual"/>
         </w:rPr>
       </w:pPr>
-      <w:hyperlink w:anchor="_Toc243835774" w:history="1">
+      <w:hyperlink w:anchor="_Toc243837948" w:history="1">
         <w:r>
           <w:rPr>
             <w:rStyle w:val="Hipervnculo"/>
@@ -1141,7 +1141,7 @@
             <w:noProof/>
             <w:webHidden/>
           </w:rPr>
-          <w:instrText xml:space="preserve"> PAGEREF _Toc243835774 \h </w:instrText>
+          <w:instrText xml:space="preserve"> PAGEREF _Toc243837948 \h </w:instrText>
         </w:r>
         <w:r>
           <w:rPr>
@@ -1188,7 +1188,7 @@
           <w14:ligatures w14:val="standardContextual"/>
         </w:rPr>
       </w:pPr>
-      <w:hyperlink w:anchor="_Toc243835775" w:history="1">
+      <w:hyperlink w:anchor="_Toc243837949" w:history="1">
         <w:r>
           <w:rPr>
             <w:rStyle w:val="Hipervnculo"/>
@@ -1215,7 +1215,7 @@
             <w:noProof/>
             <w:webHidden/>
           </w:rPr>
-          <w:instrText xml:space="preserve"> PAGEREF _Toc243835775 \h </w:instrText>
+          <w:instrText xml:space="preserve"> PAGEREF _Toc243837949 \h </w:instrText>
         </w:r>
         <w:r>
           <w:rPr>
@@ -1262,7 +1262,7 @@
           <w14:ligatures w14:val="standardContextual"/>
         </w:rPr>
       </w:pPr>
-      <w:hyperlink w:anchor="_Toc243835776" w:history="1">
+      <w:hyperlink w:anchor="_Toc243837950" w:history="1">
         <w:r>
           <w:rPr>
             <w:rStyle w:val="Hipervnculo"/>
@@ -1289,7 +1289,7 @@
             <w:noProof/>
             <w:webHidden/>
           </w:rPr>
-          <w:instrText xml:space="preserve"> PAGEREF _Toc243835776 \h </w:instrText>
+          <w:instrText xml:space="preserve"> PAGEREF _Toc243837950 \h </w:instrText>
         </w:r>
         <w:r>
           <w:rPr>
@@ -1336,7 +1336,7 @@
           <w14:ligatures w14:val="standardContextual"/>
         </w:rPr>
       </w:pPr>
-      <w:hyperlink w:anchor="_Toc243835777" w:history="1">
+      <w:hyperlink w:anchor="_Toc243837951" w:history="1">
         <w:r>
           <w:rPr>
             <w:rStyle w:val="Hipervnculo"/>
@@ -1363,7 +1363,7 @@
             <w:noProof/>
             <w:webHidden/>
           </w:rPr>
-          <w:instrText xml:space="preserve"> PAGEREF _Toc243835777 \h </w:instrText>
+          <w:instrText xml:space="preserve"> PAGEREF _Toc243837951 \h </w:instrText>
         </w:r>
         <w:r>
           <w:rPr>
@@ -1410,7 +1410,7 @@
           <w14:ligatures w14:val="standardContextual"/>
         </w:rPr>
       </w:pPr>
-      <w:hyperlink w:anchor="_Toc243835778" w:history="1">
+      <w:hyperlink w:anchor="_Toc243837952" w:history="1">
         <w:r>
           <w:rPr>
             <w:rStyle w:val="Hipervnculo"/>
@@ -1437,7 +1437,7 @@
             <w:noProof/>
             <w:webHidden/>
           </w:rPr>
-          <w:instrText xml:space="preserve"> PAGEREF _Toc243835778 \h </w:instrText>
+          <w:instrText xml:space="preserve"> PAGEREF _Toc243837952 \h </w:instrText>
         </w:r>
         <w:r>
           <w:rPr>
@@ -1484,7 +1484,7 @@
           <w14:ligatures w14:val="standardContextual"/>
         </w:rPr>
       </w:pPr>
-      <w:hyperlink w:anchor="_Toc243835779" w:history="1">
+      <w:hyperlink w:anchor="_Toc243837953" w:history="1">
         <w:r>
           <w:rPr>
             <w:rStyle w:val="Hipervnculo"/>
@@ -1511,7 +1511,7 @@
             <w:noProof/>
             <w:webHidden/>
           </w:rPr>
-          <w:instrText xml:space="preserve"> PAGEREF _Toc243835779 \h </w:instrText>
+          <w:instrText xml:space="preserve"> PAGEREF _Toc243837953 \h </w:instrText>
         </w:r>
         <w:r>
           <w:rPr>
@@ -1558,7 +1558,7 @@
           <w14:ligatures w14:val="standardContextual"/>
         </w:rPr>
       </w:pPr>
-      <w:hyperlink w:anchor="_Toc243835780" w:history="1">
+      <w:hyperlink w:anchor="_Toc243837954" w:history="1">
         <w:r>
           <w:rPr>
             <w:rStyle w:val="Hipervnculo"/>
@@ -1585,7 +1585,7 @@
             <w:noProof/>
             <w:webHidden/>
           </w:rPr>
-          <w:instrText xml:space="preserve"> PAGEREF _Toc243835780 \h </w:instrText>
+          <w:instrText xml:space="preserve"> PAGEREF _Toc243837954 \h </w:instrText>
         </w:r>
         <w:r>
           <w:rPr>
@@ -1632,7 +1632,7 @@
           <w14:ligatures w14:val="standardContextual"/>
         </w:rPr>
       </w:pPr>
-      <w:hyperlink w:anchor="_Toc243835781" w:history="1">
+      <w:hyperlink w:anchor="_Toc243837955" w:history="1">
         <w:r>
           <w:rPr>
             <w:rStyle w:val="Hipervnculo"/>
@@ -1659,7 +1659,7 @@
             <w:noProof/>
             <w:webHidden/>
           </w:rPr>
-          <w:instrText xml:space="preserve"> PAGEREF _Toc243835781 \h </w:instrText>
+          <w:instrText xml:space="preserve"> PAGEREF _Toc243837955 \h </w:instrText>
         </w:r>
         <w:r>
           <w:rPr>
@@ -1706,7 +1706,7 @@
           <w14:ligatures w14:val="standardContextual"/>
         </w:rPr>
       </w:pPr>
-      <w:hyperlink w:anchor="_Toc243835782" w:history="1">
+      <w:hyperlink w:anchor="_Toc243837956" w:history="1">
         <w:r>
           <w:rPr>
             <w:rStyle w:val="Hipervnculo"/>
@@ -1733,7 +1733,7 @@
             <w:noProof/>
             <w:webHidden/>
           </w:rPr>
-          <w:instrText xml:space="preserve"> PAGEREF _Toc243835782 \h </w:instrText>
+          <w:instrText xml:space="preserve"> PAGEREF _Toc243837956 \h </w:instrText>
         </w:r>
         <w:r>
           <w:rPr>
@@ -1780,7 +1780,7 @@
           <w14:ligatures w14:val="standardContextual"/>
         </w:rPr>
       </w:pPr>
-      <w:hyperlink w:anchor="_Toc243835783" w:history="1">
+      <w:hyperlink w:anchor="_Toc243837957" w:history="1">
         <w:r>
           <w:rPr>
             <w:rStyle w:val="Hipervnculo"/>
@@ -1807,7 +1807,7 @@
             <w:noProof/>
             <w:webHidden/>
           </w:rPr>
-          <w:instrText xml:space="preserve"> PAGEREF _Toc243835783 \h </w:instrText>
+          <w:instrText xml:space="preserve"> PAGEREF _Toc243837957 \h </w:instrText>
         </w:r>
         <w:r>
           <w:rPr>
@@ -1854,7 +1854,7 @@
           <w14:ligatures w14:val="standardContextual"/>
         </w:rPr>
       </w:pPr>
-      <w:hyperlink w:anchor="_Toc243835784" w:history="1">
+      <w:hyperlink w:anchor="_Toc243837958" w:history="1">
         <w:r>
           <w:rPr>
             <w:rStyle w:val="Hipervnculo"/>
@@ -1881,7 +1881,7 @@
             <w:noProof/>
             <w:webHidden/>
           </w:rPr>
-          <w:instrText xml:space="preserve"> PAGEREF _Toc243835784 \h </w:instrText>
+          <w:instrText xml:space="preserve"> PAGEREF _Toc243837958 \h </w:instrText>
         </w:r>
         <w:r>
           <w:rPr>
@@ -1928,7 +1928,7 @@
           <w14:ligatures w14:val="standardContextual"/>
         </w:rPr>
       </w:pPr>
-      <w:hyperlink w:anchor="_Toc243835785" w:history="1">
+      <w:hyperlink w:anchor="_Toc243837959" w:history="1">
         <w:r>
           <w:rPr>
             <w:rStyle w:val="Hipervnculo"/>
@@ -1955,7 +1955,7 @@
             <w:noProof/>
             <w:webHidden/>
           </w:rPr>
-          <w:instrText xml:space="preserve"> PAGEREF _Toc243835785 \h </w:instrText>
+          <w:instrText xml:space="preserve"> PAGEREF _Toc243837959 \h </w:instrText>
         </w:r>
         <w:r>
           <w:rPr>
@@ -2002,7 +2002,7 @@
           <w14:ligatures w14:val="standardContextual"/>
         </w:rPr>
       </w:pPr>
-      <w:hyperlink w:anchor="_Toc243835786" w:history="1">
+      <w:hyperlink w:anchor="_Toc243837960" w:history="1">
         <w:r>
           <w:rPr>
             <w:rStyle w:val="Hipervnculo"/>
@@ -2029,7 +2029,7 @@
             <w:noProof/>
             <w:webHidden/>
           </w:rPr>
-          <w:instrText xml:space="preserve"> PAGEREF _Toc243835786 \h </w:instrText>
+          <w:instrText xml:space="preserve"> PAGEREF _Toc243837960 \h </w:instrText>
         </w:r>
         <w:r>
           <w:rPr>
@@ -2076,7 +2076,7 @@
           <w14:ligatures w14:val="standardContextual"/>
         </w:rPr>
       </w:pPr>
-      <w:hyperlink w:anchor="_Toc243835787" w:history="1">
+      <w:hyperlink w:anchor="_Toc243837961" w:history="1">
         <w:r>
           <w:rPr>
             <w:rStyle w:val="Hipervnculo"/>
@@ -2103,7 +2103,7 @@
             <w:noProof/>
             <w:webHidden/>
           </w:rPr>
-          <w:instrText xml:space="preserve"> PAGEREF _Toc243835787 \h </w:instrText>
+          <w:instrText xml:space="preserve"> PAGEREF _Toc243837961 \h </w:instrText>
         </w:r>
         <w:r>
           <w:rPr>
@@ -2150,7 +2150,7 @@
           <w14:ligatures w14:val="standardContextual"/>
         </w:rPr>
       </w:pPr>
-      <w:hyperlink w:anchor="_Toc243835788" w:history="1">
+      <w:hyperlink w:anchor="_Toc243837962" w:history="1">
         <w:r>
           <w:rPr>
             <w:rStyle w:val="Hipervnculo"/>
@@ -2177,7 +2177,7 @@
             <w:noProof/>
             <w:webHidden/>
           </w:rPr>
-          <w:instrText xml:space="preserve"> PAGEREF _Toc243835788 \h </w:instrText>
+          <w:instrText xml:space="preserve"> PAGEREF _Toc243837962 \h </w:instrText>
         </w:r>
         <w:r>
           <w:rPr>
@@ -2224,7 +2224,7 @@
           <w14:ligatures w14:val="standardContextual"/>
         </w:rPr>
       </w:pPr>
-      <w:hyperlink w:anchor="_Toc243835789" w:history="1">
+      <w:hyperlink w:anchor="_Toc243837963" w:history="1">
         <w:r>
           <w:rPr>
             <w:rStyle w:val="Hipervnculo"/>
@@ -2251,7 +2251,7 @@
             <w:noProof/>
             <w:webHidden/>
           </w:rPr>
-          <w:instrText xml:space="preserve"> PAGEREF _Toc243835789 \h </w:instrText>
+          <w:instrText xml:space="preserve"> PAGEREF _Toc243837963 \h </w:instrText>
         </w:r>
         <w:r>
           <w:rPr>
@@ -2298,7 +2298,7 @@
           <w14:ligatures w14:val="standardContextual"/>
         </w:rPr>
       </w:pPr>
-      <w:hyperlink w:anchor="_Toc243835790" w:history="1">
+      <w:hyperlink w:anchor="_Toc243837964" w:history="1">
         <w:r>
           <w:rPr>
             <w:rStyle w:val="Hipervnculo"/>
@@ -2325,7 +2325,7 @@
             <w:noProof/>
             <w:webHidden/>
           </w:rPr>
-          <w:instrText xml:space="preserve"> PAGEREF _Toc243835790 \h </w:instrText>
+          <w:instrText xml:space="preserve"> PAGEREF _Toc243837964 \h </w:instrText>
         </w:r>
         <w:r>
           <w:rPr>
@@ -2372,7 +2372,7 @@
           <w14:ligatures w14:val="standardContextual"/>
         </w:rPr>
       </w:pPr>
-      <w:hyperlink w:anchor="_Toc243835791" w:history="1">
+      <w:hyperlink w:anchor="_Toc243837965" w:history="1">
         <w:r>
           <w:rPr>
             <w:rStyle w:val="Hipervnculo"/>
@@ -2399,7 +2399,7 @@
             <w:noProof/>
             <w:webHidden/>
           </w:rPr>
-          <w:instrText xml:space="preserve"> PAGEREF _Toc243835791 \h </w:instrText>
+          <w:instrText xml:space="preserve"> PAGEREF _Toc243837965 \h </w:instrText>
         </w:r>
         <w:r>
           <w:rPr>
@@ -2446,7 +2446,7 @@
           <w14:ligatures w14:val="standardContextual"/>
         </w:rPr>
       </w:pPr>
-      <w:hyperlink w:anchor="_Toc243835792" w:history="1">
+      <w:hyperlink w:anchor="_Toc243837966" w:history="1">
         <w:r>
           <w:rPr>
             <w:rStyle w:val="Hipervnculo"/>
@@ -2473,7 +2473,7 @@
             <w:noProof/>
             <w:webHidden/>
           </w:rPr>
-          <w:instrText xml:space="preserve"> PAGEREF _Toc243835792 \h </w:instrText>
+          <w:instrText xml:space="preserve"> PAGEREF _Toc243837966 \h </w:instrText>
         </w:r>
         <w:r>
           <w:rPr>
@@ -2520,7 +2520,7 @@
           <w14:ligatures w14:val="standardContextual"/>
         </w:rPr>
       </w:pPr>
-      <w:hyperlink w:anchor="_Toc243835793" w:history="1">
+      <w:hyperlink w:anchor="_Toc243837967" w:history="1">
         <w:r>
           <w:rPr>
             <w:rStyle w:val="Hipervnculo"/>
@@ -2547,7 +2547,7 @@
             <w:noProof/>
             <w:webHidden/>
           </w:rPr>
-          <w:instrText xml:space="preserve"> PAGEREF _Toc243835793 \h </w:instrText>
+          <w:instrText xml:space="preserve"> PAGEREF _Toc243837967 \h </w:instrText>
         </w:r>
         <w:r>
           <w:rPr>
@@ -2594,7 +2594,7 @@
           <w14:ligatures w14:val="standardContextual"/>
         </w:rPr>
       </w:pPr>
-      <w:hyperlink w:anchor="_Toc243835794" w:history="1">
+      <w:hyperlink w:anchor="_Toc243837968" w:history="1">
         <w:r>
           <w:rPr>
             <w:rStyle w:val="Hipervnculo"/>
@@ -2621,7 +2621,7 @@
             <w:noProof/>
             <w:webHidden/>
           </w:rPr>
-          <w:instrText xml:space="preserve"> PAGEREF _Toc243835794 \h </w:instrText>
+          <w:instrText xml:space="preserve"> PAGEREF _Toc243837968 \h </w:instrText>
         </w:r>
         <w:r>
           <w:rPr>
@@ -2668,7 +2668,7 @@
           <w14:ligatures w14:val="standardContextual"/>
         </w:rPr>
       </w:pPr>
-      <w:hyperlink w:anchor="_Toc243835795" w:history="1">
+      <w:hyperlink w:anchor="_Toc243837969" w:history="1">
         <w:r>
           <w:rPr>
             <w:rStyle w:val="Hipervnculo"/>
@@ -2695,7 +2695,7 @@
             <w:noProof/>
             <w:webHidden/>
           </w:rPr>
-          <w:instrText xml:space="preserve"> PAGEREF _Toc243835795 \h </w:instrText>
+          <w:instrText xml:space="preserve"> PAGEREF _Toc243837969 \h </w:instrText>
         </w:r>
         <w:r>
           <w:rPr>
@@ -2742,7 +2742,7 @@
           <w14:ligatures w14:val="standardContextual"/>
         </w:rPr>
       </w:pPr>
-      <w:hyperlink w:anchor="_Toc243835796" w:history="1">
+      <w:hyperlink w:anchor="_Toc243837970" w:history="1">
         <w:r>
           <w:rPr>
             <w:rStyle w:val="Hipervnculo"/>
@@ -2769,7 +2769,7 @@
             <w:noProof/>
             <w:webHidden/>
           </w:rPr>
-          <w:instrText xml:space="preserve"> PAGEREF _Toc243835796 \h </w:instrText>
+          <w:instrText xml:space="preserve"> PAGEREF _Toc243837970 \h </w:instrText>
         </w:r>
         <w:r>
           <w:rPr>
@@ -2816,7 +2816,7 @@
           <w14:ligatures w14:val="standardContextual"/>
         </w:rPr>
       </w:pPr>
-      <w:hyperlink w:anchor="_Toc243835797" w:history="1">
+      <w:hyperlink w:anchor="_Toc243837971" w:history="1">
         <w:r>
           <w:rPr>
             <w:rStyle w:val="Hipervnculo"/>
@@ -2843,7 +2843,7 @@
             <w:noProof/>
             <w:webHidden/>
           </w:rPr>
-          <w:instrText xml:space="preserve"> PAGEREF _Toc243835797 \h </w:instrText>
+          <w:instrText xml:space="preserve"> PAGEREF _Toc243837971 \h </w:instrText>
         </w:r>
         <w:r>
           <w:rPr>
@@ -2890,7 +2890,7 @@
           <w14:ligatures w14:val="standardContextual"/>
         </w:rPr>
       </w:pPr>
-      <w:hyperlink w:anchor="_Toc243835798" w:history="1">
+      <w:hyperlink w:anchor="_Toc243837972" w:history="1">
         <w:r>
           <w:rPr>
             <w:rStyle w:val="Hipervnculo"/>
@@ -2917,7 +2917,7 @@
             <w:noProof/>
             <w:webHidden/>
           </w:rPr>
-          <w:instrText xml:space="preserve"> PAGEREF _Toc243835798 \h </w:instrText>
+          <w:instrText xml:space="preserve"> PAGEREF _Toc243837972 \h </w:instrText>
         </w:r>
         <w:r>
           <w:rPr>
@@ -2964,7 +2964,7 @@
           <w14:ligatures w14:val="standardContextual"/>
         </w:rPr>
       </w:pPr>
-      <w:hyperlink w:anchor="_Toc243835799" w:history="1">
+      <w:hyperlink w:anchor="_Toc243837973" w:history="1">
         <w:r>
           <w:rPr>
             <w:rStyle w:val="Hipervnculo"/>
@@ -2991,7 +2991,7 @@
             <w:noProof/>
             <w:webHidden/>
           </w:rPr>
-          <w:instrText xml:space="preserve"> PAGEREF _Toc243835799 \h </w:instrText>
+          <w:instrText xml:space="preserve"> PAGEREF _Toc243837973 \h </w:instrText>
         </w:r>
         <w:r>
           <w:rPr>
@@ -3038,7 +3038,7 @@
           <w14:ligatures w14:val="standardContextual"/>
         </w:rPr>
       </w:pPr>
-      <w:hyperlink w:anchor="_Toc243835800" w:history="1">
+      <w:hyperlink w:anchor="_Toc243837974" w:history="1">
         <w:r>
           <w:rPr>
             <w:rStyle w:val="Hipervnculo"/>
@@ -3065,7 +3065,7 @@
             <w:noProof/>
             <w:webHidden/>
           </w:rPr>
-          <w:instrText xml:space="preserve"> PAGEREF _Toc243835800 \h </w:instrText>
+          <w:instrText xml:space="preserve"> PAGEREF _Toc243837974 \h </w:instrText>
         </w:r>
         <w:r>
           <w:rPr>
@@ -3112,7 +3112,7 @@
           <w14:ligatures w14:val="standardContextual"/>
         </w:rPr>
       </w:pPr>
-      <w:hyperlink w:anchor="_Toc243835801" w:history="1">
+      <w:hyperlink w:anchor="_Toc243837975" w:history="1">
         <w:r>
           <w:rPr>
             <w:rStyle w:val="Hipervnculo"/>
@@ -3139,7 +3139,7 @@
             <w:noProof/>
             <w:webHidden/>
           </w:rPr>
-          <w:instrText xml:space="preserve"> PAGEREF _Toc243835801 \h </w:instrText>
+          <w:instrText xml:space="preserve"> PAGEREF _Toc243837975 \h </w:instrText>
         </w:r>
         <w:r>
           <w:rPr>
@@ -3186,7 +3186,7 @@
           <w14:ligatures w14:val="standardContextual"/>
         </w:rPr>
       </w:pPr>
-      <w:hyperlink w:anchor="_Toc243835802" w:history="1">
+      <w:hyperlink w:anchor="_Toc243837976" w:history="1">
         <w:r>
           <w:rPr>
             <w:rStyle w:val="Hipervnculo"/>
@@ -3213,7 +3213,7 @@
             <w:noProof/>
             <w:webHidden/>
           </w:rPr>
-          <w:instrText xml:space="preserve"> PAGEREF _Toc243835802 \h </w:instrText>
+          <w:instrText xml:space="preserve"> PAGEREF _Toc243837976 \h </w:instrText>
         </w:r>
         <w:r>
           <w:rPr>
@@ -3260,7 +3260,7 @@
           <w14:ligatures w14:val="standardContextual"/>
         </w:rPr>
       </w:pPr>
-      <w:hyperlink w:anchor="_Toc243835803" w:history="1">
+      <w:hyperlink w:anchor="_Toc243837977" w:history="1">
         <w:r>
           <w:rPr>
             <w:rStyle w:val="Hipervnculo"/>
@@ -3287,7 +3287,7 @@
             <w:noProof/>
             <w:webHidden/>
           </w:rPr>
-          <w:instrText xml:space="preserve"> PAGEREF _Toc243835803 \h </w:instrText>
+          <w:instrText xml:space="preserve"> PAGEREF _Toc243837977 \h </w:instrText>
         </w:r>
         <w:r>
           <w:rPr>
@@ -3334,7 +3334,7 @@
           <w14:ligatures w14:val="standardContextual"/>
         </w:rPr>
       </w:pPr>
-      <w:hyperlink w:anchor="_Toc243835804" w:history="1">
+      <w:hyperlink w:anchor="_Toc243837978" w:history="1">
         <w:r>
           <w:rPr>
             <w:rStyle w:val="Hipervnculo"/>
@@ -3361,7 +3361,7 @@
             <w:noProof/>
             <w:webHidden/>
           </w:rPr>
-          <w:instrText xml:space="preserve"> PAGEREF _Toc243835804 \h </w:instrText>
+          <w:instrText xml:space="preserve"> PAGEREF _Toc243837978 \h </w:instrText>
         </w:r>
         <w:r>
           <w:rPr>
@@ -3408,7 +3408,7 @@
           <w14:ligatures w14:val="standardContextual"/>
         </w:rPr>
       </w:pPr>
-      <w:hyperlink w:anchor="_Toc243835805" w:history="1">
+      <w:hyperlink w:anchor="_Toc243837979" w:history="1">
         <w:r>
           <w:rPr>
             <w:rStyle w:val="Hipervnculo"/>
@@ -3435,7 +3435,7 @@
             <w:noProof/>
             <w:webHidden/>
           </w:rPr>
-          <w:instrText xml:space="preserve"> PAGEREF _Toc243835805 \h </w:instrText>
+          <w:instrText xml:space="preserve"> PAGEREF _Toc243837979 \h </w:instrText>
         </w:r>
         <w:r>
           <w:rPr>
@@ -3482,7 +3482,7 @@
           <w14:ligatures w14:val="standardContextual"/>
         </w:rPr>
       </w:pPr>
-      <w:hyperlink w:anchor="_Toc243835806" w:history="1">
+      <w:hyperlink w:anchor="_Toc243837980" w:history="1">
         <w:r>
           <w:rPr>
             <w:rStyle w:val="Hipervnculo"/>
@@ -3509,7 +3509,7 @@
             <w:noProof/>
             <w:webHidden/>
           </w:rPr>
-          <w:instrText xml:space="preserve"> PAGEREF _Toc243835806 \h </w:instrText>
+          <w:instrText xml:space="preserve"> PAGEREF _Toc243837980 \h </w:instrText>
         </w:r>
         <w:r>
           <w:rPr>
@@ -3556,7 +3556,7 @@
           <w14:ligatures w14:val="standardContextual"/>
         </w:rPr>
       </w:pPr>
-      <w:hyperlink w:anchor="_Toc243835807" w:history="1">
+      <w:hyperlink w:anchor="_Toc243837981" w:history="1">
         <w:r>
           <w:rPr>
             <w:rStyle w:val="Hipervnculo"/>
@@ -3583,7 +3583,7 @@
             <w:noProof/>
             <w:webHidden/>
           </w:rPr>
-          <w:instrText xml:space="preserve"> PAGEREF _Toc243835807 \h </w:instrText>
+          <w:instrText xml:space="preserve"> PAGEREF _Toc243837981 \h </w:instrText>
         </w:r>
         <w:r>
           <w:rPr>
@@ -3630,7 +3630,7 @@
           <w14:ligatures w14:val="standardContextual"/>
         </w:rPr>
       </w:pPr>
-      <w:hyperlink w:anchor="_Toc243835808" w:history="1">
+      <w:hyperlink w:anchor="_Toc243837982" w:history="1">
         <w:r>
           <w:rPr>
             <w:rStyle w:val="Hipervnculo"/>
@@ -3657,7 +3657,7 @@
             <w:noProof/>
             <w:webHidden/>
           </w:rPr>
-          <w:instrText xml:space="preserve"> PAGEREF _Toc243835808 \h </w:instrText>
+          <w:instrText xml:space="preserve"> PAGEREF _Toc243837982 \h </w:instrText>
         </w:r>
         <w:r>
           <w:rPr>
@@ -3704,7 +3704,7 @@
           <w14:ligatures w14:val="standardContextual"/>
         </w:rPr>
       </w:pPr>
-      <w:hyperlink w:anchor="_Toc243835809" w:history="1">
+      <w:hyperlink w:anchor="_Toc243837983" w:history="1">
         <w:r>
           <w:rPr>
             <w:rStyle w:val="Hipervnculo"/>
@@ -3731,7 +3731,7 @@
             <w:noProof/>
             <w:webHidden/>
           </w:rPr>
-          <w:instrText xml:space="preserve"> PAGEREF _Toc243835809 \h </w:instrText>
+          <w:instrText xml:space="preserve"> PAGEREF _Toc243837983 \h </w:instrText>
         </w:r>
         <w:r>
           <w:rPr>
@@ -3778,7 +3778,7 @@
           <w14:ligatures w14:val="standardContextual"/>
         </w:rPr>
       </w:pPr>
-      <w:hyperlink w:anchor="_Toc243835810" w:history="1">
+      <w:hyperlink w:anchor="_Toc243837984" w:history="1">
         <w:r>
           <w:rPr>
             <w:rStyle w:val="Hipervnculo"/>
@@ -3805,7 +3805,7 @@
             <w:noProof/>
             <w:webHidden/>
           </w:rPr>
-          <w:instrText xml:space="preserve"> PAGEREF _Toc243835810 \h </w:instrText>
+          <w:instrText xml:space="preserve"> PAGEREF _Toc243837984 \h </w:instrText>
         </w:r>
         <w:r>
           <w:rPr>
@@ -3852,7 +3852,7 @@
           <w14:ligatures w14:val="standardContextual"/>
         </w:rPr>
       </w:pPr>
-      <w:hyperlink w:anchor="_Toc243835811" w:history="1">
+      <w:hyperlink w:anchor="_Toc243837985" w:history="1">
         <w:r>
           <w:rPr>
             <w:rStyle w:val="Hipervnculo"/>
@@ -3879,7 +3879,7 @@
             <w:noProof/>
             <w:webHidden/>
           </w:rPr>
-          <w:instrText xml:space="preserve"> PAGEREF _Toc243835811 \h </w:instrText>
+          <w:instrText xml:space="preserve"> PAGEREF _Toc243837985 \h </w:instrText>
         </w:r>
         <w:r>
           <w:rPr>
@@ -3926,7 +3926,7 @@
           <w14:ligatures w14:val="standardContextual"/>
         </w:rPr>
       </w:pPr>
-      <w:hyperlink w:anchor="_Toc243835812" w:history="1">
+      <w:hyperlink w:anchor="_Toc243837986" w:history="1">
         <w:r>
           <w:rPr>
             <w:rStyle w:val="Hipervnculo"/>
@@ -3953,7 +3953,7 @@
             <w:noProof/>
             <w:webHidden/>
           </w:rPr>
-          <w:instrText xml:space="preserve"> PAGEREF _Toc243835812 \h </w:instrText>
+          <w:instrText xml:space="preserve"> PAGEREF _Toc243837986 \h </w:instrText>
         </w:r>
         <w:r>
           <w:rPr>
@@ -4000,7 +4000,7 @@
           <w14:ligatures w14:val="standardContextual"/>
         </w:rPr>
       </w:pPr>
-      <w:hyperlink w:anchor="_Toc243835813" w:history="1">
+      <w:hyperlink w:anchor="_Toc243837987" w:history="1">
         <w:r>
           <w:rPr>
             <w:rStyle w:val="Hipervnculo"/>
@@ -4027,7 +4027,7 @@
             <w:noProof/>
             <w:webHidden/>
           </w:rPr>
-          <w:instrText xml:space="preserve"> PAGEREF _Toc243835813 \h </w:instrText>
+          <w:instrText xml:space="preserve"> PAGEREF _Toc243837987 \h </w:instrText>
         </w:r>
         <w:r>
           <w:rPr>
@@ -4074,7 +4074,7 @@
           <w14:ligatures w14:val="standardContextual"/>
         </w:rPr>
       </w:pPr>
-      <w:hyperlink w:anchor="_Toc243835814" w:history="1">
+      <w:hyperlink w:anchor="_Toc243837988" w:history="1">
         <w:r>
           <w:rPr>
             <w:rStyle w:val="Hipervnculo"/>
@@ -4101,7 +4101,7 @@
             <w:noProof/>
             <w:webHidden/>
           </w:rPr>
-          <w:instrText xml:space="preserve"> PAGEREF _Toc243835814 \h </w:instrText>
+          <w:instrText xml:space="preserve"> PAGEREF _Toc243837988 \h </w:instrText>
         </w:r>
         <w:r>
           <w:rPr>
@@ -4148,7 +4148,7 @@
           <w14:ligatures w14:val="standardContextual"/>
         </w:rPr>
       </w:pPr>
-      <w:hyperlink w:anchor="_Toc243835815" w:history="1">
+      <w:hyperlink w:anchor="_Toc243837989" w:history="1">
         <w:r>
           <w:rPr>
             <w:rStyle w:val="Hipervnculo"/>
@@ -4175,7 +4175,7 @@
             <w:noProof/>
             <w:webHidden/>
           </w:rPr>
-          <w:instrText xml:space="preserve"> PAGEREF _Toc243835815 \h </w:instrText>
+          <w:instrText xml:space="preserve"> PAGEREF _Toc243837989 \h </w:instrText>
         </w:r>
         <w:r>
           <w:rPr>
@@ -4222,7 +4222,7 @@
           <w14:ligatures w14:val="standardContextual"/>
         </w:rPr>
       </w:pPr>
-      <w:hyperlink w:anchor="_Toc243835816" w:history="1">
+      <w:hyperlink w:anchor="_Toc243837990" w:history="1">
         <w:r>
           <w:rPr>
             <w:rStyle w:val="Hipervnculo"/>
@@ -4249,7 +4249,7 @@
             <w:noProof/>
             <w:webHidden/>
           </w:rPr>
-          <w:instrText xml:space="preserve"> PAGEREF _Toc243835816 \h </w:instrText>
+          <w:instrText xml:space="preserve"> PAGEREF _Toc243837990 \h </w:instrText>
         </w:r>
         <w:r>
           <w:rPr>
@@ -4279,6 +4279,28 @@
           <w:fldChar w:fldCharType="end"/>
         </w:r>
       </w:hyperlink>
+    </w:p>
+    <w:p>
+      <w:pPr>
+        <w:pStyle w:val="TDC3"/>
+        <w:tabs>
+          <w:tab w:val="right" w:leader="dot" w:pos="9628"/>
+        </w:tabs>
+        <w:rPr>
+          <w:rFonts w:asciiTheme="minorHAnsi" w:eastAsiaTheme="minorEastAsia" w:hAnsiTheme="minorHAnsi" w:cstheme="minorBidi"/>
+          <w:noProof/>
+          <w:color w:val="auto"/>
+          <w:kern w:val="2"/>
+          <w:sz w:val="24"/>
+          <w:szCs w:val="24"/>
+          <w14:ligatures w14:val="standardContextual"/>
+        </w:rPr>
+      </w:pPr>
+      <w:r>
+        <w:t>4.3.12. Explicabilidad de los modelos de árboles</w:t>
+        <w:tab/>
+        <w:t>54</w:t>
+      </w:r>
     </w:p>
     <w:p>
       <w:pPr>
@@ -4296,7 +4318,7 @@
           <w14:ligatures w14:val="standardContextual"/>
         </w:rPr>
       </w:pPr>
-      <w:hyperlink w:anchor="_Toc243835817" w:history="1">
+      <w:hyperlink w:anchor="_Toc243837991" w:history="1">
         <w:r>
           <w:rPr>
             <w:rStyle w:val="Hipervnculo"/>
@@ -4323,7 +4345,7 @@
             <w:noProof/>
             <w:webHidden/>
           </w:rPr>
-          <w:instrText xml:space="preserve"> PAGEREF _Toc243835817 \h </w:instrText>
+          <w:instrText xml:space="preserve"> PAGEREF _Toc243837991 \h </w:instrText>
         </w:r>
         <w:r>
           <w:rPr>
@@ -4370,7 +4392,7 @@
           <w14:ligatures w14:val="standardContextual"/>
         </w:rPr>
       </w:pPr>
-      <w:hyperlink w:anchor="_Toc243835818" w:history="1">
+      <w:hyperlink w:anchor="_Toc243837992" w:history="1">
         <w:r>
           <w:rPr>
             <w:rStyle w:val="Hipervnculo"/>
@@ -4397,7 +4419,7 @@
             <w:noProof/>
             <w:webHidden/>
           </w:rPr>
-          <w:instrText xml:space="preserve"> PAGEREF _Toc243835818 \h </w:instrText>
+          <w:instrText xml:space="preserve"> PAGEREF _Toc243837992 \h </w:instrText>
         </w:r>
         <w:r>
           <w:rPr>
@@ -4444,7 +4466,7 @@
           <w14:ligatures w14:val="standardContextual"/>
         </w:rPr>
       </w:pPr>
-      <w:hyperlink w:anchor="_Toc243835819" w:history="1">
+      <w:hyperlink w:anchor="_Toc243837993" w:history="1">
         <w:r>
           <w:rPr>
             <w:rStyle w:val="Hipervnculo"/>
@@ -4471,7 +4493,7 @@
             <w:noProof/>
             <w:webHidden/>
           </w:rPr>
-          <w:instrText xml:space="preserve"> PAGEREF _Toc243835819 \h </w:instrText>
+          <w:instrText xml:space="preserve"> PAGEREF _Toc243837993 \h </w:instrText>
         </w:r>
         <w:r>
           <w:rPr>
@@ -4518,7 +4540,7 @@
           <w14:ligatures w14:val="standardContextual"/>
         </w:rPr>
       </w:pPr>
-      <w:hyperlink w:anchor="_Toc243835820" w:history="1">
+      <w:hyperlink w:anchor="_Toc243837994" w:history="1">
         <w:r>
           <w:rPr>
             <w:rStyle w:val="Hipervnculo"/>
@@ -4545,7 +4567,7 @@
             <w:noProof/>
             <w:webHidden/>
           </w:rPr>
-          <w:instrText xml:space="preserve"> PAGEREF _Toc243835820 \h </w:instrText>
+          <w:instrText xml:space="preserve"> PAGEREF _Toc243837994 \h </w:instrText>
         </w:r>
         <w:r>
           <w:rPr>
@@ -4592,7 +4614,7 @@
           <w14:ligatures w14:val="standardContextual"/>
         </w:rPr>
       </w:pPr>
-      <w:hyperlink w:anchor="_Toc243835821" w:history="1">
+      <w:hyperlink w:anchor="_Toc243837995" w:history="1">
         <w:r>
           <w:rPr>
             <w:rStyle w:val="Hipervnculo"/>
@@ -4619,7 +4641,7 @@
             <w:noProof/>
             <w:webHidden/>
           </w:rPr>
-          <w:instrText xml:space="preserve"> PAGEREF _Toc243835821 \h </w:instrText>
+          <w:instrText xml:space="preserve"> PAGEREF _Toc243837995 \h </w:instrText>
         </w:r>
         <w:r>
           <w:rPr>
@@ -4666,7 +4688,7 @@
           <w14:ligatures w14:val="standardContextual"/>
         </w:rPr>
       </w:pPr>
-      <w:hyperlink w:anchor="_Toc243835822" w:history="1">
+      <w:hyperlink w:anchor="_Toc243837996" w:history="1">
         <w:r>
           <w:rPr>
             <w:rStyle w:val="Hipervnculo"/>
@@ -4693,7 +4715,7 @@
             <w:noProof/>
             <w:webHidden/>
           </w:rPr>
-          <w:instrText xml:space="preserve"> PAGEREF _Toc243835822 \h </w:instrText>
+          <w:instrText xml:space="preserve"> PAGEREF _Toc243837996 \h </w:instrText>
         </w:r>
         <w:r>
           <w:rPr>
@@ -4740,7 +4762,7 @@
           <w14:ligatures w14:val="standardContextual"/>
         </w:rPr>
       </w:pPr>
-      <w:hyperlink w:anchor="_Toc243835823" w:history="1">
+      <w:hyperlink w:anchor="_Toc243837997" w:history="1">
         <w:r>
           <w:rPr>
             <w:rStyle w:val="Hipervnculo"/>
@@ -4767,7 +4789,7 @@
             <w:noProof/>
             <w:webHidden/>
           </w:rPr>
-          <w:instrText xml:space="preserve"> PAGEREF _Toc243835823 \h </w:instrText>
+          <w:instrText xml:space="preserve"> PAGEREF _Toc243837997 \h </w:instrText>
         </w:r>
         <w:r>
           <w:rPr>
@@ -4814,7 +4836,7 @@
           <w14:ligatures w14:val="standardContextual"/>
         </w:rPr>
       </w:pPr>
-      <w:hyperlink w:anchor="_Toc243835824" w:history="1">
+      <w:hyperlink w:anchor="_Toc243837998" w:history="1">
         <w:r>
           <w:rPr>
             <w:rStyle w:val="Hipervnculo"/>
@@ -4841,7 +4863,7 @@
             <w:noProof/>
             <w:webHidden/>
           </w:rPr>
-          <w:instrText xml:space="preserve"> PAGEREF _Toc243835824 \h </w:instrText>
+          <w:instrText xml:space="preserve"> PAGEREF _Toc243837998 \h </w:instrText>
         </w:r>
         <w:r>
           <w:rPr>
@@ -4888,7 +4910,7 @@
           <w14:ligatures w14:val="standardContextual"/>
         </w:rPr>
       </w:pPr>
-      <w:hyperlink w:anchor="_Toc243835825" w:history="1">
+      <w:hyperlink w:anchor="_Toc243837999" w:history="1">
         <w:r>
           <w:rPr>
             <w:rStyle w:val="Hipervnculo"/>
@@ -4915,7 +4937,7 @@
             <w:noProof/>
             <w:webHidden/>
           </w:rPr>
-          <w:instrText xml:space="preserve"> PAGEREF _Toc243835825 \h </w:instrText>
+          <w:instrText xml:space="preserve"> PAGEREF _Toc243837999 \h </w:instrText>
         </w:r>
         <w:r>
           <w:rPr>
@@ -4962,7 +4984,7 @@
           <w14:ligatures w14:val="standardContextual"/>
         </w:rPr>
       </w:pPr>
-      <w:hyperlink w:anchor="_Toc243835826" w:history="1">
+      <w:hyperlink w:anchor="_Toc243838000" w:history="1">
         <w:r>
           <w:rPr>
             <w:rStyle w:val="Hipervnculo"/>
@@ -4989,7 +5011,7 @@
             <w:noProof/>
             <w:webHidden/>
           </w:rPr>
-          <w:instrText xml:space="preserve"> PAGEREF _Toc243835826 \h </w:instrText>
+          <w:instrText xml:space="preserve"> PAGEREF _Toc243838000 \h </w:instrText>
         </w:r>
         <w:r>
           <w:rPr>
@@ -5036,7 +5058,7 @@
           <w14:ligatures w14:val="standardContextual"/>
         </w:rPr>
       </w:pPr>
-      <w:hyperlink w:anchor="_Toc243835827" w:history="1">
+      <w:hyperlink w:anchor="_Toc243838001" w:history="1">
         <w:r>
           <w:rPr>
             <w:rStyle w:val="Hipervnculo"/>
@@ -5063,7 +5085,7 @@
             <w:noProof/>
             <w:webHidden/>
           </w:rPr>
-          <w:instrText xml:space="preserve"> PAGEREF _Toc243835827 \h </w:instrText>
+          <w:instrText xml:space="preserve"> PAGEREF _Toc243838001 \h </w:instrText>
         </w:r>
         <w:r>
           <w:rPr>
@@ -5110,7 +5132,7 @@
           <w14:ligatures w14:val="standardContextual"/>
         </w:rPr>
       </w:pPr>
-      <w:hyperlink w:anchor="_Toc243835828" w:history="1">
+      <w:hyperlink w:anchor="_Toc243838002" w:history="1">
         <w:r>
           <w:rPr>
             <w:rStyle w:val="Hipervnculo"/>
@@ -5137,7 +5159,7 @@
             <w:noProof/>
             <w:webHidden/>
           </w:rPr>
-          <w:instrText xml:space="preserve"> PAGEREF _Toc243835828 \h </w:instrText>
+          <w:instrText xml:space="preserve"> PAGEREF _Toc243838002 \h </w:instrText>
         </w:r>
         <w:r>
           <w:rPr>
@@ -5184,7 +5206,7 @@
           <w14:ligatures w14:val="standardContextual"/>
         </w:rPr>
       </w:pPr>
-      <w:hyperlink w:anchor="_Toc243835829" w:history="1">
+      <w:hyperlink w:anchor="_Toc243838003" w:history="1">
         <w:r>
           <w:rPr>
             <w:rStyle w:val="Hipervnculo"/>
@@ -5211,7 +5233,7 @@
             <w:noProof/>
             <w:webHidden/>
           </w:rPr>
-          <w:instrText xml:space="preserve"> PAGEREF _Toc243835829 \h </w:instrText>
+          <w:instrText xml:space="preserve"> PAGEREF _Toc243838003 \h </w:instrText>
         </w:r>
         <w:r>
           <w:rPr>
@@ -5258,7 +5280,7 @@
           <w14:ligatures w14:val="standardContextual"/>
         </w:rPr>
       </w:pPr>
-      <w:hyperlink w:anchor="_Toc243835830" w:history="1">
+      <w:hyperlink w:anchor="_Toc243838004" w:history="1">
         <w:r>
           <w:rPr>
             <w:rStyle w:val="Hipervnculo"/>
@@ -5285,7 +5307,7 @@
             <w:noProof/>
             <w:webHidden/>
           </w:rPr>
-          <w:instrText xml:space="preserve"> PAGEREF _Toc243835830 \h </w:instrText>
+          <w:instrText xml:space="preserve"> PAGEREF _Toc243838004 \h </w:instrText>
         </w:r>
         <w:r>
           <w:rPr>
@@ -5332,7 +5354,7 @@
           <w14:ligatures w14:val="standardContextual"/>
         </w:rPr>
       </w:pPr>
-      <w:hyperlink w:anchor="_Toc243835831" w:history="1">
+      <w:hyperlink w:anchor="_Toc243838005" w:history="1">
         <w:r>
           <w:rPr>
             <w:rStyle w:val="Hipervnculo"/>
@@ -5359,7 +5381,7 @@
             <w:noProof/>
             <w:webHidden/>
           </w:rPr>
-          <w:instrText xml:space="preserve"> PAGEREF _Toc243835831 \h </w:instrText>
+          <w:instrText xml:space="preserve"> PAGEREF _Toc243838005 \h </w:instrText>
         </w:r>
         <w:r>
           <w:rPr>
@@ -5406,7 +5428,7 @@
           <w14:ligatures w14:val="standardContextual"/>
         </w:rPr>
       </w:pPr>
-      <w:hyperlink w:anchor="_Toc243835832" w:history="1">
+      <w:hyperlink w:anchor="_Toc243838006" w:history="1">
         <w:r>
           <w:rPr>
             <w:rStyle w:val="Hipervnculo"/>
@@ -5433,7 +5455,7 @@
             <w:noProof/>
             <w:webHidden/>
           </w:rPr>
-          <w:instrText xml:space="preserve"> PAGEREF _Toc243835832 \h </w:instrText>
+          <w:instrText xml:space="preserve"> PAGEREF _Toc243838006 \h </w:instrText>
         </w:r>
         <w:r>
           <w:rPr>
@@ -5480,7 +5502,7 @@
           <w14:ligatures w14:val="standardContextual"/>
         </w:rPr>
       </w:pPr>
-      <w:hyperlink w:anchor="_Toc243835833" w:history="1">
+      <w:hyperlink w:anchor="_Toc243838007" w:history="1">
         <w:r>
           <w:rPr>
             <w:rStyle w:val="Hipervnculo"/>
@@ -5507,7 +5529,7 @@
             <w:noProof/>
             <w:webHidden/>
           </w:rPr>
-          <w:instrText xml:space="preserve"> PAGEREF _Toc243835833 \h </w:instrText>
+          <w:instrText xml:space="preserve"> PAGEREF _Toc243838007 \h </w:instrText>
         </w:r>
         <w:r>
           <w:rPr>
@@ -5554,7 +5576,7 @@
           <w14:ligatures w14:val="standardContextual"/>
         </w:rPr>
       </w:pPr>
-      <w:hyperlink w:anchor="_Toc243835834" w:history="1">
+      <w:hyperlink w:anchor="_Toc243838008" w:history="1">
         <w:r>
           <w:rPr>
             <w:rStyle w:val="Hipervnculo"/>
@@ -5581,7 +5603,7 @@
             <w:noProof/>
             <w:webHidden/>
           </w:rPr>
-          <w:instrText xml:space="preserve"> PAGEREF _Toc243835834 \h </w:instrText>
+          <w:instrText xml:space="preserve"> PAGEREF _Toc243838008 \h </w:instrText>
         </w:r>
         <w:r>
           <w:rPr>
@@ -5628,7 +5650,7 @@
           <w14:ligatures w14:val="standardContextual"/>
         </w:rPr>
       </w:pPr>
-      <w:hyperlink w:anchor="_Toc243835835" w:history="1">
+      <w:hyperlink w:anchor="_Toc243838009" w:history="1">
         <w:r>
           <w:rPr>
             <w:rStyle w:val="Hipervnculo"/>
@@ -5655,7 +5677,7 @@
             <w:noProof/>
             <w:webHidden/>
           </w:rPr>
-          <w:instrText xml:space="preserve"> PAGEREF _Toc243835835 \h </w:instrText>
+          <w:instrText xml:space="preserve"> PAGEREF _Toc243838009 \h </w:instrText>
         </w:r>
         <w:r>
           <w:rPr>
@@ -5702,7 +5724,7 @@
           <w14:ligatures w14:val="standardContextual"/>
         </w:rPr>
       </w:pPr>
-      <w:hyperlink w:anchor="_Toc243835836" w:history="1">
+      <w:hyperlink w:anchor="_Toc243838010" w:history="1">
         <w:r>
           <w:rPr>
             <w:rStyle w:val="Hipervnculo"/>
@@ -5729,7 +5751,7 @@
             <w:noProof/>
             <w:webHidden/>
           </w:rPr>
-          <w:instrText xml:space="preserve"> PAGEREF _Toc243835836 \h </w:instrText>
+          <w:instrText xml:space="preserve"> PAGEREF _Toc243838010 \h </w:instrText>
         </w:r>
         <w:r>
           <w:rPr>
@@ -5776,7 +5798,7 @@
           <w14:ligatures w14:val="standardContextual"/>
         </w:rPr>
       </w:pPr>
-      <w:hyperlink w:anchor="_Toc243835837" w:history="1">
+      <w:hyperlink w:anchor="_Toc243838011" w:history="1">
         <w:r>
           <w:rPr>
             <w:rStyle w:val="Hipervnculo"/>
@@ -5803,7 +5825,7 @@
             <w:noProof/>
             <w:webHidden/>
           </w:rPr>
-          <w:instrText xml:space="preserve"> PAGEREF _Toc243835837 \h </w:instrText>
+          <w:instrText xml:space="preserve"> PAGEREF _Toc243838011 \h </w:instrText>
         </w:r>
         <w:r>
           <w:rPr>
@@ -5850,7 +5872,7 @@
           <w14:ligatures w14:val="standardContextual"/>
         </w:rPr>
       </w:pPr>
-      <w:hyperlink w:anchor="_Toc243835838" w:history="1">
+      <w:hyperlink w:anchor="_Toc243838012" w:history="1">
         <w:r>
           <w:rPr>
             <w:rStyle w:val="Hipervnculo"/>
@@ -5877,7 +5899,7 @@
             <w:noProof/>
             <w:webHidden/>
           </w:rPr>
-          <w:instrText xml:space="preserve"> PAGEREF _Toc243835838 \h </w:instrText>
+          <w:instrText xml:space="preserve"> PAGEREF _Toc243838012 \h </w:instrText>
         </w:r>
         <w:r>
           <w:rPr>
@@ -5924,7 +5946,7 @@
           <w14:ligatures w14:val="standardContextual"/>
         </w:rPr>
       </w:pPr>
-      <w:hyperlink w:anchor="_Toc243835839" w:history="1">
+      <w:hyperlink w:anchor="_Toc243838013" w:history="1">
         <w:r>
           <w:rPr>
             <w:rStyle w:val="Hipervnculo"/>
@@ -5951,7 +5973,7 @@
             <w:noProof/>
             <w:webHidden/>
           </w:rPr>
-          <w:instrText xml:space="preserve"> PAGEREF _Toc243835839 \h </w:instrText>
+          <w:instrText xml:space="preserve"> PAGEREF _Toc243838013 \h </w:instrText>
         </w:r>
         <w:r>
           <w:rPr>
@@ -5998,7 +6020,7 @@
           <w14:ligatures w14:val="standardContextual"/>
         </w:rPr>
       </w:pPr>
-      <w:hyperlink w:anchor="_Toc243835840" w:history="1">
+      <w:hyperlink w:anchor="_Toc243838014" w:history="1">
         <w:r>
           <w:rPr>
             <w:rStyle w:val="Hipervnculo"/>
@@ -6025,7 +6047,7 @@
             <w:noProof/>
             <w:webHidden/>
           </w:rPr>
-          <w:instrText xml:space="preserve"> PAGEREF _Toc243835840 \h </w:instrText>
+          <w:instrText xml:space="preserve"> PAGEREF _Toc243838014 \h </w:instrText>
         </w:r>
         <w:r>
           <w:rPr>
@@ -6072,7 +6094,7 @@
           <w14:ligatures w14:val="standardContextual"/>
         </w:rPr>
       </w:pPr>
-      <w:hyperlink w:anchor="_Toc243835841" w:history="1">
+      <w:hyperlink w:anchor="_Toc243838015" w:history="1">
         <w:r>
           <w:rPr>
             <w:rStyle w:val="Hipervnculo"/>
@@ -6099,7 +6121,7 @@
             <w:noProof/>
             <w:webHidden/>
           </w:rPr>
-          <w:instrText xml:space="preserve"> PAGEREF _Toc243835841 \h </w:instrText>
+          <w:instrText xml:space="preserve"> PAGEREF _Toc243838015 \h </w:instrText>
         </w:r>
         <w:r>
           <w:rPr>
@@ -6146,7 +6168,7 @@
           <w14:ligatures w14:val="standardContextual"/>
         </w:rPr>
       </w:pPr>
-      <w:hyperlink w:anchor="_Toc243835842" w:history="1">
+      <w:hyperlink w:anchor="_Toc243838016" w:history="1">
         <w:r>
           <w:rPr>
             <w:rStyle w:val="Hipervnculo"/>
@@ -6173,7 +6195,7 @@
             <w:noProof/>
             <w:webHidden/>
           </w:rPr>
-          <w:instrText xml:space="preserve"> PAGEREF _Toc243835842 \h </w:instrText>
+          <w:instrText xml:space="preserve"> PAGEREF _Toc243838016 \h </w:instrText>
         </w:r>
         <w:r>
           <w:rPr>
@@ -6220,7 +6242,7 @@
           <w14:ligatures w14:val="standardContextual"/>
         </w:rPr>
       </w:pPr>
-      <w:hyperlink w:anchor="_Toc243835843" w:history="1">
+      <w:hyperlink w:anchor="_Toc243838017" w:history="1">
         <w:r>
           <w:rPr>
             <w:rStyle w:val="Hipervnculo"/>
@@ -6247,7 +6269,7 @@
             <w:noProof/>
             <w:webHidden/>
           </w:rPr>
-          <w:instrText xml:space="preserve"> PAGEREF _Toc243835843 \h </w:instrText>
+          <w:instrText xml:space="preserve"> PAGEREF _Toc243838017 \h </w:instrText>
         </w:r>
         <w:r>
           <w:rPr>
@@ -6294,7 +6316,7 @@
           <w14:ligatures w14:val="standardContextual"/>
         </w:rPr>
       </w:pPr>
-      <w:hyperlink w:anchor="_Toc243835844" w:history="1">
+      <w:hyperlink w:anchor="_Toc243838018" w:history="1">
         <w:r>
           <w:rPr>
             <w:rStyle w:val="Hipervnculo"/>
@@ -6321,7 +6343,7 @@
             <w:noProof/>
             <w:webHidden/>
           </w:rPr>
-          <w:instrText xml:space="preserve"> PAGEREF _Toc243835844 \h </w:instrText>
+          <w:instrText xml:space="preserve"> PAGEREF _Toc243838018 \h </w:instrText>
         </w:r>
         <w:r>
           <w:rPr>
@@ -6368,7 +6390,7 @@
           <w14:ligatures w14:val="standardContextual"/>
         </w:rPr>
       </w:pPr>
-      <w:hyperlink w:anchor="_Toc243835845" w:history="1">
+      <w:hyperlink w:anchor="_Toc243838019" w:history="1">
         <w:r>
           <w:rPr>
             <w:rStyle w:val="Hipervnculo"/>
@@ -6395,7 +6417,7 @@
             <w:noProof/>
             <w:webHidden/>
           </w:rPr>
-          <w:instrText xml:space="preserve"> PAGEREF _Toc243835845 \h </w:instrText>
+          <w:instrText xml:space="preserve"> PAGEREF _Toc243838019 \h </w:instrText>
         </w:r>
         <w:r>
           <w:rPr>
@@ -6442,7 +6464,7 @@
           <w14:ligatures w14:val="standardContextual"/>
         </w:rPr>
       </w:pPr>
-      <w:hyperlink w:anchor="_Toc243835846" w:history="1">
+      <w:hyperlink w:anchor="_Toc243838020" w:history="1">
         <w:r>
           <w:rPr>
             <w:rStyle w:val="Hipervnculo"/>
@@ -6469,7 +6491,7 @@
             <w:noProof/>
             <w:webHidden/>
           </w:rPr>
-          <w:instrText xml:space="preserve"> PAGEREF _Toc243835846 \h </w:instrText>
+          <w:instrText xml:space="preserve"> PAGEREF _Toc243838020 \h </w:instrText>
         </w:r>
         <w:r>
           <w:rPr>
@@ -6516,7 +6538,7 @@
           <w14:ligatures w14:val="standardContextual"/>
         </w:rPr>
       </w:pPr>
-      <w:hyperlink w:anchor="_Toc243835847" w:history="1">
+      <w:hyperlink w:anchor="_Toc243838021" w:history="1">
         <w:r>
           <w:rPr>
             <w:rStyle w:val="Hipervnculo"/>
@@ -6543,7 +6565,7 @@
             <w:noProof/>
             <w:webHidden/>
           </w:rPr>
-          <w:instrText xml:space="preserve"> PAGEREF _Toc243835847 \h </w:instrText>
+          <w:instrText xml:space="preserve"> PAGEREF _Toc243838021 \h </w:instrText>
         </w:r>
         <w:r>
           <w:rPr>
@@ -6590,7 +6612,7 @@
           <w14:ligatures w14:val="standardContextual"/>
         </w:rPr>
       </w:pPr>
-      <w:hyperlink w:anchor="_Toc243835848" w:history="1">
+      <w:hyperlink w:anchor="_Toc243838022" w:history="1">
         <w:r>
           <w:rPr>
             <w:rStyle w:val="Hipervnculo"/>
@@ -6617,7 +6639,7 @@
             <w:noProof/>
             <w:webHidden/>
           </w:rPr>
-          <w:instrText xml:space="preserve"> PAGEREF _Toc243835848 \h </w:instrText>
+          <w:instrText xml:space="preserve"> PAGEREF _Toc243838022 \h </w:instrText>
         </w:r>
         <w:r>
           <w:rPr>
@@ -6664,7 +6686,7 @@
           <w14:ligatures w14:val="standardContextual"/>
         </w:rPr>
       </w:pPr>
-      <w:hyperlink w:anchor="_Toc243835849" w:history="1">
+      <w:hyperlink w:anchor="_Toc243838023" w:history="1">
         <w:r>
           <w:rPr>
             <w:rStyle w:val="Hipervnculo"/>
@@ -6691,7 +6713,7 @@
             <w:noProof/>
             <w:webHidden/>
           </w:rPr>
-          <w:instrText xml:space="preserve"> PAGEREF _Toc243835849 \h </w:instrText>
+          <w:instrText xml:space="preserve"> PAGEREF _Toc243838023 \h </w:instrText>
         </w:r>
         <w:r>
           <w:rPr>
@@ -6738,7 +6760,7 @@
           <w14:ligatures w14:val="standardContextual"/>
         </w:rPr>
       </w:pPr>
-      <w:hyperlink w:anchor="_Toc243835850" w:history="1">
+      <w:hyperlink w:anchor="_Toc243838024" w:history="1">
         <w:r>
           <w:rPr>
             <w:rStyle w:val="Hipervnculo"/>
@@ -6765,7 +6787,7 @@
             <w:noProof/>
             <w:webHidden/>
           </w:rPr>
-          <w:instrText xml:space="preserve"> PAGEREF _Toc243835850 \h </w:instrText>
+          <w:instrText xml:space="preserve"> PAGEREF _Toc243838024 \h </w:instrText>
         </w:r>
         <w:r>
           <w:rPr>
@@ -6812,7 +6834,7 @@
           <w14:ligatures w14:val="standardContextual"/>
         </w:rPr>
       </w:pPr>
-      <w:hyperlink w:anchor="_Toc243835851" w:history="1">
+      <w:hyperlink w:anchor="_Toc243838025" w:history="1">
         <w:r>
           <w:rPr>
             <w:rStyle w:val="Hipervnculo"/>
@@ -6839,7 +6861,7 @@
             <w:noProof/>
             <w:webHidden/>
           </w:rPr>
-          <w:instrText xml:space="preserve"> PAGEREF _Toc243835851 \h </w:instrText>
+          <w:instrText xml:space="preserve"> PAGEREF _Toc243838025 \h </w:instrText>
         </w:r>
         <w:r>
           <w:rPr>
@@ -6886,7 +6908,7 @@
           <w14:ligatures w14:val="standardContextual"/>
         </w:rPr>
       </w:pPr>
-      <w:hyperlink w:anchor="_Toc243835852" w:history="1">
+      <w:hyperlink w:anchor="_Toc243838026" w:history="1">
         <w:r>
           <w:rPr>
             <w:rStyle w:val="Hipervnculo"/>
@@ -6913,7 +6935,7 @@
             <w:noProof/>
             <w:webHidden/>
           </w:rPr>
-          <w:instrText xml:space="preserve"> PAGEREF _Toc243835852 \h </w:instrText>
+          <w:instrText xml:space="preserve"> PAGEREF _Toc243838026 \h </w:instrText>
         </w:r>
         <w:r>
           <w:rPr>
@@ -6960,7 +6982,7 @@
           <w14:ligatures w14:val="standardContextual"/>
         </w:rPr>
       </w:pPr>
-      <w:hyperlink w:anchor="_Toc243835853" w:history="1">
+      <w:hyperlink w:anchor="_Toc243838027" w:history="1">
         <w:r>
           <w:rPr>
             <w:rStyle w:val="Hipervnculo"/>
@@ -6987,7 +7009,7 @@
             <w:noProof/>
             <w:webHidden/>
           </w:rPr>
-          <w:instrText xml:space="preserve"> PAGEREF _Toc243835853 \h </w:instrText>
+          <w:instrText xml:space="preserve"> PAGEREF _Toc243838027 \h </w:instrText>
         </w:r>
         <w:r>
           <w:rPr>
@@ -7034,7 +7056,7 @@
           <w14:ligatures w14:val="standardContextual"/>
         </w:rPr>
       </w:pPr>
-      <w:hyperlink w:anchor="_Toc243835854" w:history="1">
+      <w:hyperlink w:anchor="_Toc243838028" w:history="1">
         <w:r>
           <w:rPr>
             <w:rStyle w:val="Hipervnculo"/>
@@ -7061,7 +7083,7 @@
             <w:noProof/>
             <w:webHidden/>
           </w:rPr>
-          <w:instrText xml:space="preserve"> PAGEREF _Toc243835854 \h </w:instrText>
+          <w:instrText xml:space="preserve"> PAGEREF _Toc243838028 \h </w:instrText>
         </w:r>
         <w:r>
           <w:rPr>
@@ -7108,7 +7130,7 @@
           <w14:ligatures w14:val="standardContextual"/>
         </w:rPr>
       </w:pPr>
-      <w:hyperlink w:anchor="_Toc243835855" w:history="1">
+      <w:hyperlink w:anchor="_Toc243838029" w:history="1">
         <w:r>
           <w:rPr>
             <w:rStyle w:val="Hipervnculo"/>
@@ -7135,7 +7157,7 @@
             <w:noProof/>
             <w:webHidden/>
           </w:rPr>
-          <w:instrText xml:space="preserve"> PAGEREF _Toc243835855 \h </w:instrText>
+          <w:instrText xml:space="preserve"> PAGEREF _Toc243838029 \h </w:instrText>
         </w:r>
         <w:r>
           <w:rPr>
@@ -7182,63 +7204,55 @@
           <w14:ligatures w14:val="standardContextual"/>
         </w:rPr>
       </w:pPr>
-      <w:hyperlink w:anchor="_Toc243835856" w:history="1">
-        <w:r>
-          <w:rPr>
-            <w:rStyle w:val="Hipervnculo"/>
-            <w:noProof/>
-          </w:rPr>
-          <w:t>6.3.5. Consideración final</w:t>
-        </w:r>
-        <w:r>
-          <w:rPr>
-            <w:noProof/>
-            <w:webHidden/>
-          </w:rPr>
-          <w:tab/>
-        </w:r>
-        <w:r>
-          <w:rPr>
-            <w:noProof/>
-            <w:webHidden/>
-          </w:rPr>
-          <w:fldChar w:fldCharType="begin"/>
-        </w:r>
-        <w:r>
-          <w:rPr>
-            <w:noProof/>
-            <w:webHidden/>
-          </w:rPr>
-          <w:instrText xml:space="preserve"> PAGEREF _Toc243835856 \h </w:instrText>
-        </w:r>
-        <w:r>
-          <w:rPr>
-            <w:noProof/>
-            <w:webHidden/>
-          </w:rPr>
-        </w:r>
-        <w:r>
-          <w:rPr>
-            <w:noProof/>
-            <w:webHidden/>
-          </w:rPr>
-          <w:fldChar w:fldCharType="separate"/>
-        </w:r>
-        <w:r>
-          <w:rPr>
-            <w:noProof/>
-            <w:webHidden/>
-          </w:rPr>
-          <w:t>81</w:t>
-        </w:r>
-        <w:r>
-          <w:rPr>
-            <w:noProof/>
-            <w:webHidden/>
-          </w:rPr>
-          <w:fldChar w:fldCharType="end"/>
-        </w:r>
-      </w:hyperlink>
+      <w:r>
+        <w:t>6.3.5. Operación, MLOps y control de deriva</w:t>
+        <w:tab/>
+        <w:t>83</w:t>
+      </w:r>
+    </w:p>
+    <w:p>
+      <w:pPr>
+        <w:pStyle w:val="TDC3"/>
+        <w:tabs>
+          <w:tab w:val="right" w:leader="dot" w:pos="9628"/>
+        </w:tabs>
+        <w:rPr>
+          <w:rFonts w:asciiTheme="minorHAnsi" w:eastAsiaTheme="minorEastAsia" w:hAnsiTheme="minorHAnsi" w:cstheme="minorBidi"/>
+          <w:noProof/>
+          <w:color w:val="auto"/>
+          <w:kern w:val="2"/>
+          <w:sz w:val="24"/>
+          <w:szCs w:val="24"/>
+          <w14:ligatures w14:val="standardContextual"/>
+        </w:rPr>
+      </w:pPr>
+      <w:r>
+        <w:t>6.3.6. Ciencia abierta y principios FAIR</w:t>
+        <w:tab/>
+        <w:t>84</w:t>
+      </w:r>
+    </w:p>
+    <w:p>
+      <w:pPr>
+        <w:pStyle w:val="TDC3"/>
+        <w:tabs>
+          <w:tab w:val="right" w:leader="dot" w:pos="9628"/>
+        </w:tabs>
+        <w:rPr>
+          <w:rFonts w:asciiTheme="minorHAnsi" w:eastAsiaTheme="minorEastAsia" w:hAnsiTheme="minorHAnsi" w:cstheme="minorBidi"/>
+          <w:noProof/>
+          <w:color w:val="auto"/>
+          <w:kern w:val="2"/>
+          <w:sz w:val="24"/>
+          <w:szCs w:val="24"/>
+          <w14:ligatures w14:val="standardContextual"/>
+        </w:rPr>
+      </w:pPr>
+      <w:r>
+        <w:t>6.3.7. Consideración final</w:t>
+        <w:tab/>
+        <w:t>84</w:t>
+      </w:r>
     </w:p>
     <w:p>
       <w:pPr>
@@ -7256,7 +7270,7 @@
           <w14:ligatures w14:val="standardContextual"/>
         </w:rPr>
       </w:pPr>
-      <w:hyperlink w:anchor="_Toc243835857" w:history="1">
+      <w:hyperlink w:anchor="_Toc243838031" w:history="1">
         <w:r>
           <w:rPr>
             <w:rStyle w:val="Hipervnculo"/>
@@ -7283,7 +7297,7 @@
             <w:noProof/>
             <w:webHidden/>
           </w:rPr>
-          <w:instrText xml:space="preserve"> PAGEREF _Toc243835857 \h </w:instrText>
+          <w:instrText xml:space="preserve"> PAGEREF _Toc243838031 \h </w:instrText>
         </w:r>
         <w:r>
           <w:rPr>
@@ -7330,7 +7344,7 @@
           <w14:ligatures w14:val="standardContextual"/>
         </w:rPr>
       </w:pPr>
-      <w:hyperlink w:anchor="_Toc243835858" w:history="1">
+      <w:hyperlink w:anchor="_Toc243838032" w:history="1">
         <w:r>
           <w:rPr>
             <w:rStyle w:val="Hipervnculo"/>
@@ -7357,7 +7371,7 @@
             <w:noProof/>
             <w:webHidden/>
           </w:rPr>
-          <w:instrText xml:space="preserve"> PAGEREF _Toc243835858 \h </w:instrText>
+          <w:instrText xml:space="preserve"> PAGEREF _Toc243838032 \h </w:instrText>
         </w:r>
         <w:r>
           <w:rPr>
@@ -7377,7 +7391,7 @@
             <w:noProof/>
             <w:webHidden/>
           </w:rPr>
-          <w:t>85</w:t>
+          <w:t>86</w:t>
         </w:r>
         <w:r>
           <w:rPr>
@@ -7404,7 +7418,7 @@
           <w14:ligatures w14:val="standardContextual"/>
         </w:rPr>
       </w:pPr>
-      <w:hyperlink w:anchor="_Toc243835859" w:history="1">
+      <w:hyperlink w:anchor="_Toc243838033" w:history="1">
         <w:r>
           <w:rPr>
             <w:rStyle w:val="Hipervnculo"/>
@@ -7431,7 +7445,7 @@
             <w:noProof/>
             <w:webHidden/>
           </w:rPr>
-          <w:instrText xml:space="preserve"> PAGEREF _Toc243835859 \h </w:instrText>
+          <w:instrText xml:space="preserve"> PAGEREF _Toc243838033 \h </w:instrText>
         </w:r>
         <w:r>
           <w:rPr>
@@ -7451,7 +7465,7 @@
             <w:noProof/>
             <w:webHidden/>
           </w:rPr>
-          <w:t>85</w:t>
+          <w:t>86</w:t>
         </w:r>
         <w:r>
           <w:rPr>
@@ -7478,7 +7492,7 @@
           <w14:ligatures w14:val="standardContextual"/>
         </w:rPr>
       </w:pPr>
-      <w:hyperlink w:anchor="_Toc243835860" w:history="1">
+      <w:hyperlink w:anchor="_Toc243838034" w:history="1">
         <w:r>
           <w:rPr>
             <w:rStyle w:val="Hipervnculo"/>
@@ -7505,7 +7519,7 @@
             <w:noProof/>
             <w:webHidden/>
           </w:rPr>
-          <w:instrText xml:space="preserve"> PAGEREF _Toc243835860 \h </w:instrText>
+          <w:instrText xml:space="preserve"> PAGEREF _Toc243838034 \h </w:instrText>
         </w:r>
         <w:r>
           <w:rPr>
@@ -7525,7 +7539,7 @@
             <w:noProof/>
             <w:webHidden/>
           </w:rPr>
-          <w:t>85</w:t>
+          <w:t>86</w:t>
         </w:r>
         <w:r>
           <w:rPr>
@@ -7800,9 +7814,249 @@
         <w:pStyle w:val="EntradadendiceTFM"/>
       </w:pPr>
       <w:r>
+        <w:t>Tabla 4.17. Variables con mayor contribución media absoluta en la prueba temporal.</w:t>
+        <w:tab/>
+        <w:t>55</w:t>
+      </w:r>
+    </w:p>
+    <w:p>
+      <w:pPr>
+        <w:pStyle w:val="EntradadendiceTFM"/>
+      </w:pPr>
+      <w:r>
         <w:t>Tabla 5.1. Reglas aplicadas por el motor de recomendación.</w:t>
-      </w:r>
-      <w:r>
+        <w:tab/>
+        <w:t>60</w:t>
+      </w:r>
+    </w:p>
+    <w:p>
+      <w:pPr>
+        <w:pStyle w:val="EntradadendiceTFM"/>
+      </w:pPr>
+      <w:r>
+        <w:t>Tabla 5.2. Planificación emitida el 28 de junio de 2025 frente a la referencia SiAR.</w:t>
+        <w:tab/>
+        <w:t>65</w:t>
+      </w:r>
+    </w:p>
+    <w:p>
+      <w:pPr>
+        <w:pStyle w:val="EntradadendiceTFM"/>
+      </w:pPr>
+      <w:r>
+        <w:t>Tabla 5.3. MAE medio de los horizontes 1 a 7 según la ventana de ET0 (mm/día).</w:t>
+        <w:tab/>
+        <w:t>67</w:t>
+      </w:r>
+    </w:p>
+    <w:p>
+      <w:pPr>
+        <w:pStyle w:val="EntradadendiceTFM"/>
+      </w:pPr>
+      <w:r>
+        <w:t>Tabla 5.4. Error de la recomendación a un día frente a la referencia SiAR.</w:t>
+        <w:tab/>
+        <w:t>68</w:t>
+      </w:r>
+    </w:p>
+    <w:p>
+      <w:pPr>
+        <w:pStyle w:val="EntradadendiceTFM"/>
+      </w:pPr>
+      <w:r>
+        <w:t>Tabla 5.5. MAE diario según el día del horizonte (mm/día).</w:t>
+        <w:tab/>
+        <w:t>70</w:t>
+      </w:r>
+    </w:p>
+    <w:p>
+      <w:pPr>
+        <w:pStyle w:val="EntradadendiceTFM"/>
+      </w:pPr>
+      <w:r>
+        <w:t>Tabla 5.6. Dosis bruta de los 148 días con referencia válida según el sistema de riego.</w:t>
+        <w:tab/>
+        <w:t>72</w:t>
+      </w:r>
+    </w:p>
+    <w:p>
+      <w:pPr>
+        <w:pStyle w:val="EntradadendiceTFM"/>
+      </w:pPr>
+      <w:r>
+        <w:t>Tabla 5.7. Escenarios de validación del comportamiento del sistema.</w:t>
+        <w:tab/>
+        <w:t>73</w:t>
+      </w:r>
+    </w:p>
+    <w:p>
+      <w:pPr>
+        <w:pStyle w:val="EntradadendiceTFM"/>
+      </w:pPr>
+      <w:r>
+        <w:t>Tabla 6.1. Grado de cumplimiento de los objetivos específicos.</w:t>
+        <w:tab/>
+        <w:t>76</w:t>
+      </w:r>
+    </w:p>
+    <w:p>
+      <w:pPr>
+        <w:pStyle w:val="EntradadendiceTFM"/>
+      </w:pPr>
+      <w:r>
+        <w:t>Tabla 6.2. Limitaciones del piloto, alcance de las conclusiones y línea de mejora asociada.</w:t>
+        <w:tab/>
+        <w:t>79</w:t>
+      </w:r>
+    </w:p>
+    <w:p>
+      <w:pPr>
+        <w:pStyle w:val="EntradadendiceTFM"/>
+      </w:pPr>
+      <w:r>
+        <w:t>Tabla A.1. Rutas del repositorio para reproducir y contrastar los resultados.</w:t>
+        <w:tab/>
+        <w:t>89</w:t>
+      </w:r>
+    </w:p>
+    <w:p>
+      <w:r>
+        <w:br w:type="page"/>
+      </w:r>
+    </w:p>
+    <w:p>
+      <w:pPr>
+        <w:pStyle w:val="PreliminarTFM"/>
+      </w:pPr>
+      <w:r>
+        <w:lastRenderedPageBreak/>
+        <w:t>Índice de figuras</w:t>
+      </w:r>
+    </w:p>
+    <w:p>
+      <w:pPr>
+        <w:pStyle w:val="EntradadendiceTFM"/>
+      </w:pPr>
+      <w:r>
+        <w:t>Figura 3.1. Arquitectura del prototipo. Las cajas azules representan componentes implementados y las cajas discontinuas identifican extensiones previstas.</w:t>
+      </w:r>
+      <w:r>
+        <w:tab/>
+        <w:t>24</w:t>
+      </w:r>
+    </w:p>
+    <w:p>
+      <w:pPr>
+        <w:pStyle w:val="EntradadendiceTFM"/>
+      </w:pPr>
+      <w:r>
+        <w:t>Figura 4.1. ETL del caso piloto desde su configuración hasta la tabla analítica. Los gráficos inferiores utilizan datos reales de la extracción del 24 de septiembre de 2026.</w:t>
+      </w:r>
+      <w:r>
+        <w:tab/>
+        <w:t>29</w:t>
+      </w:r>
+    </w:p>
+    <w:p>
+      <w:pPr>
+        <w:pStyle w:val="EntradadendiceTFM"/>
+      </w:pPr>
+      <w:r>
+        <w:t>Figura 4.2. Valores ausentes y continuidad del calendario en la tabla analítica del piloto. Fuente: elaboración propia a partir de SiAR.</w:t>
+      </w:r>
+      <w:r>
+        <w:tab/>
+        <w:t>41</w:t>
+      </w:r>
+    </w:p>
+    <w:p>
+      <w:pPr>
+        <w:pStyle w:val="EntradadendiceTFM"/>
+      </w:pPr>
+      <w:r>
+        <w:t>Figura 4.3. Evolución de ET0, ETc, necesidad neta, Kc y precipitación efectiva. Fuente: elaboración propia a partir de SiAR.</w:t>
+      </w:r>
+      <w:r>
+        <w:tab/>
+        <w:t>42</w:t>
+      </w:r>
+    </w:p>
+    <w:p>
+      <w:pPr>
+        <w:pStyle w:val="EntradadendiceTFM"/>
+      </w:pPr>
+      <w:r>
+        <w:t>Figura 4.4. Distribución de temperatura, humedad, ET0 y necesidad neta. Fuente: elaboración propia a partir de SiAR.</w:t>
+      </w:r>
+      <w:r>
+        <w:tab/>
+        <w:t>43</w:t>
+      </w:r>
+    </w:p>
+    <w:p>
+      <w:pPr>
+        <w:pStyle w:val="EntradadendiceTFM"/>
+      </w:pPr>
+      <w:r>
+        <w:t>Figura 4.5. Matriz de correlaciones de Pearson para variables seleccionadas. Fuente: elaboración propia a partir de SiAR.</w:t>
+      </w:r>
+      <w:r>
+        <w:tab/>
+        <w:t>44</w:t>
+      </w:r>
+    </w:p>
+    <w:p>
+      <w:pPr>
+        <w:pStyle w:val="EntradadendiceTFM"/>
+      </w:pPr>
+      <w:r>
+        <w:t>Figura 4.6. Estabilidad temporal de los modelos durante la validación y comparación con la prueba final.</w:t>
+      </w:r>
+      <w:r>
+        <w:tab/>
+        <w:t>50</w:t>
+      </w:r>
+    </w:p>
+    <w:p>
+      <w:pPr>
+        <w:pStyle w:val="EntradadendiceTFM"/>
+      </w:pPr>
+      <w:r>
+        <w:t>Figura 4.7. Predicciones y errores diarios de los seis enfoques en el tramo de prueba.</w:t>
+      </w:r>
+      <w:r>
+        <w:tab/>
+        <w:t>51</w:t>
+      </w:r>
+    </w:p>
+    <w:p>
+      <w:pPr>
+        <w:pStyle w:val="EntradadendiceTFM"/>
+      </w:pPr>
+      <w:r>
+        <w:t>Figura 4.8. Error del modelo elegido en validación temporal y prueba final para seis casos.</w:t>
+      </w:r>
+      <w:r>
+        <w:tab/>
+        <w:t>53</w:t>
+      </w:r>
+    </w:p>
+    <w:p>
+      <w:pPr>
+        <w:pStyle w:val="EntradadendiceTFM"/>
+      </w:pPr>
+      <w:r>
+        <w:t>Figura 4.9. Importancia global y explicaciones locales de Random Forest y XGBoost mediante TreeSHAP.</w:t>
+        <w:tab/>
+        <w:t>55</w:t>
+      </w:r>
+    </w:p>
+    <w:p>
+      <w:pPr>
+        <w:pStyle w:val="EntradadendiceTFM"/>
+      </w:pPr>
+      <w:r>
+        <w:t>Figura 5.1. Flujo simplificado del motor retrospectivo de 2025.</w:t>
         <w:tab/>
         <w:t>58</w:t>
       </w:r>
@@ -7812,11 +8066,9 @@
         <w:pStyle w:val="EntradadendiceTFM"/>
       </w:pPr>
       <w:r>
-        <w:t>Tabla 5.2. Planificación emitida el 28 de junio de 2025 frente a la referencia SiAR.</w:t>
-      </w:r>
-      <w:r>
+        <w:t>Figura 5.2. Captura de la interfaz anterior para la planificación histórica emitida el 28 de junio de 2025, con referencia SiAR superpuesta.</w:t>
         <w:tab/>
-        <w:t>63</w:t>
+        <w:t>64</w:t>
       </w:r>
     </w:p>
     <w:p>
@@ -7824,11 +8076,9 @@
         <w:pStyle w:val="EntradadendiceTFM"/>
       </w:pPr>
       <w:r>
-        <w:t>Tabla 5.3. MAE medio de los horizontes 1 a 7 según la ventana de ET0 (mm/día).</w:t>
-      </w:r>
-      <w:r>
+        <w:t>Figura 5.3. Recomendaciones emitidas cada día con la información del día anterior y error frente a la referencia SiAR.</w:t>
         <w:tab/>
-        <w:t>65</w:t>
+        <w:t>69</w:t>
       </w:r>
     </w:p>
     <w:p>
@@ -7836,33 +8086,7 @@
         <w:pStyle w:val="EntradadendiceTFM"/>
       </w:pPr>
       <w:r>
-        <w:t>Tabla 5.4. Error de la recomendación a un día frente a la referencia SiAR.</w:t>
-      </w:r>
-      <w:r>
-        <w:tab/>
-        <w:t>66</w:t>
-      </w:r>
-    </w:p>
-    <w:p>
-      <w:pPr>
-        <w:pStyle w:val="EntradadendiceTFM"/>
-      </w:pPr>
-      <w:r>
-        <w:t>Tabla 5.5. MAE diario según el día del horizonte (mm/día).</w:t>
-      </w:r>
-      <w:r>
-        <w:tab/>
-        <w:t>68</w:t>
-      </w:r>
-    </w:p>
-    <w:p>
-      <w:pPr>
-        <w:pStyle w:val="EntradadendiceTFM"/>
-      </w:pPr>
-      <w:r>
-        <w:t>Tabla 5.6. Dosis bruta de los 148 días con referencia válida según el sistema de riego.</w:t>
-      </w:r>
-      <w:r>
+        <w:t>Figura 5.4. MAE diario según el día del horizonte en los periodos de desarrollo y prueba.</w:t>
         <w:tab/>
         <w:t>70</w:t>
       </w:r>
@@ -7872,239 +8096,19 @@
         <w:pStyle w:val="EntradadendiceTFM"/>
       </w:pPr>
       <w:r>
-        <w:t>Tabla 5.7. Escenarios de validación del comportamiento del sistema.</w:t>
-      </w:r>
-      <w:r>
+        <w:t>Figura 5.5. Necesidad neta semanal planificada por el DSS frente a la referencia SiAR y dosis bruta para riego por goteo.</w:t>
         <w:tab/>
         <w:t>71</w:t>
       </w:r>
     </w:p>
     <w:p>
       <w:pPr>
-        <w:pStyle w:val="EntradadendiceTFM"/>
-      </w:pPr>
-      <w:r>
-        <w:t>Tabla 6.1. Grado de cumplimiento de los objetivos específicos.</w:t>
-      </w:r>
-      <w:r>
-        <w:tab/>
-        <w:t>74</w:t>
-      </w:r>
-    </w:p>
-    <w:p>
-      <w:pPr>
-        <w:pStyle w:val="EntradadendiceTFM"/>
-      </w:pPr>
-      <w:r>
-        <w:t>Tabla 6.2. Limitaciones del piloto, alcance de las conclusiones y línea de mejora asociada.</w:t>
-      </w:r>
-      <w:r>
-        <w:tab/>
-        <w:t>77</w:t>
-      </w:r>
-    </w:p>
-    <w:p>
-      <w:pPr>
-        <w:pStyle w:val="EntradadendiceTFM"/>
-      </w:pPr>
-      <w:r>
-        <w:t>Tabla A.1. Rutas del repositorio para reproducir y contrastar los resultados.</w:t>
-      </w:r>
-      <w:r>
-        <w:tab/>
-        <w:t>85</w:t>
-      </w:r>
-    </w:p>
-    <w:p>
+        <w:pStyle w:val="Ttulo1"/>
+      </w:pPr>
       <w:r>
         <w:br w:type="page"/>
       </w:r>
-    </w:p>
-    <w:p>
-      <w:pPr>
-        <w:pStyle w:val="PreliminarTFM"/>
-      </w:pPr>
-      <w:r>
-        <w:lastRenderedPageBreak/>
-        <w:t>Índice de figuras</w:t>
-      </w:r>
-    </w:p>
-    <w:p>
-      <w:pPr>
-        <w:pStyle w:val="EntradadendiceTFM"/>
-      </w:pPr>
-      <w:r>
-        <w:t>Figura 3.1. Arquitectura del prototipo. Las cajas azules representan componentes implementados y las cajas discontinuas identifican extensiones previstas.</w:t>
-      </w:r>
-      <w:r>
-        <w:tab/>
-        <w:t>24</w:t>
-      </w:r>
-    </w:p>
-    <w:p>
-      <w:pPr>
-        <w:pStyle w:val="EntradadendiceTFM"/>
-      </w:pPr>
-      <w:r>
-        <w:t>Figura 4.1. ETL del caso piloto desde su configuración hasta la tabla analítica. Los gráficos inferiores utilizan datos reales de la extracción del 24 de septiembre de 2026.</w:t>
-      </w:r>
-      <w:r>
-        <w:tab/>
-        <w:t>29</w:t>
-      </w:r>
-    </w:p>
-    <w:p>
-      <w:pPr>
-        <w:pStyle w:val="EntradadendiceTFM"/>
-      </w:pPr>
-      <w:r>
-        <w:t>Figura 4.2. Valores ausentes y continuidad del calendario en la tabla analítica del piloto. Fuente: elaboración propia a partir de SiAR.</w:t>
-      </w:r>
-      <w:r>
-        <w:tab/>
-        <w:t>41</w:t>
-      </w:r>
-    </w:p>
-    <w:p>
-      <w:pPr>
-        <w:pStyle w:val="EntradadendiceTFM"/>
-      </w:pPr>
-      <w:r>
-        <w:t>Figura 4.3. Evolución de ET0, ETc, necesidad neta, Kc y precipitación efectiva. Fuente: elaboración propia a partir de SiAR.</w:t>
-      </w:r>
-      <w:r>
-        <w:tab/>
-        <w:t>42</w:t>
-      </w:r>
-    </w:p>
-    <w:p>
-      <w:pPr>
-        <w:pStyle w:val="EntradadendiceTFM"/>
-      </w:pPr>
-      <w:r>
-        <w:t>Figura 4.4. Distribución de temperatura, humedad, ET0 y necesidad neta. Fuente: elaboración propia a partir de SiAR.</w:t>
-      </w:r>
-      <w:r>
-        <w:tab/>
-        <w:t>43</w:t>
-      </w:r>
-    </w:p>
-    <w:p>
-      <w:pPr>
-        <w:pStyle w:val="EntradadendiceTFM"/>
-      </w:pPr>
-      <w:r>
-        <w:t>Figura 4.5. Matriz de correlaciones de Pearson para variables seleccionadas. Fuente: elaboración propia a partir de SiAR.</w:t>
-      </w:r>
-      <w:r>
-        <w:tab/>
-        <w:t>44</w:t>
-      </w:r>
-    </w:p>
-    <w:p>
-      <w:pPr>
-        <w:pStyle w:val="EntradadendiceTFM"/>
-      </w:pPr>
-      <w:r>
-        <w:t>Figura 4.6. Estabilidad temporal de los modelos durante la validación y comparación con la prueba final.</w:t>
-      </w:r>
-      <w:r>
-        <w:tab/>
-        <w:t>50</w:t>
-      </w:r>
-    </w:p>
-    <w:p>
-      <w:pPr>
-        <w:pStyle w:val="EntradadendiceTFM"/>
-      </w:pPr>
-      <w:r>
-        <w:t>Figura 4.7. Predicciones y errores diarios de los seis enfoques en el tramo de prueba.</w:t>
-      </w:r>
-      <w:r>
-        <w:tab/>
-        <w:t>51</w:t>
-      </w:r>
-    </w:p>
-    <w:p>
-      <w:pPr>
-        <w:pStyle w:val="EntradadendiceTFM"/>
-      </w:pPr>
-      <w:r>
-        <w:t>Figura 4.8. Error del modelo elegido en validación temporal y prueba final para seis casos.</w:t>
-      </w:r>
-      <w:r>
-        <w:tab/>
-        <w:t>53</w:t>
-      </w:r>
-    </w:p>
-    <w:p>
-      <w:pPr>
-        <w:pStyle w:val="EntradadendiceTFM"/>
-      </w:pPr>
-      <w:r>
-        <w:t>Figura 5.1. Flujo simplificado del motor retrospectivo de 2025.</w:t>
-      </w:r>
-      <w:r>
-        <w:tab/>
-        <w:t>56</w:t>
-      </w:r>
-    </w:p>
-    <w:p>
-      <w:pPr>
-        <w:pStyle w:val="EntradadendiceTFM"/>
-      </w:pPr>
-      <w:r>
-        <w:t>Figura 5.2. Captura de la interfaz anterior para la planificación histórica emitida el 28 de junio de 2025, con referencia SiAR superpuesta.</w:t>
-      </w:r>
-      <w:r>
-        <w:tab/>
-        <w:t>62</w:t>
-      </w:r>
-    </w:p>
-    <w:p>
-      <w:pPr>
-        <w:pStyle w:val="EntradadendiceTFM"/>
-      </w:pPr>
-      <w:r>
-        <w:t>Figura 5.3. Recomendaciones emitidas cada día con la información del día anterior y error frente a la referencia SiAR.</w:t>
-      </w:r>
-      <w:r>
-        <w:tab/>
-        <w:t>67</w:t>
-      </w:r>
-    </w:p>
-    <w:p>
-      <w:pPr>
-        <w:pStyle w:val="EntradadendiceTFM"/>
-      </w:pPr>
-      <w:r>
-        <w:t>Figura 5.4. MAE diario según el día del horizonte en los periodos de desarrollo y prueba.</w:t>
-      </w:r>
-      <w:r>
-        <w:tab/>
-        <w:t>68</w:t>
-      </w:r>
-    </w:p>
-    <w:p>
-      <w:pPr>
-        <w:pStyle w:val="EntradadendiceTFM"/>
-      </w:pPr>
-      <w:r>
-        <w:t>Figura 5.5. Necesidad neta semanal planificada por el DSS frente a la referencia SiAR y dosis bruta para riego por goteo.</w:t>
-      </w:r>
-      <w:r>
-        <w:tab/>
-        <w:t>69</w:t>
-      </w:r>
-    </w:p>
-    <w:p>
-      <w:pPr>
-        <w:pStyle w:val="Ttulo1"/>
-      </w:pPr>
-      <w:r>
-        <w:br w:type="page"/>
-      </w:r>
-      <w:bookmarkStart w:id="1" w:name="_Toc243835764"/>
+      <w:bookmarkStart w:id="1" w:name="_Toc243837938"/>
       <w:r>
         <w:lastRenderedPageBreak/>
         <w:t>1. Introducción y objetivos</w:t>
@@ -8115,7 +8119,7 @@
       <w:pPr>
         <w:pStyle w:val="Ttulo2"/>
       </w:pPr>
-      <w:bookmarkStart w:id="2" w:name="_Toc243835765"/>
+      <w:bookmarkStart w:id="2" w:name="_Toc243837939"/>
       <w:r>
         <w:t>1.1. Contexto, motivación y justificación</w:t>
       </w:r>
@@ -8178,7 +8182,7 @@
       <w:pPr>
         <w:pStyle w:val="Ttulo2"/>
       </w:pPr>
-      <w:bookmarkStart w:id="3" w:name="_Toc243835766"/>
+      <w:bookmarkStart w:id="3" w:name="_Toc243837940"/>
       <w:r>
         <w:t>1.2. Objetivos generales y específicos</w:t>
       </w:r>
@@ -8240,7 +8244,7 @@
       <w:pPr>
         <w:pStyle w:val="Ttulo2"/>
       </w:pPr>
-      <w:bookmarkStart w:id="4" w:name="_Toc243835767"/>
+      <w:bookmarkStart w:id="4" w:name="_Toc243837941"/>
       <w:r>
         <w:t>1.3. Alcance, usuarios y limitaciones</w:t>
       </w:r>
@@ -8295,7 +8299,7 @@
         <w:pStyle w:val="Ttulo1"/>
         <w:pageBreakBefore/>
       </w:pPr>
-      <w:bookmarkStart w:id="5" w:name="_Toc243835768"/>
+      <w:bookmarkStart w:id="5" w:name="_Toc243837942"/>
       <w:r>
         <w:lastRenderedPageBreak/>
         <w:t>2. Marco teórico y estado del arte</w:t>
@@ -8306,7 +8310,7 @@
       <w:pPr>
         <w:pStyle w:val="Ttulo2"/>
       </w:pPr>
-      <w:bookmarkStart w:id="6" w:name="_Toc243835769"/>
+      <w:bookmarkStart w:id="6" w:name="_Toc243837943"/>
       <w:r>
         <w:t>2.1. Necesidades hídricas y gestión eficiente del riego</w:t>
       </w:r>
@@ -8374,7 +8378,7 @@
       <w:pPr>
         <w:pStyle w:val="Ttulo2"/>
       </w:pPr>
-      <w:bookmarkStart w:id="7" w:name="_Toc243835770"/>
+      <w:bookmarkStart w:id="7" w:name="_Toc243837944"/>
       <w:r>
         <w:t>2.2. Agricultura de precisión y aprendizaje automático</w:t>
       </w:r>
@@ -8439,7 +8443,7 @@
       <w:pPr>
         <w:pStyle w:val="Ttulo2"/>
       </w:pPr>
-      <w:bookmarkStart w:id="8" w:name="_Toc243835771"/>
+      <w:bookmarkStart w:id="8" w:name="_Toc243837945"/>
       <w:r>
         <w:t>2.3. Sistemas inteligentes de apoyo a la decisión</w:t>
       </w:r>
@@ -8503,7 +8507,7 @@
         <w:pStyle w:val="Ttulo1"/>
         <w:pageBreakBefore/>
       </w:pPr>
-      <w:bookmarkStart w:id="9" w:name="_Toc243835772"/>
+      <w:bookmarkStart w:id="9" w:name="_Toc243837946"/>
       <w:r>
         <w:lastRenderedPageBreak/>
         <w:t>3. Metodología y arquitectura del sistema</w:t>
@@ -8514,7 +8518,7 @@
       <w:pPr>
         <w:pStyle w:val="Ttulo2"/>
       </w:pPr>
-      <w:bookmarkStart w:id="10" w:name="_Toc243835773"/>
+      <w:bookmarkStart w:id="10" w:name="_Toc243837947"/>
       <w:r>
         <w:t>3.1. Fuentes, variables y calidad de los datos</w:t>
       </w:r>
@@ -8534,7 +8538,7 @@
       <w:pPr>
         <w:pStyle w:val="Ttulo3"/>
       </w:pPr>
-      <w:bookmarkStart w:id="11" w:name="_Toc243835774"/>
+      <w:bookmarkStart w:id="11" w:name="_Toc243837948"/>
       <w:r>
         <w:rPr>
           <w:sz w:val="24"/>
@@ -9204,7 +9208,7 @@
       <w:pPr>
         <w:pStyle w:val="Ttulo3"/>
       </w:pPr>
-      <w:bookmarkStart w:id="12" w:name="_Toc243835775"/>
+      <w:bookmarkStart w:id="12" w:name="_Toc243837949"/>
       <w:r>
         <w:rPr>
           <w:sz w:val="24"/>
@@ -9945,7 +9949,7 @@
       <w:pPr>
         <w:pStyle w:val="Ttulo3"/>
       </w:pPr>
-      <w:bookmarkStart w:id="13" w:name="_Toc243835776"/>
+      <w:bookmarkStart w:id="13" w:name="_Toc243837950"/>
       <w:r>
         <w:rPr>
           <w:sz w:val="24"/>
@@ -10054,7 +10058,7 @@
       <w:pPr>
         <w:pStyle w:val="Ttulo3"/>
       </w:pPr>
-      <w:bookmarkStart w:id="14" w:name="_Toc243835777"/>
+      <w:bookmarkStart w:id="14" w:name="_Toc243837951"/>
       <w:r>
         <w:rPr>
           <w:sz w:val="24"/>
@@ -10078,7 +10082,7 @@
       <w:pPr>
         <w:pStyle w:val="Ttulo2"/>
       </w:pPr>
-      <w:bookmarkStart w:id="15" w:name="_Toc243835778"/>
+      <w:bookmarkStart w:id="15" w:name="_Toc243837952"/>
       <w:r>
         <w:t>3.2. Arquitectura, tecnologías y flujo de información</w:t>
       </w:r>
@@ -10151,7 +10155,7 @@
       <w:pPr>
         <w:pStyle w:val="Ttulo3"/>
       </w:pPr>
-      <w:bookmarkStart w:id="16" w:name="_Toc243835779"/>
+      <w:bookmarkStart w:id="16" w:name="_Toc243837953"/>
       <w:r>
         <w:rPr>
           <w:sz w:val="24"/>
@@ -10288,7 +10292,7 @@
       <w:pPr>
         <w:pStyle w:val="Ttulo3"/>
       </w:pPr>
-      <w:bookmarkStart w:id="17" w:name="_Toc243835780"/>
+      <w:bookmarkStart w:id="17" w:name="_Toc243837954"/>
       <w:r>
         <w:rPr>
           <w:sz w:val="24"/>
@@ -11296,7 +11300,7 @@
       <w:pPr>
         <w:pStyle w:val="Ttulo3"/>
       </w:pPr>
-      <w:bookmarkStart w:id="18" w:name="_Toc243835781"/>
+      <w:bookmarkStart w:id="18" w:name="_Toc243837955"/>
       <w:r>
         <w:rPr>
           <w:sz w:val="24"/>
@@ -11319,7 +11323,7 @@
       <w:pPr>
         <w:pStyle w:val="Ttulo3"/>
       </w:pPr>
-      <w:bookmarkStart w:id="19" w:name="_Toc243835782"/>
+      <w:bookmarkStart w:id="19" w:name="_Toc243837956"/>
       <w:r>
         <w:rPr>
           <w:sz w:val="24"/>
@@ -11331,7 +11335,7 @@
     </w:p>
     <w:p>
       <w:r>
-        <w:t>Los módulos generan salidas reproducibles a partir de datos y parámetros conocidos. La suite reúne 103 pruebas definidas para extracción, protección de credenciales, escritura raw, normalización, calidad, variables, selección temporal, modelos de ETc y reglas del motor. Incluye controles para impedir el uso de información posterior a la consulta. Las figuras y resúmenes se regeneran desde los archivos del proyecto.</w:t>
+        <w:t>Los módulos generan salidas reproducibles a partir de datos y parámetros conocidos. La suite reúne 104 pruebas definidas para extracción, protección de credenciales, escritura raw, normalización, calidad, variables, selección temporal, modelos de ETc, explicabilidad XAI y reglas del motor. Incluye controles para impedir el uso de información posterior a la consulta. Las figuras y resúmenes se regeneran desde los archivos del proyecto.</w:t>
       </w:r>
     </w:p>
     <w:p>
@@ -11343,7 +11347,7 @@
       <w:pPr>
         <w:pStyle w:val="Ttulo2"/>
       </w:pPr>
-      <w:bookmarkStart w:id="20" w:name="_Toc243835783"/>
+      <w:bookmarkStart w:id="20" w:name="_Toc243837957"/>
       <w:r>
         <w:t>3.3. Planificación y organización del proyecto</w:t>
       </w:r>
@@ -11986,7 +11990,7 @@
         <w:pStyle w:val="Ttulo1"/>
         <w:pageBreakBefore/>
       </w:pPr>
-      <w:bookmarkStart w:id="21" w:name="_Toc243835784"/>
+      <w:bookmarkStart w:id="21" w:name="_Toc243837958"/>
       <w:r>
         <w:lastRenderedPageBreak/>
         <w:t>4. Procesamiento de datos y aprendizaje automático</w:t>
@@ -11997,7 +12001,7 @@
       <w:pPr>
         <w:pStyle w:val="Ttulo2"/>
       </w:pPr>
-      <w:bookmarkStart w:id="22" w:name="_Toc243835785"/>
+      <w:bookmarkStart w:id="22" w:name="_Toc243837959"/>
       <w:r>
         <w:t>4.1. Extracción, transformación y almacenamiento de datos</w:t>
       </w:r>
@@ -12078,7 +12082,7 @@
       <w:pPr>
         <w:pStyle w:val="Ttulo3"/>
       </w:pPr>
-      <w:bookmarkStart w:id="23" w:name="_Toc243835786"/>
+      <w:bookmarkStart w:id="23" w:name="_Toc243837960"/>
       <w:r>
         <w:rPr>
           <w:sz w:val="24"/>
@@ -12665,7 +12669,7 @@
       <w:pPr>
         <w:pStyle w:val="Ttulo3"/>
       </w:pPr>
-      <w:bookmarkStart w:id="24" w:name="_Toc243835787"/>
+      <w:bookmarkStart w:id="24" w:name="_Toc243837961"/>
       <w:r>
         <w:rPr>
           <w:sz w:val="24"/>
@@ -13133,7 +13137,7 @@
       <w:pPr>
         <w:pStyle w:val="Ttulo3"/>
       </w:pPr>
-      <w:bookmarkStart w:id="25" w:name="_Toc243835788"/>
+      <w:bookmarkStart w:id="25" w:name="_Toc243837962"/>
       <w:r>
         <w:rPr>
           <w:sz w:val="24"/>
@@ -13917,7 +13921,7 @@
       <w:pPr>
         <w:pStyle w:val="Ttulo3"/>
       </w:pPr>
-      <w:bookmarkStart w:id="26" w:name="_Toc243835789"/>
+      <w:bookmarkStart w:id="26" w:name="_Toc243837963"/>
       <w:r>
         <w:rPr>
           <w:sz w:val="24"/>
@@ -13993,7 +13997,7 @@
       <w:pPr>
         <w:pStyle w:val="Ttulo3"/>
       </w:pPr>
-      <w:bookmarkStart w:id="27" w:name="_Toc243835790"/>
+      <w:bookmarkStart w:id="27" w:name="_Toc243837964"/>
       <w:r>
         <w:rPr>
           <w:sz w:val="24"/>
@@ -14142,7 +14146,7 @@
       <w:pPr>
         <w:pStyle w:val="Ttulo3"/>
       </w:pPr>
-      <w:bookmarkStart w:id="28" w:name="_Toc243835791"/>
+      <w:bookmarkStart w:id="28" w:name="_Toc243837965"/>
       <w:r>
         <w:rPr>
           <w:sz w:val="24"/>
@@ -16753,7 +16757,7 @@
       <w:pPr>
         <w:pStyle w:val="Ttulo3"/>
       </w:pPr>
-      <w:bookmarkStart w:id="29" w:name="_Toc243835792"/>
+      <w:bookmarkStart w:id="29" w:name="_Toc243837966"/>
       <w:r>
         <w:rPr>
           <w:sz w:val="24"/>
@@ -18742,7 +18746,7 @@
       <w:pPr>
         <w:pStyle w:val="Ttulo3"/>
       </w:pPr>
-      <w:bookmarkStart w:id="30" w:name="_Toc243835793"/>
+      <w:bookmarkStart w:id="30" w:name="_Toc243837967"/>
       <w:r>
         <w:rPr>
           <w:sz w:val="24"/>
@@ -19494,7 +19498,7 @@
       <w:pPr>
         <w:pStyle w:val="Ttulo3"/>
       </w:pPr>
-      <w:bookmarkStart w:id="31" w:name="_Toc243835794"/>
+      <w:bookmarkStart w:id="31" w:name="_Toc243837968"/>
       <w:r>
         <w:rPr>
           <w:sz w:val="24"/>
@@ -19521,7 +19525,7 @@
       <w:pPr>
         <w:pStyle w:val="Ttulo3"/>
       </w:pPr>
-      <w:bookmarkStart w:id="32" w:name="_Toc243835795"/>
+      <w:bookmarkStart w:id="32" w:name="_Toc243837969"/>
       <w:r>
         <w:rPr>
           <w:sz w:val="24"/>
@@ -19575,7 +19579,7 @@
       <w:pPr>
         <w:pStyle w:val="Ttulo3"/>
       </w:pPr>
-      <w:bookmarkStart w:id="33" w:name="_Toc243835796"/>
+      <w:bookmarkStart w:id="33" w:name="_Toc243837970"/>
       <w:r>
         <w:rPr>
           <w:sz w:val="24"/>
@@ -19593,7 +19597,7 @@
       <w:pPr>
         <w:pStyle w:val="Ttulo2"/>
       </w:pPr>
-      <w:bookmarkStart w:id="34" w:name="_Toc243835797"/>
+      <w:bookmarkStart w:id="34" w:name="_Toc243837971"/>
       <w:r>
         <w:t>4.2. Análisis exploratorio y preparación de variables</w:t>
       </w:r>
@@ -19608,7 +19612,7 @@
       <w:pPr>
         <w:pStyle w:val="Ttulo3"/>
       </w:pPr>
-      <w:bookmarkStart w:id="35" w:name="_Toc243835798"/>
+      <w:bookmarkStart w:id="35" w:name="_Toc243837972"/>
       <w:r>
         <w:rPr>
           <w:sz w:val="24"/>
@@ -20141,7 +20145,7 @@
       <w:pPr>
         <w:pStyle w:val="Ttulo3"/>
       </w:pPr>
-      <w:bookmarkStart w:id="36" w:name="_Toc243835799"/>
+      <w:bookmarkStart w:id="36" w:name="_Toc243837973"/>
       <w:r>
         <w:rPr>
           <w:sz w:val="24"/>
@@ -21207,7 +21211,7 @@
       <w:pPr>
         <w:pStyle w:val="Ttulo3"/>
       </w:pPr>
-      <w:bookmarkStart w:id="37" w:name="_Toc243835800"/>
+      <w:bookmarkStart w:id="37" w:name="_Toc243837974"/>
       <w:r>
         <w:rPr>
           <w:sz w:val="24"/>
@@ -21294,7 +21298,7 @@
       <w:pPr>
         <w:pStyle w:val="Ttulo3"/>
       </w:pPr>
-      <w:bookmarkStart w:id="38" w:name="_Toc243835801"/>
+      <w:bookmarkStart w:id="38" w:name="_Toc243837975"/>
       <w:r>
         <w:rPr>
           <w:sz w:val="24"/>
@@ -21377,7 +21381,7 @@
       <w:pPr>
         <w:pStyle w:val="Ttulo3"/>
       </w:pPr>
-      <w:bookmarkStart w:id="39" w:name="_Toc243835802"/>
+      <w:bookmarkStart w:id="39" w:name="_Toc243837976"/>
       <w:r>
         <w:rPr>
           <w:sz w:val="24"/>
@@ -21915,7 +21919,7 @@
       <w:pPr>
         <w:pStyle w:val="Ttulo3"/>
       </w:pPr>
-      <w:bookmarkStart w:id="40" w:name="_Toc243835803"/>
+      <w:bookmarkStart w:id="40" w:name="_Toc243837977"/>
       <w:r>
         <w:rPr>
           <w:sz w:val="24"/>
@@ -21943,7 +21947,7 @@
       <w:pPr>
         <w:pStyle w:val="Ttulo3"/>
       </w:pPr>
-      <w:bookmarkStart w:id="41" w:name="_Toc243835804"/>
+      <w:bookmarkStart w:id="41" w:name="_Toc243837978"/>
       <w:r>
         <w:rPr>
           <w:sz w:val="24"/>
@@ -22059,7 +22063,7 @@
       <w:pPr>
         <w:pStyle w:val="Ttulo2"/>
       </w:pPr>
-      <w:bookmarkStart w:id="42" w:name="_Toc243835805"/>
+      <w:bookmarkStart w:id="42" w:name="_Toc243837979"/>
       <w:r>
         <w:lastRenderedPageBreak/>
         <w:t>4.3. Desarrollo y evaluación del modelo predictivo</w:t>
@@ -22075,7 +22079,7 @@
       <w:pPr>
         <w:pStyle w:val="Ttulo3"/>
       </w:pPr>
-      <w:bookmarkStart w:id="43" w:name="_Toc243835806"/>
+      <w:bookmarkStart w:id="43" w:name="_Toc243837980"/>
       <w:r>
         <w:rPr>
           <w:sz w:val="24"/>
@@ -22103,7 +22107,7 @@
       <w:pPr>
         <w:pStyle w:val="Ttulo3"/>
       </w:pPr>
-      <w:bookmarkStart w:id="44" w:name="_Toc243835807"/>
+      <w:bookmarkStart w:id="44" w:name="_Toc243837981"/>
       <w:r>
         <w:rPr>
           <w:sz w:val="24"/>
@@ -22129,7 +22133,7 @@
       <w:pPr>
         <w:pStyle w:val="Ttulo3"/>
       </w:pPr>
-      <w:bookmarkStart w:id="45" w:name="_Toc243835808"/>
+      <w:bookmarkStart w:id="45" w:name="_Toc243837982"/>
       <w:r>
         <w:rPr>
           <w:sz w:val="24"/>
@@ -22270,7 +22274,7 @@
       <w:pPr>
         <w:pStyle w:val="Ttulo3"/>
       </w:pPr>
-      <w:bookmarkStart w:id="46" w:name="_Toc243835809"/>
+      <w:bookmarkStart w:id="46" w:name="_Toc243837983"/>
       <w:r>
         <w:rPr>
           <w:sz w:val="24"/>
@@ -22288,7 +22292,7 @@
       <w:pPr>
         <w:pStyle w:val="Ttulo3"/>
       </w:pPr>
-      <w:bookmarkStart w:id="47" w:name="_Toc243835810"/>
+      <w:bookmarkStart w:id="47" w:name="_Toc243837984"/>
       <w:r>
         <w:rPr>
           <w:sz w:val="24"/>
@@ -23262,7 +23266,7 @@
       <w:pPr>
         <w:pStyle w:val="Ttulo3"/>
       </w:pPr>
-      <w:bookmarkStart w:id="48" w:name="_Toc243835811"/>
+      <w:bookmarkStart w:id="48" w:name="_Toc243837985"/>
       <w:r>
         <w:rPr>
           <w:sz w:val="24"/>
@@ -24396,7 +24400,7 @@
       <w:pPr>
         <w:pStyle w:val="Ttulo3"/>
       </w:pPr>
-      <w:bookmarkStart w:id="49" w:name="_Toc243835812"/>
+      <w:bookmarkStart w:id="49" w:name="_Toc243837986"/>
       <w:r>
         <w:rPr>
           <w:sz w:val="24"/>
@@ -24424,7 +24428,7 @@
       <w:pPr>
         <w:pStyle w:val="Ttulo3"/>
       </w:pPr>
-      <w:bookmarkStart w:id="50" w:name="_Toc243835813"/>
+      <w:bookmarkStart w:id="50" w:name="_Toc243837987"/>
       <w:r>
         <w:rPr>
           <w:sz w:val="24"/>
@@ -24448,7 +24452,7 @@
       <w:pPr>
         <w:pStyle w:val="Ttulo3"/>
       </w:pPr>
-      <w:bookmarkStart w:id="51" w:name="_Toc243835814"/>
+      <w:bookmarkStart w:id="51" w:name="_Toc243837988"/>
       <w:r>
         <w:rPr>
           <w:sz w:val="24"/>
@@ -24481,7 +24485,7 @@
       <w:pPr>
         <w:pStyle w:val="Ttulo3"/>
       </w:pPr>
-      <w:bookmarkStart w:id="52" w:name="_Toc243835815"/>
+      <w:bookmarkStart w:id="52" w:name="_Toc243837989"/>
       <w:r>
         <w:t>4.3.10. Reentrenamiento con datos de 2026</w:t>
       </w:r>
@@ -25397,7 +25401,7 @@
       <w:pPr>
         <w:pStyle w:val="Ttulo3"/>
       </w:pPr>
-      <w:bookmarkStart w:id="53" w:name="_Toc243835816"/>
+      <w:bookmarkStart w:id="53" w:name="_Toc243837990"/>
       <w:r>
         <w:lastRenderedPageBreak/>
         <w:t>4.3.11. Modelo de ETc para la aplicación</w:t>
@@ -26003,11 +26007,824 @@
     </w:p>
     <w:p>
       <w:pPr>
+        <w:pStyle w:val="Ttulo3"/>
+        <w:keepNext/>
+      </w:pPr>
+      <w:r>
+        <w:t>4.3.12. Explicabilidad de los modelos de árboles</w:t>
+      </w:r>
+    </w:p>
+    <w:p>
+      <w:r>
+        <w:t>Se aplicó TreeSHAP a Random Forest y XGBoost para analizar su comportamiento en los mismos 23 días de prueba del piloto original. Los modelos se ajustaron solo con las 125 observaciones del periodo de desarrollo y no se modificaron la partición, las variables ni los hiperparámetros del apartado 4.3. Las contribuciones SHAP explican cómo construye cada modelo su predicción; no demuestran causalidad ni bastan por sí solas para explicar el error.</w:t>
+      </w:r>
+    </w:p>
+    <w:p>
+      <w:pPr>
+        <w:pStyle w:val="ndicetablaTFM"/>
+        <w:keepNext/>
+      </w:pPr>
+      <w:r>
+        <w:t>Tabla 4.17. Variables con mayor contribución media absoluta en la prueba temporal.</w:t>
+      </w:r>
+    </w:p>
+    <w:tbl>
+      <w:tblPr>
+        <w:tblStyle w:val="Tablaconcuadrcula"/>
+        <w:tblW w:type="auto" w:w="0"/>
+        <w:tblLook w:firstColumn="1" w:firstRow="1" w:lastColumn="0" w:lastRow="0" w:noHBand="0" w:noVBand="1" w:val="04A0"/>
+      </w:tblPr>
+      <w:tblGrid>
+        <w:gridCol w:w="2409"/>
+        <w:gridCol w:w="2409"/>
+        <w:gridCol w:w="2409"/>
+        <w:gridCol w:w="2409"/>
+      </w:tblGrid>
+      <w:tr>
+        <w:trPr>
+          <w:tblHeader w:val="true"/>
+        </w:trPr>
+        <w:tc>
+          <w:tcPr>
+            <w:tcW w:type="dxa" w:w="1814"/>
+            <w:vAlign w:val="center"/>
+            <w:tcMar>
+              <w:top w:w="90" w:type="dxa"/>
+              <w:start w:w="90" w:type="dxa"/>
+              <w:bottom w:w="90" w:type="dxa"/>
+              <w:end w:w="90" w:type="dxa"/>
+            </w:tcMar>
+            <w:shd w:fill="1F4E78"/>
+          </w:tcPr>
+          <w:p>
+            <w:pPr>
+              <w:spacing w:after="0" w:before="0"/>
+              <w:jc w:val="center"/>
+            </w:pPr>
+            <w:r>
+              <w:rPr>
+                <w:b/>
+                <w:color w:val="FFFFFF"/>
+                <w:sz w:val="17"/>
+              </w:rPr>
+              <w:t>Modelo</w:t>
+            </w:r>
+          </w:p>
+        </w:tc>
+        <w:tc>
+          <w:tcPr>
+            <w:tcW w:type="dxa" w:w="2948"/>
+            <w:vAlign w:val="center"/>
+            <w:tcMar>
+              <w:top w:w="90" w:type="dxa"/>
+              <w:start w:w="90" w:type="dxa"/>
+              <w:bottom w:w="90" w:type="dxa"/>
+              <w:end w:w="90" w:type="dxa"/>
+            </w:tcMar>
+            <w:shd w:fill="1F4E78"/>
+          </w:tcPr>
+          <w:p>
+            <w:pPr>
+              <w:spacing w:after="0" w:before="0"/>
+              <w:jc w:val="left"/>
+            </w:pPr>
+            <w:r>
+              <w:rPr>
+                <w:b/>
+                <w:color w:val="FFFFFF"/>
+                <w:sz w:val="17"/>
+              </w:rPr>
+              <w:t>Variable</w:t>
+            </w:r>
+          </w:p>
+        </w:tc>
+        <w:tc>
+          <w:tcPr>
+            <w:tcW w:type="dxa" w:w="2098"/>
+            <w:vAlign w:val="center"/>
+            <w:tcMar>
+              <w:top w:w="90" w:type="dxa"/>
+              <w:start w:w="90" w:type="dxa"/>
+              <w:bottom w:w="90" w:type="dxa"/>
+              <w:end w:w="90" w:type="dxa"/>
+            </w:tcMar>
+            <w:shd w:fill="1F4E78"/>
+          </w:tcPr>
+          <w:p>
+            <w:pPr>
+              <w:spacing w:after="0" w:before="0"/>
+              <w:jc w:val="center"/>
+            </w:pPr>
+            <w:r>
+              <w:rPr>
+                <w:b/>
+                <w:color w:val="FFFFFF"/>
+                <w:sz w:val="17"/>
+              </w:rPr>
+              <w:t>Contribución media absoluta</w:t>
+            </w:r>
+          </w:p>
+        </w:tc>
+        <w:tc>
+          <w:tcPr>
+            <w:tcW w:type="dxa" w:w="1814"/>
+            <w:vAlign w:val="center"/>
+            <w:tcMar>
+              <w:top w:w="90" w:type="dxa"/>
+              <w:start w:w="90" w:type="dxa"/>
+              <w:bottom w:w="90" w:type="dxa"/>
+              <w:end w:w="90" w:type="dxa"/>
+            </w:tcMar>
+            <w:shd w:fill="1F4E78"/>
+          </w:tcPr>
+          <w:p>
+            <w:pPr>
+              <w:spacing w:after="0" w:before="0"/>
+              <w:jc w:val="center"/>
+            </w:pPr>
+            <w:r>
+              <w:rPr>
+                <w:b/>
+                <w:color w:val="FFFFFF"/>
+                <w:sz w:val="17"/>
+              </w:rPr>
+              <w:t>Porcentaje del total</w:t>
+            </w:r>
+          </w:p>
+        </w:tc>
+      </w:tr>
+      <w:tr>
+        <w:tc>
+          <w:tcPr>
+            <w:tcW w:type="dxa" w:w="1814"/>
+            <w:vAlign w:val="center"/>
+            <w:tcMar>
+              <w:top w:w="90" w:type="dxa"/>
+              <w:start w:w="90" w:type="dxa"/>
+              <w:bottom w:w="90" w:type="dxa"/>
+              <w:end w:w="90" w:type="dxa"/>
+            </w:tcMar>
+          </w:tcPr>
+          <w:p>
+            <w:pPr>
+              <w:spacing w:after="0" w:before="0"/>
+              <w:jc w:val="center"/>
+            </w:pPr>
+            <w:r>
+              <w:rPr>
+                <w:sz w:val="17"/>
+              </w:rPr>
+              <w:t>Random Forest</w:t>
+            </w:r>
+          </w:p>
+        </w:tc>
+        <w:tc>
+          <w:tcPr>
+            <w:tcW w:type="dxa" w:w="2948"/>
+            <w:vAlign w:val="center"/>
+            <w:tcMar>
+              <w:top w:w="90" w:type="dxa"/>
+              <w:start w:w="90" w:type="dxa"/>
+              <w:bottom w:w="90" w:type="dxa"/>
+              <w:end w:w="90" w:type="dxa"/>
+            </w:tcMar>
+          </w:tcPr>
+          <w:p>
+            <w:pPr>
+              <w:spacing w:after="0" w:before="0"/>
+              <w:jc w:val="left"/>
+            </w:pPr>
+            <w:r>
+              <w:rPr>
+                <w:sz w:val="17"/>
+              </w:rPr>
+              <w:t>Kc</w:t>
+            </w:r>
+          </w:p>
+        </w:tc>
+        <w:tc>
+          <w:tcPr>
+            <w:tcW w:type="dxa" w:w="2098"/>
+            <w:vAlign w:val="center"/>
+            <w:tcMar>
+              <w:top w:w="90" w:type="dxa"/>
+              <w:start w:w="90" w:type="dxa"/>
+              <w:bottom w:w="90" w:type="dxa"/>
+              <w:end w:w="90" w:type="dxa"/>
+            </w:tcMar>
+          </w:tcPr>
+          <w:p>
+            <w:pPr>
+              <w:spacing w:after="0" w:before="0"/>
+              <w:jc w:val="center"/>
+            </w:pPr>
+            <w:r>
+              <w:rPr>
+                <w:sz w:val="17"/>
+              </w:rPr>
+              <w:t>1,870 mm/día</w:t>
+            </w:r>
+          </w:p>
+        </w:tc>
+        <w:tc>
+          <w:tcPr>
+            <w:tcW w:type="dxa" w:w="1814"/>
+            <w:vAlign w:val="center"/>
+            <w:tcMar>
+              <w:top w:w="90" w:type="dxa"/>
+              <w:start w:w="90" w:type="dxa"/>
+              <w:bottom w:w="90" w:type="dxa"/>
+              <w:end w:w="90" w:type="dxa"/>
+            </w:tcMar>
+          </w:tcPr>
+          <w:p>
+            <w:pPr>
+              <w:spacing w:after="0" w:before="0"/>
+              <w:jc w:val="center"/>
+            </w:pPr>
+            <w:r>
+              <w:rPr>
+                <w:sz w:val="17"/>
+              </w:rPr>
+              <w:t>73,4 %</w:t>
+            </w:r>
+          </w:p>
+        </w:tc>
+      </w:tr>
+      <w:tr>
+        <w:tc>
+          <w:tcPr>
+            <w:tcW w:type="dxa" w:w="1814"/>
+            <w:vAlign w:val="center"/>
+            <w:tcMar>
+              <w:top w:w="90" w:type="dxa"/>
+              <w:start w:w="90" w:type="dxa"/>
+              <w:bottom w:w="90" w:type="dxa"/>
+              <w:end w:w="90" w:type="dxa"/>
+            </w:tcMar>
+            <w:shd w:fill="EAF2F8"/>
+          </w:tcPr>
+          <w:p>
+            <w:pPr>
+              <w:spacing w:after="0" w:before="0"/>
+              <w:jc w:val="center"/>
+            </w:pPr>
+            <w:r>
+              <w:rPr>
+                <w:sz w:val="17"/>
+              </w:rPr>
+              <w:t>Random Forest</w:t>
+            </w:r>
+          </w:p>
+        </w:tc>
+        <w:tc>
+          <w:tcPr>
+            <w:tcW w:type="dxa" w:w="2948"/>
+            <w:vAlign w:val="center"/>
+            <w:tcMar>
+              <w:top w:w="90" w:type="dxa"/>
+              <w:start w:w="90" w:type="dxa"/>
+              <w:bottom w:w="90" w:type="dxa"/>
+              <w:end w:w="90" w:type="dxa"/>
+            </w:tcMar>
+            <w:shd w:fill="EAF2F8"/>
+          </w:tcPr>
+          <w:p>
+            <w:pPr>
+              <w:spacing w:after="0" w:before="0"/>
+              <w:jc w:val="left"/>
+            </w:pPr>
+            <w:r>
+              <w:rPr>
+                <w:sz w:val="17"/>
+              </w:rPr>
+              <w:t>Necesidad t-1</w:t>
+            </w:r>
+          </w:p>
+        </w:tc>
+        <w:tc>
+          <w:tcPr>
+            <w:tcW w:type="dxa" w:w="2098"/>
+            <w:vAlign w:val="center"/>
+            <w:tcMar>
+              <w:top w:w="90" w:type="dxa"/>
+              <w:start w:w="90" w:type="dxa"/>
+              <w:bottom w:w="90" w:type="dxa"/>
+              <w:end w:w="90" w:type="dxa"/>
+            </w:tcMar>
+            <w:shd w:fill="EAF2F8"/>
+          </w:tcPr>
+          <w:p>
+            <w:pPr>
+              <w:spacing w:after="0" w:before="0"/>
+              <w:jc w:val="center"/>
+            </w:pPr>
+            <w:r>
+              <w:rPr>
+                <w:sz w:val="17"/>
+              </w:rPr>
+              <w:t>0,335 mm/día</w:t>
+            </w:r>
+          </w:p>
+        </w:tc>
+        <w:tc>
+          <w:tcPr>
+            <w:tcW w:type="dxa" w:w="1814"/>
+            <w:vAlign w:val="center"/>
+            <w:tcMar>
+              <w:top w:w="90" w:type="dxa"/>
+              <w:start w:w="90" w:type="dxa"/>
+              <w:bottom w:w="90" w:type="dxa"/>
+              <w:end w:w="90" w:type="dxa"/>
+            </w:tcMar>
+            <w:shd w:fill="EAF2F8"/>
+          </w:tcPr>
+          <w:p>
+            <w:pPr>
+              <w:spacing w:after="0" w:before="0"/>
+              <w:jc w:val="center"/>
+            </w:pPr>
+            <w:r>
+              <w:rPr>
+                <w:sz w:val="17"/>
+              </w:rPr>
+              <w:t>13,2 %</w:t>
+            </w:r>
+          </w:p>
+        </w:tc>
+      </w:tr>
+      <w:tr>
+        <w:tc>
+          <w:tcPr>
+            <w:tcW w:type="dxa" w:w="1814"/>
+            <w:vAlign w:val="center"/>
+            <w:tcMar>
+              <w:top w:w="90" w:type="dxa"/>
+              <w:start w:w="90" w:type="dxa"/>
+              <w:bottom w:w="90" w:type="dxa"/>
+              <w:end w:w="90" w:type="dxa"/>
+            </w:tcMar>
+          </w:tcPr>
+          <w:p>
+            <w:pPr>
+              <w:spacing w:after="0" w:before="0"/>
+              <w:jc w:val="center"/>
+            </w:pPr>
+            <w:r>
+              <w:rPr>
+                <w:sz w:val="17"/>
+              </w:rPr>
+              <w:t>Random Forest</w:t>
+            </w:r>
+          </w:p>
+        </w:tc>
+        <w:tc>
+          <w:tcPr>
+            <w:tcW w:type="dxa" w:w="2948"/>
+            <w:vAlign w:val="center"/>
+            <w:tcMar>
+              <w:top w:w="90" w:type="dxa"/>
+              <w:start w:w="90" w:type="dxa"/>
+              <w:bottom w:w="90" w:type="dxa"/>
+              <w:end w:w="90" w:type="dxa"/>
+            </w:tcMar>
+          </w:tcPr>
+          <w:p>
+            <w:pPr>
+              <w:spacing w:after="0" w:before="0"/>
+              <w:jc w:val="left"/>
+            </w:pPr>
+            <w:r>
+              <w:rPr>
+                <w:sz w:val="17"/>
+              </w:rPr>
+              <w:t>Día del año (coseno)</w:t>
+            </w:r>
+          </w:p>
+        </w:tc>
+        <w:tc>
+          <w:tcPr>
+            <w:tcW w:type="dxa" w:w="2098"/>
+            <w:vAlign w:val="center"/>
+            <w:tcMar>
+              <w:top w:w="90" w:type="dxa"/>
+              <w:start w:w="90" w:type="dxa"/>
+              <w:bottom w:w="90" w:type="dxa"/>
+              <w:end w:w="90" w:type="dxa"/>
+            </w:tcMar>
+          </w:tcPr>
+          <w:p>
+            <w:pPr>
+              <w:spacing w:after="0" w:before="0"/>
+              <w:jc w:val="center"/>
+            </w:pPr>
+            <w:r>
+              <w:rPr>
+                <w:sz w:val="17"/>
+              </w:rPr>
+              <w:t>0,124 mm/día</w:t>
+            </w:r>
+          </w:p>
+        </w:tc>
+        <w:tc>
+          <w:tcPr>
+            <w:tcW w:type="dxa" w:w="1814"/>
+            <w:vAlign w:val="center"/>
+            <w:tcMar>
+              <w:top w:w="90" w:type="dxa"/>
+              <w:start w:w="90" w:type="dxa"/>
+              <w:bottom w:w="90" w:type="dxa"/>
+              <w:end w:w="90" w:type="dxa"/>
+            </w:tcMar>
+          </w:tcPr>
+          <w:p>
+            <w:pPr>
+              <w:spacing w:after="0" w:before="0"/>
+              <w:jc w:val="center"/>
+            </w:pPr>
+            <w:r>
+              <w:rPr>
+                <w:sz w:val="17"/>
+              </w:rPr>
+              <w:t>4,9 %</w:t>
+            </w:r>
+          </w:p>
+        </w:tc>
+      </w:tr>
+      <w:tr>
+        <w:tc>
+          <w:tcPr>
+            <w:tcW w:type="dxa" w:w="1814"/>
+            <w:vAlign w:val="center"/>
+            <w:tcMar>
+              <w:top w:w="90" w:type="dxa"/>
+              <w:start w:w="90" w:type="dxa"/>
+              <w:bottom w:w="90" w:type="dxa"/>
+              <w:end w:w="90" w:type="dxa"/>
+            </w:tcMar>
+            <w:shd w:fill="EAF2F8"/>
+          </w:tcPr>
+          <w:p>
+            <w:pPr>
+              <w:spacing w:after="0" w:before="0"/>
+              <w:jc w:val="center"/>
+            </w:pPr>
+            <w:r>
+              <w:rPr>
+                <w:sz w:val="17"/>
+              </w:rPr>
+              <w:t>XGBoost</w:t>
+            </w:r>
+          </w:p>
+        </w:tc>
+        <w:tc>
+          <w:tcPr>
+            <w:tcW w:type="dxa" w:w="2948"/>
+            <w:vAlign w:val="center"/>
+            <w:tcMar>
+              <w:top w:w="90" w:type="dxa"/>
+              <w:start w:w="90" w:type="dxa"/>
+              <w:bottom w:w="90" w:type="dxa"/>
+              <w:end w:w="90" w:type="dxa"/>
+            </w:tcMar>
+            <w:shd w:fill="EAF2F8"/>
+          </w:tcPr>
+          <w:p>
+            <w:pPr>
+              <w:spacing w:after="0" w:before="0"/>
+              <w:jc w:val="left"/>
+            </w:pPr>
+            <w:r>
+              <w:rPr>
+                <w:sz w:val="17"/>
+              </w:rPr>
+              <w:t>Kc</w:t>
+            </w:r>
+          </w:p>
+        </w:tc>
+        <w:tc>
+          <w:tcPr>
+            <w:tcW w:type="dxa" w:w="2098"/>
+            <w:vAlign w:val="center"/>
+            <w:tcMar>
+              <w:top w:w="90" w:type="dxa"/>
+              <w:start w:w="90" w:type="dxa"/>
+              <w:bottom w:w="90" w:type="dxa"/>
+              <w:end w:w="90" w:type="dxa"/>
+            </w:tcMar>
+            <w:shd w:fill="EAF2F8"/>
+          </w:tcPr>
+          <w:p>
+            <w:pPr>
+              <w:spacing w:after="0" w:before="0"/>
+              <w:jc w:val="center"/>
+            </w:pPr>
+            <w:r>
+              <w:rPr>
+                <w:sz w:val="17"/>
+              </w:rPr>
+              <w:t>1,433 mm/día</w:t>
+            </w:r>
+          </w:p>
+        </w:tc>
+        <w:tc>
+          <w:tcPr>
+            <w:tcW w:type="dxa" w:w="1814"/>
+            <w:vAlign w:val="center"/>
+            <w:tcMar>
+              <w:top w:w="90" w:type="dxa"/>
+              <w:start w:w="90" w:type="dxa"/>
+              <w:bottom w:w="90" w:type="dxa"/>
+              <w:end w:w="90" w:type="dxa"/>
+            </w:tcMar>
+            <w:shd w:fill="EAF2F8"/>
+          </w:tcPr>
+          <w:p>
+            <w:pPr>
+              <w:spacing w:after="0" w:before="0"/>
+              <w:jc w:val="center"/>
+            </w:pPr>
+            <w:r>
+              <w:rPr>
+                <w:sz w:val="17"/>
+              </w:rPr>
+              <w:t>53,6 %</w:t>
+            </w:r>
+          </w:p>
+        </w:tc>
+      </w:tr>
+      <w:tr>
+        <w:tc>
+          <w:tcPr>
+            <w:tcW w:type="dxa" w:w="1814"/>
+            <w:vAlign w:val="center"/>
+            <w:tcMar>
+              <w:top w:w="90" w:type="dxa"/>
+              <w:start w:w="90" w:type="dxa"/>
+              <w:bottom w:w="90" w:type="dxa"/>
+              <w:end w:w="90" w:type="dxa"/>
+            </w:tcMar>
+          </w:tcPr>
+          <w:p>
+            <w:pPr>
+              <w:spacing w:after="0" w:before="0"/>
+              <w:jc w:val="center"/>
+            </w:pPr>
+            <w:r>
+              <w:rPr>
+                <w:sz w:val="17"/>
+              </w:rPr>
+              <w:t>XGBoost</w:t>
+            </w:r>
+          </w:p>
+        </w:tc>
+        <w:tc>
+          <w:tcPr>
+            <w:tcW w:type="dxa" w:w="2948"/>
+            <w:vAlign w:val="center"/>
+            <w:tcMar>
+              <w:top w:w="90" w:type="dxa"/>
+              <w:start w:w="90" w:type="dxa"/>
+              <w:bottom w:w="90" w:type="dxa"/>
+              <w:end w:w="90" w:type="dxa"/>
+            </w:tcMar>
+          </w:tcPr>
+          <w:p>
+            <w:pPr>
+              <w:spacing w:after="0" w:before="0"/>
+              <w:jc w:val="left"/>
+            </w:pPr>
+            <w:r>
+              <w:rPr>
+                <w:sz w:val="17"/>
+              </w:rPr>
+              <w:t>Necesidad t-1</w:t>
+            </w:r>
+          </w:p>
+        </w:tc>
+        <w:tc>
+          <w:tcPr>
+            <w:tcW w:type="dxa" w:w="2098"/>
+            <w:vAlign w:val="center"/>
+            <w:tcMar>
+              <w:top w:w="90" w:type="dxa"/>
+              <w:start w:w="90" w:type="dxa"/>
+              <w:bottom w:w="90" w:type="dxa"/>
+              <w:end w:w="90" w:type="dxa"/>
+            </w:tcMar>
+          </w:tcPr>
+          <w:p>
+            <w:pPr>
+              <w:spacing w:after="0" w:before="0"/>
+              <w:jc w:val="center"/>
+            </w:pPr>
+            <w:r>
+              <w:rPr>
+                <w:sz w:val="17"/>
+              </w:rPr>
+              <w:t>0,490 mm/día</w:t>
+            </w:r>
+          </w:p>
+        </w:tc>
+        <w:tc>
+          <w:tcPr>
+            <w:tcW w:type="dxa" w:w="1814"/>
+            <w:vAlign w:val="center"/>
+            <w:tcMar>
+              <w:top w:w="90" w:type="dxa"/>
+              <w:start w:w="90" w:type="dxa"/>
+              <w:bottom w:w="90" w:type="dxa"/>
+              <w:end w:w="90" w:type="dxa"/>
+            </w:tcMar>
+          </w:tcPr>
+          <w:p>
+            <w:pPr>
+              <w:spacing w:after="0" w:before="0"/>
+              <w:jc w:val="center"/>
+            </w:pPr>
+            <w:r>
+              <w:rPr>
+                <w:sz w:val="17"/>
+              </w:rPr>
+              <w:t>18,3 %</w:t>
+            </w:r>
+          </w:p>
+        </w:tc>
+      </w:tr>
+      <w:tr>
+        <w:tc>
+          <w:tcPr>
+            <w:tcW w:type="dxa" w:w="1814"/>
+            <w:vAlign w:val="center"/>
+            <w:tcMar>
+              <w:top w:w="90" w:type="dxa"/>
+              <w:start w:w="90" w:type="dxa"/>
+              <w:bottom w:w="90" w:type="dxa"/>
+              <w:end w:w="90" w:type="dxa"/>
+            </w:tcMar>
+            <w:shd w:fill="EAF2F8"/>
+          </w:tcPr>
+          <w:p>
+            <w:pPr>
+              <w:spacing w:after="0" w:before="0"/>
+              <w:jc w:val="center"/>
+            </w:pPr>
+            <w:r>
+              <w:rPr>
+                <w:sz w:val="17"/>
+              </w:rPr>
+              <w:t>XGBoost</w:t>
+            </w:r>
+          </w:p>
+        </w:tc>
+        <w:tc>
+          <w:tcPr>
+            <w:tcW w:type="dxa" w:w="2948"/>
+            <w:vAlign w:val="center"/>
+            <w:tcMar>
+              <w:top w:w="90" w:type="dxa"/>
+              <w:start w:w="90" w:type="dxa"/>
+              <w:bottom w:w="90" w:type="dxa"/>
+              <w:end w:w="90" w:type="dxa"/>
+            </w:tcMar>
+            <w:shd w:fill="EAF2F8"/>
+          </w:tcPr>
+          <w:p>
+            <w:pPr>
+              <w:spacing w:after="0" w:before="0"/>
+              <w:jc w:val="left"/>
+            </w:pPr>
+            <w:r>
+              <w:rPr>
+                <w:sz w:val="17"/>
+              </w:rPr>
+              <w:t>Día del año (coseno)</w:t>
+            </w:r>
+          </w:p>
+        </w:tc>
+        <w:tc>
+          <w:tcPr>
+            <w:tcW w:type="dxa" w:w="2098"/>
+            <w:vAlign w:val="center"/>
+            <w:tcMar>
+              <w:top w:w="90" w:type="dxa"/>
+              <w:start w:w="90" w:type="dxa"/>
+              <w:bottom w:w="90" w:type="dxa"/>
+              <w:end w:w="90" w:type="dxa"/>
+            </w:tcMar>
+            <w:shd w:fill="EAF2F8"/>
+          </w:tcPr>
+          <w:p>
+            <w:pPr>
+              <w:spacing w:after="0" w:before="0"/>
+              <w:jc w:val="center"/>
+            </w:pPr>
+            <w:r>
+              <w:rPr>
+                <w:sz w:val="17"/>
+              </w:rPr>
+              <w:t>0,299 mm/día</w:t>
+            </w:r>
+          </w:p>
+        </w:tc>
+        <w:tc>
+          <w:tcPr>
+            <w:tcW w:type="dxa" w:w="1814"/>
+            <w:vAlign w:val="center"/>
+            <w:tcMar>
+              <w:top w:w="90" w:type="dxa"/>
+              <w:start w:w="90" w:type="dxa"/>
+              <w:bottom w:w="90" w:type="dxa"/>
+              <w:end w:w="90" w:type="dxa"/>
+            </w:tcMar>
+            <w:shd w:fill="EAF2F8"/>
+          </w:tcPr>
+          <w:p>
+            <w:pPr>
+              <w:spacing w:after="0" w:before="0"/>
+              <w:jc w:val="center"/>
+            </w:pPr>
+            <w:r>
+              <w:rPr>
+                <w:sz w:val="17"/>
+              </w:rPr>
+              <w:t>11,2 %</w:t>
+            </w:r>
+          </w:p>
+        </w:tc>
+      </w:tr>
+    </w:tbl>
+    <w:p>
+      <w:pPr>
+        <w:spacing w:before="160" w:after="60"/>
+        <w:jc w:val="center"/>
+        <w:keepNext/>
+      </w:pPr>
+      <w:r>
+        <w:drawing>
+          <wp:inline xmlns:a="http://schemas.openxmlformats.org/drawingml/2006/main" xmlns:pic="http://schemas.openxmlformats.org/drawingml/2006/picture">
+            <wp:extent cx="5832000" cy="4587977"/>
+            <wp:docPr id="34" name="Picture 34"/>
+            <wp:cNvGraphicFramePr>
+              <a:graphicFrameLocks noChangeAspect="1"/>
+            </wp:cNvGraphicFramePr>
+            <a:graphic>
+              <a:graphicData uri="http://schemas.openxmlformats.org/drawingml/2006/picture">
+                <pic:pic>
+                  <pic:nvPicPr>
+                    <pic:cNvPr id="0" name="image.png"/>
+                    <pic:cNvPicPr/>
+                  </pic:nvPicPr>
+                  <pic:blipFill>
+                    <a:blip r:embed="rId67"/>
+                    <a:stretch>
+                      <a:fillRect/>
+                    </a:stretch>
+                  </pic:blipFill>
+                  <pic:spPr>
+                    <a:xfrm>
+                      <a:off x="0" y="0"/>
+                      <a:ext cx="5832000" cy="4587977"/>
+                    </a:xfrm>
+                    <a:prstGeom prst="rect"/>
+                  </pic:spPr>
+                </pic:pic>
+              </a:graphicData>
+            </a:graphic>
+          </wp:inline>
+        </w:drawing>
+      </w:r>
+    </w:p>
+    <w:p>
+      <w:pPr>
+        <w:pStyle w:val="ndicefiguraTFM"/>
+      </w:pPr>
+      <w:r>
+        <w:t>Figura 4.9. Importancia global y explicaciones locales de Random Forest y XGBoost mediante TreeSHAP. Fuente: elaboración propia.</w:t>
+      </w:r>
+    </w:p>
+    <w:p>
+      <w:r>
+        <w:t>El resultado debe interpretarse junto con la distribución temporal. El periodo de desarrollo contiene valores de Kc entre 0,3 y 1,0 y una necesidad media de 4,041 mm/día, mientras que toda la prueba corresponde a Kc igual a 0,3 y su media desciende a 1,130 mm/día. En ambos modelos, Kc y la necesidad del día anterior reducen una referencia interna aprendida cercana a 4,0 mm/día, pero los árboles no se ajustan completamente al tramo final y mantienen un sesgo positivo. La suma de los siete días anteriores aporta además una pequeña contribución positiva.</w:t>
+      </w:r>
+    </w:p>
+    <w:p>
+      <w:r>
+        <w:t>La explicación local del 29 de septiembre, el día de mayor error para ambos modelos, muestra ese mismo patrón: frente a una referencia SiAR de 0,89 mm/día, Random Forest estima 1,72 y XGBoost 1,92 mm/día. Este análisis no convierte el resultado en una relación causal, pero sí permite identificar una dependencia fuerte del estado fenológico y de los retardos. La persistencia se adapta mejor al nivel local del tramo final porque utiliza directamente la observación más reciente. Por tanto, la evidencia XAI refuerza, en lugar de sustituir, la decisión de no desplegar los árboles con los datos actuales.</w:t>
+      </w:r>
+    </w:p>
+    <w:p>
+      <w:r>
+        <w:t>El análisis se reproduce con python -m src.analysis.build_xai_4_3. El comando genera un informe JSON, las importancias globales, las explicaciones locales y la Figura 4.9. Los tres resultados tabulares se conservan en docs/data_samples/.</w:t>
+      </w:r>
+    </w:p>
+    <w:p>
+      <w:pPr>
         <w:pStyle w:val="Ttulo1"/>
         <w:pageBreakBefore/>
       </w:pPr>
       <w:bookmarkStart w:id="54" w:name="_Toc243495226"/>
-      <w:bookmarkStart w:id="55" w:name="_Toc243835817"/>
+      <w:bookmarkStart w:id="55" w:name="_Toc243837991"/>
       <w:r>
         <w:lastRenderedPageBreak/>
         <w:t>5. Sistema de recomendación y resultados</w:t>
@@ -26024,7 +26841,7 @@
       <w:pPr>
         <w:pStyle w:val="Ttulo2"/>
       </w:pPr>
-      <w:bookmarkStart w:id="56" w:name="_Toc243835818"/>
+      <w:bookmarkStart w:id="56" w:name="_Toc243837992"/>
       <w:r>
         <w:t>5.1. Diseño del sistema de recomendación de riego</w:t>
       </w:r>
@@ -26044,7 +26861,7 @@
       <w:pPr>
         <w:pStyle w:val="Ttulo3"/>
       </w:pPr>
-      <w:bookmarkStart w:id="57" w:name="_Toc243835819"/>
+      <w:bookmarkStart w:id="57" w:name="_Toc243837993"/>
       <w:r>
         <w:rPr>
           <w:sz w:val="24"/>
@@ -26071,7 +26888,7 @@
       <w:pPr>
         <w:pStyle w:val="Ttulo3"/>
       </w:pPr>
-      <w:bookmarkStart w:id="58" w:name="_Toc243835820"/>
+      <w:bookmarkStart w:id="58" w:name="_Toc243837994"/>
       <w:r>
         <w:rPr>
           <w:sz w:val="24"/>
@@ -26154,7 +26971,7 @@
       <w:pPr>
         <w:pStyle w:val="Ttulo3"/>
       </w:pPr>
-      <w:bookmarkStart w:id="59" w:name="_Toc243835821"/>
+      <w:bookmarkStart w:id="59" w:name="_Toc243837995"/>
       <w:r>
         <w:rPr>
           <w:sz w:val="24"/>
@@ -26203,7 +27020,7 @@
       <w:pPr>
         <w:pStyle w:val="Ttulo3"/>
       </w:pPr>
-      <w:bookmarkStart w:id="60" w:name="_Toc243835822"/>
+      <w:bookmarkStart w:id="60" w:name="_Toc243837996"/>
       <w:r>
         <w:rPr>
           <w:sz w:val="24"/>
@@ -27085,7 +27902,7 @@
       <w:pPr>
         <w:pStyle w:val="Ttulo3"/>
       </w:pPr>
-      <w:bookmarkStart w:id="61" w:name="_Toc243835823"/>
+      <w:bookmarkStart w:id="61" w:name="_Toc243837997"/>
       <w:r>
         <w:rPr>
           <w:sz w:val="24"/>
@@ -27108,7 +27925,7 @@
       <w:pPr>
         <w:pStyle w:val="Ttulo3"/>
       </w:pPr>
-      <w:bookmarkStart w:id="62" w:name="_Toc243835824"/>
+      <w:bookmarkStart w:id="62" w:name="_Toc243837998"/>
       <w:r>
         <w:rPr>
           <w:sz w:val="24"/>
@@ -27127,7 +27944,7 @@
       <w:pPr>
         <w:pStyle w:val="Ttulo3"/>
       </w:pPr>
-      <w:bookmarkStart w:id="63" w:name="_Toc243835825"/>
+      <w:bookmarkStart w:id="63" w:name="_Toc243837999"/>
       <w:r>
         <w:t>5.1.7. Integración operativa de ETc y AEMET</w:t>
       </w:r>
@@ -27147,7 +27964,7 @@
       <w:pPr>
         <w:pStyle w:val="Ttulo2"/>
       </w:pPr>
-      <w:bookmarkStart w:id="64" w:name="_Toc243835826"/>
+      <w:bookmarkStart w:id="64" w:name="_Toc243838000"/>
       <w:r>
         <w:t>5.2. Aplicación y visualización de resultados</w:t>
       </w:r>
@@ -27162,7 +27979,7 @@
       <w:pPr>
         <w:pStyle w:val="Ttulo3"/>
       </w:pPr>
-      <w:bookmarkStart w:id="65" w:name="_Toc243835827"/>
+      <w:bookmarkStart w:id="65" w:name="_Toc243838001"/>
       <w:r>
         <w:rPr>
           <w:sz w:val="24"/>
@@ -27189,7 +28006,7 @@
       <w:pPr>
         <w:pStyle w:val="Ttulo3"/>
       </w:pPr>
-      <w:bookmarkStart w:id="66" w:name="_Toc243835828"/>
+      <w:bookmarkStart w:id="66" w:name="_Toc243838002"/>
       <w:r>
         <w:rPr>
           <w:sz w:val="24"/>
@@ -27217,7 +28034,7 @@
       <w:pPr>
         <w:pStyle w:val="Ttulo3"/>
       </w:pPr>
-      <w:bookmarkStart w:id="67" w:name="_Toc243835829"/>
+      <w:bookmarkStart w:id="67" w:name="_Toc243838003"/>
       <w:r>
         <w:rPr>
           <w:sz w:val="24"/>
@@ -29160,7 +29977,7 @@
       <w:pPr>
         <w:pStyle w:val="Ttulo3"/>
       </w:pPr>
-      <w:bookmarkStart w:id="68" w:name="_Toc243835830"/>
+      <w:bookmarkStart w:id="68" w:name="_Toc243838004"/>
       <w:r>
         <w:rPr>
           <w:sz w:val="24"/>
@@ -29194,7 +30011,7 @@
       <w:pPr>
         <w:pStyle w:val="Ttulo3"/>
       </w:pPr>
-      <w:bookmarkStart w:id="69" w:name="_Toc243835831"/>
+      <w:bookmarkStart w:id="69" w:name="_Toc243838005"/>
       <w:r>
         <w:rPr>
           <w:sz w:val="24"/>
@@ -29212,7 +30029,7 @@
       <w:pPr>
         <w:pStyle w:val="Ttulo3"/>
       </w:pPr>
-      <w:bookmarkStart w:id="70" w:name="_Toc243835832"/>
+      <w:bookmarkStart w:id="70" w:name="_Toc243838006"/>
       <w:r>
         <w:rPr>
           <w:sz w:val="24"/>
@@ -29230,7 +30047,7 @@
       <w:pPr>
         <w:pStyle w:val="Ttulo2"/>
       </w:pPr>
-      <w:bookmarkStart w:id="71" w:name="_Toc243835833"/>
+      <w:bookmarkStart w:id="71" w:name="_Toc243838007"/>
       <w:r>
         <w:t>5.3. Validación, resultados y análisis crítico</w:t>
       </w:r>
@@ -29254,7 +30071,7 @@
       <w:pPr>
         <w:pStyle w:val="Ttulo3"/>
       </w:pPr>
-      <w:bookmarkStart w:id="72" w:name="_Toc243835834"/>
+      <w:bookmarkStart w:id="72" w:name="_Toc243838008"/>
       <w:r>
         <w:rPr>
           <w:sz w:val="24"/>
@@ -29277,7 +30094,7 @@
       <w:pPr>
         <w:pStyle w:val="Ttulo3"/>
       </w:pPr>
-      <w:bookmarkStart w:id="73" w:name="_Toc243835835"/>
+      <w:bookmarkStart w:id="73" w:name="_Toc243838009"/>
       <w:r>
         <w:rPr>
           <w:sz w:val="24"/>
@@ -29783,7 +30600,7 @@
       <w:pPr>
         <w:pStyle w:val="Ttulo3"/>
       </w:pPr>
-      <w:bookmarkStart w:id="74" w:name="_Toc243835836"/>
+      <w:bookmarkStart w:id="74" w:name="_Toc243838010"/>
       <w:r>
         <w:rPr>
           <w:sz w:val="24"/>
@@ -30656,7 +31473,7 @@
       <w:pPr>
         <w:pStyle w:val="Ttulo3"/>
       </w:pPr>
-      <w:bookmarkStart w:id="75" w:name="_Toc243835837"/>
+      <w:bookmarkStart w:id="75" w:name="_Toc243838011"/>
       <w:r>
         <w:rPr>
           <w:sz w:val="24"/>
@@ -31756,7 +32573,7 @@
       <w:pPr>
         <w:pStyle w:val="Ttulo3"/>
       </w:pPr>
-      <w:bookmarkStart w:id="76" w:name="_Toc243835838"/>
+      <w:bookmarkStart w:id="76" w:name="_Toc243838012"/>
       <w:r>
         <w:rPr>
           <w:sz w:val="24"/>
@@ -31848,7 +32665,7 @@
       <w:pPr>
         <w:pStyle w:val="Ttulo3"/>
       </w:pPr>
-      <w:bookmarkStart w:id="77" w:name="_Toc243835839"/>
+      <w:bookmarkStart w:id="77" w:name="_Toc243838013"/>
       <w:r>
         <w:rPr>
           <w:sz w:val="24"/>
@@ -32303,7 +33120,7 @@
       <w:pPr>
         <w:pStyle w:val="Ttulo3"/>
       </w:pPr>
-      <w:bookmarkStart w:id="78" w:name="_Toc243835840"/>
+      <w:bookmarkStart w:id="78" w:name="_Toc243838014"/>
       <w:r>
         <w:rPr>
           <w:sz w:val="24"/>
@@ -33393,7 +34210,7 @@
       <w:pPr>
         <w:pStyle w:val="Ttulo3"/>
       </w:pPr>
-      <w:bookmarkStart w:id="79" w:name="_Toc243835841"/>
+      <w:bookmarkStart w:id="79" w:name="_Toc243838015"/>
       <w:r>
         <w:rPr>
           <w:sz w:val="24"/>
@@ -33411,7 +34228,7 @@
       <w:pPr>
         <w:pStyle w:val="Ttulo3"/>
       </w:pPr>
-      <w:bookmarkStart w:id="80" w:name="_Toc243835842"/>
+      <w:bookmarkStart w:id="80" w:name="_Toc243838016"/>
       <w:r>
         <w:rPr>
           <w:sz w:val="24"/>
@@ -33448,7 +34265,7 @@
       <w:pPr>
         <w:pStyle w:val="Ttulo3"/>
       </w:pPr>
-      <w:bookmarkStart w:id="81" w:name="_Toc243835843"/>
+      <w:bookmarkStart w:id="81" w:name="_Toc243838017"/>
       <w:r>
         <w:rPr>
           <w:sz w:val="24"/>
@@ -33463,6 +34280,12 @@
       </w:r>
     </w:p>
     <w:p>
+      <w:pPr/>
+      <w:r>
+        <w:t>python -m src.analysis.build_xai_4_3</w:t>
+      </w:r>
+    </w:p>
+    <w:p>
       <w:pPr>
         <w:shd w:val="clear" w:color="auto" w:fill="F2F2F2"/>
         <w:spacing w:before="80" w:after="140"/>
@@ -33502,7 +34325,7 @@
         <w:pStyle w:val="Ttulo1"/>
         <w:pageBreakBefore/>
       </w:pPr>
-      <w:bookmarkStart w:id="82" w:name="_Toc243835844"/>
+      <w:bookmarkStart w:id="82" w:name="_Toc243838018"/>
       <w:r>
         <w:lastRenderedPageBreak/>
         <w:t>6. Conclusiones</w:t>
@@ -33513,7 +34336,7 @@
       <w:pPr>
         <w:pStyle w:val="Ttulo2"/>
       </w:pPr>
-      <w:bookmarkStart w:id="83" w:name="_Toc243835845"/>
+      <w:bookmarkStart w:id="83" w:name="_Toc243838019"/>
       <w:r>
         <w:t>6.1. Cumplimiento de objetivos y aportaciones</w:t>
       </w:r>
@@ -33523,7 +34346,7 @@
       <w:pPr>
         <w:pStyle w:val="Ttulo3"/>
       </w:pPr>
-      <w:bookmarkStart w:id="84" w:name="_Toc243835846"/>
+      <w:bookmarkStart w:id="84" w:name="_Toc243838020"/>
       <w:r>
         <w:rPr>
           <w:sz w:val="24"/>
@@ -34303,7 +35126,7 @@
       <w:pPr>
         <w:pStyle w:val="Ttulo3"/>
       </w:pPr>
-      <w:bookmarkStart w:id="85" w:name="_Toc243835847"/>
+      <w:bookmarkStart w:id="85" w:name="_Toc243838021"/>
       <w:r>
         <w:rPr>
           <w:sz w:val="24"/>
@@ -34340,7 +35163,7 @@
       <w:pPr>
         <w:pStyle w:val="Ttulo2"/>
       </w:pPr>
-      <w:bookmarkStart w:id="86" w:name="_Toc243835848"/>
+      <w:bookmarkStart w:id="86" w:name="_Toc243838022"/>
       <w:r>
         <w:t>6.2. Limitaciones e impacto del proyecto</w:t>
       </w:r>
@@ -34350,7 +35173,7 @@
       <w:pPr>
         <w:pStyle w:val="Ttulo3"/>
       </w:pPr>
-      <w:bookmarkStart w:id="87" w:name="_Toc243835849"/>
+      <w:bookmarkStart w:id="87" w:name="_Toc243838023"/>
       <w:r>
         <w:rPr>
           <w:sz w:val="24"/>
@@ -34961,7 +35784,7 @@
       <w:pPr>
         <w:pStyle w:val="Ttulo3"/>
       </w:pPr>
-      <w:bookmarkStart w:id="88" w:name="_Toc243835850"/>
+      <w:bookmarkStart w:id="88" w:name="_Toc243838024"/>
       <w:r>
         <w:rPr>
           <w:sz w:val="24"/>
@@ -35000,7 +35823,7 @@
       <w:pPr>
         <w:pStyle w:val="Ttulo2"/>
       </w:pPr>
-      <w:bookmarkStart w:id="89" w:name="_Toc243835851"/>
+      <w:bookmarkStart w:id="89" w:name="_Toc243838025"/>
       <w:r>
         <w:t>6.3. Mejoras y líneas futuras</w:t>
       </w:r>
@@ -35015,7 +35838,7 @@
       <w:pPr>
         <w:pStyle w:val="Ttulo3"/>
       </w:pPr>
-      <w:bookmarkStart w:id="90" w:name="_Toc243835852"/>
+      <w:bookmarkStart w:id="90" w:name="_Toc243838026"/>
       <w:r>
         <w:rPr>
           <w:sz w:val="24"/>
@@ -35033,7 +35856,7 @@
       <w:pPr>
         <w:pStyle w:val="Ttulo3"/>
       </w:pPr>
-      <w:bookmarkStart w:id="91" w:name="_Toc243835853"/>
+      <w:bookmarkStart w:id="91" w:name="_Toc243838027"/>
       <w:r>
         <w:rPr>
           <w:sz w:val="24"/>
@@ -35062,7 +35885,7 @@
       <w:pPr>
         <w:pStyle w:val="Ttulo3"/>
       </w:pPr>
-      <w:bookmarkStart w:id="92" w:name="_Toc243835854"/>
+      <w:bookmarkStart w:id="92" w:name="_Toc243838028"/>
       <w:r>
         <w:rPr>
           <w:sz w:val="24"/>
@@ -35086,7 +35909,7 @@
       <w:pPr>
         <w:pStyle w:val="Ttulo3"/>
       </w:pPr>
-      <w:bookmarkStart w:id="93" w:name="_Toc243835855"/>
+      <w:bookmarkStart w:id="93" w:name="_Toc243838029"/>
       <w:r>
         <w:rPr>
           <w:sz w:val="24"/>
@@ -35103,15 +35926,48 @@
     <w:p>
       <w:pPr>
         <w:pStyle w:val="Ttulo3"/>
-      </w:pPr>
-      <w:bookmarkStart w:id="94" w:name="_Toc243835856"/>
-      <w:r>
-        <w:rPr>
-          <w:sz w:val="24"/>
-        </w:rPr>
-        <w:t>6.3.5. Consideración final</w:t>
-      </w:r>
-      <w:bookmarkEnd w:id="94"/>
+        <w:keepNext/>
+      </w:pPr>
+      <w:r>
+        <w:t>6.3.5. Operación, MLOps y control de deriva</w:t>
+      </w:r>
+    </w:p>
+    <w:p>
+      <w:r>
+        <w:t>La evolución del prototipo exige vigilar la cadena completa, no solo el error del modelo. Cada ejecución debería registrar la versión del código, las fuentes, la hora de emisión, la vigencia del último dato y la recomendación. Los cambios de columnas, tipos, unidades o claves bloquearían la transformación; los datos ausentes, duplicados o fuera de rango quedarían como incidencias visibles. Esta disciplina evita que dependencias externas y cambios silenciosos acumulen deuda técnica en el sistema (Sculley et al., 2015).</w:t>
+      </w:r>
+    </w:p>
+    <w:p>
+      <w:r>
+        <w:t>La monitorización estadística se separaría por cultivo y estación. Incluiría la distribución de las variables, el MAE y el sesgo frente a SiAR, el error de lluvia AEMET por horizonte, la latencia y el porcentaje de abstenciones. Una alerta persistente abriría una evaluación, pero no desplegaría automáticamente un modelo nuevo. El candidato tendría que compararse con el modelo vigente, la persistencia y la vía física en un bloque temporal posterior, mantener los controles de seguridad y conservar una versión reversible. Mientras no exista una referencia de campo, esta vigilancia seguirá limitada a la referencia SiAR y no permitirá detectar por sí sola una pérdida agronómica real.</w:t>
+      </w:r>
+    </w:p>
+    <w:p>
+      <w:pPr>
+        <w:pStyle w:val="Ttulo3"/>
+        <w:keepNext/>
+      </w:pPr>
+      <w:r>
+        <w:t>6.3.6. Ciencia abierta y principios FAIR</w:t>
+      </w:r>
+    </w:p>
+    <w:p>
+      <w:r>
+        <w:t>La reutilización académica requiere que cada versión pueda encontrarse, comprenderse y reproducirse. El repositorio incorpora un archivo de citación, licencia para los activos propios, ficha del conjunto, diccionarios de variables, procedencia y comandos de reproducción. Los formatos CSV y JSON, las fechas ISO 8601 y las claves de estación, cultivo y fecha facilitan la interoperabilidad. Estas medidas aplican los principios FAIR sin confundir accesibilidad con apertura irrestricta (Wilkinson et al., 2016).</w:t>
+      </w:r>
+    </w:p>
+    <w:p>
+      <w:r>
+        <w:t>Una versión posterior podría depositarse en Zenodo para obtener un DOI, pero solo después de etiquetar una revisión inmutable y comprobar las condiciones de redistribución de SiAR y AEMET. La licencia del código no relicencia los datos de terceros. El depósito debería incluir la memoria, el código, los requisitos, las pruebas, la ficha del conjunto y los metadatos, sin tokens ni respuestas raw cuya redistribución no esté autorizada.</w:t>
+      </w:r>
+    </w:p>
+    <w:p>
+      <w:pPr>
+        <w:pStyle w:val="Ttulo3"/>
+      </w:pPr>
+      <w:r>
+        <w:t>6.3.7. Consideración final</w:t>
+      </w:r>
     </w:p>
     <w:p>
       <w:r>
@@ -35123,12 +35979,12 @@
         <w:pStyle w:val="Ttulo1"/>
         <w:pageBreakBefore/>
       </w:pPr>
-      <w:bookmarkStart w:id="95" w:name="_Toc243835857"/>
+      <w:bookmarkStart w:id="96" w:name="_Toc243838031"/>
       <w:r>
         <w:lastRenderedPageBreak/>
         <w:t>Referencias bibliográficas</w:t>
       </w:r>
-      <w:bookmarkEnd w:id="95"/>
+      <w:bookmarkEnd w:id="96"/>
     </w:p>
     <w:p>
       <w:pPr>
@@ -35787,6 +36643,23 @@
         <w:pStyle w:val="BibliografaAPA"/>
       </w:pPr>
       <w:r>
+        <w:t xml:space="preserve">Sculley, D., Holt, G., Golovin, D., Davydov, E., Phillips, T., Ebner, D., Chaudhary, V., Young, M., Crespo, J.-F., &amp; Dennison, D. (2015). Hidden technical debt in machine learning systems. Advances in Neural Information Processing Systems, 28, 2503–2511. </w:t>
+      </w:r>
+      <w:hyperlink r:id="rId50">
+        <w:r>
+          <w:rPr>
+            <w:color w:val="0563C1"/>
+            <w:u w:val="single"/>
+          </w:rPr>
+          <w:t>https://papers.neurips.cc/paper/5656-hidden-technical-debt-in-machine-learning-systems</w:t>
+        </w:r>
+      </w:hyperlink>
+    </w:p>
+    <w:p>
+      <w:pPr>
+        <w:pStyle w:val="BibliografaAPA"/>
+      </w:pPr>
+      <w:r>
         <w:t xml:space="preserve">Sistema de Información Agroclimática para el Regadío (SiAR). (s. f.). </w:t>
       </w:r>
       <w:r>
@@ -35798,7 +36671,7 @@
       <w:r>
         <w:t xml:space="preserve">. </w:t>
       </w:r>
-      <w:hyperlink r:id="rId50">
+      <w:hyperlink r:id="rId51">
         <w:r>
           <w:rPr>
             <w:color w:val="0563C1"/>
@@ -35824,7 +36697,7 @@
       <w:r>
         <w:t xml:space="preserve"> (Versión 1.66.0) [Software]. </w:t>
       </w:r>
-      <w:hyperlink r:id="rId51">
+      <w:hyperlink r:id="rId52">
         <w:r>
           <w:rPr>
             <w:color w:val="0563C1"/>
@@ -35850,7 +36723,7 @@
       <w:r>
         <w:t xml:space="preserve">(3), 16–17. </w:t>
       </w:r>
-      <w:hyperlink r:id="rId52">
+      <w:hyperlink r:id="rId53">
         <w:r>
           <w:rPr>
             <w:color w:val="0563C1"/>
@@ -35876,7 +36749,7 @@
       <w:r>
         <w:t xml:space="preserve">. Recuperado el 25 de octubre de 2026, de </w:t>
       </w:r>
-      <w:hyperlink r:id="rId53">
+      <w:hyperlink r:id="rId54">
         <w:r>
           <w:rPr>
             <w:color w:val="0563C1"/>
@@ -35902,13 +36775,30 @@
       <w:r>
         <w:t xml:space="preserve">(1), 79–82. </w:t>
       </w:r>
-      <w:hyperlink r:id="rId54">
+      <w:hyperlink r:id="rId55">
         <w:r>
           <w:rPr>
             <w:color w:val="0563C1"/>
             <w:u w:val="single"/>
           </w:rPr>
           <w:t>https://doi.org/10.3354/cr030079</w:t>
+        </w:r>
+      </w:hyperlink>
+    </w:p>
+    <w:p>
+      <w:pPr>
+        <w:pStyle w:val="BibliografaAPA"/>
+      </w:pPr>
+      <w:r>
+        <w:t xml:space="preserve">Wilkinson, M. D., Dumontier, M., Aalbersberg, I. J., Appleton, G., Axton, M., Baak, A., Blomberg, N., Boiten, J.-W., da Silva Santos, L. B., Bourne, P. E., Bouwman, J., Brookes, A. J., Clark, T., Crosas, M., Dillo, I., Dumon, O., Edmunds, S., Evelo, C. T., Finkers, R., ... Mons, B. (2016). The FAIR Guiding Principles for scientific data management and stewardship. Scientific Data, 3, 160018. </w:t>
+      </w:r>
+      <w:hyperlink r:id="rId56">
+        <w:r>
+          <w:rPr>
+            <w:color w:val="0563C1"/>
+            <w:u w:val="single"/>
+          </w:rPr>
+          <w:t>https://doi.org/10.1038/sdata.2016.18</w:t>
         </w:r>
       </w:hyperlink>
     </w:p>
@@ -35928,7 +36818,7 @@
       <w:r>
         <w:t xml:space="preserve">, 69–80. </w:t>
       </w:r>
-      <w:hyperlink r:id="rId55">
+      <w:hyperlink r:id="rId57">
         <w:r>
           <w:rPr>
             <w:color w:val="0563C1"/>
@@ -35943,6 +36833,7 @@
         <w:pStyle w:val="BibliografaAPA"/>
       </w:pPr>
       <w:r>
+        <w:lastRenderedPageBreak/>
         <w:t xml:space="preserve">Zhai, Z., Martínez, J. F., Beltran, V., &amp; Martínez, N. L. (2020). Decision support systems for agriculture 4.0: Survey and challenges. </w:t>
       </w:r>
       <w:r>
@@ -35954,7 +36845,7 @@
       <w:r>
         <w:t xml:space="preserve">, 105256. </w:t>
       </w:r>
-      <w:hyperlink r:id="rId56">
+      <w:hyperlink r:id="rId58">
         <w:r>
           <w:rPr>
             <w:color w:val="0563C1"/>
@@ -35980,7 +36871,7 @@
       <w:r>
         <w:t xml:space="preserve">(2–3), 113–132. </w:t>
       </w:r>
-      <w:hyperlink r:id="rId57">
+      <w:hyperlink r:id="rId59">
         <w:r>
           <w:rPr>
             <w:color w:val="0563C1"/>
@@ -35999,18 +36890,18 @@
       <w:pPr>
         <w:pStyle w:val="Ttulo1"/>
       </w:pPr>
-      <w:bookmarkStart w:id="96" w:name="_Toc243835858"/>
+      <w:bookmarkStart w:id="97" w:name="_Toc243838032"/>
       <w:r>
         <w:lastRenderedPageBreak/>
         <w:t>Anexo A. Reproducción y localización de las evidencias</w:t>
       </w:r>
-      <w:bookmarkEnd w:id="96"/>
+      <w:bookmarkEnd w:id="97"/>
     </w:p>
     <w:p>
       <w:r>
         <w:t xml:space="preserve">El repositorio de entrega, con código, CSV de muestra y resultados, es </w:t>
       </w:r>
-      <w:hyperlink r:id="rId58">
+      <w:hyperlink r:id="rId60">
         <w:r>
           <w:rPr>
             <w:color w:val="0563C1"/>
@@ -36022,7 +36913,7 @@
       <w:r>
         <w:t xml:space="preserve"> Procede del trabajo del equipo en </w:t>
       </w:r>
-      <w:hyperlink r:id="rId59">
+      <w:hyperlink r:id="rId61">
         <w:r>
           <w:rPr>
             <w:color w:val="0563C1"/>
@@ -36034,7 +36925,7 @@
       <w:r>
         <w:t xml:space="preserve"> las rutas siguientes corresponden al repositorio de entrega en su rama main. Los ensayos con CSV versionados y las pruebas no requieren credenciales. La aplicación pública está en </w:t>
       </w:r>
-      <w:hyperlink r:id="rId60">
+      <w:hyperlink r:id="rId62">
         <w:r>
           <w:rPr>
             <w:color w:val="0563C1"/>
@@ -36051,11 +36942,11 @@
       <w:pPr>
         <w:pStyle w:val="Ttulo2"/>
       </w:pPr>
-      <w:bookmarkStart w:id="97" w:name="_Toc243835859"/>
+      <w:bookmarkStart w:id="98" w:name="_Toc243838033"/>
       <w:r>
         <w:t>A.1. Archivos principales</w:t>
       </w:r>
-      <w:bookmarkEnd w:id="97"/>
+      <w:bookmarkEnd w:id="98"/>
     </w:p>
     <w:p>
       <w:pPr>
@@ -36091,16 +36982,22 @@
               <w:right w:val="single" w:sz="4" w:space="0" w:color="D9D9D9"/>
             </w:tcBorders>
             <w:shd w:val="clear" w:color="auto" w:fill="173F61"/>
-          </w:tcPr>
-          <w:p>
-            <w:pPr>
-              <w:spacing w:line="276" w:lineRule="auto"/>
+            <w:tcMar>
+              <w:top w:w="55" w:type="dxa"/>
+              <w:start w:w="70" w:type="dxa"/>
+              <w:bottom w:w="55" w:type="dxa"/>
+              <w:end w:w="70" w:type="dxa"/>
+            </w:tcMar>
+          </w:tcPr>
+          <w:p>
+            <w:pPr>
+              <w:spacing w:line="240" w:lineRule="auto" w:before="0" w:after="0"/>
             </w:pPr>
             <w:r>
               <w:rPr>
                 <w:b/>
                 <w:color w:val="FFFFFF"/>
-                <w:sz w:val="20"/>
+                <w:sz w:val="17"/>
               </w:rPr>
               <w:t>Etapa</w:t>
             </w:r>
@@ -36116,16 +37013,22 @@
               <w:right w:val="single" w:sz="4" w:space="0" w:color="D9D9D9"/>
             </w:tcBorders>
             <w:shd w:val="clear" w:color="auto" w:fill="173F61"/>
-          </w:tcPr>
-          <w:p>
-            <w:pPr>
-              <w:spacing w:line="276" w:lineRule="auto"/>
+            <w:tcMar>
+              <w:top w:w="55" w:type="dxa"/>
+              <w:start w:w="70" w:type="dxa"/>
+              <w:bottom w:w="55" w:type="dxa"/>
+              <w:end w:w="70" w:type="dxa"/>
+            </w:tcMar>
+          </w:tcPr>
+          <w:p>
+            <w:pPr>
+              <w:spacing w:line="240" w:lineRule="auto" w:before="0" w:after="0"/>
             </w:pPr>
             <w:r>
               <w:rPr>
                 <w:b/>
                 <w:color w:val="FFFFFF"/>
-                <w:sz w:val="20"/>
+                <w:sz w:val="17"/>
               </w:rPr>
               <w:t>Código y evidencia</w:t>
             </w:r>
@@ -36143,14 +37046,20 @@
               <w:right w:val="single" w:sz="4" w:space="0" w:color="D9D9D9"/>
             </w:tcBorders>
             <w:shd w:val="clear" w:color="auto" w:fill="FFFFFF"/>
-          </w:tcPr>
-          <w:p>
-            <w:pPr>
-              <w:spacing w:line="276" w:lineRule="auto"/>
-            </w:pPr>
-            <w:r>
-              <w:rPr>
-                <w:sz w:val="20"/>
+            <w:tcMar>
+              <w:top w:w="55" w:type="dxa"/>
+              <w:start w:w="70" w:type="dxa"/>
+              <w:bottom w:w="55" w:type="dxa"/>
+              <w:end w:w="70" w:type="dxa"/>
+            </w:tcMar>
+          </w:tcPr>
+          <w:p>
+            <w:pPr>
+              <w:spacing w:line="240" w:lineRule="auto" w:before="0" w:after="0"/>
+            </w:pPr>
+            <w:r>
+              <w:rPr>
+                <w:sz w:val="17"/>
               </w:rPr>
               <w:t>Extracción y transformación</w:t>
             </w:r>
@@ -36166,20 +37075,26 @@
               <w:right w:val="single" w:sz="4" w:space="0" w:color="D9D9D9"/>
             </w:tcBorders>
             <w:shd w:val="clear" w:color="auto" w:fill="FFFFFF"/>
-          </w:tcPr>
-          <w:p>
-            <w:pPr>
-              <w:spacing w:line="276" w:lineRule="auto"/>
-            </w:pPr>
-            <w:r>
-              <w:rPr>
-                <w:sz w:val="20"/>
+            <w:tcMar>
+              <w:top w:w="55" w:type="dxa"/>
+              <w:start w:w="70" w:type="dxa"/>
+              <w:bottom w:w="55" w:type="dxa"/>
+              <w:end w:w="70" w:type="dxa"/>
+            </w:tcMar>
+          </w:tcPr>
+          <w:p>
+            <w:pPr>
+              <w:spacing w:line="240" w:lineRule="auto" w:before="0" w:after="0"/>
+            </w:pPr>
+            <w:r>
+              <w:rPr>
+                <w:sz w:val="17"/>
               </w:rPr>
               <w:t>src/data/: extract_pilot.py, transform_interim.py</w:t>
             </w:r>
             <w:r>
               <w:rPr>
-                <w:sz w:val="20"/>
+                <w:sz w:val="17"/>
               </w:rPr>
               <w:br/>
               <w:t>docs/data_samples/: etl_volume_summary_4_1.csv</w:t>
@@ -36198,14 +37113,20 @@
               <w:right w:val="single" w:sz="4" w:space="0" w:color="D9D9D9"/>
             </w:tcBorders>
             <w:shd w:val="clear" w:color="auto" w:fill="F2F6FA"/>
-          </w:tcPr>
-          <w:p>
-            <w:pPr>
-              <w:spacing w:line="276" w:lineRule="auto"/>
-            </w:pPr>
-            <w:r>
-              <w:rPr>
-                <w:sz w:val="20"/>
+            <w:tcMar>
+              <w:top w:w="55" w:type="dxa"/>
+              <w:start w:w="70" w:type="dxa"/>
+              <w:bottom w:w="55" w:type="dxa"/>
+              <w:end w:w="70" w:type="dxa"/>
+            </w:tcMar>
+          </w:tcPr>
+          <w:p>
+            <w:pPr>
+              <w:spacing w:line="240" w:lineRule="auto" w:before="0" w:after="0"/>
+            </w:pPr>
+            <w:r>
+              <w:rPr>
+                <w:sz w:val="17"/>
               </w:rPr>
               <w:t>EDA y variables</w:t>
             </w:r>
@@ -36221,20 +37142,26 @@
               <w:right w:val="single" w:sz="4" w:space="0" w:color="D9D9D9"/>
             </w:tcBorders>
             <w:shd w:val="clear" w:color="auto" w:fill="F2F6FA"/>
-          </w:tcPr>
-          <w:p>
-            <w:pPr>
-              <w:spacing w:line="276" w:lineRule="auto"/>
-            </w:pPr>
-            <w:r>
-              <w:rPr>
-                <w:sz w:val="20"/>
+            <w:tcMar>
+              <w:top w:w="55" w:type="dxa"/>
+              <w:start w:w="70" w:type="dxa"/>
+              <w:bottom w:w="55" w:type="dxa"/>
+              <w:end w:w="70" w:type="dxa"/>
+            </w:tcMar>
+          </w:tcPr>
+          <w:p>
+            <w:pPr>
+              <w:spacing w:line="240" w:lineRule="auto" w:before="0" w:after="0"/>
+            </w:pPr>
+            <w:r>
+              <w:rPr>
+                <w:sz w:val="17"/>
               </w:rPr>
               <w:t>src/analysis/: build_eda_4_2.py</w:t>
             </w:r>
             <w:r>
               <w:rPr>
-                <w:sz w:val="20"/>
+                <w:sz w:val="17"/>
               </w:rPr>
               <w:br/>
               <w:t>docs/data_samples/: feature_catalog_4_2.csv</w:t>
@@ -36253,14 +37180,20 @@
               <w:right w:val="single" w:sz="4" w:space="0" w:color="D9D9D9"/>
             </w:tcBorders>
             <w:shd w:val="clear" w:color="auto" w:fill="FFFFFF"/>
-          </w:tcPr>
-          <w:p>
-            <w:pPr>
-              <w:spacing w:line="276" w:lineRule="auto"/>
-            </w:pPr>
-            <w:r>
-              <w:rPr>
-                <w:sz w:val="20"/>
+            <w:tcMar>
+              <w:top w:w="55" w:type="dxa"/>
+              <w:start w:w="70" w:type="dxa"/>
+              <w:bottom w:w="55" w:type="dxa"/>
+              <w:end w:w="70" w:type="dxa"/>
+            </w:tcMar>
+          </w:tcPr>
+          <w:p>
+            <w:pPr>
+              <w:spacing w:line="240" w:lineRule="auto" w:before="0" w:after="0"/>
+            </w:pPr>
+            <w:r>
+              <w:rPr>
+                <w:sz w:val="17"/>
               </w:rPr>
               <w:t>Comparación de modelos</w:t>
             </w:r>
@@ -36276,10 +37209,22 @@
               <w:right w:val="single" w:sz="4" w:space="0" w:color="D9D9D9"/>
             </w:tcBorders>
             <w:shd w:val="clear" w:color="auto" w:fill="FFFFFF"/>
-          </w:tcPr>
-          <w:p>
-            <w:r>
-              <w:t>src/models/train_evaluate.py y retrain_cases_2026.py; docs/data_samples/model_evaluation_4_3.json y model_retraining_2026.json</w:t>
+            <w:tcMar>
+              <w:top w:w="55" w:type="dxa"/>
+              <w:start w:w="70" w:type="dxa"/>
+              <w:bottom w:w="55" w:type="dxa"/>
+              <w:end w:w="70" w:type="dxa"/>
+            </w:tcMar>
+          </w:tcPr>
+          <w:p>
+            <w:pPr>
+              <w:spacing w:before="0" w:after="0" w:line="240" w:lineRule="auto"/>
+            </w:pPr>
+            <w:r>
+              <w:rPr>
+                <w:sz w:val="17"/>
+              </w:rPr>
+              <w:t>src/models/train_evaluate.py y retrain_cases_2026.py; docs/data_samples/model_evaluation_4_3.json y model_retraining_2026.json; src/analysis/build_xai_4_3.py; docs/data_samples/xai_analysis_4_3.json y xai_feature_importance_4_3.csv</w:t>
             </w:r>
           </w:p>
         </w:tc>
@@ -36295,14 +37240,20 @@
               <w:right w:val="single" w:sz="4" w:space="0" w:color="D9D9D9"/>
             </w:tcBorders>
             <w:shd w:val="clear" w:color="auto" w:fill="F2F6FA"/>
-          </w:tcPr>
-          <w:p>
-            <w:pPr>
-              <w:spacing w:line="276" w:lineRule="auto"/>
-            </w:pPr>
-            <w:r>
-              <w:rPr>
-                <w:sz w:val="20"/>
+            <w:tcMar>
+              <w:top w:w="55" w:type="dxa"/>
+              <w:start w:w="70" w:type="dxa"/>
+              <w:bottom w:w="55" w:type="dxa"/>
+              <w:end w:w="70" w:type="dxa"/>
+            </w:tcMar>
+          </w:tcPr>
+          <w:p>
+            <w:pPr>
+              <w:spacing w:line="240" w:lineRule="auto" w:before="0" w:after="0"/>
+            </w:pPr>
+            <w:r>
+              <w:rPr>
+                <w:sz w:val="17"/>
               </w:rPr>
               <w:t>Recomendación y validación</w:t>
             </w:r>
@@ -36318,9 +37269,21 @@
               <w:right w:val="single" w:sz="4" w:space="0" w:color="D9D9D9"/>
             </w:tcBorders>
             <w:shd w:val="clear" w:color="auto" w:fill="F2F6FA"/>
-          </w:tcPr>
-          <w:p>
-            <w:r>
+            <w:tcMar>
+              <w:top w:w="55" w:type="dxa"/>
+              <w:start w:w="70" w:type="dxa"/>
+              <w:bottom w:w="55" w:type="dxa"/>
+              <w:end w:w="70" w:type="dxa"/>
+            </w:tcMar>
+          </w:tcPr>
+          <w:p>
+            <w:pPr>
+              <w:spacing w:before="0" w:after="0" w:line="240" w:lineRule="auto"/>
+            </w:pPr>
+            <w:r>
+              <w:rPr>
+                <w:sz w:val="17"/>
+              </w:rPr>
               <w:t>src/models/train_etc_for_dss.py; src/dss/predict_etc.py, engine.py y app_streamlit.py; docs/data_samples/etc_model_deployment_2026.json y dss_validation_5_3.json; modelos en models/deployed_etc_2026/</w:t>
             </w:r>
           </w:p>
@@ -36337,14 +37300,20 @@
               <w:right w:val="single" w:sz="4" w:space="0" w:color="D9D9D9"/>
             </w:tcBorders>
             <w:shd w:val="clear" w:color="auto" w:fill="FFFFFF"/>
-          </w:tcPr>
-          <w:p>
-            <w:pPr>
-              <w:spacing w:line="276" w:lineRule="auto"/>
-            </w:pPr>
-            <w:r>
-              <w:rPr>
-                <w:sz w:val="20"/>
+            <w:tcMar>
+              <w:top w:w="55" w:type="dxa"/>
+              <w:start w:w="70" w:type="dxa"/>
+              <w:bottom w:w="55" w:type="dxa"/>
+              <w:end w:w="70" w:type="dxa"/>
+            </w:tcMar>
+          </w:tcPr>
+          <w:p>
+            <w:pPr>
+              <w:spacing w:line="240" w:lineRule="auto" w:before="0" w:after="0"/>
+            </w:pPr>
+            <w:r>
+              <w:rPr>
+                <w:sz w:val="17"/>
               </w:rPr>
               <w:t>Pruebas automáticas</w:t>
             </w:r>
@@ -36360,14 +37329,20 @@
               <w:right w:val="single" w:sz="4" w:space="0" w:color="D9D9D9"/>
             </w:tcBorders>
             <w:shd w:val="clear" w:color="auto" w:fill="FFFFFF"/>
-          </w:tcPr>
-          <w:p>
-            <w:pPr>
-              <w:spacing w:line="276" w:lineRule="auto"/>
-            </w:pPr>
-            <w:r>
-              <w:rPr>
-                <w:sz w:val="20"/>
+            <w:tcMar>
+              <w:top w:w="55" w:type="dxa"/>
+              <w:start w:w="70" w:type="dxa"/>
+              <w:bottom w:w="55" w:type="dxa"/>
+              <w:end w:w="70" w:type="dxa"/>
+            </w:tcMar>
+          </w:tcPr>
+          <w:p>
+            <w:pPr>
+              <w:spacing w:line="240" w:lineRule="auto" w:before="0" w:after="0"/>
+            </w:pPr>
+            <w:r>
+              <w:rPr>
+                <w:sz w:val="17"/>
               </w:rPr>
               <w:t>tests/</w:t>
             </w:r>
@@ -36379,11 +37354,11 @@
       <w:pPr>
         <w:pStyle w:val="Ttulo2"/>
       </w:pPr>
-      <w:bookmarkStart w:id="98" w:name="_Toc243835860"/>
+      <w:bookmarkStart w:id="99" w:name="_Toc243838034"/>
       <w:r>
         <w:t>A.2. Secuencia mínima de reproducción</w:t>
       </w:r>
-      <w:bookmarkEnd w:id="98"/>
+      <w:bookmarkEnd w:id="99"/>
     </w:p>
     <w:p>
       <w:r>
@@ -36392,77 +37367,100 @@
     </w:p>
     <w:p>
       <w:pPr>
-        <w:spacing w:after="40"/>
+        <w:spacing w:after="0" w:before="0" w:line="240" w:lineRule="auto"/>
         <w:ind w:left="283"/>
       </w:pPr>
       <w:r>
         <w:rPr>
-          <w:sz w:val="20"/>
+          <w:sz w:val="19"/>
         </w:rPr>
         <w:t>python -m src.analysis.build_etl_audit_4_1</w:t>
       </w:r>
     </w:p>
     <w:p>
       <w:pPr>
-        <w:spacing w:after="40"/>
+        <w:spacing w:after="0" w:before="0" w:line="240" w:lineRule="auto"/>
         <w:ind w:left="283"/>
       </w:pPr>
       <w:r>
         <w:rPr>
-          <w:sz w:val="20"/>
+          <w:sz w:val="19"/>
         </w:rPr>
         <w:t>python -m src.analysis.build_eda_4_2</w:t>
       </w:r>
     </w:p>
     <w:p>
       <w:pPr>
-        <w:spacing w:after="40"/>
+        <w:spacing w:after="0" w:before="0" w:line="240" w:lineRule="auto"/>
         <w:ind w:left="283"/>
       </w:pPr>
       <w:r>
         <w:rPr>
-          <w:sz w:val="20"/>
+          <w:sz w:val="19"/>
         </w:rPr>
         <w:t>python -m src.models.train_evaluate</w:t>
       </w:r>
     </w:p>
     <w:p>
       <w:pPr>
-        <w:spacing w:after="40"/>
+        <w:spacing w:before="0" w:after="0" w:line="240" w:lineRule="auto"/>
+      </w:pPr>
+      <w:r>
+        <w:rPr>
+          <w:sz w:val="19"/>
+        </w:rPr>
+        <w:t>python -m src.analysis.build_xai_4_3</w:t>
+      </w:r>
+    </w:p>
+    <w:p>
+      <w:pPr>
+        <w:spacing w:after="0" w:before="0" w:line="240" w:lineRule="auto"/>
         <w:ind w:left="283"/>
       </w:pPr>
       <w:r>
         <w:rPr>
-          <w:sz w:val="20"/>
+          <w:sz w:val="19"/>
         </w:rPr>
         <w:t>python -m src.analysis.build_validation_5_3</w:t>
       </w:r>
     </w:p>
     <w:p>
-      <w:r>
+      <w:pPr>
+        <w:spacing w:before="0" w:after="0" w:line="240" w:lineRule="auto"/>
+      </w:pPr>
+      <w:r>
+        <w:rPr>
+          <w:sz w:val="19"/>
+        </w:rPr>
         <w:t>python -m src.models.retrain_cases_2026</w:t>
       </w:r>
     </w:p>
     <w:p>
-      <w:r>
+      <w:pPr>
+        <w:spacing w:before="0" w:after="0" w:line="240" w:lineRule="auto"/>
+      </w:pPr>
+      <w:r>
+        <w:rPr>
+          <w:sz w:val="19"/>
+        </w:rPr>
         <w:t>python -m src.models.train_etc_for_dss</w:t>
       </w:r>
     </w:p>
     <w:p>
       <w:pPr>
-        <w:spacing w:after="40"/>
+        <w:spacing w:after="0" w:before="0" w:line="240" w:lineRule="auto"/>
         <w:ind w:left="283"/>
       </w:pPr>
       <w:r>
         <w:rPr>
-          <w:sz w:val="20"/>
+          <w:sz w:val="19"/>
         </w:rPr>
         <w:t>python -m unittest discover -s tests</w:t>
       </w:r>
     </w:p>
     <w:sectPr>
-      <w:headerReference w:type="default" r:id="rId61"/>
-      <w:footerReference w:type="default" r:id="rId62"/>
+      <w:headerReference w:type="default" r:id="rId63"/>
+      <w:footerReference w:type="default" r:id="rId64"/>
       <w:pgSz w:w="11906" w:h="16838" w:code="9"/>
       <w:pgMar w:top="1134" w:right="1134" w:bottom="1134" w:left="1134" w:header="567" w:footer="567" w:gutter="0"/>
       <w:cols w:space="708"/>
@@ -39523,6 +40521,21 @@
 </file>
 
 <file path=customXml/item1.xml><?xml version="1.0" encoding="utf-8"?>
+<?mso-contentType ?>
+<FormTemplates xmlns="http://schemas.microsoft.com/sharepoint/v3/contenttype/forms">
+  <Display>DocumentLibraryForm</Display>
+  <Edit>DocumentLibraryForm</Edit>
+  <New>DocumentLibraryForm</New>
+</FormTemplates>
+</file>
+
+<file path=customXml/item2.xml><?xml version="1.0" encoding="utf-8"?>
+<p:properties xmlns:p="http://schemas.microsoft.com/office/2006/metadata/properties" xmlns:xsi="http://www.w3.org/2001/XMLSchema-instance" xmlns:pc="http://schemas.microsoft.com/office/infopath/2007/PartnerControls">
+  <documentManagement/>
+</p:properties>
+</file>
+
+<file path=customXml/item3.xml><?xml version="1.0" encoding="utf-8"?>
 <ct:contentTypeSchema xmlns:ct="http://schemas.microsoft.com/office/2006/metadata/contentType" xmlns:ma="http://schemas.microsoft.com/office/2006/metadata/properties/metaAttributes" ct:_="" ma:_="" ma:contentTypeName="Documento" ma:contentTypeID="0x01010019FAAD7208B57F46B26AFFED99BCE0D3" ma:contentTypeVersion="12" ma:contentTypeDescription="Crear nuevo documento." ma:contentTypeScope="" ma:versionID="1ef574cbf204855aeab3c40b347ffcdd">
   <xsd:schema xmlns:xsd="http://www.w3.org/2001/XMLSchema" xmlns:xs="http://www.w3.org/2001/XMLSchema" xmlns:p="http://schemas.microsoft.com/office/2006/metadata/properties" xmlns:ns2="9d7b9a5c-6b4f-4ca1-bb03-c38cacb734bc" xmlns:ns3="7d80c08f-e909-465c-8aa4-0e649fbe85d0" targetNamespace="http://schemas.microsoft.com/office/2006/metadata/properties" ma:root="true" ma:fieldsID="d90f8574e5bf50e8ad773515e43a9e2d" ns2:_="" ns3:_="">
     <xsd:import namespace="9d7b9a5c-6b4f-4ca1-bb03-c38cacb734bc"/>
@@ -39739,22 +40752,24 @@
 </ct:contentTypeSchema>
 </file>
 
-<file path=customXml/item2.xml><?xml version="1.0" encoding="utf-8"?>
-<?mso-contentType ?>
-<FormTemplates xmlns="http://schemas.microsoft.com/sharepoint/v3/contenttype/forms">
-  <Display>DocumentLibraryForm</Display>
-  <Edit>DocumentLibraryForm</Edit>
-  <New>DocumentLibraryForm</New>
-</FormTemplates>
+<file path=customXml/itemProps1.xml><?xml version="1.0" encoding="utf-8"?>
+<ds:datastoreItem xmlns:ds="http://schemas.openxmlformats.org/officeDocument/2006/customXml" ds:itemID="{E5FD6A2B-9479-4129-9D84-6C858DBE1A90}">
+  <ds:schemaRefs>
+    <ds:schemaRef ds:uri="http://schemas.microsoft.com/sharepoint/v3/contenttype/forms"/>
+  </ds:schemaRefs>
+</ds:datastoreItem>
 </file>
 
-<file path=customXml/item3.xml><?xml version="1.0" encoding="utf-8"?>
-<p:properties xmlns:p="http://schemas.microsoft.com/office/2006/metadata/properties" xmlns:xsi="http://www.w3.org/2001/XMLSchema-instance" xmlns:pc="http://schemas.microsoft.com/office/infopath/2007/PartnerControls">
-  <documentManagement/>
-</p:properties>
+<file path=customXml/itemProps2.xml><?xml version="1.0" encoding="utf-8"?>
+<ds:datastoreItem xmlns:ds="http://schemas.openxmlformats.org/officeDocument/2006/customXml" ds:itemID="{261B0A37-6C6C-45CF-A5C4-83D994BC3980}">
+  <ds:schemaRefs>
+    <ds:schemaRef ds:uri="http://schemas.microsoft.com/office/2006/metadata/properties"/>
+    <ds:schemaRef ds:uri="http://schemas.microsoft.com/office/infopath/2007/PartnerControls"/>
+  </ds:schemaRefs>
+</ds:datastoreItem>
 </file>
 
-<file path=customXml/itemProps1.xml><?xml version="1.0" encoding="utf-8"?>
+<file path=customXml/itemProps3.xml><?xml version="1.0" encoding="utf-8"?>
 <ds:datastoreItem xmlns:ds="http://schemas.openxmlformats.org/officeDocument/2006/customXml" ds:itemID="{01B4916B-2905-40FE-B973-786E02856A77}">
   <ds:schemaRefs>
     <ds:schemaRef ds:uri="http://schemas.microsoft.com/office/2006/metadata/contentType"/>
@@ -39771,21 +40786,4 @@
     <ds:schemaRef ds:uri="http://schemas.microsoft.com/internal/obd"/>
   </ds:schemaRefs>
 </ds:datastoreItem>
-</file>
-
-<file path=customXml/itemProps2.xml><?xml version="1.0" encoding="utf-8"?>
-<ds:datastoreItem xmlns:ds="http://schemas.openxmlformats.org/officeDocument/2006/customXml" ds:itemID="{E5FD6A2B-9479-4129-9D84-6C858DBE1A90}">
-  <ds:schemaRefs>
-    <ds:schemaRef ds:uri="http://schemas.microsoft.com/sharepoint/v3/contenttype/forms"/>
-  </ds:schemaRefs>
-</ds:datastoreItem>
-</file>
-
-<file path=customXml/itemProps3.xml><?xml version="1.0" encoding="utf-8"?>
-<ds:datastoreItem xmlns:ds="http://schemas.openxmlformats.org/officeDocument/2006/customXml" ds:itemID="{261B0A37-6C6C-45CF-A5C4-83D994BC3980}">
-  <ds:schemaRefs>
-    <ds:schemaRef ds:uri="http://schemas.microsoft.com/office/2006/metadata/properties"/>
-    <ds:schemaRef ds:uri="http://schemas.microsoft.com/office/infopath/2007/PartnerControls"/>
-  </ds:schemaRefs>
-</ds:datastoreItem>
 </file>
</xml_diff>

<commit_message>
Auditar memoria y ordenar documentación final
</commit_message>
<xml_diff>
--- a/docs/memoria/TFM_definitivo_2026-10-25.docx
+++ b/docs/memoria/TFM_definitivo_2026-10-25.docx
@@ -10443,7 +10443,7 @@
           <wp:inline distT="0" distB="0" distL="0" distR="0" wp14:anchorId="3D43793B" wp14:editId="608EAFA3">
             <wp:extent cx="5577840" cy="3353664"/>
             <wp:effectExtent l="0" t="0" r="0" b="0"/>
-            <wp:docPr id="30" name="Picture 30"/>
+            <wp:docPr id="30" name="Picture 30" descr="Figura 3.1. Arquitectura del prototipo. Las cajas azules representan componentes implementados y las cajas discontinuas identifican extensiones previstas."/>
             <wp:cNvGraphicFramePr>
               <a:graphicFrameLocks xmlns:a="http://schemas.openxmlformats.org/drawingml/2006/main" noChangeAspect="1"/>
             </wp:cNvGraphicFramePr>
@@ -12376,7 +12376,7 @@
           <wp:inline distT="0" distB="0" distL="0" distR="0" wp14:anchorId="5CF4ECEF" wp14:editId="3B327C2B">
             <wp:extent cx="5577840" cy="3236939"/>
             <wp:effectExtent l="0" t="0" r="0" b="0"/>
-            <wp:docPr id="31" name="Picture 31"/>
+            <wp:docPr id="31" name="Picture 31" descr="Figura 4.1. ETL del caso piloto desde su configuración hasta la tabla analítica. Los gráficos inferiores utilizan datos reales de la extracción del 24 de septiembre de 2026."/>
             <wp:cNvGraphicFramePr>
               <a:graphicFrameLocks xmlns:a="http://schemas.openxmlformats.org/drawingml/2006/main" noChangeAspect="1"/>
             </wp:cNvGraphicFramePr>
@@ -24733,7 +24733,7 @@
           <wp:inline distT="0" distB="0" distL="0" distR="0" wp14:anchorId="1AD25451" wp14:editId="11F960F9">
             <wp:extent cx="5212080" cy="3571970"/>
             <wp:effectExtent l="0" t="0" r="0" b="0"/>
-            <wp:docPr id="32" name="Picture 32"/>
+            <wp:docPr id="32" name="Picture 32" descr="Figura 4.7. Predicciones y errores diarios de los seis enfoques en el tramo de prueba."/>
             <wp:cNvGraphicFramePr>
               <a:graphicFrameLocks xmlns:a="http://schemas.openxmlformats.org/drawingml/2006/main" noChangeAspect="1"/>
             </wp:cNvGraphicFramePr>
@@ -24914,6 +24914,9 @@
         <w:gridCol w:w="2851"/>
       </w:tblGrid>
       <w:tr>
+        <w:trPr>
+          <w:tblHeader/>
+        </w:trPr>
         <w:tc>
           <w:tcPr>
             <w:tcW w:w="2333" w:type="dxa"/>
@@ -25739,7 +25742,7 @@
           <wp:inline distT="0" distB="0" distL="0" distR="0" wp14:anchorId="5DB75AF7" wp14:editId="5E29939D">
             <wp:extent cx="4709160" cy="2563347"/>
             <wp:effectExtent l="0" t="0" r="0" b="0"/>
-            <wp:docPr id="33" name="Picture 33"/>
+            <wp:docPr id="33" name="Picture 33" descr="Figura 4.8. Error del modelo elegido en validación temporal y prueba final para seis casos. Fuente: elaboración propia a partir de los CSV SiAR."/>
             <wp:cNvGraphicFramePr>
               <a:graphicFrameLocks xmlns:a="http://schemas.openxmlformats.org/drawingml/2006/main" noChangeAspect="1"/>
             </wp:cNvGraphicFramePr>
@@ -25829,6 +25832,9 @@
         <w:gridCol w:w="1354"/>
       </w:tblGrid>
       <w:tr>
+        <w:trPr>
+          <w:tblHeader/>
+        </w:trPr>
         <w:tc>
           <w:tcPr>
             <w:tcW w:w="2131" w:type="dxa"/>
@@ -27159,7 +27165,7 @@
           <wp:inline distT="0" distB="0" distL="0" distR="0" wp14:anchorId="397D5CBD" wp14:editId="195B83AC">
             <wp:extent cx="5832000" cy="4587977"/>
             <wp:effectExtent l="0" t="0" r="0" b="0"/>
-            <wp:docPr id="34" name="Picture 34"/>
+            <wp:docPr id="34" name="Picture 34" descr="Figura 4.9. Importancia global y explicaciones locales de Random Forest y XGBoost mediante TreeSHAP. Fuente: elaboración propia."/>
             <wp:cNvGraphicFramePr>
               <a:graphicFrameLocks xmlns:a="http://schemas.openxmlformats.org/drawingml/2006/main" noChangeAspect="1"/>
             </wp:cNvGraphicFramePr>
@@ -35458,7 +35464,7 @@
           </w:tcPr>
           <w:p>
             <w:r>
-              <w:t>Demo pública con selección entre casos SiAR verificados y consulta AEMET para casos vigentes. Sin evaluación con usuarios ni catálogo nacional.</w:t>
+              <w:t>Prototipo público con selección entre casos SiAR verificados y consulta AEMET para casos vigentes. Sin evaluación con usuarios ni catálogo nacional.</w:t>
             </w:r>
           </w:p>
         </w:tc>
@@ -36179,7 +36185,7 @@
           </w:tcPr>
           <w:p>
             <w:r>
-              <w:t>Que la demo publicada equivalga a una plataforma operativa continua</w:t>
+              <w:t>Que el prototipo publicado equivalga a una plataforma operativa continua</w:t>
             </w:r>
           </w:p>
         </w:tc>

</xml_diff>

<commit_message>
Auditar memoria y ordenar la documentación final (#25)
Revisión final de las 90 páginas, mejoras de accesibilidad y reorganización conservadora de la documentación histórica.
</commit_message>
<xml_diff>
--- a/docs/memoria/TFM_definitivo_2026-10-25.docx
+++ b/docs/memoria/TFM_definitivo_2026-10-25.docx
@@ -10443,7 +10443,7 @@
           <wp:inline distT="0" distB="0" distL="0" distR="0" wp14:anchorId="3D43793B" wp14:editId="608EAFA3">
             <wp:extent cx="5577840" cy="3353664"/>
             <wp:effectExtent l="0" t="0" r="0" b="0"/>
-            <wp:docPr id="30" name="Picture 30"/>
+            <wp:docPr id="30" name="Picture 30" descr="Figura 3.1. Arquitectura del prototipo. Las cajas azules representan componentes implementados y las cajas discontinuas identifican extensiones previstas."/>
             <wp:cNvGraphicFramePr>
               <a:graphicFrameLocks xmlns:a="http://schemas.openxmlformats.org/drawingml/2006/main" noChangeAspect="1"/>
             </wp:cNvGraphicFramePr>
@@ -12376,7 +12376,7 @@
           <wp:inline distT="0" distB="0" distL="0" distR="0" wp14:anchorId="5CF4ECEF" wp14:editId="3B327C2B">
             <wp:extent cx="5577840" cy="3236939"/>
             <wp:effectExtent l="0" t="0" r="0" b="0"/>
-            <wp:docPr id="31" name="Picture 31"/>
+            <wp:docPr id="31" name="Picture 31" descr="Figura 4.1. ETL del caso piloto desde su configuración hasta la tabla analítica. Los gráficos inferiores utilizan datos reales de la extracción del 24 de septiembre de 2026."/>
             <wp:cNvGraphicFramePr>
               <a:graphicFrameLocks xmlns:a="http://schemas.openxmlformats.org/drawingml/2006/main" noChangeAspect="1"/>
             </wp:cNvGraphicFramePr>
@@ -24733,7 +24733,7 @@
           <wp:inline distT="0" distB="0" distL="0" distR="0" wp14:anchorId="1AD25451" wp14:editId="11F960F9">
             <wp:extent cx="5212080" cy="3571970"/>
             <wp:effectExtent l="0" t="0" r="0" b="0"/>
-            <wp:docPr id="32" name="Picture 32"/>
+            <wp:docPr id="32" name="Picture 32" descr="Figura 4.7. Predicciones y errores diarios de los seis enfoques en el tramo de prueba."/>
             <wp:cNvGraphicFramePr>
               <a:graphicFrameLocks xmlns:a="http://schemas.openxmlformats.org/drawingml/2006/main" noChangeAspect="1"/>
             </wp:cNvGraphicFramePr>
@@ -24914,6 +24914,9 @@
         <w:gridCol w:w="2851"/>
       </w:tblGrid>
       <w:tr>
+        <w:trPr>
+          <w:tblHeader/>
+        </w:trPr>
         <w:tc>
           <w:tcPr>
             <w:tcW w:w="2333" w:type="dxa"/>
@@ -25739,7 +25742,7 @@
           <wp:inline distT="0" distB="0" distL="0" distR="0" wp14:anchorId="5DB75AF7" wp14:editId="5E29939D">
             <wp:extent cx="4709160" cy="2563347"/>
             <wp:effectExtent l="0" t="0" r="0" b="0"/>
-            <wp:docPr id="33" name="Picture 33"/>
+            <wp:docPr id="33" name="Picture 33" descr="Figura 4.8. Error del modelo elegido en validación temporal y prueba final para seis casos. Fuente: elaboración propia a partir de los CSV SiAR."/>
             <wp:cNvGraphicFramePr>
               <a:graphicFrameLocks xmlns:a="http://schemas.openxmlformats.org/drawingml/2006/main" noChangeAspect="1"/>
             </wp:cNvGraphicFramePr>
@@ -25829,6 +25832,9 @@
         <w:gridCol w:w="1354"/>
       </w:tblGrid>
       <w:tr>
+        <w:trPr>
+          <w:tblHeader/>
+        </w:trPr>
         <w:tc>
           <w:tcPr>
             <w:tcW w:w="2131" w:type="dxa"/>
@@ -27159,7 +27165,7 @@
           <wp:inline distT="0" distB="0" distL="0" distR="0" wp14:anchorId="397D5CBD" wp14:editId="195B83AC">
             <wp:extent cx="5832000" cy="4587977"/>
             <wp:effectExtent l="0" t="0" r="0" b="0"/>
-            <wp:docPr id="34" name="Picture 34"/>
+            <wp:docPr id="34" name="Picture 34" descr="Figura 4.9. Importancia global y explicaciones locales de Random Forest y XGBoost mediante TreeSHAP. Fuente: elaboración propia."/>
             <wp:cNvGraphicFramePr>
               <a:graphicFrameLocks xmlns:a="http://schemas.openxmlformats.org/drawingml/2006/main" noChangeAspect="1"/>
             </wp:cNvGraphicFramePr>
@@ -35458,7 +35464,7 @@
           </w:tcPr>
           <w:p>
             <w:r>
-              <w:t>Demo pública con selección entre casos SiAR verificados y consulta AEMET para casos vigentes. Sin evaluación con usuarios ni catálogo nacional.</w:t>
+              <w:t>Prototipo público con selección entre casos SiAR verificados y consulta AEMET para casos vigentes. Sin evaluación con usuarios ni catálogo nacional.</w:t>
             </w:r>
           </w:p>
         </w:tc>
@@ -36179,7 +36185,7 @@
           </w:tcPr>
           <w:p>
             <w:r>
-              <w:t>Que la demo publicada equivalga a una plataforma operativa continua</w:t>
+              <w:t>Que el prototipo publicado equivalga a una plataforma operativa continua</w:t>
             </w:r>
           </w:p>
         </w:tc>

</xml_diff>

<commit_message>
Reorganizar documentación para la entrega final
</commit_message>
<xml_diff>
--- a/docs/memoria/TFM_definitivo_2026-10-25.docx
+++ b/docs/memoria/TFM_definitivo_2026-10-25.docx
@@ -9537,7 +9537,7 @@
     </w:p>
     <w:p>
       <w:r>
-        <w:t>Los inventarios completos de campos, endpoints, significado y prioridad ya se mantienen en docs/FUENTE_DATOS_SIAR.md y docs/FUENTE_DATOS_AEMET.md. La estrategia de combinación se documenta en docs/ESTRATEGIA_DATOS_DSS.md; por tanto, este apartado resume las decisiones metodológicas sin duplicar esos diccionarios técnicos.</w:t>
+        <w:t>Los inventarios completos de campos, endpoints, significado y prioridad ya se mantienen en docs/tecnica/FUENTE_DATOS_SIAR.md y docs/tecnica/FUENTE_DATOS_AEMET.md. La estrategia de combinación se documenta en docs/tecnica/ESTRATEGIA_DATOS_DSS.md; por tanto, este apartado resume las decisiones metodológicas sin duplicar esos diccionarios técnicos.</w:t>
       </w:r>
     </w:p>
     <w:p>
@@ -12326,7 +12326,7 @@
     </w:p>
     <w:p>
       <w:r>
-        <w:t>Las credenciales se conservan en .env, excluido de Git. Las capas raw, interim y processed también se excluyen por defecto. Una excepción acotada de datos públicos del piloto permite reconstruir la ETL sin tokens; se documenta en docs/REPRODUCCION_PILOTO.md. Se versionan asimismo código, métricas y figuras.</w:t>
+        <w:t>Las credenciales se conservan en .env, excluido de Git. Las capas raw, interim y processed también se excluyen por defecto. Una excepción acotada de datos públicos del piloto permite reconstruir la ETL sin tokens; se documenta en docs/tecnica/REPRODUCCION_PILOTO.md. Se versionan asimismo código, métricas y figuras.</w:t>
       </w:r>
     </w:p>
     <w:p>

</xml_diff>

<commit_message>
Reorganizar documentación para la entrega final (#27)
Agrupa la documentación por finalidad, retira carpetas vacías del árbol público y actualiza las rutas de la memoria y sus evidencias.
</commit_message>
<xml_diff>
--- a/docs/memoria/TFM_definitivo_2026-10-25.docx
+++ b/docs/memoria/TFM_definitivo_2026-10-25.docx
@@ -9537,7 +9537,7 @@
     </w:p>
     <w:p>
       <w:r>
-        <w:t>Los inventarios completos de campos, endpoints, significado y prioridad ya se mantienen en docs/FUENTE_DATOS_SIAR.md y docs/FUENTE_DATOS_AEMET.md. La estrategia de combinación se documenta en docs/ESTRATEGIA_DATOS_DSS.md; por tanto, este apartado resume las decisiones metodológicas sin duplicar esos diccionarios técnicos.</w:t>
+        <w:t>Los inventarios completos de campos, endpoints, significado y prioridad ya se mantienen en docs/tecnica/FUENTE_DATOS_SIAR.md y docs/tecnica/FUENTE_DATOS_AEMET.md. La estrategia de combinación se documenta en docs/tecnica/ESTRATEGIA_DATOS_DSS.md; por tanto, este apartado resume las decisiones metodológicas sin duplicar esos diccionarios técnicos.</w:t>
       </w:r>
     </w:p>
     <w:p>
@@ -12326,7 +12326,7 @@
     </w:p>
     <w:p>
       <w:r>
-        <w:t>Las credenciales se conservan en .env, excluido de Git. Las capas raw, interim y processed también se excluyen por defecto. Una excepción acotada de datos públicos del piloto permite reconstruir la ETL sin tokens; se documenta en docs/REPRODUCCION_PILOTO.md. Se versionan asimismo código, métricas y figuras.</w:t>
+        <w:t>Las credenciales se conservan en .env, excluido de Git. Las capas raw, interim y processed también se excluyen por defecto. Una excepción acotada de datos públicos del piloto permite reconstruir la ETL sin tokens; se documenta en docs/tecnica/REPRODUCCION_PILOTO.md. Se versionan asimismo código, métricas y figuras.</w:t>
       </w:r>
     </w:p>
     <w:p>

</xml_diff>

<commit_message>
Añadir validación temporal multicaso del DSS
</commit_message>
<xml_diff>
--- a/docs/memoria/TFM_definitivo_2026-10-25.docx
+++ b/docs/memoria/TFM_definitivo_2026-10-25.docx
@@ -374,7 +374,7 @@
       <w:r>
         <w:fldChar w:fldCharType="separate"/>
       </w:r>
-      <w:hyperlink w:anchor="_Toc243865165" w:history="1">
+      <w:hyperlink w:anchor="_Toc244028791" w:history="1">
         <w:r>
           <w:rPr>
             <w:rStyle w:val="Hipervnculo"/>
@@ -401,7 +401,7 @@
             <w:noProof/>
             <w:webHidden/>
           </w:rPr>
-          <w:instrText xml:space="preserve"> PAGEREF _Toc243865165 \h </w:instrText>
+          <w:instrText xml:space="preserve"> PAGEREF _Toc244028791 \h </w:instrText>
         </w:r>
         <w:r>
           <w:rPr>
@@ -448,7 +448,7 @@
           <w14:ligatures w14:val="standardContextual"/>
         </w:rPr>
       </w:pPr>
-      <w:hyperlink w:anchor="_Toc243865166" w:history="1">
+      <w:hyperlink w:anchor="_Toc244028792" w:history="1">
         <w:r>
           <w:rPr>
             <w:rStyle w:val="Hipervnculo"/>
@@ -475,7 +475,7 @@
             <w:noProof/>
             <w:webHidden/>
           </w:rPr>
-          <w:instrText xml:space="preserve"> PAGEREF _Toc243865166 \h </w:instrText>
+          <w:instrText xml:space="preserve"> PAGEREF _Toc244028792 \h </w:instrText>
         </w:r>
         <w:r>
           <w:rPr>
@@ -522,7 +522,7 @@
           <w14:ligatures w14:val="standardContextual"/>
         </w:rPr>
       </w:pPr>
-      <w:hyperlink w:anchor="_Toc243865167" w:history="1">
+      <w:hyperlink w:anchor="_Toc244028793" w:history="1">
         <w:r>
           <w:rPr>
             <w:rStyle w:val="Hipervnculo"/>
@@ -549,7 +549,7 @@
             <w:noProof/>
             <w:webHidden/>
           </w:rPr>
-          <w:instrText xml:space="preserve"> PAGEREF _Toc243865167 \h </w:instrText>
+          <w:instrText xml:space="preserve"> PAGEREF _Toc244028793 \h </w:instrText>
         </w:r>
         <w:r>
           <w:rPr>
@@ -596,7 +596,7 @@
           <w14:ligatures w14:val="standardContextual"/>
         </w:rPr>
       </w:pPr>
-      <w:hyperlink w:anchor="_Toc243865168" w:history="1">
+      <w:hyperlink w:anchor="_Toc244028794" w:history="1">
         <w:r>
           <w:rPr>
             <w:rStyle w:val="Hipervnculo"/>
@@ -623,7 +623,7 @@
             <w:noProof/>
             <w:webHidden/>
           </w:rPr>
-          <w:instrText xml:space="preserve"> PAGEREF _Toc243865168 \h </w:instrText>
+          <w:instrText xml:space="preserve"> PAGEREF _Toc244028794 \h </w:instrText>
         </w:r>
         <w:r>
           <w:rPr>
@@ -670,7 +670,7 @@
           <w14:ligatures w14:val="standardContextual"/>
         </w:rPr>
       </w:pPr>
-      <w:hyperlink w:anchor="_Toc243865169" w:history="1">
+      <w:hyperlink w:anchor="_Toc244028795" w:history="1">
         <w:r>
           <w:rPr>
             <w:rStyle w:val="Hipervnculo"/>
@@ -697,7 +697,7 @@
             <w:noProof/>
             <w:webHidden/>
           </w:rPr>
-          <w:instrText xml:space="preserve"> PAGEREF _Toc243865169 \h </w:instrText>
+          <w:instrText xml:space="preserve"> PAGEREF _Toc244028795 \h </w:instrText>
         </w:r>
         <w:r>
           <w:rPr>
@@ -744,7 +744,7 @@
           <w14:ligatures w14:val="standardContextual"/>
         </w:rPr>
       </w:pPr>
-      <w:hyperlink w:anchor="_Toc243865170" w:history="1">
+      <w:hyperlink w:anchor="_Toc244028796" w:history="1">
         <w:r>
           <w:rPr>
             <w:rStyle w:val="Hipervnculo"/>
@@ -771,7 +771,7 @@
             <w:noProof/>
             <w:webHidden/>
           </w:rPr>
-          <w:instrText xml:space="preserve"> PAGEREF _Toc243865170 \h </w:instrText>
+          <w:instrText xml:space="preserve"> PAGEREF _Toc244028796 \h </w:instrText>
         </w:r>
         <w:r>
           <w:rPr>
@@ -818,7 +818,7 @@
           <w14:ligatures w14:val="standardContextual"/>
         </w:rPr>
       </w:pPr>
-      <w:hyperlink w:anchor="_Toc243865171" w:history="1">
+      <w:hyperlink w:anchor="_Toc244028797" w:history="1">
         <w:r>
           <w:rPr>
             <w:rStyle w:val="Hipervnculo"/>
@@ -845,7 +845,7 @@
             <w:noProof/>
             <w:webHidden/>
           </w:rPr>
-          <w:instrText xml:space="preserve"> PAGEREF _Toc243865171 \h </w:instrText>
+          <w:instrText xml:space="preserve"> PAGEREF _Toc244028797 \h </w:instrText>
         </w:r>
         <w:r>
           <w:rPr>
@@ -892,7 +892,7 @@
           <w14:ligatures w14:val="standardContextual"/>
         </w:rPr>
       </w:pPr>
-      <w:hyperlink w:anchor="_Toc243865172" w:history="1">
+      <w:hyperlink w:anchor="_Toc244028798" w:history="1">
         <w:r>
           <w:rPr>
             <w:rStyle w:val="Hipervnculo"/>
@@ -919,7 +919,7 @@
             <w:noProof/>
             <w:webHidden/>
           </w:rPr>
-          <w:instrText xml:space="preserve"> PAGEREF _Toc243865172 \h </w:instrText>
+          <w:instrText xml:space="preserve"> PAGEREF _Toc244028798 \h </w:instrText>
         </w:r>
         <w:r>
           <w:rPr>
@@ -966,7 +966,7 @@
           <w14:ligatures w14:val="standardContextual"/>
         </w:rPr>
       </w:pPr>
-      <w:hyperlink w:anchor="_Toc243865173" w:history="1">
+      <w:hyperlink w:anchor="_Toc244028799" w:history="1">
         <w:r>
           <w:rPr>
             <w:rStyle w:val="Hipervnculo"/>
@@ -993,7 +993,7 @@
             <w:noProof/>
             <w:webHidden/>
           </w:rPr>
-          <w:instrText xml:space="preserve"> PAGEREF _Toc243865173 \h </w:instrText>
+          <w:instrText xml:space="preserve"> PAGEREF _Toc244028799 \h </w:instrText>
         </w:r>
         <w:r>
           <w:rPr>
@@ -1040,7 +1040,7 @@
           <w14:ligatures w14:val="standardContextual"/>
         </w:rPr>
       </w:pPr>
-      <w:hyperlink w:anchor="_Toc243865174" w:history="1">
+      <w:hyperlink w:anchor="_Toc244028800" w:history="1">
         <w:r>
           <w:rPr>
             <w:rStyle w:val="Hipervnculo"/>
@@ -1067,7 +1067,7 @@
             <w:noProof/>
             <w:webHidden/>
           </w:rPr>
-          <w:instrText xml:space="preserve"> PAGEREF _Toc243865174 \h </w:instrText>
+          <w:instrText xml:space="preserve"> PAGEREF _Toc244028800 \h </w:instrText>
         </w:r>
         <w:r>
           <w:rPr>
@@ -1114,7 +1114,7 @@
           <w14:ligatures w14:val="standardContextual"/>
         </w:rPr>
       </w:pPr>
-      <w:hyperlink w:anchor="_Toc243865175" w:history="1">
+      <w:hyperlink w:anchor="_Toc244028801" w:history="1">
         <w:r>
           <w:rPr>
             <w:rStyle w:val="Hipervnculo"/>
@@ -1141,7 +1141,7 @@
             <w:noProof/>
             <w:webHidden/>
           </w:rPr>
-          <w:instrText xml:space="preserve"> PAGEREF _Toc243865175 \h </w:instrText>
+          <w:instrText xml:space="preserve"> PAGEREF _Toc244028801 \h </w:instrText>
         </w:r>
         <w:r>
           <w:rPr>
@@ -1188,7 +1188,7 @@
           <w14:ligatures w14:val="standardContextual"/>
         </w:rPr>
       </w:pPr>
-      <w:hyperlink w:anchor="_Toc243865176" w:history="1">
+      <w:hyperlink w:anchor="_Toc244028802" w:history="1">
         <w:r>
           <w:rPr>
             <w:rStyle w:val="Hipervnculo"/>
@@ -1215,7 +1215,7 @@
             <w:noProof/>
             <w:webHidden/>
           </w:rPr>
-          <w:instrText xml:space="preserve"> PAGEREF _Toc243865176 \h </w:instrText>
+          <w:instrText xml:space="preserve"> PAGEREF _Toc244028802 \h </w:instrText>
         </w:r>
         <w:r>
           <w:rPr>
@@ -1262,7 +1262,7 @@
           <w14:ligatures w14:val="standardContextual"/>
         </w:rPr>
       </w:pPr>
-      <w:hyperlink w:anchor="_Toc243865177" w:history="1">
+      <w:hyperlink w:anchor="_Toc244028803" w:history="1">
         <w:r>
           <w:rPr>
             <w:rStyle w:val="Hipervnculo"/>
@@ -1289,7 +1289,7 @@
             <w:noProof/>
             <w:webHidden/>
           </w:rPr>
-          <w:instrText xml:space="preserve"> PAGEREF _Toc243865177 \h </w:instrText>
+          <w:instrText xml:space="preserve"> PAGEREF _Toc244028803 \h </w:instrText>
         </w:r>
         <w:r>
           <w:rPr>
@@ -1336,7 +1336,7 @@
           <w14:ligatures w14:val="standardContextual"/>
         </w:rPr>
       </w:pPr>
-      <w:hyperlink w:anchor="_Toc243865178" w:history="1">
+      <w:hyperlink w:anchor="_Toc244028804" w:history="1">
         <w:r>
           <w:rPr>
             <w:rStyle w:val="Hipervnculo"/>
@@ -1363,7 +1363,7 @@
             <w:noProof/>
             <w:webHidden/>
           </w:rPr>
-          <w:instrText xml:space="preserve"> PAGEREF _Toc243865178 \h </w:instrText>
+          <w:instrText xml:space="preserve"> PAGEREF _Toc244028804 \h </w:instrText>
         </w:r>
         <w:r>
           <w:rPr>
@@ -1410,7 +1410,7 @@
           <w14:ligatures w14:val="standardContextual"/>
         </w:rPr>
       </w:pPr>
-      <w:hyperlink w:anchor="_Toc243865179" w:history="1">
+      <w:hyperlink w:anchor="_Toc244028805" w:history="1">
         <w:r>
           <w:rPr>
             <w:rStyle w:val="Hipervnculo"/>
@@ -1437,7 +1437,7 @@
             <w:noProof/>
             <w:webHidden/>
           </w:rPr>
-          <w:instrText xml:space="preserve"> PAGEREF _Toc243865179 \h </w:instrText>
+          <w:instrText xml:space="preserve"> PAGEREF _Toc244028805 \h </w:instrText>
         </w:r>
         <w:r>
           <w:rPr>
@@ -1484,7 +1484,7 @@
           <w14:ligatures w14:val="standardContextual"/>
         </w:rPr>
       </w:pPr>
-      <w:hyperlink w:anchor="_Toc243865180" w:history="1">
+      <w:hyperlink w:anchor="_Toc244028806" w:history="1">
         <w:r>
           <w:rPr>
             <w:rStyle w:val="Hipervnculo"/>
@@ -1511,7 +1511,7 @@
             <w:noProof/>
             <w:webHidden/>
           </w:rPr>
-          <w:instrText xml:space="preserve"> PAGEREF _Toc243865180 \h </w:instrText>
+          <w:instrText xml:space="preserve"> PAGEREF _Toc244028806 \h </w:instrText>
         </w:r>
         <w:r>
           <w:rPr>
@@ -1558,7 +1558,7 @@
           <w14:ligatures w14:val="standardContextual"/>
         </w:rPr>
       </w:pPr>
-      <w:hyperlink w:anchor="_Toc243865181" w:history="1">
+      <w:hyperlink w:anchor="_Toc244028807" w:history="1">
         <w:r>
           <w:rPr>
             <w:rStyle w:val="Hipervnculo"/>
@@ -1585,7 +1585,7 @@
             <w:noProof/>
             <w:webHidden/>
           </w:rPr>
-          <w:instrText xml:space="preserve"> PAGEREF _Toc243865181 \h </w:instrText>
+          <w:instrText xml:space="preserve"> PAGEREF _Toc244028807 \h </w:instrText>
         </w:r>
         <w:r>
           <w:rPr>
@@ -1632,7 +1632,7 @@
           <w14:ligatures w14:val="standardContextual"/>
         </w:rPr>
       </w:pPr>
-      <w:hyperlink w:anchor="_Toc243865182" w:history="1">
+      <w:hyperlink w:anchor="_Toc244028808" w:history="1">
         <w:r>
           <w:rPr>
             <w:rStyle w:val="Hipervnculo"/>
@@ -1659,7 +1659,7 @@
             <w:noProof/>
             <w:webHidden/>
           </w:rPr>
-          <w:instrText xml:space="preserve"> PAGEREF _Toc243865182 \h </w:instrText>
+          <w:instrText xml:space="preserve"> PAGEREF _Toc244028808 \h </w:instrText>
         </w:r>
         <w:r>
           <w:rPr>
@@ -1706,7 +1706,7 @@
           <w14:ligatures w14:val="standardContextual"/>
         </w:rPr>
       </w:pPr>
-      <w:hyperlink w:anchor="_Toc243865183" w:history="1">
+      <w:hyperlink w:anchor="_Toc244028809" w:history="1">
         <w:r>
           <w:rPr>
             <w:rStyle w:val="Hipervnculo"/>
@@ -1733,7 +1733,7 @@
             <w:noProof/>
             <w:webHidden/>
           </w:rPr>
-          <w:instrText xml:space="preserve"> PAGEREF _Toc243865183 \h </w:instrText>
+          <w:instrText xml:space="preserve"> PAGEREF _Toc244028809 \h </w:instrText>
         </w:r>
         <w:r>
           <w:rPr>
@@ -1780,7 +1780,7 @@
           <w14:ligatures w14:val="standardContextual"/>
         </w:rPr>
       </w:pPr>
-      <w:hyperlink w:anchor="_Toc243865184" w:history="1">
+      <w:hyperlink w:anchor="_Toc244028810" w:history="1">
         <w:r>
           <w:rPr>
             <w:rStyle w:val="Hipervnculo"/>
@@ -1807,7 +1807,7 @@
             <w:noProof/>
             <w:webHidden/>
           </w:rPr>
-          <w:instrText xml:space="preserve"> PAGEREF _Toc243865184 \h </w:instrText>
+          <w:instrText xml:space="preserve"> PAGEREF _Toc244028810 \h </w:instrText>
         </w:r>
         <w:r>
           <w:rPr>
@@ -1854,7 +1854,7 @@
           <w14:ligatures w14:val="standardContextual"/>
         </w:rPr>
       </w:pPr>
-      <w:hyperlink w:anchor="_Toc243865185" w:history="1">
+      <w:hyperlink w:anchor="_Toc244028811" w:history="1">
         <w:r>
           <w:rPr>
             <w:rStyle w:val="Hipervnculo"/>
@@ -1881,7 +1881,7 @@
             <w:noProof/>
             <w:webHidden/>
           </w:rPr>
-          <w:instrText xml:space="preserve"> PAGEREF _Toc243865185 \h </w:instrText>
+          <w:instrText xml:space="preserve"> PAGEREF _Toc244028811 \h </w:instrText>
         </w:r>
         <w:r>
           <w:rPr>
@@ -1928,7 +1928,7 @@
           <w14:ligatures w14:val="standardContextual"/>
         </w:rPr>
       </w:pPr>
-      <w:hyperlink w:anchor="_Toc243865186" w:history="1">
+      <w:hyperlink w:anchor="_Toc244028913" w:history="1">
         <w:r>
           <w:rPr>
             <w:rStyle w:val="Hipervnculo"/>
@@ -1955,7 +1955,7 @@
             <w:noProof/>
             <w:webHidden/>
           </w:rPr>
-          <w:instrText xml:space="preserve"> PAGEREF _Toc243865186 \h </w:instrText>
+          <w:instrText xml:space="preserve"> PAGEREF _Toc244028913 \h </w:instrText>
         </w:r>
         <w:r>
           <w:rPr>
@@ -2002,7 +2002,7 @@
           <w14:ligatures w14:val="standardContextual"/>
         </w:rPr>
       </w:pPr>
-      <w:hyperlink w:anchor="_Toc243865187" w:history="1">
+      <w:hyperlink w:anchor="_Toc244028914" w:history="1">
         <w:r>
           <w:rPr>
             <w:rStyle w:val="Hipervnculo"/>
@@ -2029,7 +2029,7 @@
             <w:noProof/>
             <w:webHidden/>
           </w:rPr>
-          <w:instrText xml:space="preserve"> PAGEREF _Toc243865187 \h </w:instrText>
+          <w:instrText xml:space="preserve"> PAGEREF _Toc244028914 \h </w:instrText>
         </w:r>
         <w:r>
           <w:rPr>
@@ -2076,7 +2076,7 @@
           <w14:ligatures w14:val="standardContextual"/>
         </w:rPr>
       </w:pPr>
-      <w:hyperlink w:anchor="_Toc243865188" w:history="1">
+      <w:hyperlink w:anchor="_Toc244028915" w:history="1">
         <w:r>
           <w:rPr>
             <w:rStyle w:val="Hipervnculo"/>
@@ -2103,7 +2103,7 @@
             <w:noProof/>
             <w:webHidden/>
           </w:rPr>
-          <w:instrText xml:space="preserve"> PAGEREF _Toc243865188 \h </w:instrText>
+          <w:instrText xml:space="preserve"> PAGEREF _Toc244028915 \h </w:instrText>
         </w:r>
         <w:r>
           <w:rPr>
@@ -2150,7 +2150,7 @@
           <w14:ligatures w14:val="standardContextual"/>
         </w:rPr>
       </w:pPr>
-      <w:hyperlink w:anchor="_Toc243865189" w:history="1">
+      <w:hyperlink w:anchor="_Toc244028916" w:history="1">
         <w:r>
           <w:rPr>
             <w:rStyle w:val="Hipervnculo"/>
@@ -2177,7 +2177,7 @@
             <w:noProof/>
             <w:webHidden/>
           </w:rPr>
-          <w:instrText xml:space="preserve"> PAGEREF _Toc243865189 \h </w:instrText>
+          <w:instrText xml:space="preserve"> PAGEREF _Toc244028916 \h </w:instrText>
         </w:r>
         <w:r>
           <w:rPr>
@@ -2224,7 +2224,7 @@
           <w14:ligatures w14:val="standardContextual"/>
         </w:rPr>
       </w:pPr>
-      <w:hyperlink w:anchor="_Toc243865190" w:history="1">
+      <w:hyperlink w:anchor="_Toc244028917" w:history="1">
         <w:r>
           <w:rPr>
             <w:rStyle w:val="Hipervnculo"/>
@@ -2251,7 +2251,7 @@
             <w:noProof/>
             <w:webHidden/>
           </w:rPr>
-          <w:instrText xml:space="preserve"> PAGEREF _Toc243865190 \h </w:instrText>
+          <w:instrText xml:space="preserve"> PAGEREF _Toc244028917 \h </w:instrText>
         </w:r>
         <w:r>
           <w:rPr>
@@ -2298,7 +2298,7 @@
           <w14:ligatures w14:val="standardContextual"/>
         </w:rPr>
       </w:pPr>
-      <w:hyperlink w:anchor="_Toc243865191" w:history="1">
+      <w:hyperlink w:anchor="_Toc244028918" w:history="1">
         <w:r>
           <w:rPr>
             <w:rStyle w:val="Hipervnculo"/>
@@ -2325,7 +2325,7 @@
             <w:noProof/>
             <w:webHidden/>
           </w:rPr>
-          <w:instrText xml:space="preserve"> PAGEREF _Toc243865191 \h </w:instrText>
+          <w:instrText xml:space="preserve"> PAGEREF _Toc244028918 \h </w:instrText>
         </w:r>
         <w:r>
           <w:rPr>
@@ -2372,7 +2372,7 @@
           <w14:ligatures w14:val="standardContextual"/>
         </w:rPr>
       </w:pPr>
-      <w:hyperlink w:anchor="_Toc243865192" w:history="1">
+      <w:hyperlink w:anchor="_Toc244028919" w:history="1">
         <w:r>
           <w:rPr>
             <w:rStyle w:val="Hipervnculo"/>
@@ -2399,7 +2399,7 @@
             <w:noProof/>
             <w:webHidden/>
           </w:rPr>
-          <w:instrText xml:space="preserve"> PAGEREF _Toc243865192 \h </w:instrText>
+          <w:instrText xml:space="preserve"> PAGEREF _Toc244028919 \h </w:instrText>
         </w:r>
         <w:r>
           <w:rPr>
@@ -2446,7 +2446,7 @@
           <w14:ligatures w14:val="standardContextual"/>
         </w:rPr>
       </w:pPr>
-      <w:hyperlink w:anchor="_Toc243865193" w:history="1">
+      <w:hyperlink w:anchor="_Toc244028920" w:history="1">
         <w:r>
           <w:rPr>
             <w:rStyle w:val="Hipervnculo"/>
@@ -2473,7 +2473,7 @@
             <w:noProof/>
             <w:webHidden/>
           </w:rPr>
-          <w:instrText xml:space="preserve"> PAGEREF _Toc243865193 \h </w:instrText>
+          <w:instrText xml:space="preserve"> PAGEREF _Toc244028920 \h </w:instrText>
         </w:r>
         <w:r>
           <w:rPr>
@@ -2520,7 +2520,7 @@
           <w14:ligatures w14:val="standardContextual"/>
         </w:rPr>
       </w:pPr>
-      <w:hyperlink w:anchor="_Toc243865194" w:history="1">
+      <w:hyperlink w:anchor="_Toc244028921" w:history="1">
         <w:r>
           <w:rPr>
             <w:rStyle w:val="Hipervnculo"/>
@@ -2547,7 +2547,7 @@
             <w:noProof/>
             <w:webHidden/>
           </w:rPr>
-          <w:instrText xml:space="preserve"> PAGEREF _Toc243865194 \h </w:instrText>
+          <w:instrText xml:space="preserve"> PAGEREF _Toc244028921 \h </w:instrText>
         </w:r>
         <w:r>
           <w:rPr>
@@ -2594,7 +2594,7 @@
           <w14:ligatures w14:val="standardContextual"/>
         </w:rPr>
       </w:pPr>
-      <w:hyperlink w:anchor="_Toc243865195" w:history="1">
+      <w:hyperlink w:anchor="_Toc244028922" w:history="1">
         <w:r>
           <w:rPr>
             <w:rStyle w:val="Hipervnculo"/>
@@ -2621,7 +2621,7 @@
             <w:noProof/>
             <w:webHidden/>
           </w:rPr>
-          <w:instrText xml:space="preserve"> PAGEREF _Toc243865195 \h </w:instrText>
+          <w:instrText xml:space="preserve"> PAGEREF _Toc244028922 \h </w:instrText>
         </w:r>
         <w:r>
           <w:rPr>
@@ -2668,7 +2668,7 @@
           <w14:ligatures w14:val="standardContextual"/>
         </w:rPr>
       </w:pPr>
-      <w:hyperlink w:anchor="_Toc243865196" w:history="1">
+      <w:hyperlink w:anchor="_Toc244028923" w:history="1">
         <w:r>
           <w:rPr>
             <w:rStyle w:val="Hipervnculo"/>
@@ -2695,7 +2695,7 @@
             <w:noProof/>
             <w:webHidden/>
           </w:rPr>
-          <w:instrText xml:space="preserve"> PAGEREF _Toc243865196 \h </w:instrText>
+          <w:instrText xml:space="preserve"> PAGEREF _Toc244028923 \h </w:instrText>
         </w:r>
         <w:r>
           <w:rPr>
@@ -2742,7 +2742,7 @@
           <w14:ligatures w14:val="standardContextual"/>
         </w:rPr>
       </w:pPr>
-      <w:hyperlink w:anchor="_Toc243865197" w:history="1">
+      <w:hyperlink w:anchor="_Toc244028924" w:history="1">
         <w:r>
           <w:rPr>
             <w:rStyle w:val="Hipervnculo"/>
@@ -2769,7 +2769,7 @@
             <w:noProof/>
             <w:webHidden/>
           </w:rPr>
-          <w:instrText xml:space="preserve"> PAGEREF _Toc243865197 \h </w:instrText>
+          <w:instrText xml:space="preserve"> PAGEREF _Toc244028924 \h </w:instrText>
         </w:r>
         <w:r>
           <w:rPr>
@@ -2816,7 +2816,7 @@
           <w14:ligatures w14:val="standardContextual"/>
         </w:rPr>
       </w:pPr>
-      <w:hyperlink w:anchor="_Toc243865198" w:history="1">
+      <w:hyperlink w:anchor="_Toc244028925" w:history="1">
         <w:r>
           <w:rPr>
             <w:rStyle w:val="Hipervnculo"/>
@@ -2843,7 +2843,7 @@
             <w:noProof/>
             <w:webHidden/>
           </w:rPr>
-          <w:instrText xml:space="preserve"> PAGEREF _Toc243865198 \h </w:instrText>
+          <w:instrText xml:space="preserve"> PAGEREF _Toc244028925 \h </w:instrText>
         </w:r>
         <w:r>
           <w:rPr>
@@ -2890,7 +2890,7 @@
           <w14:ligatures w14:val="standardContextual"/>
         </w:rPr>
       </w:pPr>
-      <w:hyperlink w:anchor="_Toc243865199" w:history="1">
+      <w:hyperlink w:anchor="_Toc244028926" w:history="1">
         <w:r>
           <w:rPr>
             <w:rStyle w:val="Hipervnculo"/>
@@ -2917,7 +2917,7 @@
             <w:noProof/>
             <w:webHidden/>
           </w:rPr>
-          <w:instrText xml:space="preserve"> PAGEREF _Toc243865199 \h </w:instrText>
+          <w:instrText xml:space="preserve"> PAGEREF _Toc244028926 \h </w:instrText>
         </w:r>
         <w:r>
           <w:rPr>
@@ -2964,7 +2964,7 @@
           <w14:ligatures w14:val="standardContextual"/>
         </w:rPr>
       </w:pPr>
-      <w:hyperlink w:anchor="_Toc243865200" w:history="1">
+      <w:hyperlink w:anchor="_Toc244028927" w:history="1">
         <w:r>
           <w:rPr>
             <w:rStyle w:val="Hipervnculo"/>
@@ -2991,7 +2991,7 @@
             <w:noProof/>
             <w:webHidden/>
           </w:rPr>
-          <w:instrText xml:space="preserve"> PAGEREF _Toc243865200 \h </w:instrText>
+          <w:instrText xml:space="preserve"> PAGEREF _Toc244028927 \h </w:instrText>
         </w:r>
         <w:r>
           <w:rPr>
@@ -3038,7 +3038,7 @@
           <w14:ligatures w14:val="standardContextual"/>
         </w:rPr>
       </w:pPr>
-      <w:hyperlink w:anchor="_Toc243865201" w:history="1">
+      <w:hyperlink w:anchor="_Toc244028928" w:history="1">
         <w:r>
           <w:rPr>
             <w:rStyle w:val="Hipervnculo"/>
@@ -3065,7 +3065,7 @@
             <w:noProof/>
             <w:webHidden/>
           </w:rPr>
-          <w:instrText xml:space="preserve"> PAGEREF _Toc243865201 \h </w:instrText>
+          <w:instrText xml:space="preserve"> PAGEREF _Toc244028928 \h </w:instrText>
         </w:r>
         <w:r>
           <w:rPr>
@@ -3112,7 +3112,7 @@
           <w14:ligatures w14:val="standardContextual"/>
         </w:rPr>
       </w:pPr>
-      <w:hyperlink w:anchor="_Toc243865202" w:history="1">
+      <w:hyperlink w:anchor="_Toc244028929" w:history="1">
         <w:r>
           <w:rPr>
             <w:rStyle w:val="Hipervnculo"/>
@@ -3139,7 +3139,7 @@
             <w:noProof/>
             <w:webHidden/>
           </w:rPr>
-          <w:instrText xml:space="preserve"> PAGEREF _Toc243865202 \h </w:instrText>
+          <w:instrText xml:space="preserve"> PAGEREF _Toc244028929 \h </w:instrText>
         </w:r>
         <w:r>
           <w:rPr>
@@ -3186,7 +3186,7 @@
           <w14:ligatures w14:val="standardContextual"/>
         </w:rPr>
       </w:pPr>
-      <w:hyperlink w:anchor="_Toc243865203" w:history="1">
+      <w:hyperlink w:anchor="_Toc244028930" w:history="1">
         <w:r>
           <w:rPr>
             <w:rStyle w:val="Hipervnculo"/>
@@ -3213,7 +3213,7 @@
             <w:noProof/>
             <w:webHidden/>
           </w:rPr>
-          <w:instrText xml:space="preserve"> PAGEREF _Toc243865203 \h </w:instrText>
+          <w:instrText xml:space="preserve"> PAGEREF _Toc244028930 \h </w:instrText>
         </w:r>
         <w:r>
           <w:rPr>
@@ -3260,7 +3260,7 @@
           <w14:ligatures w14:val="standardContextual"/>
         </w:rPr>
       </w:pPr>
-      <w:hyperlink w:anchor="_Toc243865204" w:history="1">
+      <w:hyperlink w:anchor="_Toc244028931" w:history="1">
         <w:r>
           <w:rPr>
             <w:rStyle w:val="Hipervnculo"/>
@@ -3287,7 +3287,7 @@
             <w:noProof/>
             <w:webHidden/>
           </w:rPr>
-          <w:instrText xml:space="preserve"> PAGEREF _Toc243865204 \h </w:instrText>
+          <w:instrText xml:space="preserve"> PAGEREF _Toc244028931 \h </w:instrText>
         </w:r>
         <w:r>
           <w:rPr>
@@ -3334,7 +3334,7 @@
           <w14:ligatures w14:val="standardContextual"/>
         </w:rPr>
       </w:pPr>
-      <w:hyperlink w:anchor="_Toc243865205" w:history="1">
+      <w:hyperlink w:anchor="_Toc244028932" w:history="1">
         <w:r>
           <w:rPr>
             <w:rStyle w:val="Hipervnculo"/>
@@ -3361,7 +3361,7 @@
             <w:noProof/>
             <w:webHidden/>
           </w:rPr>
-          <w:instrText xml:space="preserve"> PAGEREF _Toc243865205 \h </w:instrText>
+          <w:instrText xml:space="preserve"> PAGEREF _Toc244028932 \h </w:instrText>
         </w:r>
         <w:r>
           <w:rPr>
@@ -3408,7 +3408,7 @@
           <w14:ligatures w14:val="standardContextual"/>
         </w:rPr>
       </w:pPr>
-      <w:hyperlink w:anchor="_Toc243865206" w:history="1">
+      <w:hyperlink w:anchor="_Toc244028933" w:history="1">
         <w:r>
           <w:rPr>
             <w:rStyle w:val="Hipervnculo"/>
@@ -3435,7 +3435,7 @@
             <w:noProof/>
             <w:webHidden/>
           </w:rPr>
-          <w:instrText xml:space="preserve"> PAGEREF _Toc243865206 \h </w:instrText>
+          <w:instrText xml:space="preserve"> PAGEREF _Toc244028933 \h </w:instrText>
         </w:r>
         <w:r>
           <w:rPr>
@@ -3482,7 +3482,7 @@
           <w14:ligatures w14:val="standardContextual"/>
         </w:rPr>
       </w:pPr>
-      <w:hyperlink w:anchor="_Toc243865207" w:history="1">
+      <w:hyperlink w:anchor="_Toc244028934" w:history="1">
         <w:r>
           <w:rPr>
             <w:rStyle w:val="Hipervnculo"/>
@@ -3509,7 +3509,7 @@
             <w:noProof/>
             <w:webHidden/>
           </w:rPr>
-          <w:instrText xml:space="preserve"> PAGEREF _Toc243865207 \h </w:instrText>
+          <w:instrText xml:space="preserve"> PAGEREF _Toc244028934 \h </w:instrText>
         </w:r>
         <w:r>
           <w:rPr>
@@ -3556,7 +3556,7 @@
           <w14:ligatures w14:val="standardContextual"/>
         </w:rPr>
       </w:pPr>
-      <w:hyperlink w:anchor="_Toc243865208" w:history="1">
+      <w:hyperlink w:anchor="_Toc244028935" w:history="1">
         <w:r>
           <w:rPr>
             <w:rStyle w:val="Hipervnculo"/>
@@ -3583,7 +3583,7 @@
             <w:noProof/>
             <w:webHidden/>
           </w:rPr>
-          <w:instrText xml:space="preserve"> PAGEREF _Toc243865208 \h </w:instrText>
+          <w:instrText xml:space="preserve"> PAGEREF _Toc244028935 \h </w:instrText>
         </w:r>
         <w:r>
           <w:rPr>
@@ -3630,7 +3630,7 @@
           <w14:ligatures w14:val="standardContextual"/>
         </w:rPr>
       </w:pPr>
-      <w:hyperlink w:anchor="_Toc243865209" w:history="1">
+      <w:hyperlink w:anchor="_Toc244028936" w:history="1">
         <w:r>
           <w:rPr>
             <w:rStyle w:val="Hipervnculo"/>
@@ -3657,7 +3657,7 @@
             <w:noProof/>
             <w:webHidden/>
           </w:rPr>
-          <w:instrText xml:space="preserve"> PAGEREF _Toc243865209 \h </w:instrText>
+          <w:instrText xml:space="preserve"> PAGEREF _Toc244028936 \h </w:instrText>
         </w:r>
         <w:r>
           <w:rPr>
@@ -3704,7 +3704,7 @@
           <w14:ligatures w14:val="standardContextual"/>
         </w:rPr>
       </w:pPr>
-      <w:hyperlink w:anchor="_Toc243865210" w:history="1">
+      <w:hyperlink w:anchor="_Toc244028937" w:history="1">
         <w:r>
           <w:rPr>
             <w:rStyle w:val="Hipervnculo"/>
@@ -3731,7 +3731,7 @@
             <w:noProof/>
             <w:webHidden/>
           </w:rPr>
-          <w:instrText xml:space="preserve"> PAGEREF _Toc243865210 \h </w:instrText>
+          <w:instrText xml:space="preserve"> PAGEREF _Toc244028937 \h </w:instrText>
         </w:r>
         <w:r>
           <w:rPr>
@@ -3778,7 +3778,7 @@
           <w14:ligatures w14:val="standardContextual"/>
         </w:rPr>
       </w:pPr>
-      <w:hyperlink w:anchor="_Toc243865211" w:history="1">
+      <w:hyperlink w:anchor="_Toc244028938" w:history="1">
         <w:r>
           <w:rPr>
             <w:rStyle w:val="Hipervnculo"/>
@@ -3805,7 +3805,7 @@
             <w:noProof/>
             <w:webHidden/>
           </w:rPr>
-          <w:instrText xml:space="preserve"> PAGEREF _Toc243865211 \h </w:instrText>
+          <w:instrText xml:space="preserve"> PAGEREF _Toc244028938 \h </w:instrText>
         </w:r>
         <w:r>
           <w:rPr>
@@ -3852,7 +3852,7 @@
           <w14:ligatures w14:val="standardContextual"/>
         </w:rPr>
       </w:pPr>
-      <w:hyperlink w:anchor="_Toc243865212" w:history="1">
+      <w:hyperlink w:anchor="_Toc244028939" w:history="1">
         <w:r>
           <w:rPr>
             <w:rStyle w:val="Hipervnculo"/>
@@ -3879,7 +3879,7 @@
             <w:noProof/>
             <w:webHidden/>
           </w:rPr>
-          <w:instrText xml:space="preserve"> PAGEREF _Toc243865212 \h </w:instrText>
+          <w:instrText xml:space="preserve"> PAGEREF _Toc244028939 \h </w:instrText>
         </w:r>
         <w:r>
           <w:rPr>
@@ -3926,7 +3926,7 @@
           <w14:ligatures w14:val="standardContextual"/>
         </w:rPr>
       </w:pPr>
-      <w:hyperlink w:anchor="_Toc243865213" w:history="1">
+      <w:hyperlink w:anchor="_Toc244028940" w:history="1">
         <w:r>
           <w:rPr>
             <w:rStyle w:val="Hipervnculo"/>
@@ -3953,7 +3953,7 @@
             <w:noProof/>
             <w:webHidden/>
           </w:rPr>
-          <w:instrText xml:space="preserve"> PAGEREF _Toc243865213 \h </w:instrText>
+          <w:instrText xml:space="preserve"> PAGEREF _Toc244028940 \h </w:instrText>
         </w:r>
         <w:r>
           <w:rPr>
@@ -4000,7 +4000,7 @@
           <w14:ligatures w14:val="standardContextual"/>
         </w:rPr>
       </w:pPr>
-      <w:hyperlink w:anchor="_Toc243865214" w:history="1">
+      <w:hyperlink w:anchor="_Toc244028941" w:history="1">
         <w:r>
           <w:rPr>
             <w:rStyle w:val="Hipervnculo"/>
@@ -4027,7 +4027,7 @@
             <w:noProof/>
             <w:webHidden/>
           </w:rPr>
-          <w:instrText xml:space="preserve"> PAGEREF _Toc243865214 \h </w:instrText>
+          <w:instrText xml:space="preserve"> PAGEREF _Toc244028941 \h </w:instrText>
         </w:r>
         <w:r>
           <w:rPr>
@@ -4074,7 +4074,7 @@
           <w14:ligatures w14:val="standardContextual"/>
         </w:rPr>
       </w:pPr>
-      <w:hyperlink w:anchor="_Toc243865215" w:history="1">
+      <w:hyperlink w:anchor="_Toc244028942" w:history="1">
         <w:r>
           <w:rPr>
             <w:rStyle w:val="Hipervnculo"/>
@@ -4101,7 +4101,7 @@
             <w:noProof/>
             <w:webHidden/>
           </w:rPr>
-          <w:instrText xml:space="preserve"> PAGEREF _Toc243865215 \h </w:instrText>
+          <w:instrText xml:space="preserve"> PAGEREF _Toc244028942 \h </w:instrText>
         </w:r>
         <w:r>
           <w:rPr>
@@ -4148,7 +4148,7 @@
           <w14:ligatures w14:val="standardContextual"/>
         </w:rPr>
       </w:pPr>
-      <w:hyperlink w:anchor="_Toc243865216" w:history="1">
+      <w:hyperlink w:anchor="_Toc244028943" w:history="1">
         <w:r>
           <w:rPr>
             <w:rStyle w:val="Hipervnculo"/>
@@ -4175,7 +4175,7 @@
             <w:noProof/>
             <w:webHidden/>
           </w:rPr>
-          <w:instrText xml:space="preserve"> PAGEREF _Toc243865216 \h </w:instrText>
+          <w:instrText xml:space="preserve"> PAGEREF _Toc244028943 \h </w:instrText>
         </w:r>
         <w:r>
           <w:rPr>
@@ -4222,7 +4222,7 @@
           <w14:ligatures w14:val="standardContextual"/>
         </w:rPr>
       </w:pPr>
-      <w:hyperlink w:anchor="_Toc243865217" w:history="1">
+      <w:hyperlink w:anchor="_Toc244028944" w:history="1">
         <w:r>
           <w:rPr>
             <w:rStyle w:val="Hipervnculo"/>
@@ -4249,7 +4249,7 @@
             <w:noProof/>
             <w:webHidden/>
           </w:rPr>
-          <w:instrText xml:space="preserve"> PAGEREF _Toc243865217 \h </w:instrText>
+          <w:instrText xml:space="preserve"> PAGEREF _Toc244028944 \h </w:instrText>
         </w:r>
         <w:r>
           <w:rPr>
@@ -4296,7 +4296,7 @@
           <w14:ligatures w14:val="standardContextual"/>
         </w:rPr>
       </w:pPr>
-      <w:hyperlink w:anchor="_Toc243865218" w:history="1">
+      <w:hyperlink w:anchor="_Toc244028945" w:history="1">
         <w:r>
           <w:rPr>
             <w:rStyle w:val="Hipervnculo"/>
@@ -4323,7 +4323,7 @@
             <w:noProof/>
             <w:webHidden/>
           </w:rPr>
-          <w:instrText xml:space="preserve"> PAGEREF _Toc243865218 \h </w:instrText>
+          <w:instrText xml:space="preserve"> PAGEREF _Toc244028945 \h </w:instrText>
         </w:r>
         <w:r>
           <w:rPr>
@@ -4370,7 +4370,7 @@
           <w14:ligatures w14:val="standardContextual"/>
         </w:rPr>
       </w:pPr>
-      <w:hyperlink w:anchor="_Toc243865219" w:history="1">
+      <w:hyperlink w:anchor="_Toc244028946" w:history="1">
         <w:r>
           <w:rPr>
             <w:rStyle w:val="Hipervnculo"/>
@@ -4397,7 +4397,7 @@
             <w:noProof/>
             <w:webHidden/>
           </w:rPr>
-          <w:instrText xml:space="preserve"> PAGEREF _Toc243865219 \h </w:instrText>
+          <w:instrText xml:space="preserve"> PAGEREF _Toc244028946 \h </w:instrText>
         </w:r>
         <w:r>
           <w:rPr>
@@ -4444,7 +4444,7 @@
           <w14:ligatures w14:val="standardContextual"/>
         </w:rPr>
       </w:pPr>
-      <w:hyperlink w:anchor="_Toc243865220" w:history="1">
+      <w:hyperlink w:anchor="_Toc244028947" w:history="1">
         <w:r>
           <w:rPr>
             <w:rStyle w:val="Hipervnculo"/>
@@ -4471,7 +4471,7 @@
             <w:noProof/>
             <w:webHidden/>
           </w:rPr>
-          <w:instrText xml:space="preserve"> PAGEREF _Toc243865220 \h </w:instrText>
+          <w:instrText xml:space="preserve"> PAGEREF _Toc244028947 \h </w:instrText>
         </w:r>
         <w:r>
           <w:rPr>
@@ -4518,7 +4518,7 @@
           <w14:ligatures w14:val="standardContextual"/>
         </w:rPr>
       </w:pPr>
-      <w:hyperlink w:anchor="_Toc243865221" w:history="1">
+      <w:hyperlink w:anchor="_Toc244028948" w:history="1">
         <w:r>
           <w:rPr>
             <w:rStyle w:val="Hipervnculo"/>
@@ -4545,7 +4545,7 @@
             <w:noProof/>
             <w:webHidden/>
           </w:rPr>
-          <w:instrText xml:space="preserve"> PAGEREF _Toc243865221 \h </w:instrText>
+          <w:instrText xml:space="preserve"> PAGEREF _Toc244028948 \h </w:instrText>
         </w:r>
         <w:r>
           <w:rPr>
@@ -4592,7 +4592,7 @@
           <w14:ligatures w14:val="standardContextual"/>
         </w:rPr>
       </w:pPr>
-      <w:hyperlink w:anchor="_Toc243865222" w:history="1">
+      <w:hyperlink w:anchor="_Toc244028949" w:history="1">
         <w:r>
           <w:rPr>
             <w:rStyle w:val="Hipervnculo"/>
@@ -4619,7 +4619,7 @@
             <w:noProof/>
             <w:webHidden/>
           </w:rPr>
-          <w:instrText xml:space="preserve"> PAGEREF _Toc243865222 \h </w:instrText>
+          <w:instrText xml:space="preserve"> PAGEREF _Toc244028949 \h </w:instrText>
         </w:r>
         <w:r>
           <w:rPr>
@@ -4666,7 +4666,7 @@
           <w14:ligatures w14:val="standardContextual"/>
         </w:rPr>
       </w:pPr>
-      <w:hyperlink w:anchor="_Toc243865223" w:history="1">
+      <w:hyperlink w:anchor="_Toc244028950" w:history="1">
         <w:r>
           <w:rPr>
             <w:rStyle w:val="Hipervnculo"/>
@@ -4693,7 +4693,7 @@
             <w:noProof/>
             <w:webHidden/>
           </w:rPr>
-          <w:instrText xml:space="preserve"> PAGEREF _Toc243865223 \h </w:instrText>
+          <w:instrText xml:space="preserve"> PAGEREF _Toc244028950 \h </w:instrText>
         </w:r>
         <w:r>
           <w:rPr>
@@ -4740,7 +4740,7 @@
           <w14:ligatures w14:val="standardContextual"/>
         </w:rPr>
       </w:pPr>
-      <w:hyperlink w:anchor="_Toc243865224" w:history="1">
+      <w:hyperlink w:anchor="_Toc244028951" w:history="1">
         <w:r>
           <w:rPr>
             <w:rStyle w:val="Hipervnculo"/>
@@ -4767,7 +4767,7 @@
             <w:noProof/>
             <w:webHidden/>
           </w:rPr>
-          <w:instrText xml:space="preserve"> PAGEREF _Toc243865224 \h </w:instrText>
+          <w:instrText xml:space="preserve"> PAGEREF _Toc244028951 \h </w:instrText>
         </w:r>
         <w:r>
           <w:rPr>
@@ -4814,7 +4814,7 @@
           <w14:ligatures w14:val="standardContextual"/>
         </w:rPr>
       </w:pPr>
-      <w:hyperlink w:anchor="_Toc243865225" w:history="1">
+      <w:hyperlink w:anchor="_Toc244028952" w:history="1">
         <w:r>
           <w:rPr>
             <w:rStyle w:val="Hipervnculo"/>
@@ -4841,7 +4841,7 @@
             <w:noProof/>
             <w:webHidden/>
           </w:rPr>
-          <w:instrText xml:space="preserve"> PAGEREF _Toc243865225 \h </w:instrText>
+          <w:instrText xml:space="preserve"> PAGEREF _Toc244028952 \h </w:instrText>
         </w:r>
         <w:r>
           <w:rPr>
@@ -4888,7 +4888,7 @@
           <w14:ligatures w14:val="standardContextual"/>
         </w:rPr>
       </w:pPr>
-      <w:hyperlink w:anchor="_Toc243865226" w:history="1">
+      <w:hyperlink w:anchor="_Toc244028953" w:history="1">
         <w:r>
           <w:rPr>
             <w:rStyle w:val="Hipervnculo"/>
@@ -4915,7 +4915,7 @@
             <w:noProof/>
             <w:webHidden/>
           </w:rPr>
-          <w:instrText xml:space="preserve"> PAGEREF _Toc243865226 \h </w:instrText>
+          <w:instrText xml:space="preserve"> PAGEREF _Toc244028953 \h </w:instrText>
         </w:r>
         <w:r>
           <w:rPr>
@@ -4962,7 +4962,7 @@
           <w14:ligatures w14:val="standardContextual"/>
         </w:rPr>
       </w:pPr>
-      <w:hyperlink w:anchor="_Toc243865227" w:history="1">
+      <w:hyperlink w:anchor="_Toc244028954" w:history="1">
         <w:r>
           <w:rPr>
             <w:rStyle w:val="Hipervnculo"/>
@@ -4989,7 +4989,7 @@
             <w:noProof/>
             <w:webHidden/>
           </w:rPr>
-          <w:instrText xml:space="preserve"> PAGEREF _Toc243865227 \h </w:instrText>
+          <w:instrText xml:space="preserve"> PAGEREF _Toc244028954 \h </w:instrText>
         </w:r>
         <w:r>
           <w:rPr>
@@ -5036,7 +5036,7 @@
           <w14:ligatures w14:val="standardContextual"/>
         </w:rPr>
       </w:pPr>
-      <w:hyperlink w:anchor="_Toc243865228" w:history="1">
+      <w:hyperlink w:anchor="_Toc244028955" w:history="1">
         <w:r>
           <w:rPr>
             <w:rStyle w:val="Hipervnculo"/>
@@ -5063,7 +5063,7 @@
             <w:noProof/>
             <w:webHidden/>
           </w:rPr>
-          <w:instrText xml:space="preserve"> PAGEREF _Toc243865228 \h </w:instrText>
+          <w:instrText xml:space="preserve"> PAGEREF _Toc244028955 \h </w:instrText>
         </w:r>
         <w:r>
           <w:rPr>
@@ -5110,7 +5110,7 @@
           <w14:ligatures w14:val="standardContextual"/>
         </w:rPr>
       </w:pPr>
-      <w:hyperlink w:anchor="_Toc243865229" w:history="1">
+      <w:hyperlink w:anchor="_Toc244028956" w:history="1">
         <w:r>
           <w:rPr>
             <w:rStyle w:val="Hipervnculo"/>
@@ -5137,7 +5137,7 @@
             <w:noProof/>
             <w:webHidden/>
           </w:rPr>
-          <w:instrText xml:space="preserve"> PAGEREF _Toc243865229 \h </w:instrText>
+          <w:instrText xml:space="preserve"> PAGEREF _Toc244028956 \h </w:instrText>
         </w:r>
         <w:r>
           <w:rPr>
@@ -5184,7 +5184,7 @@
           <w14:ligatures w14:val="standardContextual"/>
         </w:rPr>
       </w:pPr>
-      <w:hyperlink w:anchor="_Toc243865230" w:history="1">
+      <w:hyperlink w:anchor="_Toc244028957" w:history="1">
         <w:r>
           <w:rPr>
             <w:rStyle w:val="Hipervnculo"/>
@@ -5211,7 +5211,7 @@
             <w:noProof/>
             <w:webHidden/>
           </w:rPr>
-          <w:instrText xml:space="preserve"> PAGEREF _Toc243865230 \h </w:instrText>
+          <w:instrText xml:space="preserve"> PAGEREF _Toc244028957 \h </w:instrText>
         </w:r>
         <w:r>
           <w:rPr>
@@ -5258,7 +5258,7 @@
           <w14:ligatures w14:val="standardContextual"/>
         </w:rPr>
       </w:pPr>
-      <w:hyperlink w:anchor="_Toc243865231" w:history="1">
+      <w:hyperlink w:anchor="_Toc244028958" w:history="1">
         <w:r>
           <w:rPr>
             <w:rStyle w:val="Hipervnculo"/>
@@ -5285,7 +5285,7 @@
             <w:noProof/>
             <w:webHidden/>
           </w:rPr>
-          <w:instrText xml:space="preserve"> PAGEREF _Toc243865231 \h </w:instrText>
+          <w:instrText xml:space="preserve"> PAGEREF _Toc244028958 \h </w:instrText>
         </w:r>
         <w:r>
           <w:rPr>
@@ -5332,7 +5332,7 @@
           <w14:ligatures w14:val="standardContextual"/>
         </w:rPr>
       </w:pPr>
-      <w:hyperlink w:anchor="_Toc243865232" w:history="1">
+      <w:hyperlink w:anchor="_Toc244028959" w:history="1">
         <w:r>
           <w:rPr>
             <w:rStyle w:val="Hipervnculo"/>
@@ -5359,7 +5359,7 @@
             <w:noProof/>
             <w:webHidden/>
           </w:rPr>
-          <w:instrText xml:space="preserve"> PAGEREF _Toc243865232 \h </w:instrText>
+          <w:instrText xml:space="preserve"> PAGEREF _Toc244028959 \h </w:instrText>
         </w:r>
         <w:r>
           <w:rPr>
@@ -5406,7 +5406,7 @@
           <w14:ligatures w14:val="standardContextual"/>
         </w:rPr>
       </w:pPr>
-      <w:hyperlink w:anchor="_Toc243865233" w:history="1">
+      <w:hyperlink w:anchor="_Toc244028960" w:history="1">
         <w:r>
           <w:rPr>
             <w:rStyle w:val="Hipervnculo"/>
@@ -5433,7 +5433,7 @@
             <w:noProof/>
             <w:webHidden/>
           </w:rPr>
-          <w:instrText xml:space="preserve"> PAGEREF _Toc243865233 \h </w:instrText>
+          <w:instrText xml:space="preserve"> PAGEREF _Toc244028960 \h </w:instrText>
         </w:r>
         <w:r>
           <w:rPr>
@@ -5480,7 +5480,7 @@
           <w14:ligatures w14:val="standardContextual"/>
         </w:rPr>
       </w:pPr>
-      <w:hyperlink w:anchor="_Toc243865234" w:history="1">
+      <w:hyperlink w:anchor="_Toc244028961" w:history="1">
         <w:r>
           <w:rPr>
             <w:rStyle w:val="Hipervnculo"/>
@@ -5507,7 +5507,7 @@
             <w:noProof/>
             <w:webHidden/>
           </w:rPr>
-          <w:instrText xml:space="preserve"> PAGEREF _Toc243865234 \h </w:instrText>
+          <w:instrText xml:space="preserve"> PAGEREF _Toc244028961 \h </w:instrText>
         </w:r>
         <w:r>
           <w:rPr>
@@ -5554,7 +5554,7 @@
           <w14:ligatures w14:val="standardContextual"/>
         </w:rPr>
       </w:pPr>
-      <w:hyperlink w:anchor="_Toc243865235" w:history="1">
+      <w:hyperlink w:anchor="_Toc244028962" w:history="1">
         <w:r>
           <w:rPr>
             <w:rStyle w:val="Hipervnculo"/>
@@ -5581,7 +5581,7 @@
             <w:noProof/>
             <w:webHidden/>
           </w:rPr>
-          <w:instrText xml:space="preserve"> PAGEREF _Toc243865235 \h </w:instrText>
+          <w:instrText xml:space="preserve"> PAGEREF _Toc244028962 \h </w:instrText>
         </w:r>
         <w:r>
           <w:rPr>
@@ -5628,7 +5628,7 @@
           <w14:ligatures w14:val="standardContextual"/>
         </w:rPr>
       </w:pPr>
-      <w:hyperlink w:anchor="_Toc243865236" w:history="1">
+      <w:hyperlink w:anchor="_Toc244028963" w:history="1">
         <w:r>
           <w:rPr>
             <w:rStyle w:val="Hipervnculo"/>
@@ -5655,7 +5655,7 @@
             <w:noProof/>
             <w:webHidden/>
           </w:rPr>
-          <w:instrText xml:space="preserve"> PAGEREF _Toc243865236 \h </w:instrText>
+          <w:instrText xml:space="preserve"> PAGEREF _Toc244028963 \h </w:instrText>
         </w:r>
         <w:r>
           <w:rPr>
@@ -5702,7 +5702,7 @@
           <w14:ligatures w14:val="standardContextual"/>
         </w:rPr>
       </w:pPr>
-      <w:hyperlink w:anchor="_Toc243865237" w:history="1">
+      <w:hyperlink w:anchor="_Toc244028964" w:history="1">
         <w:r>
           <w:rPr>
             <w:rStyle w:val="Hipervnculo"/>
@@ -5729,7 +5729,7 @@
             <w:noProof/>
             <w:webHidden/>
           </w:rPr>
-          <w:instrText xml:space="preserve"> PAGEREF _Toc243865237 \h </w:instrText>
+          <w:instrText xml:space="preserve"> PAGEREF _Toc244028964 \h </w:instrText>
         </w:r>
         <w:r>
           <w:rPr>
@@ -5776,7 +5776,7 @@
           <w14:ligatures w14:val="standardContextual"/>
         </w:rPr>
       </w:pPr>
-      <w:hyperlink w:anchor="_Toc243865238" w:history="1">
+      <w:hyperlink w:anchor="_Toc244028965" w:history="1">
         <w:r>
           <w:rPr>
             <w:rStyle w:val="Hipervnculo"/>
@@ -5803,7 +5803,7 @@
             <w:noProof/>
             <w:webHidden/>
           </w:rPr>
-          <w:instrText xml:space="preserve"> PAGEREF _Toc243865238 \h </w:instrText>
+          <w:instrText xml:space="preserve"> PAGEREF _Toc244028965 \h </w:instrText>
         </w:r>
         <w:r>
           <w:rPr>
@@ -5850,7 +5850,7 @@
           <w14:ligatures w14:val="standardContextual"/>
         </w:rPr>
       </w:pPr>
-      <w:hyperlink w:anchor="_Toc243865239" w:history="1">
+      <w:hyperlink w:anchor="_Toc244028966" w:history="1">
         <w:r>
           <w:rPr>
             <w:rStyle w:val="Hipervnculo"/>
@@ -5877,7 +5877,7 @@
             <w:noProof/>
             <w:webHidden/>
           </w:rPr>
-          <w:instrText xml:space="preserve"> PAGEREF _Toc243865239 \h </w:instrText>
+          <w:instrText xml:space="preserve"> PAGEREF _Toc244028966 \h </w:instrText>
         </w:r>
         <w:r>
           <w:rPr>
@@ -5924,7 +5924,7 @@
           <w14:ligatures w14:val="standardContextual"/>
         </w:rPr>
       </w:pPr>
-      <w:hyperlink w:anchor="_Toc243865240" w:history="1">
+      <w:hyperlink w:anchor="_Toc244028967" w:history="1">
         <w:r>
           <w:rPr>
             <w:rStyle w:val="Hipervnculo"/>
@@ -5951,7 +5951,7 @@
             <w:noProof/>
             <w:webHidden/>
           </w:rPr>
-          <w:instrText xml:space="preserve"> PAGEREF _Toc243865240 \h </w:instrText>
+          <w:instrText xml:space="preserve"> PAGEREF _Toc244028967 \h </w:instrText>
         </w:r>
         <w:r>
           <w:rPr>
@@ -5998,7 +5998,7 @@
           <w14:ligatures w14:val="standardContextual"/>
         </w:rPr>
       </w:pPr>
-      <w:hyperlink w:anchor="_Toc243865241" w:history="1">
+      <w:hyperlink w:anchor="_Toc244028968" w:history="1">
         <w:r>
           <w:rPr>
             <w:rStyle w:val="Hipervnculo"/>
@@ -6025,7 +6025,7 @@
             <w:noProof/>
             <w:webHidden/>
           </w:rPr>
-          <w:instrText xml:space="preserve"> PAGEREF _Toc243865241 \h </w:instrText>
+          <w:instrText xml:space="preserve"> PAGEREF _Toc244028968 \h </w:instrText>
         </w:r>
         <w:r>
           <w:rPr>
@@ -6072,7 +6072,7 @@
           <w14:ligatures w14:val="standardContextual"/>
         </w:rPr>
       </w:pPr>
-      <w:hyperlink w:anchor="_Toc243865242" w:history="1">
+      <w:hyperlink w:anchor="_Toc244028969" w:history="1">
         <w:r>
           <w:rPr>
             <w:rStyle w:val="Hipervnculo"/>
@@ -6099,7 +6099,7 @@
             <w:noProof/>
             <w:webHidden/>
           </w:rPr>
-          <w:instrText xml:space="preserve"> PAGEREF _Toc243865242 \h </w:instrText>
+          <w:instrText xml:space="preserve"> PAGEREF _Toc244028969 \h </w:instrText>
         </w:r>
         <w:r>
           <w:rPr>
@@ -6146,7 +6146,7 @@
           <w14:ligatures w14:val="standardContextual"/>
         </w:rPr>
       </w:pPr>
-      <w:hyperlink w:anchor="_Toc243865243" w:history="1">
+      <w:hyperlink w:anchor="_Toc244028970" w:history="1">
         <w:r>
           <w:rPr>
             <w:rStyle w:val="Hipervnculo"/>
@@ -6173,7 +6173,7 @@
             <w:noProof/>
             <w:webHidden/>
           </w:rPr>
-          <w:instrText xml:space="preserve"> PAGEREF _Toc243865243 \h </w:instrText>
+          <w:instrText xml:space="preserve"> PAGEREF _Toc244028970 \h </w:instrText>
         </w:r>
         <w:r>
           <w:rPr>
@@ -6220,7 +6220,7 @@
           <w14:ligatures w14:val="standardContextual"/>
         </w:rPr>
       </w:pPr>
-      <w:hyperlink w:anchor="_Toc243865244" w:history="1">
+      <w:hyperlink w:anchor="_Toc244028971" w:history="1">
         <w:r>
           <w:rPr>
             <w:rStyle w:val="Hipervnculo"/>
@@ -6247,7 +6247,7 @@
             <w:noProof/>
             <w:webHidden/>
           </w:rPr>
-          <w:instrText xml:space="preserve"> PAGEREF _Toc243865244 \h </w:instrText>
+          <w:instrText xml:space="preserve"> PAGEREF _Toc244028971 \h </w:instrText>
         </w:r>
         <w:r>
           <w:rPr>
@@ -6294,13 +6294,13 @@
           <w14:ligatures w14:val="standardContextual"/>
         </w:rPr>
       </w:pPr>
-      <w:hyperlink w:anchor="_Toc243865245" w:history="1">
+      <w:hyperlink w:anchor="_Toc244028972" w:history="1">
         <w:r>
           <w:rPr>
             <w:rStyle w:val="Hipervnculo"/>
             <w:noProof/>
           </w:rPr>
-          <w:t>5.3.10. Reproducibilidad y evidencias</w:t>
+          <w:t>5.3.10. Transferencia temporal a otros cultivos y regiones</w:t>
         </w:r>
         <w:r>
           <w:rPr>
@@ -6321,7 +6321,7 @@
             <w:noProof/>
             <w:webHidden/>
           </w:rPr>
-          <w:instrText xml:space="preserve"> PAGEREF _Toc243865245 \h </w:instrText>
+          <w:instrText xml:space="preserve"> PAGEREF _Toc244028972 \h </w:instrText>
         </w:r>
         <w:r>
           <w:rPr>
@@ -6342,6 +6342,80 @@
             <w:webHidden/>
           </w:rPr>
           <w:t>75</w:t>
+        </w:r>
+        <w:r>
+          <w:rPr>
+            <w:noProof/>
+            <w:webHidden/>
+          </w:rPr>
+          <w:fldChar w:fldCharType="end"/>
+        </w:r>
+      </w:hyperlink>
+    </w:p>
+    <w:p>
+      <w:pPr>
+        <w:pStyle w:val="TDC3"/>
+        <w:tabs>
+          <w:tab w:val="right" w:leader="dot" w:pos="9628"/>
+        </w:tabs>
+        <w:rPr>
+          <w:rFonts w:asciiTheme="minorHAnsi" w:eastAsiaTheme="minorEastAsia" w:hAnsiTheme="minorHAnsi" w:cstheme="minorBidi"/>
+          <w:noProof/>
+          <w:color w:val="auto"/>
+          <w:kern w:val="2"/>
+          <w:sz w:val="24"/>
+          <w:szCs w:val="24"/>
+          <w14:ligatures w14:val="standardContextual"/>
+        </w:rPr>
+      </w:pPr>
+      <w:hyperlink w:anchor="_Toc244028973" w:history="1">
+        <w:r>
+          <w:rPr>
+            <w:rStyle w:val="Hipervnculo"/>
+            <w:noProof/>
+          </w:rPr>
+          <w:t>5.3.11. Reproducibilidad y evidencias</w:t>
+        </w:r>
+        <w:r>
+          <w:rPr>
+            <w:noProof/>
+            <w:webHidden/>
+          </w:rPr>
+          <w:tab/>
+        </w:r>
+        <w:r>
+          <w:rPr>
+            <w:noProof/>
+            <w:webHidden/>
+          </w:rPr>
+          <w:fldChar w:fldCharType="begin"/>
+        </w:r>
+        <w:r>
+          <w:rPr>
+            <w:noProof/>
+            <w:webHidden/>
+          </w:rPr>
+          <w:instrText xml:space="preserve"> PAGEREF _Toc244028973 \h </w:instrText>
+        </w:r>
+        <w:r>
+          <w:rPr>
+            <w:noProof/>
+            <w:webHidden/>
+          </w:rPr>
+        </w:r>
+        <w:r>
+          <w:rPr>
+            <w:noProof/>
+            <w:webHidden/>
+          </w:rPr>
+          <w:fldChar w:fldCharType="separate"/>
+        </w:r>
+        <w:r>
+          <w:rPr>
+            <w:noProof/>
+            <w:webHidden/>
+          </w:rPr>
+          <w:t>77</w:t>
         </w:r>
         <w:r>
           <w:rPr>
@@ -6368,7 +6442,7 @@
           <w14:ligatures w14:val="standardContextual"/>
         </w:rPr>
       </w:pPr>
-      <w:hyperlink w:anchor="_Toc243865246" w:history="1">
+      <w:hyperlink w:anchor="_Toc244028974" w:history="1">
         <w:r>
           <w:rPr>
             <w:rStyle w:val="Hipervnculo"/>
@@ -6395,7 +6469,7 @@
             <w:noProof/>
             <w:webHidden/>
           </w:rPr>
-          <w:instrText xml:space="preserve"> PAGEREF _Toc243865246 \h </w:instrText>
+          <w:instrText xml:space="preserve"> PAGEREF _Toc244028974 \h </w:instrText>
         </w:r>
         <w:r>
           <w:rPr>
@@ -6415,7 +6489,7 @@
             <w:noProof/>
             <w:webHidden/>
           </w:rPr>
-          <w:t>76</w:t>
+          <w:t>78</w:t>
         </w:r>
         <w:r>
           <w:rPr>
@@ -6442,7 +6516,7 @@
           <w14:ligatures w14:val="standardContextual"/>
         </w:rPr>
       </w:pPr>
-      <w:hyperlink w:anchor="_Toc243865247" w:history="1">
+      <w:hyperlink w:anchor="_Toc244028975" w:history="1">
         <w:r>
           <w:rPr>
             <w:rStyle w:val="Hipervnculo"/>
@@ -6469,7 +6543,7 @@
             <w:noProof/>
             <w:webHidden/>
           </w:rPr>
-          <w:instrText xml:space="preserve"> PAGEREF _Toc243865247 \h </w:instrText>
+          <w:instrText xml:space="preserve"> PAGEREF _Toc244028975 \h </w:instrText>
         </w:r>
         <w:r>
           <w:rPr>
@@ -6489,7 +6563,7 @@
             <w:noProof/>
             <w:webHidden/>
           </w:rPr>
-          <w:t>76</w:t>
+          <w:t>78</w:t>
         </w:r>
         <w:r>
           <w:rPr>
@@ -6516,7 +6590,7 @@
           <w14:ligatures w14:val="standardContextual"/>
         </w:rPr>
       </w:pPr>
-      <w:hyperlink w:anchor="_Toc243865248" w:history="1">
+      <w:hyperlink w:anchor="_Toc244028976" w:history="1">
         <w:r>
           <w:rPr>
             <w:rStyle w:val="Hipervnculo"/>
@@ -6543,7 +6617,7 @@
             <w:noProof/>
             <w:webHidden/>
           </w:rPr>
-          <w:instrText xml:space="preserve"> PAGEREF _Toc243865248 \h </w:instrText>
+          <w:instrText xml:space="preserve"> PAGEREF _Toc244028976 \h </w:instrText>
         </w:r>
         <w:r>
           <w:rPr>
@@ -6563,7 +6637,7 @@
             <w:noProof/>
             <w:webHidden/>
           </w:rPr>
-          <w:t>76</w:t>
+          <w:t>78</w:t>
         </w:r>
         <w:r>
           <w:rPr>
@@ -6590,7 +6664,7 @@
           <w14:ligatures w14:val="standardContextual"/>
         </w:rPr>
       </w:pPr>
-      <w:hyperlink w:anchor="_Toc243865249" w:history="1">
+      <w:hyperlink w:anchor="_Toc244028977" w:history="1">
         <w:r>
           <w:rPr>
             <w:rStyle w:val="Hipervnculo"/>
@@ -6617,7 +6691,7 @@
             <w:noProof/>
             <w:webHidden/>
           </w:rPr>
-          <w:instrText xml:space="preserve"> PAGEREF _Toc243865249 \h </w:instrText>
+          <w:instrText xml:space="preserve"> PAGEREF _Toc244028977 \h </w:instrText>
         </w:r>
         <w:r>
           <w:rPr>
@@ -6637,7 +6711,7 @@
             <w:noProof/>
             <w:webHidden/>
           </w:rPr>
-          <w:t>77</w:t>
+          <w:t>80</w:t>
         </w:r>
         <w:r>
           <w:rPr>
@@ -6664,7 +6738,7 @@
           <w14:ligatures w14:val="standardContextual"/>
         </w:rPr>
       </w:pPr>
-      <w:hyperlink w:anchor="_Toc243865250" w:history="1">
+      <w:hyperlink w:anchor="_Toc244028978" w:history="1">
         <w:r>
           <w:rPr>
             <w:rStyle w:val="Hipervnculo"/>
@@ -6691,7 +6765,7 @@
             <w:noProof/>
             <w:webHidden/>
           </w:rPr>
-          <w:instrText xml:space="preserve"> PAGEREF _Toc243865250 \h </w:instrText>
+          <w:instrText xml:space="preserve"> PAGEREF _Toc244028978 \h </w:instrText>
         </w:r>
         <w:r>
           <w:rPr>
@@ -6711,7 +6785,7 @@
             <w:noProof/>
             <w:webHidden/>
           </w:rPr>
-          <w:t>78</w:t>
+          <w:t>81</w:t>
         </w:r>
         <w:r>
           <w:rPr>
@@ -6738,7 +6812,7 @@
           <w14:ligatures w14:val="standardContextual"/>
         </w:rPr>
       </w:pPr>
-      <w:hyperlink w:anchor="_Toc243865251" w:history="1">
+      <w:hyperlink w:anchor="_Toc244028979" w:history="1">
         <w:r>
           <w:rPr>
             <w:rStyle w:val="Hipervnculo"/>
@@ -6765,7 +6839,7 @@
             <w:noProof/>
             <w:webHidden/>
           </w:rPr>
-          <w:instrText xml:space="preserve"> PAGEREF _Toc243865251 \h </w:instrText>
+          <w:instrText xml:space="preserve"> PAGEREF _Toc244028979 \h </w:instrText>
         </w:r>
         <w:r>
           <w:rPr>
@@ -6785,7 +6859,7 @@
             <w:noProof/>
             <w:webHidden/>
           </w:rPr>
-          <w:t>78</w:t>
+          <w:t>81</w:t>
         </w:r>
         <w:r>
           <w:rPr>
@@ -6812,7 +6886,7 @@
           <w14:ligatures w14:val="standardContextual"/>
         </w:rPr>
       </w:pPr>
-      <w:hyperlink w:anchor="_Toc243865252" w:history="1">
+      <w:hyperlink w:anchor="_Toc244028980" w:history="1">
         <w:r>
           <w:rPr>
             <w:rStyle w:val="Hipervnculo"/>
@@ -6839,7 +6913,7 @@
             <w:noProof/>
             <w:webHidden/>
           </w:rPr>
-          <w:instrText xml:space="preserve"> PAGEREF _Toc243865252 \h </w:instrText>
+          <w:instrText xml:space="preserve"> PAGEREF _Toc244028980 \h </w:instrText>
         </w:r>
         <w:r>
           <w:rPr>
@@ -6859,7 +6933,7 @@
             <w:noProof/>
             <w:webHidden/>
           </w:rPr>
-          <w:t>80</w:t>
+          <w:t>82</w:t>
         </w:r>
         <w:r>
           <w:rPr>
@@ -6886,7 +6960,7 @@
           <w14:ligatures w14:val="standardContextual"/>
         </w:rPr>
       </w:pPr>
-      <w:hyperlink w:anchor="_Toc243865253" w:history="1">
+      <w:hyperlink w:anchor="_Toc244028981" w:history="1">
         <w:r>
           <w:rPr>
             <w:rStyle w:val="Hipervnculo"/>
@@ -6913,7 +6987,7 @@
             <w:noProof/>
             <w:webHidden/>
           </w:rPr>
-          <w:instrText xml:space="preserve"> PAGEREF _Toc243865253 \h </w:instrText>
+          <w:instrText xml:space="preserve"> PAGEREF _Toc244028981 \h </w:instrText>
         </w:r>
         <w:r>
           <w:rPr>
@@ -6933,7 +7007,7 @@
             <w:noProof/>
             <w:webHidden/>
           </w:rPr>
-          <w:t>81</w:t>
+          <w:t>83</w:t>
         </w:r>
         <w:r>
           <w:rPr>
@@ -6960,7 +7034,7 @@
           <w14:ligatures w14:val="standardContextual"/>
         </w:rPr>
       </w:pPr>
-      <w:hyperlink w:anchor="_Toc243865254" w:history="1">
+      <w:hyperlink w:anchor="_Toc244028982" w:history="1">
         <w:r>
           <w:rPr>
             <w:rStyle w:val="Hipervnculo"/>
@@ -6987,7 +7061,7 @@
             <w:noProof/>
             <w:webHidden/>
           </w:rPr>
-          <w:instrText xml:space="preserve"> PAGEREF _Toc243865254 \h </w:instrText>
+          <w:instrText xml:space="preserve"> PAGEREF _Toc244028982 \h </w:instrText>
         </w:r>
         <w:r>
           <w:rPr>
@@ -7007,7 +7081,7 @@
             <w:noProof/>
             <w:webHidden/>
           </w:rPr>
-          <w:t>81</w:t>
+          <w:t>83</w:t>
         </w:r>
         <w:r>
           <w:rPr>
@@ -7034,7 +7108,7 @@
           <w14:ligatures w14:val="standardContextual"/>
         </w:rPr>
       </w:pPr>
-      <w:hyperlink w:anchor="_Toc243865255" w:history="1">
+      <w:hyperlink w:anchor="_Toc244028983" w:history="1">
         <w:r>
           <w:rPr>
             <w:rStyle w:val="Hipervnculo"/>
@@ -7061,7 +7135,7 @@
             <w:noProof/>
             <w:webHidden/>
           </w:rPr>
-          <w:instrText xml:space="preserve"> PAGEREF _Toc243865255 \h </w:instrText>
+          <w:instrText xml:space="preserve"> PAGEREF _Toc244028983 \h </w:instrText>
         </w:r>
         <w:r>
           <w:rPr>
@@ -7081,7 +7155,7 @@
             <w:noProof/>
             <w:webHidden/>
           </w:rPr>
-          <w:t>82</w:t>
+          <w:t>84</w:t>
         </w:r>
         <w:r>
           <w:rPr>
@@ -7108,7 +7182,7 @@
           <w14:ligatures w14:val="standardContextual"/>
         </w:rPr>
       </w:pPr>
-      <w:hyperlink w:anchor="_Toc243865256" w:history="1">
+      <w:hyperlink w:anchor="_Toc244028984" w:history="1">
         <w:r>
           <w:rPr>
             <w:rStyle w:val="Hipervnculo"/>
@@ -7135,7 +7209,7 @@
             <w:noProof/>
             <w:webHidden/>
           </w:rPr>
-          <w:instrText xml:space="preserve"> PAGEREF _Toc243865256 \h </w:instrText>
+          <w:instrText xml:space="preserve"> PAGEREF _Toc244028984 \h </w:instrText>
         </w:r>
         <w:r>
           <w:rPr>
@@ -7155,7 +7229,7 @@
             <w:noProof/>
             <w:webHidden/>
           </w:rPr>
-          <w:t>83</w:t>
+          <w:t>85</w:t>
         </w:r>
         <w:r>
           <w:rPr>
@@ -7182,7 +7256,7 @@
           <w14:ligatures w14:val="standardContextual"/>
         </w:rPr>
       </w:pPr>
-      <w:hyperlink w:anchor="_Toc243865257" w:history="1">
+      <w:hyperlink w:anchor="_Toc244028985" w:history="1">
         <w:r>
           <w:rPr>
             <w:rStyle w:val="Hipervnculo"/>
@@ -7209,7 +7283,7 @@
             <w:noProof/>
             <w:webHidden/>
           </w:rPr>
-          <w:instrText xml:space="preserve"> PAGEREF _Toc243865257 \h </w:instrText>
+          <w:instrText xml:space="preserve"> PAGEREF _Toc244028985 \h </w:instrText>
         </w:r>
         <w:r>
           <w:rPr>
@@ -7229,7 +7303,7 @@
             <w:noProof/>
             <w:webHidden/>
           </w:rPr>
-          <w:t>83</w:t>
+          <w:t>85</w:t>
         </w:r>
         <w:r>
           <w:rPr>
@@ -7256,7 +7330,7 @@
           <w14:ligatures w14:val="standardContextual"/>
         </w:rPr>
       </w:pPr>
-      <w:hyperlink w:anchor="_Toc243865258" w:history="1">
+      <w:hyperlink w:anchor="_Toc244028986" w:history="1">
         <w:r>
           <w:rPr>
             <w:rStyle w:val="Hipervnculo"/>
@@ -7283,7 +7357,7 @@
             <w:noProof/>
             <w:webHidden/>
           </w:rPr>
-          <w:instrText xml:space="preserve"> PAGEREF _Toc243865258 \h </w:instrText>
+          <w:instrText xml:space="preserve"> PAGEREF _Toc244028986 \h </w:instrText>
         </w:r>
         <w:r>
           <w:rPr>
@@ -7303,7 +7377,7 @@
             <w:noProof/>
             <w:webHidden/>
           </w:rPr>
-          <w:t>84</w:t>
+          <w:t>86</w:t>
         </w:r>
         <w:r>
           <w:rPr>
@@ -7330,7 +7404,7 @@
           <w14:ligatures w14:val="standardContextual"/>
         </w:rPr>
       </w:pPr>
-      <w:hyperlink w:anchor="_Toc243865259" w:history="1">
+      <w:hyperlink w:anchor="_Toc244028987" w:history="1">
         <w:r>
           <w:rPr>
             <w:rStyle w:val="Hipervnculo"/>
@@ -7357,7 +7431,7 @@
             <w:noProof/>
             <w:webHidden/>
           </w:rPr>
-          <w:instrText xml:space="preserve"> PAGEREF _Toc243865259 \h </w:instrText>
+          <w:instrText xml:space="preserve"> PAGEREF _Toc244028987 \h </w:instrText>
         </w:r>
         <w:r>
           <w:rPr>
@@ -7377,7 +7451,7 @@
             <w:noProof/>
             <w:webHidden/>
           </w:rPr>
-          <w:t>84</w:t>
+          <w:t>86</w:t>
         </w:r>
         <w:r>
           <w:rPr>
@@ -7404,7 +7478,7 @@
           <w14:ligatures w14:val="standardContextual"/>
         </w:rPr>
       </w:pPr>
-      <w:hyperlink w:anchor="_Toc243865260" w:history="1">
+      <w:hyperlink w:anchor="_Toc244028988" w:history="1">
         <w:r>
           <w:rPr>
             <w:rStyle w:val="Hipervnculo"/>
@@ -7431,7 +7505,7 @@
             <w:noProof/>
             <w:webHidden/>
           </w:rPr>
-          <w:instrText xml:space="preserve"> PAGEREF _Toc243865260 \h </w:instrText>
+          <w:instrText xml:space="preserve"> PAGEREF _Toc244028988 \h </w:instrText>
         </w:r>
         <w:r>
           <w:rPr>
@@ -7451,7 +7525,7 @@
             <w:noProof/>
             <w:webHidden/>
           </w:rPr>
-          <w:t>85</w:t>
+          <w:t>87</w:t>
         </w:r>
         <w:r>
           <w:rPr>
@@ -7478,7 +7552,7 @@
           <w14:ligatures w14:val="standardContextual"/>
         </w:rPr>
       </w:pPr>
-      <w:hyperlink w:anchor="_Toc243865261" w:history="1">
+      <w:hyperlink w:anchor="_Toc244028989" w:history="1">
         <w:r>
           <w:rPr>
             <w:rStyle w:val="Hipervnculo"/>
@@ -7505,7 +7579,7 @@
             <w:noProof/>
             <w:webHidden/>
           </w:rPr>
-          <w:instrText xml:space="preserve"> PAGEREF _Toc243865261 \h </w:instrText>
+          <w:instrText xml:space="preserve"> PAGEREF _Toc244028989 \h </w:instrText>
         </w:r>
         <w:r>
           <w:rPr>
@@ -7525,7 +7599,7 @@
             <w:noProof/>
             <w:webHidden/>
           </w:rPr>
-          <w:t>86</w:t>
+          <w:t>88</w:t>
         </w:r>
         <w:r>
           <w:rPr>
@@ -7552,7 +7626,7 @@
           <w14:ligatures w14:val="standardContextual"/>
         </w:rPr>
       </w:pPr>
-      <w:hyperlink w:anchor="_Toc243865262" w:history="1">
+      <w:hyperlink w:anchor="_Toc244028990" w:history="1">
         <w:r>
           <w:rPr>
             <w:rStyle w:val="Hipervnculo"/>
@@ -7579,7 +7653,7 @@
             <w:noProof/>
             <w:webHidden/>
           </w:rPr>
-          <w:instrText xml:space="preserve"> PAGEREF _Toc243865262 \h </w:instrText>
+          <w:instrText xml:space="preserve"> PAGEREF _Toc244028990 \h </w:instrText>
         </w:r>
         <w:r>
           <w:rPr>
@@ -7599,7 +7673,7 @@
             <w:noProof/>
             <w:webHidden/>
           </w:rPr>
-          <w:t>90</w:t>
+          <w:t>92</w:t>
         </w:r>
         <w:r>
           <w:rPr>
@@ -7626,7 +7700,7 @@
           <w14:ligatures w14:val="standardContextual"/>
         </w:rPr>
       </w:pPr>
-      <w:hyperlink w:anchor="_Toc243865263" w:history="1">
+      <w:hyperlink w:anchor="_Toc244028991" w:history="1">
         <w:r>
           <w:rPr>
             <w:rStyle w:val="Hipervnculo"/>
@@ -7653,7 +7727,7 @@
             <w:noProof/>
             <w:webHidden/>
           </w:rPr>
-          <w:instrText xml:space="preserve"> PAGEREF _Toc243865263 \h </w:instrText>
+          <w:instrText xml:space="preserve"> PAGEREF _Toc244028991 \h </w:instrText>
         </w:r>
         <w:r>
           <w:rPr>
@@ -7673,7 +7747,7 @@
             <w:noProof/>
             <w:webHidden/>
           </w:rPr>
-          <w:t>90</w:t>
+          <w:t>92</w:t>
         </w:r>
         <w:r>
           <w:rPr>
@@ -7700,7 +7774,7 @@
           <w14:ligatures w14:val="standardContextual"/>
         </w:rPr>
       </w:pPr>
-      <w:hyperlink w:anchor="_Toc243865264" w:history="1">
+      <w:hyperlink w:anchor="_Toc244028992" w:history="1">
         <w:r>
           <w:rPr>
             <w:rStyle w:val="Hipervnculo"/>
@@ -7727,7 +7801,7 @@
             <w:noProof/>
             <w:webHidden/>
           </w:rPr>
-          <w:instrText xml:space="preserve"> PAGEREF _Toc243865264 \h </w:instrText>
+          <w:instrText xml:space="preserve"> PAGEREF _Toc244028992 \h </w:instrText>
         </w:r>
         <w:r>
           <w:rPr>
@@ -7747,7 +7821,7 @@
             <w:noProof/>
             <w:webHidden/>
           </w:rPr>
-          <w:t>90</w:t>
+          <w:t>92</w:t>
         </w:r>
         <w:r>
           <w:rPr>
@@ -8442,7 +8516,7 @@
       <w:r>
         <w:br w:type="page"/>
       </w:r>
-      <w:bookmarkStart w:id="1" w:name="_Toc243865165"/>
+      <w:bookmarkStart w:id="1" w:name="_Toc244028791"/>
       <w:r>
         <w:lastRenderedPageBreak/>
         <w:t>1. Introducción y objetivos</w:t>
@@ -8453,7 +8527,7 @@
       <w:pPr>
         <w:pStyle w:val="Ttulo2"/>
       </w:pPr>
-      <w:bookmarkStart w:id="2" w:name="_Toc243865166"/>
+      <w:bookmarkStart w:id="2" w:name="_Toc244028792"/>
       <w:r>
         <w:t>1.1. Contexto, motivación y justificación</w:t>
       </w:r>
@@ -8516,7 +8590,7 @@
       <w:pPr>
         <w:pStyle w:val="Ttulo2"/>
       </w:pPr>
-      <w:bookmarkStart w:id="3" w:name="_Toc243865167"/>
+      <w:bookmarkStart w:id="3" w:name="_Toc244028793"/>
       <w:r>
         <w:t>1.2. Objetivos generales y específicos</w:t>
       </w:r>
@@ -8578,7 +8652,7 @@
       <w:pPr>
         <w:pStyle w:val="Ttulo2"/>
       </w:pPr>
-      <w:bookmarkStart w:id="4" w:name="_Toc243865168"/>
+      <w:bookmarkStart w:id="4" w:name="_Toc244028794"/>
       <w:r>
         <w:t>1.3. Alcance, usuarios y limitaciones</w:t>
       </w:r>
@@ -8633,7 +8707,7 @@
         <w:pStyle w:val="Ttulo1"/>
         <w:pageBreakBefore/>
       </w:pPr>
-      <w:bookmarkStart w:id="5" w:name="_Toc243865169"/>
+      <w:bookmarkStart w:id="5" w:name="_Toc244028795"/>
       <w:r>
         <w:lastRenderedPageBreak/>
         <w:t>2. Marco teórico y estado del arte</w:t>
@@ -8644,7 +8718,7 @@
       <w:pPr>
         <w:pStyle w:val="Ttulo2"/>
       </w:pPr>
-      <w:bookmarkStart w:id="6" w:name="_Toc243865170"/>
+      <w:bookmarkStart w:id="6" w:name="_Toc244028796"/>
       <w:r>
         <w:t>2.1. Necesidades hídricas y gestión eficiente del riego</w:t>
       </w:r>
@@ -8712,7 +8786,7 @@
       <w:pPr>
         <w:pStyle w:val="Ttulo2"/>
       </w:pPr>
-      <w:bookmarkStart w:id="7" w:name="_Toc243865171"/>
+      <w:bookmarkStart w:id="7" w:name="_Toc244028797"/>
       <w:r>
         <w:t>2.2. Agricultura de precisión y aprendizaje automático</w:t>
       </w:r>
@@ -8777,7 +8851,7 @@
       <w:pPr>
         <w:pStyle w:val="Ttulo2"/>
       </w:pPr>
-      <w:bookmarkStart w:id="8" w:name="_Toc243865172"/>
+      <w:bookmarkStart w:id="8" w:name="_Toc244028798"/>
       <w:r>
         <w:t>2.3. Sistemas inteligentes de apoyo a la decisión</w:t>
       </w:r>
@@ -8841,7 +8915,7 @@
         <w:pStyle w:val="Ttulo1"/>
         <w:pageBreakBefore/>
       </w:pPr>
-      <w:bookmarkStart w:id="9" w:name="_Toc243865173"/>
+      <w:bookmarkStart w:id="9" w:name="_Toc244028799"/>
       <w:r>
         <w:lastRenderedPageBreak/>
         <w:t>3. Metodología y arquitectura del sistema</w:t>
@@ -8852,7 +8926,7 @@
       <w:pPr>
         <w:pStyle w:val="Ttulo2"/>
       </w:pPr>
-      <w:bookmarkStart w:id="10" w:name="_Toc243865174"/>
+      <w:bookmarkStart w:id="10" w:name="_Toc244028800"/>
       <w:r>
         <w:t>3.1. Fuentes, variables y calidad de los datos</w:t>
       </w:r>
@@ -8872,7 +8946,7 @@
       <w:pPr>
         <w:pStyle w:val="Ttulo3"/>
       </w:pPr>
-      <w:bookmarkStart w:id="11" w:name="_Toc243865175"/>
+      <w:bookmarkStart w:id="11" w:name="_Toc244028801"/>
       <w:r>
         <w:rPr>
           <w:sz w:val="24"/>
@@ -9544,7 +9618,7 @@
       <w:pPr>
         <w:pStyle w:val="Ttulo3"/>
       </w:pPr>
-      <w:bookmarkStart w:id="13" w:name="_Toc243865176"/>
+      <w:bookmarkStart w:id="13" w:name="_Toc244028802"/>
       <w:r>
         <w:rPr>
           <w:sz w:val="24"/>
@@ -10287,7 +10361,7 @@
       <w:pPr>
         <w:pStyle w:val="Ttulo3"/>
       </w:pPr>
-      <w:bookmarkStart w:id="15" w:name="_Toc243865177"/>
+      <w:bookmarkStart w:id="15" w:name="_Toc244028803"/>
       <w:r>
         <w:rPr>
           <w:sz w:val="24"/>
@@ -10396,7 +10470,7 @@
       <w:pPr>
         <w:pStyle w:val="Ttulo3"/>
       </w:pPr>
-      <w:bookmarkStart w:id="16" w:name="_Toc243865178"/>
+      <w:bookmarkStart w:id="16" w:name="_Toc244028804"/>
       <w:r>
         <w:rPr>
           <w:sz w:val="24"/>
@@ -10420,7 +10494,7 @@
       <w:pPr>
         <w:pStyle w:val="Ttulo2"/>
       </w:pPr>
-      <w:bookmarkStart w:id="17" w:name="_Toc243865179"/>
+      <w:bookmarkStart w:id="17" w:name="_Toc244028805"/>
       <w:r>
         <w:t>3.2. Arquitectura, tecnologías y flujo de información</w:t>
       </w:r>
@@ -10495,7 +10569,7 @@
       <w:pPr>
         <w:pStyle w:val="Ttulo3"/>
       </w:pPr>
-      <w:bookmarkStart w:id="19" w:name="_Toc243865180"/>
+      <w:bookmarkStart w:id="19" w:name="_Toc244028806"/>
       <w:r>
         <w:rPr>
           <w:sz w:val="24"/>
@@ -10632,7 +10706,7 @@
       <w:pPr>
         <w:pStyle w:val="Ttulo3"/>
       </w:pPr>
-      <w:bookmarkStart w:id="20" w:name="_Toc243865181"/>
+      <w:bookmarkStart w:id="20" w:name="_Toc244028807"/>
       <w:r>
         <w:rPr>
           <w:sz w:val="24"/>
@@ -11642,7 +11716,7 @@
       <w:pPr>
         <w:pStyle w:val="Ttulo3"/>
       </w:pPr>
-      <w:bookmarkStart w:id="22" w:name="_Toc243865182"/>
+      <w:bookmarkStart w:id="22" w:name="_Toc244028808"/>
       <w:r>
         <w:rPr>
           <w:sz w:val="24"/>
@@ -11665,7 +11739,7 @@
       <w:pPr>
         <w:pStyle w:val="Ttulo3"/>
       </w:pPr>
-      <w:bookmarkStart w:id="23" w:name="_Toc243865183"/>
+      <w:bookmarkStart w:id="23" w:name="_Toc244028809"/>
       <w:r>
         <w:rPr>
           <w:sz w:val="24"/>
@@ -11689,7 +11763,7 @@
       <w:pPr>
         <w:pStyle w:val="Ttulo2"/>
       </w:pPr>
-      <w:bookmarkStart w:id="24" w:name="_Toc243865184"/>
+      <w:bookmarkStart w:id="24" w:name="_Toc244028810"/>
       <w:r>
         <w:t>3.3. Planificación y organización del proyecto</w:t>
       </w:r>
@@ -12334,7 +12408,7 @@
         <w:pStyle w:val="Ttulo1"/>
         <w:pageBreakBefore/>
       </w:pPr>
-      <w:bookmarkStart w:id="26" w:name="_Toc243865185"/>
+      <w:bookmarkStart w:id="26" w:name="_Toc244028811"/>
       <w:r>
         <w:lastRenderedPageBreak/>
         <w:t>4. Procesamiento de datos y aprendizaje automático</w:t>
@@ -12345,7 +12419,7 @@
       <w:pPr>
         <w:pStyle w:val="Ttulo2"/>
       </w:pPr>
-      <w:bookmarkStart w:id="27" w:name="_Toc243865186"/>
+      <w:bookmarkStart w:id="27" w:name="_Toc244028913"/>
       <w:r>
         <w:t>4.1. Extracción, transformación y almacenamiento de datos</w:t>
       </w:r>
@@ -12428,7 +12502,7 @@
       <w:pPr>
         <w:pStyle w:val="Ttulo3"/>
       </w:pPr>
-      <w:bookmarkStart w:id="29" w:name="_Toc243865187"/>
+      <w:bookmarkStart w:id="29" w:name="_Toc244028914"/>
       <w:r>
         <w:rPr>
           <w:sz w:val="24"/>
@@ -13017,7 +13091,7 @@
       <w:pPr>
         <w:pStyle w:val="Ttulo3"/>
       </w:pPr>
-      <w:bookmarkStart w:id="31" w:name="_Toc243865188"/>
+      <w:bookmarkStart w:id="31" w:name="_Toc244028915"/>
       <w:r>
         <w:rPr>
           <w:sz w:val="24"/>
@@ -13487,7 +13561,7 @@
       <w:pPr>
         <w:pStyle w:val="Ttulo3"/>
       </w:pPr>
-      <w:bookmarkStart w:id="33" w:name="_Toc243865189"/>
+      <w:bookmarkStart w:id="33" w:name="_Toc244028916"/>
       <w:r>
         <w:rPr>
           <w:sz w:val="24"/>
@@ -14273,7 +14347,7 @@
       <w:pPr>
         <w:pStyle w:val="Ttulo3"/>
       </w:pPr>
-      <w:bookmarkStart w:id="35" w:name="_Toc243865190"/>
+      <w:bookmarkStart w:id="35" w:name="_Toc244028917"/>
       <w:r>
         <w:rPr>
           <w:sz w:val="24"/>
@@ -14349,7 +14423,7 @@
       <w:pPr>
         <w:pStyle w:val="Ttulo3"/>
       </w:pPr>
-      <w:bookmarkStart w:id="36" w:name="_Toc243865191"/>
+      <w:bookmarkStart w:id="36" w:name="_Toc244028918"/>
       <w:r>
         <w:rPr>
           <w:sz w:val="24"/>
@@ -14498,7 +14572,7 @@
       <w:pPr>
         <w:pStyle w:val="Ttulo3"/>
       </w:pPr>
-      <w:bookmarkStart w:id="37" w:name="_Toc243865192"/>
+      <w:bookmarkStart w:id="37" w:name="_Toc244028919"/>
       <w:r>
         <w:rPr>
           <w:sz w:val="24"/>
@@ -17117,7 +17191,7 @@
       <w:pPr>
         <w:pStyle w:val="Ttulo3"/>
       </w:pPr>
-      <w:bookmarkStart w:id="42" w:name="_Toc243865193"/>
+      <w:bookmarkStart w:id="42" w:name="_Toc244028920"/>
       <w:r>
         <w:rPr>
           <w:sz w:val="24"/>
@@ -19108,7 +19182,7 @@
       <w:pPr>
         <w:pStyle w:val="Ttulo3"/>
       </w:pPr>
-      <w:bookmarkStart w:id="44" w:name="_Toc243865194"/>
+      <w:bookmarkStart w:id="44" w:name="_Toc244028921"/>
       <w:r>
         <w:rPr>
           <w:sz w:val="24"/>
@@ -19862,7 +19936,7 @@
       <w:pPr>
         <w:pStyle w:val="Ttulo3"/>
       </w:pPr>
-      <w:bookmarkStart w:id="46" w:name="_Toc243865195"/>
+      <w:bookmarkStart w:id="46" w:name="_Toc244028922"/>
       <w:r>
         <w:rPr>
           <w:sz w:val="24"/>
@@ -19889,7 +19963,7 @@
       <w:pPr>
         <w:pStyle w:val="Ttulo3"/>
       </w:pPr>
-      <w:bookmarkStart w:id="47" w:name="_Toc243865196"/>
+      <w:bookmarkStart w:id="47" w:name="_Toc244028923"/>
       <w:r>
         <w:rPr>
           <w:sz w:val="24"/>
@@ -19943,7 +20017,7 @@
       <w:pPr>
         <w:pStyle w:val="Ttulo3"/>
       </w:pPr>
-      <w:bookmarkStart w:id="48" w:name="_Toc243865197"/>
+      <w:bookmarkStart w:id="48" w:name="_Toc244028924"/>
       <w:r>
         <w:rPr>
           <w:sz w:val="24"/>
@@ -19961,7 +20035,7 @@
       <w:pPr>
         <w:pStyle w:val="Ttulo2"/>
       </w:pPr>
-      <w:bookmarkStart w:id="49" w:name="_Toc243865198"/>
+      <w:bookmarkStart w:id="49" w:name="_Toc244028925"/>
       <w:r>
         <w:t>4.2. Análisis exploratorio y preparación de variables</w:t>
       </w:r>
@@ -19976,7 +20050,7 @@
       <w:pPr>
         <w:pStyle w:val="Ttulo3"/>
       </w:pPr>
-      <w:bookmarkStart w:id="50" w:name="_Toc243865199"/>
+      <w:bookmarkStart w:id="50" w:name="_Toc244028926"/>
       <w:r>
         <w:rPr>
           <w:sz w:val="24"/>
@@ -20513,7 +20587,7 @@
       <w:pPr>
         <w:pStyle w:val="Ttulo3"/>
       </w:pPr>
-      <w:bookmarkStart w:id="53" w:name="_Toc243865200"/>
+      <w:bookmarkStart w:id="53" w:name="_Toc244028927"/>
       <w:r>
         <w:rPr>
           <w:sz w:val="24"/>
@@ -21585,7 +21659,7 @@
       <w:pPr>
         <w:pStyle w:val="Ttulo3"/>
       </w:pPr>
-      <w:bookmarkStart w:id="57" w:name="_Toc243865201"/>
+      <w:bookmarkStart w:id="57" w:name="_Toc244028928"/>
       <w:r>
         <w:rPr>
           <w:sz w:val="24"/>
@@ -21674,7 +21748,7 @@
       <w:pPr>
         <w:pStyle w:val="Ttulo3"/>
       </w:pPr>
-      <w:bookmarkStart w:id="59" w:name="_Toc243865202"/>
+      <w:bookmarkStart w:id="59" w:name="_Toc244028929"/>
       <w:r>
         <w:rPr>
           <w:sz w:val="24"/>
@@ -21757,7 +21831,7 @@
       <w:pPr>
         <w:pStyle w:val="Ttulo3"/>
       </w:pPr>
-      <w:bookmarkStart w:id="60" w:name="_Toc243865203"/>
+      <w:bookmarkStart w:id="60" w:name="_Toc244028930"/>
       <w:r>
         <w:rPr>
           <w:sz w:val="24"/>
@@ -22297,7 +22371,7 @@
       <w:pPr>
         <w:pStyle w:val="Ttulo3"/>
       </w:pPr>
-      <w:bookmarkStart w:id="62" w:name="_Toc243865204"/>
+      <w:bookmarkStart w:id="62" w:name="_Toc244028931"/>
       <w:r>
         <w:rPr>
           <w:sz w:val="24"/>
@@ -22325,7 +22399,7 @@
       <w:pPr>
         <w:pStyle w:val="Ttulo3"/>
       </w:pPr>
-      <w:bookmarkStart w:id="63" w:name="_Toc243865205"/>
+      <w:bookmarkStart w:id="63" w:name="_Toc244028932"/>
       <w:r>
         <w:rPr>
           <w:sz w:val="24"/>
@@ -22441,7 +22515,7 @@
       <w:pPr>
         <w:pStyle w:val="Ttulo2"/>
       </w:pPr>
-      <w:bookmarkStart w:id="64" w:name="_Toc243865206"/>
+      <w:bookmarkStart w:id="64" w:name="_Toc244028933"/>
       <w:r>
         <w:lastRenderedPageBreak/>
         <w:t>4.3. Desarrollo y evaluación del modelo predictivo</w:t>
@@ -22457,7 +22531,7 @@
       <w:pPr>
         <w:pStyle w:val="Ttulo3"/>
       </w:pPr>
-      <w:bookmarkStart w:id="65" w:name="_Toc243865207"/>
+      <w:bookmarkStart w:id="65" w:name="_Toc244028934"/>
       <w:r>
         <w:rPr>
           <w:sz w:val="24"/>
@@ -22485,7 +22559,7 @@
       <w:pPr>
         <w:pStyle w:val="Ttulo3"/>
       </w:pPr>
-      <w:bookmarkStart w:id="66" w:name="_Toc243865208"/>
+      <w:bookmarkStart w:id="66" w:name="_Toc244028935"/>
       <w:r>
         <w:rPr>
           <w:sz w:val="24"/>
@@ -22511,7 +22585,7 @@
       <w:pPr>
         <w:pStyle w:val="Ttulo3"/>
       </w:pPr>
-      <w:bookmarkStart w:id="67" w:name="_Toc243865209"/>
+      <w:bookmarkStart w:id="67" w:name="_Toc244028936"/>
       <w:r>
         <w:rPr>
           <w:sz w:val="24"/>
@@ -22652,7 +22726,7 @@
       <w:pPr>
         <w:pStyle w:val="Ttulo3"/>
       </w:pPr>
-      <w:bookmarkStart w:id="68" w:name="_Toc243865210"/>
+      <w:bookmarkStart w:id="68" w:name="_Toc244028937"/>
       <w:r>
         <w:rPr>
           <w:sz w:val="24"/>
@@ -22670,7 +22744,7 @@
       <w:pPr>
         <w:pStyle w:val="Ttulo3"/>
       </w:pPr>
-      <w:bookmarkStart w:id="69" w:name="_Toc243865211"/>
+      <w:bookmarkStart w:id="69" w:name="_Toc244028938"/>
       <w:r>
         <w:rPr>
           <w:sz w:val="24"/>
@@ -23648,7 +23722,7 @@
       <w:pPr>
         <w:pStyle w:val="Ttulo3"/>
       </w:pPr>
-      <w:bookmarkStart w:id="72" w:name="_Toc243865212"/>
+      <w:bookmarkStart w:id="72" w:name="_Toc244028939"/>
       <w:r>
         <w:rPr>
           <w:sz w:val="24"/>
@@ -24786,7 +24860,7 @@
       <w:pPr>
         <w:pStyle w:val="Ttulo3"/>
       </w:pPr>
-      <w:bookmarkStart w:id="75" w:name="_Toc243865213"/>
+      <w:bookmarkStart w:id="75" w:name="_Toc244028940"/>
       <w:r>
         <w:rPr>
           <w:sz w:val="24"/>
@@ -24814,7 +24888,7 @@
       <w:pPr>
         <w:pStyle w:val="Ttulo3"/>
       </w:pPr>
-      <w:bookmarkStart w:id="76" w:name="_Toc243865214"/>
+      <w:bookmarkStart w:id="76" w:name="_Toc244028941"/>
       <w:r>
         <w:rPr>
           <w:sz w:val="24"/>
@@ -24838,7 +24912,7 @@
       <w:pPr>
         <w:pStyle w:val="Ttulo3"/>
       </w:pPr>
-      <w:bookmarkStart w:id="77" w:name="_Toc243865215"/>
+      <w:bookmarkStart w:id="77" w:name="_Toc244028942"/>
       <w:r>
         <w:rPr>
           <w:sz w:val="24"/>
@@ -24871,7 +24945,7 @@
       <w:pPr>
         <w:pStyle w:val="Ttulo3"/>
       </w:pPr>
-      <w:bookmarkStart w:id="78" w:name="_Toc243865216"/>
+      <w:bookmarkStart w:id="78" w:name="_Toc244028943"/>
       <w:r>
         <w:t>4.3.10. Reentrenamiento con datos de 2026</w:t>
       </w:r>
@@ -25794,7 +25868,7 @@
       <w:pPr>
         <w:pStyle w:val="Ttulo3"/>
       </w:pPr>
-      <w:bookmarkStart w:id="81" w:name="_Toc243865217"/>
+      <w:bookmarkStart w:id="81" w:name="_Toc244028944"/>
       <w:r>
         <w:lastRenderedPageBreak/>
         <w:t>4.3.11. Modelo de ETc para la aplicación</w:t>
@@ -26407,7 +26481,7 @@
       <w:pPr>
         <w:pStyle w:val="Ttulo3"/>
       </w:pPr>
-      <w:bookmarkStart w:id="83" w:name="_Toc243865218"/>
+      <w:bookmarkStart w:id="83" w:name="_Toc244028945"/>
       <w:r>
         <w:t>4.3.12. Explicabilidad de los modelos de árboles</w:t>
       </w:r>
@@ -27233,7 +27307,7 @@
         <w:pageBreakBefore/>
       </w:pPr>
       <w:bookmarkStart w:id="86" w:name="_Toc243495226"/>
-      <w:bookmarkStart w:id="87" w:name="_Toc243865219"/>
+      <w:bookmarkStart w:id="87" w:name="_Toc244028946"/>
       <w:r>
         <w:lastRenderedPageBreak/>
         <w:t>5. Sistema de recomendación y resultados</w:t>
@@ -27250,7 +27324,7 @@
       <w:pPr>
         <w:pStyle w:val="Ttulo2"/>
       </w:pPr>
-      <w:bookmarkStart w:id="88" w:name="_Toc243865220"/>
+      <w:bookmarkStart w:id="88" w:name="_Toc244028947"/>
       <w:r>
         <w:t>5.1. Diseño del sistema de recomendación de riego</w:t>
       </w:r>
@@ -27270,7 +27344,7 @@
       <w:pPr>
         <w:pStyle w:val="Ttulo3"/>
       </w:pPr>
-      <w:bookmarkStart w:id="89" w:name="_Toc243865221"/>
+      <w:bookmarkStart w:id="89" w:name="_Toc244028948"/>
       <w:r>
         <w:rPr>
           <w:sz w:val="24"/>
@@ -27297,7 +27371,7 @@
       <w:pPr>
         <w:pStyle w:val="Ttulo3"/>
       </w:pPr>
-      <w:bookmarkStart w:id="90" w:name="_Toc243865222"/>
+      <w:bookmarkStart w:id="90" w:name="_Toc244028949"/>
       <w:r>
         <w:rPr>
           <w:sz w:val="24"/>
@@ -27382,7 +27456,7 @@
       <w:pPr>
         <w:pStyle w:val="Ttulo3"/>
       </w:pPr>
-      <w:bookmarkStart w:id="92" w:name="_Toc243865223"/>
+      <w:bookmarkStart w:id="92" w:name="_Toc244028950"/>
       <w:r>
         <w:rPr>
           <w:sz w:val="24"/>
@@ -27431,7 +27505,7 @@
       <w:pPr>
         <w:pStyle w:val="Ttulo3"/>
       </w:pPr>
-      <w:bookmarkStart w:id="93" w:name="_Toc243865224"/>
+      <w:bookmarkStart w:id="93" w:name="_Toc244028951"/>
       <w:r>
         <w:rPr>
           <w:sz w:val="24"/>
@@ -28315,7 +28389,7 @@
       <w:pPr>
         <w:pStyle w:val="Ttulo3"/>
       </w:pPr>
-      <w:bookmarkStart w:id="95" w:name="_Toc243865225"/>
+      <w:bookmarkStart w:id="95" w:name="_Toc244028952"/>
       <w:r>
         <w:rPr>
           <w:sz w:val="24"/>
@@ -28338,7 +28412,7 @@
       <w:pPr>
         <w:pStyle w:val="Ttulo3"/>
       </w:pPr>
-      <w:bookmarkStart w:id="96" w:name="_Toc243865226"/>
+      <w:bookmarkStart w:id="96" w:name="_Toc244028953"/>
       <w:r>
         <w:rPr>
           <w:sz w:val="24"/>
@@ -28357,7 +28431,7 @@
       <w:pPr>
         <w:pStyle w:val="Ttulo3"/>
       </w:pPr>
-      <w:bookmarkStart w:id="97" w:name="_Toc243865227"/>
+      <w:bookmarkStart w:id="97" w:name="_Toc244028954"/>
       <w:r>
         <w:t>5.1.7. Integración operativa de ETc y AEMET</w:t>
       </w:r>
@@ -28377,7 +28451,7 @@
       <w:pPr>
         <w:pStyle w:val="Ttulo2"/>
       </w:pPr>
-      <w:bookmarkStart w:id="98" w:name="_Toc243865228"/>
+      <w:bookmarkStart w:id="98" w:name="_Toc244028955"/>
       <w:r>
         <w:t>5.2. Aplicación y visualización de resultados</w:t>
       </w:r>
@@ -28392,7 +28466,7 @@
       <w:pPr>
         <w:pStyle w:val="Ttulo3"/>
       </w:pPr>
-      <w:bookmarkStart w:id="99" w:name="_Toc243865229"/>
+      <w:bookmarkStart w:id="99" w:name="_Toc244028956"/>
       <w:r>
         <w:rPr>
           <w:sz w:val="24"/>
@@ -28419,7 +28493,7 @@
       <w:pPr>
         <w:pStyle w:val="Ttulo3"/>
       </w:pPr>
-      <w:bookmarkStart w:id="100" w:name="_Toc243865230"/>
+      <w:bookmarkStart w:id="100" w:name="_Toc244028957"/>
       <w:r>
         <w:rPr>
           <w:sz w:val="24"/>
@@ -28447,7 +28521,7 @@
       <w:pPr>
         <w:pStyle w:val="Ttulo3"/>
       </w:pPr>
-      <w:bookmarkStart w:id="101" w:name="_Toc243865231"/>
+      <w:bookmarkStart w:id="101" w:name="_Toc244028958"/>
       <w:r>
         <w:rPr>
           <w:sz w:val="24"/>
@@ -30394,7 +30468,7 @@
       <w:pPr>
         <w:pStyle w:val="Ttulo3"/>
       </w:pPr>
-      <w:bookmarkStart w:id="104" w:name="_Toc243865232"/>
+      <w:bookmarkStart w:id="104" w:name="_Toc244028959"/>
       <w:r>
         <w:rPr>
           <w:sz w:val="24"/>
@@ -30428,7 +30502,7 @@
       <w:pPr>
         <w:pStyle w:val="Ttulo3"/>
       </w:pPr>
-      <w:bookmarkStart w:id="105" w:name="_Toc243865233"/>
+      <w:bookmarkStart w:id="105" w:name="_Toc244028960"/>
       <w:r>
         <w:rPr>
           <w:sz w:val="24"/>
@@ -30446,7 +30520,7 @@
       <w:pPr>
         <w:pStyle w:val="Ttulo3"/>
       </w:pPr>
-      <w:bookmarkStart w:id="106" w:name="_Toc243865234"/>
+      <w:bookmarkStart w:id="106" w:name="_Toc244028961"/>
       <w:r>
         <w:rPr>
           <w:sz w:val="24"/>
@@ -30464,7 +30538,7 @@
       <w:pPr>
         <w:pStyle w:val="Ttulo2"/>
       </w:pPr>
-      <w:bookmarkStart w:id="107" w:name="_Toc243865235"/>
+      <w:bookmarkStart w:id="107" w:name="_Toc244028962"/>
       <w:r>
         <w:t>5.3. Validación, resultados y análisis crítico</w:t>
       </w:r>
@@ -30488,7 +30562,7 @@
       <w:pPr>
         <w:pStyle w:val="Ttulo3"/>
       </w:pPr>
-      <w:bookmarkStart w:id="108" w:name="_Toc243865236"/>
+      <w:bookmarkStart w:id="108" w:name="_Toc244028963"/>
       <w:r>
         <w:rPr>
           <w:sz w:val="24"/>
@@ -30511,7 +30585,7 @@
       <w:pPr>
         <w:pStyle w:val="Ttulo3"/>
       </w:pPr>
-      <w:bookmarkStart w:id="109" w:name="_Toc243865237"/>
+      <w:bookmarkStart w:id="109" w:name="_Toc244028964"/>
       <w:r>
         <w:rPr>
           <w:sz w:val="24"/>
@@ -31019,7 +31093,7 @@
       <w:pPr>
         <w:pStyle w:val="Ttulo3"/>
       </w:pPr>
-      <w:bookmarkStart w:id="111" w:name="_Toc243865238"/>
+      <w:bookmarkStart w:id="111" w:name="_Toc244028965"/>
       <w:r>
         <w:rPr>
           <w:sz w:val="24"/>
@@ -31896,7 +31970,7 @@
       <w:pPr>
         <w:pStyle w:val="Ttulo3"/>
       </w:pPr>
-      <w:bookmarkStart w:id="114" w:name="_Toc243865239"/>
+      <w:bookmarkStart w:id="114" w:name="_Toc244028966"/>
       <w:r>
         <w:rPr>
           <w:sz w:val="24"/>
@@ -33000,7 +33074,7 @@
       <w:pPr>
         <w:pStyle w:val="Ttulo3"/>
       </w:pPr>
-      <w:bookmarkStart w:id="117" w:name="_Toc243865240"/>
+      <w:bookmarkStart w:id="117" w:name="_Toc244028967"/>
       <w:r>
         <w:rPr>
           <w:sz w:val="24"/>
@@ -33094,7 +33168,7 @@
       <w:pPr>
         <w:pStyle w:val="Ttulo3"/>
       </w:pPr>
-      <w:bookmarkStart w:id="119" w:name="_Toc243865241"/>
+      <w:bookmarkStart w:id="119" w:name="_Toc244028968"/>
       <w:r>
         <w:rPr>
           <w:sz w:val="24"/>
@@ -33551,7 +33625,7 @@
       <w:pPr>
         <w:pStyle w:val="Ttulo3"/>
       </w:pPr>
-      <w:bookmarkStart w:id="121" w:name="_Toc243865242"/>
+      <w:bookmarkStart w:id="121" w:name="_Toc244028969"/>
       <w:r>
         <w:rPr>
           <w:sz w:val="24"/>
@@ -34643,7 +34717,7 @@
       <w:pPr>
         <w:pStyle w:val="Ttulo3"/>
       </w:pPr>
-      <w:bookmarkStart w:id="123" w:name="_Toc243865243"/>
+      <w:bookmarkStart w:id="123" w:name="_Toc244028970"/>
       <w:r>
         <w:rPr>
           <w:sz w:val="24"/>
@@ -34661,7 +34735,7 @@
       <w:pPr>
         <w:pStyle w:val="Ttulo3"/>
       </w:pPr>
-      <w:bookmarkStart w:id="124" w:name="_Toc243865244"/>
+      <w:bookmarkStart w:id="124" w:name="_Toc244028971"/>
       <w:r>
         <w:rPr>
           <w:sz w:val="24"/>
@@ -34677,7 +34751,7 @@
     </w:p>
     <w:p>
       <w:r>
-        <w:t xml:space="preserve">Los resultados deben leerse, no obstante, con varias cautelas. La primera es que la referencia es la propia SiAR. Un error pequeño frente a ella indica que el sistema reproduce bien un cálculo oficial, no que la dosis sea la adecuada para una parcela concreta, cuyo suelo, marco de plantación, cubierta y estado del cultivo pueden diferir de las hipótesis de la estación. La segunda es que todo se ha evaluado con una estación, un cultivo y una campaña. La ventaja del sistema en los horizontes largos depende de que existan cambios de fase dentro del horizonte, y en un cultivo con un Kc que varíe de forma gradual sería menor. La tercera es que el tramo de prueba, </w:t>
+        <w:t xml:space="preserve">Los resultados deben leerse, no obstante, con varias cautelas. La primera es que la referencia es la propia SiAR. Un error pequeño frente a ella indica que el sistema reproduce bien un cálculo oficial, no que la dosis sea la adecuada para una parcela concreta, cuyo suelo, marco de plantación, cubierta y estado del cultivo pueden diferir de las hipótesis de la estación. La segunda es que la evaluación detallada se concentra en pimiento AL01 durante 2025. La comprobación añadida en coliflor AL01, alfalfa Z06 y alcachofa BA08 muestra transferencia a otros calendarios y regiones, pero cada cultivo aporta una sola campaña de 2026. La ventaja observada no acredita generalización nacional ni estabilidad interanual. La tercera es que el tramo de prueba del piloto, </w:t>
       </w:r>
       <w:r>
         <w:lastRenderedPageBreak/>
@@ -34698,14 +34772,566 @@
       <w:pPr>
         <w:pStyle w:val="Ttulo3"/>
       </w:pPr>
-      <w:bookmarkStart w:id="125" w:name="_Toc243865245"/>
+      <w:bookmarkStart w:id="125" w:name="_Toc244028972"/>
+      <w:r>
+        <w:t>5.3.10. Transferencia temporal a otros cultivos y regiones</w:t>
+      </w:r>
+      <w:bookmarkEnd w:id="125"/>
+    </w:p>
+    <w:p>
+      <w:r>
+        <w:t>La evaluación principal se diseñó sobre el piloto de pimiento AL01 de 2025 y permite analizar con detalle cada regla y cada horizonte. Como comprobación de transferencia, se repitió la simulación diaria con las tres campañas que permanecían activas en octubre de 2026: coliflor en AL01 La Mojonera, alfalfa en Z06 Ejea de los Caballeros y alcachofa en BA08 Don Benito. En cada caso el 80 % cronológicamente inicial se trató como desarrollo y el 20 % final como prueba. La ventana de siete días seleccionada con el piloto se mantuvo fija: no se reajustó por cultivo ni después de observar el tramo de prueba.</w:t>
+      </w:r>
+    </w:p>
+    <w:p>
+      <w:pPr>
+        <w:pStyle w:val="ndicetablaTFM"/>
+      </w:pPr>
+      <w:r>
+        <w:t>Tabla 5.8. Validación temporal multicaso a un día frente a la referencia SiAR.</w:t>
+      </w:r>
+    </w:p>
+    <w:tbl>
+      <w:tblPr>
+        <w:tblStyle w:val="TableNormal"/>
+        <w:tblW w:w="0" w:type="auto"/>
+        <w:jc w:val="center"/>
+        <w:tblInd w:w="0" w:type="dxa"/>
+        <w:tblLayout w:type="fixed"/>
+        <w:tblLook w:val="04A0" w:firstRow="1" w:lastRow="0" w:firstColumn="1" w:lastColumn="0" w:noHBand="0" w:noVBand="1"/>
+      </w:tblPr>
+      <w:tblGrid>
+        <w:gridCol w:w="1928"/>
+        <w:gridCol w:w="1304"/>
+        <w:gridCol w:w="964"/>
+        <w:gridCol w:w="1304"/>
+        <w:gridCol w:w="1757"/>
+        <w:gridCol w:w="1134"/>
+      </w:tblGrid>
+      <w:tr>
+        <w:trPr>
+          <w:tblHeader/>
+          <w:jc w:val="center"/>
+        </w:trPr>
+        <w:tc>
+          <w:tcPr>
+            <w:tcW w:w="1928" w:type="dxa"/>
+            <w:shd w:val="clear" w:color="auto" w:fill="1F4E78"/>
+            <w:vAlign w:val="center"/>
+          </w:tcPr>
+          <w:p>
+            <w:pPr>
+              <w:jc w:val="center"/>
+            </w:pPr>
+            <w:r>
+              <w:rPr>
+                <w:b/>
+                <w:color w:val="FFFFFF"/>
+                <w:sz w:val="15"/>
+              </w:rPr>
+              <w:t>Cultivo y estación</w:t>
+            </w:r>
+          </w:p>
+        </w:tc>
+        <w:tc>
+          <w:tcPr>
+            <w:tcW w:w="1304" w:type="dxa"/>
+            <w:shd w:val="clear" w:color="auto" w:fill="1F4E78"/>
+            <w:vAlign w:val="center"/>
+          </w:tcPr>
+          <w:p>
+            <w:pPr>
+              <w:jc w:val="center"/>
+            </w:pPr>
+            <w:r>
+              <w:rPr>
+                <w:b/>
+                <w:color w:val="FFFFFF"/>
+                <w:sz w:val="15"/>
+              </w:rPr>
+              <w:t>Días comparables</w:t>
+            </w:r>
+          </w:p>
+        </w:tc>
+        <w:tc>
+          <w:tcPr>
+            <w:tcW w:w="964" w:type="dxa"/>
+            <w:shd w:val="clear" w:color="auto" w:fill="1F4E78"/>
+            <w:vAlign w:val="center"/>
+          </w:tcPr>
+          <w:p>
+            <w:pPr>
+              <w:jc w:val="center"/>
+            </w:pPr>
+            <w:r>
+              <w:rPr>
+                <w:b/>
+                <w:color w:val="FFFFFF"/>
+                <w:sz w:val="15"/>
+              </w:rPr>
+              <w:t>Días de prueba</w:t>
+            </w:r>
+          </w:p>
+        </w:tc>
+        <w:tc>
+          <w:tcPr>
+            <w:tcW w:w="1304" w:type="dxa"/>
+            <w:shd w:val="clear" w:color="auto" w:fill="1F4E78"/>
+            <w:vAlign w:val="center"/>
+          </w:tcPr>
+          <w:p>
+            <w:pPr>
+              <w:jc w:val="center"/>
+            </w:pPr>
+            <w:r>
+              <w:rPr>
+                <w:b/>
+                <w:color w:val="FFFFFF"/>
+                <w:sz w:val="15"/>
+              </w:rPr>
+              <w:t>MAE DSS (mm/día)</w:t>
+            </w:r>
+          </w:p>
+        </w:tc>
+        <w:tc>
+          <w:tcPr>
+            <w:tcW w:w="1757" w:type="dxa"/>
+            <w:shd w:val="clear" w:color="auto" w:fill="1F4E78"/>
+            <w:vAlign w:val="center"/>
+          </w:tcPr>
+          <w:p>
+            <w:pPr>
+              <w:jc w:val="center"/>
+            </w:pPr>
+            <w:r>
+              <w:rPr>
+                <w:b/>
+                <w:color w:val="FFFFFF"/>
+                <w:sz w:val="15"/>
+              </w:rPr>
+              <w:t>MAE persistencia (mm/día)</w:t>
+            </w:r>
+          </w:p>
+        </w:tc>
+        <w:tc>
+          <w:tcPr>
+            <w:tcW w:w="1134" w:type="dxa"/>
+            <w:shd w:val="clear" w:color="auto" w:fill="1F4E78"/>
+            <w:vAlign w:val="center"/>
+          </w:tcPr>
+          <w:p>
+            <w:pPr>
+              <w:jc w:val="center"/>
+            </w:pPr>
+            <w:r>
+              <w:rPr>
+                <w:b/>
+                <w:color w:val="FFFFFF"/>
+                <w:sz w:val="15"/>
+              </w:rPr>
+              <w:t>Mejora del MAE</w:t>
+            </w:r>
+          </w:p>
+        </w:tc>
+      </w:tr>
+      <w:tr>
+        <w:trPr>
+          <w:jc w:val="center"/>
+        </w:trPr>
+        <w:tc>
+          <w:tcPr>
+            <w:tcW w:w="1928" w:type="dxa"/>
+            <w:vAlign w:val="center"/>
+          </w:tcPr>
+          <w:p>
+            <w:r>
+              <w:rPr>
+                <w:sz w:val="17"/>
+              </w:rPr>
+              <w:t>Coliflor · AL01</w:t>
+            </w:r>
+          </w:p>
+        </w:tc>
+        <w:tc>
+          <w:tcPr>
+            <w:tcW w:w="1304" w:type="dxa"/>
+            <w:vAlign w:val="center"/>
+          </w:tcPr>
+          <w:p>
+            <w:pPr>
+              <w:jc w:val="center"/>
+            </w:pPr>
+            <w:r>
+              <w:rPr>
+                <w:sz w:val="17"/>
+              </w:rPr>
+              <w:t>146</w:t>
+            </w:r>
+          </w:p>
+        </w:tc>
+        <w:tc>
+          <w:tcPr>
+            <w:tcW w:w="964" w:type="dxa"/>
+            <w:vAlign w:val="center"/>
+          </w:tcPr>
+          <w:p>
+            <w:pPr>
+              <w:jc w:val="center"/>
+            </w:pPr>
+            <w:r>
+              <w:rPr>
+                <w:sz w:val="17"/>
+              </w:rPr>
+              <w:t>30</w:t>
+            </w:r>
+          </w:p>
+        </w:tc>
+        <w:tc>
+          <w:tcPr>
+            <w:tcW w:w="1304" w:type="dxa"/>
+            <w:vAlign w:val="center"/>
+          </w:tcPr>
+          <w:p>
+            <w:pPr>
+              <w:jc w:val="center"/>
+            </w:pPr>
+            <w:r>
+              <w:rPr>
+                <w:b/>
+                <w:sz w:val="17"/>
+              </w:rPr>
+              <w:t>0,689</w:t>
+            </w:r>
+          </w:p>
+        </w:tc>
+        <w:tc>
+          <w:tcPr>
+            <w:tcW w:w="1757" w:type="dxa"/>
+            <w:vAlign w:val="center"/>
+          </w:tcPr>
+          <w:p>
+            <w:pPr>
+              <w:jc w:val="center"/>
+            </w:pPr>
+            <w:r>
+              <w:rPr>
+                <w:sz w:val="17"/>
+              </w:rPr>
+              <w:t>0,787</w:t>
+            </w:r>
+          </w:p>
+        </w:tc>
+        <w:tc>
+          <w:tcPr>
+            <w:tcW w:w="1134" w:type="dxa"/>
+            <w:vAlign w:val="center"/>
+          </w:tcPr>
+          <w:p>
+            <w:pPr>
+              <w:jc w:val="center"/>
+            </w:pPr>
+            <w:r>
+              <w:rPr>
+                <w:sz w:val="17"/>
+              </w:rPr>
+              <w:t>12,5 %</w:t>
+            </w:r>
+          </w:p>
+        </w:tc>
+      </w:tr>
+      <w:tr>
+        <w:trPr>
+          <w:jc w:val="center"/>
+        </w:trPr>
+        <w:tc>
+          <w:tcPr>
+            <w:tcW w:w="1928" w:type="dxa"/>
+            <w:shd w:val="clear" w:color="auto" w:fill="EAF2F8"/>
+            <w:vAlign w:val="center"/>
+          </w:tcPr>
+          <w:p>
+            <w:r>
+              <w:rPr>
+                <w:sz w:val="17"/>
+              </w:rPr>
+              <w:t>Alfalfa · Z06</w:t>
+            </w:r>
+          </w:p>
+        </w:tc>
+        <w:tc>
+          <w:tcPr>
+            <w:tcW w:w="1304" w:type="dxa"/>
+            <w:shd w:val="clear" w:color="auto" w:fill="EAF2F8"/>
+            <w:vAlign w:val="center"/>
+          </w:tcPr>
+          <w:p>
+            <w:pPr>
+              <w:jc w:val="center"/>
+            </w:pPr>
+            <w:r>
+              <w:rPr>
+                <w:sz w:val="17"/>
+              </w:rPr>
+              <w:t>238</w:t>
+            </w:r>
+          </w:p>
+        </w:tc>
+        <w:tc>
+          <w:tcPr>
+            <w:tcW w:w="964" w:type="dxa"/>
+            <w:shd w:val="clear" w:color="auto" w:fill="EAF2F8"/>
+            <w:vAlign w:val="center"/>
+          </w:tcPr>
+          <w:p>
+            <w:pPr>
+              <w:jc w:val="center"/>
+            </w:pPr>
+            <w:r>
+              <w:rPr>
+                <w:sz w:val="17"/>
+              </w:rPr>
+              <w:t>48</w:t>
+            </w:r>
+          </w:p>
+        </w:tc>
+        <w:tc>
+          <w:tcPr>
+            <w:tcW w:w="1304" w:type="dxa"/>
+            <w:shd w:val="clear" w:color="auto" w:fill="EAF2F8"/>
+            <w:vAlign w:val="center"/>
+          </w:tcPr>
+          <w:p>
+            <w:pPr>
+              <w:jc w:val="center"/>
+            </w:pPr>
+            <w:r>
+              <w:rPr>
+                <w:b/>
+                <w:sz w:val="17"/>
+              </w:rPr>
+              <w:t>0,646</w:t>
+            </w:r>
+          </w:p>
+        </w:tc>
+        <w:tc>
+          <w:tcPr>
+            <w:tcW w:w="1757" w:type="dxa"/>
+            <w:shd w:val="clear" w:color="auto" w:fill="EAF2F8"/>
+            <w:vAlign w:val="center"/>
+          </w:tcPr>
+          <w:p>
+            <w:pPr>
+              <w:jc w:val="center"/>
+            </w:pPr>
+            <w:r>
+              <w:rPr>
+                <w:sz w:val="17"/>
+              </w:rPr>
+              <w:t>0,761</w:t>
+            </w:r>
+          </w:p>
+        </w:tc>
+        <w:tc>
+          <w:tcPr>
+            <w:tcW w:w="1134" w:type="dxa"/>
+            <w:shd w:val="clear" w:color="auto" w:fill="EAF2F8"/>
+            <w:vAlign w:val="center"/>
+          </w:tcPr>
+          <w:p>
+            <w:pPr>
+              <w:jc w:val="center"/>
+            </w:pPr>
+            <w:r>
+              <w:rPr>
+                <w:sz w:val="17"/>
+              </w:rPr>
+              <w:t>15,1 %</w:t>
+            </w:r>
+          </w:p>
+        </w:tc>
+      </w:tr>
+      <w:tr>
+        <w:trPr>
+          <w:jc w:val="center"/>
+        </w:trPr>
+        <w:tc>
+          <w:tcPr>
+            <w:tcW w:w="1928" w:type="dxa"/>
+            <w:vAlign w:val="center"/>
+          </w:tcPr>
+          <w:p>
+            <w:r>
+              <w:rPr>
+                <w:sz w:val="17"/>
+              </w:rPr>
+              <w:t>Alcachofa · BA08</w:t>
+            </w:r>
+          </w:p>
+        </w:tc>
+        <w:tc>
+          <w:tcPr>
+            <w:tcW w:w="1304" w:type="dxa"/>
+            <w:vAlign w:val="center"/>
+          </w:tcPr>
+          <w:p>
+            <w:pPr>
+              <w:jc w:val="center"/>
+            </w:pPr>
+            <w:r>
+              <w:rPr>
+                <w:sz w:val="17"/>
+              </w:rPr>
+              <w:t>296</w:t>
+            </w:r>
+          </w:p>
+        </w:tc>
+        <w:tc>
+          <w:tcPr>
+            <w:tcW w:w="964" w:type="dxa"/>
+            <w:vAlign w:val="center"/>
+          </w:tcPr>
+          <w:p>
+            <w:pPr>
+              <w:jc w:val="center"/>
+            </w:pPr>
+            <w:r>
+              <w:rPr>
+                <w:sz w:val="17"/>
+              </w:rPr>
+              <w:t>60</w:t>
+            </w:r>
+          </w:p>
+        </w:tc>
+        <w:tc>
+          <w:tcPr>
+            <w:tcW w:w="1304" w:type="dxa"/>
+            <w:vAlign w:val="center"/>
+          </w:tcPr>
+          <w:p>
+            <w:pPr>
+              <w:jc w:val="center"/>
+            </w:pPr>
+            <w:r>
+              <w:rPr>
+                <w:b/>
+                <w:sz w:val="17"/>
+              </w:rPr>
+              <w:t>0,548</w:t>
+            </w:r>
+          </w:p>
+        </w:tc>
+        <w:tc>
+          <w:tcPr>
+            <w:tcW w:w="1757" w:type="dxa"/>
+            <w:vAlign w:val="center"/>
+          </w:tcPr>
+          <w:p>
+            <w:pPr>
+              <w:jc w:val="center"/>
+            </w:pPr>
+            <w:r>
+              <w:rPr>
+                <w:sz w:val="17"/>
+              </w:rPr>
+              <w:t>0,683</w:t>
+            </w:r>
+          </w:p>
+        </w:tc>
+        <w:tc>
+          <w:tcPr>
+            <w:tcW w:w="1134" w:type="dxa"/>
+            <w:vAlign w:val="center"/>
+          </w:tcPr>
+          <w:p>
+            <w:pPr>
+              <w:jc w:val="center"/>
+            </w:pPr>
+            <w:r>
+              <w:rPr>
+                <w:sz w:val="17"/>
+              </w:rPr>
+              <w:t>19,8 %</w:t>
+            </w:r>
+          </w:p>
+        </w:tc>
+      </w:tr>
+    </w:tbl>
+    <w:p>
+      <w:pPr>
+        <w:keepNext/>
+        <w:jc w:val="center"/>
+      </w:pPr>
       <w:r>
         <w:rPr>
-          <w:sz w:val="24"/>
+          <w:noProof/>
         </w:rPr>
-        <w:t>5.3.10. Reproducibilidad y evidencias</w:t>
-      </w:r>
-      <w:bookmarkEnd w:id="125"/>
+        <w:lastRenderedPageBreak/>
+        <w:drawing>
+          <wp:inline distT="0" distB="0" distL="0" distR="0" wp14:anchorId="087CE7CC" wp14:editId="3AD53FB9">
+            <wp:extent cx="5328000" cy="2854286"/>
+            <wp:effectExtent l="0" t="0" r="0" b="0"/>
+            <wp:docPr id="35" name="Picture 35"/>
+            <wp:cNvGraphicFramePr>
+              <a:graphicFrameLocks xmlns:a="http://schemas.openxmlformats.org/drawingml/2006/main" noChangeAspect="1"/>
+            </wp:cNvGraphicFramePr>
+            <a:graphic xmlns:a="http://schemas.openxmlformats.org/drawingml/2006/main">
+              <a:graphicData uri="http://schemas.openxmlformats.org/drawingml/2006/picture">
+                <pic:pic xmlns:pic="http://schemas.openxmlformats.org/drawingml/2006/picture">
+                  <pic:nvPicPr>
+                    <pic:cNvPr id="0" name="dss_validation_multicaso_5_3.png"/>
+                    <pic:cNvPicPr/>
+                  </pic:nvPicPr>
+                  <pic:blipFill>
+                    <a:blip r:embed="rId26"/>
+                    <a:stretch>
+                      <a:fillRect/>
+                    </a:stretch>
+                  </pic:blipFill>
+                  <pic:spPr>
+                    <a:xfrm>
+                      <a:off x="0" y="0"/>
+                      <a:ext cx="5328000" cy="2854286"/>
+                    </a:xfrm>
+                    <a:prstGeom prst="rect">
+                      <a:avLst/>
+                    </a:prstGeom>
+                  </pic:spPr>
+                </pic:pic>
+              </a:graphicData>
+            </a:graphic>
+          </wp:inline>
+        </w:drawing>
+      </w:r>
+    </w:p>
+    <w:p>
+      <w:pPr>
+        <w:pStyle w:val="ndicefiguraTFM"/>
+      </w:pPr>
+      <w:r>
+        <w:t>Figura 5.6. MAE de prueba del DSS y la persistencia en tres cultivos y regiones de 2026.</w:t>
+      </w:r>
+    </w:p>
+    <w:p>
+      <w:r>
+        <w:t>El tramo conjunto de prueba contiene 138 emisiones. El DSS obtiene un MAE agregado de 0,613 mm/día y un RMSE de 0,936 mm/día, frente a 0,733 y 1,082 mm/día para la persistencia. El MAE medio entre casos es de 0,628 mm/día para el DSS y de 0,744 mm/día para la línea base. La vía física supera a la persistencia en los tres tramos reservados, con mejoras relativas de entre el 12,5 % y el 19,8 %. En desarrollo, sin embargo, la alcachofa presenta un MAE ligeramente peor que la persistencia, 0,237 frente a 0,226 mm/día. Este resultado impide presentar la superioridad como universal y refuerza la necesidad de evaluar por campaña.</w:t>
+      </w:r>
+    </w:p>
+    <w:p>
+      <w:r>
+        <w:t>La ampliación aporta evidencia de transferencia temporal a calendarios y climas distintos, pero conserva tres límites. Primero, la referencia continúa siendo el cálculo de SiAR y no el riego observado. Segundo, cada cultivo aporta una sola campaña de 2026. Tercero, la simulación no puede incorporar predicciones AEMET históricas emitidas antes de cada fecha. Por ello demuestra que el motor reproduce de forma más estable la referencia oficial en estos tres casos, no que optimice el agua aplicada ni que vaya a generalizar a todo el territorio nacional.</w:t>
+      </w:r>
+    </w:p>
+    <w:p>
+      <w:pPr>
+        <w:pStyle w:val="Ttulo3"/>
+        <w:pageBreakBefore/>
+      </w:pPr>
+      <w:bookmarkStart w:id="126" w:name="_Toc244028973"/>
+      <w:r>
+        <w:lastRenderedPageBreak/>
+        <w:t>5.3.11. Reproducibilidad y evidencias</w:t>
+      </w:r>
+      <w:bookmarkEnd w:id="126"/>
     </w:p>
     <w:p>
       <w:r>
@@ -34714,7 +35340,12 @@
     </w:p>
     <w:p>
       <w:r>
-        <w:t>python -m src.analysis.build_xai_4_3</w:t>
+        <w:t>python -m src.analysis.build_validation_5_3</w:t>
+      </w:r>
+    </w:p>
+    <w:p>
+      <w:r>
+        <w:t>python -m src.analysis.build_validation_multicase_5_3</w:t>
       </w:r>
     </w:p>
     <w:p>
@@ -34724,7 +35355,7 @@
         <w:ind w:left="360" w:right="216"/>
       </w:pPr>
       <w:r>
-        <w:t>python -m src.analysis.build_validation_5_3</w:t>
+        <w:t>python -m src.visualization.build_dss_visual</w:t>
       </w:r>
     </w:p>
     <w:p>
@@ -34734,22 +35365,15 @@
         <w:ind w:left="360" w:right="216"/>
       </w:pPr>
       <w:r>
-        <w:t>python -m src.visualization.build_dss_visual</w:t>
-      </w:r>
-    </w:p>
-    <w:p>
-      <w:pPr>
-        <w:shd w:val="clear" w:color="auto" w:fill="F2F2F2"/>
-        <w:spacing w:before="80" w:after="140"/>
-        <w:ind w:left="360" w:right="216"/>
-      </w:pPr>
-      <w:r>
         <w:t>python -m unittest discover -s tests</w:t>
       </w:r>
     </w:p>
     <w:p>
-      <w:r>
-        <w:t>El primer comando genera el informe del DSS de 2025 y sus figuras; el segundo, la Figura 5.1, y el tercero ejecuta las pruebas. Los experimentos ampliados se regeneran con python -m src.models.retrain_cases_2026 y python -m src.models.train_etc_for_dss. La aplicación se abre desde el enlace público o mediante streamlit run src/dss/app_streamlit.py. El motor evaluado en este capítulo no equivale a una validación de la consulta AEMET actual.</w:t>
+      <w:pPr>
+        <w:keepLines/>
+      </w:pPr>
+      <w:r>
+        <w:t>El primer comando produce el informe completo del piloto, sus errores por horizonte, los escenarios y las Figuras 5.3, 5.4 y 5.5. El segundo produce la Tabla 5.8, el informe y el CSV multicaso, además de la Figura 5.6. El tercero genera la Figura 5.1 y el cuarto ejecuta las 105 pruebas automáticas. Los experimentos ampliados se regeneran con python -m src.models.retrain_cases_2026 y python -m src.models.train_etc_for_dss. La aplicación se abre desde el enlace público o mediante streamlit run src/dss/app_streamlit.py. El motor evaluado en este capítulo no equivale a una validación de la consulta AEMET actual.</w:t>
       </w:r>
     </w:p>
     <w:p>
@@ -34757,35 +35381,35 @@
         <w:pStyle w:val="Ttulo1"/>
         <w:pageBreakBefore/>
       </w:pPr>
-      <w:bookmarkStart w:id="126" w:name="_Toc243865246"/>
+      <w:bookmarkStart w:id="127" w:name="_Toc244028974"/>
       <w:r>
         <w:lastRenderedPageBreak/>
         <w:t>6. Conclusiones</w:t>
       </w:r>
-      <w:bookmarkEnd w:id="126"/>
+      <w:bookmarkEnd w:id="127"/>
     </w:p>
     <w:p>
       <w:pPr>
         <w:pStyle w:val="Ttulo2"/>
       </w:pPr>
-      <w:bookmarkStart w:id="127" w:name="_Toc243865247"/>
+      <w:bookmarkStart w:id="128" w:name="_Toc244028975"/>
       <w:r>
         <w:t>6.1. Cumplimiento de objetivos y aportaciones</w:t>
       </w:r>
-      <w:bookmarkEnd w:id="127"/>
+      <w:bookmarkEnd w:id="128"/>
     </w:p>
     <w:p>
       <w:pPr>
         <w:pStyle w:val="Ttulo3"/>
       </w:pPr>
-      <w:bookmarkStart w:id="128" w:name="_Toc243865248"/>
+      <w:bookmarkStart w:id="129" w:name="_Toc244028976"/>
       <w:r>
         <w:rPr>
           <w:sz w:val="24"/>
         </w:rPr>
         <w:t>6.1.1. Valoración de los objetivos</w:t>
       </w:r>
-      <w:bookmarkEnd w:id="128"/>
+      <w:bookmarkEnd w:id="129"/>
     </w:p>
     <w:p>
       <w:r>
@@ -34802,14 +35426,14 @@
         <w:pStyle w:val="ndicetablaTFM"/>
         <w:spacing w:after="120"/>
       </w:pPr>
-      <w:bookmarkStart w:id="129" w:name="idx_tbl_6_1"/>
+      <w:bookmarkStart w:id="130" w:name="idx_tbl_6_1"/>
       <w:r>
         <w:rPr>
           <w:b/>
         </w:rPr>
         <w:t>Tabla 6.1. Grado de cumplimiento de los objetivos específicos.</w:t>
       </w:r>
-      <w:bookmarkEnd w:id="129"/>
+      <w:bookmarkEnd w:id="130"/>
     </w:p>
     <w:tbl>
       <w:tblPr>
@@ -35040,10 +35664,7 @@
           </w:tcPr>
           <w:p>
             <w:r>
-              <w:rPr>
-                <w:sz w:val="18"/>
-              </w:rPr>
-              <w:t>Diseñar un flujo de datos reproducible con calidad y trazabilidad</w:t>
+              <w:t>Tres casos adicionales, pero una sola campaña por cultivo</w:t>
             </w:r>
           </w:p>
         </w:tc>
@@ -35061,10 +35682,7 @@
           </w:tcPr>
           <w:p>
             <w:r>
-              <w:rPr>
-                <w:sz w:val="18"/>
-              </w:rPr>
-              <w:t>Apartado 4.1; capas raw, interim y processed</w:t>
+              <w:t>Que los resultados se generalicen a todo el territorio o a otros años</w:t>
             </w:r>
           </w:p>
         </w:tc>
@@ -35081,14 +35699,8 @@
             <w:vAlign w:val="center"/>
           </w:tcPr>
           <w:p>
-            <w:pPr>
-              <w:jc w:val="center"/>
-            </w:pPr>
-            <w:r>
-              <w:rPr>
-                <w:sz w:val="18"/>
-              </w:rPr>
-              <w:t>Cumplido</w:t>
+            <w:r>
+              <w:t>Ampliación de la evidencia (6.3.1)</w:t>
             </w:r>
           </w:p>
         </w:tc>
@@ -35134,6 +35746,7 @@
               <w:rPr>
                 <w:sz w:val="18"/>
               </w:rPr>
+              <w:lastRenderedPageBreak/>
               <w:t>Realizar el análisis exploratorio y construir variables derivadas</w:t>
             </w:r>
           </w:p>
@@ -35220,7 +35833,6 @@
               <w:rPr>
                 <w:sz w:val="18"/>
               </w:rPr>
-              <w:lastRenderedPageBreak/>
               <w:t>Desarrollar y comparar modelos predictivos</w:t>
             </w:r>
           </w:p>
@@ -35560,61 +36172,59 @@
       <w:pPr>
         <w:pStyle w:val="Ttulo3"/>
       </w:pPr>
-      <w:bookmarkStart w:id="130" w:name="_Toc243865249"/>
+      <w:bookmarkStart w:id="131" w:name="_Toc244028977"/>
       <w:r>
         <w:rPr>
           <w:sz w:val="24"/>
         </w:rPr>
+        <w:lastRenderedPageBreak/>
         <w:t>6.1.2. Aportaciones del trabajo</w:t>
       </w:r>
-      <w:bookmarkEnd w:id="130"/>
-    </w:p>
-    <w:p>
-      <w:r>
-        <w:t xml:space="preserve">La aportación principal es un resultado empírico que no estaba previsto en el anteproyecto. En este piloto, para anticipar la necesidad de riego de un cultivo con calendario definido, separar la estimación en sus dos componentes resultó más eficaz que aumentar la complejidad del modelo. Uno de ellos, la demanda atmosférica, es incierto pero evoluciona de forma gradual; el otro, el </w:t>
-      </w:r>
+      <w:bookmarkEnd w:id="131"/>
+    </w:p>
+    <w:p>
+      <w:r>
+        <w:t>La aportación principal es un resultado empírico que no estaba previsto en el anteproyecto. En este piloto, para anticipar la necesidad de riego de un cultivo con calendario definido, separar la estimación en sus dos componentes resultó más eficaz que aumentar la complejidad del modelo. Uno de ellos, la demanda atmosférica, es incierto pero evoluciona de forma gradual; el otro, el coeficiente de cultivo, cambia de forma brusca pero se conoce de antemano. La vía que multiplica la ET0 media de los siete días anteriores por el Kc del día objetivo reduce el MAE de la recomendación a un día frente a la persistencia en un 7 % en desarrollo y en un 25 % en la prueba, y el RMSE de desarrollo en un 18 %. La diferencia se amplía con la anticipación: a siete días, en el periodo de desarrollo, el error del sistema es de 0,48 mm frente a 0,87 mm de la persistencia, porque se mantiene prácticamente estable a lo largo del horizonte. Donde el método se distingue con más claridad es en los cambios de fase. El 1 de septiembre, cuando el Kc pasa de 1,00 a 0,30, la persistencia se desvía 3,52 mm y el sistema 0,01 mm.</w:t>
+      </w:r>
+    </w:p>
+    <w:p>
+      <w:r>
+        <w:t>La segunda aportación es una comparación temporal reproducible. En el piloto original se midieron persistencia, Ridge, Random Forest, KNN, SVR y XGBoost sobre la referencia calculada por SiAR, sin ET0, ETc ni precipitación efectiva del mismo día entre los predictores. El modelo se eligió antes de abrir la prueba final. La ampliación posterior reentrenó por separado seis combinaciones: persistencia fue elegida en cinco y Ridge en coliflor, donde su MAE final (0,892 mm/día) no superó al de persistencia (0,885). Estas pruebas no indican que un algoritmo complejo mejore de forma general la estimación. La evaluación del método físico de capítulo 5 reutiliza fechas del piloto y no constituye otra prueba independiente.</w:t>
+      </w:r>
+    </w:p>
+    <w:p>
+      <w:r>
+        <w:t>La tercera aportación es de diseño. El motor hace visibles sus limitaciones en la salida. Cada recomendación indica el método que la produjo, las reglas aplicadas, el último dato observado, un nivel de confianza y, cuando está disponible el informe de validación, el error medio para su día del horizonte. Si falta información imprescindible no se emite una dosis; si los datos son antiguos, se conserva la estimación con un aviso y confianza baja. Las filas sin estimación permanecen ausentes, no se convierten en dosis cero, y ninguna dosis emitida resulta negativa. Las pruebas automáticas verifican, además, que la planificación no cambia cuando se alteran los datos posteriores a la fecha de emisión, que es la garantía formal de que el sistema no utiliza información futura.</w:t>
+      </w:r>
+    </w:p>
+    <w:p>
+      <w:r>
+        <w:t>La cuarta aportación es la reproducibilidad. El repositorio conserva los CSV SiAR acotados, los protocolos de modelado y las métricas por caso, el motor y la aplicación pública. Los modelos de necesidad neta del experimento quedan como artefactos locales reproducibles; los seis artefactos pequeños de ETc sí se versionan para su uso en Streamlit. Los módulos de entrenamiento y la suite de pruebas verifican calidad, orden temporal y ausencia de variables del día objetivo.</w:t>
+      </w:r>
+    </w:p>
+    <w:p>
+      <w:pPr>
+        <w:pStyle w:val="Ttulo2"/>
+      </w:pPr>
+      <w:bookmarkStart w:id="132" w:name="_Toc244028978"/>
       <w:r>
         <w:lastRenderedPageBreak/>
-        <w:t>coeficiente de cultivo, cambia de forma brusca pero se conoce de antemano. La vía que multiplica la ET0 media de los siete días anteriores por el Kc del día objetivo reduce el MAE de la recomendación a un día frente a la persistencia en un 7 % en desarrollo y en un 25 % en la prueba, y el RMSE de desarrollo en un 18 %. La diferencia se amplía con la anticipación: a siete días, en el periodo de desarrollo, el error del sistema es de 0,48 mm frente a 0,87 mm de la persistencia, porque se mantiene prácticamente estable a lo largo del horizonte. Donde el método se distingue con más claridad es en los cambios de fase. El 1 de septiembre, cuando el Kc pasa de 1,00 a 0,30, la persistencia se desvía 3,52 mm y el sistema 0,01 mm.</w:t>
-      </w:r>
-    </w:p>
-    <w:p>
-      <w:r>
-        <w:t>La segunda aportación es una comparación temporal reproducible. En el piloto original se midieron persistencia, Ridge, Random Forest, KNN, SVR y XGBoost sobre la referencia calculada por SiAR, sin ET0, ETc ni precipitación efectiva del mismo día entre los predictores. El modelo se eligió antes de abrir la prueba final. La ampliación posterior reentrenó por separado seis combinaciones: persistencia fue elegida en cinco y Ridge en coliflor, donde su MAE final (0,892 mm/día) no superó al de persistencia (0,885). Estas pruebas no indican que un algoritmo complejo mejore de forma general la estimación. La evaluación del método físico de capítulo 5 reutiliza fechas del piloto y no constituye otra prueba independiente.</w:t>
-      </w:r>
-    </w:p>
-    <w:p>
-      <w:r>
-        <w:t>La tercera aportación es de diseño. El motor hace visibles sus limitaciones en la salida. Cada recomendación indica el método que la produjo, las reglas aplicadas, el último dato observado, un nivel de confianza y, cuando está disponible el informe de validación, el error medio para su día del horizonte. Si falta información imprescindible no se emite una dosis; si los datos son antiguos, se conserva la estimación con un aviso y confianza baja. Las filas sin estimación permanecen ausentes, no se convierten en dosis cero, y ninguna dosis emitida resulta negativa. Las pruebas automáticas verifican, además, que la planificación no cambia cuando se alteran los datos posteriores a la fecha de emisión, que es la garantía formal de que el sistema no utiliza información futura.</w:t>
-      </w:r>
-    </w:p>
-    <w:p>
-      <w:r>
-        <w:t>La cuarta aportación es la reproducibilidad. El repositorio conserva los CSV SiAR acotados, los protocolos de modelado y las métricas por caso, el motor y la aplicación pública. Los modelos de necesidad neta del experimento quedan como artefactos locales reproducibles; los seis artefactos pequeños de ETc sí se versionan para su uso en Streamlit. Los módulos de entrenamiento y la suite de pruebas verifican calidad, orden temporal y ausencia de variables del día objetivo.</w:t>
-      </w:r>
-    </w:p>
-    <w:p>
-      <w:pPr>
-        <w:pStyle w:val="Ttulo2"/>
-      </w:pPr>
-      <w:bookmarkStart w:id="131" w:name="_Toc243865250"/>
-      <w:r>
         <w:t>6.2. Limitaciones e impacto del proyecto</w:t>
       </w:r>
-      <w:bookmarkEnd w:id="131"/>
+      <w:bookmarkEnd w:id="132"/>
     </w:p>
     <w:p>
       <w:pPr>
         <w:pStyle w:val="Ttulo3"/>
       </w:pPr>
-      <w:bookmarkStart w:id="132" w:name="_Toc243865251"/>
+      <w:bookmarkStart w:id="133" w:name="_Toc244028979"/>
       <w:r>
         <w:rPr>
           <w:sz w:val="24"/>
         </w:rPr>
         <w:t>6.2.1. Limitaciones y alcance de las conclusiones</w:t>
       </w:r>
-      <w:bookmarkEnd w:id="132"/>
+      <w:bookmarkEnd w:id="133"/>
     </w:p>
     <w:p>
       <w:r>
@@ -35623,13 +36233,12 @@
     </w:p>
     <w:p>
       <w:r>
-        <w:lastRenderedPageBreak/>
         <w:t>La limitación más importante es de validez de constructo. La variable objetivo y la referencia de toda la evaluación es la necesidad neta calculada por SiAR, que aplica la metodología FAO-56 a las condiciones de una estación y a un calendario de cultivo estándar (Allen et al., 1998). Un error pequeño frente a ella demuestra que el sistema reproduce y anticipa bien un cálculo oficial, no que la dosis sea la adecuada para una parcela concreta, cuyo suelo, cubierta, marco de plantación y estado del cultivo pueden diferir de los supuestos de la estación.</w:t>
       </w:r>
     </w:p>
     <w:p>
       <w:r>
-        <w:t>La segunda limitación es de validez externa. La evaluación del DSS del capítulo 5 sigue centrada en pimiento AL01 en 2025. La evaluación predictiva ampliada reúne seis combinaciones de tres estaciones y una o dos campañas, pero cada prueba final pertenece a un tramo temporal concreto de 2026. Coliflor y alcachofa presentan mayor error en prueba que en validación. No se ha demostrado transferencia a otras fincas, sistemas de producción ni años posteriores.</w:t>
+        <w:t>La segunda limitación es de validez externa. La evaluación detallada se concentra en pimiento AL01 durante 2025, aunque se ha añadido una comprobación temporal con coliflor AL01, alfalfa Z06 y alcachofa BA08 en 2026. El DSS supera a la persistencia en los tres tramos finales reservados, pero cada cultivo adicional aporta una sola campaña y no existe una prueba dejando fuera un año completo. Por tanto, la ampliación muestra transferencia a tres calendarios y regiones, pero no demuestra generalización nacional ni estabilidad interanual.</w:t>
       </w:r>
     </w:p>
     <w:p>
@@ -35652,14 +36261,15 @@
         <w:pStyle w:val="ndicetablaTFM"/>
         <w:spacing w:after="120"/>
       </w:pPr>
-      <w:bookmarkStart w:id="133" w:name="idx_tbl_6_2"/>
+      <w:bookmarkStart w:id="134" w:name="idx_tbl_6_2"/>
       <w:r>
         <w:rPr>
           <w:b/>
         </w:rPr>
+        <w:lastRenderedPageBreak/>
         <w:t>Tabla 6.2. Limitaciones del piloto, alcance de las conclusiones y línea de mejora asociada.</w:t>
       </w:r>
-      <w:bookmarkEnd w:id="133"/>
+      <w:bookmarkEnd w:id="134"/>
     </w:p>
     <w:tbl>
       <w:tblPr>
@@ -35840,7 +36450,6 @@
           </w:tcPr>
           <w:p>
             <w:r>
-              <w:lastRenderedPageBreak/>
               <w:t>DSS evaluado en pimiento 2025; modelos ampliados a seis combinaciones</w:t>
             </w:r>
           </w:p>
@@ -36220,14 +36829,14 @@
       <w:pPr>
         <w:pStyle w:val="Ttulo3"/>
       </w:pPr>
-      <w:bookmarkStart w:id="134" w:name="_Toc243865252"/>
+      <w:bookmarkStart w:id="135" w:name="_Toc244028980"/>
       <w:r>
         <w:rPr>
           <w:sz w:val="24"/>
         </w:rPr>
         <w:t>6.2.2. Impacto del proyecto</w:t>
       </w:r>
-      <w:bookmarkEnd w:id="134"/>
+      <w:bookmarkEnd w:id="135"/>
     </w:p>
     <w:p>
       <w:r>
@@ -36236,12 +36845,15 @@
     </w:p>
     <w:p>
       <w:r>
-        <w:t>El primero es una capacidad funcional comprobada. El sistema transforma datos públicos y gratuitos en una dosis diaria y semanal expresada en milímetros y en metros cúbicos por parcela, acompañada de su explicación y sin necesidad de sensores. Su valor práctico se concentra en los cambios de fase. En la semana analizada en el apartado 5.2.3, la persistencia habría planificado 6,77 mm menos de los que necesitó el cultivo, un 18 % de la referencia, justo al entrar en una fase de mayor demanda; el sistema se desvió un 4,9 %. Es el tipo de error que un calendario fijo o la repetición de la última dosis no ponen de manifiesto y que podría producir un déficit si se aplicara sin otros controles; el ejemplo retrospectivo no demuestra que ocurriera en una parcela.</w:t>
-      </w:r>
-    </w:p>
-    <w:p>
+        <w:t xml:space="preserve">El primero es una capacidad funcional comprobada. El sistema transforma datos públicos y gratuitos en una dosis diaria y semanal expresada en milímetros y en metros cúbicos por parcela, acompañada de su explicación y sin necesidad de sensores. Su valor práctico se concentra en los cambios de fase. En la semana analizada en el apartado 5.2.3, la persistencia habría planificado 6,77 mm menos de los que necesitó el cultivo, un 18 % de la referencia, justo al entrar en una fase </w:t>
+      </w:r>
       <w:r>
         <w:lastRenderedPageBreak/>
+        <w:t>de mayor demanda; el sistema se desvió un 4,9 %. Es el tipo de error que un calendario fijo o la repetición de la última dosis no ponen de manifiesto y que podría producir un déficit si se aplicara sin otros controles; el ejemplo retrospectivo no demuestra que ocurriera en una parcela.</w:t>
+      </w:r>
+    </w:p>
+    <w:p>
+      <w:r>
         <w:t>El segundo es un hallazgo que reordena las prioridades de mejora. El análisis de sensibilidad mostró que un error de diez puntos en la eficiencia de la instalación produce una desviación de alrededor del 12 % en la dosis bruta, muy superior al error de estimación de la necesidad neta medido en este trabajo. Para una explotación, caracterizar la eficiencia y la uniformidad de su instalación aportaría más precisión que refinar el modelo de ET0 (Burt et al., 1997). La observación es pertinente también para las políticas de digitalización del regadío (Real Decreto 854/2022, 2022): una herramienta digital solo convierte su precisión en ahorro si conoce la instalación sobre la que se aplica.</w:t>
       </w:r>
     </w:p>
@@ -36259,11 +36871,11 @@
       <w:pPr>
         <w:pStyle w:val="Ttulo2"/>
       </w:pPr>
-      <w:bookmarkStart w:id="135" w:name="_Toc243865253"/>
+      <w:bookmarkStart w:id="136" w:name="_Toc244028981"/>
       <w:r>
         <w:t>6.3. Mejoras y líneas futuras</w:t>
       </w:r>
-      <w:bookmarkEnd w:id="135"/>
+      <w:bookmarkEnd w:id="136"/>
     </w:p>
     <w:p>
       <w:r>
@@ -36274,70 +36886,73 @@
       <w:pPr>
         <w:pStyle w:val="Ttulo3"/>
       </w:pPr>
-      <w:bookmarkStart w:id="136" w:name="_Toc243865254"/>
+      <w:bookmarkStart w:id="137" w:name="_Toc244028982"/>
       <w:r>
         <w:rPr>
           <w:sz w:val="24"/>
         </w:rPr>
         <w:t>6.3.1. Ampliación de la evidencia</w:t>
       </w:r>
-      <w:bookmarkEnd w:id="136"/>
-    </w:p>
-    <w:p>
-      <w:r>
-        <w:t>La primera mejora consiste en ampliar campañas, estaciones y cultivos. El prototipo ya ofrece seis combinaciones en tres estaciones, pero solo entre casos descargados y verificados. La extracción meteorológica admite estación y periodo; las necesidades se aportan con CSV SiAR y metadatos. Falta automatizar un catálogo amplio y contrastar la aplicabilidad agronómica de cada calendario. Con campañas adicionales podrán reservarse bloques completos para medir transferencia temporal y espacial (Roberts et al., 2017).</w:t>
+      <w:bookmarkEnd w:id="137"/>
+    </w:p>
+    <w:p>
+      <w:r>
+        <w:t xml:space="preserve">La primera mejora consiste en ampliar campañas, estaciones y cultivos. El prototipo ya ofrece seis combinaciones en tres estaciones, pero solo entre casos descargados y verificados. La extracción meteorológica admite estación y periodo; las necesidades se aportan con CSV SiAR y metadatos. Falta automatizar un catálogo amplio y contrastar la aplicabilidad agronómica de cada calendario. </w:t>
+      </w:r>
+      <w:r>
+        <w:lastRenderedPageBreak/>
+        <w:t>Con campañas adicionales podrán reservarse bloques completos para medir transferencia temporal y espacial (Roberts et al., 2017).</w:t>
       </w:r>
     </w:p>
     <w:p>
       <w:pPr>
         <w:pStyle w:val="Ttulo3"/>
       </w:pPr>
-      <w:bookmarkStart w:id="137" w:name="_Toc243865255"/>
+      <w:bookmarkStart w:id="138" w:name="_Toc244028983"/>
       <w:r>
         <w:rPr>
           <w:sz w:val="24"/>
         </w:rPr>
+        <w:t>6.3.2. Mejora del motor de recomendación</w:t>
+      </w:r>
+      <w:bookmarkEnd w:id="138"/>
+    </w:p>
+    <w:p>
+      <w:r>
+        <w:t>La prioridad principal para la siguiente iteración es incorporar un balance hídrico real de la parcela. La instrumentación podría combinar sondas capacitivas FDR o TDR para contenido volumétrico y tensiómetros para potencial matricial, instalados a varias profundidades representativas de la zona radicular. Como configuración inicial se propone un registro frecuente y una agregación horaria; Sui (2017) documenta un caso con lectura cada minuto, promedio horario y sensores a tres profundidades. La frecuencia definitiva deberá ajustarse al suelo, cultivo y sistema de riego. La tubería de datos controlaría rango físico, valores ausentes, deriva, conectividad y calibración específica del suelo antes de alimentar el DSS. Junto con capacidad de retención, profundidad radicular, precipitación efectiva y riego realmente aplicado, estas entradas permitirían estimar el agotamiento admisible de FAO-56, decidir no solo cuánto sino cuándo regar y aprovechar la lluvia almacenada (Allen et al., 1998). La telemetría no sustituye la caracterización agronómica ni prueba que una dosis recomendada se haya ejecutado. Cualquier mejora deberá validarse en campo; después podría estudiarse un riego deficitario que concentre el déficit en fases menos sensibles (Fereres &amp; Soriano, 2007).</w:t>
+      </w:r>
+    </w:p>
+    <w:p>
+      <w:r>
+        <w:t>Como complemento espacial, podría evaluarse la teledetección de Copernicus Sentinel-2 para estimar índices de vegetación como NDVI y observar diferencias de vigor dentro de la parcela (Drusch et al., 2012). Estos índices no sustituirían automáticamente el Kc de calendario. Servirían para investigar un Kc dinámico por cultivo y parcela, calibrado frente a sensores, observaciones de campo y ETc de referencia. La nubosidad, la frecuencia de adquisición y la resolución disponible deberían tratarse como fuentes de ausencia e incertidumbre, de modo que el sistema mantuviera la vía agronómica cuando la imagen no fuese representativa.</w:t>
+      </w:r>
+    </w:p>
+    <w:p>
+      <w:r>
+        <w:t xml:space="preserve">La segunda prioridad es anticipar los cambios meteorológicos mediante una ET0 futura validada, especialmente para los días 4 a 7. El motor admite esa entrada, pero la aplicación usa de momento ET0 observada reciente. AEMET aporta lluvia prevista al cálculo actual; no hay emisiones históricas archivadas que permitan evaluar su aportación frente a la lluvia finalmente efectiva. Ese archivo deberá registrar emisión, periodo de validez y observación posterior. Con él se podría evaluar una ET0 derivada de variables pronosticadas o el producto de necesidades previstas de SiAR (Sistema de Información Agroclimática para el Regadío, s. f.), sin confundir productos relacionados con una validación independiente. La sustitución de la vía actual exigiría mejorar el error por horizonte en bloques temporales nuevos. El mismo archivo permitiría modelizar el error local de AEMET mediante dos tareas separadas: clasificación de la ocurrencia de lluvia y regresión de la cantidad observada frente a la prevista. Este posprocesado corregiría </w:t>
+      </w:r>
+      <w:r>
         <w:lastRenderedPageBreak/>
-        <w:t>6.3.2. Mejora del motor de recomendación</w:t>
-      </w:r>
-      <w:bookmarkEnd w:id="137"/>
-    </w:p>
-    <w:p>
-      <w:r>
-        <w:t>La prioridad principal para la siguiente iteración es incorporar un balance hídrico real de la parcela. La instrumentación podría combinar sondas capacitivas FDR o TDR para contenido volumétrico y tensiómetros para potencial matricial, instalados a varias profundidades representativas de la zona radicular. Como configuración inicial se propone un registro frecuente y una agregación horaria; Sui (2017) documenta un caso con lectura cada minuto, promedio horario y sensores a tres profundidades. La frecuencia definitiva deberá ajustarse al suelo, cultivo y sistema de riego. La tubería de datos controlaría rango físico, valores ausentes, deriva, conectividad y calibración específica del suelo antes de alimentar el DSS. Junto con capacidad de retención, profundidad radicular, precipitación efectiva y riego realmente aplicado, estas entradas permitirían estimar el agotamiento admisible de FAO-56, decidir no solo cuánto sino cuándo regar y aprovechar la lluvia almacenada (Allen et al., 1998). La telemetría no sustituye la caracterización agronómica ni prueba que una dosis recomendada se haya ejecutado. Cualquier mejora deberá validarse en campo; después podría estudiarse un riego deficitario que concentre el déficit en fases menos sensibles (Fereres &amp; Soriano, 2007).</w:t>
-      </w:r>
-    </w:p>
-    <w:p>
-      <w:r>
-        <w:t>Como complemento espacial, podría evaluarse la teledetección de Copernicus Sentinel-2 para estimar índices de vegetación como NDVI y observar diferencias de vigor dentro de la parcela (Drusch et al., 2012). Estos índices no sustituirían automáticamente el Kc de calendario. Servirían para investigar un Kc dinámico por cultivo y parcela, calibrado frente a sensores, observaciones de campo y ETc de referencia. La nubosidad, la frecuencia de adquisición y la resolución disponible deberían tratarse como fuentes de ausencia e incertidumbre, de modo que el sistema mantuviera la vía agronómica cuando la imagen no fuese representativa.</w:t>
-      </w:r>
-    </w:p>
-    <w:p>
-      <w:r>
-        <w:t>La segunda prioridad es anticipar los cambios meteorológicos mediante una ET0 futura validada, especialmente para los días 4 a 7. El motor admite esa entrada, pero la aplicación usa de momento ET0 observada reciente. AEMET aporta lluvia prevista al cálculo actual; no hay emisiones históricas archivadas que permitan evaluar su aportación frente a la lluvia finalmente efectiva. Ese archivo deberá registrar emisión, periodo de validez y observación posterior. Con él se podría evaluar una ET0 derivada de variables pronosticadas o el producto de necesidades previstas de SiAR (Sistema de Información Agroclimática para el Regadío, s. f.), sin confundir productos relacionados con una validación independiente. La sustitución de la vía actual exigiría mejorar el error por horizonte en bloques temporales nuevos. El mismo archivo permitiría modelizar el error local de AEMET mediante dos tareas separadas: clasificación de la ocurrencia de lluvia y regresión de la cantidad observada frente a la prevista. Este posprocesado corregiría sesgos locales y cuantificaría la incertidumbre; no sustituiría la predicción oficial. El entrenamiento respetaría la hora de emisión y reservaría bloques temporales posteriores para prueba.</w:t>
-      </w:r>
-    </w:p>
-    <w:p>
-      <w:r>
-        <w:t xml:space="preserve">La tercera prioridad es reevaluar el componente predictivo cuando existan más campañas, telemetría y previsiones archivadas. Los seis modelos de ETc actuales se utilizan como contraste </w:t>
-      </w:r>
-      <w:r>
-        <w:lastRenderedPageBreak/>
-        <w:t>de la vía física y solo pueden determinar la dosis cuando mejoran su MAE de prueba y existe una observación del día anterior. Con más información convendrá ensayar una corrección de la estimación física mediante el residuo entre ET0 × Kc y la referencia, usando únicamente datos disponibles al emitir. La mejora deberá evaluarse en bloques temporales nuevos, sin reutilizar para selección la misma prueba final. Los niveles de confianza actuales, definidos por reglas, podrían reemplazarse por intervalos calibrados (Hyndman &amp; Athanasopoulos, 2021).</w:t>
+        <w:t>sesgos locales y cuantificaría la incertidumbre; no sustituiría la predicción oficial. El entrenamiento respetaría la hora de emisión y reservaría bloques temporales posteriores para prueba.</w:t>
+      </w:r>
+    </w:p>
+    <w:p>
+      <w:r>
+        <w:t>La tercera prioridad es reevaluar el componente predictivo cuando existan más campañas, telemetría y previsiones archivadas. Los seis modelos de ETc actuales se utilizan como contraste de la vía física y solo pueden determinar la dosis cuando mejoran su MAE de prueba y existe una observación del día anterior. Con más información convendrá ensayar una corrección de la estimación física mediante el residuo entre ET0 × Kc y la referencia, usando únicamente datos disponibles al emitir. La mejora deberá evaluarse en bloques temporales nuevos, sin reutilizar para selección la misma prueba final. Los niveles de confianza actuales, definidos por reglas, podrían reemplazarse por intervalos calibrados (Hyndman &amp; Athanasopoulos, 2021).</w:t>
       </w:r>
     </w:p>
     <w:p>
       <w:pPr>
         <w:pStyle w:val="Ttulo3"/>
       </w:pPr>
-      <w:bookmarkStart w:id="138" w:name="_Toc243865256"/>
+      <w:bookmarkStart w:id="139" w:name="_Toc244028984"/>
       <w:r>
         <w:rPr>
           <w:sz w:val="24"/>
         </w:rPr>
         <w:t>6.3.3. Validación en condiciones de uso</w:t>
       </w:r>
-      <w:bookmarkEnd w:id="138"/>
+      <w:bookmarkEnd w:id="139"/>
     </w:p>
     <w:p>
       <w:r>
@@ -36358,22 +36973,22 @@
       <w:pPr>
         <w:pStyle w:val="Ttulo3"/>
       </w:pPr>
-      <w:bookmarkStart w:id="139" w:name="_Toc243865257"/>
+      <w:bookmarkStart w:id="140" w:name="_Toc244028985"/>
       <w:r>
         <w:rPr>
           <w:sz w:val="24"/>
         </w:rPr>
         <w:t>6.3.4. Evolución de la plataforma</w:t>
       </w:r>
-      <w:bookmarkEnd w:id="139"/>
-    </w:p>
-    <w:p>
-      <w:r>
-        <w:t xml:space="preserve">La industrialización debería ser gradual y proporcional al volumen real. Una primera etapa programaría procesos ligeros en Python o funciones gestionadas que conservaran cada respuesta JSON, su hora de emisión y su procedencia en una capa raw inmutable de almacenamiento de objetos. Una segunda capa normalizaría y particionaría los datos en Parquet por fuente, estación y fecha, con catálogo, controles de calidad y trazabilidad. Una base relacional quedaría reservada para usuarios, parcelas y recomendaciones; el histórico analítico se consultaría con DuckDB o Polars mientras el volumen sea moderado. Si una ampliación nacional y multianual exigiera consultas concurrentes, podría incorporarse un motor SQL distribuido como Trino, capaz de consultar formatos de tabla y archivos Parquet sobre almacenamiento de objetos (Trino, s. f.). Esta evolución sigue los principios de un lakehouse sin presentar Apache Hop, Impala, Hue o </w:t>
+      <w:bookmarkEnd w:id="140"/>
+    </w:p>
+    <w:p>
+      <w:r>
+        <w:t xml:space="preserve">La industrialización debería ser gradual y proporcional al volumen real. Una primera etapa programaría procesos ligeros en Python o funciones gestionadas que conservaran cada respuesta JSON, su hora de emisión y su procedencia en una capa raw inmutable de almacenamiento de objetos. Una segunda capa normalizaría y particionaría los datos en Parquet por fuente, estación y fecha, con catálogo, controles de calidad y trazabilidad. Una base relacional quedaría reservada para usuarios, parcelas y recomendaciones; el histórico analítico se consultaría con DuckDB o </w:t>
       </w:r>
       <w:r>
         <w:lastRenderedPageBreak/>
-        <w:t>PySpark como requisitos. El procesamiento distribuido solo se justificaría mediante mediciones de volumen, latencia y coste que demostrasen una limitación del enfoque ligero. La aplicación seguiría necesitando un catálogo agronómico dinámico, operación, control de acceso y persistencia de consultas.</w:t>
+        <w:t>Polars mientras el volumen sea moderado. Si una ampliación nacional y multianual exigiera consultas concurrentes, podría incorporarse un motor SQL distribuido como Trino, capaz de consultar formatos de tabla y archivos Parquet sobre almacenamiento de objetos (Trino, s. f.). Esta evolución sigue los principios de un lakehouse sin presentar Apache Hop, Impala, Hue o PySpark como requisitos. El procesamiento distribuido solo se justificaría mediante mediciones de volumen, latencia y coste que demostrasen una limitación del enfoque ligero. La aplicación seguiría necesitando un catálogo agronómico dinámico, operación, control de acceso y persistencia de consultas.</w:t>
       </w:r>
     </w:p>
     <w:p>
@@ -36385,11 +37000,11 @@
       <w:pPr>
         <w:pStyle w:val="Ttulo3"/>
       </w:pPr>
-      <w:bookmarkStart w:id="140" w:name="_Toc243865258"/>
+      <w:bookmarkStart w:id="141" w:name="_Toc244028986"/>
       <w:r>
         <w:t>6.3.5. Operación, MLOps y control de deriva</w:t>
       </w:r>
-      <w:bookmarkEnd w:id="140"/>
+      <w:bookmarkEnd w:id="141"/>
     </w:p>
     <w:p>
       <w:r>
@@ -36405,35 +37020,35 @@
       <w:pPr>
         <w:pStyle w:val="Ttulo3"/>
       </w:pPr>
-      <w:bookmarkStart w:id="141" w:name="_Toc243865259"/>
+      <w:bookmarkStart w:id="142" w:name="_Toc244028987"/>
       <w:r>
         <w:t>6.3.6. Ciencia abierta y principios FAIR</w:t>
       </w:r>
-      <w:bookmarkEnd w:id="141"/>
-    </w:p>
-    <w:p>
-      <w:r>
-        <w:t>La reutilización académica requiere que cada versión pueda encontrarse, comprenderse y reproducirse. El repositorio incorpora un archivo de citación, licencia para los activos propios, ficha del conjunto, diccionarios de variables, procedencia y comandos de reproducción. Los formatos CSV y JSON, las fechas ISO 8601 y las claves de estación, cultivo y fecha facilitan la interoperabilidad. Estas medidas aplican los principios FAIR sin confundir accesibilidad con apertura irrestricta (Wilkinson et al., 2016).</w:t>
-      </w:r>
-    </w:p>
-    <w:p>
-      <w:r>
-        <w:t xml:space="preserve">Una versión posterior podría depositarse en Zenodo para obtener un DOI, pero solo después de etiquetar una revisión inmutable y comprobar las condiciones de redistribución de SiAR y AEMET. </w:t>
+      <w:bookmarkEnd w:id="142"/>
+    </w:p>
+    <w:p>
+      <w:r>
+        <w:t xml:space="preserve">La reutilización académica requiere que cada versión pueda encontrarse, comprenderse y reproducirse. El repositorio incorpora un archivo de citación, licencia para los activos propios, ficha del conjunto, diccionarios de variables, procedencia y comandos de reproducción. Los formatos CSV y JSON, las fechas ISO 8601 y las claves de estación, cultivo y fecha facilitan la </w:t>
       </w:r>
       <w:r>
         <w:lastRenderedPageBreak/>
-        <w:t>La licencia del código no relicencia los datos de terceros. El depósito debería incluir la memoria, el código, los requisitos, las pruebas, la ficha del conjunto y los metadatos, sin tokens ni respuestas raw cuya redistribución no esté autorizada.</w:t>
+        <w:t>interoperabilidad. Estas medidas aplican los principios FAIR sin confundir accesibilidad con apertura irrestricta (Wilkinson et al., 2016).</w:t>
+      </w:r>
+    </w:p>
+    <w:p>
+      <w:r>
+        <w:t>Una versión posterior podría depositarse en Zenodo para obtener un DOI, pero solo después de etiquetar una revisión inmutable y comprobar las condiciones de redistribución de SiAR y AEMET. La licencia del código no relicencia los datos de terceros. El depósito debería incluir la memoria, el código, los requisitos, las pruebas, la ficha del conjunto y los metadatos, sin tokens ni respuestas raw cuya redistribución no esté autorizada.</w:t>
       </w:r>
     </w:p>
     <w:p>
       <w:pPr>
         <w:pStyle w:val="Ttulo3"/>
       </w:pPr>
-      <w:bookmarkStart w:id="142" w:name="_Toc243865260"/>
+      <w:bookmarkStart w:id="143" w:name="_Toc244028988"/>
       <w:r>
         <w:t>6.3.7. Consideración final</w:t>
       </w:r>
-      <w:bookmarkEnd w:id="142"/>
+      <w:bookmarkEnd w:id="143"/>
     </w:p>
     <w:p>
       <w:r>
@@ -36445,12 +37060,12 @@
         <w:pStyle w:val="Ttulo1"/>
         <w:pageBreakBefore/>
       </w:pPr>
-      <w:bookmarkStart w:id="143" w:name="_Toc243865261"/>
+      <w:bookmarkStart w:id="144" w:name="_Toc244028989"/>
       <w:r>
         <w:lastRenderedPageBreak/>
         <w:t>Referencias bibliográficas</w:t>
       </w:r>
-      <w:bookmarkEnd w:id="143"/>
+      <w:bookmarkEnd w:id="144"/>
     </w:p>
     <w:p>
       <w:pPr>
@@ -36468,7 +37083,7 @@
       <w:r>
         <w:t xml:space="preserve">. Recuperado el 16 de septiembre de 2026, de </w:t>
       </w:r>
-      <w:hyperlink r:id="rId26">
+      <w:hyperlink r:id="rId27">
         <w:r>
           <w:rPr>
             <w:color w:val="0563C1"/>
@@ -36494,7 +37109,7 @@
       <w:r>
         <w:t xml:space="preserve"> (FAO Irrigation and Drainage Paper No. 56). Food and Agriculture Organization of the United Nations. </w:t>
       </w:r>
-      <w:hyperlink r:id="rId27">
+      <w:hyperlink r:id="rId28">
         <w:r>
           <w:rPr>
             <w:color w:val="0563C1"/>
@@ -36520,7 +37135,7 @@
       <w:r>
         <w:t xml:space="preserve">(11), 3758. </w:t>
       </w:r>
-      <w:hyperlink r:id="rId28">
+      <w:hyperlink r:id="rId29">
         <w:r>
           <w:rPr>
             <w:color w:val="0563C1"/>
@@ -36546,7 +37161,7 @@
       <w:r>
         <w:t xml:space="preserve"> (Training manual No. 4). Food and Agriculture Organization of the United Nations. </w:t>
       </w:r>
-      <w:hyperlink r:id="rId29">
+      <w:hyperlink r:id="rId30">
         <w:r>
           <w:rPr>
             <w:color w:val="0563C1"/>
@@ -36572,7 +37187,7 @@
       <w:r>
         <w:t xml:space="preserve">(6), 423–442. </w:t>
       </w:r>
-      <w:hyperlink r:id="rId30">
+      <w:hyperlink r:id="rId31">
         <w:r>
           <w:rPr>
             <w:color w:val="0563C1"/>
@@ -36589,7 +37204,7 @@
       <w:r>
         <w:t xml:space="preserve">Drusch, M., Del Bello, U., Carlier, S., Colin, O., Fernandez, V., Gascon, F., Hoersch, B., Isola, C., Laberinti, P., Martimort, P., Meygret, A., Spoto, F., Sy, O., Marchese, F., &amp; Bargellini, P. (2012). Sentinel-2: ESA's optical high-resolution mission for GMES operational services. Remote Sensing of Environment, 120, 25-36. </w:t>
       </w:r>
-      <w:hyperlink r:id="rId31">
+      <w:hyperlink r:id="rId32">
         <w:r>
           <w:rPr>
             <w:color w:val="0563C1"/>
@@ -36615,7 +37230,7 @@
       <w:r>
         <w:t xml:space="preserve"> (EEA Report No. 12/2021). </w:t>
       </w:r>
-      <w:hyperlink r:id="rId32">
+      <w:hyperlink r:id="rId33">
         <w:r>
           <w:rPr>
             <w:color w:val="0563C1"/>
@@ -36641,7 +37256,7 @@
       <w:r>
         <w:t xml:space="preserve">(2), 147–159. </w:t>
       </w:r>
-      <w:hyperlink r:id="rId33">
+      <w:hyperlink r:id="rId34">
         <w:r>
           <w:rPr>
             <w:color w:val="0563C1"/>
@@ -36667,7 +37282,7 @@
       <w:r>
         <w:t xml:space="preserve">. </w:t>
       </w:r>
-      <w:hyperlink r:id="rId34">
+      <w:hyperlink r:id="rId35">
         <w:r>
           <w:rPr>
             <w:color w:val="0563C1"/>
@@ -36693,7 +37308,7 @@
       <w:r>
         <w:t xml:space="preserve">, 40–50. </w:t>
       </w:r>
-      <w:hyperlink r:id="rId35">
+      <w:hyperlink r:id="rId36">
         <w:r>
           <w:rPr>
             <w:color w:val="0563C1"/>
@@ -36720,7 +37335,7 @@
       <w:r>
         <w:t xml:space="preserve">(5967), 828–831. </w:t>
       </w:r>
-      <w:hyperlink r:id="rId36">
+      <w:hyperlink r:id="rId37">
         <w:r>
           <w:rPr>
             <w:color w:val="0563C1"/>
@@ -36746,7 +37361,7 @@
       <w:r>
         <w:t xml:space="preserve">(2), 281–289. </w:t>
       </w:r>
-      <w:hyperlink r:id="rId37">
+      <w:hyperlink r:id="rId38">
         <w:r>
           <w:rPr>
             <w:color w:val="0563C1"/>
@@ -36772,7 +37387,7 @@
       <w:r>
         <w:t xml:space="preserve"> (3.ª ed.). OTexts. </w:t>
       </w:r>
-      <w:hyperlink r:id="rId38">
+      <w:hyperlink r:id="rId39">
         <w:r>
           <w:rPr>
             <w:color w:val="0563C1"/>
@@ -36798,7 +37413,7 @@
       <w:r>
         <w:t xml:space="preserve"> (H.-O. Pörtner, D. C. Roberts, M. Tignor, E. S. Poloczanska, K. Mintenbeck, A. Alegría, M. Craig, S. Langsdorf, S. Löschke, V. Möller, A. Okem, &amp; B. Rama, Eds.). Cambridge University Press. </w:t>
       </w:r>
-      <w:hyperlink r:id="rId39">
+      <w:hyperlink r:id="rId40">
         <w:r>
           <w:rPr>
             <w:color w:val="0563C1"/>
@@ -36824,7 +37439,7 @@
       <w:r>
         <w:t xml:space="preserve">(8), 2674. </w:t>
       </w:r>
-      <w:hyperlink r:id="rId40">
+      <w:hyperlink r:id="rId41">
         <w:r>
           <w:rPr>
             <w:color w:val="0563C1"/>
@@ -36850,7 +37465,7 @@
       <w:r>
         <w:t xml:space="preserve">(3), 309–331. </w:t>
       </w:r>
-      <w:hyperlink r:id="rId41">
+      <w:hyperlink r:id="rId42">
         <w:r>
           <w:rPr>
             <w:color w:val="0563C1"/>
@@ -36876,7 +37491,7 @@
       <w:r>
         <w:t xml:space="preserve">, 4765–4774. </w:t>
       </w:r>
-      <w:hyperlink r:id="rId42">
+      <w:hyperlink r:id="rId43">
         <w:r>
           <w:rPr>
             <w:color w:val="0563C1"/>
@@ -36902,7 +37517,7 @@
       <w:r>
         <w:t xml:space="preserve">(1), 11–25. </w:t>
       </w:r>
-      <w:hyperlink r:id="rId43">
+      <w:hyperlink r:id="rId44">
         <w:r>
           <w:rPr>
             <w:color w:val="0563C1"/>
@@ -36928,7 +37543,7 @@
       <w:r>
         <w:t xml:space="preserve">. Recuperado el 16 de septiembre de 2026, de </w:t>
       </w:r>
-      <w:hyperlink r:id="rId44">
+      <w:hyperlink r:id="rId45">
         <w:r>
           <w:rPr>
             <w:color w:val="0563C1"/>
@@ -36954,7 +37569,7 @@
       <w:r>
         <w:t xml:space="preserve">. Recuperado el 16 de septiembre de 2026, de </w:t>
       </w:r>
-      <w:hyperlink r:id="rId45">
+      <w:hyperlink r:id="rId46">
         <w:r>
           <w:rPr>
             <w:color w:val="0563C1"/>
@@ -36980,7 +37595,7 @@
       <w:r>
         <w:t xml:space="preserve">, 121–131. </w:t>
       </w:r>
-      <w:hyperlink r:id="rId46">
+      <w:hyperlink r:id="rId47">
         <w:r>
           <w:rPr>
             <w:color w:val="0563C1"/>
@@ -37006,7 +37621,7 @@
       <w:r>
         <w:t xml:space="preserve">(4), 367–378. </w:t>
       </w:r>
-      <w:hyperlink r:id="rId47">
+      <w:hyperlink r:id="rId48">
         <w:r>
           <w:rPr>
             <w:color w:val="0563C1"/>
@@ -37033,7 +37648,7 @@
       <w:r>
         <w:t xml:space="preserve">, 245, de 12 de octubre de 2022, 139046–139055. </w:t>
       </w:r>
-      <w:hyperlink r:id="rId48">
+      <w:hyperlink r:id="rId49">
         <w:r>
           <w:rPr>
             <w:color w:val="0563C1"/>
@@ -37059,7 +37674,7 @@
       <w:r>
         <w:t xml:space="preserve">(8), 913–929. </w:t>
       </w:r>
-      <w:hyperlink r:id="rId49">
+      <w:hyperlink r:id="rId50">
         <w:r>
           <w:rPr>
             <w:color w:val="0563C1"/>
@@ -37085,7 +37700,7 @@
       <w:r>
         <w:t xml:space="preserve">, 165–174. </w:t>
       </w:r>
-      <w:hyperlink r:id="rId50">
+      <w:hyperlink r:id="rId51">
         <w:r>
           <w:rPr>
             <w:color w:val="0563C1"/>
@@ -37111,7 +37726,7 @@
       <w:r>
         <w:t xml:space="preserve">(2), 111–126. </w:t>
       </w:r>
-      <w:hyperlink r:id="rId51">
+      <w:hyperlink r:id="rId52">
         <w:r>
           <w:rPr>
             <w:color w:val="0563C1"/>
@@ -37128,7 +37743,7 @@
       <w:r>
         <w:t xml:space="preserve">Sculley, D., Holt, G., Golovin, D., Davydov, E., Phillips, T., Ebner, D., Chaudhary, V., Young, M., Crespo, J.-F., &amp; Dennison, D. (2015). Hidden technical debt in machine learning systems. Advances in Neural Information Processing Systems, 28, 2503–2511. </w:t>
       </w:r>
-      <w:hyperlink r:id="rId52">
+      <w:hyperlink r:id="rId53">
         <w:r>
           <w:rPr>
             <w:color w:val="0563C1"/>
@@ -37154,7 +37769,7 @@
       <w:r>
         <w:t xml:space="preserve">. </w:t>
       </w:r>
-      <w:hyperlink r:id="rId53">
+      <w:hyperlink r:id="rId54">
         <w:r>
           <w:rPr>
             <w:color w:val="0563C1"/>
@@ -37180,7 +37795,7 @@
       <w:r>
         <w:t xml:space="preserve"> (Versión 1.66.0) [Software]. </w:t>
       </w:r>
-      <w:hyperlink r:id="rId54">
+      <w:hyperlink r:id="rId55">
         <w:r>
           <w:rPr>
             <w:color w:val="0563C1"/>
@@ -37206,7 +37821,7 @@
       <w:r>
         <w:t xml:space="preserve">(3), 16–17. </w:t>
       </w:r>
-      <w:hyperlink r:id="rId55">
+      <w:hyperlink r:id="rId56">
         <w:r>
           <w:rPr>
             <w:color w:val="0563C1"/>
@@ -37232,7 +37847,7 @@
       <w:r>
         <w:t xml:space="preserve">. Recuperado el 25 de octubre de 2026, de </w:t>
       </w:r>
-      <w:hyperlink r:id="rId56">
+      <w:hyperlink r:id="rId57">
         <w:r>
           <w:rPr>
             <w:color w:val="0563C1"/>
@@ -37258,7 +37873,7 @@
       <w:r>
         <w:t xml:space="preserve">(1), 79–82. </w:t>
       </w:r>
-      <w:hyperlink r:id="rId57">
+      <w:hyperlink r:id="rId58">
         <w:r>
           <w:rPr>
             <w:color w:val="0563C1"/>
@@ -37275,7 +37890,7 @@
       <w:r>
         <w:t xml:space="preserve">Wilkinson, M. D., Dumontier, M., Aalbersberg, I. J., Appleton, G., Axton, M., Baak, A., Blomberg, N., Boiten, J.-W., da Silva Santos, L. B., Bourne, P. E., Bouwman, J., Brookes, A. J., Clark, T., Crosas, M., Dillo, I., Dumon, O., Edmunds, S., Evelo, C. T., Finkers, R., ... Mons, B. (2016). The FAIR Guiding Principles for scientific data management and stewardship. Scientific Data, 3, 160018. </w:t>
       </w:r>
-      <w:hyperlink r:id="rId58">
+      <w:hyperlink r:id="rId59">
         <w:r>
           <w:rPr>
             <w:color w:val="0563C1"/>
@@ -37302,7 +37917,7 @@
       <w:r>
         <w:t xml:space="preserve">, 69–80. </w:t>
       </w:r>
-      <w:hyperlink r:id="rId59">
+      <w:hyperlink r:id="rId60">
         <w:r>
           <w:rPr>
             <w:color w:val="0563C1"/>
@@ -37328,7 +37943,7 @@
       <w:r>
         <w:t xml:space="preserve">, 105256. </w:t>
       </w:r>
-      <w:hyperlink r:id="rId60">
+      <w:hyperlink r:id="rId61">
         <w:r>
           <w:rPr>
             <w:color w:val="0563C1"/>
@@ -37354,7 +37969,7 @@
       <w:r>
         <w:t xml:space="preserve">(2–3), 113–132. </w:t>
       </w:r>
-      <w:hyperlink r:id="rId61">
+      <w:hyperlink r:id="rId62">
         <w:r>
           <w:rPr>
             <w:color w:val="0563C1"/>
@@ -37373,18 +37988,18 @@
       <w:pPr>
         <w:pStyle w:val="Ttulo1"/>
       </w:pPr>
-      <w:bookmarkStart w:id="144" w:name="_Toc243865262"/>
+      <w:bookmarkStart w:id="145" w:name="_Toc244028990"/>
       <w:r>
         <w:lastRenderedPageBreak/>
         <w:t>Anexo A. Reproducción y localización de las evidencias</w:t>
       </w:r>
-      <w:bookmarkEnd w:id="144"/>
+      <w:bookmarkEnd w:id="145"/>
     </w:p>
     <w:p>
       <w:r>
         <w:t xml:space="preserve">El repositorio de entrega, con código, CSV de muestra y resultados, es </w:t>
       </w:r>
-      <w:hyperlink r:id="rId62">
+      <w:hyperlink r:id="rId63">
         <w:r>
           <w:rPr>
             <w:color w:val="0563C1"/>
@@ -37396,7 +38011,7 @@
       <w:r>
         <w:t xml:space="preserve"> Procede del trabajo del equipo en </w:t>
       </w:r>
-      <w:hyperlink r:id="rId63">
+      <w:hyperlink r:id="rId64">
         <w:r>
           <w:rPr>
             <w:color w:val="0563C1"/>
@@ -37408,7 +38023,7 @@
       <w:r>
         <w:t xml:space="preserve"> las rutas siguientes corresponden al repositorio de entrega en su rama main. Los ensayos con CSV versionados y las pruebas no requieren credenciales. La aplicación pública está en </w:t>
       </w:r>
-      <w:hyperlink r:id="rId64">
+      <w:hyperlink r:id="rId65">
         <w:r>
           <w:rPr>
             <w:color w:val="0563C1"/>
@@ -37425,21 +38040,21 @@
       <w:pPr>
         <w:pStyle w:val="Ttulo2"/>
       </w:pPr>
-      <w:bookmarkStart w:id="145" w:name="_Toc243865263"/>
+      <w:bookmarkStart w:id="146" w:name="_Toc244028991"/>
       <w:r>
         <w:t>A.1. Archivos principales</w:t>
       </w:r>
-      <w:bookmarkEnd w:id="145"/>
+      <w:bookmarkEnd w:id="146"/>
     </w:p>
     <w:p>
       <w:pPr>
         <w:pStyle w:val="ndicetablaTFM"/>
       </w:pPr>
-      <w:bookmarkStart w:id="146" w:name="idx_tbl_A_1"/>
+      <w:bookmarkStart w:id="147" w:name="idx_tbl_A_1"/>
       <w:r>
         <w:t>Tabla A.1. Rutas del repositorio para reproducir y contrastar los resultados.</w:t>
       </w:r>
-      <w:bookmarkEnd w:id="146"/>
+      <w:bookmarkEnd w:id="147"/>
     </w:p>
     <w:tbl>
       <w:tblPr>
@@ -37839,11 +38454,11 @@
       <w:pPr>
         <w:pStyle w:val="Ttulo2"/>
       </w:pPr>
-      <w:bookmarkStart w:id="147" w:name="_Toc243865264"/>
+      <w:bookmarkStart w:id="148" w:name="_Toc244028992"/>
       <w:r>
         <w:t>A.2. Secuencia mínima de reproducción</w:t>
       </w:r>
-      <w:bookmarkEnd w:id="147"/>
+      <w:bookmarkEnd w:id="148"/>
     </w:p>
     <w:p>
       <w:r>
@@ -37944,8 +38559,8 @@
       </w:r>
     </w:p>
     <w:sectPr>
-      <w:headerReference w:type="default" r:id="rId65"/>
-      <w:footerReference w:type="default" r:id="rId66"/>
+      <w:headerReference w:type="default" r:id="rId66"/>
+      <w:footerReference w:type="default" r:id="rId67"/>
       <w:pgSz w:w="11906" w:h="16838" w:code="9"/>
       <w:pgMar w:top="1134" w:right="1134" w:bottom="1134" w:left="1134" w:header="567" w:footer="567" w:gutter="0"/>
       <w:cols w:space="708"/>
@@ -41006,6 +41621,21 @@
 </file>
 
 <file path=customXml/item1.xml><?xml version="1.0" encoding="utf-8"?>
+<?mso-contentType ?>
+<FormTemplates xmlns="http://schemas.microsoft.com/sharepoint/v3/contenttype/forms">
+  <Display>DocumentLibraryForm</Display>
+  <Edit>DocumentLibraryForm</Edit>
+  <New>DocumentLibraryForm</New>
+</FormTemplates>
+</file>
+
+<file path=customXml/item2.xml><?xml version="1.0" encoding="utf-8"?>
+<p:properties xmlns:p="http://schemas.microsoft.com/office/2006/metadata/properties" xmlns:xsi="http://www.w3.org/2001/XMLSchema-instance" xmlns:pc="http://schemas.microsoft.com/office/infopath/2007/PartnerControls">
+  <documentManagement/>
+</p:properties>
+</file>
+
+<file path=customXml/item3.xml><?xml version="1.0" encoding="utf-8"?>
 <ct:contentTypeSchema xmlns:ct="http://schemas.microsoft.com/office/2006/metadata/contentType" xmlns:ma="http://schemas.microsoft.com/office/2006/metadata/properties/metaAttributes" ct:_="" ma:_="" ma:contentTypeName="Documento" ma:contentTypeID="0x01010019FAAD7208B57F46B26AFFED99BCE0D3" ma:contentTypeVersion="12" ma:contentTypeDescription="Crear nuevo documento." ma:contentTypeScope="" ma:versionID="1ef574cbf204855aeab3c40b347ffcdd">
   <xsd:schema xmlns:xsd="http://www.w3.org/2001/XMLSchema" xmlns:xs="http://www.w3.org/2001/XMLSchema" xmlns:p="http://schemas.microsoft.com/office/2006/metadata/properties" xmlns:ns2="9d7b9a5c-6b4f-4ca1-bb03-c38cacb734bc" xmlns:ns3="7d80c08f-e909-465c-8aa4-0e649fbe85d0" targetNamespace="http://schemas.microsoft.com/office/2006/metadata/properties" ma:root="true" ma:fieldsID="d90f8574e5bf50e8ad773515e43a9e2d" ns2:_="" ns3:_="">
     <xsd:import namespace="9d7b9a5c-6b4f-4ca1-bb03-c38cacb734bc"/>
@@ -41222,22 +41852,24 @@
 </ct:contentTypeSchema>
 </file>
 
-<file path=customXml/item2.xml><?xml version="1.0" encoding="utf-8"?>
-<?mso-contentType ?>
-<FormTemplates xmlns="http://schemas.microsoft.com/sharepoint/v3/contenttype/forms">
-  <Display>DocumentLibraryForm</Display>
-  <Edit>DocumentLibraryForm</Edit>
-  <New>DocumentLibraryForm</New>
-</FormTemplates>
+<file path=customXml/itemProps1.xml><?xml version="1.0" encoding="utf-8"?>
+<ds:datastoreItem xmlns:ds="http://schemas.openxmlformats.org/officeDocument/2006/customXml" ds:itemID="{E5FD6A2B-9479-4129-9D84-6C858DBE1A90}">
+  <ds:schemaRefs>
+    <ds:schemaRef ds:uri="http://schemas.microsoft.com/sharepoint/v3/contenttype/forms"/>
+  </ds:schemaRefs>
+</ds:datastoreItem>
 </file>
 
-<file path=customXml/item3.xml><?xml version="1.0" encoding="utf-8"?>
-<p:properties xmlns:p="http://schemas.microsoft.com/office/2006/metadata/properties" xmlns:xsi="http://www.w3.org/2001/XMLSchema-instance" xmlns:pc="http://schemas.microsoft.com/office/infopath/2007/PartnerControls">
-  <documentManagement/>
-</p:properties>
+<file path=customXml/itemProps2.xml><?xml version="1.0" encoding="utf-8"?>
+<ds:datastoreItem xmlns:ds="http://schemas.openxmlformats.org/officeDocument/2006/customXml" ds:itemID="{261B0A37-6C6C-45CF-A5C4-83D994BC3980}">
+  <ds:schemaRefs>
+    <ds:schemaRef ds:uri="http://schemas.microsoft.com/office/2006/metadata/properties"/>
+    <ds:schemaRef ds:uri="http://schemas.microsoft.com/office/infopath/2007/PartnerControls"/>
+  </ds:schemaRefs>
+</ds:datastoreItem>
 </file>
 
-<file path=customXml/itemProps1.xml><?xml version="1.0" encoding="utf-8"?>
+<file path=customXml/itemProps3.xml><?xml version="1.0" encoding="utf-8"?>
 <ds:datastoreItem xmlns:ds="http://schemas.openxmlformats.org/officeDocument/2006/customXml" ds:itemID="{01B4916B-2905-40FE-B973-786E02856A77}">
   <ds:schemaRefs>
     <ds:schemaRef ds:uri="http://schemas.microsoft.com/office/2006/metadata/contentType"/>
@@ -41254,21 +41886,4 @@
     <ds:schemaRef ds:uri="http://schemas.microsoft.com/internal/obd"/>
   </ds:schemaRefs>
 </ds:datastoreItem>
-</file>
-
-<file path=customXml/itemProps2.xml><?xml version="1.0" encoding="utf-8"?>
-<ds:datastoreItem xmlns:ds="http://schemas.openxmlformats.org/officeDocument/2006/customXml" ds:itemID="{E5FD6A2B-9479-4129-9D84-6C858DBE1A90}">
-  <ds:schemaRefs>
-    <ds:schemaRef ds:uri="http://schemas.microsoft.com/sharepoint/v3/contenttype/forms"/>
-  </ds:schemaRefs>
-</ds:datastoreItem>
-</file>
-
-<file path=customXml/itemProps3.xml><?xml version="1.0" encoding="utf-8"?>
-<ds:datastoreItem xmlns:ds="http://schemas.openxmlformats.org/officeDocument/2006/customXml" ds:itemID="{261B0A37-6C6C-45CF-A5C4-83D994BC3980}">
-  <ds:schemaRefs>
-    <ds:schemaRef ds:uri="http://schemas.microsoft.com/office/2006/metadata/properties"/>
-    <ds:schemaRef ds:uri="http://schemas.microsoft.com/office/infopath/2007/PartnerControls"/>
-  </ds:schemaRefs>
-</ds:datastoreItem>
 </file>
</xml_diff>

<commit_message>
Añadir validación temporal multicaso del DSS (#31)
Incorpora la validación reproducible en tres cultivos y regiones, actualiza la memoria definitiva y añade la regeneración del experimento a la validación automática.
</commit_message>
<xml_diff>
--- a/docs/memoria/TFM_definitivo_2026-10-25.docx
+++ b/docs/memoria/TFM_definitivo_2026-10-25.docx
@@ -374,7 +374,7 @@
       <w:r>
         <w:fldChar w:fldCharType="separate"/>
       </w:r>
-      <w:hyperlink w:anchor="_Toc243865165" w:history="1">
+      <w:hyperlink w:anchor="_Toc244028791" w:history="1">
         <w:r>
           <w:rPr>
             <w:rStyle w:val="Hipervnculo"/>
@@ -401,7 +401,7 @@
             <w:noProof/>
             <w:webHidden/>
           </w:rPr>
-          <w:instrText xml:space="preserve"> PAGEREF _Toc243865165 \h </w:instrText>
+          <w:instrText xml:space="preserve"> PAGEREF _Toc244028791 \h </w:instrText>
         </w:r>
         <w:r>
           <w:rPr>
@@ -448,7 +448,7 @@
           <w14:ligatures w14:val="standardContextual"/>
         </w:rPr>
       </w:pPr>
-      <w:hyperlink w:anchor="_Toc243865166" w:history="1">
+      <w:hyperlink w:anchor="_Toc244028792" w:history="1">
         <w:r>
           <w:rPr>
             <w:rStyle w:val="Hipervnculo"/>
@@ -475,7 +475,7 @@
             <w:noProof/>
             <w:webHidden/>
           </w:rPr>
-          <w:instrText xml:space="preserve"> PAGEREF _Toc243865166 \h </w:instrText>
+          <w:instrText xml:space="preserve"> PAGEREF _Toc244028792 \h </w:instrText>
         </w:r>
         <w:r>
           <w:rPr>
@@ -522,7 +522,7 @@
           <w14:ligatures w14:val="standardContextual"/>
         </w:rPr>
       </w:pPr>
-      <w:hyperlink w:anchor="_Toc243865167" w:history="1">
+      <w:hyperlink w:anchor="_Toc244028793" w:history="1">
         <w:r>
           <w:rPr>
             <w:rStyle w:val="Hipervnculo"/>
@@ -549,7 +549,7 @@
             <w:noProof/>
             <w:webHidden/>
           </w:rPr>
-          <w:instrText xml:space="preserve"> PAGEREF _Toc243865167 \h </w:instrText>
+          <w:instrText xml:space="preserve"> PAGEREF _Toc244028793 \h </w:instrText>
         </w:r>
         <w:r>
           <w:rPr>
@@ -596,7 +596,7 @@
           <w14:ligatures w14:val="standardContextual"/>
         </w:rPr>
       </w:pPr>
-      <w:hyperlink w:anchor="_Toc243865168" w:history="1">
+      <w:hyperlink w:anchor="_Toc244028794" w:history="1">
         <w:r>
           <w:rPr>
             <w:rStyle w:val="Hipervnculo"/>
@@ -623,7 +623,7 @@
             <w:noProof/>
             <w:webHidden/>
           </w:rPr>
-          <w:instrText xml:space="preserve"> PAGEREF _Toc243865168 \h </w:instrText>
+          <w:instrText xml:space="preserve"> PAGEREF _Toc244028794 \h </w:instrText>
         </w:r>
         <w:r>
           <w:rPr>
@@ -670,7 +670,7 @@
           <w14:ligatures w14:val="standardContextual"/>
         </w:rPr>
       </w:pPr>
-      <w:hyperlink w:anchor="_Toc243865169" w:history="1">
+      <w:hyperlink w:anchor="_Toc244028795" w:history="1">
         <w:r>
           <w:rPr>
             <w:rStyle w:val="Hipervnculo"/>
@@ -697,7 +697,7 @@
             <w:noProof/>
             <w:webHidden/>
           </w:rPr>
-          <w:instrText xml:space="preserve"> PAGEREF _Toc243865169 \h </w:instrText>
+          <w:instrText xml:space="preserve"> PAGEREF _Toc244028795 \h </w:instrText>
         </w:r>
         <w:r>
           <w:rPr>
@@ -744,7 +744,7 @@
           <w14:ligatures w14:val="standardContextual"/>
         </w:rPr>
       </w:pPr>
-      <w:hyperlink w:anchor="_Toc243865170" w:history="1">
+      <w:hyperlink w:anchor="_Toc244028796" w:history="1">
         <w:r>
           <w:rPr>
             <w:rStyle w:val="Hipervnculo"/>
@@ -771,7 +771,7 @@
             <w:noProof/>
             <w:webHidden/>
           </w:rPr>
-          <w:instrText xml:space="preserve"> PAGEREF _Toc243865170 \h </w:instrText>
+          <w:instrText xml:space="preserve"> PAGEREF _Toc244028796 \h </w:instrText>
         </w:r>
         <w:r>
           <w:rPr>
@@ -818,7 +818,7 @@
           <w14:ligatures w14:val="standardContextual"/>
         </w:rPr>
       </w:pPr>
-      <w:hyperlink w:anchor="_Toc243865171" w:history="1">
+      <w:hyperlink w:anchor="_Toc244028797" w:history="1">
         <w:r>
           <w:rPr>
             <w:rStyle w:val="Hipervnculo"/>
@@ -845,7 +845,7 @@
             <w:noProof/>
             <w:webHidden/>
           </w:rPr>
-          <w:instrText xml:space="preserve"> PAGEREF _Toc243865171 \h </w:instrText>
+          <w:instrText xml:space="preserve"> PAGEREF _Toc244028797 \h </w:instrText>
         </w:r>
         <w:r>
           <w:rPr>
@@ -892,7 +892,7 @@
           <w14:ligatures w14:val="standardContextual"/>
         </w:rPr>
       </w:pPr>
-      <w:hyperlink w:anchor="_Toc243865172" w:history="1">
+      <w:hyperlink w:anchor="_Toc244028798" w:history="1">
         <w:r>
           <w:rPr>
             <w:rStyle w:val="Hipervnculo"/>
@@ -919,7 +919,7 @@
             <w:noProof/>
             <w:webHidden/>
           </w:rPr>
-          <w:instrText xml:space="preserve"> PAGEREF _Toc243865172 \h </w:instrText>
+          <w:instrText xml:space="preserve"> PAGEREF _Toc244028798 \h </w:instrText>
         </w:r>
         <w:r>
           <w:rPr>
@@ -966,7 +966,7 @@
           <w14:ligatures w14:val="standardContextual"/>
         </w:rPr>
       </w:pPr>
-      <w:hyperlink w:anchor="_Toc243865173" w:history="1">
+      <w:hyperlink w:anchor="_Toc244028799" w:history="1">
         <w:r>
           <w:rPr>
             <w:rStyle w:val="Hipervnculo"/>
@@ -993,7 +993,7 @@
             <w:noProof/>
             <w:webHidden/>
           </w:rPr>
-          <w:instrText xml:space="preserve"> PAGEREF _Toc243865173 \h </w:instrText>
+          <w:instrText xml:space="preserve"> PAGEREF _Toc244028799 \h </w:instrText>
         </w:r>
         <w:r>
           <w:rPr>
@@ -1040,7 +1040,7 @@
           <w14:ligatures w14:val="standardContextual"/>
         </w:rPr>
       </w:pPr>
-      <w:hyperlink w:anchor="_Toc243865174" w:history="1">
+      <w:hyperlink w:anchor="_Toc244028800" w:history="1">
         <w:r>
           <w:rPr>
             <w:rStyle w:val="Hipervnculo"/>
@@ -1067,7 +1067,7 @@
             <w:noProof/>
             <w:webHidden/>
           </w:rPr>
-          <w:instrText xml:space="preserve"> PAGEREF _Toc243865174 \h </w:instrText>
+          <w:instrText xml:space="preserve"> PAGEREF _Toc244028800 \h </w:instrText>
         </w:r>
         <w:r>
           <w:rPr>
@@ -1114,7 +1114,7 @@
           <w14:ligatures w14:val="standardContextual"/>
         </w:rPr>
       </w:pPr>
-      <w:hyperlink w:anchor="_Toc243865175" w:history="1">
+      <w:hyperlink w:anchor="_Toc244028801" w:history="1">
         <w:r>
           <w:rPr>
             <w:rStyle w:val="Hipervnculo"/>
@@ -1141,7 +1141,7 @@
             <w:noProof/>
             <w:webHidden/>
           </w:rPr>
-          <w:instrText xml:space="preserve"> PAGEREF _Toc243865175 \h </w:instrText>
+          <w:instrText xml:space="preserve"> PAGEREF _Toc244028801 \h </w:instrText>
         </w:r>
         <w:r>
           <w:rPr>
@@ -1188,7 +1188,7 @@
           <w14:ligatures w14:val="standardContextual"/>
         </w:rPr>
       </w:pPr>
-      <w:hyperlink w:anchor="_Toc243865176" w:history="1">
+      <w:hyperlink w:anchor="_Toc244028802" w:history="1">
         <w:r>
           <w:rPr>
             <w:rStyle w:val="Hipervnculo"/>
@@ -1215,7 +1215,7 @@
             <w:noProof/>
             <w:webHidden/>
           </w:rPr>
-          <w:instrText xml:space="preserve"> PAGEREF _Toc243865176 \h </w:instrText>
+          <w:instrText xml:space="preserve"> PAGEREF _Toc244028802 \h </w:instrText>
         </w:r>
         <w:r>
           <w:rPr>
@@ -1262,7 +1262,7 @@
           <w14:ligatures w14:val="standardContextual"/>
         </w:rPr>
       </w:pPr>
-      <w:hyperlink w:anchor="_Toc243865177" w:history="1">
+      <w:hyperlink w:anchor="_Toc244028803" w:history="1">
         <w:r>
           <w:rPr>
             <w:rStyle w:val="Hipervnculo"/>
@@ -1289,7 +1289,7 @@
             <w:noProof/>
             <w:webHidden/>
           </w:rPr>
-          <w:instrText xml:space="preserve"> PAGEREF _Toc243865177 \h </w:instrText>
+          <w:instrText xml:space="preserve"> PAGEREF _Toc244028803 \h </w:instrText>
         </w:r>
         <w:r>
           <w:rPr>
@@ -1336,7 +1336,7 @@
           <w14:ligatures w14:val="standardContextual"/>
         </w:rPr>
       </w:pPr>
-      <w:hyperlink w:anchor="_Toc243865178" w:history="1">
+      <w:hyperlink w:anchor="_Toc244028804" w:history="1">
         <w:r>
           <w:rPr>
             <w:rStyle w:val="Hipervnculo"/>
@@ -1363,7 +1363,7 @@
             <w:noProof/>
             <w:webHidden/>
           </w:rPr>
-          <w:instrText xml:space="preserve"> PAGEREF _Toc243865178 \h </w:instrText>
+          <w:instrText xml:space="preserve"> PAGEREF _Toc244028804 \h </w:instrText>
         </w:r>
         <w:r>
           <w:rPr>
@@ -1410,7 +1410,7 @@
           <w14:ligatures w14:val="standardContextual"/>
         </w:rPr>
       </w:pPr>
-      <w:hyperlink w:anchor="_Toc243865179" w:history="1">
+      <w:hyperlink w:anchor="_Toc244028805" w:history="1">
         <w:r>
           <w:rPr>
             <w:rStyle w:val="Hipervnculo"/>
@@ -1437,7 +1437,7 @@
             <w:noProof/>
             <w:webHidden/>
           </w:rPr>
-          <w:instrText xml:space="preserve"> PAGEREF _Toc243865179 \h </w:instrText>
+          <w:instrText xml:space="preserve"> PAGEREF _Toc244028805 \h </w:instrText>
         </w:r>
         <w:r>
           <w:rPr>
@@ -1484,7 +1484,7 @@
           <w14:ligatures w14:val="standardContextual"/>
         </w:rPr>
       </w:pPr>
-      <w:hyperlink w:anchor="_Toc243865180" w:history="1">
+      <w:hyperlink w:anchor="_Toc244028806" w:history="1">
         <w:r>
           <w:rPr>
             <w:rStyle w:val="Hipervnculo"/>
@@ -1511,7 +1511,7 @@
             <w:noProof/>
             <w:webHidden/>
           </w:rPr>
-          <w:instrText xml:space="preserve"> PAGEREF _Toc243865180 \h </w:instrText>
+          <w:instrText xml:space="preserve"> PAGEREF _Toc244028806 \h </w:instrText>
         </w:r>
         <w:r>
           <w:rPr>
@@ -1558,7 +1558,7 @@
           <w14:ligatures w14:val="standardContextual"/>
         </w:rPr>
       </w:pPr>
-      <w:hyperlink w:anchor="_Toc243865181" w:history="1">
+      <w:hyperlink w:anchor="_Toc244028807" w:history="1">
         <w:r>
           <w:rPr>
             <w:rStyle w:val="Hipervnculo"/>
@@ -1585,7 +1585,7 @@
             <w:noProof/>
             <w:webHidden/>
           </w:rPr>
-          <w:instrText xml:space="preserve"> PAGEREF _Toc243865181 \h </w:instrText>
+          <w:instrText xml:space="preserve"> PAGEREF _Toc244028807 \h </w:instrText>
         </w:r>
         <w:r>
           <w:rPr>
@@ -1632,7 +1632,7 @@
           <w14:ligatures w14:val="standardContextual"/>
         </w:rPr>
       </w:pPr>
-      <w:hyperlink w:anchor="_Toc243865182" w:history="1">
+      <w:hyperlink w:anchor="_Toc244028808" w:history="1">
         <w:r>
           <w:rPr>
             <w:rStyle w:val="Hipervnculo"/>
@@ -1659,7 +1659,7 @@
             <w:noProof/>
             <w:webHidden/>
           </w:rPr>
-          <w:instrText xml:space="preserve"> PAGEREF _Toc243865182 \h </w:instrText>
+          <w:instrText xml:space="preserve"> PAGEREF _Toc244028808 \h </w:instrText>
         </w:r>
         <w:r>
           <w:rPr>
@@ -1706,7 +1706,7 @@
           <w14:ligatures w14:val="standardContextual"/>
         </w:rPr>
       </w:pPr>
-      <w:hyperlink w:anchor="_Toc243865183" w:history="1">
+      <w:hyperlink w:anchor="_Toc244028809" w:history="1">
         <w:r>
           <w:rPr>
             <w:rStyle w:val="Hipervnculo"/>
@@ -1733,7 +1733,7 @@
             <w:noProof/>
             <w:webHidden/>
           </w:rPr>
-          <w:instrText xml:space="preserve"> PAGEREF _Toc243865183 \h </w:instrText>
+          <w:instrText xml:space="preserve"> PAGEREF _Toc244028809 \h </w:instrText>
         </w:r>
         <w:r>
           <w:rPr>
@@ -1780,7 +1780,7 @@
           <w14:ligatures w14:val="standardContextual"/>
         </w:rPr>
       </w:pPr>
-      <w:hyperlink w:anchor="_Toc243865184" w:history="1">
+      <w:hyperlink w:anchor="_Toc244028810" w:history="1">
         <w:r>
           <w:rPr>
             <w:rStyle w:val="Hipervnculo"/>
@@ -1807,7 +1807,7 @@
             <w:noProof/>
             <w:webHidden/>
           </w:rPr>
-          <w:instrText xml:space="preserve"> PAGEREF _Toc243865184 \h </w:instrText>
+          <w:instrText xml:space="preserve"> PAGEREF _Toc244028810 \h </w:instrText>
         </w:r>
         <w:r>
           <w:rPr>
@@ -1854,7 +1854,7 @@
           <w14:ligatures w14:val="standardContextual"/>
         </w:rPr>
       </w:pPr>
-      <w:hyperlink w:anchor="_Toc243865185" w:history="1">
+      <w:hyperlink w:anchor="_Toc244028811" w:history="1">
         <w:r>
           <w:rPr>
             <w:rStyle w:val="Hipervnculo"/>
@@ -1881,7 +1881,7 @@
             <w:noProof/>
             <w:webHidden/>
           </w:rPr>
-          <w:instrText xml:space="preserve"> PAGEREF _Toc243865185 \h </w:instrText>
+          <w:instrText xml:space="preserve"> PAGEREF _Toc244028811 \h </w:instrText>
         </w:r>
         <w:r>
           <w:rPr>
@@ -1928,7 +1928,7 @@
           <w14:ligatures w14:val="standardContextual"/>
         </w:rPr>
       </w:pPr>
-      <w:hyperlink w:anchor="_Toc243865186" w:history="1">
+      <w:hyperlink w:anchor="_Toc244028913" w:history="1">
         <w:r>
           <w:rPr>
             <w:rStyle w:val="Hipervnculo"/>
@@ -1955,7 +1955,7 @@
             <w:noProof/>
             <w:webHidden/>
           </w:rPr>
-          <w:instrText xml:space="preserve"> PAGEREF _Toc243865186 \h </w:instrText>
+          <w:instrText xml:space="preserve"> PAGEREF _Toc244028913 \h </w:instrText>
         </w:r>
         <w:r>
           <w:rPr>
@@ -2002,7 +2002,7 @@
           <w14:ligatures w14:val="standardContextual"/>
         </w:rPr>
       </w:pPr>
-      <w:hyperlink w:anchor="_Toc243865187" w:history="1">
+      <w:hyperlink w:anchor="_Toc244028914" w:history="1">
         <w:r>
           <w:rPr>
             <w:rStyle w:val="Hipervnculo"/>
@@ -2029,7 +2029,7 @@
             <w:noProof/>
             <w:webHidden/>
           </w:rPr>
-          <w:instrText xml:space="preserve"> PAGEREF _Toc243865187 \h </w:instrText>
+          <w:instrText xml:space="preserve"> PAGEREF _Toc244028914 \h </w:instrText>
         </w:r>
         <w:r>
           <w:rPr>
@@ -2076,7 +2076,7 @@
           <w14:ligatures w14:val="standardContextual"/>
         </w:rPr>
       </w:pPr>
-      <w:hyperlink w:anchor="_Toc243865188" w:history="1">
+      <w:hyperlink w:anchor="_Toc244028915" w:history="1">
         <w:r>
           <w:rPr>
             <w:rStyle w:val="Hipervnculo"/>
@@ -2103,7 +2103,7 @@
             <w:noProof/>
             <w:webHidden/>
           </w:rPr>
-          <w:instrText xml:space="preserve"> PAGEREF _Toc243865188 \h </w:instrText>
+          <w:instrText xml:space="preserve"> PAGEREF _Toc244028915 \h </w:instrText>
         </w:r>
         <w:r>
           <w:rPr>
@@ -2150,7 +2150,7 @@
           <w14:ligatures w14:val="standardContextual"/>
         </w:rPr>
       </w:pPr>
-      <w:hyperlink w:anchor="_Toc243865189" w:history="1">
+      <w:hyperlink w:anchor="_Toc244028916" w:history="1">
         <w:r>
           <w:rPr>
             <w:rStyle w:val="Hipervnculo"/>
@@ -2177,7 +2177,7 @@
             <w:noProof/>
             <w:webHidden/>
           </w:rPr>
-          <w:instrText xml:space="preserve"> PAGEREF _Toc243865189 \h </w:instrText>
+          <w:instrText xml:space="preserve"> PAGEREF _Toc244028916 \h </w:instrText>
         </w:r>
         <w:r>
           <w:rPr>
@@ -2224,7 +2224,7 @@
           <w14:ligatures w14:val="standardContextual"/>
         </w:rPr>
       </w:pPr>
-      <w:hyperlink w:anchor="_Toc243865190" w:history="1">
+      <w:hyperlink w:anchor="_Toc244028917" w:history="1">
         <w:r>
           <w:rPr>
             <w:rStyle w:val="Hipervnculo"/>
@@ -2251,7 +2251,7 @@
             <w:noProof/>
             <w:webHidden/>
           </w:rPr>
-          <w:instrText xml:space="preserve"> PAGEREF _Toc243865190 \h </w:instrText>
+          <w:instrText xml:space="preserve"> PAGEREF _Toc244028917 \h </w:instrText>
         </w:r>
         <w:r>
           <w:rPr>
@@ -2298,7 +2298,7 @@
           <w14:ligatures w14:val="standardContextual"/>
         </w:rPr>
       </w:pPr>
-      <w:hyperlink w:anchor="_Toc243865191" w:history="1">
+      <w:hyperlink w:anchor="_Toc244028918" w:history="1">
         <w:r>
           <w:rPr>
             <w:rStyle w:val="Hipervnculo"/>
@@ -2325,7 +2325,7 @@
             <w:noProof/>
             <w:webHidden/>
           </w:rPr>
-          <w:instrText xml:space="preserve"> PAGEREF _Toc243865191 \h </w:instrText>
+          <w:instrText xml:space="preserve"> PAGEREF _Toc244028918 \h </w:instrText>
         </w:r>
         <w:r>
           <w:rPr>
@@ -2372,7 +2372,7 @@
           <w14:ligatures w14:val="standardContextual"/>
         </w:rPr>
       </w:pPr>
-      <w:hyperlink w:anchor="_Toc243865192" w:history="1">
+      <w:hyperlink w:anchor="_Toc244028919" w:history="1">
         <w:r>
           <w:rPr>
             <w:rStyle w:val="Hipervnculo"/>
@@ -2399,7 +2399,7 @@
             <w:noProof/>
             <w:webHidden/>
           </w:rPr>
-          <w:instrText xml:space="preserve"> PAGEREF _Toc243865192 \h </w:instrText>
+          <w:instrText xml:space="preserve"> PAGEREF _Toc244028919 \h </w:instrText>
         </w:r>
         <w:r>
           <w:rPr>
@@ -2446,7 +2446,7 @@
           <w14:ligatures w14:val="standardContextual"/>
         </w:rPr>
       </w:pPr>
-      <w:hyperlink w:anchor="_Toc243865193" w:history="1">
+      <w:hyperlink w:anchor="_Toc244028920" w:history="1">
         <w:r>
           <w:rPr>
             <w:rStyle w:val="Hipervnculo"/>
@@ -2473,7 +2473,7 @@
             <w:noProof/>
             <w:webHidden/>
           </w:rPr>
-          <w:instrText xml:space="preserve"> PAGEREF _Toc243865193 \h </w:instrText>
+          <w:instrText xml:space="preserve"> PAGEREF _Toc244028920 \h </w:instrText>
         </w:r>
         <w:r>
           <w:rPr>
@@ -2520,7 +2520,7 @@
           <w14:ligatures w14:val="standardContextual"/>
         </w:rPr>
       </w:pPr>
-      <w:hyperlink w:anchor="_Toc243865194" w:history="1">
+      <w:hyperlink w:anchor="_Toc244028921" w:history="1">
         <w:r>
           <w:rPr>
             <w:rStyle w:val="Hipervnculo"/>
@@ -2547,7 +2547,7 @@
             <w:noProof/>
             <w:webHidden/>
           </w:rPr>
-          <w:instrText xml:space="preserve"> PAGEREF _Toc243865194 \h </w:instrText>
+          <w:instrText xml:space="preserve"> PAGEREF _Toc244028921 \h </w:instrText>
         </w:r>
         <w:r>
           <w:rPr>
@@ -2594,7 +2594,7 @@
           <w14:ligatures w14:val="standardContextual"/>
         </w:rPr>
       </w:pPr>
-      <w:hyperlink w:anchor="_Toc243865195" w:history="1">
+      <w:hyperlink w:anchor="_Toc244028922" w:history="1">
         <w:r>
           <w:rPr>
             <w:rStyle w:val="Hipervnculo"/>
@@ -2621,7 +2621,7 @@
             <w:noProof/>
             <w:webHidden/>
           </w:rPr>
-          <w:instrText xml:space="preserve"> PAGEREF _Toc243865195 \h </w:instrText>
+          <w:instrText xml:space="preserve"> PAGEREF _Toc244028922 \h </w:instrText>
         </w:r>
         <w:r>
           <w:rPr>
@@ -2668,7 +2668,7 @@
           <w14:ligatures w14:val="standardContextual"/>
         </w:rPr>
       </w:pPr>
-      <w:hyperlink w:anchor="_Toc243865196" w:history="1">
+      <w:hyperlink w:anchor="_Toc244028923" w:history="1">
         <w:r>
           <w:rPr>
             <w:rStyle w:val="Hipervnculo"/>
@@ -2695,7 +2695,7 @@
             <w:noProof/>
             <w:webHidden/>
           </w:rPr>
-          <w:instrText xml:space="preserve"> PAGEREF _Toc243865196 \h </w:instrText>
+          <w:instrText xml:space="preserve"> PAGEREF _Toc244028923 \h </w:instrText>
         </w:r>
         <w:r>
           <w:rPr>
@@ -2742,7 +2742,7 @@
           <w14:ligatures w14:val="standardContextual"/>
         </w:rPr>
       </w:pPr>
-      <w:hyperlink w:anchor="_Toc243865197" w:history="1">
+      <w:hyperlink w:anchor="_Toc244028924" w:history="1">
         <w:r>
           <w:rPr>
             <w:rStyle w:val="Hipervnculo"/>
@@ -2769,7 +2769,7 @@
             <w:noProof/>
             <w:webHidden/>
           </w:rPr>
-          <w:instrText xml:space="preserve"> PAGEREF _Toc243865197 \h </w:instrText>
+          <w:instrText xml:space="preserve"> PAGEREF _Toc244028924 \h </w:instrText>
         </w:r>
         <w:r>
           <w:rPr>
@@ -2816,7 +2816,7 @@
           <w14:ligatures w14:val="standardContextual"/>
         </w:rPr>
       </w:pPr>
-      <w:hyperlink w:anchor="_Toc243865198" w:history="1">
+      <w:hyperlink w:anchor="_Toc244028925" w:history="1">
         <w:r>
           <w:rPr>
             <w:rStyle w:val="Hipervnculo"/>
@@ -2843,7 +2843,7 @@
             <w:noProof/>
             <w:webHidden/>
           </w:rPr>
-          <w:instrText xml:space="preserve"> PAGEREF _Toc243865198 \h </w:instrText>
+          <w:instrText xml:space="preserve"> PAGEREF _Toc244028925 \h </w:instrText>
         </w:r>
         <w:r>
           <w:rPr>
@@ -2890,7 +2890,7 @@
           <w14:ligatures w14:val="standardContextual"/>
         </w:rPr>
       </w:pPr>
-      <w:hyperlink w:anchor="_Toc243865199" w:history="1">
+      <w:hyperlink w:anchor="_Toc244028926" w:history="1">
         <w:r>
           <w:rPr>
             <w:rStyle w:val="Hipervnculo"/>
@@ -2917,7 +2917,7 @@
             <w:noProof/>
             <w:webHidden/>
           </w:rPr>
-          <w:instrText xml:space="preserve"> PAGEREF _Toc243865199 \h </w:instrText>
+          <w:instrText xml:space="preserve"> PAGEREF _Toc244028926 \h </w:instrText>
         </w:r>
         <w:r>
           <w:rPr>
@@ -2964,7 +2964,7 @@
           <w14:ligatures w14:val="standardContextual"/>
         </w:rPr>
       </w:pPr>
-      <w:hyperlink w:anchor="_Toc243865200" w:history="1">
+      <w:hyperlink w:anchor="_Toc244028927" w:history="1">
         <w:r>
           <w:rPr>
             <w:rStyle w:val="Hipervnculo"/>
@@ -2991,7 +2991,7 @@
             <w:noProof/>
             <w:webHidden/>
           </w:rPr>
-          <w:instrText xml:space="preserve"> PAGEREF _Toc243865200 \h </w:instrText>
+          <w:instrText xml:space="preserve"> PAGEREF _Toc244028927 \h </w:instrText>
         </w:r>
         <w:r>
           <w:rPr>
@@ -3038,7 +3038,7 @@
           <w14:ligatures w14:val="standardContextual"/>
         </w:rPr>
       </w:pPr>
-      <w:hyperlink w:anchor="_Toc243865201" w:history="1">
+      <w:hyperlink w:anchor="_Toc244028928" w:history="1">
         <w:r>
           <w:rPr>
             <w:rStyle w:val="Hipervnculo"/>
@@ -3065,7 +3065,7 @@
             <w:noProof/>
             <w:webHidden/>
           </w:rPr>
-          <w:instrText xml:space="preserve"> PAGEREF _Toc243865201 \h </w:instrText>
+          <w:instrText xml:space="preserve"> PAGEREF _Toc244028928 \h </w:instrText>
         </w:r>
         <w:r>
           <w:rPr>
@@ -3112,7 +3112,7 @@
           <w14:ligatures w14:val="standardContextual"/>
         </w:rPr>
       </w:pPr>
-      <w:hyperlink w:anchor="_Toc243865202" w:history="1">
+      <w:hyperlink w:anchor="_Toc244028929" w:history="1">
         <w:r>
           <w:rPr>
             <w:rStyle w:val="Hipervnculo"/>
@@ -3139,7 +3139,7 @@
             <w:noProof/>
             <w:webHidden/>
           </w:rPr>
-          <w:instrText xml:space="preserve"> PAGEREF _Toc243865202 \h </w:instrText>
+          <w:instrText xml:space="preserve"> PAGEREF _Toc244028929 \h </w:instrText>
         </w:r>
         <w:r>
           <w:rPr>
@@ -3186,7 +3186,7 @@
           <w14:ligatures w14:val="standardContextual"/>
         </w:rPr>
       </w:pPr>
-      <w:hyperlink w:anchor="_Toc243865203" w:history="1">
+      <w:hyperlink w:anchor="_Toc244028930" w:history="1">
         <w:r>
           <w:rPr>
             <w:rStyle w:val="Hipervnculo"/>
@@ -3213,7 +3213,7 @@
             <w:noProof/>
             <w:webHidden/>
           </w:rPr>
-          <w:instrText xml:space="preserve"> PAGEREF _Toc243865203 \h </w:instrText>
+          <w:instrText xml:space="preserve"> PAGEREF _Toc244028930 \h </w:instrText>
         </w:r>
         <w:r>
           <w:rPr>
@@ -3260,7 +3260,7 @@
           <w14:ligatures w14:val="standardContextual"/>
         </w:rPr>
       </w:pPr>
-      <w:hyperlink w:anchor="_Toc243865204" w:history="1">
+      <w:hyperlink w:anchor="_Toc244028931" w:history="1">
         <w:r>
           <w:rPr>
             <w:rStyle w:val="Hipervnculo"/>
@@ -3287,7 +3287,7 @@
             <w:noProof/>
             <w:webHidden/>
           </w:rPr>
-          <w:instrText xml:space="preserve"> PAGEREF _Toc243865204 \h </w:instrText>
+          <w:instrText xml:space="preserve"> PAGEREF _Toc244028931 \h </w:instrText>
         </w:r>
         <w:r>
           <w:rPr>
@@ -3334,7 +3334,7 @@
           <w14:ligatures w14:val="standardContextual"/>
         </w:rPr>
       </w:pPr>
-      <w:hyperlink w:anchor="_Toc243865205" w:history="1">
+      <w:hyperlink w:anchor="_Toc244028932" w:history="1">
         <w:r>
           <w:rPr>
             <w:rStyle w:val="Hipervnculo"/>
@@ -3361,7 +3361,7 @@
             <w:noProof/>
             <w:webHidden/>
           </w:rPr>
-          <w:instrText xml:space="preserve"> PAGEREF _Toc243865205 \h </w:instrText>
+          <w:instrText xml:space="preserve"> PAGEREF _Toc244028932 \h </w:instrText>
         </w:r>
         <w:r>
           <w:rPr>
@@ -3408,7 +3408,7 @@
           <w14:ligatures w14:val="standardContextual"/>
         </w:rPr>
       </w:pPr>
-      <w:hyperlink w:anchor="_Toc243865206" w:history="1">
+      <w:hyperlink w:anchor="_Toc244028933" w:history="1">
         <w:r>
           <w:rPr>
             <w:rStyle w:val="Hipervnculo"/>
@@ -3435,7 +3435,7 @@
             <w:noProof/>
             <w:webHidden/>
           </w:rPr>
-          <w:instrText xml:space="preserve"> PAGEREF _Toc243865206 \h </w:instrText>
+          <w:instrText xml:space="preserve"> PAGEREF _Toc244028933 \h </w:instrText>
         </w:r>
         <w:r>
           <w:rPr>
@@ -3482,7 +3482,7 @@
           <w14:ligatures w14:val="standardContextual"/>
         </w:rPr>
       </w:pPr>
-      <w:hyperlink w:anchor="_Toc243865207" w:history="1">
+      <w:hyperlink w:anchor="_Toc244028934" w:history="1">
         <w:r>
           <w:rPr>
             <w:rStyle w:val="Hipervnculo"/>
@@ -3509,7 +3509,7 @@
             <w:noProof/>
             <w:webHidden/>
           </w:rPr>
-          <w:instrText xml:space="preserve"> PAGEREF _Toc243865207 \h </w:instrText>
+          <w:instrText xml:space="preserve"> PAGEREF _Toc244028934 \h </w:instrText>
         </w:r>
         <w:r>
           <w:rPr>
@@ -3556,7 +3556,7 @@
           <w14:ligatures w14:val="standardContextual"/>
         </w:rPr>
       </w:pPr>
-      <w:hyperlink w:anchor="_Toc243865208" w:history="1">
+      <w:hyperlink w:anchor="_Toc244028935" w:history="1">
         <w:r>
           <w:rPr>
             <w:rStyle w:val="Hipervnculo"/>
@@ -3583,7 +3583,7 @@
             <w:noProof/>
             <w:webHidden/>
           </w:rPr>
-          <w:instrText xml:space="preserve"> PAGEREF _Toc243865208 \h </w:instrText>
+          <w:instrText xml:space="preserve"> PAGEREF _Toc244028935 \h </w:instrText>
         </w:r>
         <w:r>
           <w:rPr>
@@ -3630,7 +3630,7 @@
           <w14:ligatures w14:val="standardContextual"/>
         </w:rPr>
       </w:pPr>
-      <w:hyperlink w:anchor="_Toc243865209" w:history="1">
+      <w:hyperlink w:anchor="_Toc244028936" w:history="1">
         <w:r>
           <w:rPr>
             <w:rStyle w:val="Hipervnculo"/>
@@ -3657,7 +3657,7 @@
             <w:noProof/>
             <w:webHidden/>
           </w:rPr>
-          <w:instrText xml:space="preserve"> PAGEREF _Toc243865209 \h </w:instrText>
+          <w:instrText xml:space="preserve"> PAGEREF _Toc244028936 \h </w:instrText>
         </w:r>
         <w:r>
           <w:rPr>
@@ -3704,7 +3704,7 @@
           <w14:ligatures w14:val="standardContextual"/>
         </w:rPr>
       </w:pPr>
-      <w:hyperlink w:anchor="_Toc243865210" w:history="1">
+      <w:hyperlink w:anchor="_Toc244028937" w:history="1">
         <w:r>
           <w:rPr>
             <w:rStyle w:val="Hipervnculo"/>
@@ -3731,7 +3731,7 @@
             <w:noProof/>
             <w:webHidden/>
           </w:rPr>
-          <w:instrText xml:space="preserve"> PAGEREF _Toc243865210 \h </w:instrText>
+          <w:instrText xml:space="preserve"> PAGEREF _Toc244028937 \h </w:instrText>
         </w:r>
         <w:r>
           <w:rPr>
@@ -3778,7 +3778,7 @@
           <w14:ligatures w14:val="standardContextual"/>
         </w:rPr>
       </w:pPr>
-      <w:hyperlink w:anchor="_Toc243865211" w:history="1">
+      <w:hyperlink w:anchor="_Toc244028938" w:history="1">
         <w:r>
           <w:rPr>
             <w:rStyle w:val="Hipervnculo"/>
@@ -3805,7 +3805,7 @@
             <w:noProof/>
             <w:webHidden/>
           </w:rPr>
-          <w:instrText xml:space="preserve"> PAGEREF _Toc243865211 \h </w:instrText>
+          <w:instrText xml:space="preserve"> PAGEREF _Toc244028938 \h </w:instrText>
         </w:r>
         <w:r>
           <w:rPr>
@@ -3852,7 +3852,7 @@
           <w14:ligatures w14:val="standardContextual"/>
         </w:rPr>
       </w:pPr>
-      <w:hyperlink w:anchor="_Toc243865212" w:history="1">
+      <w:hyperlink w:anchor="_Toc244028939" w:history="1">
         <w:r>
           <w:rPr>
             <w:rStyle w:val="Hipervnculo"/>
@@ -3879,7 +3879,7 @@
             <w:noProof/>
             <w:webHidden/>
           </w:rPr>
-          <w:instrText xml:space="preserve"> PAGEREF _Toc243865212 \h </w:instrText>
+          <w:instrText xml:space="preserve"> PAGEREF _Toc244028939 \h </w:instrText>
         </w:r>
         <w:r>
           <w:rPr>
@@ -3926,7 +3926,7 @@
           <w14:ligatures w14:val="standardContextual"/>
         </w:rPr>
       </w:pPr>
-      <w:hyperlink w:anchor="_Toc243865213" w:history="1">
+      <w:hyperlink w:anchor="_Toc244028940" w:history="1">
         <w:r>
           <w:rPr>
             <w:rStyle w:val="Hipervnculo"/>
@@ -3953,7 +3953,7 @@
             <w:noProof/>
             <w:webHidden/>
           </w:rPr>
-          <w:instrText xml:space="preserve"> PAGEREF _Toc243865213 \h </w:instrText>
+          <w:instrText xml:space="preserve"> PAGEREF _Toc244028940 \h </w:instrText>
         </w:r>
         <w:r>
           <w:rPr>
@@ -4000,7 +4000,7 @@
           <w14:ligatures w14:val="standardContextual"/>
         </w:rPr>
       </w:pPr>
-      <w:hyperlink w:anchor="_Toc243865214" w:history="1">
+      <w:hyperlink w:anchor="_Toc244028941" w:history="1">
         <w:r>
           <w:rPr>
             <w:rStyle w:val="Hipervnculo"/>
@@ -4027,7 +4027,7 @@
             <w:noProof/>
             <w:webHidden/>
           </w:rPr>
-          <w:instrText xml:space="preserve"> PAGEREF _Toc243865214 \h </w:instrText>
+          <w:instrText xml:space="preserve"> PAGEREF _Toc244028941 \h </w:instrText>
         </w:r>
         <w:r>
           <w:rPr>
@@ -4074,7 +4074,7 @@
           <w14:ligatures w14:val="standardContextual"/>
         </w:rPr>
       </w:pPr>
-      <w:hyperlink w:anchor="_Toc243865215" w:history="1">
+      <w:hyperlink w:anchor="_Toc244028942" w:history="1">
         <w:r>
           <w:rPr>
             <w:rStyle w:val="Hipervnculo"/>
@@ -4101,7 +4101,7 @@
             <w:noProof/>
             <w:webHidden/>
           </w:rPr>
-          <w:instrText xml:space="preserve"> PAGEREF _Toc243865215 \h </w:instrText>
+          <w:instrText xml:space="preserve"> PAGEREF _Toc244028942 \h </w:instrText>
         </w:r>
         <w:r>
           <w:rPr>
@@ -4148,7 +4148,7 @@
           <w14:ligatures w14:val="standardContextual"/>
         </w:rPr>
       </w:pPr>
-      <w:hyperlink w:anchor="_Toc243865216" w:history="1">
+      <w:hyperlink w:anchor="_Toc244028943" w:history="1">
         <w:r>
           <w:rPr>
             <w:rStyle w:val="Hipervnculo"/>
@@ -4175,7 +4175,7 @@
             <w:noProof/>
             <w:webHidden/>
           </w:rPr>
-          <w:instrText xml:space="preserve"> PAGEREF _Toc243865216 \h </w:instrText>
+          <w:instrText xml:space="preserve"> PAGEREF _Toc244028943 \h </w:instrText>
         </w:r>
         <w:r>
           <w:rPr>
@@ -4222,7 +4222,7 @@
           <w14:ligatures w14:val="standardContextual"/>
         </w:rPr>
       </w:pPr>
-      <w:hyperlink w:anchor="_Toc243865217" w:history="1">
+      <w:hyperlink w:anchor="_Toc244028944" w:history="1">
         <w:r>
           <w:rPr>
             <w:rStyle w:val="Hipervnculo"/>
@@ -4249,7 +4249,7 @@
             <w:noProof/>
             <w:webHidden/>
           </w:rPr>
-          <w:instrText xml:space="preserve"> PAGEREF _Toc243865217 \h </w:instrText>
+          <w:instrText xml:space="preserve"> PAGEREF _Toc244028944 \h </w:instrText>
         </w:r>
         <w:r>
           <w:rPr>
@@ -4296,7 +4296,7 @@
           <w14:ligatures w14:val="standardContextual"/>
         </w:rPr>
       </w:pPr>
-      <w:hyperlink w:anchor="_Toc243865218" w:history="1">
+      <w:hyperlink w:anchor="_Toc244028945" w:history="1">
         <w:r>
           <w:rPr>
             <w:rStyle w:val="Hipervnculo"/>
@@ -4323,7 +4323,7 @@
             <w:noProof/>
             <w:webHidden/>
           </w:rPr>
-          <w:instrText xml:space="preserve"> PAGEREF _Toc243865218 \h </w:instrText>
+          <w:instrText xml:space="preserve"> PAGEREF _Toc244028945 \h </w:instrText>
         </w:r>
         <w:r>
           <w:rPr>
@@ -4370,7 +4370,7 @@
           <w14:ligatures w14:val="standardContextual"/>
         </w:rPr>
       </w:pPr>
-      <w:hyperlink w:anchor="_Toc243865219" w:history="1">
+      <w:hyperlink w:anchor="_Toc244028946" w:history="1">
         <w:r>
           <w:rPr>
             <w:rStyle w:val="Hipervnculo"/>
@@ -4397,7 +4397,7 @@
             <w:noProof/>
             <w:webHidden/>
           </w:rPr>
-          <w:instrText xml:space="preserve"> PAGEREF _Toc243865219 \h </w:instrText>
+          <w:instrText xml:space="preserve"> PAGEREF _Toc244028946 \h </w:instrText>
         </w:r>
         <w:r>
           <w:rPr>
@@ -4444,7 +4444,7 @@
           <w14:ligatures w14:val="standardContextual"/>
         </w:rPr>
       </w:pPr>
-      <w:hyperlink w:anchor="_Toc243865220" w:history="1">
+      <w:hyperlink w:anchor="_Toc244028947" w:history="1">
         <w:r>
           <w:rPr>
             <w:rStyle w:val="Hipervnculo"/>
@@ -4471,7 +4471,7 @@
             <w:noProof/>
             <w:webHidden/>
           </w:rPr>
-          <w:instrText xml:space="preserve"> PAGEREF _Toc243865220 \h </w:instrText>
+          <w:instrText xml:space="preserve"> PAGEREF _Toc244028947 \h </w:instrText>
         </w:r>
         <w:r>
           <w:rPr>
@@ -4518,7 +4518,7 @@
           <w14:ligatures w14:val="standardContextual"/>
         </w:rPr>
       </w:pPr>
-      <w:hyperlink w:anchor="_Toc243865221" w:history="1">
+      <w:hyperlink w:anchor="_Toc244028948" w:history="1">
         <w:r>
           <w:rPr>
             <w:rStyle w:val="Hipervnculo"/>
@@ -4545,7 +4545,7 @@
             <w:noProof/>
             <w:webHidden/>
           </w:rPr>
-          <w:instrText xml:space="preserve"> PAGEREF _Toc243865221 \h </w:instrText>
+          <w:instrText xml:space="preserve"> PAGEREF _Toc244028948 \h </w:instrText>
         </w:r>
         <w:r>
           <w:rPr>
@@ -4592,7 +4592,7 @@
           <w14:ligatures w14:val="standardContextual"/>
         </w:rPr>
       </w:pPr>
-      <w:hyperlink w:anchor="_Toc243865222" w:history="1">
+      <w:hyperlink w:anchor="_Toc244028949" w:history="1">
         <w:r>
           <w:rPr>
             <w:rStyle w:val="Hipervnculo"/>
@@ -4619,7 +4619,7 @@
             <w:noProof/>
             <w:webHidden/>
           </w:rPr>
-          <w:instrText xml:space="preserve"> PAGEREF _Toc243865222 \h </w:instrText>
+          <w:instrText xml:space="preserve"> PAGEREF _Toc244028949 \h </w:instrText>
         </w:r>
         <w:r>
           <w:rPr>
@@ -4666,7 +4666,7 @@
           <w14:ligatures w14:val="standardContextual"/>
         </w:rPr>
       </w:pPr>
-      <w:hyperlink w:anchor="_Toc243865223" w:history="1">
+      <w:hyperlink w:anchor="_Toc244028950" w:history="1">
         <w:r>
           <w:rPr>
             <w:rStyle w:val="Hipervnculo"/>
@@ -4693,7 +4693,7 @@
             <w:noProof/>
             <w:webHidden/>
           </w:rPr>
-          <w:instrText xml:space="preserve"> PAGEREF _Toc243865223 \h </w:instrText>
+          <w:instrText xml:space="preserve"> PAGEREF _Toc244028950 \h </w:instrText>
         </w:r>
         <w:r>
           <w:rPr>
@@ -4740,7 +4740,7 @@
           <w14:ligatures w14:val="standardContextual"/>
         </w:rPr>
       </w:pPr>
-      <w:hyperlink w:anchor="_Toc243865224" w:history="1">
+      <w:hyperlink w:anchor="_Toc244028951" w:history="1">
         <w:r>
           <w:rPr>
             <w:rStyle w:val="Hipervnculo"/>
@@ -4767,7 +4767,7 @@
             <w:noProof/>
             <w:webHidden/>
           </w:rPr>
-          <w:instrText xml:space="preserve"> PAGEREF _Toc243865224 \h </w:instrText>
+          <w:instrText xml:space="preserve"> PAGEREF _Toc244028951 \h </w:instrText>
         </w:r>
         <w:r>
           <w:rPr>
@@ -4814,7 +4814,7 @@
           <w14:ligatures w14:val="standardContextual"/>
         </w:rPr>
       </w:pPr>
-      <w:hyperlink w:anchor="_Toc243865225" w:history="1">
+      <w:hyperlink w:anchor="_Toc244028952" w:history="1">
         <w:r>
           <w:rPr>
             <w:rStyle w:val="Hipervnculo"/>
@@ -4841,7 +4841,7 @@
             <w:noProof/>
             <w:webHidden/>
           </w:rPr>
-          <w:instrText xml:space="preserve"> PAGEREF _Toc243865225 \h </w:instrText>
+          <w:instrText xml:space="preserve"> PAGEREF _Toc244028952 \h </w:instrText>
         </w:r>
         <w:r>
           <w:rPr>
@@ -4888,7 +4888,7 @@
           <w14:ligatures w14:val="standardContextual"/>
         </w:rPr>
       </w:pPr>
-      <w:hyperlink w:anchor="_Toc243865226" w:history="1">
+      <w:hyperlink w:anchor="_Toc244028953" w:history="1">
         <w:r>
           <w:rPr>
             <w:rStyle w:val="Hipervnculo"/>
@@ -4915,7 +4915,7 @@
             <w:noProof/>
             <w:webHidden/>
           </w:rPr>
-          <w:instrText xml:space="preserve"> PAGEREF _Toc243865226 \h </w:instrText>
+          <w:instrText xml:space="preserve"> PAGEREF _Toc244028953 \h </w:instrText>
         </w:r>
         <w:r>
           <w:rPr>
@@ -4962,7 +4962,7 @@
           <w14:ligatures w14:val="standardContextual"/>
         </w:rPr>
       </w:pPr>
-      <w:hyperlink w:anchor="_Toc243865227" w:history="1">
+      <w:hyperlink w:anchor="_Toc244028954" w:history="1">
         <w:r>
           <w:rPr>
             <w:rStyle w:val="Hipervnculo"/>
@@ -4989,7 +4989,7 @@
             <w:noProof/>
             <w:webHidden/>
           </w:rPr>
-          <w:instrText xml:space="preserve"> PAGEREF _Toc243865227 \h </w:instrText>
+          <w:instrText xml:space="preserve"> PAGEREF _Toc244028954 \h </w:instrText>
         </w:r>
         <w:r>
           <w:rPr>
@@ -5036,7 +5036,7 @@
           <w14:ligatures w14:val="standardContextual"/>
         </w:rPr>
       </w:pPr>
-      <w:hyperlink w:anchor="_Toc243865228" w:history="1">
+      <w:hyperlink w:anchor="_Toc244028955" w:history="1">
         <w:r>
           <w:rPr>
             <w:rStyle w:val="Hipervnculo"/>
@@ -5063,7 +5063,7 @@
             <w:noProof/>
             <w:webHidden/>
           </w:rPr>
-          <w:instrText xml:space="preserve"> PAGEREF _Toc243865228 \h </w:instrText>
+          <w:instrText xml:space="preserve"> PAGEREF _Toc244028955 \h </w:instrText>
         </w:r>
         <w:r>
           <w:rPr>
@@ -5110,7 +5110,7 @@
           <w14:ligatures w14:val="standardContextual"/>
         </w:rPr>
       </w:pPr>
-      <w:hyperlink w:anchor="_Toc243865229" w:history="1">
+      <w:hyperlink w:anchor="_Toc244028956" w:history="1">
         <w:r>
           <w:rPr>
             <w:rStyle w:val="Hipervnculo"/>
@@ -5137,7 +5137,7 @@
             <w:noProof/>
             <w:webHidden/>
           </w:rPr>
-          <w:instrText xml:space="preserve"> PAGEREF _Toc243865229 \h </w:instrText>
+          <w:instrText xml:space="preserve"> PAGEREF _Toc244028956 \h </w:instrText>
         </w:r>
         <w:r>
           <w:rPr>
@@ -5184,7 +5184,7 @@
           <w14:ligatures w14:val="standardContextual"/>
         </w:rPr>
       </w:pPr>
-      <w:hyperlink w:anchor="_Toc243865230" w:history="1">
+      <w:hyperlink w:anchor="_Toc244028957" w:history="1">
         <w:r>
           <w:rPr>
             <w:rStyle w:val="Hipervnculo"/>
@@ -5211,7 +5211,7 @@
             <w:noProof/>
             <w:webHidden/>
           </w:rPr>
-          <w:instrText xml:space="preserve"> PAGEREF _Toc243865230 \h </w:instrText>
+          <w:instrText xml:space="preserve"> PAGEREF _Toc244028957 \h </w:instrText>
         </w:r>
         <w:r>
           <w:rPr>
@@ -5258,7 +5258,7 @@
           <w14:ligatures w14:val="standardContextual"/>
         </w:rPr>
       </w:pPr>
-      <w:hyperlink w:anchor="_Toc243865231" w:history="1">
+      <w:hyperlink w:anchor="_Toc244028958" w:history="1">
         <w:r>
           <w:rPr>
             <w:rStyle w:val="Hipervnculo"/>
@@ -5285,7 +5285,7 @@
             <w:noProof/>
             <w:webHidden/>
           </w:rPr>
-          <w:instrText xml:space="preserve"> PAGEREF _Toc243865231 \h </w:instrText>
+          <w:instrText xml:space="preserve"> PAGEREF _Toc244028958 \h </w:instrText>
         </w:r>
         <w:r>
           <w:rPr>
@@ -5332,7 +5332,7 @@
           <w14:ligatures w14:val="standardContextual"/>
         </w:rPr>
       </w:pPr>
-      <w:hyperlink w:anchor="_Toc243865232" w:history="1">
+      <w:hyperlink w:anchor="_Toc244028959" w:history="1">
         <w:r>
           <w:rPr>
             <w:rStyle w:val="Hipervnculo"/>
@@ -5359,7 +5359,7 @@
             <w:noProof/>
             <w:webHidden/>
           </w:rPr>
-          <w:instrText xml:space="preserve"> PAGEREF _Toc243865232 \h </w:instrText>
+          <w:instrText xml:space="preserve"> PAGEREF _Toc244028959 \h </w:instrText>
         </w:r>
         <w:r>
           <w:rPr>
@@ -5406,7 +5406,7 @@
           <w14:ligatures w14:val="standardContextual"/>
         </w:rPr>
       </w:pPr>
-      <w:hyperlink w:anchor="_Toc243865233" w:history="1">
+      <w:hyperlink w:anchor="_Toc244028960" w:history="1">
         <w:r>
           <w:rPr>
             <w:rStyle w:val="Hipervnculo"/>
@@ -5433,7 +5433,7 @@
             <w:noProof/>
             <w:webHidden/>
           </w:rPr>
-          <w:instrText xml:space="preserve"> PAGEREF _Toc243865233 \h </w:instrText>
+          <w:instrText xml:space="preserve"> PAGEREF _Toc244028960 \h </w:instrText>
         </w:r>
         <w:r>
           <w:rPr>
@@ -5480,7 +5480,7 @@
           <w14:ligatures w14:val="standardContextual"/>
         </w:rPr>
       </w:pPr>
-      <w:hyperlink w:anchor="_Toc243865234" w:history="1">
+      <w:hyperlink w:anchor="_Toc244028961" w:history="1">
         <w:r>
           <w:rPr>
             <w:rStyle w:val="Hipervnculo"/>
@@ -5507,7 +5507,7 @@
             <w:noProof/>
             <w:webHidden/>
           </w:rPr>
-          <w:instrText xml:space="preserve"> PAGEREF _Toc243865234 \h </w:instrText>
+          <w:instrText xml:space="preserve"> PAGEREF _Toc244028961 \h </w:instrText>
         </w:r>
         <w:r>
           <w:rPr>
@@ -5554,7 +5554,7 @@
           <w14:ligatures w14:val="standardContextual"/>
         </w:rPr>
       </w:pPr>
-      <w:hyperlink w:anchor="_Toc243865235" w:history="1">
+      <w:hyperlink w:anchor="_Toc244028962" w:history="1">
         <w:r>
           <w:rPr>
             <w:rStyle w:val="Hipervnculo"/>
@@ -5581,7 +5581,7 @@
             <w:noProof/>
             <w:webHidden/>
           </w:rPr>
-          <w:instrText xml:space="preserve"> PAGEREF _Toc243865235 \h </w:instrText>
+          <w:instrText xml:space="preserve"> PAGEREF _Toc244028962 \h </w:instrText>
         </w:r>
         <w:r>
           <w:rPr>
@@ -5628,7 +5628,7 @@
           <w14:ligatures w14:val="standardContextual"/>
         </w:rPr>
       </w:pPr>
-      <w:hyperlink w:anchor="_Toc243865236" w:history="1">
+      <w:hyperlink w:anchor="_Toc244028963" w:history="1">
         <w:r>
           <w:rPr>
             <w:rStyle w:val="Hipervnculo"/>
@@ -5655,7 +5655,7 @@
             <w:noProof/>
             <w:webHidden/>
           </w:rPr>
-          <w:instrText xml:space="preserve"> PAGEREF _Toc243865236 \h </w:instrText>
+          <w:instrText xml:space="preserve"> PAGEREF _Toc244028963 \h </w:instrText>
         </w:r>
         <w:r>
           <w:rPr>
@@ -5702,7 +5702,7 @@
           <w14:ligatures w14:val="standardContextual"/>
         </w:rPr>
       </w:pPr>
-      <w:hyperlink w:anchor="_Toc243865237" w:history="1">
+      <w:hyperlink w:anchor="_Toc244028964" w:history="1">
         <w:r>
           <w:rPr>
             <w:rStyle w:val="Hipervnculo"/>
@@ -5729,7 +5729,7 @@
             <w:noProof/>
             <w:webHidden/>
           </w:rPr>
-          <w:instrText xml:space="preserve"> PAGEREF _Toc243865237 \h </w:instrText>
+          <w:instrText xml:space="preserve"> PAGEREF _Toc244028964 \h </w:instrText>
         </w:r>
         <w:r>
           <w:rPr>
@@ -5776,7 +5776,7 @@
           <w14:ligatures w14:val="standardContextual"/>
         </w:rPr>
       </w:pPr>
-      <w:hyperlink w:anchor="_Toc243865238" w:history="1">
+      <w:hyperlink w:anchor="_Toc244028965" w:history="1">
         <w:r>
           <w:rPr>
             <w:rStyle w:val="Hipervnculo"/>
@@ -5803,7 +5803,7 @@
             <w:noProof/>
             <w:webHidden/>
           </w:rPr>
-          <w:instrText xml:space="preserve"> PAGEREF _Toc243865238 \h </w:instrText>
+          <w:instrText xml:space="preserve"> PAGEREF _Toc244028965 \h </w:instrText>
         </w:r>
         <w:r>
           <w:rPr>
@@ -5850,7 +5850,7 @@
           <w14:ligatures w14:val="standardContextual"/>
         </w:rPr>
       </w:pPr>
-      <w:hyperlink w:anchor="_Toc243865239" w:history="1">
+      <w:hyperlink w:anchor="_Toc244028966" w:history="1">
         <w:r>
           <w:rPr>
             <w:rStyle w:val="Hipervnculo"/>
@@ -5877,7 +5877,7 @@
             <w:noProof/>
             <w:webHidden/>
           </w:rPr>
-          <w:instrText xml:space="preserve"> PAGEREF _Toc243865239 \h </w:instrText>
+          <w:instrText xml:space="preserve"> PAGEREF _Toc244028966 \h </w:instrText>
         </w:r>
         <w:r>
           <w:rPr>
@@ -5924,7 +5924,7 @@
           <w14:ligatures w14:val="standardContextual"/>
         </w:rPr>
       </w:pPr>
-      <w:hyperlink w:anchor="_Toc243865240" w:history="1">
+      <w:hyperlink w:anchor="_Toc244028967" w:history="1">
         <w:r>
           <w:rPr>
             <w:rStyle w:val="Hipervnculo"/>
@@ -5951,7 +5951,7 @@
             <w:noProof/>
             <w:webHidden/>
           </w:rPr>
-          <w:instrText xml:space="preserve"> PAGEREF _Toc243865240 \h </w:instrText>
+          <w:instrText xml:space="preserve"> PAGEREF _Toc244028967 \h </w:instrText>
         </w:r>
         <w:r>
           <w:rPr>
@@ -5998,7 +5998,7 @@
           <w14:ligatures w14:val="standardContextual"/>
         </w:rPr>
       </w:pPr>
-      <w:hyperlink w:anchor="_Toc243865241" w:history="1">
+      <w:hyperlink w:anchor="_Toc244028968" w:history="1">
         <w:r>
           <w:rPr>
             <w:rStyle w:val="Hipervnculo"/>
@@ -6025,7 +6025,7 @@
             <w:noProof/>
             <w:webHidden/>
           </w:rPr>
-          <w:instrText xml:space="preserve"> PAGEREF _Toc243865241 \h </w:instrText>
+          <w:instrText xml:space="preserve"> PAGEREF _Toc244028968 \h </w:instrText>
         </w:r>
         <w:r>
           <w:rPr>
@@ -6072,7 +6072,7 @@
           <w14:ligatures w14:val="standardContextual"/>
         </w:rPr>
       </w:pPr>
-      <w:hyperlink w:anchor="_Toc243865242" w:history="1">
+      <w:hyperlink w:anchor="_Toc244028969" w:history="1">
         <w:r>
           <w:rPr>
             <w:rStyle w:val="Hipervnculo"/>
@@ -6099,7 +6099,7 @@
             <w:noProof/>
             <w:webHidden/>
           </w:rPr>
-          <w:instrText xml:space="preserve"> PAGEREF _Toc243865242 \h </w:instrText>
+          <w:instrText xml:space="preserve"> PAGEREF _Toc244028969 \h </w:instrText>
         </w:r>
         <w:r>
           <w:rPr>
@@ -6146,7 +6146,7 @@
           <w14:ligatures w14:val="standardContextual"/>
         </w:rPr>
       </w:pPr>
-      <w:hyperlink w:anchor="_Toc243865243" w:history="1">
+      <w:hyperlink w:anchor="_Toc244028970" w:history="1">
         <w:r>
           <w:rPr>
             <w:rStyle w:val="Hipervnculo"/>
@@ -6173,7 +6173,7 @@
             <w:noProof/>
             <w:webHidden/>
           </w:rPr>
-          <w:instrText xml:space="preserve"> PAGEREF _Toc243865243 \h </w:instrText>
+          <w:instrText xml:space="preserve"> PAGEREF _Toc244028970 \h </w:instrText>
         </w:r>
         <w:r>
           <w:rPr>
@@ -6220,7 +6220,7 @@
           <w14:ligatures w14:val="standardContextual"/>
         </w:rPr>
       </w:pPr>
-      <w:hyperlink w:anchor="_Toc243865244" w:history="1">
+      <w:hyperlink w:anchor="_Toc244028971" w:history="1">
         <w:r>
           <w:rPr>
             <w:rStyle w:val="Hipervnculo"/>
@@ -6247,7 +6247,7 @@
             <w:noProof/>
             <w:webHidden/>
           </w:rPr>
-          <w:instrText xml:space="preserve"> PAGEREF _Toc243865244 \h </w:instrText>
+          <w:instrText xml:space="preserve"> PAGEREF _Toc244028971 \h </w:instrText>
         </w:r>
         <w:r>
           <w:rPr>
@@ -6294,13 +6294,13 @@
           <w14:ligatures w14:val="standardContextual"/>
         </w:rPr>
       </w:pPr>
-      <w:hyperlink w:anchor="_Toc243865245" w:history="1">
+      <w:hyperlink w:anchor="_Toc244028972" w:history="1">
         <w:r>
           <w:rPr>
             <w:rStyle w:val="Hipervnculo"/>
             <w:noProof/>
           </w:rPr>
-          <w:t>5.3.10. Reproducibilidad y evidencias</w:t>
+          <w:t>5.3.10. Transferencia temporal a otros cultivos y regiones</w:t>
         </w:r>
         <w:r>
           <w:rPr>
@@ -6321,7 +6321,7 @@
             <w:noProof/>
             <w:webHidden/>
           </w:rPr>
-          <w:instrText xml:space="preserve"> PAGEREF _Toc243865245 \h </w:instrText>
+          <w:instrText xml:space="preserve"> PAGEREF _Toc244028972 \h </w:instrText>
         </w:r>
         <w:r>
           <w:rPr>
@@ -6342,6 +6342,80 @@
             <w:webHidden/>
           </w:rPr>
           <w:t>75</w:t>
+        </w:r>
+        <w:r>
+          <w:rPr>
+            <w:noProof/>
+            <w:webHidden/>
+          </w:rPr>
+          <w:fldChar w:fldCharType="end"/>
+        </w:r>
+      </w:hyperlink>
+    </w:p>
+    <w:p>
+      <w:pPr>
+        <w:pStyle w:val="TDC3"/>
+        <w:tabs>
+          <w:tab w:val="right" w:leader="dot" w:pos="9628"/>
+        </w:tabs>
+        <w:rPr>
+          <w:rFonts w:asciiTheme="minorHAnsi" w:eastAsiaTheme="minorEastAsia" w:hAnsiTheme="minorHAnsi" w:cstheme="minorBidi"/>
+          <w:noProof/>
+          <w:color w:val="auto"/>
+          <w:kern w:val="2"/>
+          <w:sz w:val="24"/>
+          <w:szCs w:val="24"/>
+          <w14:ligatures w14:val="standardContextual"/>
+        </w:rPr>
+      </w:pPr>
+      <w:hyperlink w:anchor="_Toc244028973" w:history="1">
+        <w:r>
+          <w:rPr>
+            <w:rStyle w:val="Hipervnculo"/>
+            <w:noProof/>
+          </w:rPr>
+          <w:t>5.3.11. Reproducibilidad y evidencias</w:t>
+        </w:r>
+        <w:r>
+          <w:rPr>
+            <w:noProof/>
+            <w:webHidden/>
+          </w:rPr>
+          <w:tab/>
+        </w:r>
+        <w:r>
+          <w:rPr>
+            <w:noProof/>
+            <w:webHidden/>
+          </w:rPr>
+          <w:fldChar w:fldCharType="begin"/>
+        </w:r>
+        <w:r>
+          <w:rPr>
+            <w:noProof/>
+            <w:webHidden/>
+          </w:rPr>
+          <w:instrText xml:space="preserve"> PAGEREF _Toc244028973 \h </w:instrText>
+        </w:r>
+        <w:r>
+          <w:rPr>
+            <w:noProof/>
+            <w:webHidden/>
+          </w:rPr>
+        </w:r>
+        <w:r>
+          <w:rPr>
+            <w:noProof/>
+            <w:webHidden/>
+          </w:rPr>
+          <w:fldChar w:fldCharType="separate"/>
+        </w:r>
+        <w:r>
+          <w:rPr>
+            <w:noProof/>
+            <w:webHidden/>
+          </w:rPr>
+          <w:t>77</w:t>
         </w:r>
         <w:r>
           <w:rPr>
@@ -6368,7 +6442,7 @@
           <w14:ligatures w14:val="standardContextual"/>
         </w:rPr>
       </w:pPr>
-      <w:hyperlink w:anchor="_Toc243865246" w:history="1">
+      <w:hyperlink w:anchor="_Toc244028974" w:history="1">
         <w:r>
           <w:rPr>
             <w:rStyle w:val="Hipervnculo"/>
@@ -6395,7 +6469,7 @@
             <w:noProof/>
             <w:webHidden/>
           </w:rPr>
-          <w:instrText xml:space="preserve"> PAGEREF _Toc243865246 \h </w:instrText>
+          <w:instrText xml:space="preserve"> PAGEREF _Toc244028974 \h </w:instrText>
         </w:r>
         <w:r>
           <w:rPr>
@@ -6415,7 +6489,7 @@
             <w:noProof/>
             <w:webHidden/>
           </w:rPr>
-          <w:t>76</w:t>
+          <w:t>78</w:t>
         </w:r>
         <w:r>
           <w:rPr>
@@ -6442,7 +6516,7 @@
           <w14:ligatures w14:val="standardContextual"/>
         </w:rPr>
       </w:pPr>
-      <w:hyperlink w:anchor="_Toc243865247" w:history="1">
+      <w:hyperlink w:anchor="_Toc244028975" w:history="1">
         <w:r>
           <w:rPr>
             <w:rStyle w:val="Hipervnculo"/>
@@ -6469,7 +6543,7 @@
             <w:noProof/>
             <w:webHidden/>
           </w:rPr>
-          <w:instrText xml:space="preserve"> PAGEREF _Toc243865247 \h </w:instrText>
+          <w:instrText xml:space="preserve"> PAGEREF _Toc244028975 \h </w:instrText>
         </w:r>
         <w:r>
           <w:rPr>
@@ -6489,7 +6563,7 @@
             <w:noProof/>
             <w:webHidden/>
           </w:rPr>
-          <w:t>76</w:t>
+          <w:t>78</w:t>
         </w:r>
         <w:r>
           <w:rPr>
@@ -6516,7 +6590,7 @@
           <w14:ligatures w14:val="standardContextual"/>
         </w:rPr>
       </w:pPr>
-      <w:hyperlink w:anchor="_Toc243865248" w:history="1">
+      <w:hyperlink w:anchor="_Toc244028976" w:history="1">
         <w:r>
           <w:rPr>
             <w:rStyle w:val="Hipervnculo"/>
@@ -6543,7 +6617,7 @@
             <w:noProof/>
             <w:webHidden/>
           </w:rPr>
-          <w:instrText xml:space="preserve"> PAGEREF _Toc243865248 \h </w:instrText>
+          <w:instrText xml:space="preserve"> PAGEREF _Toc244028976 \h </w:instrText>
         </w:r>
         <w:r>
           <w:rPr>
@@ -6563,7 +6637,7 @@
             <w:noProof/>
             <w:webHidden/>
           </w:rPr>
-          <w:t>76</w:t>
+          <w:t>78</w:t>
         </w:r>
         <w:r>
           <w:rPr>
@@ -6590,7 +6664,7 @@
           <w14:ligatures w14:val="standardContextual"/>
         </w:rPr>
       </w:pPr>
-      <w:hyperlink w:anchor="_Toc243865249" w:history="1">
+      <w:hyperlink w:anchor="_Toc244028977" w:history="1">
         <w:r>
           <w:rPr>
             <w:rStyle w:val="Hipervnculo"/>
@@ -6617,7 +6691,7 @@
             <w:noProof/>
             <w:webHidden/>
           </w:rPr>
-          <w:instrText xml:space="preserve"> PAGEREF _Toc243865249 \h </w:instrText>
+          <w:instrText xml:space="preserve"> PAGEREF _Toc244028977 \h </w:instrText>
         </w:r>
         <w:r>
           <w:rPr>
@@ -6637,7 +6711,7 @@
             <w:noProof/>
             <w:webHidden/>
           </w:rPr>
-          <w:t>77</w:t>
+          <w:t>80</w:t>
         </w:r>
         <w:r>
           <w:rPr>
@@ -6664,7 +6738,7 @@
           <w14:ligatures w14:val="standardContextual"/>
         </w:rPr>
       </w:pPr>
-      <w:hyperlink w:anchor="_Toc243865250" w:history="1">
+      <w:hyperlink w:anchor="_Toc244028978" w:history="1">
         <w:r>
           <w:rPr>
             <w:rStyle w:val="Hipervnculo"/>
@@ -6691,7 +6765,7 @@
             <w:noProof/>
             <w:webHidden/>
           </w:rPr>
-          <w:instrText xml:space="preserve"> PAGEREF _Toc243865250 \h </w:instrText>
+          <w:instrText xml:space="preserve"> PAGEREF _Toc244028978 \h </w:instrText>
         </w:r>
         <w:r>
           <w:rPr>
@@ -6711,7 +6785,7 @@
             <w:noProof/>
             <w:webHidden/>
           </w:rPr>
-          <w:t>78</w:t>
+          <w:t>81</w:t>
         </w:r>
         <w:r>
           <w:rPr>
@@ -6738,7 +6812,7 @@
           <w14:ligatures w14:val="standardContextual"/>
         </w:rPr>
       </w:pPr>
-      <w:hyperlink w:anchor="_Toc243865251" w:history="1">
+      <w:hyperlink w:anchor="_Toc244028979" w:history="1">
         <w:r>
           <w:rPr>
             <w:rStyle w:val="Hipervnculo"/>
@@ -6765,7 +6839,7 @@
             <w:noProof/>
             <w:webHidden/>
           </w:rPr>
-          <w:instrText xml:space="preserve"> PAGEREF _Toc243865251 \h </w:instrText>
+          <w:instrText xml:space="preserve"> PAGEREF _Toc244028979 \h </w:instrText>
         </w:r>
         <w:r>
           <w:rPr>
@@ -6785,7 +6859,7 @@
             <w:noProof/>
             <w:webHidden/>
           </w:rPr>
-          <w:t>78</w:t>
+          <w:t>81</w:t>
         </w:r>
         <w:r>
           <w:rPr>
@@ -6812,7 +6886,7 @@
           <w14:ligatures w14:val="standardContextual"/>
         </w:rPr>
       </w:pPr>
-      <w:hyperlink w:anchor="_Toc243865252" w:history="1">
+      <w:hyperlink w:anchor="_Toc244028980" w:history="1">
         <w:r>
           <w:rPr>
             <w:rStyle w:val="Hipervnculo"/>
@@ -6839,7 +6913,7 @@
             <w:noProof/>
             <w:webHidden/>
           </w:rPr>
-          <w:instrText xml:space="preserve"> PAGEREF _Toc243865252 \h </w:instrText>
+          <w:instrText xml:space="preserve"> PAGEREF _Toc244028980 \h </w:instrText>
         </w:r>
         <w:r>
           <w:rPr>
@@ -6859,7 +6933,7 @@
             <w:noProof/>
             <w:webHidden/>
           </w:rPr>
-          <w:t>80</w:t>
+          <w:t>82</w:t>
         </w:r>
         <w:r>
           <w:rPr>
@@ -6886,7 +6960,7 @@
           <w14:ligatures w14:val="standardContextual"/>
         </w:rPr>
       </w:pPr>
-      <w:hyperlink w:anchor="_Toc243865253" w:history="1">
+      <w:hyperlink w:anchor="_Toc244028981" w:history="1">
         <w:r>
           <w:rPr>
             <w:rStyle w:val="Hipervnculo"/>
@@ -6913,7 +6987,7 @@
             <w:noProof/>
             <w:webHidden/>
           </w:rPr>
-          <w:instrText xml:space="preserve"> PAGEREF _Toc243865253 \h </w:instrText>
+          <w:instrText xml:space="preserve"> PAGEREF _Toc244028981 \h </w:instrText>
         </w:r>
         <w:r>
           <w:rPr>
@@ -6933,7 +7007,7 @@
             <w:noProof/>
             <w:webHidden/>
           </w:rPr>
-          <w:t>81</w:t>
+          <w:t>83</w:t>
         </w:r>
         <w:r>
           <w:rPr>
@@ -6960,7 +7034,7 @@
           <w14:ligatures w14:val="standardContextual"/>
         </w:rPr>
       </w:pPr>
-      <w:hyperlink w:anchor="_Toc243865254" w:history="1">
+      <w:hyperlink w:anchor="_Toc244028982" w:history="1">
         <w:r>
           <w:rPr>
             <w:rStyle w:val="Hipervnculo"/>
@@ -6987,7 +7061,7 @@
             <w:noProof/>
             <w:webHidden/>
           </w:rPr>
-          <w:instrText xml:space="preserve"> PAGEREF _Toc243865254 \h </w:instrText>
+          <w:instrText xml:space="preserve"> PAGEREF _Toc244028982 \h </w:instrText>
         </w:r>
         <w:r>
           <w:rPr>
@@ -7007,7 +7081,7 @@
             <w:noProof/>
             <w:webHidden/>
           </w:rPr>
-          <w:t>81</w:t>
+          <w:t>83</w:t>
         </w:r>
         <w:r>
           <w:rPr>
@@ -7034,7 +7108,7 @@
           <w14:ligatures w14:val="standardContextual"/>
         </w:rPr>
       </w:pPr>
-      <w:hyperlink w:anchor="_Toc243865255" w:history="1">
+      <w:hyperlink w:anchor="_Toc244028983" w:history="1">
         <w:r>
           <w:rPr>
             <w:rStyle w:val="Hipervnculo"/>
@@ -7061,7 +7135,7 @@
             <w:noProof/>
             <w:webHidden/>
           </w:rPr>
-          <w:instrText xml:space="preserve"> PAGEREF _Toc243865255 \h </w:instrText>
+          <w:instrText xml:space="preserve"> PAGEREF _Toc244028983 \h </w:instrText>
         </w:r>
         <w:r>
           <w:rPr>
@@ -7081,7 +7155,7 @@
             <w:noProof/>
             <w:webHidden/>
           </w:rPr>
-          <w:t>82</w:t>
+          <w:t>84</w:t>
         </w:r>
         <w:r>
           <w:rPr>
@@ -7108,7 +7182,7 @@
           <w14:ligatures w14:val="standardContextual"/>
         </w:rPr>
       </w:pPr>
-      <w:hyperlink w:anchor="_Toc243865256" w:history="1">
+      <w:hyperlink w:anchor="_Toc244028984" w:history="1">
         <w:r>
           <w:rPr>
             <w:rStyle w:val="Hipervnculo"/>
@@ -7135,7 +7209,7 @@
             <w:noProof/>
             <w:webHidden/>
           </w:rPr>
-          <w:instrText xml:space="preserve"> PAGEREF _Toc243865256 \h </w:instrText>
+          <w:instrText xml:space="preserve"> PAGEREF _Toc244028984 \h </w:instrText>
         </w:r>
         <w:r>
           <w:rPr>
@@ -7155,7 +7229,7 @@
             <w:noProof/>
             <w:webHidden/>
           </w:rPr>
-          <w:t>83</w:t>
+          <w:t>85</w:t>
         </w:r>
         <w:r>
           <w:rPr>
@@ -7182,7 +7256,7 @@
           <w14:ligatures w14:val="standardContextual"/>
         </w:rPr>
       </w:pPr>
-      <w:hyperlink w:anchor="_Toc243865257" w:history="1">
+      <w:hyperlink w:anchor="_Toc244028985" w:history="1">
         <w:r>
           <w:rPr>
             <w:rStyle w:val="Hipervnculo"/>
@@ -7209,7 +7283,7 @@
             <w:noProof/>
             <w:webHidden/>
           </w:rPr>
-          <w:instrText xml:space="preserve"> PAGEREF _Toc243865257 \h </w:instrText>
+          <w:instrText xml:space="preserve"> PAGEREF _Toc244028985 \h </w:instrText>
         </w:r>
         <w:r>
           <w:rPr>
@@ -7229,7 +7303,7 @@
             <w:noProof/>
             <w:webHidden/>
           </w:rPr>
-          <w:t>83</w:t>
+          <w:t>85</w:t>
         </w:r>
         <w:r>
           <w:rPr>
@@ -7256,7 +7330,7 @@
           <w14:ligatures w14:val="standardContextual"/>
         </w:rPr>
       </w:pPr>
-      <w:hyperlink w:anchor="_Toc243865258" w:history="1">
+      <w:hyperlink w:anchor="_Toc244028986" w:history="1">
         <w:r>
           <w:rPr>
             <w:rStyle w:val="Hipervnculo"/>
@@ -7283,7 +7357,7 @@
             <w:noProof/>
             <w:webHidden/>
           </w:rPr>
-          <w:instrText xml:space="preserve"> PAGEREF _Toc243865258 \h </w:instrText>
+          <w:instrText xml:space="preserve"> PAGEREF _Toc244028986 \h </w:instrText>
         </w:r>
         <w:r>
           <w:rPr>
@@ -7303,7 +7377,7 @@
             <w:noProof/>
             <w:webHidden/>
           </w:rPr>
-          <w:t>84</w:t>
+          <w:t>86</w:t>
         </w:r>
         <w:r>
           <w:rPr>
@@ -7330,7 +7404,7 @@
           <w14:ligatures w14:val="standardContextual"/>
         </w:rPr>
       </w:pPr>
-      <w:hyperlink w:anchor="_Toc243865259" w:history="1">
+      <w:hyperlink w:anchor="_Toc244028987" w:history="1">
         <w:r>
           <w:rPr>
             <w:rStyle w:val="Hipervnculo"/>
@@ -7357,7 +7431,7 @@
             <w:noProof/>
             <w:webHidden/>
           </w:rPr>
-          <w:instrText xml:space="preserve"> PAGEREF _Toc243865259 \h </w:instrText>
+          <w:instrText xml:space="preserve"> PAGEREF _Toc244028987 \h </w:instrText>
         </w:r>
         <w:r>
           <w:rPr>
@@ -7377,7 +7451,7 @@
             <w:noProof/>
             <w:webHidden/>
           </w:rPr>
-          <w:t>84</w:t>
+          <w:t>86</w:t>
         </w:r>
         <w:r>
           <w:rPr>
@@ -7404,7 +7478,7 @@
           <w14:ligatures w14:val="standardContextual"/>
         </w:rPr>
       </w:pPr>
-      <w:hyperlink w:anchor="_Toc243865260" w:history="1">
+      <w:hyperlink w:anchor="_Toc244028988" w:history="1">
         <w:r>
           <w:rPr>
             <w:rStyle w:val="Hipervnculo"/>
@@ -7431,7 +7505,7 @@
             <w:noProof/>
             <w:webHidden/>
           </w:rPr>
-          <w:instrText xml:space="preserve"> PAGEREF _Toc243865260 \h </w:instrText>
+          <w:instrText xml:space="preserve"> PAGEREF _Toc244028988 \h </w:instrText>
         </w:r>
         <w:r>
           <w:rPr>
@@ -7451,7 +7525,7 @@
             <w:noProof/>
             <w:webHidden/>
           </w:rPr>
-          <w:t>85</w:t>
+          <w:t>87</w:t>
         </w:r>
         <w:r>
           <w:rPr>
@@ -7478,7 +7552,7 @@
           <w14:ligatures w14:val="standardContextual"/>
         </w:rPr>
       </w:pPr>
-      <w:hyperlink w:anchor="_Toc243865261" w:history="1">
+      <w:hyperlink w:anchor="_Toc244028989" w:history="1">
         <w:r>
           <w:rPr>
             <w:rStyle w:val="Hipervnculo"/>
@@ -7505,7 +7579,7 @@
             <w:noProof/>
             <w:webHidden/>
           </w:rPr>
-          <w:instrText xml:space="preserve"> PAGEREF _Toc243865261 \h </w:instrText>
+          <w:instrText xml:space="preserve"> PAGEREF _Toc244028989 \h </w:instrText>
         </w:r>
         <w:r>
           <w:rPr>
@@ -7525,7 +7599,7 @@
             <w:noProof/>
             <w:webHidden/>
           </w:rPr>
-          <w:t>86</w:t>
+          <w:t>88</w:t>
         </w:r>
         <w:r>
           <w:rPr>
@@ -7552,7 +7626,7 @@
           <w14:ligatures w14:val="standardContextual"/>
         </w:rPr>
       </w:pPr>
-      <w:hyperlink w:anchor="_Toc243865262" w:history="1">
+      <w:hyperlink w:anchor="_Toc244028990" w:history="1">
         <w:r>
           <w:rPr>
             <w:rStyle w:val="Hipervnculo"/>
@@ -7579,7 +7653,7 @@
             <w:noProof/>
             <w:webHidden/>
           </w:rPr>
-          <w:instrText xml:space="preserve"> PAGEREF _Toc243865262 \h </w:instrText>
+          <w:instrText xml:space="preserve"> PAGEREF _Toc244028990 \h </w:instrText>
         </w:r>
         <w:r>
           <w:rPr>
@@ -7599,7 +7673,7 @@
             <w:noProof/>
             <w:webHidden/>
           </w:rPr>
-          <w:t>90</w:t>
+          <w:t>92</w:t>
         </w:r>
         <w:r>
           <w:rPr>
@@ -7626,7 +7700,7 @@
           <w14:ligatures w14:val="standardContextual"/>
         </w:rPr>
       </w:pPr>
-      <w:hyperlink w:anchor="_Toc243865263" w:history="1">
+      <w:hyperlink w:anchor="_Toc244028991" w:history="1">
         <w:r>
           <w:rPr>
             <w:rStyle w:val="Hipervnculo"/>
@@ -7653,7 +7727,7 @@
             <w:noProof/>
             <w:webHidden/>
           </w:rPr>
-          <w:instrText xml:space="preserve"> PAGEREF _Toc243865263 \h </w:instrText>
+          <w:instrText xml:space="preserve"> PAGEREF _Toc244028991 \h </w:instrText>
         </w:r>
         <w:r>
           <w:rPr>
@@ -7673,7 +7747,7 @@
             <w:noProof/>
             <w:webHidden/>
           </w:rPr>
-          <w:t>90</w:t>
+          <w:t>92</w:t>
         </w:r>
         <w:r>
           <w:rPr>
@@ -7700,7 +7774,7 @@
           <w14:ligatures w14:val="standardContextual"/>
         </w:rPr>
       </w:pPr>
-      <w:hyperlink w:anchor="_Toc243865264" w:history="1">
+      <w:hyperlink w:anchor="_Toc244028992" w:history="1">
         <w:r>
           <w:rPr>
             <w:rStyle w:val="Hipervnculo"/>
@@ -7727,7 +7801,7 @@
             <w:noProof/>
             <w:webHidden/>
           </w:rPr>
-          <w:instrText xml:space="preserve"> PAGEREF _Toc243865264 \h </w:instrText>
+          <w:instrText xml:space="preserve"> PAGEREF _Toc244028992 \h </w:instrText>
         </w:r>
         <w:r>
           <w:rPr>
@@ -7747,7 +7821,7 @@
             <w:noProof/>
             <w:webHidden/>
           </w:rPr>
-          <w:t>90</w:t>
+          <w:t>92</w:t>
         </w:r>
         <w:r>
           <w:rPr>
@@ -8442,7 +8516,7 @@
       <w:r>
         <w:br w:type="page"/>
       </w:r>
-      <w:bookmarkStart w:id="1" w:name="_Toc243865165"/>
+      <w:bookmarkStart w:id="1" w:name="_Toc244028791"/>
       <w:r>
         <w:lastRenderedPageBreak/>
         <w:t>1. Introducción y objetivos</w:t>
@@ -8453,7 +8527,7 @@
       <w:pPr>
         <w:pStyle w:val="Ttulo2"/>
       </w:pPr>
-      <w:bookmarkStart w:id="2" w:name="_Toc243865166"/>
+      <w:bookmarkStart w:id="2" w:name="_Toc244028792"/>
       <w:r>
         <w:t>1.1. Contexto, motivación y justificación</w:t>
       </w:r>
@@ -8516,7 +8590,7 @@
       <w:pPr>
         <w:pStyle w:val="Ttulo2"/>
       </w:pPr>
-      <w:bookmarkStart w:id="3" w:name="_Toc243865167"/>
+      <w:bookmarkStart w:id="3" w:name="_Toc244028793"/>
       <w:r>
         <w:t>1.2. Objetivos generales y específicos</w:t>
       </w:r>
@@ -8578,7 +8652,7 @@
       <w:pPr>
         <w:pStyle w:val="Ttulo2"/>
       </w:pPr>
-      <w:bookmarkStart w:id="4" w:name="_Toc243865168"/>
+      <w:bookmarkStart w:id="4" w:name="_Toc244028794"/>
       <w:r>
         <w:t>1.3. Alcance, usuarios y limitaciones</w:t>
       </w:r>
@@ -8633,7 +8707,7 @@
         <w:pStyle w:val="Ttulo1"/>
         <w:pageBreakBefore/>
       </w:pPr>
-      <w:bookmarkStart w:id="5" w:name="_Toc243865169"/>
+      <w:bookmarkStart w:id="5" w:name="_Toc244028795"/>
       <w:r>
         <w:lastRenderedPageBreak/>
         <w:t>2. Marco teórico y estado del arte</w:t>
@@ -8644,7 +8718,7 @@
       <w:pPr>
         <w:pStyle w:val="Ttulo2"/>
       </w:pPr>
-      <w:bookmarkStart w:id="6" w:name="_Toc243865170"/>
+      <w:bookmarkStart w:id="6" w:name="_Toc244028796"/>
       <w:r>
         <w:t>2.1. Necesidades hídricas y gestión eficiente del riego</w:t>
       </w:r>
@@ -8712,7 +8786,7 @@
       <w:pPr>
         <w:pStyle w:val="Ttulo2"/>
       </w:pPr>
-      <w:bookmarkStart w:id="7" w:name="_Toc243865171"/>
+      <w:bookmarkStart w:id="7" w:name="_Toc244028797"/>
       <w:r>
         <w:t>2.2. Agricultura de precisión y aprendizaje automático</w:t>
       </w:r>
@@ -8777,7 +8851,7 @@
       <w:pPr>
         <w:pStyle w:val="Ttulo2"/>
       </w:pPr>
-      <w:bookmarkStart w:id="8" w:name="_Toc243865172"/>
+      <w:bookmarkStart w:id="8" w:name="_Toc244028798"/>
       <w:r>
         <w:t>2.3. Sistemas inteligentes de apoyo a la decisión</w:t>
       </w:r>
@@ -8841,7 +8915,7 @@
         <w:pStyle w:val="Ttulo1"/>
         <w:pageBreakBefore/>
       </w:pPr>
-      <w:bookmarkStart w:id="9" w:name="_Toc243865173"/>
+      <w:bookmarkStart w:id="9" w:name="_Toc244028799"/>
       <w:r>
         <w:lastRenderedPageBreak/>
         <w:t>3. Metodología y arquitectura del sistema</w:t>
@@ -8852,7 +8926,7 @@
       <w:pPr>
         <w:pStyle w:val="Ttulo2"/>
       </w:pPr>
-      <w:bookmarkStart w:id="10" w:name="_Toc243865174"/>
+      <w:bookmarkStart w:id="10" w:name="_Toc244028800"/>
       <w:r>
         <w:t>3.1. Fuentes, variables y calidad de los datos</w:t>
       </w:r>
@@ -8872,7 +8946,7 @@
       <w:pPr>
         <w:pStyle w:val="Ttulo3"/>
       </w:pPr>
-      <w:bookmarkStart w:id="11" w:name="_Toc243865175"/>
+      <w:bookmarkStart w:id="11" w:name="_Toc244028801"/>
       <w:r>
         <w:rPr>
           <w:sz w:val="24"/>
@@ -9544,7 +9618,7 @@
       <w:pPr>
         <w:pStyle w:val="Ttulo3"/>
       </w:pPr>
-      <w:bookmarkStart w:id="13" w:name="_Toc243865176"/>
+      <w:bookmarkStart w:id="13" w:name="_Toc244028802"/>
       <w:r>
         <w:rPr>
           <w:sz w:val="24"/>
@@ -10287,7 +10361,7 @@
       <w:pPr>
         <w:pStyle w:val="Ttulo3"/>
       </w:pPr>
-      <w:bookmarkStart w:id="15" w:name="_Toc243865177"/>
+      <w:bookmarkStart w:id="15" w:name="_Toc244028803"/>
       <w:r>
         <w:rPr>
           <w:sz w:val="24"/>
@@ -10396,7 +10470,7 @@
       <w:pPr>
         <w:pStyle w:val="Ttulo3"/>
       </w:pPr>
-      <w:bookmarkStart w:id="16" w:name="_Toc243865178"/>
+      <w:bookmarkStart w:id="16" w:name="_Toc244028804"/>
       <w:r>
         <w:rPr>
           <w:sz w:val="24"/>
@@ -10420,7 +10494,7 @@
       <w:pPr>
         <w:pStyle w:val="Ttulo2"/>
       </w:pPr>
-      <w:bookmarkStart w:id="17" w:name="_Toc243865179"/>
+      <w:bookmarkStart w:id="17" w:name="_Toc244028805"/>
       <w:r>
         <w:t>3.2. Arquitectura, tecnologías y flujo de información</w:t>
       </w:r>
@@ -10495,7 +10569,7 @@
       <w:pPr>
         <w:pStyle w:val="Ttulo3"/>
       </w:pPr>
-      <w:bookmarkStart w:id="19" w:name="_Toc243865180"/>
+      <w:bookmarkStart w:id="19" w:name="_Toc244028806"/>
       <w:r>
         <w:rPr>
           <w:sz w:val="24"/>
@@ -10632,7 +10706,7 @@
       <w:pPr>
         <w:pStyle w:val="Ttulo3"/>
       </w:pPr>
-      <w:bookmarkStart w:id="20" w:name="_Toc243865181"/>
+      <w:bookmarkStart w:id="20" w:name="_Toc244028807"/>
       <w:r>
         <w:rPr>
           <w:sz w:val="24"/>
@@ -11642,7 +11716,7 @@
       <w:pPr>
         <w:pStyle w:val="Ttulo3"/>
       </w:pPr>
-      <w:bookmarkStart w:id="22" w:name="_Toc243865182"/>
+      <w:bookmarkStart w:id="22" w:name="_Toc244028808"/>
       <w:r>
         <w:rPr>
           <w:sz w:val="24"/>
@@ -11665,7 +11739,7 @@
       <w:pPr>
         <w:pStyle w:val="Ttulo3"/>
       </w:pPr>
-      <w:bookmarkStart w:id="23" w:name="_Toc243865183"/>
+      <w:bookmarkStart w:id="23" w:name="_Toc244028809"/>
       <w:r>
         <w:rPr>
           <w:sz w:val="24"/>
@@ -11689,7 +11763,7 @@
       <w:pPr>
         <w:pStyle w:val="Ttulo2"/>
       </w:pPr>
-      <w:bookmarkStart w:id="24" w:name="_Toc243865184"/>
+      <w:bookmarkStart w:id="24" w:name="_Toc244028810"/>
       <w:r>
         <w:t>3.3. Planificación y organización del proyecto</w:t>
       </w:r>
@@ -12334,7 +12408,7 @@
         <w:pStyle w:val="Ttulo1"/>
         <w:pageBreakBefore/>
       </w:pPr>
-      <w:bookmarkStart w:id="26" w:name="_Toc243865185"/>
+      <w:bookmarkStart w:id="26" w:name="_Toc244028811"/>
       <w:r>
         <w:lastRenderedPageBreak/>
         <w:t>4. Procesamiento de datos y aprendizaje automático</w:t>
@@ -12345,7 +12419,7 @@
       <w:pPr>
         <w:pStyle w:val="Ttulo2"/>
       </w:pPr>
-      <w:bookmarkStart w:id="27" w:name="_Toc243865186"/>
+      <w:bookmarkStart w:id="27" w:name="_Toc244028913"/>
       <w:r>
         <w:t>4.1. Extracción, transformación y almacenamiento de datos</w:t>
       </w:r>
@@ -12428,7 +12502,7 @@
       <w:pPr>
         <w:pStyle w:val="Ttulo3"/>
       </w:pPr>
-      <w:bookmarkStart w:id="29" w:name="_Toc243865187"/>
+      <w:bookmarkStart w:id="29" w:name="_Toc244028914"/>
       <w:r>
         <w:rPr>
           <w:sz w:val="24"/>
@@ -13017,7 +13091,7 @@
       <w:pPr>
         <w:pStyle w:val="Ttulo3"/>
       </w:pPr>
-      <w:bookmarkStart w:id="31" w:name="_Toc243865188"/>
+      <w:bookmarkStart w:id="31" w:name="_Toc244028915"/>
       <w:r>
         <w:rPr>
           <w:sz w:val="24"/>
@@ -13487,7 +13561,7 @@
       <w:pPr>
         <w:pStyle w:val="Ttulo3"/>
       </w:pPr>
-      <w:bookmarkStart w:id="33" w:name="_Toc243865189"/>
+      <w:bookmarkStart w:id="33" w:name="_Toc244028916"/>
       <w:r>
         <w:rPr>
           <w:sz w:val="24"/>
@@ -14273,7 +14347,7 @@
       <w:pPr>
         <w:pStyle w:val="Ttulo3"/>
       </w:pPr>
-      <w:bookmarkStart w:id="35" w:name="_Toc243865190"/>
+      <w:bookmarkStart w:id="35" w:name="_Toc244028917"/>
       <w:r>
         <w:rPr>
           <w:sz w:val="24"/>
@@ -14349,7 +14423,7 @@
       <w:pPr>
         <w:pStyle w:val="Ttulo3"/>
       </w:pPr>
-      <w:bookmarkStart w:id="36" w:name="_Toc243865191"/>
+      <w:bookmarkStart w:id="36" w:name="_Toc244028918"/>
       <w:r>
         <w:rPr>
           <w:sz w:val="24"/>
@@ -14498,7 +14572,7 @@
       <w:pPr>
         <w:pStyle w:val="Ttulo3"/>
       </w:pPr>
-      <w:bookmarkStart w:id="37" w:name="_Toc243865192"/>
+      <w:bookmarkStart w:id="37" w:name="_Toc244028919"/>
       <w:r>
         <w:rPr>
           <w:sz w:val="24"/>
@@ -17117,7 +17191,7 @@
       <w:pPr>
         <w:pStyle w:val="Ttulo3"/>
       </w:pPr>
-      <w:bookmarkStart w:id="42" w:name="_Toc243865193"/>
+      <w:bookmarkStart w:id="42" w:name="_Toc244028920"/>
       <w:r>
         <w:rPr>
           <w:sz w:val="24"/>
@@ -19108,7 +19182,7 @@
       <w:pPr>
         <w:pStyle w:val="Ttulo3"/>
       </w:pPr>
-      <w:bookmarkStart w:id="44" w:name="_Toc243865194"/>
+      <w:bookmarkStart w:id="44" w:name="_Toc244028921"/>
       <w:r>
         <w:rPr>
           <w:sz w:val="24"/>
@@ -19862,7 +19936,7 @@
       <w:pPr>
         <w:pStyle w:val="Ttulo3"/>
       </w:pPr>
-      <w:bookmarkStart w:id="46" w:name="_Toc243865195"/>
+      <w:bookmarkStart w:id="46" w:name="_Toc244028922"/>
       <w:r>
         <w:rPr>
           <w:sz w:val="24"/>
@@ -19889,7 +19963,7 @@
       <w:pPr>
         <w:pStyle w:val="Ttulo3"/>
       </w:pPr>
-      <w:bookmarkStart w:id="47" w:name="_Toc243865196"/>
+      <w:bookmarkStart w:id="47" w:name="_Toc244028923"/>
       <w:r>
         <w:rPr>
           <w:sz w:val="24"/>
@@ -19943,7 +20017,7 @@
       <w:pPr>
         <w:pStyle w:val="Ttulo3"/>
       </w:pPr>
-      <w:bookmarkStart w:id="48" w:name="_Toc243865197"/>
+      <w:bookmarkStart w:id="48" w:name="_Toc244028924"/>
       <w:r>
         <w:rPr>
           <w:sz w:val="24"/>
@@ -19961,7 +20035,7 @@
       <w:pPr>
         <w:pStyle w:val="Ttulo2"/>
       </w:pPr>
-      <w:bookmarkStart w:id="49" w:name="_Toc243865198"/>
+      <w:bookmarkStart w:id="49" w:name="_Toc244028925"/>
       <w:r>
         <w:t>4.2. Análisis exploratorio y preparación de variables</w:t>
       </w:r>
@@ -19976,7 +20050,7 @@
       <w:pPr>
         <w:pStyle w:val="Ttulo3"/>
       </w:pPr>
-      <w:bookmarkStart w:id="50" w:name="_Toc243865199"/>
+      <w:bookmarkStart w:id="50" w:name="_Toc244028926"/>
       <w:r>
         <w:rPr>
           <w:sz w:val="24"/>
@@ -20513,7 +20587,7 @@
       <w:pPr>
         <w:pStyle w:val="Ttulo3"/>
       </w:pPr>
-      <w:bookmarkStart w:id="53" w:name="_Toc243865200"/>
+      <w:bookmarkStart w:id="53" w:name="_Toc244028927"/>
       <w:r>
         <w:rPr>
           <w:sz w:val="24"/>
@@ -21585,7 +21659,7 @@
       <w:pPr>
         <w:pStyle w:val="Ttulo3"/>
       </w:pPr>
-      <w:bookmarkStart w:id="57" w:name="_Toc243865201"/>
+      <w:bookmarkStart w:id="57" w:name="_Toc244028928"/>
       <w:r>
         <w:rPr>
           <w:sz w:val="24"/>
@@ -21674,7 +21748,7 @@
       <w:pPr>
         <w:pStyle w:val="Ttulo3"/>
       </w:pPr>
-      <w:bookmarkStart w:id="59" w:name="_Toc243865202"/>
+      <w:bookmarkStart w:id="59" w:name="_Toc244028929"/>
       <w:r>
         <w:rPr>
           <w:sz w:val="24"/>
@@ -21757,7 +21831,7 @@
       <w:pPr>
         <w:pStyle w:val="Ttulo3"/>
       </w:pPr>
-      <w:bookmarkStart w:id="60" w:name="_Toc243865203"/>
+      <w:bookmarkStart w:id="60" w:name="_Toc244028930"/>
       <w:r>
         <w:rPr>
           <w:sz w:val="24"/>
@@ -22297,7 +22371,7 @@
       <w:pPr>
         <w:pStyle w:val="Ttulo3"/>
       </w:pPr>
-      <w:bookmarkStart w:id="62" w:name="_Toc243865204"/>
+      <w:bookmarkStart w:id="62" w:name="_Toc244028931"/>
       <w:r>
         <w:rPr>
           <w:sz w:val="24"/>
@@ -22325,7 +22399,7 @@
       <w:pPr>
         <w:pStyle w:val="Ttulo3"/>
       </w:pPr>
-      <w:bookmarkStart w:id="63" w:name="_Toc243865205"/>
+      <w:bookmarkStart w:id="63" w:name="_Toc244028932"/>
       <w:r>
         <w:rPr>
           <w:sz w:val="24"/>
@@ -22441,7 +22515,7 @@
       <w:pPr>
         <w:pStyle w:val="Ttulo2"/>
       </w:pPr>
-      <w:bookmarkStart w:id="64" w:name="_Toc243865206"/>
+      <w:bookmarkStart w:id="64" w:name="_Toc244028933"/>
       <w:r>
         <w:lastRenderedPageBreak/>
         <w:t>4.3. Desarrollo y evaluación del modelo predictivo</w:t>
@@ -22457,7 +22531,7 @@
       <w:pPr>
         <w:pStyle w:val="Ttulo3"/>
       </w:pPr>
-      <w:bookmarkStart w:id="65" w:name="_Toc243865207"/>
+      <w:bookmarkStart w:id="65" w:name="_Toc244028934"/>
       <w:r>
         <w:rPr>
           <w:sz w:val="24"/>
@@ -22485,7 +22559,7 @@
       <w:pPr>
         <w:pStyle w:val="Ttulo3"/>
       </w:pPr>
-      <w:bookmarkStart w:id="66" w:name="_Toc243865208"/>
+      <w:bookmarkStart w:id="66" w:name="_Toc244028935"/>
       <w:r>
         <w:rPr>
           <w:sz w:val="24"/>
@@ -22511,7 +22585,7 @@
       <w:pPr>
         <w:pStyle w:val="Ttulo3"/>
       </w:pPr>
-      <w:bookmarkStart w:id="67" w:name="_Toc243865209"/>
+      <w:bookmarkStart w:id="67" w:name="_Toc244028936"/>
       <w:r>
         <w:rPr>
           <w:sz w:val="24"/>
@@ -22652,7 +22726,7 @@
       <w:pPr>
         <w:pStyle w:val="Ttulo3"/>
       </w:pPr>
-      <w:bookmarkStart w:id="68" w:name="_Toc243865210"/>
+      <w:bookmarkStart w:id="68" w:name="_Toc244028937"/>
       <w:r>
         <w:rPr>
           <w:sz w:val="24"/>
@@ -22670,7 +22744,7 @@
       <w:pPr>
         <w:pStyle w:val="Ttulo3"/>
       </w:pPr>
-      <w:bookmarkStart w:id="69" w:name="_Toc243865211"/>
+      <w:bookmarkStart w:id="69" w:name="_Toc244028938"/>
       <w:r>
         <w:rPr>
           <w:sz w:val="24"/>
@@ -23648,7 +23722,7 @@
       <w:pPr>
         <w:pStyle w:val="Ttulo3"/>
       </w:pPr>
-      <w:bookmarkStart w:id="72" w:name="_Toc243865212"/>
+      <w:bookmarkStart w:id="72" w:name="_Toc244028939"/>
       <w:r>
         <w:rPr>
           <w:sz w:val="24"/>
@@ -24786,7 +24860,7 @@
       <w:pPr>
         <w:pStyle w:val="Ttulo3"/>
       </w:pPr>
-      <w:bookmarkStart w:id="75" w:name="_Toc243865213"/>
+      <w:bookmarkStart w:id="75" w:name="_Toc244028940"/>
       <w:r>
         <w:rPr>
           <w:sz w:val="24"/>
@@ -24814,7 +24888,7 @@
       <w:pPr>
         <w:pStyle w:val="Ttulo3"/>
       </w:pPr>
-      <w:bookmarkStart w:id="76" w:name="_Toc243865214"/>
+      <w:bookmarkStart w:id="76" w:name="_Toc244028941"/>
       <w:r>
         <w:rPr>
           <w:sz w:val="24"/>
@@ -24838,7 +24912,7 @@
       <w:pPr>
         <w:pStyle w:val="Ttulo3"/>
       </w:pPr>
-      <w:bookmarkStart w:id="77" w:name="_Toc243865215"/>
+      <w:bookmarkStart w:id="77" w:name="_Toc244028942"/>
       <w:r>
         <w:rPr>
           <w:sz w:val="24"/>
@@ -24871,7 +24945,7 @@
       <w:pPr>
         <w:pStyle w:val="Ttulo3"/>
       </w:pPr>
-      <w:bookmarkStart w:id="78" w:name="_Toc243865216"/>
+      <w:bookmarkStart w:id="78" w:name="_Toc244028943"/>
       <w:r>
         <w:t>4.3.10. Reentrenamiento con datos de 2026</w:t>
       </w:r>
@@ -25794,7 +25868,7 @@
       <w:pPr>
         <w:pStyle w:val="Ttulo3"/>
       </w:pPr>
-      <w:bookmarkStart w:id="81" w:name="_Toc243865217"/>
+      <w:bookmarkStart w:id="81" w:name="_Toc244028944"/>
       <w:r>
         <w:lastRenderedPageBreak/>
         <w:t>4.3.11. Modelo de ETc para la aplicación</w:t>
@@ -26407,7 +26481,7 @@
       <w:pPr>
         <w:pStyle w:val="Ttulo3"/>
       </w:pPr>
-      <w:bookmarkStart w:id="83" w:name="_Toc243865218"/>
+      <w:bookmarkStart w:id="83" w:name="_Toc244028945"/>
       <w:r>
         <w:t>4.3.12. Explicabilidad de los modelos de árboles</w:t>
       </w:r>
@@ -27233,7 +27307,7 @@
         <w:pageBreakBefore/>
       </w:pPr>
       <w:bookmarkStart w:id="86" w:name="_Toc243495226"/>
-      <w:bookmarkStart w:id="87" w:name="_Toc243865219"/>
+      <w:bookmarkStart w:id="87" w:name="_Toc244028946"/>
       <w:r>
         <w:lastRenderedPageBreak/>
         <w:t>5. Sistema de recomendación y resultados</w:t>
@@ -27250,7 +27324,7 @@
       <w:pPr>
         <w:pStyle w:val="Ttulo2"/>
       </w:pPr>
-      <w:bookmarkStart w:id="88" w:name="_Toc243865220"/>
+      <w:bookmarkStart w:id="88" w:name="_Toc244028947"/>
       <w:r>
         <w:t>5.1. Diseño del sistema de recomendación de riego</w:t>
       </w:r>
@@ -27270,7 +27344,7 @@
       <w:pPr>
         <w:pStyle w:val="Ttulo3"/>
       </w:pPr>
-      <w:bookmarkStart w:id="89" w:name="_Toc243865221"/>
+      <w:bookmarkStart w:id="89" w:name="_Toc244028948"/>
       <w:r>
         <w:rPr>
           <w:sz w:val="24"/>
@@ -27297,7 +27371,7 @@
       <w:pPr>
         <w:pStyle w:val="Ttulo3"/>
       </w:pPr>
-      <w:bookmarkStart w:id="90" w:name="_Toc243865222"/>
+      <w:bookmarkStart w:id="90" w:name="_Toc244028949"/>
       <w:r>
         <w:rPr>
           <w:sz w:val="24"/>
@@ -27382,7 +27456,7 @@
       <w:pPr>
         <w:pStyle w:val="Ttulo3"/>
       </w:pPr>
-      <w:bookmarkStart w:id="92" w:name="_Toc243865223"/>
+      <w:bookmarkStart w:id="92" w:name="_Toc244028950"/>
       <w:r>
         <w:rPr>
           <w:sz w:val="24"/>
@@ -27431,7 +27505,7 @@
       <w:pPr>
         <w:pStyle w:val="Ttulo3"/>
       </w:pPr>
-      <w:bookmarkStart w:id="93" w:name="_Toc243865224"/>
+      <w:bookmarkStart w:id="93" w:name="_Toc244028951"/>
       <w:r>
         <w:rPr>
           <w:sz w:val="24"/>
@@ -28315,7 +28389,7 @@
       <w:pPr>
         <w:pStyle w:val="Ttulo3"/>
       </w:pPr>
-      <w:bookmarkStart w:id="95" w:name="_Toc243865225"/>
+      <w:bookmarkStart w:id="95" w:name="_Toc244028952"/>
       <w:r>
         <w:rPr>
           <w:sz w:val="24"/>
@@ -28338,7 +28412,7 @@
       <w:pPr>
         <w:pStyle w:val="Ttulo3"/>
       </w:pPr>
-      <w:bookmarkStart w:id="96" w:name="_Toc243865226"/>
+      <w:bookmarkStart w:id="96" w:name="_Toc244028953"/>
       <w:r>
         <w:rPr>
           <w:sz w:val="24"/>
@@ -28357,7 +28431,7 @@
       <w:pPr>
         <w:pStyle w:val="Ttulo3"/>
       </w:pPr>
-      <w:bookmarkStart w:id="97" w:name="_Toc243865227"/>
+      <w:bookmarkStart w:id="97" w:name="_Toc244028954"/>
       <w:r>
         <w:t>5.1.7. Integración operativa de ETc y AEMET</w:t>
       </w:r>
@@ -28377,7 +28451,7 @@
       <w:pPr>
         <w:pStyle w:val="Ttulo2"/>
       </w:pPr>
-      <w:bookmarkStart w:id="98" w:name="_Toc243865228"/>
+      <w:bookmarkStart w:id="98" w:name="_Toc244028955"/>
       <w:r>
         <w:t>5.2. Aplicación y visualización de resultados</w:t>
       </w:r>
@@ -28392,7 +28466,7 @@
       <w:pPr>
         <w:pStyle w:val="Ttulo3"/>
       </w:pPr>
-      <w:bookmarkStart w:id="99" w:name="_Toc243865229"/>
+      <w:bookmarkStart w:id="99" w:name="_Toc244028956"/>
       <w:r>
         <w:rPr>
           <w:sz w:val="24"/>
@@ -28419,7 +28493,7 @@
       <w:pPr>
         <w:pStyle w:val="Ttulo3"/>
       </w:pPr>
-      <w:bookmarkStart w:id="100" w:name="_Toc243865230"/>
+      <w:bookmarkStart w:id="100" w:name="_Toc244028957"/>
       <w:r>
         <w:rPr>
           <w:sz w:val="24"/>
@@ -28447,7 +28521,7 @@
       <w:pPr>
         <w:pStyle w:val="Ttulo3"/>
       </w:pPr>
-      <w:bookmarkStart w:id="101" w:name="_Toc243865231"/>
+      <w:bookmarkStart w:id="101" w:name="_Toc244028958"/>
       <w:r>
         <w:rPr>
           <w:sz w:val="24"/>
@@ -30394,7 +30468,7 @@
       <w:pPr>
         <w:pStyle w:val="Ttulo3"/>
       </w:pPr>
-      <w:bookmarkStart w:id="104" w:name="_Toc243865232"/>
+      <w:bookmarkStart w:id="104" w:name="_Toc244028959"/>
       <w:r>
         <w:rPr>
           <w:sz w:val="24"/>
@@ -30428,7 +30502,7 @@
       <w:pPr>
         <w:pStyle w:val="Ttulo3"/>
       </w:pPr>
-      <w:bookmarkStart w:id="105" w:name="_Toc243865233"/>
+      <w:bookmarkStart w:id="105" w:name="_Toc244028960"/>
       <w:r>
         <w:rPr>
           <w:sz w:val="24"/>
@@ -30446,7 +30520,7 @@
       <w:pPr>
         <w:pStyle w:val="Ttulo3"/>
       </w:pPr>
-      <w:bookmarkStart w:id="106" w:name="_Toc243865234"/>
+      <w:bookmarkStart w:id="106" w:name="_Toc244028961"/>
       <w:r>
         <w:rPr>
           <w:sz w:val="24"/>
@@ -30464,7 +30538,7 @@
       <w:pPr>
         <w:pStyle w:val="Ttulo2"/>
       </w:pPr>
-      <w:bookmarkStart w:id="107" w:name="_Toc243865235"/>
+      <w:bookmarkStart w:id="107" w:name="_Toc244028962"/>
       <w:r>
         <w:t>5.3. Validación, resultados y análisis crítico</w:t>
       </w:r>
@@ -30488,7 +30562,7 @@
       <w:pPr>
         <w:pStyle w:val="Ttulo3"/>
       </w:pPr>
-      <w:bookmarkStart w:id="108" w:name="_Toc243865236"/>
+      <w:bookmarkStart w:id="108" w:name="_Toc244028963"/>
       <w:r>
         <w:rPr>
           <w:sz w:val="24"/>
@@ -30511,7 +30585,7 @@
       <w:pPr>
         <w:pStyle w:val="Ttulo3"/>
       </w:pPr>
-      <w:bookmarkStart w:id="109" w:name="_Toc243865237"/>
+      <w:bookmarkStart w:id="109" w:name="_Toc244028964"/>
       <w:r>
         <w:rPr>
           <w:sz w:val="24"/>
@@ -31019,7 +31093,7 @@
       <w:pPr>
         <w:pStyle w:val="Ttulo3"/>
       </w:pPr>
-      <w:bookmarkStart w:id="111" w:name="_Toc243865238"/>
+      <w:bookmarkStart w:id="111" w:name="_Toc244028965"/>
       <w:r>
         <w:rPr>
           <w:sz w:val="24"/>
@@ -31896,7 +31970,7 @@
       <w:pPr>
         <w:pStyle w:val="Ttulo3"/>
       </w:pPr>
-      <w:bookmarkStart w:id="114" w:name="_Toc243865239"/>
+      <w:bookmarkStart w:id="114" w:name="_Toc244028966"/>
       <w:r>
         <w:rPr>
           <w:sz w:val="24"/>
@@ -33000,7 +33074,7 @@
       <w:pPr>
         <w:pStyle w:val="Ttulo3"/>
       </w:pPr>
-      <w:bookmarkStart w:id="117" w:name="_Toc243865240"/>
+      <w:bookmarkStart w:id="117" w:name="_Toc244028967"/>
       <w:r>
         <w:rPr>
           <w:sz w:val="24"/>
@@ -33094,7 +33168,7 @@
       <w:pPr>
         <w:pStyle w:val="Ttulo3"/>
       </w:pPr>
-      <w:bookmarkStart w:id="119" w:name="_Toc243865241"/>
+      <w:bookmarkStart w:id="119" w:name="_Toc244028968"/>
       <w:r>
         <w:rPr>
           <w:sz w:val="24"/>
@@ -33551,7 +33625,7 @@
       <w:pPr>
         <w:pStyle w:val="Ttulo3"/>
       </w:pPr>
-      <w:bookmarkStart w:id="121" w:name="_Toc243865242"/>
+      <w:bookmarkStart w:id="121" w:name="_Toc244028969"/>
       <w:r>
         <w:rPr>
           <w:sz w:val="24"/>
@@ -34643,7 +34717,7 @@
       <w:pPr>
         <w:pStyle w:val="Ttulo3"/>
       </w:pPr>
-      <w:bookmarkStart w:id="123" w:name="_Toc243865243"/>
+      <w:bookmarkStart w:id="123" w:name="_Toc244028970"/>
       <w:r>
         <w:rPr>
           <w:sz w:val="24"/>
@@ -34661,7 +34735,7 @@
       <w:pPr>
         <w:pStyle w:val="Ttulo3"/>
       </w:pPr>
-      <w:bookmarkStart w:id="124" w:name="_Toc243865244"/>
+      <w:bookmarkStart w:id="124" w:name="_Toc244028971"/>
       <w:r>
         <w:rPr>
           <w:sz w:val="24"/>
@@ -34677,7 +34751,7 @@
     </w:p>
     <w:p>
       <w:r>
-        <w:t xml:space="preserve">Los resultados deben leerse, no obstante, con varias cautelas. La primera es que la referencia es la propia SiAR. Un error pequeño frente a ella indica que el sistema reproduce bien un cálculo oficial, no que la dosis sea la adecuada para una parcela concreta, cuyo suelo, marco de plantación, cubierta y estado del cultivo pueden diferir de las hipótesis de la estación. La segunda es que todo se ha evaluado con una estación, un cultivo y una campaña. La ventaja del sistema en los horizontes largos depende de que existan cambios de fase dentro del horizonte, y en un cultivo con un Kc que varíe de forma gradual sería menor. La tercera es que el tramo de prueba, </w:t>
+        <w:t xml:space="preserve">Los resultados deben leerse, no obstante, con varias cautelas. La primera es que la referencia es la propia SiAR. Un error pequeño frente a ella indica que el sistema reproduce bien un cálculo oficial, no que la dosis sea la adecuada para una parcela concreta, cuyo suelo, marco de plantación, cubierta y estado del cultivo pueden diferir de las hipótesis de la estación. La segunda es que la evaluación detallada se concentra en pimiento AL01 durante 2025. La comprobación añadida en coliflor AL01, alfalfa Z06 y alcachofa BA08 muestra transferencia a otros calendarios y regiones, pero cada cultivo aporta una sola campaña de 2026. La ventaja observada no acredita generalización nacional ni estabilidad interanual. La tercera es que el tramo de prueba del piloto, </w:t>
       </w:r>
       <w:r>
         <w:lastRenderedPageBreak/>
@@ -34698,14 +34772,566 @@
       <w:pPr>
         <w:pStyle w:val="Ttulo3"/>
       </w:pPr>
-      <w:bookmarkStart w:id="125" w:name="_Toc243865245"/>
+      <w:bookmarkStart w:id="125" w:name="_Toc244028972"/>
+      <w:r>
+        <w:t>5.3.10. Transferencia temporal a otros cultivos y regiones</w:t>
+      </w:r>
+      <w:bookmarkEnd w:id="125"/>
+    </w:p>
+    <w:p>
+      <w:r>
+        <w:t>La evaluación principal se diseñó sobre el piloto de pimiento AL01 de 2025 y permite analizar con detalle cada regla y cada horizonte. Como comprobación de transferencia, se repitió la simulación diaria con las tres campañas que permanecían activas en octubre de 2026: coliflor en AL01 La Mojonera, alfalfa en Z06 Ejea de los Caballeros y alcachofa en BA08 Don Benito. En cada caso el 80 % cronológicamente inicial se trató como desarrollo y el 20 % final como prueba. La ventana de siete días seleccionada con el piloto se mantuvo fija: no se reajustó por cultivo ni después de observar el tramo de prueba.</w:t>
+      </w:r>
+    </w:p>
+    <w:p>
+      <w:pPr>
+        <w:pStyle w:val="ndicetablaTFM"/>
+      </w:pPr>
+      <w:r>
+        <w:t>Tabla 5.8. Validación temporal multicaso a un día frente a la referencia SiAR.</w:t>
+      </w:r>
+    </w:p>
+    <w:tbl>
+      <w:tblPr>
+        <w:tblStyle w:val="TableNormal"/>
+        <w:tblW w:w="0" w:type="auto"/>
+        <w:jc w:val="center"/>
+        <w:tblInd w:w="0" w:type="dxa"/>
+        <w:tblLayout w:type="fixed"/>
+        <w:tblLook w:val="04A0" w:firstRow="1" w:lastRow="0" w:firstColumn="1" w:lastColumn="0" w:noHBand="0" w:noVBand="1"/>
+      </w:tblPr>
+      <w:tblGrid>
+        <w:gridCol w:w="1928"/>
+        <w:gridCol w:w="1304"/>
+        <w:gridCol w:w="964"/>
+        <w:gridCol w:w="1304"/>
+        <w:gridCol w:w="1757"/>
+        <w:gridCol w:w="1134"/>
+      </w:tblGrid>
+      <w:tr>
+        <w:trPr>
+          <w:tblHeader/>
+          <w:jc w:val="center"/>
+        </w:trPr>
+        <w:tc>
+          <w:tcPr>
+            <w:tcW w:w="1928" w:type="dxa"/>
+            <w:shd w:val="clear" w:color="auto" w:fill="1F4E78"/>
+            <w:vAlign w:val="center"/>
+          </w:tcPr>
+          <w:p>
+            <w:pPr>
+              <w:jc w:val="center"/>
+            </w:pPr>
+            <w:r>
+              <w:rPr>
+                <w:b/>
+                <w:color w:val="FFFFFF"/>
+                <w:sz w:val="15"/>
+              </w:rPr>
+              <w:t>Cultivo y estación</w:t>
+            </w:r>
+          </w:p>
+        </w:tc>
+        <w:tc>
+          <w:tcPr>
+            <w:tcW w:w="1304" w:type="dxa"/>
+            <w:shd w:val="clear" w:color="auto" w:fill="1F4E78"/>
+            <w:vAlign w:val="center"/>
+          </w:tcPr>
+          <w:p>
+            <w:pPr>
+              <w:jc w:val="center"/>
+            </w:pPr>
+            <w:r>
+              <w:rPr>
+                <w:b/>
+                <w:color w:val="FFFFFF"/>
+                <w:sz w:val="15"/>
+              </w:rPr>
+              <w:t>Días comparables</w:t>
+            </w:r>
+          </w:p>
+        </w:tc>
+        <w:tc>
+          <w:tcPr>
+            <w:tcW w:w="964" w:type="dxa"/>
+            <w:shd w:val="clear" w:color="auto" w:fill="1F4E78"/>
+            <w:vAlign w:val="center"/>
+          </w:tcPr>
+          <w:p>
+            <w:pPr>
+              <w:jc w:val="center"/>
+            </w:pPr>
+            <w:r>
+              <w:rPr>
+                <w:b/>
+                <w:color w:val="FFFFFF"/>
+                <w:sz w:val="15"/>
+              </w:rPr>
+              <w:t>Días de prueba</w:t>
+            </w:r>
+          </w:p>
+        </w:tc>
+        <w:tc>
+          <w:tcPr>
+            <w:tcW w:w="1304" w:type="dxa"/>
+            <w:shd w:val="clear" w:color="auto" w:fill="1F4E78"/>
+            <w:vAlign w:val="center"/>
+          </w:tcPr>
+          <w:p>
+            <w:pPr>
+              <w:jc w:val="center"/>
+            </w:pPr>
+            <w:r>
+              <w:rPr>
+                <w:b/>
+                <w:color w:val="FFFFFF"/>
+                <w:sz w:val="15"/>
+              </w:rPr>
+              <w:t>MAE DSS (mm/día)</w:t>
+            </w:r>
+          </w:p>
+        </w:tc>
+        <w:tc>
+          <w:tcPr>
+            <w:tcW w:w="1757" w:type="dxa"/>
+            <w:shd w:val="clear" w:color="auto" w:fill="1F4E78"/>
+            <w:vAlign w:val="center"/>
+          </w:tcPr>
+          <w:p>
+            <w:pPr>
+              <w:jc w:val="center"/>
+            </w:pPr>
+            <w:r>
+              <w:rPr>
+                <w:b/>
+                <w:color w:val="FFFFFF"/>
+                <w:sz w:val="15"/>
+              </w:rPr>
+              <w:t>MAE persistencia (mm/día)</w:t>
+            </w:r>
+          </w:p>
+        </w:tc>
+        <w:tc>
+          <w:tcPr>
+            <w:tcW w:w="1134" w:type="dxa"/>
+            <w:shd w:val="clear" w:color="auto" w:fill="1F4E78"/>
+            <w:vAlign w:val="center"/>
+          </w:tcPr>
+          <w:p>
+            <w:pPr>
+              <w:jc w:val="center"/>
+            </w:pPr>
+            <w:r>
+              <w:rPr>
+                <w:b/>
+                <w:color w:val="FFFFFF"/>
+                <w:sz w:val="15"/>
+              </w:rPr>
+              <w:t>Mejora del MAE</w:t>
+            </w:r>
+          </w:p>
+        </w:tc>
+      </w:tr>
+      <w:tr>
+        <w:trPr>
+          <w:jc w:val="center"/>
+        </w:trPr>
+        <w:tc>
+          <w:tcPr>
+            <w:tcW w:w="1928" w:type="dxa"/>
+            <w:vAlign w:val="center"/>
+          </w:tcPr>
+          <w:p>
+            <w:r>
+              <w:rPr>
+                <w:sz w:val="17"/>
+              </w:rPr>
+              <w:t>Coliflor · AL01</w:t>
+            </w:r>
+          </w:p>
+        </w:tc>
+        <w:tc>
+          <w:tcPr>
+            <w:tcW w:w="1304" w:type="dxa"/>
+            <w:vAlign w:val="center"/>
+          </w:tcPr>
+          <w:p>
+            <w:pPr>
+              <w:jc w:val="center"/>
+            </w:pPr>
+            <w:r>
+              <w:rPr>
+                <w:sz w:val="17"/>
+              </w:rPr>
+              <w:t>146</w:t>
+            </w:r>
+          </w:p>
+        </w:tc>
+        <w:tc>
+          <w:tcPr>
+            <w:tcW w:w="964" w:type="dxa"/>
+            <w:vAlign w:val="center"/>
+          </w:tcPr>
+          <w:p>
+            <w:pPr>
+              <w:jc w:val="center"/>
+            </w:pPr>
+            <w:r>
+              <w:rPr>
+                <w:sz w:val="17"/>
+              </w:rPr>
+              <w:t>30</w:t>
+            </w:r>
+          </w:p>
+        </w:tc>
+        <w:tc>
+          <w:tcPr>
+            <w:tcW w:w="1304" w:type="dxa"/>
+            <w:vAlign w:val="center"/>
+          </w:tcPr>
+          <w:p>
+            <w:pPr>
+              <w:jc w:val="center"/>
+            </w:pPr>
+            <w:r>
+              <w:rPr>
+                <w:b/>
+                <w:sz w:val="17"/>
+              </w:rPr>
+              <w:t>0,689</w:t>
+            </w:r>
+          </w:p>
+        </w:tc>
+        <w:tc>
+          <w:tcPr>
+            <w:tcW w:w="1757" w:type="dxa"/>
+            <w:vAlign w:val="center"/>
+          </w:tcPr>
+          <w:p>
+            <w:pPr>
+              <w:jc w:val="center"/>
+            </w:pPr>
+            <w:r>
+              <w:rPr>
+                <w:sz w:val="17"/>
+              </w:rPr>
+              <w:t>0,787</w:t>
+            </w:r>
+          </w:p>
+        </w:tc>
+        <w:tc>
+          <w:tcPr>
+            <w:tcW w:w="1134" w:type="dxa"/>
+            <w:vAlign w:val="center"/>
+          </w:tcPr>
+          <w:p>
+            <w:pPr>
+              <w:jc w:val="center"/>
+            </w:pPr>
+            <w:r>
+              <w:rPr>
+                <w:sz w:val="17"/>
+              </w:rPr>
+              <w:t>12,5 %</w:t>
+            </w:r>
+          </w:p>
+        </w:tc>
+      </w:tr>
+      <w:tr>
+        <w:trPr>
+          <w:jc w:val="center"/>
+        </w:trPr>
+        <w:tc>
+          <w:tcPr>
+            <w:tcW w:w="1928" w:type="dxa"/>
+            <w:shd w:val="clear" w:color="auto" w:fill="EAF2F8"/>
+            <w:vAlign w:val="center"/>
+          </w:tcPr>
+          <w:p>
+            <w:r>
+              <w:rPr>
+                <w:sz w:val="17"/>
+              </w:rPr>
+              <w:t>Alfalfa · Z06</w:t>
+            </w:r>
+          </w:p>
+        </w:tc>
+        <w:tc>
+          <w:tcPr>
+            <w:tcW w:w="1304" w:type="dxa"/>
+            <w:shd w:val="clear" w:color="auto" w:fill="EAF2F8"/>
+            <w:vAlign w:val="center"/>
+          </w:tcPr>
+          <w:p>
+            <w:pPr>
+              <w:jc w:val="center"/>
+            </w:pPr>
+            <w:r>
+              <w:rPr>
+                <w:sz w:val="17"/>
+              </w:rPr>
+              <w:t>238</w:t>
+            </w:r>
+          </w:p>
+        </w:tc>
+        <w:tc>
+          <w:tcPr>
+            <w:tcW w:w="964" w:type="dxa"/>
+            <w:shd w:val="clear" w:color="auto" w:fill="EAF2F8"/>
+            <w:vAlign w:val="center"/>
+          </w:tcPr>
+          <w:p>
+            <w:pPr>
+              <w:jc w:val="center"/>
+            </w:pPr>
+            <w:r>
+              <w:rPr>
+                <w:sz w:val="17"/>
+              </w:rPr>
+              <w:t>48</w:t>
+            </w:r>
+          </w:p>
+        </w:tc>
+        <w:tc>
+          <w:tcPr>
+            <w:tcW w:w="1304" w:type="dxa"/>
+            <w:shd w:val="clear" w:color="auto" w:fill="EAF2F8"/>
+            <w:vAlign w:val="center"/>
+          </w:tcPr>
+          <w:p>
+            <w:pPr>
+              <w:jc w:val="center"/>
+            </w:pPr>
+            <w:r>
+              <w:rPr>
+                <w:b/>
+                <w:sz w:val="17"/>
+              </w:rPr>
+              <w:t>0,646</w:t>
+            </w:r>
+          </w:p>
+        </w:tc>
+        <w:tc>
+          <w:tcPr>
+            <w:tcW w:w="1757" w:type="dxa"/>
+            <w:shd w:val="clear" w:color="auto" w:fill="EAF2F8"/>
+            <w:vAlign w:val="center"/>
+          </w:tcPr>
+          <w:p>
+            <w:pPr>
+              <w:jc w:val="center"/>
+            </w:pPr>
+            <w:r>
+              <w:rPr>
+                <w:sz w:val="17"/>
+              </w:rPr>
+              <w:t>0,761</w:t>
+            </w:r>
+          </w:p>
+        </w:tc>
+        <w:tc>
+          <w:tcPr>
+            <w:tcW w:w="1134" w:type="dxa"/>
+            <w:shd w:val="clear" w:color="auto" w:fill="EAF2F8"/>
+            <w:vAlign w:val="center"/>
+          </w:tcPr>
+          <w:p>
+            <w:pPr>
+              <w:jc w:val="center"/>
+            </w:pPr>
+            <w:r>
+              <w:rPr>
+                <w:sz w:val="17"/>
+              </w:rPr>
+              <w:t>15,1 %</w:t>
+            </w:r>
+          </w:p>
+        </w:tc>
+      </w:tr>
+      <w:tr>
+        <w:trPr>
+          <w:jc w:val="center"/>
+        </w:trPr>
+        <w:tc>
+          <w:tcPr>
+            <w:tcW w:w="1928" w:type="dxa"/>
+            <w:vAlign w:val="center"/>
+          </w:tcPr>
+          <w:p>
+            <w:r>
+              <w:rPr>
+                <w:sz w:val="17"/>
+              </w:rPr>
+              <w:t>Alcachofa · BA08</w:t>
+            </w:r>
+          </w:p>
+        </w:tc>
+        <w:tc>
+          <w:tcPr>
+            <w:tcW w:w="1304" w:type="dxa"/>
+            <w:vAlign w:val="center"/>
+          </w:tcPr>
+          <w:p>
+            <w:pPr>
+              <w:jc w:val="center"/>
+            </w:pPr>
+            <w:r>
+              <w:rPr>
+                <w:sz w:val="17"/>
+              </w:rPr>
+              <w:t>296</w:t>
+            </w:r>
+          </w:p>
+        </w:tc>
+        <w:tc>
+          <w:tcPr>
+            <w:tcW w:w="964" w:type="dxa"/>
+            <w:vAlign w:val="center"/>
+          </w:tcPr>
+          <w:p>
+            <w:pPr>
+              <w:jc w:val="center"/>
+            </w:pPr>
+            <w:r>
+              <w:rPr>
+                <w:sz w:val="17"/>
+              </w:rPr>
+              <w:t>60</w:t>
+            </w:r>
+          </w:p>
+        </w:tc>
+        <w:tc>
+          <w:tcPr>
+            <w:tcW w:w="1304" w:type="dxa"/>
+            <w:vAlign w:val="center"/>
+          </w:tcPr>
+          <w:p>
+            <w:pPr>
+              <w:jc w:val="center"/>
+            </w:pPr>
+            <w:r>
+              <w:rPr>
+                <w:b/>
+                <w:sz w:val="17"/>
+              </w:rPr>
+              <w:t>0,548</w:t>
+            </w:r>
+          </w:p>
+        </w:tc>
+        <w:tc>
+          <w:tcPr>
+            <w:tcW w:w="1757" w:type="dxa"/>
+            <w:vAlign w:val="center"/>
+          </w:tcPr>
+          <w:p>
+            <w:pPr>
+              <w:jc w:val="center"/>
+            </w:pPr>
+            <w:r>
+              <w:rPr>
+                <w:sz w:val="17"/>
+              </w:rPr>
+              <w:t>0,683</w:t>
+            </w:r>
+          </w:p>
+        </w:tc>
+        <w:tc>
+          <w:tcPr>
+            <w:tcW w:w="1134" w:type="dxa"/>
+            <w:vAlign w:val="center"/>
+          </w:tcPr>
+          <w:p>
+            <w:pPr>
+              <w:jc w:val="center"/>
+            </w:pPr>
+            <w:r>
+              <w:rPr>
+                <w:sz w:val="17"/>
+              </w:rPr>
+              <w:t>19,8 %</w:t>
+            </w:r>
+          </w:p>
+        </w:tc>
+      </w:tr>
+    </w:tbl>
+    <w:p>
+      <w:pPr>
+        <w:keepNext/>
+        <w:jc w:val="center"/>
+      </w:pPr>
       <w:r>
         <w:rPr>
-          <w:sz w:val="24"/>
+          <w:noProof/>
         </w:rPr>
-        <w:t>5.3.10. Reproducibilidad y evidencias</w:t>
-      </w:r>
-      <w:bookmarkEnd w:id="125"/>
+        <w:lastRenderedPageBreak/>
+        <w:drawing>
+          <wp:inline distT="0" distB="0" distL="0" distR="0" wp14:anchorId="087CE7CC" wp14:editId="3AD53FB9">
+            <wp:extent cx="5328000" cy="2854286"/>
+            <wp:effectExtent l="0" t="0" r="0" b="0"/>
+            <wp:docPr id="35" name="Picture 35"/>
+            <wp:cNvGraphicFramePr>
+              <a:graphicFrameLocks xmlns:a="http://schemas.openxmlformats.org/drawingml/2006/main" noChangeAspect="1"/>
+            </wp:cNvGraphicFramePr>
+            <a:graphic xmlns:a="http://schemas.openxmlformats.org/drawingml/2006/main">
+              <a:graphicData uri="http://schemas.openxmlformats.org/drawingml/2006/picture">
+                <pic:pic xmlns:pic="http://schemas.openxmlformats.org/drawingml/2006/picture">
+                  <pic:nvPicPr>
+                    <pic:cNvPr id="0" name="dss_validation_multicaso_5_3.png"/>
+                    <pic:cNvPicPr/>
+                  </pic:nvPicPr>
+                  <pic:blipFill>
+                    <a:blip r:embed="rId26"/>
+                    <a:stretch>
+                      <a:fillRect/>
+                    </a:stretch>
+                  </pic:blipFill>
+                  <pic:spPr>
+                    <a:xfrm>
+                      <a:off x="0" y="0"/>
+                      <a:ext cx="5328000" cy="2854286"/>
+                    </a:xfrm>
+                    <a:prstGeom prst="rect">
+                      <a:avLst/>
+                    </a:prstGeom>
+                  </pic:spPr>
+                </pic:pic>
+              </a:graphicData>
+            </a:graphic>
+          </wp:inline>
+        </w:drawing>
+      </w:r>
+    </w:p>
+    <w:p>
+      <w:pPr>
+        <w:pStyle w:val="ndicefiguraTFM"/>
+      </w:pPr>
+      <w:r>
+        <w:t>Figura 5.6. MAE de prueba del DSS y la persistencia en tres cultivos y regiones de 2026.</w:t>
+      </w:r>
+    </w:p>
+    <w:p>
+      <w:r>
+        <w:t>El tramo conjunto de prueba contiene 138 emisiones. El DSS obtiene un MAE agregado de 0,613 mm/día y un RMSE de 0,936 mm/día, frente a 0,733 y 1,082 mm/día para la persistencia. El MAE medio entre casos es de 0,628 mm/día para el DSS y de 0,744 mm/día para la línea base. La vía física supera a la persistencia en los tres tramos reservados, con mejoras relativas de entre el 12,5 % y el 19,8 %. En desarrollo, sin embargo, la alcachofa presenta un MAE ligeramente peor que la persistencia, 0,237 frente a 0,226 mm/día. Este resultado impide presentar la superioridad como universal y refuerza la necesidad de evaluar por campaña.</w:t>
+      </w:r>
+    </w:p>
+    <w:p>
+      <w:r>
+        <w:t>La ampliación aporta evidencia de transferencia temporal a calendarios y climas distintos, pero conserva tres límites. Primero, la referencia continúa siendo el cálculo de SiAR y no el riego observado. Segundo, cada cultivo aporta una sola campaña de 2026. Tercero, la simulación no puede incorporar predicciones AEMET históricas emitidas antes de cada fecha. Por ello demuestra que el motor reproduce de forma más estable la referencia oficial en estos tres casos, no que optimice el agua aplicada ni que vaya a generalizar a todo el territorio nacional.</w:t>
+      </w:r>
+    </w:p>
+    <w:p>
+      <w:pPr>
+        <w:pStyle w:val="Ttulo3"/>
+        <w:pageBreakBefore/>
+      </w:pPr>
+      <w:bookmarkStart w:id="126" w:name="_Toc244028973"/>
+      <w:r>
+        <w:lastRenderedPageBreak/>
+        <w:t>5.3.11. Reproducibilidad y evidencias</w:t>
+      </w:r>
+      <w:bookmarkEnd w:id="126"/>
     </w:p>
     <w:p>
       <w:r>
@@ -34714,7 +35340,12 @@
     </w:p>
     <w:p>
       <w:r>
-        <w:t>python -m src.analysis.build_xai_4_3</w:t>
+        <w:t>python -m src.analysis.build_validation_5_3</w:t>
+      </w:r>
+    </w:p>
+    <w:p>
+      <w:r>
+        <w:t>python -m src.analysis.build_validation_multicase_5_3</w:t>
       </w:r>
     </w:p>
     <w:p>
@@ -34724,7 +35355,7 @@
         <w:ind w:left="360" w:right="216"/>
       </w:pPr>
       <w:r>
-        <w:t>python -m src.analysis.build_validation_5_3</w:t>
+        <w:t>python -m src.visualization.build_dss_visual</w:t>
       </w:r>
     </w:p>
     <w:p>
@@ -34734,22 +35365,15 @@
         <w:ind w:left="360" w:right="216"/>
       </w:pPr>
       <w:r>
-        <w:t>python -m src.visualization.build_dss_visual</w:t>
-      </w:r>
-    </w:p>
-    <w:p>
-      <w:pPr>
-        <w:shd w:val="clear" w:color="auto" w:fill="F2F2F2"/>
-        <w:spacing w:before="80" w:after="140"/>
-        <w:ind w:left="360" w:right="216"/>
-      </w:pPr>
-      <w:r>
         <w:t>python -m unittest discover -s tests</w:t>
       </w:r>
     </w:p>
     <w:p>
-      <w:r>
-        <w:t>El primer comando genera el informe del DSS de 2025 y sus figuras; el segundo, la Figura 5.1, y el tercero ejecuta las pruebas. Los experimentos ampliados se regeneran con python -m src.models.retrain_cases_2026 y python -m src.models.train_etc_for_dss. La aplicación se abre desde el enlace público o mediante streamlit run src/dss/app_streamlit.py. El motor evaluado en este capítulo no equivale a una validación de la consulta AEMET actual.</w:t>
+      <w:pPr>
+        <w:keepLines/>
+      </w:pPr>
+      <w:r>
+        <w:t>El primer comando produce el informe completo del piloto, sus errores por horizonte, los escenarios y las Figuras 5.3, 5.4 y 5.5. El segundo produce la Tabla 5.8, el informe y el CSV multicaso, además de la Figura 5.6. El tercero genera la Figura 5.1 y el cuarto ejecuta las 105 pruebas automáticas. Los experimentos ampliados se regeneran con python -m src.models.retrain_cases_2026 y python -m src.models.train_etc_for_dss. La aplicación se abre desde el enlace público o mediante streamlit run src/dss/app_streamlit.py. El motor evaluado en este capítulo no equivale a una validación de la consulta AEMET actual.</w:t>
       </w:r>
     </w:p>
     <w:p>
@@ -34757,35 +35381,35 @@
         <w:pStyle w:val="Ttulo1"/>
         <w:pageBreakBefore/>
       </w:pPr>
-      <w:bookmarkStart w:id="126" w:name="_Toc243865246"/>
+      <w:bookmarkStart w:id="127" w:name="_Toc244028974"/>
       <w:r>
         <w:lastRenderedPageBreak/>
         <w:t>6. Conclusiones</w:t>
       </w:r>
-      <w:bookmarkEnd w:id="126"/>
+      <w:bookmarkEnd w:id="127"/>
     </w:p>
     <w:p>
       <w:pPr>
         <w:pStyle w:val="Ttulo2"/>
       </w:pPr>
-      <w:bookmarkStart w:id="127" w:name="_Toc243865247"/>
+      <w:bookmarkStart w:id="128" w:name="_Toc244028975"/>
       <w:r>
         <w:t>6.1. Cumplimiento de objetivos y aportaciones</w:t>
       </w:r>
-      <w:bookmarkEnd w:id="127"/>
+      <w:bookmarkEnd w:id="128"/>
     </w:p>
     <w:p>
       <w:pPr>
         <w:pStyle w:val="Ttulo3"/>
       </w:pPr>
-      <w:bookmarkStart w:id="128" w:name="_Toc243865248"/>
+      <w:bookmarkStart w:id="129" w:name="_Toc244028976"/>
       <w:r>
         <w:rPr>
           <w:sz w:val="24"/>
         </w:rPr>
         <w:t>6.1.1. Valoración de los objetivos</w:t>
       </w:r>
-      <w:bookmarkEnd w:id="128"/>
+      <w:bookmarkEnd w:id="129"/>
     </w:p>
     <w:p>
       <w:r>
@@ -34802,14 +35426,14 @@
         <w:pStyle w:val="ndicetablaTFM"/>
         <w:spacing w:after="120"/>
       </w:pPr>
-      <w:bookmarkStart w:id="129" w:name="idx_tbl_6_1"/>
+      <w:bookmarkStart w:id="130" w:name="idx_tbl_6_1"/>
       <w:r>
         <w:rPr>
           <w:b/>
         </w:rPr>
         <w:t>Tabla 6.1. Grado de cumplimiento de los objetivos específicos.</w:t>
       </w:r>
-      <w:bookmarkEnd w:id="129"/>
+      <w:bookmarkEnd w:id="130"/>
     </w:p>
     <w:tbl>
       <w:tblPr>
@@ -35040,10 +35664,7 @@
           </w:tcPr>
           <w:p>
             <w:r>
-              <w:rPr>
-                <w:sz w:val="18"/>
-              </w:rPr>
-              <w:t>Diseñar un flujo de datos reproducible con calidad y trazabilidad</w:t>
+              <w:t>Tres casos adicionales, pero una sola campaña por cultivo</w:t>
             </w:r>
           </w:p>
         </w:tc>
@@ -35061,10 +35682,7 @@
           </w:tcPr>
           <w:p>
             <w:r>
-              <w:rPr>
-                <w:sz w:val="18"/>
-              </w:rPr>
-              <w:t>Apartado 4.1; capas raw, interim y processed</w:t>
+              <w:t>Que los resultados se generalicen a todo el territorio o a otros años</w:t>
             </w:r>
           </w:p>
         </w:tc>
@@ -35081,14 +35699,8 @@
             <w:vAlign w:val="center"/>
           </w:tcPr>
           <w:p>
-            <w:pPr>
-              <w:jc w:val="center"/>
-            </w:pPr>
-            <w:r>
-              <w:rPr>
-                <w:sz w:val="18"/>
-              </w:rPr>
-              <w:t>Cumplido</w:t>
+            <w:r>
+              <w:t>Ampliación de la evidencia (6.3.1)</w:t>
             </w:r>
           </w:p>
         </w:tc>
@@ -35134,6 +35746,7 @@
               <w:rPr>
                 <w:sz w:val="18"/>
               </w:rPr>
+              <w:lastRenderedPageBreak/>
               <w:t>Realizar el análisis exploratorio y construir variables derivadas</w:t>
             </w:r>
           </w:p>
@@ -35220,7 +35833,6 @@
               <w:rPr>
                 <w:sz w:val="18"/>
               </w:rPr>
-              <w:lastRenderedPageBreak/>
               <w:t>Desarrollar y comparar modelos predictivos</w:t>
             </w:r>
           </w:p>
@@ -35560,61 +36172,59 @@
       <w:pPr>
         <w:pStyle w:val="Ttulo3"/>
       </w:pPr>
-      <w:bookmarkStart w:id="130" w:name="_Toc243865249"/>
+      <w:bookmarkStart w:id="131" w:name="_Toc244028977"/>
       <w:r>
         <w:rPr>
           <w:sz w:val="24"/>
         </w:rPr>
+        <w:lastRenderedPageBreak/>
         <w:t>6.1.2. Aportaciones del trabajo</w:t>
       </w:r>
-      <w:bookmarkEnd w:id="130"/>
-    </w:p>
-    <w:p>
-      <w:r>
-        <w:t xml:space="preserve">La aportación principal es un resultado empírico que no estaba previsto en el anteproyecto. En este piloto, para anticipar la necesidad de riego de un cultivo con calendario definido, separar la estimación en sus dos componentes resultó más eficaz que aumentar la complejidad del modelo. Uno de ellos, la demanda atmosférica, es incierto pero evoluciona de forma gradual; el otro, el </w:t>
-      </w:r>
+      <w:bookmarkEnd w:id="131"/>
+    </w:p>
+    <w:p>
+      <w:r>
+        <w:t>La aportación principal es un resultado empírico que no estaba previsto en el anteproyecto. En este piloto, para anticipar la necesidad de riego de un cultivo con calendario definido, separar la estimación en sus dos componentes resultó más eficaz que aumentar la complejidad del modelo. Uno de ellos, la demanda atmosférica, es incierto pero evoluciona de forma gradual; el otro, el coeficiente de cultivo, cambia de forma brusca pero se conoce de antemano. La vía que multiplica la ET0 media de los siete días anteriores por el Kc del día objetivo reduce el MAE de la recomendación a un día frente a la persistencia en un 7 % en desarrollo y en un 25 % en la prueba, y el RMSE de desarrollo en un 18 %. La diferencia se amplía con la anticipación: a siete días, en el periodo de desarrollo, el error del sistema es de 0,48 mm frente a 0,87 mm de la persistencia, porque se mantiene prácticamente estable a lo largo del horizonte. Donde el método se distingue con más claridad es en los cambios de fase. El 1 de septiembre, cuando el Kc pasa de 1,00 a 0,30, la persistencia se desvía 3,52 mm y el sistema 0,01 mm.</w:t>
+      </w:r>
+    </w:p>
+    <w:p>
+      <w:r>
+        <w:t>La segunda aportación es una comparación temporal reproducible. En el piloto original se midieron persistencia, Ridge, Random Forest, KNN, SVR y XGBoost sobre la referencia calculada por SiAR, sin ET0, ETc ni precipitación efectiva del mismo día entre los predictores. El modelo se eligió antes de abrir la prueba final. La ampliación posterior reentrenó por separado seis combinaciones: persistencia fue elegida en cinco y Ridge en coliflor, donde su MAE final (0,892 mm/día) no superó al de persistencia (0,885). Estas pruebas no indican que un algoritmo complejo mejore de forma general la estimación. La evaluación del método físico de capítulo 5 reutiliza fechas del piloto y no constituye otra prueba independiente.</w:t>
+      </w:r>
+    </w:p>
+    <w:p>
+      <w:r>
+        <w:t>La tercera aportación es de diseño. El motor hace visibles sus limitaciones en la salida. Cada recomendación indica el método que la produjo, las reglas aplicadas, el último dato observado, un nivel de confianza y, cuando está disponible el informe de validación, el error medio para su día del horizonte. Si falta información imprescindible no se emite una dosis; si los datos son antiguos, se conserva la estimación con un aviso y confianza baja. Las filas sin estimación permanecen ausentes, no se convierten en dosis cero, y ninguna dosis emitida resulta negativa. Las pruebas automáticas verifican, además, que la planificación no cambia cuando se alteran los datos posteriores a la fecha de emisión, que es la garantía formal de que el sistema no utiliza información futura.</w:t>
+      </w:r>
+    </w:p>
+    <w:p>
+      <w:r>
+        <w:t>La cuarta aportación es la reproducibilidad. El repositorio conserva los CSV SiAR acotados, los protocolos de modelado y las métricas por caso, el motor y la aplicación pública. Los modelos de necesidad neta del experimento quedan como artefactos locales reproducibles; los seis artefactos pequeños de ETc sí se versionan para su uso en Streamlit. Los módulos de entrenamiento y la suite de pruebas verifican calidad, orden temporal y ausencia de variables del día objetivo.</w:t>
+      </w:r>
+    </w:p>
+    <w:p>
+      <w:pPr>
+        <w:pStyle w:val="Ttulo2"/>
+      </w:pPr>
+      <w:bookmarkStart w:id="132" w:name="_Toc244028978"/>
       <w:r>
         <w:lastRenderedPageBreak/>
-        <w:t>coeficiente de cultivo, cambia de forma brusca pero se conoce de antemano. La vía que multiplica la ET0 media de los siete días anteriores por el Kc del día objetivo reduce el MAE de la recomendación a un día frente a la persistencia en un 7 % en desarrollo y en un 25 % en la prueba, y el RMSE de desarrollo en un 18 %. La diferencia se amplía con la anticipación: a siete días, en el periodo de desarrollo, el error del sistema es de 0,48 mm frente a 0,87 mm de la persistencia, porque se mantiene prácticamente estable a lo largo del horizonte. Donde el método se distingue con más claridad es en los cambios de fase. El 1 de septiembre, cuando el Kc pasa de 1,00 a 0,30, la persistencia se desvía 3,52 mm y el sistema 0,01 mm.</w:t>
-      </w:r>
-    </w:p>
-    <w:p>
-      <w:r>
-        <w:t>La segunda aportación es una comparación temporal reproducible. En el piloto original se midieron persistencia, Ridge, Random Forest, KNN, SVR y XGBoost sobre la referencia calculada por SiAR, sin ET0, ETc ni precipitación efectiva del mismo día entre los predictores. El modelo se eligió antes de abrir la prueba final. La ampliación posterior reentrenó por separado seis combinaciones: persistencia fue elegida en cinco y Ridge en coliflor, donde su MAE final (0,892 mm/día) no superó al de persistencia (0,885). Estas pruebas no indican que un algoritmo complejo mejore de forma general la estimación. La evaluación del método físico de capítulo 5 reutiliza fechas del piloto y no constituye otra prueba independiente.</w:t>
-      </w:r>
-    </w:p>
-    <w:p>
-      <w:r>
-        <w:t>La tercera aportación es de diseño. El motor hace visibles sus limitaciones en la salida. Cada recomendación indica el método que la produjo, las reglas aplicadas, el último dato observado, un nivel de confianza y, cuando está disponible el informe de validación, el error medio para su día del horizonte. Si falta información imprescindible no se emite una dosis; si los datos son antiguos, se conserva la estimación con un aviso y confianza baja. Las filas sin estimación permanecen ausentes, no se convierten en dosis cero, y ninguna dosis emitida resulta negativa. Las pruebas automáticas verifican, además, que la planificación no cambia cuando se alteran los datos posteriores a la fecha de emisión, que es la garantía formal de que el sistema no utiliza información futura.</w:t>
-      </w:r>
-    </w:p>
-    <w:p>
-      <w:r>
-        <w:t>La cuarta aportación es la reproducibilidad. El repositorio conserva los CSV SiAR acotados, los protocolos de modelado y las métricas por caso, el motor y la aplicación pública. Los modelos de necesidad neta del experimento quedan como artefactos locales reproducibles; los seis artefactos pequeños de ETc sí se versionan para su uso en Streamlit. Los módulos de entrenamiento y la suite de pruebas verifican calidad, orden temporal y ausencia de variables del día objetivo.</w:t>
-      </w:r>
-    </w:p>
-    <w:p>
-      <w:pPr>
-        <w:pStyle w:val="Ttulo2"/>
-      </w:pPr>
-      <w:bookmarkStart w:id="131" w:name="_Toc243865250"/>
-      <w:r>
         <w:t>6.2. Limitaciones e impacto del proyecto</w:t>
       </w:r>
-      <w:bookmarkEnd w:id="131"/>
+      <w:bookmarkEnd w:id="132"/>
     </w:p>
     <w:p>
       <w:pPr>
         <w:pStyle w:val="Ttulo3"/>
       </w:pPr>
-      <w:bookmarkStart w:id="132" w:name="_Toc243865251"/>
+      <w:bookmarkStart w:id="133" w:name="_Toc244028979"/>
       <w:r>
         <w:rPr>
           <w:sz w:val="24"/>
         </w:rPr>
         <w:t>6.2.1. Limitaciones y alcance de las conclusiones</w:t>
       </w:r>
-      <w:bookmarkEnd w:id="132"/>
+      <w:bookmarkEnd w:id="133"/>
     </w:p>
     <w:p>
       <w:r>
@@ -35623,13 +36233,12 @@
     </w:p>
     <w:p>
       <w:r>
-        <w:lastRenderedPageBreak/>
         <w:t>La limitación más importante es de validez de constructo. La variable objetivo y la referencia de toda la evaluación es la necesidad neta calculada por SiAR, que aplica la metodología FAO-56 a las condiciones de una estación y a un calendario de cultivo estándar (Allen et al., 1998). Un error pequeño frente a ella demuestra que el sistema reproduce y anticipa bien un cálculo oficial, no que la dosis sea la adecuada para una parcela concreta, cuyo suelo, cubierta, marco de plantación y estado del cultivo pueden diferir de los supuestos de la estación.</w:t>
       </w:r>
     </w:p>
     <w:p>
       <w:r>
-        <w:t>La segunda limitación es de validez externa. La evaluación del DSS del capítulo 5 sigue centrada en pimiento AL01 en 2025. La evaluación predictiva ampliada reúne seis combinaciones de tres estaciones y una o dos campañas, pero cada prueba final pertenece a un tramo temporal concreto de 2026. Coliflor y alcachofa presentan mayor error en prueba que en validación. No se ha demostrado transferencia a otras fincas, sistemas de producción ni años posteriores.</w:t>
+        <w:t>La segunda limitación es de validez externa. La evaluación detallada se concentra en pimiento AL01 durante 2025, aunque se ha añadido una comprobación temporal con coliflor AL01, alfalfa Z06 y alcachofa BA08 en 2026. El DSS supera a la persistencia en los tres tramos finales reservados, pero cada cultivo adicional aporta una sola campaña y no existe una prueba dejando fuera un año completo. Por tanto, la ampliación muestra transferencia a tres calendarios y regiones, pero no demuestra generalización nacional ni estabilidad interanual.</w:t>
       </w:r>
     </w:p>
     <w:p>
@@ -35652,14 +36261,15 @@
         <w:pStyle w:val="ndicetablaTFM"/>
         <w:spacing w:after="120"/>
       </w:pPr>
-      <w:bookmarkStart w:id="133" w:name="idx_tbl_6_2"/>
+      <w:bookmarkStart w:id="134" w:name="idx_tbl_6_2"/>
       <w:r>
         <w:rPr>
           <w:b/>
         </w:rPr>
+        <w:lastRenderedPageBreak/>
         <w:t>Tabla 6.2. Limitaciones del piloto, alcance de las conclusiones y línea de mejora asociada.</w:t>
       </w:r>
-      <w:bookmarkEnd w:id="133"/>
+      <w:bookmarkEnd w:id="134"/>
     </w:p>
     <w:tbl>
       <w:tblPr>
@@ -35840,7 +36450,6 @@
           </w:tcPr>
           <w:p>
             <w:r>
-              <w:lastRenderedPageBreak/>
               <w:t>DSS evaluado en pimiento 2025; modelos ampliados a seis combinaciones</w:t>
             </w:r>
           </w:p>
@@ -36220,14 +36829,14 @@
       <w:pPr>
         <w:pStyle w:val="Ttulo3"/>
       </w:pPr>
-      <w:bookmarkStart w:id="134" w:name="_Toc243865252"/>
+      <w:bookmarkStart w:id="135" w:name="_Toc244028980"/>
       <w:r>
         <w:rPr>
           <w:sz w:val="24"/>
         </w:rPr>
         <w:t>6.2.2. Impacto del proyecto</w:t>
       </w:r>
-      <w:bookmarkEnd w:id="134"/>
+      <w:bookmarkEnd w:id="135"/>
     </w:p>
     <w:p>
       <w:r>
@@ -36236,12 +36845,15 @@
     </w:p>
     <w:p>
       <w:r>
-        <w:t>El primero es una capacidad funcional comprobada. El sistema transforma datos públicos y gratuitos en una dosis diaria y semanal expresada en milímetros y en metros cúbicos por parcela, acompañada de su explicación y sin necesidad de sensores. Su valor práctico se concentra en los cambios de fase. En la semana analizada en el apartado 5.2.3, la persistencia habría planificado 6,77 mm menos de los que necesitó el cultivo, un 18 % de la referencia, justo al entrar en una fase de mayor demanda; el sistema se desvió un 4,9 %. Es el tipo de error que un calendario fijo o la repetición de la última dosis no ponen de manifiesto y que podría producir un déficit si se aplicara sin otros controles; el ejemplo retrospectivo no demuestra que ocurriera en una parcela.</w:t>
-      </w:r>
-    </w:p>
-    <w:p>
+        <w:t xml:space="preserve">El primero es una capacidad funcional comprobada. El sistema transforma datos públicos y gratuitos en una dosis diaria y semanal expresada en milímetros y en metros cúbicos por parcela, acompañada de su explicación y sin necesidad de sensores. Su valor práctico se concentra en los cambios de fase. En la semana analizada en el apartado 5.2.3, la persistencia habría planificado 6,77 mm menos de los que necesitó el cultivo, un 18 % de la referencia, justo al entrar en una fase </w:t>
+      </w:r>
       <w:r>
         <w:lastRenderedPageBreak/>
+        <w:t>de mayor demanda; el sistema se desvió un 4,9 %. Es el tipo de error que un calendario fijo o la repetición de la última dosis no ponen de manifiesto y que podría producir un déficit si se aplicara sin otros controles; el ejemplo retrospectivo no demuestra que ocurriera en una parcela.</w:t>
+      </w:r>
+    </w:p>
+    <w:p>
+      <w:r>
         <w:t>El segundo es un hallazgo que reordena las prioridades de mejora. El análisis de sensibilidad mostró que un error de diez puntos en la eficiencia de la instalación produce una desviación de alrededor del 12 % en la dosis bruta, muy superior al error de estimación de la necesidad neta medido en este trabajo. Para una explotación, caracterizar la eficiencia y la uniformidad de su instalación aportaría más precisión que refinar el modelo de ET0 (Burt et al., 1997). La observación es pertinente también para las políticas de digitalización del regadío (Real Decreto 854/2022, 2022): una herramienta digital solo convierte su precisión en ahorro si conoce la instalación sobre la que se aplica.</w:t>
       </w:r>
     </w:p>
@@ -36259,11 +36871,11 @@
       <w:pPr>
         <w:pStyle w:val="Ttulo2"/>
       </w:pPr>
-      <w:bookmarkStart w:id="135" w:name="_Toc243865253"/>
+      <w:bookmarkStart w:id="136" w:name="_Toc244028981"/>
       <w:r>
         <w:t>6.3. Mejoras y líneas futuras</w:t>
       </w:r>
-      <w:bookmarkEnd w:id="135"/>
+      <w:bookmarkEnd w:id="136"/>
     </w:p>
     <w:p>
       <w:r>
@@ -36274,70 +36886,73 @@
       <w:pPr>
         <w:pStyle w:val="Ttulo3"/>
       </w:pPr>
-      <w:bookmarkStart w:id="136" w:name="_Toc243865254"/>
+      <w:bookmarkStart w:id="137" w:name="_Toc244028982"/>
       <w:r>
         <w:rPr>
           <w:sz w:val="24"/>
         </w:rPr>
         <w:t>6.3.1. Ampliación de la evidencia</w:t>
       </w:r>
-      <w:bookmarkEnd w:id="136"/>
-    </w:p>
-    <w:p>
-      <w:r>
-        <w:t>La primera mejora consiste en ampliar campañas, estaciones y cultivos. El prototipo ya ofrece seis combinaciones en tres estaciones, pero solo entre casos descargados y verificados. La extracción meteorológica admite estación y periodo; las necesidades se aportan con CSV SiAR y metadatos. Falta automatizar un catálogo amplio y contrastar la aplicabilidad agronómica de cada calendario. Con campañas adicionales podrán reservarse bloques completos para medir transferencia temporal y espacial (Roberts et al., 2017).</w:t>
+      <w:bookmarkEnd w:id="137"/>
+    </w:p>
+    <w:p>
+      <w:r>
+        <w:t xml:space="preserve">La primera mejora consiste en ampliar campañas, estaciones y cultivos. El prototipo ya ofrece seis combinaciones en tres estaciones, pero solo entre casos descargados y verificados. La extracción meteorológica admite estación y periodo; las necesidades se aportan con CSV SiAR y metadatos. Falta automatizar un catálogo amplio y contrastar la aplicabilidad agronómica de cada calendario. </w:t>
+      </w:r>
+      <w:r>
+        <w:lastRenderedPageBreak/>
+        <w:t>Con campañas adicionales podrán reservarse bloques completos para medir transferencia temporal y espacial (Roberts et al., 2017).</w:t>
       </w:r>
     </w:p>
     <w:p>
       <w:pPr>
         <w:pStyle w:val="Ttulo3"/>
       </w:pPr>
-      <w:bookmarkStart w:id="137" w:name="_Toc243865255"/>
+      <w:bookmarkStart w:id="138" w:name="_Toc244028983"/>
       <w:r>
         <w:rPr>
           <w:sz w:val="24"/>
         </w:rPr>
+        <w:t>6.3.2. Mejora del motor de recomendación</w:t>
+      </w:r>
+      <w:bookmarkEnd w:id="138"/>
+    </w:p>
+    <w:p>
+      <w:r>
+        <w:t>La prioridad principal para la siguiente iteración es incorporar un balance hídrico real de la parcela. La instrumentación podría combinar sondas capacitivas FDR o TDR para contenido volumétrico y tensiómetros para potencial matricial, instalados a varias profundidades representativas de la zona radicular. Como configuración inicial se propone un registro frecuente y una agregación horaria; Sui (2017) documenta un caso con lectura cada minuto, promedio horario y sensores a tres profundidades. La frecuencia definitiva deberá ajustarse al suelo, cultivo y sistema de riego. La tubería de datos controlaría rango físico, valores ausentes, deriva, conectividad y calibración específica del suelo antes de alimentar el DSS. Junto con capacidad de retención, profundidad radicular, precipitación efectiva y riego realmente aplicado, estas entradas permitirían estimar el agotamiento admisible de FAO-56, decidir no solo cuánto sino cuándo regar y aprovechar la lluvia almacenada (Allen et al., 1998). La telemetría no sustituye la caracterización agronómica ni prueba que una dosis recomendada se haya ejecutado. Cualquier mejora deberá validarse en campo; después podría estudiarse un riego deficitario que concentre el déficit en fases menos sensibles (Fereres &amp; Soriano, 2007).</w:t>
+      </w:r>
+    </w:p>
+    <w:p>
+      <w:r>
+        <w:t>Como complemento espacial, podría evaluarse la teledetección de Copernicus Sentinel-2 para estimar índices de vegetación como NDVI y observar diferencias de vigor dentro de la parcela (Drusch et al., 2012). Estos índices no sustituirían automáticamente el Kc de calendario. Servirían para investigar un Kc dinámico por cultivo y parcela, calibrado frente a sensores, observaciones de campo y ETc de referencia. La nubosidad, la frecuencia de adquisición y la resolución disponible deberían tratarse como fuentes de ausencia e incertidumbre, de modo que el sistema mantuviera la vía agronómica cuando la imagen no fuese representativa.</w:t>
+      </w:r>
+    </w:p>
+    <w:p>
+      <w:r>
+        <w:t xml:space="preserve">La segunda prioridad es anticipar los cambios meteorológicos mediante una ET0 futura validada, especialmente para los días 4 a 7. El motor admite esa entrada, pero la aplicación usa de momento ET0 observada reciente. AEMET aporta lluvia prevista al cálculo actual; no hay emisiones históricas archivadas que permitan evaluar su aportación frente a la lluvia finalmente efectiva. Ese archivo deberá registrar emisión, periodo de validez y observación posterior. Con él se podría evaluar una ET0 derivada de variables pronosticadas o el producto de necesidades previstas de SiAR (Sistema de Información Agroclimática para el Regadío, s. f.), sin confundir productos relacionados con una validación independiente. La sustitución de la vía actual exigiría mejorar el error por horizonte en bloques temporales nuevos. El mismo archivo permitiría modelizar el error local de AEMET mediante dos tareas separadas: clasificación de la ocurrencia de lluvia y regresión de la cantidad observada frente a la prevista. Este posprocesado corregiría </w:t>
+      </w:r>
+      <w:r>
         <w:lastRenderedPageBreak/>
-        <w:t>6.3.2. Mejora del motor de recomendación</w:t>
-      </w:r>
-      <w:bookmarkEnd w:id="137"/>
-    </w:p>
-    <w:p>
-      <w:r>
-        <w:t>La prioridad principal para la siguiente iteración es incorporar un balance hídrico real de la parcela. La instrumentación podría combinar sondas capacitivas FDR o TDR para contenido volumétrico y tensiómetros para potencial matricial, instalados a varias profundidades representativas de la zona radicular. Como configuración inicial se propone un registro frecuente y una agregación horaria; Sui (2017) documenta un caso con lectura cada minuto, promedio horario y sensores a tres profundidades. La frecuencia definitiva deberá ajustarse al suelo, cultivo y sistema de riego. La tubería de datos controlaría rango físico, valores ausentes, deriva, conectividad y calibración específica del suelo antes de alimentar el DSS. Junto con capacidad de retención, profundidad radicular, precipitación efectiva y riego realmente aplicado, estas entradas permitirían estimar el agotamiento admisible de FAO-56, decidir no solo cuánto sino cuándo regar y aprovechar la lluvia almacenada (Allen et al., 1998). La telemetría no sustituye la caracterización agronómica ni prueba que una dosis recomendada se haya ejecutado. Cualquier mejora deberá validarse en campo; después podría estudiarse un riego deficitario que concentre el déficit en fases menos sensibles (Fereres &amp; Soriano, 2007).</w:t>
-      </w:r>
-    </w:p>
-    <w:p>
-      <w:r>
-        <w:t>Como complemento espacial, podría evaluarse la teledetección de Copernicus Sentinel-2 para estimar índices de vegetación como NDVI y observar diferencias de vigor dentro de la parcela (Drusch et al., 2012). Estos índices no sustituirían automáticamente el Kc de calendario. Servirían para investigar un Kc dinámico por cultivo y parcela, calibrado frente a sensores, observaciones de campo y ETc de referencia. La nubosidad, la frecuencia de adquisición y la resolución disponible deberían tratarse como fuentes de ausencia e incertidumbre, de modo que el sistema mantuviera la vía agronómica cuando la imagen no fuese representativa.</w:t>
-      </w:r>
-    </w:p>
-    <w:p>
-      <w:r>
-        <w:t>La segunda prioridad es anticipar los cambios meteorológicos mediante una ET0 futura validada, especialmente para los días 4 a 7. El motor admite esa entrada, pero la aplicación usa de momento ET0 observada reciente. AEMET aporta lluvia prevista al cálculo actual; no hay emisiones históricas archivadas que permitan evaluar su aportación frente a la lluvia finalmente efectiva. Ese archivo deberá registrar emisión, periodo de validez y observación posterior. Con él se podría evaluar una ET0 derivada de variables pronosticadas o el producto de necesidades previstas de SiAR (Sistema de Información Agroclimática para el Regadío, s. f.), sin confundir productos relacionados con una validación independiente. La sustitución de la vía actual exigiría mejorar el error por horizonte en bloques temporales nuevos. El mismo archivo permitiría modelizar el error local de AEMET mediante dos tareas separadas: clasificación de la ocurrencia de lluvia y regresión de la cantidad observada frente a la prevista. Este posprocesado corregiría sesgos locales y cuantificaría la incertidumbre; no sustituiría la predicción oficial. El entrenamiento respetaría la hora de emisión y reservaría bloques temporales posteriores para prueba.</w:t>
-      </w:r>
-    </w:p>
-    <w:p>
-      <w:r>
-        <w:t xml:space="preserve">La tercera prioridad es reevaluar el componente predictivo cuando existan más campañas, telemetría y previsiones archivadas. Los seis modelos de ETc actuales se utilizan como contraste </w:t>
-      </w:r>
-      <w:r>
-        <w:lastRenderedPageBreak/>
-        <w:t>de la vía física y solo pueden determinar la dosis cuando mejoran su MAE de prueba y existe una observación del día anterior. Con más información convendrá ensayar una corrección de la estimación física mediante el residuo entre ET0 × Kc y la referencia, usando únicamente datos disponibles al emitir. La mejora deberá evaluarse en bloques temporales nuevos, sin reutilizar para selección la misma prueba final. Los niveles de confianza actuales, definidos por reglas, podrían reemplazarse por intervalos calibrados (Hyndman &amp; Athanasopoulos, 2021).</w:t>
+        <w:t>sesgos locales y cuantificaría la incertidumbre; no sustituiría la predicción oficial. El entrenamiento respetaría la hora de emisión y reservaría bloques temporales posteriores para prueba.</w:t>
+      </w:r>
+    </w:p>
+    <w:p>
+      <w:r>
+        <w:t>La tercera prioridad es reevaluar el componente predictivo cuando existan más campañas, telemetría y previsiones archivadas. Los seis modelos de ETc actuales se utilizan como contraste de la vía física y solo pueden determinar la dosis cuando mejoran su MAE de prueba y existe una observación del día anterior. Con más información convendrá ensayar una corrección de la estimación física mediante el residuo entre ET0 × Kc y la referencia, usando únicamente datos disponibles al emitir. La mejora deberá evaluarse en bloques temporales nuevos, sin reutilizar para selección la misma prueba final. Los niveles de confianza actuales, definidos por reglas, podrían reemplazarse por intervalos calibrados (Hyndman &amp; Athanasopoulos, 2021).</w:t>
       </w:r>
     </w:p>
     <w:p>
       <w:pPr>
         <w:pStyle w:val="Ttulo3"/>
       </w:pPr>
-      <w:bookmarkStart w:id="138" w:name="_Toc243865256"/>
+      <w:bookmarkStart w:id="139" w:name="_Toc244028984"/>
       <w:r>
         <w:rPr>
           <w:sz w:val="24"/>
         </w:rPr>
         <w:t>6.3.3. Validación en condiciones de uso</w:t>
       </w:r>
-      <w:bookmarkEnd w:id="138"/>
+      <w:bookmarkEnd w:id="139"/>
     </w:p>
     <w:p>
       <w:r>
@@ -36358,22 +36973,22 @@
       <w:pPr>
         <w:pStyle w:val="Ttulo3"/>
       </w:pPr>
-      <w:bookmarkStart w:id="139" w:name="_Toc243865257"/>
+      <w:bookmarkStart w:id="140" w:name="_Toc244028985"/>
       <w:r>
         <w:rPr>
           <w:sz w:val="24"/>
         </w:rPr>
         <w:t>6.3.4. Evolución de la plataforma</w:t>
       </w:r>
-      <w:bookmarkEnd w:id="139"/>
-    </w:p>
-    <w:p>
-      <w:r>
-        <w:t xml:space="preserve">La industrialización debería ser gradual y proporcional al volumen real. Una primera etapa programaría procesos ligeros en Python o funciones gestionadas que conservaran cada respuesta JSON, su hora de emisión y su procedencia en una capa raw inmutable de almacenamiento de objetos. Una segunda capa normalizaría y particionaría los datos en Parquet por fuente, estación y fecha, con catálogo, controles de calidad y trazabilidad. Una base relacional quedaría reservada para usuarios, parcelas y recomendaciones; el histórico analítico se consultaría con DuckDB o Polars mientras el volumen sea moderado. Si una ampliación nacional y multianual exigiera consultas concurrentes, podría incorporarse un motor SQL distribuido como Trino, capaz de consultar formatos de tabla y archivos Parquet sobre almacenamiento de objetos (Trino, s. f.). Esta evolución sigue los principios de un lakehouse sin presentar Apache Hop, Impala, Hue o </w:t>
+      <w:bookmarkEnd w:id="140"/>
+    </w:p>
+    <w:p>
+      <w:r>
+        <w:t xml:space="preserve">La industrialización debería ser gradual y proporcional al volumen real. Una primera etapa programaría procesos ligeros en Python o funciones gestionadas que conservaran cada respuesta JSON, su hora de emisión y su procedencia en una capa raw inmutable de almacenamiento de objetos. Una segunda capa normalizaría y particionaría los datos en Parquet por fuente, estación y fecha, con catálogo, controles de calidad y trazabilidad. Una base relacional quedaría reservada para usuarios, parcelas y recomendaciones; el histórico analítico se consultaría con DuckDB o </w:t>
       </w:r>
       <w:r>
         <w:lastRenderedPageBreak/>
-        <w:t>PySpark como requisitos. El procesamiento distribuido solo se justificaría mediante mediciones de volumen, latencia y coste que demostrasen una limitación del enfoque ligero. La aplicación seguiría necesitando un catálogo agronómico dinámico, operación, control de acceso y persistencia de consultas.</w:t>
+        <w:t>Polars mientras el volumen sea moderado. Si una ampliación nacional y multianual exigiera consultas concurrentes, podría incorporarse un motor SQL distribuido como Trino, capaz de consultar formatos de tabla y archivos Parquet sobre almacenamiento de objetos (Trino, s. f.). Esta evolución sigue los principios de un lakehouse sin presentar Apache Hop, Impala, Hue o PySpark como requisitos. El procesamiento distribuido solo se justificaría mediante mediciones de volumen, latencia y coste que demostrasen una limitación del enfoque ligero. La aplicación seguiría necesitando un catálogo agronómico dinámico, operación, control de acceso y persistencia de consultas.</w:t>
       </w:r>
     </w:p>
     <w:p>
@@ -36385,11 +37000,11 @@
       <w:pPr>
         <w:pStyle w:val="Ttulo3"/>
       </w:pPr>
-      <w:bookmarkStart w:id="140" w:name="_Toc243865258"/>
+      <w:bookmarkStart w:id="141" w:name="_Toc244028986"/>
       <w:r>
         <w:t>6.3.5. Operación, MLOps y control de deriva</w:t>
       </w:r>
-      <w:bookmarkEnd w:id="140"/>
+      <w:bookmarkEnd w:id="141"/>
     </w:p>
     <w:p>
       <w:r>
@@ -36405,35 +37020,35 @@
       <w:pPr>
         <w:pStyle w:val="Ttulo3"/>
       </w:pPr>
-      <w:bookmarkStart w:id="141" w:name="_Toc243865259"/>
+      <w:bookmarkStart w:id="142" w:name="_Toc244028987"/>
       <w:r>
         <w:t>6.3.6. Ciencia abierta y principios FAIR</w:t>
       </w:r>
-      <w:bookmarkEnd w:id="141"/>
-    </w:p>
-    <w:p>
-      <w:r>
-        <w:t>La reutilización académica requiere que cada versión pueda encontrarse, comprenderse y reproducirse. El repositorio incorpora un archivo de citación, licencia para los activos propios, ficha del conjunto, diccionarios de variables, procedencia y comandos de reproducción. Los formatos CSV y JSON, las fechas ISO 8601 y las claves de estación, cultivo y fecha facilitan la interoperabilidad. Estas medidas aplican los principios FAIR sin confundir accesibilidad con apertura irrestricta (Wilkinson et al., 2016).</w:t>
-      </w:r>
-    </w:p>
-    <w:p>
-      <w:r>
-        <w:t xml:space="preserve">Una versión posterior podría depositarse en Zenodo para obtener un DOI, pero solo después de etiquetar una revisión inmutable y comprobar las condiciones de redistribución de SiAR y AEMET. </w:t>
+      <w:bookmarkEnd w:id="142"/>
+    </w:p>
+    <w:p>
+      <w:r>
+        <w:t xml:space="preserve">La reutilización académica requiere que cada versión pueda encontrarse, comprenderse y reproducirse. El repositorio incorpora un archivo de citación, licencia para los activos propios, ficha del conjunto, diccionarios de variables, procedencia y comandos de reproducción. Los formatos CSV y JSON, las fechas ISO 8601 y las claves de estación, cultivo y fecha facilitan la </w:t>
       </w:r>
       <w:r>
         <w:lastRenderedPageBreak/>
-        <w:t>La licencia del código no relicencia los datos de terceros. El depósito debería incluir la memoria, el código, los requisitos, las pruebas, la ficha del conjunto y los metadatos, sin tokens ni respuestas raw cuya redistribución no esté autorizada.</w:t>
+        <w:t>interoperabilidad. Estas medidas aplican los principios FAIR sin confundir accesibilidad con apertura irrestricta (Wilkinson et al., 2016).</w:t>
+      </w:r>
+    </w:p>
+    <w:p>
+      <w:r>
+        <w:t>Una versión posterior podría depositarse en Zenodo para obtener un DOI, pero solo después de etiquetar una revisión inmutable y comprobar las condiciones de redistribución de SiAR y AEMET. La licencia del código no relicencia los datos de terceros. El depósito debería incluir la memoria, el código, los requisitos, las pruebas, la ficha del conjunto y los metadatos, sin tokens ni respuestas raw cuya redistribución no esté autorizada.</w:t>
       </w:r>
     </w:p>
     <w:p>
       <w:pPr>
         <w:pStyle w:val="Ttulo3"/>
       </w:pPr>
-      <w:bookmarkStart w:id="142" w:name="_Toc243865260"/>
+      <w:bookmarkStart w:id="143" w:name="_Toc244028988"/>
       <w:r>
         <w:t>6.3.7. Consideración final</w:t>
       </w:r>
-      <w:bookmarkEnd w:id="142"/>
+      <w:bookmarkEnd w:id="143"/>
     </w:p>
     <w:p>
       <w:r>
@@ -36445,12 +37060,12 @@
         <w:pStyle w:val="Ttulo1"/>
         <w:pageBreakBefore/>
       </w:pPr>
-      <w:bookmarkStart w:id="143" w:name="_Toc243865261"/>
+      <w:bookmarkStart w:id="144" w:name="_Toc244028989"/>
       <w:r>
         <w:lastRenderedPageBreak/>
         <w:t>Referencias bibliográficas</w:t>
       </w:r>
-      <w:bookmarkEnd w:id="143"/>
+      <w:bookmarkEnd w:id="144"/>
     </w:p>
     <w:p>
       <w:pPr>
@@ -36468,7 +37083,7 @@
       <w:r>
         <w:t xml:space="preserve">. Recuperado el 16 de septiembre de 2026, de </w:t>
       </w:r>
-      <w:hyperlink r:id="rId26">
+      <w:hyperlink r:id="rId27">
         <w:r>
           <w:rPr>
             <w:color w:val="0563C1"/>
@@ -36494,7 +37109,7 @@
       <w:r>
         <w:t xml:space="preserve"> (FAO Irrigation and Drainage Paper No. 56). Food and Agriculture Organization of the United Nations. </w:t>
       </w:r>
-      <w:hyperlink r:id="rId27">
+      <w:hyperlink r:id="rId28">
         <w:r>
           <w:rPr>
             <w:color w:val="0563C1"/>
@@ -36520,7 +37135,7 @@
       <w:r>
         <w:t xml:space="preserve">(11), 3758. </w:t>
       </w:r>
-      <w:hyperlink r:id="rId28">
+      <w:hyperlink r:id="rId29">
         <w:r>
           <w:rPr>
             <w:color w:val="0563C1"/>
@@ -36546,7 +37161,7 @@
       <w:r>
         <w:t xml:space="preserve"> (Training manual No. 4). Food and Agriculture Organization of the United Nations. </w:t>
       </w:r>
-      <w:hyperlink r:id="rId29">
+      <w:hyperlink r:id="rId30">
         <w:r>
           <w:rPr>
             <w:color w:val="0563C1"/>
@@ -36572,7 +37187,7 @@
       <w:r>
         <w:t xml:space="preserve">(6), 423–442. </w:t>
       </w:r>
-      <w:hyperlink r:id="rId30">
+      <w:hyperlink r:id="rId31">
         <w:r>
           <w:rPr>
             <w:color w:val="0563C1"/>
@@ -36589,7 +37204,7 @@
       <w:r>
         <w:t xml:space="preserve">Drusch, M., Del Bello, U., Carlier, S., Colin, O., Fernandez, V., Gascon, F., Hoersch, B., Isola, C., Laberinti, P., Martimort, P., Meygret, A., Spoto, F., Sy, O., Marchese, F., &amp; Bargellini, P. (2012). Sentinel-2: ESA's optical high-resolution mission for GMES operational services. Remote Sensing of Environment, 120, 25-36. </w:t>
       </w:r>
-      <w:hyperlink r:id="rId31">
+      <w:hyperlink r:id="rId32">
         <w:r>
           <w:rPr>
             <w:color w:val="0563C1"/>
@@ -36615,7 +37230,7 @@
       <w:r>
         <w:t xml:space="preserve"> (EEA Report No. 12/2021). </w:t>
       </w:r>
-      <w:hyperlink r:id="rId32">
+      <w:hyperlink r:id="rId33">
         <w:r>
           <w:rPr>
             <w:color w:val="0563C1"/>
@@ -36641,7 +37256,7 @@
       <w:r>
         <w:t xml:space="preserve">(2), 147–159. </w:t>
       </w:r>
-      <w:hyperlink r:id="rId33">
+      <w:hyperlink r:id="rId34">
         <w:r>
           <w:rPr>
             <w:color w:val="0563C1"/>
@@ -36667,7 +37282,7 @@
       <w:r>
         <w:t xml:space="preserve">. </w:t>
       </w:r>
-      <w:hyperlink r:id="rId34">
+      <w:hyperlink r:id="rId35">
         <w:r>
           <w:rPr>
             <w:color w:val="0563C1"/>
@@ -36693,7 +37308,7 @@
       <w:r>
         <w:t xml:space="preserve">, 40–50. </w:t>
       </w:r>
-      <w:hyperlink r:id="rId35">
+      <w:hyperlink r:id="rId36">
         <w:r>
           <w:rPr>
             <w:color w:val="0563C1"/>
@@ -36720,7 +37335,7 @@
       <w:r>
         <w:t xml:space="preserve">(5967), 828–831. </w:t>
       </w:r>
-      <w:hyperlink r:id="rId36">
+      <w:hyperlink r:id="rId37">
         <w:r>
           <w:rPr>
             <w:color w:val="0563C1"/>
@@ -36746,7 +37361,7 @@
       <w:r>
         <w:t xml:space="preserve">(2), 281–289. </w:t>
       </w:r>
-      <w:hyperlink r:id="rId37">
+      <w:hyperlink r:id="rId38">
         <w:r>
           <w:rPr>
             <w:color w:val="0563C1"/>
@@ -36772,7 +37387,7 @@
       <w:r>
         <w:t xml:space="preserve"> (3.ª ed.). OTexts. </w:t>
       </w:r>
-      <w:hyperlink r:id="rId38">
+      <w:hyperlink r:id="rId39">
         <w:r>
           <w:rPr>
             <w:color w:val="0563C1"/>
@@ -36798,7 +37413,7 @@
       <w:r>
         <w:t xml:space="preserve"> (H.-O. Pörtner, D. C. Roberts, M. Tignor, E. S. Poloczanska, K. Mintenbeck, A. Alegría, M. Craig, S. Langsdorf, S. Löschke, V. Möller, A. Okem, &amp; B. Rama, Eds.). Cambridge University Press. </w:t>
       </w:r>
-      <w:hyperlink r:id="rId39">
+      <w:hyperlink r:id="rId40">
         <w:r>
           <w:rPr>
             <w:color w:val="0563C1"/>
@@ -36824,7 +37439,7 @@
       <w:r>
         <w:t xml:space="preserve">(8), 2674. </w:t>
       </w:r>
-      <w:hyperlink r:id="rId40">
+      <w:hyperlink r:id="rId41">
         <w:r>
           <w:rPr>
             <w:color w:val="0563C1"/>
@@ -36850,7 +37465,7 @@
       <w:r>
         <w:t xml:space="preserve">(3), 309–331. </w:t>
       </w:r>
-      <w:hyperlink r:id="rId41">
+      <w:hyperlink r:id="rId42">
         <w:r>
           <w:rPr>
             <w:color w:val="0563C1"/>
@@ -36876,7 +37491,7 @@
       <w:r>
         <w:t xml:space="preserve">, 4765–4774. </w:t>
       </w:r>
-      <w:hyperlink r:id="rId42">
+      <w:hyperlink r:id="rId43">
         <w:r>
           <w:rPr>
             <w:color w:val="0563C1"/>
@@ -36902,7 +37517,7 @@
       <w:r>
         <w:t xml:space="preserve">(1), 11–25. </w:t>
       </w:r>
-      <w:hyperlink r:id="rId43">
+      <w:hyperlink r:id="rId44">
         <w:r>
           <w:rPr>
             <w:color w:val="0563C1"/>
@@ -36928,7 +37543,7 @@
       <w:r>
         <w:t xml:space="preserve">. Recuperado el 16 de septiembre de 2026, de </w:t>
       </w:r>
-      <w:hyperlink r:id="rId44">
+      <w:hyperlink r:id="rId45">
         <w:r>
           <w:rPr>
             <w:color w:val="0563C1"/>
@@ -36954,7 +37569,7 @@
       <w:r>
         <w:t xml:space="preserve">. Recuperado el 16 de septiembre de 2026, de </w:t>
       </w:r>
-      <w:hyperlink r:id="rId45">
+      <w:hyperlink r:id="rId46">
         <w:r>
           <w:rPr>
             <w:color w:val="0563C1"/>
@@ -36980,7 +37595,7 @@
       <w:r>
         <w:t xml:space="preserve">, 121–131. </w:t>
       </w:r>
-      <w:hyperlink r:id="rId46">
+      <w:hyperlink r:id="rId47">
         <w:r>
           <w:rPr>
             <w:color w:val="0563C1"/>
@@ -37006,7 +37621,7 @@
       <w:r>
         <w:t xml:space="preserve">(4), 367–378. </w:t>
       </w:r>
-      <w:hyperlink r:id="rId47">
+      <w:hyperlink r:id="rId48">
         <w:r>
           <w:rPr>
             <w:color w:val="0563C1"/>
@@ -37033,7 +37648,7 @@
       <w:r>
         <w:t xml:space="preserve">, 245, de 12 de octubre de 2022, 139046–139055. </w:t>
       </w:r>
-      <w:hyperlink r:id="rId48">
+      <w:hyperlink r:id="rId49">
         <w:r>
           <w:rPr>
             <w:color w:val="0563C1"/>
@@ -37059,7 +37674,7 @@
       <w:r>
         <w:t xml:space="preserve">(8), 913–929. </w:t>
       </w:r>
-      <w:hyperlink r:id="rId49">
+      <w:hyperlink r:id="rId50">
         <w:r>
           <w:rPr>
             <w:color w:val="0563C1"/>
@@ -37085,7 +37700,7 @@
       <w:r>
         <w:t xml:space="preserve">, 165–174. </w:t>
       </w:r>
-      <w:hyperlink r:id="rId50">
+      <w:hyperlink r:id="rId51">
         <w:r>
           <w:rPr>
             <w:color w:val="0563C1"/>
@@ -37111,7 +37726,7 @@
       <w:r>
         <w:t xml:space="preserve">(2), 111–126. </w:t>
       </w:r>
-      <w:hyperlink r:id="rId51">
+      <w:hyperlink r:id="rId52">
         <w:r>
           <w:rPr>
             <w:color w:val="0563C1"/>
@@ -37128,7 +37743,7 @@
       <w:r>
         <w:t xml:space="preserve">Sculley, D., Holt, G., Golovin, D., Davydov, E., Phillips, T., Ebner, D., Chaudhary, V., Young, M., Crespo, J.-F., &amp; Dennison, D. (2015). Hidden technical debt in machine learning systems. Advances in Neural Information Processing Systems, 28, 2503–2511. </w:t>
       </w:r>
-      <w:hyperlink r:id="rId52">
+      <w:hyperlink r:id="rId53">
         <w:r>
           <w:rPr>
             <w:color w:val="0563C1"/>
@@ -37154,7 +37769,7 @@
       <w:r>
         <w:t xml:space="preserve">. </w:t>
       </w:r>
-      <w:hyperlink r:id="rId53">
+      <w:hyperlink r:id="rId54">
         <w:r>
           <w:rPr>
             <w:color w:val="0563C1"/>
@@ -37180,7 +37795,7 @@
       <w:r>
         <w:t xml:space="preserve"> (Versión 1.66.0) [Software]. </w:t>
       </w:r>
-      <w:hyperlink r:id="rId54">
+      <w:hyperlink r:id="rId55">
         <w:r>
           <w:rPr>
             <w:color w:val="0563C1"/>
@@ -37206,7 +37821,7 @@
       <w:r>
         <w:t xml:space="preserve">(3), 16–17. </w:t>
       </w:r>
-      <w:hyperlink r:id="rId55">
+      <w:hyperlink r:id="rId56">
         <w:r>
           <w:rPr>
             <w:color w:val="0563C1"/>
@@ -37232,7 +37847,7 @@
       <w:r>
         <w:t xml:space="preserve">. Recuperado el 25 de octubre de 2026, de </w:t>
       </w:r>
-      <w:hyperlink r:id="rId56">
+      <w:hyperlink r:id="rId57">
         <w:r>
           <w:rPr>
             <w:color w:val="0563C1"/>
@@ -37258,7 +37873,7 @@
       <w:r>
         <w:t xml:space="preserve">(1), 79–82. </w:t>
       </w:r>
-      <w:hyperlink r:id="rId57">
+      <w:hyperlink r:id="rId58">
         <w:r>
           <w:rPr>
             <w:color w:val="0563C1"/>
@@ -37275,7 +37890,7 @@
       <w:r>
         <w:t xml:space="preserve">Wilkinson, M. D., Dumontier, M., Aalbersberg, I. J., Appleton, G., Axton, M., Baak, A., Blomberg, N., Boiten, J.-W., da Silva Santos, L. B., Bourne, P. E., Bouwman, J., Brookes, A. J., Clark, T., Crosas, M., Dillo, I., Dumon, O., Edmunds, S., Evelo, C. T., Finkers, R., ... Mons, B. (2016). The FAIR Guiding Principles for scientific data management and stewardship. Scientific Data, 3, 160018. </w:t>
       </w:r>
-      <w:hyperlink r:id="rId58">
+      <w:hyperlink r:id="rId59">
         <w:r>
           <w:rPr>
             <w:color w:val="0563C1"/>
@@ -37302,7 +37917,7 @@
       <w:r>
         <w:t xml:space="preserve">, 69–80. </w:t>
       </w:r>
-      <w:hyperlink r:id="rId59">
+      <w:hyperlink r:id="rId60">
         <w:r>
           <w:rPr>
             <w:color w:val="0563C1"/>
@@ -37328,7 +37943,7 @@
       <w:r>
         <w:t xml:space="preserve">, 105256. </w:t>
       </w:r>
-      <w:hyperlink r:id="rId60">
+      <w:hyperlink r:id="rId61">
         <w:r>
           <w:rPr>
             <w:color w:val="0563C1"/>
@@ -37354,7 +37969,7 @@
       <w:r>
         <w:t xml:space="preserve">(2–3), 113–132. </w:t>
       </w:r>
-      <w:hyperlink r:id="rId61">
+      <w:hyperlink r:id="rId62">
         <w:r>
           <w:rPr>
             <w:color w:val="0563C1"/>
@@ -37373,18 +37988,18 @@
       <w:pPr>
         <w:pStyle w:val="Ttulo1"/>
       </w:pPr>
-      <w:bookmarkStart w:id="144" w:name="_Toc243865262"/>
+      <w:bookmarkStart w:id="145" w:name="_Toc244028990"/>
       <w:r>
         <w:lastRenderedPageBreak/>
         <w:t>Anexo A. Reproducción y localización de las evidencias</w:t>
       </w:r>
-      <w:bookmarkEnd w:id="144"/>
+      <w:bookmarkEnd w:id="145"/>
     </w:p>
     <w:p>
       <w:r>
         <w:t xml:space="preserve">El repositorio de entrega, con código, CSV de muestra y resultados, es </w:t>
       </w:r>
-      <w:hyperlink r:id="rId62">
+      <w:hyperlink r:id="rId63">
         <w:r>
           <w:rPr>
             <w:color w:val="0563C1"/>
@@ -37396,7 +38011,7 @@
       <w:r>
         <w:t xml:space="preserve"> Procede del trabajo del equipo en </w:t>
       </w:r>
-      <w:hyperlink r:id="rId63">
+      <w:hyperlink r:id="rId64">
         <w:r>
           <w:rPr>
             <w:color w:val="0563C1"/>
@@ -37408,7 +38023,7 @@
       <w:r>
         <w:t xml:space="preserve"> las rutas siguientes corresponden al repositorio de entrega en su rama main. Los ensayos con CSV versionados y las pruebas no requieren credenciales. La aplicación pública está en </w:t>
       </w:r>
-      <w:hyperlink r:id="rId64">
+      <w:hyperlink r:id="rId65">
         <w:r>
           <w:rPr>
             <w:color w:val="0563C1"/>
@@ -37425,21 +38040,21 @@
       <w:pPr>
         <w:pStyle w:val="Ttulo2"/>
       </w:pPr>
-      <w:bookmarkStart w:id="145" w:name="_Toc243865263"/>
+      <w:bookmarkStart w:id="146" w:name="_Toc244028991"/>
       <w:r>
         <w:t>A.1. Archivos principales</w:t>
       </w:r>
-      <w:bookmarkEnd w:id="145"/>
+      <w:bookmarkEnd w:id="146"/>
     </w:p>
     <w:p>
       <w:pPr>
         <w:pStyle w:val="ndicetablaTFM"/>
       </w:pPr>
-      <w:bookmarkStart w:id="146" w:name="idx_tbl_A_1"/>
+      <w:bookmarkStart w:id="147" w:name="idx_tbl_A_1"/>
       <w:r>
         <w:t>Tabla A.1. Rutas del repositorio para reproducir y contrastar los resultados.</w:t>
       </w:r>
-      <w:bookmarkEnd w:id="146"/>
+      <w:bookmarkEnd w:id="147"/>
     </w:p>
     <w:tbl>
       <w:tblPr>
@@ -37839,11 +38454,11 @@
       <w:pPr>
         <w:pStyle w:val="Ttulo2"/>
       </w:pPr>
-      <w:bookmarkStart w:id="147" w:name="_Toc243865264"/>
+      <w:bookmarkStart w:id="148" w:name="_Toc244028992"/>
       <w:r>
         <w:t>A.2. Secuencia mínima de reproducción</w:t>
       </w:r>
-      <w:bookmarkEnd w:id="147"/>
+      <w:bookmarkEnd w:id="148"/>
     </w:p>
     <w:p>
       <w:r>
@@ -37944,8 +38559,8 @@
       </w:r>
     </w:p>
     <w:sectPr>
-      <w:headerReference w:type="default" r:id="rId65"/>
-      <w:footerReference w:type="default" r:id="rId66"/>
+      <w:headerReference w:type="default" r:id="rId66"/>
+      <w:footerReference w:type="default" r:id="rId67"/>
       <w:pgSz w:w="11906" w:h="16838" w:code="9"/>
       <w:pgMar w:top="1134" w:right="1134" w:bottom="1134" w:left="1134" w:header="567" w:footer="567" w:gutter="0"/>
       <w:cols w:space="708"/>
@@ -41006,6 +41621,21 @@
 </file>
 
 <file path=customXml/item1.xml><?xml version="1.0" encoding="utf-8"?>
+<?mso-contentType ?>
+<FormTemplates xmlns="http://schemas.microsoft.com/sharepoint/v3/contenttype/forms">
+  <Display>DocumentLibraryForm</Display>
+  <Edit>DocumentLibraryForm</Edit>
+  <New>DocumentLibraryForm</New>
+</FormTemplates>
+</file>
+
+<file path=customXml/item2.xml><?xml version="1.0" encoding="utf-8"?>
+<p:properties xmlns:p="http://schemas.microsoft.com/office/2006/metadata/properties" xmlns:xsi="http://www.w3.org/2001/XMLSchema-instance" xmlns:pc="http://schemas.microsoft.com/office/infopath/2007/PartnerControls">
+  <documentManagement/>
+</p:properties>
+</file>
+
+<file path=customXml/item3.xml><?xml version="1.0" encoding="utf-8"?>
 <ct:contentTypeSchema xmlns:ct="http://schemas.microsoft.com/office/2006/metadata/contentType" xmlns:ma="http://schemas.microsoft.com/office/2006/metadata/properties/metaAttributes" ct:_="" ma:_="" ma:contentTypeName="Documento" ma:contentTypeID="0x01010019FAAD7208B57F46B26AFFED99BCE0D3" ma:contentTypeVersion="12" ma:contentTypeDescription="Crear nuevo documento." ma:contentTypeScope="" ma:versionID="1ef574cbf204855aeab3c40b347ffcdd">
   <xsd:schema xmlns:xsd="http://www.w3.org/2001/XMLSchema" xmlns:xs="http://www.w3.org/2001/XMLSchema" xmlns:p="http://schemas.microsoft.com/office/2006/metadata/properties" xmlns:ns2="9d7b9a5c-6b4f-4ca1-bb03-c38cacb734bc" xmlns:ns3="7d80c08f-e909-465c-8aa4-0e649fbe85d0" targetNamespace="http://schemas.microsoft.com/office/2006/metadata/properties" ma:root="true" ma:fieldsID="d90f8574e5bf50e8ad773515e43a9e2d" ns2:_="" ns3:_="">
     <xsd:import namespace="9d7b9a5c-6b4f-4ca1-bb03-c38cacb734bc"/>
@@ -41222,22 +41852,24 @@
 </ct:contentTypeSchema>
 </file>
 
-<file path=customXml/item2.xml><?xml version="1.0" encoding="utf-8"?>
-<?mso-contentType ?>
-<FormTemplates xmlns="http://schemas.microsoft.com/sharepoint/v3/contenttype/forms">
-  <Display>DocumentLibraryForm</Display>
-  <Edit>DocumentLibraryForm</Edit>
-  <New>DocumentLibraryForm</New>
-</FormTemplates>
+<file path=customXml/itemProps1.xml><?xml version="1.0" encoding="utf-8"?>
+<ds:datastoreItem xmlns:ds="http://schemas.openxmlformats.org/officeDocument/2006/customXml" ds:itemID="{E5FD6A2B-9479-4129-9D84-6C858DBE1A90}">
+  <ds:schemaRefs>
+    <ds:schemaRef ds:uri="http://schemas.microsoft.com/sharepoint/v3/contenttype/forms"/>
+  </ds:schemaRefs>
+</ds:datastoreItem>
 </file>
 
-<file path=customXml/item3.xml><?xml version="1.0" encoding="utf-8"?>
-<p:properties xmlns:p="http://schemas.microsoft.com/office/2006/metadata/properties" xmlns:xsi="http://www.w3.org/2001/XMLSchema-instance" xmlns:pc="http://schemas.microsoft.com/office/infopath/2007/PartnerControls">
-  <documentManagement/>
-</p:properties>
+<file path=customXml/itemProps2.xml><?xml version="1.0" encoding="utf-8"?>
+<ds:datastoreItem xmlns:ds="http://schemas.openxmlformats.org/officeDocument/2006/customXml" ds:itemID="{261B0A37-6C6C-45CF-A5C4-83D994BC3980}">
+  <ds:schemaRefs>
+    <ds:schemaRef ds:uri="http://schemas.microsoft.com/office/2006/metadata/properties"/>
+    <ds:schemaRef ds:uri="http://schemas.microsoft.com/office/infopath/2007/PartnerControls"/>
+  </ds:schemaRefs>
+</ds:datastoreItem>
 </file>
 
-<file path=customXml/itemProps1.xml><?xml version="1.0" encoding="utf-8"?>
+<file path=customXml/itemProps3.xml><?xml version="1.0" encoding="utf-8"?>
 <ds:datastoreItem xmlns:ds="http://schemas.openxmlformats.org/officeDocument/2006/customXml" ds:itemID="{01B4916B-2905-40FE-B973-786E02856A77}">
   <ds:schemaRefs>
     <ds:schemaRef ds:uri="http://schemas.microsoft.com/office/2006/metadata/contentType"/>
@@ -41254,21 +41886,4 @@
     <ds:schemaRef ds:uri="http://schemas.microsoft.com/internal/obd"/>
   </ds:schemaRefs>
 </ds:datastoreItem>
-</file>
-
-<file path=customXml/itemProps2.xml><?xml version="1.0" encoding="utf-8"?>
-<ds:datastoreItem xmlns:ds="http://schemas.openxmlformats.org/officeDocument/2006/customXml" ds:itemID="{E5FD6A2B-9479-4129-9D84-6C858DBE1A90}">
-  <ds:schemaRefs>
-    <ds:schemaRef ds:uri="http://schemas.microsoft.com/sharepoint/v3/contenttype/forms"/>
-  </ds:schemaRefs>
-</ds:datastoreItem>
-</file>
-
-<file path=customXml/itemProps3.xml><?xml version="1.0" encoding="utf-8"?>
-<ds:datastoreItem xmlns:ds="http://schemas.openxmlformats.org/officeDocument/2006/customXml" ds:itemID="{261B0A37-6C6C-45CF-A5C4-83D994BC3980}">
-  <ds:schemaRefs>
-    <ds:schemaRef ds:uri="http://schemas.microsoft.com/office/2006/metadata/properties"/>
-    <ds:schemaRef ds:uri="http://schemas.microsoft.com/office/infopath/2007/PartnerControls"/>
-  </ds:schemaRefs>
-</ds:datastoreItem>
 </file>
</xml_diff>